<commit_message>
Document M9.3 company deployment validation
</commit_message>
<xml_diff>
--- a/docs/OMNICHECK_AI_BUILD_AND_OPERATIONS_GUIDE.docx
+++ b/docs/OMNICHECK_AI_BUILD_AND_OPERATIONS_GUIDE.docx
@@ -103,7 +103,7 @@
           <w:b w:val="0"/>
           <w:i w:val="0"/>
         </w:rPr>
-        <w:t>文件版本：0.9.3-draft.1</w:t>
+        <w:t>文件版本：0.9.3-draft.2</w:t>
       </w:r>
     </w:p>
     <w:p>
@@ -157,7 +157,7 @@
           <w:color w:val="17365D"/>
           <w:sz w:val="17"/>
         </w:rPr>
-        <w:t>dc1c5ba</w:t>
+        <w:t>8faff37</w:t>
       </w:r>
     </w:p>
     <w:p>
@@ -1504,6 +1504,112 @@
                 <w:i w:val="0"/>
                 <w:sz w:val="17"/>
               </w:rPr>
+              <w:t>0.9.3-draft.2</w:t>
+            </w:r>
+          </w:p>
+        </w:tc>
+        <w:tc>
+          <w:tcPr>
+            <w:tcW w:type="dxa" w:w="2470"/>
+            <w:vAlign w:val="center"/>
+            <w:tcMar>
+              <w:top w:w="45" w:type="dxa"/>
+              <w:start w:w="120" w:type="dxa"/>
+              <w:bottom w:w="45" w:type="dxa"/>
+              <w:end w:w="120" w:type="dxa"/>
+            </w:tcMar>
+          </w:tcPr>
+          <w:p>
+            <w:pPr>
+              <w:spacing w:after="0"/>
+            </w:pPr>
+            <w:r>
+              <w:rPr>
+                <w:rFonts w:ascii="Calibri" w:hAnsi="Calibri" w:eastAsia="Microsoft JhengHei"/>
+                <w:b w:val="0"/>
+                <w:i w:val="0"/>
+                <w:sz w:val="17"/>
+              </w:rPr>
+              <w:t>2026-08-05</w:t>
+            </w:r>
+          </w:p>
+        </w:tc>
+        <w:tc>
+          <w:tcPr>
+            <w:tcW w:type="dxa" w:w="2470"/>
+            <w:vAlign w:val="center"/>
+            <w:tcMar>
+              <w:top w:w="45" w:type="dxa"/>
+              <w:start w:w="120" w:type="dxa"/>
+              <w:bottom w:w="45" w:type="dxa"/>
+              <w:end w:w="120" w:type="dxa"/>
+            </w:tcMar>
+          </w:tcPr>
+          <w:p>
+            <w:pPr>
+              <w:spacing w:after="0"/>
+            </w:pPr>
+            <w:r>
+              <w:rPr>
+                <w:rFonts w:ascii="Calibri" w:hAnsi="Calibri" w:eastAsia="Microsoft JhengHei"/>
+                <w:b w:val="0"/>
+                <w:i w:val="0"/>
+                <w:sz w:val="17"/>
+              </w:rPr>
+              <w:t>完成公司 App VM／EDB core deployment、EPAS Redwood 與 Linux fontconfig 修正</w:t>
+            </w:r>
+          </w:p>
+        </w:tc>
+        <w:tc>
+          <w:tcPr>
+            <w:tcW w:type="dxa" w:w="2470"/>
+            <w:vAlign w:val="center"/>
+            <w:tcMar>
+              <w:top w:w="45" w:type="dxa"/>
+              <w:start w:w="120" w:type="dxa"/>
+              <w:bottom w:w="45" w:type="dxa"/>
+              <w:end w:w="120" w:type="dxa"/>
+            </w:tcMar>
+          </w:tcPr>
+          <w:p>
+            <w:pPr>
+              <w:spacing w:after="0"/>
+            </w:pPr>
+            <w:r>
+              <w:rPr>
+                <w:rFonts w:ascii="Calibri" w:hAnsi="Calibri" w:eastAsia="Microsoft JhengHei"/>
+                <w:b w:val="0"/>
+                <w:i w:val="0"/>
+                <w:sz w:val="17"/>
+              </w:rPr>
+              <w:t>公司 Golden E2E 通過；TLS／密碼驗證與實際客戶資料待完成</w:t>
+            </w:r>
+          </w:p>
+        </w:tc>
+      </w:tr>
+      <w:tr>
+        <w:tc>
+          <w:tcPr>
+            <w:tcW w:type="dxa" w:w="2470"/>
+            <w:vAlign w:val="center"/>
+            <w:tcMar>
+              <w:top w:w="45" w:type="dxa"/>
+              <w:start w:w="120" w:type="dxa"/>
+              <w:bottom w:w="45" w:type="dxa"/>
+              <w:end w:w="120" w:type="dxa"/>
+            </w:tcMar>
+          </w:tcPr>
+          <w:p>
+            <w:pPr>
+              <w:spacing w:after="0"/>
+            </w:pPr>
+            <w:r>
+              <w:rPr>
+                <w:rFonts w:ascii="Calibri" w:hAnsi="Calibri" w:eastAsia="Microsoft JhengHei"/>
+                <w:b w:val="0"/>
+                <w:i w:val="0"/>
+                <w:sz w:val="17"/>
+              </w:rPr>
               <w:t>0.9.3-draft.1</w:t>
             </w:r>
           </w:p>
@@ -1582,7 +1688,7 @@
                 <w:i w:val="0"/>
                 <w:sz w:val="17"/>
               </w:rPr>
-              <w:t>本機驗證；公司 EDB／VM 實機待驗證</w:t>
+              <w:t>本機驗證</w:t>
             </w:r>
           </w:p>
         </w:tc>
@@ -2896,6 +3002,25 @@
                 <w:color w:val="17365D"/>
                 <w:sz w:val="17"/>
               </w:rPr>
+              <w:t>omnicheck-ai-app</w:t>
+            </w:r>
+            <w:r>
+              <w:rPr>
+                <w:rFonts w:ascii="Calibri" w:hAnsi="Calibri" w:eastAsia="Microsoft JhengHei"/>
+                <w:b w:val="0"/>
+                <w:i w:val="0"/>
+                <w:sz w:val="17"/>
+              </w:rPr>
+              <w:t>／</w:t>
+            </w:r>
+            <w:r>
+              <w:rPr>
+                <w:rFonts w:ascii="Consolas" w:hAnsi="Consolas" w:eastAsia="Microsoft JhengHei"/>
+                <w:b w:val="0"/>
+                <w:i w:val="0"/>
+                <w:color w:val="17365D"/>
+                <w:sz w:val="17"/>
+              </w:rPr>
               <w:t>192.168.118.77</w:t>
             </w:r>
             <w:r>
@@ -2905,7 +3030,7 @@
                 <w:i w:val="0"/>
                 <w:sz w:val="17"/>
               </w:rPr>
-              <w:t>，CentOS 9 VM</w:t>
+              <w:t>，CentOS Stream 9 x86_64</w:t>
             </w:r>
           </w:p>
         </w:tc>
@@ -2931,7 +3056,7 @@
                 <w:i w:val="0"/>
                 <w:sz w:val="17"/>
               </w:rPr>
-              <w:t>已提供，待部署</w:t>
+              <w:t>已部署並驗證</w:t>
             </w:r>
           </w:p>
         </w:tc>
@@ -3021,7 +3146,7 @@
                 <w:i w:val="0"/>
                 <w:sz w:val="17"/>
               </w:rPr>
-              <w:t>已準備</w:t>
+              <w:t>已驗證</w:t>
             </w:r>
           </w:p>
         </w:tc>
@@ -3102,7 +3227,7 @@
                 <w:i w:val="0"/>
                 <w:sz w:val="17"/>
               </w:rPr>
-              <w:t>已提供，待連線驗證</w:t>
+              <w:t>EPAS protocol／SQLAlchemy／migration 已驗證</w:t>
             </w:r>
           </w:p>
         </w:tc>
@@ -3684,7 +3809,7 @@
                 <w:i w:val="0"/>
                 <w:sz w:val="17"/>
               </w:rPr>
-              <w:t>設計完成，待實機驗證</w:t>
+              <w:t>Web／Worker enabled、active、重啟持久性通過</w:t>
             </w:r>
           </w:p>
         </w:tc>
@@ -4722,7 +4847,7 @@
                 <w:rFonts w:ascii="Consolas" w:hAnsi="Consolas" w:eastAsia="Microsoft JhengHei"/>
                 <w:sz w:val="16"/>
               </w:rPr>
-              <w:t>dnf info git python3.12 python3.12-pip fontconfig libreoffice-headless</w:t>
+              <w:t>dnf info git python3.12 python3.12-pip fontconfig libreoffice</w:t>
               <w:br/>
               <w:t>dnf list available '*noto*cjk*' '*source*han*'</w:t>
             </w:r>
@@ -4791,7 +4916,7 @@
                 <w:rFonts w:ascii="Consolas" w:hAnsi="Consolas" w:eastAsia="Microsoft JhengHei"/>
                 <w:sz w:val="16"/>
               </w:rPr>
-              <w:t>dnf install -y git python3.12 python3.12-pip fontconfig libreoffice-headless</w:t>
+              <w:t>dnf install -y git python3.12 python3.12-pip fontconfig libreoffice google-noto-sans-cjk-ttc-fonts</w:t>
               <w:br/>
               <w:t>python3.12 --version</w:t>
               <w:br/>
@@ -4810,25 +4935,7 @@
           <w:b w:val="0"/>
           <w:i w:val="0"/>
         </w:rPr>
-        <w:t xml:space="preserve">預期 Python 為 3.12.x。若公司 repository 沒有 Python 3.12 或 </w:t>
-      </w:r>
-      <w:r>
-        <w:rPr>
-          <w:rFonts w:ascii="Consolas" w:hAnsi="Consolas" w:eastAsia="Microsoft JhengHei"/>
-          <w:b w:val="0"/>
-          <w:i w:val="0"/>
-          <w:color w:val="17365D"/>
-          <w:sz w:val="17"/>
-        </w:rPr>
-        <w:t>libreoffice-headless</w:t>
-      </w:r>
-      <w:r>
-        <w:rPr>
-          <w:rFonts w:ascii="Calibri" w:hAnsi="Calibri" w:eastAsia="Microsoft JhengHei"/>
-          <w:b w:val="0"/>
-          <w:i w:val="0"/>
-        </w:rPr>
-        <w:t>，停止並由 OS 管理員提供核准 repository／RPM；不可臨時從不明網站下載，也不可用系統 Python 3.9 代替。</w:t>
+        <w:t>公司實測版本為 Python 3.12.13、LibreOffice 7.1.8.1、Noto Sans CJK TC。若 repository 沒有上述套件，停止並由 OS 管理員提供核准 repository／RPM；不可臨時從不明網站下載，也不可用系統 Python 3.9 代替。</w:t>
       </w:r>
     </w:p>
     <w:p>
@@ -5940,13 +6047,13 @@
               <w:br/>
               <w:t>install -d -o omnicheck -g omnicheck -m 0750 /data/omnicheck/app/releases</w:t>
               <w:br/>
-              <w:t>sudo -u omnicheck git clone &lt;APPROVED_GIT_URL&gt; releases/dc1c5ba</w:t>
+              <w:t>sudo -u omnicheck git clone &lt;APPROVED_GIT_URL&gt; releases/8faff37</w:t>
               <w:br/>
-              <w:t>cd releases/dc1c5ba</w:t>
+              <w:t>cd releases/8faff37</w:t>
               <w:br/>
               <w:t>sudo -u omnicheck git fetch --tags --prune</w:t>
               <w:br/>
-              <w:t>sudo -u omnicheck git checkout dc1c5ba</w:t>
+              <w:t>sudo -u omnicheck git checkout 8faff37</w:t>
               <w:br/>
               <w:t>git status --short</w:t>
               <w:br/>
@@ -6009,7 +6116,7 @@
                 <w:rFonts w:ascii="Consolas" w:hAnsi="Consolas" w:eastAsia="Microsoft JhengHei"/>
                 <w:sz w:val="16"/>
               </w:rPr>
-              <w:t>ln -sfn /data/omnicheck/app/releases/dc1c5ba /data/omnicheck/app/current</w:t>
+              <w:t>ln -sfn /data/omnicheck/app/releases/8faff37 /data/omnicheck/app/current</w:t>
               <w:br/>
               <w:t>chown -h omnicheck:omnicheck /data/omnicheck/app/current</w:t>
             </w:r>
@@ -6113,7 +6220,7 @@
               <w:br/>
               <w:t>/data/omnicheck/venv/bin/python -m pip install --upgrade pip</w:t>
               <w:br/>
-              <w:t>/data/omnicheck/venv/bin/pip install '/data/omnicheck/app/current[dev]'</w:t>
+              <w:t>/data/omnicheck/venv/bin/pip install -e '/data/omnicheck/app/current[dev]'</w:t>
               <w:br/>
               <w:t>/data/omnicheck/venv/bin/python --version</w:t>
               <w:br/>
@@ -6181,7 +6288,7 @@
           <w:b w:val="0"/>
           <w:i w:val="0"/>
         </w:rPr>
-        <w:t xml:space="preserve">目前 </w:t>
+        <w:t>目前 V4 vendor bundle 位於固定 source release 外部，不包含於 wheel，因此部署採固定 release + editable link。</w:t>
       </w:r>
       <w:r>
         <w:rPr>
@@ -6199,7 +6306,7 @@
           <w:b w:val="0"/>
           <w:i w:val="0"/>
         </w:rPr>
-        <w:t xml:space="preserve"> 允許版本範圍，尚未提供完整 lock file；這是重現性風險，正式上線前應建立受控 lock／wheelhouse。</w:t>
+        <w:t xml:space="preserve"> 仍允許版本範圍且尚未提供完整 lock file；正式上線前應建立可攜式 package data 與受控 lock／wheelhouse。</w:t>
       </w:r>
     </w:p>
     <w:p>
@@ -6235,7 +6342,7 @@
           <w:b w:val="0"/>
           <w:i w:val="0"/>
         </w:rPr>
-        <w:t xml:space="preserve">建立 </w:t>
+        <w:t xml:space="preserve">正式環境建立 </w:t>
       </w:r>
       <w:r>
         <w:rPr>
@@ -6336,6 +6443,142 @@
         </w:tc>
       </w:tr>
     </w:tbl>
+    <w:p>
+      <w:r>
+        <w:rPr>
+          <w:rFonts w:ascii="Calibri" w:hAnsi="Calibri" w:eastAsia="Microsoft JhengHei"/>
+          <w:b w:val="0"/>
+          <w:i w:val="0"/>
+        </w:rPr>
+        <w:t xml:space="preserve">公司首次測試發現未提供 </w:t>
+      </w:r>
+      <w:r>
+        <w:rPr>
+          <w:rFonts w:ascii="Consolas" w:hAnsi="Consolas" w:eastAsia="Microsoft JhengHei"/>
+          <w:b w:val="0"/>
+          <w:i w:val="0"/>
+          <w:color w:val="17365D"/>
+          <w:sz w:val="17"/>
+        </w:rPr>
+        <w:t>.pgpass</w:t>
+      </w:r>
+      <w:r>
+        <w:rPr>
+          <w:rFonts w:ascii="Calibri" w:hAnsi="Calibri" w:eastAsia="Microsoft JhengHei"/>
+          <w:b w:val="0"/>
+          <w:i w:val="0"/>
+        </w:rPr>
+        <w:t xml:space="preserve"> 仍可由 </w:t>
+      </w:r>
+      <w:r>
+        <w:rPr>
+          <w:rFonts w:ascii="Consolas" w:hAnsi="Consolas" w:eastAsia="Microsoft JhengHei"/>
+          <w:b w:val="0"/>
+          <w:i w:val="0"/>
+          <w:color w:val="17365D"/>
+          <w:sz w:val="17"/>
+        </w:rPr>
+        <w:t>.77</w:t>
+      </w:r>
+      <w:r>
+        <w:rPr>
+          <w:rFonts w:ascii="Calibri" w:hAnsi="Calibri" w:eastAsia="Microsoft JhengHei"/>
+          <w:b w:val="0"/>
+          <w:i w:val="0"/>
+        </w:rPr>
+        <w:t xml:space="preserve"> 登入 </w:t>
+      </w:r>
+      <w:r>
+        <w:rPr>
+          <w:rFonts w:ascii="Consolas" w:hAnsi="Consolas" w:eastAsia="Microsoft JhengHei"/>
+          <w:b w:val="0"/>
+          <w:i w:val="0"/>
+          <w:color w:val="17365D"/>
+          <w:sz w:val="17"/>
+        </w:rPr>
+        <w:t>.81</w:t>
+      </w:r>
+      <w:r>
+        <w:rPr>
+          <w:rFonts w:ascii="Calibri" w:hAnsi="Calibri" w:eastAsia="Microsoft JhengHei"/>
+          <w:b w:val="0"/>
+          <w:i w:val="0"/>
+        </w:rPr>
+        <w:t xml:space="preserve">，代表目前 </w:t>
+      </w:r>
+      <w:r>
+        <w:rPr>
+          <w:rFonts w:ascii="Consolas" w:hAnsi="Consolas" w:eastAsia="Microsoft JhengHei"/>
+          <w:b w:val="0"/>
+          <w:i w:val="0"/>
+          <w:color w:val="17365D"/>
+          <w:sz w:val="17"/>
+        </w:rPr>
+        <w:t>pg_hba.conf</w:t>
+      </w:r>
+      <w:r>
+        <w:rPr>
+          <w:rFonts w:ascii="Calibri" w:hAnsi="Calibri" w:eastAsia="Microsoft JhengHei"/>
+          <w:b w:val="0"/>
+          <w:i w:val="0"/>
+        </w:rPr>
+        <w:t xml:space="preserve"> 未要求 application password。測試部署暫時移除 URL 的 </w:t>
+      </w:r>
+      <w:r>
+        <w:rPr>
+          <w:rFonts w:ascii="Consolas" w:hAnsi="Consolas" w:eastAsia="Microsoft JhengHei"/>
+          <w:b w:val="0"/>
+          <w:i w:val="0"/>
+          <w:color w:val="17365D"/>
+          <w:sz w:val="17"/>
+        </w:rPr>
+        <w:t>passfile</w:t>
+      </w:r>
+      <w:r>
+        <w:rPr>
+          <w:rFonts w:ascii="Calibri" w:hAnsi="Calibri" w:eastAsia="Microsoft JhengHei"/>
+          <w:b w:val="0"/>
+          <w:i w:val="0"/>
+        </w:rPr>
+        <w:t xml:space="preserve"> 參數；正式上線前必須改為 </w:t>
+      </w:r>
+      <w:r>
+        <w:rPr>
+          <w:rFonts w:ascii="Consolas" w:hAnsi="Consolas" w:eastAsia="Microsoft JhengHei"/>
+          <w:b w:val="0"/>
+          <w:i w:val="0"/>
+          <w:color w:val="17365D"/>
+          <w:sz w:val="17"/>
+        </w:rPr>
+        <w:t>scram-sha-256</w:t>
+      </w:r>
+      <w:r>
+        <w:rPr>
+          <w:rFonts w:ascii="Calibri" w:hAnsi="Calibri" w:eastAsia="Microsoft JhengHei"/>
+          <w:b w:val="0"/>
+          <w:i w:val="0"/>
+        </w:rPr>
+        <w:t xml:space="preserve">、設定 application password、建立 </w:t>
+      </w:r>
+      <w:r>
+        <w:rPr>
+          <w:rFonts w:ascii="Consolas" w:hAnsi="Consolas" w:eastAsia="Microsoft JhengHei"/>
+          <w:b w:val="0"/>
+          <w:i w:val="0"/>
+          <w:color w:val="17365D"/>
+          <w:sz w:val="17"/>
+        </w:rPr>
+        <w:t>0600</w:t>
+      </w:r>
+      <w:r>
+        <w:rPr>
+          <w:rFonts w:ascii="Calibri" w:hAnsi="Calibri" w:eastAsia="Microsoft JhengHei"/>
+          <w:b w:val="0"/>
+          <w:i w:val="0"/>
+        </w:rPr>
+        <w:t xml:space="preserve"> pgpass，再恢復以下標準設定。</w:t>
+      </w:r>
+    </w:p>
     <w:p>
       <w:pPr>
         <w:pStyle w:val="Heading3"/>
@@ -7336,7 +7579,7 @@
           <w:b w:val="0"/>
           <w:i w:val="0"/>
         </w:rPr>
-        <w:t>M9.3 本機基準為 56 tests 全部通過。實際數量會隨版本增加，不應硬性只等於 56；重點是 0 failed。</w:t>
+        <w:t>公司實機修正後基準為 59 tests 全部通過。實際數量會隨版本增加，不應硬性只等於 59；重點是 0 failed。</w:t>
       </w:r>
     </w:p>
     <w:p>
@@ -10571,7 +10814,7 @@
           <w:b w:val="0"/>
           <w:i w:val="0"/>
         </w:rPr>
-        <w:t xml:space="preserve">M9.3 尚未在公司 </w:t>
+        <w:t xml:space="preserve">M9.3 core deployment 已在公司 </w:t>
       </w:r>
       <w:r>
         <w:rPr>
@@ -10589,7 +10832,56 @@
           <w:b w:val="0"/>
           <w:i w:val="0"/>
         </w:rPr>
-        <w:t xml:space="preserve"> 實機驗證。</w:t>
+        <w:t xml:space="preserve"> 通過 migration、systemd、EDB queue、retry、DOCX/PDF、重啟持久性與 Golden E2E。</w:t>
+      </w:r>
+    </w:p>
+    <w:p>
+      <w:pPr>
+        <w:pStyle w:val="ListBullet"/>
+      </w:pPr>
+      <w:r>
+        <w:rPr>
+          <w:rFonts w:ascii="Calibri" w:hAnsi="Calibri" w:eastAsia="Microsoft JhengHei"/>
+          <w:b w:val="0"/>
+          <w:i w:val="0"/>
+        </w:rPr>
+        <w:t>尚未以台灣行動支付實際資料在公司 VM 執行唯讀驗證。</w:t>
+      </w:r>
+    </w:p>
+    <w:p>
+      <w:pPr>
+        <w:pStyle w:val="ListBullet"/>
+      </w:pPr>
+      <w:r>
+        <w:rPr>
+          <w:rFonts w:ascii="Consolas" w:hAnsi="Consolas" w:eastAsia="Microsoft JhengHei"/>
+          <w:b w:val="0"/>
+          <w:i w:val="0"/>
+          <w:color w:val="17365D"/>
+          <w:sz w:val="17"/>
+        </w:rPr>
+        <w:t>.81</w:t>
+      </w:r>
+      <w:r>
+        <w:rPr>
+          <w:rFonts w:ascii="Calibri" w:hAnsi="Calibri" w:eastAsia="Microsoft JhengHei"/>
+          <w:b w:val="0"/>
+          <w:i w:val="0"/>
+        </w:rPr>
+        <w:t xml:space="preserve"> 目前允許 application user 無密碼登入，正式上線前必須改為 SCRAM。</w:t>
+      </w:r>
+    </w:p>
+    <w:p>
+      <w:pPr>
+        <w:pStyle w:val="ListBullet"/>
+      </w:pPr>
+      <w:r>
+        <w:rPr>
+          <w:rFonts w:ascii="Calibri" w:hAnsi="Calibri" w:eastAsia="Microsoft JhengHei"/>
+          <w:b w:val="0"/>
+          <w:i w:val="0"/>
+        </w:rPr>
+        <w:t>兩次修正前 API 500 留下兩筆空的 draft Golden 測試案件；尚未執行破壞性清除。</w:t>
       </w:r>
     </w:p>
     <w:p>

</xml_diff>

<commit_message>
Record EDB-centric and CVE architecture decision
</commit_message>
<xml_diff>
--- a/docs/OMNICHECK_AI_BUILD_AND_OPERATIONS_GUIDE.docx
+++ b/docs/OMNICHECK_AI_BUILD_AND_OPERATIONS_GUIDE.docx
@@ -103,7 +103,7 @@
           <w:b w:val="0"/>
           <w:i w:val="0"/>
         </w:rPr>
-        <w:t>文件版本：0.9.3-draft.2</w:t>
+        <w:t>文件版本：0.9.3-draft.3</w:t>
       </w:r>
     </w:p>
     <w:p>
@@ -157,7 +157,7 @@
           <w:color w:val="17365D"/>
           <w:sz w:val="17"/>
         </w:rPr>
-        <w:t>8faff37</w:t>
+        <w:t>18e21ee</w:t>
       </w:r>
     </w:p>
     <w:p>
@@ -1504,6 +1504,112 @@
                 <w:i w:val="0"/>
                 <w:sz w:val="17"/>
               </w:rPr>
+              <w:t>0.9.3-draft.3</w:t>
+            </w:r>
+          </w:p>
+        </w:tc>
+        <w:tc>
+          <w:tcPr>
+            <w:tcW w:type="dxa" w:w="2470"/>
+            <w:vAlign w:val="center"/>
+            <w:tcMar>
+              <w:top w:w="45" w:type="dxa"/>
+              <w:start w:w="120" w:type="dxa"/>
+              <w:bottom w:w="45" w:type="dxa"/>
+              <w:end w:w="120" w:type="dxa"/>
+            </w:tcMar>
+          </w:tcPr>
+          <w:p>
+            <w:pPr>
+              <w:spacing w:after="0"/>
+            </w:pPr>
+            <w:r>
+              <w:rPr>
+                <w:rFonts w:ascii="Calibri" w:hAnsi="Calibri" w:eastAsia="Microsoft JhengHei"/>
+                <w:b w:val="0"/>
+                <w:i w:val="0"/>
+                <w:sz w:val="17"/>
+              </w:rPr>
+              <w:t>2026-08-05</w:t>
+            </w:r>
+          </w:p>
+        </w:tc>
+        <w:tc>
+          <w:tcPr>
+            <w:tcW w:type="dxa" w:w="2470"/>
+            <w:vAlign w:val="center"/>
+            <w:tcMar>
+              <w:top w:w="45" w:type="dxa"/>
+              <w:start w:w="120" w:type="dxa"/>
+              <w:bottom w:w="45" w:type="dxa"/>
+              <w:end w:w="120" w:type="dxa"/>
+            </w:tcMar>
+          </w:tcPr>
+          <w:p>
+            <w:pPr>
+              <w:spacing w:after="0"/>
+            </w:pPr>
+            <w:r>
+              <w:rPr>
+                <w:rFonts w:ascii="Calibri" w:hAnsi="Calibri" w:eastAsia="Microsoft JhengHei"/>
+                <w:b w:val="0"/>
+                <w:i w:val="0"/>
+                <w:sz w:val="17"/>
+              </w:rPr>
+              <w:t>納入 EDB 中心化、Canonical JSON、Artifact、CVE 與 AI 責任邊界決策</w:t>
+            </w:r>
+          </w:p>
+        </w:tc>
+        <w:tc>
+          <w:tcPr>
+            <w:tcW w:type="dxa" w:w="2470"/>
+            <w:vAlign w:val="center"/>
+            <w:tcMar>
+              <w:top w:w="45" w:type="dxa"/>
+              <w:start w:w="120" w:type="dxa"/>
+              <w:bottom w:w="45" w:type="dxa"/>
+              <w:end w:w="120" w:type="dxa"/>
+            </w:tcMar>
+          </w:tcPr>
+          <w:p>
+            <w:pPr>
+              <w:spacing w:after="0"/>
+            </w:pPr>
+            <w:r>
+              <w:rPr>
+                <w:rFonts w:ascii="Calibri" w:hAnsi="Calibri" w:eastAsia="Microsoft JhengHei"/>
+                <w:b w:val="0"/>
+                <w:i w:val="0"/>
+                <w:sz w:val="17"/>
+              </w:rPr>
+              <w:t>文件與 DOCX 驗證；後續資料模型尚未實作</w:t>
+            </w:r>
+          </w:p>
+        </w:tc>
+      </w:tr>
+      <w:tr>
+        <w:tc>
+          <w:tcPr>
+            <w:tcW w:type="dxa" w:w="2470"/>
+            <w:vAlign w:val="center"/>
+            <w:tcMar>
+              <w:top w:w="45" w:type="dxa"/>
+              <w:start w:w="120" w:type="dxa"/>
+              <w:bottom w:w="45" w:type="dxa"/>
+              <w:end w:w="120" w:type="dxa"/>
+            </w:tcMar>
+          </w:tcPr>
+          <w:p>
+            <w:pPr>
+              <w:spacing w:after="0"/>
+            </w:pPr>
+            <w:r>
+              <w:rPr>
+                <w:rFonts w:ascii="Calibri" w:hAnsi="Calibri" w:eastAsia="Microsoft JhengHei"/>
+                <w:b w:val="0"/>
+                <w:i w:val="0"/>
+                <w:sz w:val="17"/>
+              </w:rPr>
               <w:t>0.9.3-draft.2</w:t>
             </w:r>
           </w:p>
@@ -2465,7 +2571,7 @@
                 <w:i w:val="0"/>
                 <w:sz w:val="17"/>
               </w:rPr>
-              <w:t>待驗證</w:t>
+              <w:t>Core 已驗證</w:t>
             </w:r>
           </w:p>
         </w:tc>
@@ -2491,7 +2597,87 @@
                 <w:i w:val="0"/>
                 <w:sz w:val="17"/>
               </w:rPr>
-              <w:t>公司 EDB migration、systemd、網路、字型與 PDF</w:t>
+              <w:t>公司 EDB migration、systemd、網路、Golden DOCX／PDF 與重啟持久性通過；安全與實際資料待完成</w:t>
+            </w:r>
+          </w:p>
+        </w:tc>
+      </w:tr>
+      <w:tr>
+        <w:tc>
+          <w:tcPr>
+            <w:tcW w:type="dxa" w:w="3293"/>
+            <w:vAlign w:val="center"/>
+            <w:tcMar>
+              <w:top w:w="45" w:type="dxa"/>
+              <w:start w:w="120" w:type="dxa"/>
+              <w:bottom w:w="45" w:type="dxa"/>
+              <w:end w:w="120" w:type="dxa"/>
+            </w:tcMar>
+          </w:tcPr>
+          <w:p>
+            <w:pPr>
+              <w:spacing w:after="0"/>
+            </w:pPr>
+            <w:r>
+              <w:rPr>
+                <w:rFonts w:ascii="Calibri" w:hAnsi="Calibri" w:eastAsia="Microsoft JhengHei"/>
+                <w:b w:val="0"/>
+                <w:i w:val="0"/>
+                <w:sz w:val="17"/>
+              </w:rPr>
+              <w:t>M9.4～M15</w:t>
+            </w:r>
+          </w:p>
+        </w:tc>
+        <w:tc>
+          <w:tcPr>
+            <w:tcW w:type="dxa" w:w="3293"/>
+            <w:vAlign w:val="center"/>
+            <w:tcMar>
+              <w:top w:w="45" w:type="dxa"/>
+              <w:start w:w="120" w:type="dxa"/>
+              <w:bottom w:w="45" w:type="dxa"/>
+              <w:end w:w="120" w:type="dxa"/>
+            </w:tcMar>
+          </w:tcPr>
+          <w:p>
+            <w:pPr>
+              <w:spacing w:after="0"/>
+            </w:pPr>
+            <w:r>
+              <w:rPr>
+                <w:rFonts w:ascii="Calibri" w:hAnsi="Calibri" w:eastAsia="Microsoft JhengHei"/>
+                <w:b w:val="0"/>
+                <w:i w:val="0"/>
+                <w:sz w:val="17"/>
+              </w:rPr>
+              <w:t>已核准、待實作</w:t>
+            </w:r>
+          </w:p>
+        </w:tc>
+        <w:tc>
+          <w:tcPr>
+            <w:tcW w:type="dxa" w:w="3293"/>
+            <w:vAlign w:val="center"/>
+            <w:tcMar>
+              <w:top w:w="45" w:type="dxa"/>
+              <w:start w:w="120" w:type="dxa"/>
+              <w:bottom w:w="45" w:type="dxa"/>
+              <w:end w:w="120" w:type="dxa"/>
+            </w:tcMar>
+          </w:tcPr>
+          <w:p>
+            <w:pPr>
+              <w:spacing w:after="0"/>
+            </w:pPr>
+            <w:r>
+              <w:rPr>
+                <w:rFonts w:ascii="Calibri" w:hAnsi="Calibri" w:eastAsia="Microsoft JhengHei"/>
+                <w:b w:val="0"/>
+                <w:i w:val="0"/>
+                <w:sz w:val="17"/>
+              </w:rPr>
+              <w:t>EDB 應用資料、Artifact、拓撲確認、權限、歷史、CVE、選配 AI 與生產強化</w:t>
             </w:r>
           </w:p>
         </w:tc>
@@ -2656,7 +2842,7 @@
           <w:b w:val="0"/>
           <w:i w:val="0"/>
         </w:rPr>
-        <w:t>3.1 資料責任</w:t>
+        <w:t>3.1 目前 M9.3 資料責任</w:t>
       </w:r>
     </w:p>
     <w:p>
@@ -2669,7 +2855,7 @@
           <w:b w:val="0"/>
           <w:i w:val="0"/>
         </w:rPr>
-        <w:t>EDB 只保存案件 metadata、狀態、claim、attempt 與事件。</w:t>
+        <w:t>目前已實作的 EDB 只保存案件 metadata、狀態、claim、attempt 與事件。</w:t>
       </w:r>
     </w:p>
     <w:p>
@@ -2822,6 +3008,194 @@
           <w:i w:val="0"/>
         </w:rPr>
         <w:t>目前正式路徑不需要外部 AI。Primary、Scope、狀態、證據、版面與品質閘門均為確定性程式。未來 AI 只能做已遮蔽內容的摘要、解釋或問答，不得更動證據與判斷。</w:t>
+      </w:r>
+    </w:p>
+    <w:p>
+      <w:pPr>
+        <w:pStyle w:val="Heading3"/>
+      </w:pPr>
+      <w:r>
+        <w:rPr>
+          <w:rFonts w:ascii="Calibri" w:hAnsi="Calibri" w:eastAsia="Microsoft JhengHei"/>
+          <w:b w:val="0"/>
+          <w:i w:val="0"/>
+        </w:rPr>
+        <w:t>3.3 已核准的目標資料架構（M9.4 起）</w:t>
+      </w:r>
+    </w:p>
+    <w:p>
+      <w:r>
+        <w:rPr>
+          <w:rFonts w:ascii="Calibri" w:hAnsi="Calibri" w:eastAsia="Microsoft JhengHei"/>
+          <w:b w:val="0"/>
+          <w:i w:val="0"/>
+        </w:rPr>
+        <w:t xml:space="preserve">詳細權威決策為 </w:t>
+      </w:r>
+      <w:r>
+        <w:rPr>
+          <w:rFonts w:ascii="Consolas" w:hAnsi="Consolas" w:eastAsia="Microsoft JhengHei"/>
+          <w:b w:val="0"/>
+          <w:i w:val="0"/>
+          <w:color w:val="17365D"/>
+          <w:sz w:val="17"/>
+        </w:rPr>
+        <w:t>docs/EDB_CENTRIC_AND_CVE_ARCHITECTURE.md</w:t>
+      </w:r>
+      <w:r>
+        <w:rPr>
+          <w:rFonts w:ascii="Calibri" w:hAnsi="Calibri" w:eastAsia="Microsoft JhengHei"/>
+          <w:b w:val="0"/>
+          <w:i w:val="0"/>
+        </w:rPr>
+        <w:t>。實作原則如下：</w:t>
+      </w:r>
+    </w:p>
+    <w:p>
+      <w:pPr>
+        <w:pStyle w:val="ListBullet"/>
+      </w:pPr>
+      <w:r>
+        <w:rPr>
+          <w:rFonts w:ascii="Calibri" w:hAnsi="Calibri" w:eastAsia="Microsoft JhengHei"/>
+          <w:b w:val="0"/>
+          <w:i w:val="0"/>
+        </w:rPr>
+        <w:t>EDB 逐步成為結構化應用資料、歷史、規則結果與 CVE Cache 的主要查詢來源。</w:t>
+      </w:r>
+    </w:p>
+    <w:p>
+      <w:pPr>
+        <w:pStyle w:val="ListBullet"/>
+      </w:pPr>
+      <w:r>
+        <w:rPr>
+          <w:rFonts w:ascii="Consolas" w:hAnsi="Consolas" w:eastAsia="Microsoft JhengHei"/>
+          <w:b w:val="0"/>
+          <w:i w:val="0"/>
+          <w:color w:val="17365D"/>
+          <w:sz w:val="17"/>
+        </w:rPr>
+        <w:t>/data</w:t>
+      </w:r>
+      <w:r>
+        <w:rPr>
+          <w:rFonts w:ascii="Calibri" w:hAnsi="Calibri" w:eastAsia="Microsoft JhengHei"/>
+          <w:b w:val="0"/>
+          <w:i w:val="0"/>
+        </w:rPr>
+        <w:t xml:space="preserve"> 繼續保存原始證據、圖片、壓縮檔、Canonical JSON、DOCX、PDF 與 Render 暫存檔。</w:t>
+      </w:r>
+    </w:p>
+    <w:p>
+      <w:pPr>
+        <w:pStyle w:val="ListBullet"/>
+      </w:pPr>
+      <w:r>
+        <w:rPr>
+          <w:rFonts w:ascii="Calibri" w:hAnsi="Calibri" w:eastAsia="Microsoft JhengHei"/>
+          <w:b w:val="0"/>
+          <w:i w:val="0"/>
+        </w:rPr>
+        <w:t xml:space="preserve">EDB 對大型檔案只保存 </w:t>
+      </w:r>
+      <w:r>
+        <w:rPr>
+          <w:rFonts w:ascii="Consolas" w:hAnsi="Consolas" w:eastAsia="Microsoft JhengHei"/>
+          <w:b w:val="0"/>
+          <w:i w:val="0"/>
+          <w:color w:val="17365D"/>
+          <w:sz w:val="17"/>
+        </w:rPr>
+        <w:t>storage_backend</w:t>
+      </w:r>
+      <w:r>
+        <w:rPr>
+          <w:rFonts w:ascii="Calibri" w:hAnsi="Calibri" w:eastAsia="Microsoft JhengHei"/>
+          <w:b w:val="0"/>
+          <w:i w:val="0"/>
+        </w:rPr>
+        <w:t>、</w:t>
+      </w:r>
+      <w:r>
+        <w:rPr>
+          <w:rFonts w:ascii="Consolas" w:hAnsi="Consolas" w:eastAsia="Microsoft JhengHei"/>
+          <w:b w:val="0"/>
+          <w:i w:val="0"/>
+          <w:color w:val="17365D"/>
+          <w:sz w:val="17"/>
+        </w:rPr>
+        <w:t>storage_key</w:t>
+      </w:r>
+      <w:r>
+        <w:rPr>
+          <w:rFonts w:ascii="Calibri" w:hAnsi="Calibri" w:eastAsia="Microsoft JhengHei"/>
+          <w:b w:val="0"/>
+          <w:i w:val="0"/>
+        </w:rPr>
+        <w:t>、hash、大小、media type、保留與封存狀態。</w:t>
+      </w:r>
+    </w:p>
+    <w:p>
+      <w:pPr>
+        <w:pStyle w:val="ListBullet"/>
+      </w:pPr>
+      <w:r>
+        <w:rPr>
+          <w:rFonts w:ascii="Calibri" w:hAnsi="Calibri" w:eastAsia="Microsoft JhengHei"/>
+          <w:b w:val="0"/>
+          <w:i w:val="0"/>
+        </w:rPr>
+        <w:t>Canonical JSON 不取消；它是不可變 Pipeline／Renderer 契約、Golden、除錯、重建與 rollback 保護。</w:t>
+      </w:r>
+    </w:p>
+    <w:p>
+      <w:pPr>
+        <w:pStyle w:val="ListBullet"/>
+      </w:pPr>
+      <w:r>
+        <w:rPr>
+          <w:rFonts w:ascii="Calibri" w:hAnsi="Calibri" w:eastAsia="Microsoft JhengHei"/>
+          <w:b w:val="0"/>
+          <w:i w:val="0"/>
+        </w:rPr>
+        <w:t>Pipeline 後增加冪等 Persistence Adapter；持久化失敗時 Job 不得標成 succeeded。</w:t>
+      </w:r>
+    </w:p>
+    <w:p>
+      <w:pPr>
+        <w:pStyle w:val="ListBullet"/>
+      </w:pPr>
+      <w:r>
+        <w:rPr>
+          <w:rFonts w:ascii="Calibri" w:hAnsi="Calibri" w:eastAsia="Microsoft JhengHei"/>
+          <w:b w:val="0"/>
+          <w:i w:val="0"/>
+        </w:rPr>
+        <w:t>Customer／tenant key 從 M9.4 進資料模型；M11 再完成 Login／RBAC／Audit enforcement。</w:t>
+      </w:r>
+    </w:p>
+    <w:p>
+      <w:pPr>
+        <w:pStyle w:val="ListBullet"/>
+      </w:pPr>
+      <w:r>
+        <w:rPr>
+          <w:rFonts w:ascii="Calibri" w:hAnsi="Calibri" w:eastAsia="Microsoft JhengHei"/>
+          <w:b w:val="0"/>
+          <w:i w:val="0"/>
+        </w:rPr>
+        <w:t>CVE 由固定官方來源排程同步，Version Matcher 確定性判斷；AI 不決定漏洞適用性。</w:t>
+      </w:r>
+    </w:p>
+    <w:p>
+      <w:r>
+        <w:rPr>
+          <w:rFonts w:ascii="Calibri" w:hAnsi="Calibri" w:eastAsia="Microsoft JhengHei"/>
+          <w:b w:val="0"/>
+          <w:i w:val="0"/>
+        </w:rPr>
+        <w:t>此節是核准的未來狀態，不代表 M9.4～M15 的 table、migration、sync worker 或 AI Gateway 已經存在。</w:t>
       </w:r>
     </w:p>
     <w:p>
@@ -10951,6 +11325,19 @@
     </w:p>
     <w:p>
       <w:pPr>
+        <w:pStyle w:val="ListBullet"/>
+      </w:pPr>
+      <w:r>
+        <w:rPr>
+          <w:rFonts w:ascii="Calibri" w:hAnsi="Calibri" w:eastAsia="Microsoft JhengHei"/>
+          <w:b w:val="0"/>
+          <w:i w:val="0"/>
+        </w:rPr>
+        <w:t>EDB 中心化與 CVE 自動化方向已核准，但 Persistence Adapter、Application Data tables、Artifact Registry 與 CVE tables 尚未實作。</w:t>
+      </w:r>
+    </w:p>
+    <w:p>
+      <w:pPr>
         <w:pStyle w:val="Heading2"/>
       </w:pPr>
       <w:r>
@@ -11160,6 +11547,29 @@
           <w:sz w:val="17"/>
         </w:rPr>
         <w:t>docs/M9_3_VALIDATION.md</w:t>
+      </w:r>
+    </w:p>
+    <w:p>
+      <w:pPr>
+        <w:pStyle w:val="ListBullet"/>
+      </w:pPr>
+      <w:r>
+        <w:rPr>
+          <w:rFonts w:ascii="Calibri" w:hAnsi="Calibri" w:eastAsia="Microsoft JhengHei"/>
+          <w:b w:val="0"/>
+          <w:i w:val="0"/>
+        </w:rPr>
+        <w:t>M9.4～M15 架構決策：</w:t>
+      </w:r>
+      <w:r>
+        <w:rPr>
+          <w:rFonts w:ascii="Consolas" w:hAnsi="Consolas" w:eastAsia="Microsoft JhengHei"/>
+          <w:b w:val="0"/>
+          <w:i w:val="0"/>
+          <w:color w:val="17365D"/>
+          <w:sz w:val="17"/>
+        </w:rPr>
+        <w:t>docs/EDB_CENTRIC_AND_CVE_ARCHITECTURE.md</w:t>
       </w:r>
     </w:p>
     <w:p>

</xml_diff>

<commit_message>
Complete M9.3 company validation records
</commit_message>
<xml_diff>
--- a/docs/OMNICHECK_AI_BUILD_AND_OPERATIONS_GUIDE.docx
+++ b/docs/OMNICHECK_AI_BUILD_AND_OPERATIONS_GUIDE.docx
@@ -103,7 +103,7 @@
           <w:b w:val="0"/>
           <w:i w:val="0"/>
         </w:rPr>
-        <w:t>文件版本：0.9.3-draft.3</w:t>
+        <w:t>文件版本：0.9.3-draft.4</w:t>
       </w:r>
     </w:p>
     <w:p>
@@ -157,7 +157,7 @@
           <w:color w:val="17365D"/>
           <w:sz w:val="17"/>
         </w:rPr>
-        <w:t>18e21ee</w:t>
+        <w:t>a1d286f</w:t>
       </w:r>
     </w:p>
     <w:p>
@@ -1504,6 +1504,112 @@
                 <w:i w:val="0"/>
                 <w:sz w:val="17"/>
               </w:rPr>
+              <w:t>0.9.3-draft.4</w:t>
+            </w:r>
+          </w:p>
+        </w:tc>
+        <w:tc>
+          <w:tcPr>
+            <w:tcW w:type="dxa" w:w="2470"/>
+            <w:vAlign w:val="center"/>
+            <w:tcMar>
+              <w:top w:w="45" w:type="dxa"/>
+              <w:start w:w="120" w:type="dxa"/>
+              <w:bottom w:w="45" w:type="dxa"/>
+              <w:end w:w="120" w:type="dxa"/>
+            </w:tcMar>
+          </w:tcPr>
+          <w:p>
+            <w:pPr>
+              <w:spacing w:after="0"/>
+            </w:pPr>
+            <w:r>
+              <w:rPr>
+                <w:rFonts w:ascii="Calibri" w:hAnsi="Calibri" w:eastAsia="Microsoft JhengHei"/>
+                <w:b w:val="0"/>
+                <w:i w:val="0"/>
+                <w:sz w:val="17"/>
+              </w:rPr>
+              <w:t>2026-08-05</w:t>
+            </w:r>
+          </w:p>
+        </w:tc>
+        <w:tc>
+          <w:tcPr>
+            <w:tcW w:type="dxa" w:w="2470"/>
+            <w:vAlign w:val="center"/>
+            <w:tcMar>
+              <w:top w:w="45" w:type="dxa"/>
+              <w:start w:w="120" w:type="dxa"/>
+              <w:bottom w:w="45" w:type="dxa"/>
+              <w:end w:w="120" w:type="dxa"/>
+            </w:tcMar>
+          </w:tcPr>
+          <w:p>
+            <w:pPr>
+              <w:spacing w:after="0"/>
+            </w:pPr>
+            <w:r>
+              <w:rPr>
+                <w:rFonts w:ascii="Calibri" w:hAnsi="Calibri" w:eastAsia="Microsoft JhengHei"/>
+                <w:b w:val="0"/>
+                <w:i w:val="0"/>
+                <w:sz w:val="17"/>
+              </w:rPr>
+              <w:t>完成 SCRAM／pgpass、實際客戶資料 E2E 與 V4 摘要分頁修正</w:t>
+            </w:r>
+          </w:p>
+        </w:tc>
+        <w:tc>
+          <w:tcPr>
+            <w:tcW w:type="dxa" w:w="2470"/>
+            <w:vAlign w:val="center"/>
+            <w:tcMar>
+              <w:top w:w="45" w:type="dxa"/>
+              <w:start w:w="120" w:type="dxa"/>
+              <w:bottom w:w="45" w:type="dxa"/>
+              <w:end w:w="120" w:type="dxa"/>
+            </w:tcMar>
+          </w:tcPr>
+          <w:p>
+            <w:pPr>
+              <w:spacing w:after="0"/>
+            </w:pPr>
+            <w:r>
+              <w:rPr>
+                <w:rFonts w:ascii="Calibri" w:hAnsi="Calibri" w:eastAsia="Microsoft JhengHei"/>
+                <w:b w:val="0"/>
+                <w:i w:val="0"/>
+                <w:sz w:val="17"/>
+              </w:rPr>
+              <w:t>本機／VM 60 tests、QA、V4 QA、29 頁 PDF 與來源 hash 通過；待 merge/tag</w:t>
+            </w:r>
+          </w:p>
+        </w:tc>
+      </w:tr>
+      <w:tr>
+        <w:tc>
+          <w:tcPr>
+            <w:tcW w:type="dxa" w:w="2470"/>
+            <w:vAlign w:val="center"/>
+            <w:tcMar>
+              <w:top w:w="45" w:type="dxa"/>
+              <w:start w:w="120" w:type="dxa"/>
+              <w:bottom w:w="45" w:type="dxa"/>
+              <w:end w:w="120" w:type="dxa"/>
+            </w:tcMar>
+          </w:tcPr>
+          <w:p>
+            <w:pPr>
+              <w:spacing w:after="0"/>
+            </w:pPr>
+            <w:r>
+              <w:rPr>
+                <w:rFonts w:ascii="Calibri" w:hAnsi="Calibri" w:eastAsia="Microsoft JhengHei"/>
+                <w:b w:val="0"/>
+                <w:i w:val="0"/>
+                <w:sz w:val="17"/>
+              </w:rPr>
               <w:t>0.9.3-draft.3</w:t>
             </w:r>
           </w:p>
@@ -2571,7 +2677,7 @@
                 <w:i w:val="0"/>
                 <w:sz w:val="17"/>
               </w:rPr>
-              <w:t>Core 已驗證</w:t>
+              <w:t>正式化驗證通過</w:t>
             </w:r>
           </w:p>
         </w:tc>
@@ -2597,7 +2703,7 @@
                 <w:i w:val="0"/>
                 <w:sz w:val="17"/>
               </w:rPr>
-              <w:t>公司 EDB migration、systemd、網路、Golden DOCX／PDF 與重啟持久性通過；安全與實際資料待完成</w:t>
+              <w:t>公司 EDB、systemd、SCRAM／pgpass、Golden、實際資料、DOCX／PDF 與重啟持久性通過；待 merge/tag</w:t>
             </w:r>
           </w:p>
         </w:tc>
@@ -6824,7 +6930,7 @@
           <w:b w:val="0"/>
           <w:i w:val="0"/>
         </w:rPr>
-        <w:t xml:space="preserve">公司首次測試發現未提供 </w:t>
+        <w:t xml:space="preserve">公司首次測試發現前置 </w:t>
       </w:r>
       <w:r>
         <w:rPr>
@@ -6834,7 +6940,7 @@
           <w:color w:val="17365D"/>
           <w:sz w:val="17"/>
         </w:rPr>
-        <w:t>.pgpass</w:t>
+        <w:t>host all all 0.0.0.0/0 trust</w:t>
       </w:r>
       <w:r>
         <w:rPr>
@@ -6842,7 +6948,7 @@
           <w:b w:val="0"/>
           <w:i w:val="0"/>
         </w:rPr>
-        <w:t xml:space="preserve"> 仍可由 </w:t>
+        <w:t xml:space="preserve"> 會蓋過後方 application 規則。M9.3 正式化已在該規則前新增只匹配 database/user </w:t>
       </w:r>
       <w:r>
         <w:rPr>
@@ -6852,7 +6958,7 @@
           <w:color w:val="17365D"/>
           <w:sz w:val="17"/>
         </w:rPr>
-        <w:t>.77</w:t>
+        <w:t>omnicheck_app</w:t>
       </w:r>
       <w:r>
         <w:rPr>
@@ -6860,7 +6966,7 @@
           <w:b w:val="0"/>
           <w:i w:val="0"/>
         </w:rPr>
-        <w:t xml:space="preserve"> 登入 </w:t>
+        <w:t xml:space="preserve">、來源 </w:t>
       </w:r>
       <w:r>
         <w:rPr>
@@ -6870,7 +6976,7 @@
           <w:color w:val="17365D"/>
           <w:sz w:val="17"/>
         </w:rPr>
-        <w:t>.81</w:t>
+        <w:t>192.168.118.77/32</w:t>
       </w:r>
       <w:r>
         <w:rPr>
@@ -6878,7 +6984,7 @@
           <w:b w:val="0"/>
           <w:i w:val="0"/>
         </w:rPr>
-        <w:t xml:space="preserve">，代表目前 </w:t>
+        <w:t xml:space="preserve"> 的 </w:t>
       </w:r>
       <w:r>
         <w:rPr>
@@ -6888,7 +6994,7 @@
           <w:color w:val="17365D"/>
           <w:sz w:val="17"/>
         </w:rPr>
-        <w:t>pg_hba.conf</w:t>
+        <w:t>scram-sha-256</w:t>
       </w:r>
       <w:r>
         <w:rPr>
@@ -6896,7 +7002,7 @@
           <w:b w:val="0"/>
           <w:i w:val="0"/>
         </w:rPr>
-        <w:t xml:space="preserve"> 未要求 application password。測試部署暫時移除 URL 的 </w:t>
+        <w:t xml:space="preserve"> 規則，輪替密碼並建立 </w:t>
       </w:r>
       <w:r>
         <w:rPr>
@@ -6906,7 +7012,7 @@
           <w:color w:val="17365D"/>
           <w:sz w:val="17"/>
         </w:rPr>
-        <w:t>passfile</w:t>
+        <w:t>0600</w:t>
       </w:r>
       <w:r>
         <w:rPr>
@@ -6914,43 +7020,7 @@
           <w:b w:val="0"/>
           <w:i w:val="0"/>
         </w:rPr>
-        <w:t xml:space="preserve"> 參數；正式上線前必須改為 </w:t>
-      </w:r>
-      <w:r>
-        <w:rPr>
-          <w:rFonts w:ascii="Consolas" w:hAnsi="Consolas" w:eastAsia="Microsoft JhengHei"/>
-          <w:b w:val="0"/>
-          <w:i w:val="0"/>
-          <w:color w:val="17365D"/>
-          <w:sz w:val="17"/>
-        </w:rPr>
-        <w:t>scram-sha-256</w:t>
-      </w:r>
-      <w:r>
-        <w:rPr>
-          <w:rFonts w:ascii="Calibri" w:hAnsi="Calibri" w:eastAsia="Microsoft JhengHei"/>
-          <w:b w:val="0"/>
-          <w:i w:val="0"/>
-        </w:rPr>
-        <w:t xml:space="preserve">、設定 application password、建立 </w:t>
-      </w:r>
-      <w:r>
-        <w:rPr>
-          <w:rFonts w:ascii="Consolas" w:hAnsi="Consolas" w:eastAsia="Microsoft JhengHei"/>
-          <w:b w:val="0"/>
-          <w:i w:val="0"/>
-          <w:color w:val="17365D"/>
-          <w:sz w:val="17"/>
-        </w:rPr>
-        <w:t>0600</w:t>
-      </w:r>
-      <w:r>
-        <w:rPr>
-          <w:rFonts w:ascii="Calibri" w:hAnsi="Calibri" w:eastAsia="Microsoft JhengHei"/>
-          <w:b w:val="0"/>
-          <w:i w:val="0"/>
-        </w:rPr>
-        <w:t xml:space="preserve"> pgpass，再恢復以下標準設定。</w:t>
+        <w:t xml:space="preserve"> pgpass。無密碼登入已驗證拒絕；pgpass 登入成功。既有全域 trust 規則尚未移除，因其可能影響其他應用，必須另案盤點後收斂。</w:t>
       </w:r>
     </w:p>
     <w:p>
@@ -11188,7 +11258,7 @@
           <w:b w:val="0"/>
           <w:i w:val="0"/>
         </w:rPr>
-        <w:t xml:space="preserve">M9.3 core deployment 已在公司 </w:t>
+        <w:t xml:space="preserve">M9.3 已在公司 </w:t>
       </w:r>
       <w:r>
         <w:rPr>
@@ -11206,7 +11276,7 @@
           <w:b w:val="0"/>
           <w:i w:val="0"/>
         </w:rPr>
-        <w:t xml:space="preserve"> 通過 migration、systemd、EDB queue、retry、DOCX/PDF、重啟持久性與 Golden E2E。</w:t>
+        <w:t xml:space="preserve"> 通過 migration、systemd、EDB queue、retry、SCRAM／pgpass、DOCX/PDF、重啟持久性、Golden 與實際客戶資料 E2E。</w:t>
       </w:r>
     </w:p>
     <w:p>
@@ -11219,7 +11289,7 @@
           <w:b w:val="0"/>
           <w:i w:val="0"/>
         </w:rPr>
-        <w:t>尚未以台灣行動支付實際資料在公司 VM 執行唯讀驗證。</w:t>
+        <w:t>台灣行動支付實際資料在 SCRAM 重啟後通過 13 inputs／13 outputs、QA 8/8、V4 QA、29 頁 PDF 與來源 SHA-256 不變。</w:t>
       </w:r>
     </w:p>
     <w:p>
@@ -11242,7 +11312,25 @@
           <w:b w:val="0"/>
           <w:i w:val="0"/>
         </w:rPr>
-        <w:t xml:space="preserve"> 目前允許 application user 無密碼登入，正式上線前必須改為 SCRAM。</w:t>
+        <w:t xml:space="preserve"> 的 OMNIcheck 精確規則已要求 SCRAM；cluster-wide </w:t>
+      </w:r>
+      <w:r>
+        <w:rPr>
+          <w:rFonts w:ascii="Consolas" w:hAnsi="Consolas" w:eastAsia="Microsoft JhengHei"/>
+          <w:b w:val="0"/>
+          <w:i w:val="0"/>
+          <w:color w:val="17365D"/>
+          <w:sz w:val="17"/>
+        </w:rPr>
+        <w:t>host all all 0.0.0.0/0 trust</w:t>
+      </w:r>
+      <w:r>
+        <w:rPr>
+          <w:rFonts w:ascii="Calibri" w:hAnsi="Calibri" w:eastAsia="Microsoft JhengHei"/>
+          <w:b w:val="0"/>
+          <w:i w:val="0"/>
+        </w:rPr>
+        <w:t xml:space="preserve"> 仍是其他連線的安全風險，需另案收斂。</w:t>
       </w:r>
     </w:p>
     <w:p>

</xml_diff>

<commit_message>
feat: add M9.4 application data foundation
</commit_message>
<xml_diff>
--- a/docs/OMNICHECK_AI_BUILD_AND_OPERATIONS_GUIDE.docx
+++ b/docs/OMNICHECK_AI_BUILD_AND_OPERATIONS_GUIDE.docx
@@ -103,7 +103,7 @@
           <w:b w:val="0"/>
           <w:i w:val="0"/>
         </w:rPr>
-        <w:t>文件版本：0.9.3</w:t>
+        <w:t>文件版本：0.9.4-draft.1</w:t>
       </w:r>
     </w:p>
     <w:p>
@@ -158,6 +158,24 @@
           <w:sz w:val="17"/>
         </w:rPr>
         <w:t>m9.3</w:t>
+      </w:r>
+      <w:r>
+        <w:rPr>
+          <w:rFonts w:ascii="Calibri" w:hAnsi="Calibri" w:eastAsia="Microsoft JhengHei"/>
+          <w:b w:val="0"/>
+          <w:i w:val="0"/>
+        </w:rPr>
+        <w:t xml:space="preserve">，以及待驗收的 </w:t>
+      </w:r>
+      <w:r>
+        <w:rPr>
+          <w:rFonts w:ascii="Consolas" w:hAnsi="Consolas" w:eastAsia="Microsoft JhengHei"/>
+          <w:b w:val="0"/>
+          <w:i w:val="0"/>
+          <w:color w:val="17365D"/>
+          <w:sz w:val="17"/>
+        </w:rPr>
+        <w:t>feature/m9-4-application-data-foundation</w:t>
       </w:r>
     </w:p>
     <w:p>
@@ -1504,6 +1522,131 @@
                 <w:i w:val="0"/>
                 <w:sz w:val="17"/>
               </w:rPr>
+              <w:t>0.9.4-draft.1</w:t>
+            </w:r>
+          </w:p>
+        </w:tc>
+        <w:tc>
+          <w:tcPr>
+            <w:tcW w:type="dxa" w:w="2470"/>
+            <w:vAlign w:val="center"/>
+            <w:tcMar>
+              <w:top w:w="45" w:type="dxa"/>
+              <w:start w:w="120" w:type="dxa"/>
+              <w:bottom w:w="45" w:type="dxa"/>
+              <w:end w:w="120" w:type="dxa"/>
+            </w:tcMar>
+          </w:tcPr>
+          <w:p>
+            <w:pPr>
+              <w:spacing w:after="0"/>
+            </w:pPr>
+            <w:r>
+              <w:rPr>
+                <w:rFonts w:ascii="Calibri" w:hAnsi="Calibri" w:eastAsia="Microsoft JhengHei"/>
+                <w:b w:val="0"/>
+                <w:i w:val="0"/>
+                <w:sz w:val="17"/>
+              </w:rPr>
+              <w:t>2026-08-05</w:t>
+            </w:r>
+          </w:p>
+        </w:tc>
+        <w:tc>
+          <w:tcPr>
+            <w:tcW w:type="dxa" w:w="2470"/>
+            <w:vAlign w:val="center"/>
+            <w:tcMar>
+              <w:top w:w="45" w:type="dxa"/>
+              <w:start w:w="120" w:type="dxa"/>
+              <w:bottom w:w="45" w:type="dxa"/>
+              <w:end w:w="120" w:type="dxa"/>
+            </w:tcMar>
+          </w:tcPr>
+          <w:p>
+            <w:pPr>
+              <w:spacing w:after="0"/>
+            </w:pPr>
+            <w:r>
+              <w:rPr>
+                <w:rFonts w:ascii="Calibri" w:hAnsi="Calibri" w:eastAsia="Microsoft JhengHei"/>
+                <w:b w:val="0"/>
+                <w:i w:val="0"/>
+                <w:sz w:val="17"/>
+              </w:rPr>
+              <w:t xml:space="preserve">新增 M9.4 Customer／System／Node／Topology／Evidence／Artifact、tenant scope 與 </w:t>
+            </w:r>
+            <w:r>
+              <w:rPr>
+                <w:rFonts w:ascii="Consolas" w:hAnsi="Consolas" w:eastAsia="Microsoft JhengHei"/>
+                <w:b w:val="0"/>
+                <w:i w:val="0"/>
+                <w:color w:val="17365D"/>
+                <w:sz w:val="17"/>
+              </w:rPr>
+              <w:t>0002_m9_4</w:t>
+            </w:r>
+            <w:r>
+              <w:rPr>
+                <w:rFonts w:ascii="Calibri" w:hAnsi="Calibri" w:eastAsia="Microsoft JhengHei"/>
+                <w:b w:val="0"/>
+                <w:i w:val="0"/>
+                <w:sz w:val="17"/>
+              </w:rPr>
+              <w:t xml:space="preserve"> migration 手順</w:t>
+            </w:r>
+          </w:p>
+        </w:tc>
+        <w:tc>
+          <w:tcPr>
+            <w:tcW w:type="dxa" w:w="2470"/>
+            <w:vAlign w:val="center"/>
+            <w:tcMar>
+              <w:top w:w="45" w:type="dxa"/>
+              <w:start w:w="120" w:type="dxa"/>
+              <w:bottom w:w="45" w:type="dxa"/>
+              <w:end w:w="120" w:type="dxa"/>
+            </w:tcMar>
+          </w:tcPr>
+          <w:p>
+            <w:pPr>
+              <w:spacing w:after="0"/>
+            </w:pPr>
+            <w:r>
+              <w:rPr>
+                <w:rFonts w:ascii="Calibri" w:hAnsi="Calibri" w:eastAsia="Microsoft JhengHei"/>
+                <w:b w:val="0"/>
+                <w:i w:val="0"/>
+                <w:sz w:val="17"/>
+              </w:rPr>
+              <w:t>本機 65 tests、offline upgrade/downgrade、實際資料隔離投影與來源 hash 通過；公司 EDB 待驗證</w:t>
+            </w:r>
+          </w:p>
+        </w:tc>
+      </w:tr>
+      <w:tr>
+        <w:tc>
+          <w:tcPr>
+            <w:tcW w:type="dxa" w:w="2470"/>
+            <w:vAlign w:val="center"/>
+            <w:tcMar>
+              <w:top w:w="45" w:type="dxa"/>
+              <w:start w:w="120" w:type="dxa"/>
+              <w:bottom w:w="45" w:type="dxa"/>
+              <w:end w:w="120" w:type="dxa"/>
+            </w:tcMar>
+          </w:tcPr>
+          <w:p>
+            <w:pPr>
+              <w:spacing w:after="0"/>
+            </w:pPr>
+            <w:r>
+              <w:rPr>
+                <w:rFonts w:ascii="Calibri" w:hAnsi="Calibri" w:eastAsia="Microsoft JhengHei"/>
+                <w:b w:val="0"/>
+                <w:i w:val="0"/>
+                <w:sz w:val="17"/>
+              </w:rPr>
               <w:t>0.9.3</w:t>
             </w:r>
           </w:p>
@@ -2102,7 +2245,7 @@
           <w:b w:val="0"/>
           <w:i w:val="0"/>
         </w:rPr>
-        <w:t>驗證 M1～M9.3 的輸出、Golden Regression 與 PDF 字型。</w:t>
+        <w:t>驗證 M1～M9.3 的輸出、Golden Regression 與 PDF 字型，以及 M9.4 application data foundation。</w:t>
       </w:r>
     </w:p>
     <w:p>
@@ -2837,7 +2980,87 @@
                 <w:i w:val="0"/>
                 <w:sz w:val="17"/>
               </w:rPr>
-              <w:t>M9.4～M15</w:t>
+              <w:t>M9.4</w:t>
+            </w:r>
+          </w:p>
+        </w:tc>
+        <w:tc>
+          <w:tcPr>
+            <w:tcW w:type="dxa" w:w="3293"/>
+            <w:vAlign w:val="center"/>
+            <w:tcMar>
+              <w:top w:w="45" w:type="dxa"/>
+              <w:start w:w="120" w:type="dxa"/>
+              <w:bottom w:w="45" w:type="dxa"/>
+              <w:end w:w="120" w:type="dxa"/>
+            </w:tcMar>
+          </w:tcPr>
+          <w:p>
+            <w:pPr>
+              <w:spacing w:after="0"/>
+            </w:pPr>
+            <w:r>
+              <w:rPr>
+                <w:rFonts w:ascii="Calibri" w:hAnsi="Calibri" w:eastAsia="Microsoft JhengHei"/>
+                <w:b w:val="0"/>
+                <w:i w:val="0"/>
+                <w:sz w:val="17"/>
+              </w:rPr>
+              <w:t>功能分支本機完成</w:t>
+            </w:r>
+          </w:p>
+        </w:tc>
+        <w:tc>
+          <w:tcPr>
+            <w:tcW w:type="dxa" w:w="3293"/>
+            <w:vAlign w:val="center"/>
+            <w:tcMar>
+              <w:top w:w="45" w:type="dxa"/>
+              <w:start w:w="120" w:type="dxa"/>
+              <w:bottom w:w="45" w:type="dxa"/>
+              <w:end w:w="120" w:type="dxa"/>
+            </w:tcMar>
+          </w:tcPr>
+          <w:p>
+            <w:pPr>
+              <w:spacing w:after="0"/>
+            </w:pPr>
+            <w:r>
+              <w:rPr>
+                <w:rFonts w:ascii="Calibri" w:hAnsi="Calibri" w:eastAsia="Microsoft JhengHei"/>
+                <w:b w:val="0"/>
+                <w:i w:val="0"/>
+                <w:sz w:val="17"/>
+              </w:rPr>
+              <w:t>Customer／System／Node／Topology／Evidence／Artifact、tenant key；公司 EDB 待驗證</w:t>
+            </w:r>
+          </w:p>
+        </w:tc>
+      </w:tr>
+      <w:tr>
+        <w:tc>
+          <w:tcPr>
+            <w:tcW w:type="dxa" w:w="3293"/>
+            <w:vAlign w:val="center"/>
+            <w:tcMar>
+              <w:top w:w="45" w:type="dxa"/>
+              <w:start w:w="120" w:type="dxa"/>
+              <w:bottom w:w="45" w:type="dxa"/>
+              <w:end w:w="120" w:type="dxa"/>
+            </w:tcMar>
+          </w:tcPr>
+          <w:p>
+            <w:pPr>
+              <w:spacing w:after="0"/>
+            </w:pPr>
+            <w:r>
+              <w:rPr>
+                <w:rFonts w:ascii="Calibri" w:hAnsi="Calibri" w:eastAsia="Microsoft JhengHei"/>
+                <w:b w:val="0"/>
+                <w:i w:val="0"/>
+                <w:sz w:val="17"/>
+              </w:rPr>
+              <w:t>M9.5～M15</w:t>
             </w:r>
           </w:p>
         </w:tc>
@@ -2889,7 +3112,7 @@
                 <w:i w:val="0"/>
                 <w:sz w:val="17"/>
               </w:rPr>
-              <w:t>EDB 應用資料、Artifact、拓撲確認、權限、歷史、CVE、選配 AI 與生產強化</w:t>
+              <w:t>Pipeline Persistence、Artifact lifecycle、拓撲確認、權限、歷史、CVE、選配 AI 與生產強化</w:t>
             </w:r>
           </w:p>
         </w:tc>
@@ -3250,7 +3473,7 @@
           <w:b w:val="0"/>
           <w:i w:val="0"/>
         </w:rPr>
-        <w:t>3.3 已核准的目標資料架構（M9.4 起）</w:t>
+        <w:t>3.3 M9.4 起的目標資料架構</w:t>
       </w:r>
     </w:p>
     <w:p>
@@ -3425,7 +3648,133 @@
           <w:b w:val="0"/>
           <w:i w:val="0"/>
         </w:rPr>
-        <w:t>此節是核准的未來狀態，不代表 M9.4～M15 的 table、migration、sync worker 或 AI Gateway 已經存在。</w:t>
+        <w:t xml:space="preserve">M9.4 已建立 </w:t>
+      </w:r>
+      <w:r>
+        <w:rPr>
+          <w:rFonts w:ascii="Consolas" w:hAnsi="Consolas" w:eastAsia="Microsoft JhengHei"/>
+          <w:b w:val="0"/>
+          <w:i w:val="0"/>
+          <w:color w:val="17365D"/>
+          <w:sz w:val="17"/>
+        </w:rPr>
+        <w:t>customers</w:t>
+      </w:r>
+      <w:r>
+        <w:rPr>
+          <w:rFonts w:ascii="Calibri" w:hAnsi="Calibri" w:eastAsia="Microsoft JhengHei"/>
+          <w:b w:val="0"/>
+          <w:i w:val="0"/>
+        </w:rPr>
+        <w:t>、</w:t>
+      </w:r>
+      <w:r>
+        <w:rPr>
+          <w:rFonts w:ascii="Consolas" w:hAnsi="Consolas" w:eastAsia="Microsoft JhengHei"/>
+          <w:b w:val="0"/>
+          <w:i w:val="0"/>
+          <w:color w:val="17365D"/>
+          <w:sz w:val="17"/>
+        </w:rPr>
+        <w:t>systems</w:t>
+      </w:r>
+      <w:r>
+        <w:rPr>
+          <w:rFonts w:ascii="Calibri" w:hAnsi="Calibri" w:eastAsia="Microsoft JhengHei"/>
+          <w:b w:val="0"/>
+          <w:i w:val="0"/>
+        </w:rPr>
+        <w:t>、</w:t>
+      </w:r>
+      <w:r>
+        <w:rPr>
+          <w:rFonts w:ascii="Consolas" w:hAnsi="Consolas" w:eastAsia="Microsoft JhengHei"/>
+          <w:b w:val="0"/>
+          <w:i w:val="0"/>
+          <w:color w:val="17365D"/>
+          <w:sz w:val="17"/>
+        </w:rPr>
+        <w:t>nodes</w:t>
+      </w:r>
+      <w:r>
+        <w:rPr>
+          <w:rFonts w:ascii="Calibri" w:hAnsi="Calibri" w:eastAsia="Microsoft JhengHei"/>
+          <w:b w:val="0"/>
+          <w:i w:val="0"/>
+        </w:rPr>
+        <w:t>、</w:t>
+      </w:r>
+      <w:r>
+        <w:rPr>
+          <w:rFonts w:ascii="Consolas" w:hAnsi="Consolas" w:eastAsia="Microsoft JhengHei"/>
+          <w:b w:val="0"/>
+          <w:i w:val="0"/>
+          <w:color w:val="17365D"/>
+          <w:sz w:val="17"/>
+        </w:rPr>
+        <w:t>topology_relations</w:t>
+      </w:r>
+      <w:r>
+        <w:rPr>
+          <w:rFonts w:ascii="Calibri" w:hAnsi="Calibri" w:eastAsia="Microsoft JhengHei"/>
+          <w:b w:val="0"/>
+          <w:i w:val="0"/>
+        </w:rPr>
+        <w:t>、</w:t>
+      </w:r>
+      <w:r>
+        <w:rPr>
+          <w:rFonts w:ascii="Consolas" w:hAnsi="Consolas" w:eastAsia="Microsoft JhengHei"/>
+          <w:b w:val="0"/>
+          <w:i w:val="0"/>
+          <w:color w:val="17365D"/>
+          <w:sz w:val="17"/>
+        </w:rPr>
+        <w:t>evidence_files</w:t>
+      </w:r>
+      <w:r>
+        <w:rPr>
+          <w:rFonts w:ascii="Calibri" w:hAnsi="Calibri" w:eastAsia="Microsoft JhengHei"/>
+          <w:b w:val="0"/>
+          <w:i w:val="0"/>
+        </w:rPr>
+        <w:t>、</w:t>
+      </w:r>
+      <w:r>
+        <w:rPr>
+          <w:rFonts w:ascii="Consolas" w:hAnsi="Consolas" w:eastAsia="Microsoft JhengHei"/>
+          <w:b w:val="0"/>
+          <w:i w:val="0"/>
+          <w:color w:val="17365D"/>
+          <w:sz w:val="17"/>
+        </w:rPr>
+        <w:t>artifacts</w:t>
+      </w:r>
+      <w:r>
+        <w:rPr>
+          <w:rFonts w:ascii="Calibri" w:hAnsi="Calibri" w:eastAsia="Microsoft JhengHei"/>
+          <w:b w:val="0"/>
+          <w:i w:val="0"/>
+        </w:rPr>
+        <w:t xml:space="preserve">，並為 </w:t>
+      </w:r>
+      <w:r>
+        <w:rPr>
+          <w:rFonts w:ascii="Consolas" w:hAnsi="Consolas" w:eastAsia="Microsoft JhengHei"/>
+          <w:b w:val="0"/>
+          <w:i w:val="0"/>
+          <w:color w:val="17365D"/>
+          <w:sz w:val="17"/>
+        </w:rPr>
+        <w:t>jobs</w:t>
+      </w:r>
+      <w:r>
+        <w:rPr>
+          <w:rFonts w:ascii="Calibri" w:hAnsi="Calibri" w:eastAsia="Microsoft JhengHei"/>
+          <w:b w:val="0"/>
+          <w:i w:val="0"/>
+        </w:rPr>
+        <w:t xml:space="preserve"> 加入 nullable tenant scope。完整 Pipeline Persistence、Artifact lifecycle、sync worker 與 AI Gateway 尚未完成。</w:t>
       </w:r>
     </w:p>
     <w:p>
@@ -7539,7 +7888,7 @@
           <w:b w:val="0"/>
           <w:i w:val="0"/>
         </w:rPr>
-        <w:t xml:space="preserve">預期 revision 為 </w:t>
+        <w:t xml:space="preserve">正式 </w:t>
       </w:r>
       <w:r>
         <w:rPr>
@@ -7549,15 +7898,15 @@
           <w:color w:val="17365D"/>
           <w:sz w:val="17"/>
         </w:rPr>
-        <w:t>0001_m9_3 (head)</w:t>
-      </w:r>
-      <w:r>
-        <w:rPr>
-          <w:rFonts w:ascii="Calibri" w:hAnsi="Calibri" w:eastAsia="Microsoft JhengHei"/>
-          <w:b w:val="0"/>
-          <w:i w:val="0"/>
-        </w:rPr>
-        <w:t xml:space="preserve">，schema 有 </w:t>
+        <w:t>m9.3</w:t>
+      </w:r>
+      <w:r>
+        <w:rPr>
+          <w:rFonts w:ascii="Calibri" w:hAnsi="Calibri" w:eastAsia="Microsoft JhengHei"/>
+          <w:b w:val="0"/>
+          <w:i w:val="0"/>
+        </w:rPr>
+        <w:t xml:space="preserve"> 預期 revision 為 </w:t>
       </w:r>
       <w:r>
         <w:rPr>
@@ -7567,15 +7916,15 @@
           <w:color w:val="17365D"/>
           <w:sz w:val="17"/>
         </w:rPr>
-        <w:t>jobs</w:t>
-      </w:r>
-      <w:r>
-        <w:rPr>
-          <w:rFonts w:ascii="Calibri" w:hAnsi="Calibri" w:eastAsia="Microsoft JhengHei"/>
-          <w:b w:val="0"/>
-          <w:i w:val="0"/>
-        </w:rPr>
-        <w:t>、</w:t>
+        <w:t>0001_m9_3</w:t>
+      </w:r>
+      <w:r>
+        <w:rPr>
+          <w:rFonts w:ascii="Calibri" w:hAnsi="Calibri" w:eastAsia="Microsoft JhengHei"/>
+          <w:b w:val="0"/>
+          <w:i w:val="0"/>
+        </w:rPr>
+        <w:t xml:space="preserve">，schema 有 </w:t>
       </w:r>
       <w:r>
         <w:rPr>
@@ -7585,7 +7934,7 @@
           <w:color w:val="17365D"/>
           <w:sz w:val="17"/>
         </w:rPr>
-        <w:t>job_events</w:t>
+        <w:t>jobs</w:t>
       </w:r>
       <w:r>
         <w:rPr>
@@ -7603,7 +7952,187 @@
           <w:color w:val="17365D"/>
           <w:sz w:val="17"/>
         </w:rPr>
+        <w:t>job_events</w:t>
+      </w:r>
+      <w:r>
+        <w:rPr>
+          <w:rFonts w:ascii="Calibri" w:hAnsi="Calibri" w:eastAsia="Microsoft JhengHei"/>
+          <w:b w:val="0"/>
+          <w:i w:val="0"/>
+        </w:rPr>
+        <w:t>、</w:t>
+      </w:r>
+      <w:r>
+        <w:rPr>
+          <w:rFonts w:ascii="Consolas" w:hAnsi="Consolas" w:eastAsia="Microsoft JhengHei"/>
+          <w:b w:val="0"/>
+          <w:i w:val="0"/>
+          <w:color w:val="17365D"/>
+          <w:sz w:val="17"/>
+        </w:rPr>
         <w:t>alembic_version</w:t>
+      </w:r>
+      <w:r>
+        <w:rPr>
+          <w:rFonts w:ascii="Calibri" w:hAnsi="Calibri" w:eastAsia="Microsoft JhengHei"/>
+          <w:b w:val="0"/>
+          <w:i w:val="0"/>
+        </w:rPr>
+        <w:t xml:space="preserve">。M9.4 功能分支部署後預期為 </w:t>
+      </w:r>
+      <w:r>
+        <w:rPr>
+          <w:rFonts w:ascii="Consolas" w:hAnsi="Consolas" w:eastAsia="Microsoft JhengHei"/>
+          <w:b w:val="0"/>
+          <w:i w:val="0"/>
+          <w:color w:val="17365D"/>
+          <w:sz w:val="17"/>
+        </w:rPr>
+        <w:t>0002_m9_4 (head)</w:t>
+      </w:r>
+      <w:r>
+        <w:rPr>
+          <w:rFonts w:ascii="Calibri" w:hAnsi="Calibri" w:eastAsia="Microsoft JhengHei"/>
+          <w:b w:val="0"/>
+          <w:i w:val="0"/>
+        </w:rPr>
+        <w:t xml:space="preserve">，並新增 </w:t>
+      </w:r>
+      <w:r>
+        <w:rPr>
+          <w:rFonts w:ascii="Consolas" w:hAnsi="Consolas" w:eastAsia="Microsoft JhengHei"/>
+          <w:b w:val="0"/>
+          <w:i w:val="0"/>
+          <w:color w:val="17365D"/>
+          <w:sz w:val="17"/>
+        </w:rPr>
+        <w:t>customers</w:t>
+      </w:r>
+      <w:r>
+        <w:rPr>
+          <w:rFonts w:ascii="Calibri" w:hAnsi="Calibri" w:eastAsia="Microsoft JhengHei"/>
+          <w:b w:val="0"/>
+          <w:i w:val="0"/>
+        </w:rPr>
+        <w:t>、</w:t>
+      </w:r>
+      <w:r>
+        <w:rPr>
+          <w:rFonts w:ascii="Consolas" w:hAnsi="Consolas" w:eastAsia="Microsoft JhengHei"/>
+          <w:b w:val="0"/>
+          <w:i w:val="0"/>
+          <w:color w:val="17365D"/>
+          <w:sz w:val="17"/>
+        </w:rPr>
+        <w:t>systems</w:t>
+      </w:r>
+      <w:r>
+        <w:rPr>
+          <w:rFonts w:ascii="Calibri" w:hAnsi="Calibri" w:eastAsia="Microsoft JhengHei"/>
+          <w:b w:val="0"/>
+          <w:i w:val="0"/>
+        </w:rPr>
+        <w:t>、</w:t>
+      </w:r>
+      <w:r>
+        <w:rPr>
+          <w:rFonts w:ascii="Consolas" w:hAnsi="Consolas" w:eastAsia="Microsoft JhengHei"/>
+          <w:b w:val="0"/>
+          <w:i w:val="0"/>
+          <w:color w:val="17365D"/>
+          <w:sz w:val="17"/>
+        </w:rPr>
+        <w:t>nodes</w:t>
+      </w:r>
+      <w:r>
+        <w:rPr>
+          <w:rFonts w:ascii="Calibri" w:hAnsi="Calibri" w:eastAsia="Microsoft JhengHei"/>
+          <w:b w:val="0"/>
+          <w:i w:val="0"/>
+        </w:rPr>
+        <w:t>、</w:t>
+      </w:r>
+      <w:r>
+        <w:rPr>
+          <w:rFonts w:ascii="Consolas" w:hAnsi="Consolas" w:eastAsia="Microsoft JhengHei"/>
+          <w:b w:val="0"/>
+          <w:i w:val="0"/>
+          <w:color w:val="17365D"/>
+          <w:sz w:val="17"/>
+        </w:rPr>
+        <w:t>topology_relations</w:t>
+      </w:r>
+      <w:r>
+        <w:rPr>
+          <w:rFonts w:ascii="Calibri" w:hAnsi="Calibri" w:eastAsia="Microsoft JhengHei"/>
+          <w:b w:val="0"/>
+          <w:i w:val="0"/>
+        </w:rPr>
+        <w:t>、</w:t>
+      </w:r>
+      <w:r>
+        <w:rPr>
+          <w:rFonts w:ascii="Consolas" w:hAnsi="Consolas" w:eastAsia="Microsoft JhengHei"/>
+          <w:b w:val="0"/>
+          <w:i w:val="0"/>
+          <w:color w:val="17365D"/>
+          <w:sz w:val="17"/>
+        </w:rPr>
+        <w:t>evidence_files</w:t>
+      </w:r>
+      <w:r>
+        <w:rPr>
+          <w:rFonts w:ascii="Calibri" w:hAnsi="Calibri" w:eastAsia="Microsoft JhengHei"/>
+          <w:b w:val="0"/>
+          <w:i w:val="0"/>
+        </w:rPr>
+        <w:t>、</w:t>
+      </w:r>
+      <w:r>
+        <w:rPr>
+          <w:rFonts w:ascii="Consolas" w:hAnsi="Consolas" w:eastAsia="Microsoft JhengHei"/>
+          <w:b w:val="0"/>
+          <w:i w:val="0"/>
+          <w:color w:val="17365D"/>
+          <w:sz w:val="17"/>
+        </w:rPr>
+        <w:t>artifacts</w:t>
+      </w:r>
+      <w:r>
+        <w:rPr>
+          <w:rFonts w:ascii="Calibri" w:hAnsi="Calibri" w:eastAsia="Microsoft JhengHei"/>
+          <w:b w:val="0"/>
+          <w:i w:val="0"/>
+        </w:rPr>
+        <w:t>；</w:t>
+      </w:r>
+      <w:r>
+        <w:rPr>
+          <w:rFonts w:ascii="Consolas" w:hAnsi="Consolas" w:eastAsia="Microsoft JhengHei"/>
+          <w:b w:val="0"/>
+          <w:i w:val="0"/>
+          <w:color w:val="17365D"/>
+          <w:sz w:val="17"/>
+        </w:rPr>
+        <w:t>jobs</w:t>
+      </w:r>
+      <w:r>
+        <w:rPr>
+          <w:rFonts w:ascii="Calibri" w:hAnsi="Calibri" w:eastAsia="Microsoft JhengHei"/>
+          <w:b w:val="0"/>
+          <w:i w:val="0"/>
+        </w:rPr>
+        <w:t xml:space="preserve"> 新增 nullable </w:t>
+      </w:r>
+      <w:r>
+        <w:rPr>
+          <w:rFonts w:ascii="Consolas" w:hAnsi="Consolas" w:eastAsia="Microsoft JhengHei"/>
+          <w:b w:val="0"/>
+          <w:i w:val="0"/>
+          <w:color w:val="17365D"/>
+          <w:sz w:val="17"/>
+        </w:rPr>
+        <w:t>customer_id/system_id</w:t>
       </w:r>
       <w:r>
         <w:rPr>
@@ -7663,6 +8192,261 @@
           <w:i w:val="0"/>
         </w:rPr>
         <w:t>Alembic downgrade 會刪表，屬破壞性操作；只有完成 metadata backup 並取得明確核准後才能執行。</w:t>
+      </w:r>
+    </w:p>
+    <w:p>
+      <w:pPr>
+        <w:pStyle w:val="Heading3"/>
+      </w:pPr>
+      <w:r>
+        <w:rPr>
+          <w:rFonts w:ascii="Calibri" w:hAnsi="Calibri" w:eastAsia="Microsoft JhengHei"/>
+          <w:b w:val="0"/>
+          <w:i w:val="0"/>
+        </w:rPr>
+        <w:t>10.3 M9.4 migration 待驗證手順</w:t>
+      </w:r>
+    </w:p>
+    <w:p>
+      <w:r>
+        <w:rPr>
+          <w:rFonts w:ascii="Calibri" w:hAnsi="Calibri" w:eastAsia="Microsoft JhengHei"/>
+          <w:b w:val="0"/>
+          <w:i w:val="0"/>
+        </w:rPr>
+        <w:t xml:space="preserve">目前只在本機 SQLite 與 PostgreSQL offline SQL 驗證，尚未於公司 </w:t>
+      </w:r>
+      <w:r>
+        <w:rPr>
+          <w:rFonts w:ascii="Consolas" w:hAnsi="Consolas" w:eastAsia="Microsoft JhengHei"/>
+          <w:b w:val="0"/>
+          <w:i w:val="0"/>
+          <w:color w:val="17365D"/>
+          <w:sz w:val="17"/>
+        </w:rPr>
+        <w:t>.81</w:t>
+      </w:r>
+      <w:r>
+        <w:rPr>
+          <w:rFonts w:ascii="Calibri" w:hAnsi="Calibri" w:eastAsia="Microsoft JhengHei"/>
+          <w:b w:val="0"/>
+          <w:i w:val="0"/>
+        </w:rPr>
+        <w:t xml:space="preserve"> 執行。安排公司測試時：</w:t>
+      </w:r>
+    </w:p>
+    <w:p>
+      <w:pPr>
+        <w:pStyle w:val="ListNumber"/>
+      </w:pPr>
+      <w:r>
+        <w:rPr>
+          <w:rFonts w:ascii="Calibri" w:hAnsi="Calibri" w:eastAsia="Microsoft JhengHei"/>
+          <w:b w:val="0"/>
+          <w:i w:val="0"/>
+        </w:rPr>
+        <w:t xml:space="preserve">停止 Web／Worker，記錄目前 app commit 與 </w:t>
+      </w:r>
+      <w:r>
+        <w:rPr>
+          <w:rFonts w:ascii="Consolas" w:hAnsi="Consolas" w:eastAsia="Microsoft JhengHei"/>
+          <w:b w:val="0"/>
+          <w:i w:val="0"/>
+          <w:color w:val="17365D"/>
+          <w:sz w:val="17"/>
+        </w:rPr>
+        <w:t>alembic current</w:t>
+      </w:r>
+      <w:r>
+        <w:rPr>
+          <w:rFonts w:ascii="Calibri" w:hAnsi="Calibri" w:eastAsia="Microsoft JhengHei"/>
+          <w:b w:val="0"/>
+          <w:i w:val="0"/>
+        </w:rPr>
+        <w:t>。</w:t>
+      </w:r>
+    </w:p>
+    <w:p>
+      <w:pPr>
+        <w:pStyle w:val="ListNumber"/>
+      </w:pPr>
+      <w:r>
+        <w:rPr>
+          <w:rFonts w:ascii="Calibri" w:hAnsi="Calibri" w:eastAsia="Microsoft JhengHei"/>
+          <w:b w:val="0"/>
+          <w:i w:val="0"/>
+        </w:rPr>
+        <w:t xml:space="preserve">使用 </w:t>
+      </w:r>
+      <w:r>
+        <w:rPr>
+          <w:rFonts w:ascii="Consolas" w:hAnsi="Consolas" w:eastAsia="Microsoft JhengHei"/>
+          <w:b w:val="0"/>
+          <w:i w:val="0"/>
+          <w:color w:val="17365D"/>
+          <w:sz w:val="17"/>
+        </w:rPr>
+        <w:t>pg_dump -Fc</w:t>
+      </w:r>
+      <w:r>
+        <w:rPr>
+          <w:rFonts w:ascii="Calibri" w:hAnsi="Calibri" w:eastAsia="Microsoft JhengHei"/>
+          <w:b w:val="0"/>
+          <w:i w:val="0"/>
+        </w:rPr>
+        <w:t xml:space="preserve"> 備份 </w:t>
+      </w:r>
+      <w:r>
+        <w:rPr>
+          <w:rFonts w:ascii="Consolas" w:hAnsi="Consolas" w:eastAsia="Microsoft JhengHei"/>
+          <w:b w:val="0"/>
+          <w:i w:val="0"/>
+          <w:color w:val="17365D"/>
+          <w:sz w:val="17"/>
+        </w:rPr>
+        <w:t>omnicheck_app</w:t>
+      </w:r>
+      <w:r>
+        <w:rPr>
+          <w:rFonts w:ascii="Calibri" w:hAnsi="Calibri" w:eastAsia="Microsoft JhengHei"/>
+          <w:b w:val="0"/>
+          <w:i w:val="0"/>
+        </w:rPr>
+        <w:t>，並確認備份檔大小與 checksum。</w:t>
+      </w:r>
+    </w:p>
+    <w:p>
+      <w:pPr>
+        <w:pStyle w:val="ListNumber"/>
+      </w:pPr>
+      <w:r>
+        <w:rPr>
+          <w:rFonts w:ascii="Calibri" w:hAnsi="Calibri" w:eastAsia="Microsoft JhengHei"/>
+          <w:b w:val="0"/>
+          <w:i w:val="0"/>
+        </w:rPr>
+        <w:t xml:space="preserve">在隔離 staging restore，演練 </w:t>
+      </w:r>
+      <w:r>
+        <w:rPr>
+          <w:rFonts w:ascii="Consolas" w:hAnsi="Consolas" w:eastAsia="Microsoft JhengHei"/>
+          <w:b w:val="0"/>
+          <w:i w:val="0"/>
+          <w:color w:val="17365D"/>
+          <w:sz w:val="17"/>
+        </w:rPr>
+        <w:t>upgrade 0002_m9_4</w:t>
+      </w:r>
+      <w:r>
+        <w:rPr>
+          <w:rFonts w:ascii="Calibri" w:hAnsi="Calibri" w:eastAsia="Microsoft JhengHei"/>
+          <w:b w:val="0"/>
+          <w:i w:val="0"/>
+        </w:rPr>
+        <w:t>、基本 CRUD 與回復。</w:t>
+      </w:r>
+    </w:p>
+    <w:p>
+      <w:pPr>
+        <w:pStyle w:val="ListNumber"/>
+      </w:pPr>
+      <w:r>
+        <w:rPr>
+          <w:rFonts w:ascii="Calibri" w:hAnsi="Calibri" w:eastAsia="Microsoft JhengHei"/>
+          <w:b w:val="0"/>
+          <w:i w:val="0"/>
+        </w:rPr>
+        <w:t xml:space="preserve">公司測試 EDB 執行 </w:t>
+      </w:r>
+      <w:r>
+        <w:rPr>
+          <w:rFonts w:ascii="Consolas" w:hAnsi="Consolas" w:eastAsia="Microsoft JhengHei"/>
+          <w:b w:val="0"/>
+          <w:i w:val="0"/>
+          <w:color w:val="17365D"/>
+          <w:sz w:val="17"/>
+        </w:rPr>
+        <w:t>alembic upgrade 0002_m9_4</w:t>
+      </w:r>
+      <w:r>
+        <w:rPr>
+          <w:rFonts w:ascii="Calibri" w:hAnsi="Calibri" w:eastAsia="Microsoft JhengHei"/>
+          <w:b w:val="0"/>
+          <w:i w:val="0"/>
+        </w:rPr>
+        <w:t>。</w:t>
+      </w:r>
+    </w:p>
+    <w:p>
+      <w:pPr>
+        <w:pStyle w:val="ListNumber"/>
+      </w:pPr>
+      <w:r>
+        <w:rPr>
+          <w:rFonts w:ascii="Calibri" w:hAnsi="Calibri" w:eastAsia="Microsoft JhengHei"/>
+          <w:b w:val="0"/>
+          <w:i w:val="0"/>
+        </w:rPr>
+        <w:t>查核六張新表、Job nullable tenant columns、FK／unique／check constraints。</w:t>
+      </w:r>
+    </w:p>
+    <w:p>
+      <w:pPr>
+        <w:pStyle w:val="ListNumber"/>
+      </w:pPr>
+      <w:r>
+        <w:rPr>
+          <w:rFonts w:ascii="Calibri" w:hAnsi="Calibri" w:eastAsia="Microsoft JhengHei"/>
+          <w:b w:val="0"/>
+          <w:i w:val="0"/>
+        </w:rPr>
+        <w:t>重啟 Web／Worker，確認既有 M9.3 Job 可讀、新 Job Queue／Worker E2E 通過。</w:t>
+      </w:r>
+    </w:p>
+    <w:p>
+      <w:r>
+        <w:rPr>
+          <w:rFonts w:ascii="Calibri" w:hAnsi="Calibri" w:eastAsia="Microsoft JhengHei"/>
+          <w:b w:val="0"/>
+          <w:i w:val="0"/>
+        </w:rPr>
+        <w:t>需要回到 M9.3 schema 時，</w:t>
+      </w:r>
+      <w:r>
+        <w:rPr>
+          <w:rFonts w:ascii="Consolas" w:hAnsi="Consolas" w:eastAsia="Microsoft JhengHei"/>
+          <w:b w:val="0"/>
+          <w:i w:val="0"/>
+          <w:color w:val="17365D"/>
+          <w:sz w:val="17"/>
+        </w:rPr>
+        <w:t>alembic downgrade 0001_m9_3</w:t>
+      </w:r>
+      <w:r>
+        <w:rPr>
+          <w:rFonts w:ascii="Calibri" w:hAnsi="Calibri" w:eastAsia="Microsoft JhengHei"/>
+          <w:b w:val="0"/>
+          <w:i w:val="0"/>
+        </w:rPr>
+        <w:t xml:space="preserve"> 會刪除六張 M9.4 table、其中全部資料及 Job tenant columns。必須另行取得破壞性變更核准；通常優先保留 additive schema、切回 </w:t>
+      </w:r>
+      <w:r>
+        <w:rPr>
+          <w:rFonts w:ascii="Consolas" w:hAnsi="Consolas" w:eastAsia="Microsoft JhengHei"/>
+          <w:b w:val="0"/>
+          <w:i w:val="0"/>
+          <w:color w:val="17365D"/>
+          <w:sz w:val="17"/>
+        </w:rPr>
+        <w:t>m9.3</w:t>
+      </w:r>
+      <w:r>
+        <w:rPr>
+          <w:rFonts w:ascii="Calibri" w:hAnsi="Calibri" w:eastAsia="Microsoft JhengHei"/>
+          <w:b w:val="0"/>
+          <w:i w:val="0"/>
+        </w:rPr>
+        <w:t xml:space="preserve"> application 或採 forward fix。</w:t>
       </w:r>
     </w:p>
     <w:p>
@@ -8147,7 +8931,7 @@
           <w:b w:val="0"/>
           <w:i w:val="0"/>
         </w:rPr>
-        <w:t>公司實機修正後基準為 59 tests 全部通過。實際數量會隨版本增加，不應硬性只等於 59；重點是 0 failed。</w:t>
+        <w:t>公司 M9.3 正式基準為 60 tests；M9.4 功能分支本機基準為 65 tests。實際數量會隨版本增加，不應硬性只等於固定數字；重點是 0 failed。</w:t>
       </w:r>
     </w:p>
     <w:p>
@@ -8702,6 +9486,182 @@
           <w:i w:val="0"/>
         </w:rPr>
         <w:t xml:space="preserve"> 必須 503，不能假裝正常。</w:t>
+      </w:r>
+    </w:p>
+    <w:p>
+      <w:pPr>
+        <w:pStyle w:val="Heading3"/>
+      </w:pPr>
+      <w:r>
+        <w:rPr>
+          <w:rFonts w:ascii="Calibri" w:hAnsi="Calibri" w:eastAsia="Microsoft JhengHei"/>
+          <w:b w:val="0"/>
+          <w:i w:val="0"/>
+        </w:rPr>
+        <w:t>13.7 M9.4 application data 驗收</w:t>
+      </w:r>
+    </w:p>
+    <w:p>
+      <w:pPr>
+        <w:pStyle w:val="ListBullet"/>
+      </w:pPr>
+      <w:r>
+        <w:rPr>
+          <w:rFonts w:ascii="Calibri" w:hAnsi="Calibri" w:eastAsia="Microsoft JhengHei"/>
+          <w:b w:val="0"/>
+          <w:i w:val="0"/>
+        </w:rPr>
+        <w:t xml:space="preserve">Legacy M9.3 Job 在 </w:t>
+      </w:r>
+      <w:r>
+        <w:rPr>
+          <w:rFonts w:ascii="Consolas" w:hAnsi="Consolas" w:eastAsia="Microsoft JhengHei"/>
+          <w:b w:val="0"/>
+          <w:i w:val="0"/>
+          <w:color w:val="17365D"/>
+          <w:sz w:val="17"/>
+        </w:rPr>
+        <w:t>customer_id/system_id</w:t>
+      </w:r>
+      <w:r>
+        <w:rPr>
+          <w:rFonts w:ascii="Calibri" w:hAnsi="Calibri" w:eastAsia="Microsoft JhengHei"/>
+          <w:b w:val="0"/>
+          <w:i w:val="0"/>
+        </w:rPr>
+        <w:t xml:space="preserve"> 為 </w:t>
+      </w:r>
+      <w:r>
+        <w:rPr>
+          <w:rFonts w:ascii="Consolas" w:hAnsi="Consolas" w:eastAsia="Microsoft JhengHei"/>
+          <w:b w:val="0"/>
+          <w:i w:val="0"/>
+          <w:color w:val="17365D"/>
+          <w:sz w:val="17"/>
+        </w:rPr>
+        <w:t>NULL</w:t>
+      </w:r>
+      <w:r>
+        <w:rPr>
+          <w:rFonts w:ascii="Calibri" w:hAnsi="Calibri" w:eastAsia="Microsoft JhengHei"/>
+          <w:b w:val="0"/>
+          <w:i w:val="0"/>
+        </w:rPr>
+        <w:t xml:space="preserve"> 時仍可運作。</w:t>
+      </w:r>
+    </w:p>
+    <w:p>
+      <w:pPr>
+        <w:pStyle w:val="ListBullet"/>
+      </w:pPr>
+      <w:r>
+        <w:rPr>
+          <w:rFonts w:ascii="Calibri" w:hAnsi="Calibri" w:eastAsia="Microsoft JhengHei"/>
+          <w:b w:val="0"/>
+          <w:i w:val="0"/>
+        </w:rPr>
+        <w:t>Customer 內可建立 System 與 Primary／Standby／DR／Witness Node。</w:t>
+      </w:r>
+    </w:p>
+    <w:p>
+      <w:pPr>
+        <w:pStyle w:val="ListBullet"/>
+      </w:pPr>
+      <w:r>
+        <w:rPr>
+          <w:rFonts w:ascii="Calibri" w:hAnsi="Calibri" w:eastAsia="Microsoft JhengHei"/>
+          <w:b w:val="0"/>
+          <w:i w:val="0"/>
+        </w:rPr>
+        <w:t>Topology source／target 必須屬於同一 Customer／System。</w:t>
+      </w:r>
+    </w:p>
+    <w:p>
+      <w:pPr>
+        <w:pStyle w:val="ListBullet"/>
+      </w:pPr>
+      <w:r>
+        <w:rPr>
+          <w:rFonts w:ascii="Calibri" w:hAnsi="Calibri" w:eastAsia="Microsoft JhengHei"/>
+          <w:b w:val="0"/>
+          <w:i w:val="0"/>
+        </w:rPr>
+        <w:t>已關聯 Job 不得改掛另一個 tenant。</w:t>
+      </w:r>
+    </w:p>
+    <w:p>
+      <w:pPr>
+        <w:pStyle w:val="ListBullet"/>
+      </w:pPr>
+      <w:r>
+        <w:rPr>
+          <w:rFonts w:ascii="Calibri" w:hAnsi="Calibri" w:eastAsia="Microsoft JhengHei"/>
+          <w:b w:val="0"/>
+          <w:i w:val="0"/>
+        </w:rPr>
+        <w:t>Evidence／Artifact 只能使用安全相對 storage key，且保存 SHA-256、size、media type。</w:t>
+      </w:r>
+    </w:p>
+    <w:p>
+      <w:pPr>
+        <w:pStyle w:val="ListBullet"/>
+      </w:pPr>
+      <w:r>
+        <w:rPr>
+          <w:rFonts w:ascii="Calibri" w:hAnsi="Calibri" w:eastAsia="Microsoft JhengHei"/>
+          <w:b w:val="0"/>
+          <w:i w:val="0"/>
+        </w:rPr>
+        <w:t xml:space="preserve">大型原始檔與報告留在 </w:t>
+      </w:r>
+      <w:r>
+        <w:rPr>
+          <w:rFonts w:ascii="Consolas" w:hAnsi="Consolas" w:eastAsia="Microsoft JhengHei"/>
+          <w:b w:val="0"/>
+          <w:i w:val="0"/>
+          <w:color w:val="17365D"/>
+          <w:sz w:val="17"/>
+        </w:rPr>
+        <w:t>/data</w:t>
+      </w:r>
+      <w:r>
+        <w:rPr>
+          <w:rFonts w:ascii="Calibri" w:hAnsi="Calibri" w:eastAsia="Microsoft JhengHei"/>
+          <w:b w:val="0"/>
+          <w:i w:val="0"/>
+        </w:rPr>
+        <w:t xml:space="preserve">，EDB 不存 </w:t>
+      </w:r>
+      <w:r>
+        <w:rPr>
+          <w:rFonts w:ascii="Consolas" w:hAnsi="Consolas" w:eastAsia="Microsoft JhengHei"/>
+          <w:b w:val="0"/>
+          <w:i w:val="0"/>
+          <w:color w:val="17365D"/>
+          <w:sz w:val="17"/>
+        </w:rPr>
+        <w:t>BYTEA</w:t>
+      </w:r>
+      <w:r>
+        <w:rPr>
+          <w:rFonts w:ascii="Calibri" w:hAnsi="Calibri" w:eastAsia="Microsoft JhengHei"/>
+          <w:b w:val="0"/>
+          <w:i w:val="0"/>
+        </w:rPr>
+        <w:t>。</w:t>
+      </w:r>
+    </w:p>
+    <w:p>
+      <w:pPr>
+        <w:pStyle w:val="ListBullet"/>
+      </w:pPr>
+      <w:r>
+        <w:rPr>
+          <w:rFonts w:ascii="Calibri" w:hAnsi="Calibri" w:eastAsia="Microsoft JhengHei"/>
+          <w:b w:val="0"/>
+          <w:i w:val="0"/>
+        </w:rPr>
+        <w:t>實際客戶資料只讀投影前後 manifest 必須一致。</w:t>
       </w:r>
     </w:p>
     <w:p>
@@ -10127,6 +11087,19 @@
           <w:b w:val="0"/>
           <w:i w:val="0"/>
         </w:rPr>
+        <w:t>M9.4 起另檢查 Customer／System／Node／Topology／Evidence／Artifact row counts 與孤兒外鍵。</w:t>
+      </w:r>
+    </w:p>
+    <w:p>
+      <w:pPr>
+        <w:pStyle w:val="ListBullet"/>
+      </w:pPr>
+      <w:r>
+        <w:rPr>
+          <w:rFonts w:ascii="Calibri" w:hAnsi="Calibri" w:eastAsia="Microsoft JhengHei"/>
+          <w:b w:val="0"/>
+          <w:i w:val="0"/>
+        </w:rPr>
         <w:t>啟動 Web／Worker，挑一個既有 succeeded job 確認下載。</w:t>
       </w:r>
     </w:p>
@@ -10447,15 +11420,33 @@
           <w:color w:val="17365D"/>
           <w:sz w:val="17"/>
         </w:rPr>
-        <w:t>0001_m9_3</w:t>
-      </w:r>
-      <w:r>
-        <w:rPr>
-          <w:rFonts w:ascii="Calibri" w:hAnsi="Calibri" w:eastAsia="Microsoft JhengHei"/>
-          <w:b w:val="0"/>
-          <w:i w:val="0"/>
-        </w:rPr>
-        <w:t xml:space="preserve"> downgrade 會刪除 </w:t>
+        <w:t>0002_m9_4 → 0001_m9_3</w:t>
+      </w:r>
+      <w:r>
+        <w:rPr>
+          <w:rFonts w:ascii="Calibri" w:hAnsi="Calibri" w:eastAsia="Microsoft JhengHei"/>
+          <w:b w:val="0"/>
+          <w:i w:val="0"/>
+        </w:rPr>
+        <w:t xml:space="preserve"> 會刪除 M9.4 tables／data 與 Job tenant columns；</w:t>
+      </w:r>
+      <w:r>
+        <w:rPr>
+          <w:rFonts w:ascii="Consolas" w:hAnsi="Consolas" w:eastAsia="Microsoft JhengHei"/>
+          <w:b w:val="0"/>
+          <w:i w:val="0"/>
+          <w:color w:val="17365D"/>
+          <w:sz w:val="17"/>
+        </w:rPr>
+        <w:t>0001_m9_3 → base</w:t>
+      </w:r>
+      <w:r>
+        <w:rPr>
+          <w:rFonts w:ascii="Calibri" w:hAnsi="Calibri" w:eastAsia="Microsoft JhengHei"/>
+          <w:b w:val="0"/>
+          <w:i w:val="0"/>
+        </w:rPr>
+        <w:t xml:space="preserve"> 會刪除 </w:t>
       </w:r>
       <w:r>
         <w:rPr>
@@ -11413,7 +12404,25 @@
           <w:b w:val="0"/>
           <w:i w:val="0"/>
         </w:rPr>
-        <w:t>台灣行動支付實際資料在 SCRAM 重啟後通過 13 inputs／13 outputs、QA 8/8、V4 QA、29 頁 PDF 與來源 SHA-256 不變。</w:t>
+        <w:t xml:space="preserve">M9.4 foundation 已在功能分支通過 65 tests、PostgreSQL offline migration 與台灣行動支付 14 檔隔離投影；尚未部署公司 </w:t>
+      </w:r>
+      <w:r>
+        <w:rPr>
+          <w:rFonts w:ascii="Consolas" w:hAnsi="Consolas" w:eastAsia="Microsoft JhengHei"/>
+          <w:b w:val="0"/>
+          <w:i w:val="0"/>
+          <w:color w:val="17365D"/>
+          <w:sz w:val="17"/>
+        </w:rPr>
+        <w:t>.81</w:t>
+      </w:r>
+      <w:r>
+        <w:rPr>
+          <w:rFonts w:ascii="Calibri" w:hAnsi="Calibri" w:eastAsia="Microsoft JhengHei"/>
+          <w:b w:val="0"/>
+          <w:i w:val="0"/>
+        </w:rPr>
+        <w:t>。</w:t>
       </w:r>
     </w:p>
     <w:p>
@@ -11422,39 +12431,11 @@
       </w:pPr>
       <w:r>
         <w:rPr>
-          <w:rFonts w:ascii="Consolas" w:hAnsi="Consolas" w:eastAsia="Microsoft JhengHei"/>
-          <w:b w:val="0"/>
-          <w:i w:val="0"/>
-          <w:color w:val="17365D"/>
-          <w:sz w:val="17"/>
-        </w:rPr>
-        <w:t>.81</w:t>
-      </w:r>
-      <w:r>
-        <w:rPr>
-          <w:rFonts w:ascii="Calibri" w:hAnsi="Calibri" w:eastAsia="Microsoft JhengHei"/>
-          <w:b w:val="0"/>
-          <w:i w:val="0"/>
-        </w:rPr>
-        <w:t xml:space="preserve"> 的 OMNIcheck 精確規則已要求 SCRAM；cluster-wide </w:t>
-      </w:r>
-      <w:r>
-        <w:rPr>
-          <w:rFonts w:ascii="Consolas" w:hAnsi="Consolas" w:eastAsia="Microsoft JhengHei"/>
-          <w:b w:val="0"/>
-          <w:i w:val="0"/>
-          <w:color w:val="17365D"/>
-          <w:sz w:val="17"/>
-        </w:rPr>
-        <w:t>host all all 0.0.0.0/0 trust</w:t>
-      </w:r>
-      <w:r>
-        <w:rPr>
-          <w:rFonts w:ascii="Calibri" w:hAnsi="Calibri" w:eastAsia="Microsoft JhengHei"/>
-          <w:b w:val="0"/>
-          <w:i w:val="0"/>
-        </w:rPr>
-        <w:t xml:space="preserve"> 仍是其他連線的安全風險，需另案收斂。</w:t>
+          <w:rFonts w:ascii="Calibri" w:hAnsi="Calibri" w:eastAsia="Microsoft JhengHei"/>
+          <w:b w:val="0"/>
+          <w:i w:val="0"/>
+        </w:rPr>
+        <w:t>台灣行動支付實際資料在 SCRAM 重啟後通過 13 inputs／13 outputs、QA 8/8、V4 QA、29 頁 PDF 與來源 SHA-256 不變。</w:t>
       </w:r>
     </w:p>
     <w:p>
@@ -11463,11 +12444,39 @@
       </w:pPr>
       <w:r>
         <w:rPr>
-          <w:rFonts w:ascii="Calibri" w:hAnsi="Calibri" w:eastAsia="Microsoft JhengHei"/>
-          <w:b w:val="0"/>
-          <w:i w:val="0"/>
-        </w:rPr>
-        <w:t>兩次修正前 API 500 留下兩筆空的 draft Golden 測試案件；尚未執行破壞性清除。</w:t>
+          <w:rFonts w:ascii="Consolas" w:hAnsi="Consolas" w:eastAsia="Microsoft JhengHei"/>
+          <w:b w:val="0"/>
+          <w:i w:val="0"/>
+          <w:color w:val="17365D"/>
+          <w:sz w:val="17"/>
+        </w:rPr>
+        <w:t>.81</w:t>
+      </w:r>
+      <w:r>
+        <w:rPr>
+          <w:rFonts w:ascii="Calibri" w:hAnsi="Calibri" w:eastAsia="Microsoft JhengHei"/>
+          <w:b w:val="0"/>
+          <w:i w:val="0"/>
+        </w:rPr>
+        <w:t xml:space="preserve"> 的 OMNIcheck 精確規則已要求 SCRAM；cluster-wide </w:t>
+      </w:r>
+      <w:r>
+        <w:rPr>
+          <w:rFonts w:ascii="Consolas" w:hAnsi="Consolas" w:eastAsia="Microsoft JhengHei"/>
+          <w:b w:val="0"/>
+          <w:i w:val="0"/>
+          <w:color w:val="17365D"/>
+          <w:sz w:val="17"/>
+        </w:rPr>
+        <w:t>host all all 0.0.0.0/0 trust</w:t>
+      </w:r>
+      <w:r>
+        <w:rPr>
+          <w:rFonts w:ascii="Calibri" w:hAnsi="Calibri" w:eastAsia="Microsoft JhengHei"/>
+          <w:b w:val="0"/>
+          <w:i w:val="0"/>
+        </w:rPr>
+        <w:t xml:space="preserve"> 仍是其他連線的安全風險，需另案收斂。</w:t>
       </w:r>
     </w:p>
     <w:p>
@@ -11480,7 +12489,7 @@
           <w:b w:val="0"/>
           <w:i w:val="0"/>
         </w:rPr>
-        <w:t>正式 TLS/VIP、EFM failover、reverse proxy、登入／RBAC 尚未完成。</w:t>
+        <w:t>兩次修正前 API 500 留下兩筆空的 draft Golden 測試案件；尚未執行破壞性清除。</w:t>
       </w:r>
     </w:p>
     <w:p>
@@ -11493,7 +12502,7 @@
           <w:b w:val="0"/>
           <w:i w:val="0"/>
         </w:rPr>
-        <w:t>完全未知資料包尚不能自動決定節點角色，仍需使用者確認。</w:t>
+        <w:t>正式 TLS/VIP、EFM failover、reverse proxy、登入／RBAC 尚未完成。</w:t>
       </w:r>
     </w:p>
     <w:p>
@@ -11506,7 +12515,7 @@
           <w:b w:val="0"/>
           <w:i w:val="0"/>
         </w:rPr>
-        <w:t>Barman 真實 wrapper fixture 待提供。</w:t>
+        <w:t>完全未知資料包尚不能自動決定節點角色，仍需使用者確認。</w:t>
       </w:r>
     </w:p>
     <w:p>
@@ -11519,7 +12528,7 @@
           <w:b w:val="0"/>
           <w:i w:val="0"/>
         </w:rPr>
-        <w:t>Python dependency 目前為 version ranges，正式 reproducible build 尚需 lock／wheelhouse。</w:t>
+        <w:t>Barman 真實 wrapper fixture 待提供。</w:t>
       </w:r>
     </w:p>
     <w:p>
@@ -11532,7 +12541,7 @@
           <w:b w:val="0"/>
           <w:i w:val="0"/>
         </w:rPr>
-        <w:t>歷史比較、CVE cache、可選 AI gateway 尚未實作。</w:t>
+        <w:t>Python dependency 目前為 version ranges，正式 reproducible build 尚需 lock／wheelhouse。</w:t>
       </w:r>
     </w:p>
     <w:p>
@@ -11545,7 +12554,20 @@
           <w:b w:val="0"/>
           <w:i w:val="0"/>
         </w:rPr>
-        <w:t>EDB 中心化與 CVE 自動化方向已核准，但 Persistence Adapter、Application Data tables、Artifact Registry 與 CVE tables 尚未實作。</w:t>
+        <w:t>歷史比較、CVE cache、可選 AI gateway 尚未實作。</w:t>
+      </w:r>
+    </w:p>
+    <w:p>
+      <w:pPr>
+        <w:pStyle w:val="ListBullet"/>
+      </w:pPr>
+      <w:r>
+        <w:rPr>
+          <w:rFonts w:ascii="Calibri" w:hAnsi="Calibri" w:eastAsia="Microsoft JhengHei"/>
+          <w:b w:val="0"/>
+          <w:i w:val="0"/>
+        </w:rPr>
+        <w:t>EDB 中心化與 CVE 自動化方向已核准；Application Data foundation tables 已實作，完整 Persistence Adapter、Artifact lifecycle 與 CVE tables 尚未實作。</w:t>
       </w:r>
     </w:p>
     <w:p>
@@ -11759,6 +12781,47 @@
           <w:sz w:val="17"/>
         </w:rPr>
         <w:t>docs/M9_3_VALIDATION.md</w:t>
+      </w:r>
+    </w:p>
+    <w:p>
+      <w:pPr>
+        <w:pStyle w:val="ListBullet"/>
+      </w:pPr>
+      <w:r>
+        <w:rPr>
+          <w:rFonts w:ascii="Calibri" w:hAnsi="Calibri" w:eastAsia="Microsoft JhengHei"/>
+          <w:b w:val="0"/>
+          <w:i w:val="0"/>
+        </w:rPr>
+        <w:t>M9.4：</w:t>
+      </w:r>
+      <w:r>
+        <w:rPr>
+          <w:rFonts w:ascii="Consolas" w:hAnsi="Consolas" w:eastAsia="Microsoft JhengHei"/>
+          <w:b w:val="0"/>
+          <w:i w:val="0"/>
+          <w:color w:val="17365D"/>
+          <w:sz w:val="17"/>
+        </w:rPr>
+        <w:t>docs/M9_4_APPLICATION_DATA_FOUNDATION.md</w:t>
+      </w:r>
+      <w:r>
+        <w:rPr>
+          <w:rFonts w:ascii="Calibri" w:hAnsi="Calibri" w:eastAsia="Microsoft JhengHei"/>
+          <w:b w:val="0"/>
+          <w:i w:val="0"/>
+        </w:rPr>
+        <w:t>、</w:t>
+      </w:r>
+      <w:r>
+        <w:rPr>
+          <w:rFonts w:ascii="Consolas" w:hAnsi="Consolas" w:eastAsia="Microsoft JhengHei"/>
+          <w:b w:val="0"/>
+          <w:i w:val="0"/>
+          <w:color w:val="17365D"/>
+          <w:sz w:val="17"/>
+        </w:rPr>
+        <w:t>docs/M9_4_VALIDATION.md</w:t>
       </w:r>
     </w:p>
     <w:p>

</xml_diff>

<commit_message>
docs: record M9.4 company deployment validation
</commit_message>
<xml_diff>
--- a/docs/OMNICHECK_AI_BUILD_AND_OPERATIONS_GUIDE.docx
+++ b/docs/OMNICHECK_AI_BUILD_AND_OPERATIONS_GUIDE.docx
@@ -103,7 +103,7 @@
           <w:b w:val="0"/>
           <w:i w:val="0"/>
         </w:rPr>
-        <w:t>文件版本：0.9.4-draft.1</w:t>
+        <w:t>文件版本：0.9.4-draft.2</w:t>
       </w:r>
     </w:p>
     <w:p>
@@ -1495,6 +1495,150 @@
                 <w:sz w:val="17"/>
               </w:rPr>
               <w:t>驗證狀態</w:t>
+            </w:r>
+          </w:p>
+        </w:tc>
+      </w:tr>
+      <w:tr>
+        <w:tc>
+          <w:tcPr>
+            <w:tcW w:type="dxa" w:w="2470"/>
+            <w:vAlign w:val="center"/>
+            <w:tcMar>
+              <w:top w:w="45" w:type="dxa"/>
+              <w:start w:w="120" w:type="dxa"/>
+              <w:bottom w:w="45" w:type="dxa"/>
+              <w:end w:w="120" w:type="dxa"/>
+            </w:tcMar>
+          </w:tcPr>
+          <w:p>
+            <w:pPr>
+              <w:spacing w:after="0"/>
+            </w:pPr>
+            <w:r>
+              <w:rPr>
+                <w:rFonts w:ascii="Calibri" w:hAnsi="Calibri" w:eastAsia="Microsoft JhengHei"/>
+                <w:b w:val="0"/>
+                <w:i w:val="0"/>
+                <w:sz w:val="17"/>
+              </w:rPr>
+              <w:t>0.9.4-draft.2</w:t>
+            </w:r>
+          </w:p>
+        </w:tc>
+        <w:tc>
+          <w:tcPr>
+            <w:tcW w:type="dxa" w:w="2470"/>
+            <w:vAlign w:val="center"/>
+            <w:tcMar>
+              <w:top w:w="45" w:type="dxa"/>
+              <w:start w:w="120" w:type="dxa"/>
+              <w:bottom w:w="45" w:type="dxa"/>
+              <w:end w:w="120" w:type="dxa"/>
+            </w:tcMar>
+          </w:tcPr>
+          <w:p>
+            <w:pPr>
+              <w:spacing w:after="0"/>
+            </w:pPr>
+            <w:r>
+              <w:rPr>
+                <w:rFonts w:ascii="Calibri" w:hAnsi="Calibri" w:eastAsia="Microsoft JhengHei"/>
+                <w:b w:val="0"/>
+                <w:i w:val="0"/>
+                <w:sz w:val="17"/>
+              </w:rPr>
+              <w:t>2026-08-05</w:t>
+            </w:r>
+          </w:p>
+        </w:tc>
+        <w:tc>
+          <w:tcPr>
+            <w:tcW w:type="dxa" w:w="2470"/>
+            <w:vAlign w:val="center"/>
+            <w:tcMar>
+              <w:top w:w="45" w:type="dxa"/>
+              <w:start w:w="120" w:type="dxa"/>
+              <w:bottom w:w="45" w:type="dxa"/>
+              <w:end w:w="120" w:type="dxa"/>
+            </w:tcMar>
+          </w:tcPr>
+          <w:p>
+            <w:pPr>
+              <w:spacing w:after="0"/>
+            </w:pPr>
+            <w:r>
+              <w:rPr>
+                <w:rFonts w:ascii="Calibri" w:hAnsi="Calibri" w:eastAsia="Microsoft JhengHei"/>
+                <w:b w:val="0"/>
+                <w:i w:val="0"/>
+                <w:sz w:val="17"/>
+              </w:rPr>
+              <w:t xml:space="preserve">完成公司 </w:t>
+            </w:r>
+            <w:r>
+              <w:rPr>
+                <w:rFonts w:ascii="Consolas" w:hAnsi="Consolas" w:eastAsia="Microsoft JhengHei"/>
+                <w:b w:val="0"/>
+                <w:i w:val="0"/>
+                <w:color w:val="17365D"/>
+                <w:sz w:val="17"/>
+              </w:rPr>
+              <w:t>.77/.81</w:t>
+            </w:r>
+            <w:r>
+              <w:rPr>
+                <w:rFonts w:ascii="Calibri" w:hAnsi="Calibri" w:eastAsia="Microsoft JhengHei"/>
+                <w:b w:val="0"/>
+                <w:i w:val="0"/>
+                <w:sz w:val="17"/>
+              </w:rPr>
+              <w:t xml:space="preserve"> M9.4 migration、release 切換與 live Queue 驗收</w:t>
+            </w:r>
+          </w:p>
+        </w:tc>
+        <w:tc>
+          <w:tcPr>
+            <w:tcW w:type="dxa" w:w="2470"/>
+            <w:vAlign w:val="center"/>
+            <w:tcMar>
+              <w:top w:w="45" w:type="dxa"/>
+              <w:start w:w="120" w:type="dxa"/>
+              <w:bottom w:w="45" w:type="dxa"/>
+              <w:end w:w="120" w:type="dxa"/>
+            </w:tcMar>
+          </w:tcPr>
+          <w:p>
+            <w:pPr>
+              <w:spacing w:after="0"/>
+            </w:pPr>
+            <w:r>
+              <w:rPr>
+                <w:rFonts w:ascii="Calibri" w:hAnsi="Calibri" w:eastAsia="Microsoft JhengHei"/>
+                <w:b w:val="0"/>
+                <w:i w:val="0"/>
+                <w:sz w:val="17"/>
+              </w:rPr>
+              <w:t>Backup/hash、VM 65 tests、</w:t>
+            </w:r>
+            <w:r>
+              <w:rPr>
+                <w:rFonts w:ascii="Consolas" w:hAnsi="Consolas" w:eastAsia="Microsoft JhengHei"/>
+                <w:b w:val="0"/>
+                <w:i w:val="0"/>
+                <w:color w:val="17365D"/>
+                <w:sz w:val="17"/>
+              </w:rPr>
+              <w:t>0002_m9_4</w:t>
+            </w:r>
+            <w:r>
+              <w:rPr>
+                <w:rFonts w:ascii="Calibri" w:hAnsi="Calibri" w:eastAsia="Microsoft JhengHei"/>
+                <w:b w:val="0"/>
+                <w:i w:val="0"/>
+                <w:sz w:val="17"/>
+              </w:rPr>
+              <w:t>、constraints、rollback smoke、health 與 Golden Job 通過</w:t>
             </w:r>
           </w:p>
         </w:tc>
@@ -3006,7 +3150,7 @@
                 <w:i w:val="0"/>
                 <w:sz w:val="17"/>
               </w:rPr>
-              <w:t>功能分支本機完成</w:t>
+              <w:t>功能分支與公司部署完成</w:t>
             </w:r>
           </w:p>
         </w:tc>
@@ -3032,7 +3176,7 @@
                 <w:i w:val="0"/>
                 <w:sz w:val="17"/>
               </w:rPr>
-              <w:t>Customer／System／Node／Topology／Evidence／Artifact、tenant key；公司 EDB 待驗證</w:t>
+              <w:t>Customer／System／Node／Topology／Evidence／Artifact、tenant key；待 merge／tag</w:t>
             </w:r>
           </w:p>
         </w:tc>
@@ -8214,7 +8358,7 @@
           <w:b w:val="0"/>
           <w:i w:val="0"/>
         </w:rPr>
-        <w:t xml:space="preserve">目前只在本機 SQLite 與 PostgreSQL offline SQL 驗證，尚未於公司 </w:t>
+        <w:t xml:space="preserve">公司 </w:t>
       </w:r>
       <w:r>
         <w:rPr>
@@ -8224,15 +8368,15 @@
           <w:color w:val="17365D"/>
           <w:sz w:val="17"/>
         </w:rPr>
-        <w:t>.81</w:t>
-      </w:r>
-      <w:r>
-        <w:rPr>
-          <w:rFonts w:ascii="Calibri" w:hAnsi="Calibri" w:eastAsia="Microsoft JhengHei"/>
-          <w:b w:val="0"/>
-          <w:i w:val="0"/>
-        </w:rPr>
-        <w:t xml:space="preserve"> 執行。安排公司測試時：</w:t>
+        <w:t>.77/.81</w:t>
+      </w:r>
+      <w:r>
+        <w:rPr>
+          <w:rFonts w:ascii="Calibri" w:hAnsi="Calibri" w:eastAsia="Microsoft JhengHei"/>
+          <w:b w:val="0"/>
+          <w:i w:val="0"/>
+        </w:rPr>
+        <w:t xml:space="preserve"> 已依下列流程完成；新環境或後續升級仍必須重做：</w:t>
       </w:r>
     </w:p>
     <w:p>
@@ -8447,6 +8591,106 @@
           <w:i w:val="0"/>
         </w:rPr>
         <w:t xml:space="preserve"> application 或採 forward fix。</w:t>
+      </w:r>
+    </w:p>
+    <w:p>
+      <w:r>
+        <w:rPr>
+          <w:rFonts w:ascii="Calibri" w:hAnsi="Calibri" w:eastAsia="Microsoft JhengHei"/>
+          <w:b w:val="0"/>
+          <w:i w:val="0"/>
+        </w:rPr>
+        <w:t xml:space="preserve">公司驗證結果：升級前先保存 </w:t>
+      </w:r>
+      <w:r>
+        <w:rPr>
+          <w:rFonts w:ascii="Consolas" w:hAnsi="Consolas" w:eastAsia="Microsoft JhengHei"/>
+          <w:b w:val="0"/>
+          <w:i w:val="0"/>
+          <w:color w:val="17365D"/>
+          <w:sz w:val="17"/>
+        </w:rPr>
+        <w:t>/data/omnicheck/archive/omnicheck_app_pre_m9_4_20260805.dump</w:t>
+      </w:r>
+      <w:r>
+        <w:rPr>
+          <w:rFonts w:ascii="Calibri" w:hAnsi="Calibri" w:eastAsia="Microsoft JhengHei"/>
+          <w:b w:val="0"/>
+          <w:i w:val="0"/>
+        </w:rPr>
+        <w:t xml:space="preserve">，SHA-256 為 </w:t>
+      </w:r>
+      <w:r>
+        <w:rPr>
+          <w:rFonts w:ascii="Consolas" w:hAnsi="Consolas" w:eastAsia="Microsoft JhengHei"/>
+          <w:b w:val="0"/>
+          <w:i w:val="0"/>
+          <w:color w:val="17365D"/>
+          <w:sz w:val="17"/>
+        </w:rPr>
+        <w:t>e07edb51bcab5d71e14c4de19ad5c539186bfc6ea650e658da2c8cf07e7822df</w:t>
+      </w:r>
+      <w:r>
+        <w:rPr>
+          <w:rFonts w:ascii="Calibri" w:hAnsi="Calibri" w:eastAsia="Microsoft JhengHei"/>
+          <w:b w:val="0"/>
+          <w:i w:val="0"/>
+        </w:rPr>
+        <w:t xml:space="preserve">，且 </w:t>
+      </w:r>
+      <w:r>
+        <w:rPr>
+          <w:rFonts w:ascii="Consolas" w:hAnsi="Consolas" w:eastAsia="Microsoft JhengHei"/>
+          <w:b w:val="0"/>
+          <w:i w:val="0"/>
+          <w:color w:val="17365D"/>
+          <w:sz w:val="17"/>
+        </w:rPr>
+        <w:t>pg_restore --list</w:t>
+      </w:r>
+      <w:r>
+        <w:rPr>
+          <w:rFonts w:ascii="Calibri" w:hAnsi="Calibri" w:eastAsia="Microsoft JhengHei"/>
+          <w:b w:val="0"/>
+          <w:i w:val="0"/>
+        </w:rPr>
+        <w:t xml:space="preserve"> 可讀。Release </w:t>
+      </w:r>
+      <w:r>
+        <w:rPr>
+          <w:rFonts w:ascii="Consolas" w:hAnsi="Consolas" w:eastAsia="Microsoft JhengHei"/>
+          <w:b w:val="0"/>
+          <w:i w:val="0"/>
+          <w:color w:val="17365D"/>
+          <w:sz w:val="17"/>
+        </w:rPr>
+        <w:t>9dc7d76</w:t>
+      </w:r>
+      <w:r>
+        <w:rPr>
+          <w:rFonts w:ascii="Calibri" w:hAnsi="Calibri" w:eastAsia="Microsoft JhengHei"/>
+          <w:b w:val="0"/>
+          <w:i w:val="0"/>
+        </w:rPr>
+        <w:t xml:space="preserve"> 在 VM 通過 65 tests，schema 升至 </w:t>
+      </w:r>
+      <w:r>
+        <w:rPr>
+          <w:rFonts w:ascii="Consolas" w:hAnsi="Consolas" w:eastAsia="Microsoft JhengHei"/>
+          <w:b w:val="0"/>
+          <w:i w:val="0"/>
+          <w:color w:val="17365D"/>
+          <w:sz w:val="17"/>
+        </w:rPr>
+        <w:t>0002_m9_4 (head)</w:t>
+      </w:r>
+      <w:r>
+        <w:rPr>
+          <w:rFonts w:ascii="Calibri" w:hAnsi="Calibri" w:eastAsia="Microsoft JhengHei"/>
+          <w:b w:val="0"/>
+          <w:i w:val="0"/>
+        </w:rPr>
+        <w:t>；六張新表、constraints、legacy Job、transaction rollback smoke、Web／Worker 與 live Golden Queue 均通過。完整 restore 與實際 downgrade drill 尚未執行。</w:t>
       </w:r>
     </w:p>
     <w:p>
@@ -12404,7 +12648,7 @@
           <w:b w:val="0"/>
           <w:i w:val="0"/>
         </w:rPr>
-        <w:t xml:space="preserve">M9.4 foundation 已在功能分支通過 65 tests、PostgreSQL offline migration 與台灣行動支付 14 檔隔離投影；尚未部署公司 </w:t>
+        <w:t xml:space="preserve">M9.4 已部署公司 </w:t>
       </w:r>
       <w:r>
         <w:rPr>
@@ -12414,15 +12658,69 @@
           <w:color w:val="17365D"/>
           <w:sz w:val="17"/>
         </w:rPr>
-        <w:t>.81</w:t>
-      </w:r>
-      <w:r>
-        <w:rPr>
-          <w:rFonts w:ascii="Calibri" w:hAnsi="Calibri" w:eastAsia="Microsoft JhengHei"/>
-          <w:b w:val="0"/>
-          <w:i w:val="0"/>
-        </w:rPr>
-        <w:t>。</w:t>
+        <w:t>.77/.81</w:t>
+      </w:r>
+      <w:r>
+        <w:rPr>
+          <w:rFonts w:ascii="Calibri" w:hAnsi="Calibri" w:eastAsia="Microsoft JhengHei"/>
+          <w:b w:val="0"/>
+          <w:i w:val="0"/>
+        </w:rPr>
+        <w:t xml:space="preserve">：current release </w:t>
+      </w:r>
+      <w:r>
+        <w:rPr>
+          <w:rFonts w:ascii="Consolas" w:hAnsi="Consolas" w:eastAsia="Microsoft JhengHei"/>
+          <w:b w:val="0"/>
+          <w:i w:val="0"/>
+          <w:color w:val="17365D"/>
+          <w:sz w:val="17"/>
+        </w:rPr>
+        <w:t>9dc7d76</w:t>
+      </w:r>
+      <w:r>
+        <w:rPr>
+          <w:rFonts w:ascii="Calibri" w:hAnsi="Calibri" w:eastAsia="Microsoft JhengHei"/>
+          <w:b w:val="0"/>
+          <w:i w:val="0"/>
+        </w:rPr>
+        <w:t xml:space="preserve">、Alembic </w:t>
+      </w:r>
+      <w:r>
+        <w:rPr>
+          <w:rFonts w:ascii="Consolas" w:hAnsi="Consolas" w:eastAsia="Microsoft JhengHei"/>
+          <w:b w:val="0"/>
+          <w:i w:val="0"/>
+          <w:color w:val="17365D"/>
+          <w:sz w:val="17"/>
+        </w:rPr>
+        <w:t>0002_m9_4</w:t>
+      </w:r>
+      <w:r>
+        <w:rPr>
+          <w:rFonts w:ascii="Calibri" w:hAnsi="Calibri" w:eastAsia="Microsoft JhengHei"/>
+          <w:b w:val="0"/>
+          <w:i w:val="0"/>
+        </w:rPr>
+        <w:t xml:space="preserve">、Web／Worker active、Golden Job </w:t>
+      </w:r>
+      <w:r>
+        <w:rPr>
+          <w:rFonts w:ascii="Consolas" w:hAnsi="Consolas" w:eastAsia="Microsoft JhengHei"/>
+          <w:b w:val="0"/>
+          <w:i w:val="0"/>
+          <w:color w:val="17365D"/>
+          <w:sz w:val="17"/>
+        </w:rPr>
+        <w:t>cf384056cf7045878f12341324cb1852</w:t>
+      </w:r>
+      <w:r>
+        <w:rPr>
+          <w:rFonts w:ascii="Calibri" w:hAnsi="Calibri" w:eastAsia="Microsoft JhengHei"/>
+          <w:b w:val="0"/>
+          <w:i w:val="0"/>
+        </w:rPr>
+        <w:t xml:space="preserve"> succeeded。尚未 merge／tag，完整 restore／downgrade drill 尚待安排。</w:t>
       </w:r>
     </w:p>
     <w:p>

</xml_diff>

<commit_message>
feat: persist M9.5 pipeline results
</commit_message>
<xml_diff>
--- a/docs/OMNICHECK_AI_BUILD_AND_OPERATIONS_GUIDE.docx
+++ b/docs/OMNICHECK_AI_BUILD_AND_OPERATIONS_GUIDE.docx
@@ -103,7 +103,7 @@
           <w:b w:val="0"/>
           <w:i w:val="0"/>
         </w:rPr>
-        <w:t>文件版本：0.9.4</w:t>
+        <w:t>文件版本：0.9.5-draft.1</w:t>
       </w:r>
     </w:p>
     <w:p>
@@ -1477,6 +1477,112 @@
                 <w:sz w:val="17"/>
               </w:rPr>
               <w:t>驗證狀態</w:t>
+            </w:r>
+          </w:p>
+        </w:tc>
+      </w:tr>
+      <w:tr>
+        <w:tc>
+          <w:tcPr>
+            <w:tcW w:type="dxa" w:w="2470"/>
+            <w:vAlign w:val="center"/>
+            <w:tcMar>
+              <w:top w:w="45" w:type="dxa"/>
+              <w:start w:w="120" w:type="dxa"/>
+              <w:bottom w:w="45" w:type="dxa"/>
+              <w:end w:w="120" w:type="dxa"/>
+            </w:tcMar>
+          </w:tcPr>
+          <w:p>
+            <w:pPr>
+              <w:spacing w:after="0"/>
+            </w:pPr>
+            <w:r>
+              <w:rPr>
+                <w:rFonts w:ascii="Calibri" w:hAnsi="Calibri" w:eastAsia="Microsoft JhengHei"/>
+                <w:b w:val="0"/>
+                <w:i w:val="0"/>
+                <w:sz w:val="17"/>
+              </w:rPr>
+              <w:t>0.9.5-draft.1</w:t>
+            </w:r>
+          </w:p>
+        </w:tc>
+        <w:tc>
+          <w:tcPr>
+            <w:tcW w:type="dxa" w:w="2470"/>
+            <w:vAlign w:val="center"/>
+            <w:tcMar>
+              <w:top w:w="45" w:type="dxa"/>
+              <w:start w:w="120" w:type="dxa"/>
+              <w:bottom w:w="45" w:type="dxa"/>
+              <w:end w:w="120" w:type="dxa"/>
+            </w:tcMar>
+          </w:tcPr>
+          <w:p>
+            <w:pPr>
+              <w:spacing w:after="0"/>
+            </w:pPr>
+            <w:r>
+              <w:rPr>
+                <w:rFonts w:ascii="Calibri" w:hAnsi="Calibri" w:eastAsia="Microsoft JhengHei"/>
+                <w:b w:val="0"/>
+                <w:i w:val="0"/>
+                <w:sz w:val="17"/>
+              </w:rPr>
+              <w:t>2026-08-05</w:t>
+            </w:r>
+          </w:p>
+        </w:tc>
+        <w:tc>
+          <w:tcPr>
+            <w:tcW w:type="dxa" w:w="2470"/>
+            <w:vAlign w:val="center"/>
+            <w:tcMar>
+              <w:top w:w="45" w:type="dxa"/>
+              <w:start w:w="120" w:type="dxa"/>
+              <w:bottom w:w="45" w:type="dxa"/>
+              <w:end w:w="120" w:type="dxa"/>
+            </w:tcMar>
+          </w:tcPr>
+          <w:p>
+            <w:pPr>
+              <w:spacing w:after="0"/>
+            </w:pPr>
+            <w:r>
+              <w:rPr>
+                <w:rFonts w:ascii="Calibri" w:hAnsi="Calibri" w:eastAsia="Microsoft JhengHei"/>
+                <w:b w:val="0"/>
+                <w:i w:val="0"/>
+                <w:sz w:val="17"/>
+              </w:rPr>
+              <w:t>新增 M9.5 scoped Pipeline snapshot、row-level persistence、冪等與 failure gate</w:t>
+            </w:r>
+          </w:p>
+        </w:tc>
+        <w:tc>
+          <w:tcPr>
+            <w:tcW w:type="dxa" w:w="2470"/>
+            <w:vAlign w:val="center"/>
+            <w:tcMar>
+              <w:top w:w="45" w:type="dxa"/>
+              <w:start w:w="120" w:type="dxa"/>
+              <w:bottom w:w="45" w:type="dxa"/>
+              <w:end w:w="120" w:type="dxa"/>
+            </w:tcMar>
+          </w:tcPr>
+          <w:p>
+            <w:pPr>
+              <w:spacing w:after="0"/>
+            </w:pPr>
+            <w:r>
+              <w:rPr>
+                <w:rFonts w:ascii="Calibri" w:hAnsi="Calibri" w:eastAsia="Microsoft JhengHei"/>
+                <w:b w:val="0"/>
+                <w:i w:val="0"/>
+                <w:sz w:val="17"/>
+              </w:rPr>
+              <w:t>本機 70 tests、offline migration 與實際資料唯讀投影通過；公司 EDB 待驗證</w:t>
             </w:r>
           </w:p>
         </w:tc>
@@ -3292,7 +3398,87 @@
                 <w:i w:val="0"/>
                 <w:sz w:val="17"/>
               </w:rPr>
-              <w:t>M9.5～M15</w:t>
+              <w:t>M9.5</w:t>
+            </w:r>
+          </w:p>
+        </w:tc>
+        <w:tc>
+          <w:tcPr>
+            <w:tcW w:type="dxa" w:w="3293"/>
+            <w:vAlign w:val="center"/>
+            <w:tcMar>
+              <w:top w:w="45" w:type="dxa"/>
+              <w:start w:w="120" w:type="dxa"/>
+              <w:bottom w:w="45" w:type="dxa"/>
+              <w:end w:w="120" w:type="dxa"/>
+            </w:tcMar>
+          </w:tcPr>
+          <w:p>
+            <w:pPr>
+              <w:spacing w:after="0"/>
+            </w:pPr>
+            <w:r>
+              <w:rPr>
+                <w:rFonts w:ascii="Calibri" w:hAnsi="Calibri" w:eastAsia="Microsoft JhengHei"/>
+                <w:b w:val="0"/>
+                <w:i w:val="0"/>
+                <w:sz w:val="17"/>
+              </w:rPr>
+              <w:t>功能分支本機完成</w:t>
+            </w:r>
+          </w:p>
+        </w:tc>
+        <w:tc>
+          <w:tcPr>
+            <w:tcW w:type="dxa" w:w="3293"/>
+            <w:vAlign w:val="center"/>
+            <w:tcMar>
+              <w:top w:w="45" w:type="dxa"/>
+              <w:start w:w="120" w:type="dxa"/>
+              <w:bottom w:w="45" w:type="dxa"/>
+              <w:end w:w="120" w:type="dxa"/>
+            </w:tcMar>
+          </w:tcPr>
+          <w:p>
+            <w:pPr>
+              <w:spacing w:after="0"/>
+            </w:pPr>
+            <w:r>
+              <w:rPr>
+                <w:rFonts w:ascii="Calibri" w:hAnsi="Calibri" w:eastAsia="Microsoft JhengHei"/>
+                <w:b w:val="0"/>
+                <w:i w:val="0"/>
+                <w:sz w:val="17"/>
+              </w:rPr>
+              <w:t>Scope／Normalized／Config／Assessment／Coverage／QA 冪等 EDB 投影；公司 EDB 待驗證</w:t>
+            </w:r>
+          </w:p>
+        </w:tc>
+      </w:tr>
+      <w:tr>
+        <w:tc>
+          <w:tcPr>
+            <w:tcW w:type="dxa" w:w="3293"/>
+            <w:vAlign w:val="center"/>
+            <w:tcMar>
+              <w:top w:w="45" w:type="dxa"/>
+              <w:start w:w="120" w:type="dxa"/>
+              <w:bottom w:w="45" w:type="dxa"/>
+              <w:end w:w="120" w:type="dxa"/>
+            </w:tcMar>
+          </w:tcPr>
+          <w:p>
+            <w:pPr>
+              <w:spacing w:after="0"/>
+            </w:pPr>
+            <w:r>
+              <w:rPr>
+                <w:rFonts w:ascii="Calibri" w:hAnsi="Calibri" w:eastAsia="Microsoft JhengHei"/>
+                <w:b w:val="0"/>
+                <w:i w:val="0"/>
+                <w:sz w:val="17"/>
+              </w:rPr>
+              <w:t>M9.6～M15</w:t>
             </w:r>
           </w:p>
         </w:tc>
@@ -3344,7 +3530,7 @@
                 <w:i w:val="0"/>
                 <w:sz w:val="17"/>
               </w:rPr>
-              <w:t>Pipeline Persistence、Artifact lifecycle、拓撲確認、權限、歷史、CVE、選配 AI 與生產強化</w:t>
+              <w:t>Artifact lifecycle、拓撲確認、權限、歷史、CVE、選配 AI 與生產強化</w:t>
             </w:r>
           </w:p>
         </w:tc>
@@ -7855,6 +8041,8 @@
               <w:t>OMNICHECK_WORKER_HEARTBEAT_SECONDS=30</w:t>
               <w:br/>
               <w:t>OMNICHECK_WORKER_STALE_SECONDS=3600</w:t>
+              <w:br/>
+              <w:t>OMNICHECK_PERSIST_RESULTS=true</w:t>
             </w:r>
           </w:p>
         </w:tc>
@@ -8797,6 +8985,219 @@
           <w:i w:val="0"/>
         </w:rPr>
         <w:t>；六張新表、constraints、legacy Job、transaction rollback smoke、Web／Worker 與 live Golden Queue 均通過。完整 restore 與實際 downgrade drill 尚未執行。</w:t>
+      </w:r>
+    </w:p>
+    <w:p>
+      <w:pPr>
+        <w:pStyle w:val="Heading3"/>
+      </w:pPr>
+      <w:r>
+        <w:rPr>
+          <w:rFonts w:ascii="Calibri" w:hAnsi="Calibri" w:eastAsia="Microsoft JhengHei"/>
+          <w:b w:val="0"/>
+          <w:i w:val="0"/>
+        </w:rPr>
+        <w:t>10.4 M9.5 migration（公司環境待驗證）</w:t>
+      </w:r>
+    </w:p>
+    <w:p>
+      <w:r>
+        <w:rPr>
+          <w:rFonts w:ascii="Consolas" w:hAnsi="Consolas" w:eastAsia="Microsoft JhengHei"/>
+          <w:b w:val="0"/>
+          <w:i w:val="0"/>
+          <w:color w:val="17365D"/>
+          <w:sz w:val="17"/>
+        </w:rPr>
+        <w:t>0003_m9_5</w:t>
+      </w:r>
+      <w:r>
+        <w:rPr>
+          <w:rFonts w:ascii="Calibri" w:hAnsi="Calibri" w:eastAsia="Microsoft JhengHei"/>
+          <w:b w:val="0"/>
+          <w:i w:val="0"/>
+        </w:rPr>
+        <w:t xml:space="preserve"> 新增 </w:t>
+      </w:r>
+      <w:r>
+        <w:rPr>
+          <w:rFonts w:ascii="Consolas" w:hAnsi="Consolas" w:eastAsia="Microsoft JhengHei"/>
+          <w:b w:val="0"/>
+          <w:i w:val="0"/>
+          <w:color w:val="17365D"/>
+          <w:sz w:val="17"/>
+        </w:rPr>
+        <w:t>pipeline_snapshots</w:t>
+      </w:r>
+      <w:r>
+        <w:rPr>
+          <w:rFonts w:ascii="Calibri" w:hAnsi="Calibri" w:eastAsia="Microsoft JhengHei"/>
+          <w:b w:val="0"/>
+          <w:i w:val="0"/>
+        </w:rPr>
+        <w:t>、</w:t>
+      </w:r>
+      <w:r>
+        <w:rPr>
+          <w:rFonts w:ascii="Consolas" w:hAnsi="Consolas" w:eastAsia="Microsoft JhengHei"/>
+          <w:b w:val="0"/>
+          <w:i w:val="0"/>
+          <w:color w:val="17365D"/>
+          <w:sz w:val="17"/>
+        </w:rPr>
+        <w:t>scope_decisions</w:t>
+      </w:r>
+      <w:r>
+        <w:rPr>
+          <w:rFonts w:ascii="Calibri" w:hAnsi="Calibri" w:eastAsia="Microsoft JhengHei"/>
+          <w:b w:val="0"/>
+          <w:i w:val="0"/>
+        </w:rPr>
+        <w:t>、</w:t>
+      </w:r>
+      <w:r>
+        <w:rPr>
+          <w:rFonts w:ascii="Consolas" w:hAnsi="Consolas" w:eastAsia="Microsoft JhengHei"/>
+          <w:b w:val="0"/>
+          <w:i w:val="0"/>
+          <w:color w:val="17365D"/>
+          <w:sz w:val="17"/>
+        </w:rPr>
+        <w:t>normalized_checks</w:t>
+      </w:r>
+      <w:r>
+        <w:rPr>
+          <w:rFonts w:ascii="Calibri" w:hAnsi="Calibri" w:eastAsia="Microsoft JhengHei"/>
+          <w:b w:val="0"/>
+          <w:i w:val="0"/>
+        </w:rPr>
+        <w:t>、</w:t>
+      </w:r>
+      <w:r>
+        <w:rPr>
+          <w:rFonts w:ascii="Consolas" w:hAnsi="Consolas" w:eastAsia="Microsoft JhengHei"/>
+          <w:b w:val="0"/>
+          <w:i w:val="0"/>
+          <w:color w:val="17365D"/>
+          <w:sz w:val="17"/>
+        </w:rPr>
+        <w:t>normalized_unparsed</w:t>
+      </w:r>
+      <w:r>
+        <w:rPr>
+          <w:rFonts w:ascii="Calibri" w:hAnsi="Calibri" w:eastAsia="Microsoft JhengHei"/>
+          <w:b w:val="0"/>
+          <w:i w:val="0"/>
+        </w:rPr>
+        <w:t>、</w:t>
+      </w:r>
+      <w:r>
+        <w:rPr>
+          <w:rFonts w:ascii="Consolas" w:hAnsi="Consolas" w:eastAsia="Microsoft JhengHei"/>
+          <w:b w:val="0"/>
+          <w:i w:val="0"/>
+          <w:color w:val="17365D"/>
+          <w:sz w:val="17"/>
+        </w:rPr>
+        <w:t>configuration_comparisons</w:t>
+      </w:r>
+      <w:r>
+        <w:rPr>
+          <w:rFonts w:ascii="Calibri" w:hAnsi="Calibri" w:eastAsia="Microsoft JhengHei"/>
+          <w:b w:val="0"/>
+          <w:i w:val="0"/>
+        </w:rPr>
+        <w:t>、</w:t>
+      </w:r>
+      <w:r>
+        <w:rPr>
+          <w:rFonts w:ascii="Consolas" w:hAnsi="Consolas" w:eastAsia="Microsoft JhengHei"/>
+          <w:b w:val="0"/>
+          <w:i w:val="0"/>
+          <w:color w:val="17365D"/>
+          <w:sz w:val="17"/>
+        </w:rPr>
+        <w:t>pipeline_assessments</w:t>
+      </w:r>
+      <w:r>
+        <w:rPr>
+          <w:rFonts w:ascii="Calibri" w:hAnsi="Calibri" w:eastAsia="Microsoft JhengHei"/>
+          <w:b w:val="0"/>
+          <w:i w:val="0"/>
+        </w:rPr>
+        <w:t>、</w:t>
+      </w:r>
+      <w:r>
+        <w:rPr>
+          <w:rFonts w:ascii="Consolas" w:hAnsi="Consolas" w:eastAsia="Microsoft JhengHei"/>
+          <w:b w:val="0"/>
+          <w:i w:val="0"/>
+          <w:color w:val="17365D"/>
+          <w:sz w:val="17"/>
+        </w:rPr>
+        <w:t>coverage_items</w:t>
+      </w:r>
+      <w:r>
+        <w:rPr>
+          <w:rFonts w:ascii="Calibri" w:hAnsi="Calibri" w:eastAsia="Microsoft JhengHei"/>
+          <w:b w:val="0"/>
+          <w:i w:val="0"/>
+        </w:rPr>
+        <w:t>、</w:t>
+      </w:r>
+      <w:r>
+        <w:rPr>
+          <w:rFonts w:ascii="Consolas" w:hAnsi="Consolas" w:eastAsia="Microsoft JhengHei"/>
+          <w:b w:val="0"/>
+          <w:i w:val="0"/>
+          <w:color w:val="17365D"/>
+          <w:sz w:val="17"/>
+        </w:rPr>
+        <w:t>quality_results</w:t>
+      </w:r>
+      <w:r>
+        <w:rPr>
+          <w:rFonts w:ascii="Calibri" w:hAnsi="Calibri" w:eastAsia="Microsoft JhengHei"/>
+          <w:b w:val="0"/>
+          <w:i w:val="0"/>
+        </w:rPr>
+        <w:t xml:space="preserve">。部署前先備份目前 </w:t>
+      </w:r>
+      <w:r>
+        <w:rPr>
+          <w:rFonts w:ascii="Consolas" w:hAnsi="Consolas" w:eastAsia="Microsoft JhengHei"/>
+          <w:b w:val="0"/>
+          <w:i w:val="0"/>
+          <w:color w:val="17365D"/>
+          <w:sz w:val="17"/>
+        </w:rPr>
+        <w:t>0002_m9_4</w:t>
+      </w:r>
+      <w:r>
+        <w:rPr>
+          <w:rFonts w:ascii="Calibri" w:hAnsi="Calibri" w:eastAsia="Microsoft JhengHei"/>
+          <w:b w:val="0"/>
+          <w:i w:val="0"/>
+        </w:rPr>
+        <w:t>；升級後以完整 scoped Job 驗證 snapshot 與 child row counts。</w:t>
+      </w:r>
+      <w:r>
+        <w:rPr>
+          <w:rFonts w:ascii="Consolas" w:hAnsi="Consolas" w:eastAsia="Microsoft JhengHei"/>
+          <w:b w:val="0"/>
+          <w:i w:val="0"/>
+          <w:color w:val="17365D"/>
+          <w:sz w:val="17"/>
+        </w:rPr>
+        <w:t>alembic downgrade 0002_m9_4</w:t>
+      </w:r>
+      <w:r>
+        <w:rPr>
+          <w:rFonts w:ascii="Calibri" w:hAnsi="Calibri" w:eastAsia="Microsoft JhengHei"/>
+          <w:b w:val="0"/>
+          <w:i w:val="0"/>
+        </w:rPr>
+        <w:t xml:space="preserve"> 會刪除全部 M9.5 results，必須另行核准。</w:t>
       </w:r>
     </w:p>
     <w:p>
@@ -12839,7 +13240,43 @@
           <w:b w:val="0"/>
           <w:i w:val="0"/>
         </w:rPr>
-        <w:t>台灣行動支付實際資料在 SCRAM 重啟後通過 13 inputs／13 outputs、QA 8/8、V4 QA、29 頁 PDF 與來源 SHA-256 不變。</w:t>
+        <w:t xml:space="preserve">M9.5 功能分支已通過 70 tests、offline migration 與台灣行動支付唯讀冪等投影；公司 </w:t>
+      </w:r>
+      <w:r>
+        <w:rPr>
+          <w:rFonts w:ascii="Consolas" w:hAnsi="Consolas" w:eastAsia="Microsoft JhengHei"/>
+          <w:b w:val="0"/>
+          <w:i w:val="0"/>
+          <w:color w:val="17365D"/>
+          <w:sz w:val="17"/>
+        </w:rPr>
+        <w:t>.81</w:t>
+      </w:r>
+      <w:r>
+        <w:rPr>
+          <w:rFonts w:ascii="Calibri" w:hAnsi="Calibri" w:eastAsia="Microsoft JhengHei"/>
+          <w:b w:val="0"/>
+          <w:i w:val="0"/>
+        </w:rPr>
+        <w:t xml:space="preserve"> 尚未執行 </w:t>
+      </w:r>
+      <w:r>
+        <w:rPr>
+          <w:rFonts w:ascii="Consolas" w:hAnsi="Consolas" w:eastAsia="Microsoft JhengHei"/>
+          <w:b w:val="0"/>
+          <w:i w:val="0"/>
+          <w:color w:val="17365D"/>
+          <w:sz w:val="17"/>
+        </w:rPr>
+        <w:t>0003_m9_5</w:t>
+      </w:r>
+      <w:r>
+        <w:rPr>
+          <w:rFonts w:ascii="Calibri" w:hAnsi="Calibri" w:eastAsia="Microsoft JhengHei"/>
+          <w:b w:val="0"/>
+          <w:i w:val="0"/>
+        </w:rPr>
+        <w:t>。</w:t>
       </w:r>
     </w:p>
     <w:p>
@@ -12848,39 +13285,11 @@
       </w:pPr>
       <w:r>
         <w:rPr>
-          <w:rFonts w:ascii="Consolas" w:hAnsi="Consolas" w:eastAsia="Microsoft JhengHei"/>
-          <w:b w:val="0"/>
-          <w:i w:val="0"/>
-          <w:color w:val="17365D"/>
-          <w:sz w:val="17"/>
-        </w:rPr>
-        <w:t>.81</w:t>
-      </w:r>
-      <w:r>
-        <w:rPr>
-          <w:rFonts w:ascii="Calibri" w:hAnsi="Calibri" w:eastAsia="Microsoft JhengHei"/>
-          <w:b w:val="0"/>
-          <w:i w:val="0"/>
-        </w:rPr>
-        <w:t xml:space="preserve"> 的 OMNIcheck 精確規則已要求 SCRAM；cluster-wide </w:t>
-      </w:r>
-      <w:r>
-        <w:rPr>
-          <w:rFonts w:ascii="Consolas" w:hAnsi="Consolas" w:eastAsia="Microsoft JhengHei"/>
-          <w:b w:val="0"/>
-          <w:i w:val="0"/>
-          <w:color w:val="17365D"/>
-          <w:sz w:val="17"/>
-        </w:rPr>
-        <w:t>host all all 0.0.0.0/0 trust</w:t>
-      </w:r>
-      <w:r>
-        <w:rPr>
-          <w:rFonts w:ascii="Calibri" w:hAnsi="Calibri" w:eastAsia="Microsoft JhengHei"/>
-          <w:b w:val="0"/>
-          <w:i w:val="0"/>
-        </w:rPr>
-        <w:t xml:space="preserve"> 仍是其他連線的安全風險，需另案收斂。</w:t>
+          <w:rFonts w:ascii="Calibri" w:hAnsi="Calibri" w:eastAsia="Microsoft JhengHei"/>
+          <w:b w:val="0"/>
+          <w:i w:val="0"/>
+        </w:rPr>
+        <w:t>台灣行動支付實際資料在 SCRAM 重啟後通過 13 inputs／13 outputs、QA 8/8、V4 QA、29 頁 PDF 與來源 SHA-256 不變。</w:t>
       </w:r>
     </w:p>
     <w:p>
@@ -12889,11 +13298,39 @@
       </w:pPr>
       <w:r>
         <w:rPr>
-          <w:rFonts w:ascii="Calibri" w:hAnsi="Calibri" w:eastAsia="Microsoft JhengHei"/>
-          <w:b w:val="0"/>
-          <w:i w:val="0"/>
-        </w:rPr>
-        <w:t>兩次修正前 API 500 留下兩筆空的 draft Golden 測試案件；尚未執行破壞性清除。</w:t>
+          <w:rFonts w:ascii="Consolas" w:hAnsi="Consolas" w:eastAsia="Microsoft JhengHei"/>
+          <w:b w:val="0"/>
+          <w:i w:val="0"/>
+          <w:color w:val="17365D"/>
+          <w:sz w:val="17"/>
+        </w:rPr>
+        <w:t>.81</w:t>
+      </w:r>
+      <w:r>
+        <w:rPr>
+          <w:rFonts w:ascii="Calibri" w:hAnsi="Calibri" w:eastAsia="Microsoft JhengHei"/>
+          <w:b w:val="0"/>
+          <w:i w:val="0"/>
+        </w:rPr>
+        <w:t xml:space="preserve"> 的 OMNIcheck 精確規則已要求 SCRAM；cluster-wide </w:t>
+      </w:r>
+      <w:r>
+        <w:rPr>
+          <w:rFonts w:ascii="Consolas" w:hAnsi="Consolas" w:eastAsia="Microsoft JhengHei"/>
+          <w:b w:val="0"/>
+          <w:i w:val="0"/>
+          <w:color w:val="17365D"/>
+          <w:sz w:val="17"/>
+        </w:rPr>
+        <w:t>host all all 0.0.0.0/0 trust</w:t>
+      </w:r>
+      <w:r>
+        <w:rPr>
+          <w:rFonts w:ascii="Calibri" w:hAnsi="Calibri" w:eastAsia="Microsoft JhengHei"/>
+          <w:b w:val="0"/>
+          <w:i w:val="0"/>
+        </w:rPr>
+        <w:t xml:space="preserve"> 仍是其他連線的安全風險，需另案收斂。</w:t>
       </w:r>
     </w:p>
     <w:p>
@@ -12906,7 +13343,7 @@
           <w:b w:val="0"/>
           <w:i w:val="0"/>
         </w:rPr>
-        <w:t>正式 TLS/VIP、EFM failover、reverse proxy、登入／RBAC 尚未完成。</w:t>
+        <w:t>兩次修正前 API 500 留下兩筆空的 draft Golden 測試案件；尚未執行破壞性清除。</w:t>
       </w:r>
     </w:p>
     <w:p>
@@ -12919,7 +13356,7 @@
           <w:b w:val="0"/>
           <w:i w:val="0"/>
         </w:rPr>
-        <w:t>完全未知資料包尚不能自動決定節點角色，仍需使用者確認。</w:t>
+        <w:t>正式 TLS/VIP、EFM failover、reverse proxy、登入／RBAC 尚未完成。</w:t>
       </w:r>
     </w:p>
     <w:p>
@@ -12932,7 +13369,7 @@
           <w:b w:val="0"/>
           <w:i w:val="0"/>
         </w:rPr>
-        <w:t>Barman 真實 wrapper fixture 待提供。</w:t>
+        <w:t>完全未知資料包尚不能自動決定節點角色，仍需使用者確認。</w:t>
       </w:r>
     </w:p>
     <w:p>
@@ -12945,7 +13382,7 @@
           <w:b w:val="0"/>
           <w:i w:val="0"/>
         </w:rPr>
-        <w:t>Python dependency 目前為 version ranges，正式 reproducible build 尚需 lock／wheelhouse。</w:t>
+        <w:t>Barman 真實 wrapper fixture 待提供。</w:t>
       </w:r>
     </w:p>
     <w:p>
@@ -12958,7 +13395,7 @@
           <w:b w:val="0"/>
           <w:i w:val="0"/>
         </w:rPr>
-        <w:t>歷史比較、CVE cache、可選 AI gateway 尚未實作。</w:t>
+        <w:t>Python dependency 目前為 version ranges，正式 reproducible build 尚需 lock／wheelhouse。</w:t>
       </w:r>
     </w:p>
     <w:p>
@@ -12971,7 +13408,20 @@
           <w:b w:val="0"/>
           <w:i w:val="0"/>
         </w:rPr>
-        <w:t>EDB 中心化與 CVE 自動化方向已核准；Application Data foundation tables 已實作，完整 Persistence Adapter、Artifact lifecycle 與 CVE tables 尚未實作。</w:t>
+        <w:t>歷史比較、CVE cache、可選 AI gateway 尚未實作。</w:t>
+      </w:r>
+    </w:p>
+    <w:p>
+      <w:pPr>
+        <w:pStyle w:val="ListBullet"/>
+      </w:pPr>
+      <w:r>
+        <w:rPr>
+          <w:rFonts w:ascii="Calibri" w:hAnsi="Calibri" w:eastAsia="Microsoft JhengHei"/>
+          <w:b w:val="0"/>
+          <w:i w:val="0"/>
+        </w:rPr>
+        <w:t>EDB 中心化與 CVE 自動化方向已核准；Application Data foundation tables 與 M9.5 Persistence Adapter 已實作，Artifact lifecycle 與 CVE tables 尚未實作。</w:t>
       </w:r>
     </w:p>
     <w:p>
@@ -13226,6 +13676,47 @@
           <w:sz w:val="17"/>
         </w:rPr>
         <w:t>docs/M9_4_VALIDATION.md</w:t>
+      </w:r>
+    </w:p>
+    <w:p>
+      <w:pPr>
+        <w:pStyle w:val="ListBullet"/>
+      </w:pPr>
+      <w:r>
+        <w:rPr>
+          <w:rFonts w:ascii="Calibri" w:hAnsi="Calibri" w:eastAsia="Microsoft JhengHei"/>
+          <w:b w:val="0"/>
+          <w:i w:val="0"/>
+        </w:rPr>
+        <w:t>M9.5：</w:t>
+      </w:r>
+      <w:r>
+        <w:rPr>
+          <w:rFonts w:ascii="Consolas" w:hAnsi="Consolas" w:eastAsia="Microsoft JhengHei"/>
+          <w:b w:val="0"/>
+          <w:i w:val="0"/>
+          <w:color w:val="17365D"/>
+          <w:sz w:val="17"/>
+        </w:rPr>
+        <w:t>docs/M9_5_PIPELINE_RESULT_PERSISTENCE.md</w:t>
+      </w:r>
+      <w:r>
+        <w:rPr>
+          <w:rFonts w:ascii="Calibri" w:hAnsi="Calibri" w:eastAsia="Microsoft JhengHei"/>
+          <w:b w:val="0"/>
+          <w:i w:val="0"/>
+        </w:rPr>
+        <w:t>、</w:t>
+      </w:r>
+      <w:r>
+        <w:rPr>
+          <w:rFonts w:ascii="Consolas" w:hAnsi="Consolas" w:eastAsia="Microsoft JhengHei"/>
+          <w:b w:val="0"/>
+          <w:i w:val="0"/>
+          <w:color w:val="17365D"/>
+          <w:sz w:val="17"/>
+        </w:rPr>
+        <w:t>docs/M9_5_VALIDATION.md</w:t>
       </w:r>
     </w:p>
     <w:p>
@@ -14070,8 +14561,13 @@
     </w:tbl>
     <w:p>
       <w:pPr>
-        <w:spacing w:after="20"/>
+        <w:spacing w:after="0" w:before="0" w:line="20" w:lineRule="exact"/>
       </w:pPr>
+      <w:r>
+        <w:rPr>
+          <w:sz w:val="2"/>
+        </w:rPr>
+      </w:r>
     </w:p>
     <w:sectPr>
       <w:headerReference w:type="default" r:id="rId9"/>

</xml_diff>

<commit_message>
docs: record M9.5 company deployment
</commit_message>
<xml_diff>
--- a/docs/OMNICHECK_AI_BUILD_AND_OPERATIONS_GUIDE.docx
+++ b/docs/OMNICHECK_AI_BUILD_AND_OPERATIONS_GUIDE.docx
@@ -103,7 +103,7 @@
           <w:b w:val="0"/>
           <w:i w:val="0"/>
         </w:rPr>
-        <w:t>文件版本：0.9.5-draft.1</w:t>
+        <w:t>文件版本：0.9.5</w:t>
       </w:r>
     </w:p>
     <w:p>
@@ -157,7 +157,7 @@
           <w:color w:val="17365D"/>
           <w:sz w:val="17"/>
         </w:rPr>
-        <w:t>m9.4</w:t>
+        <w:t>m9.5</w:t>
       </w:r>
     </w:p>
     <w:p>
@@ -180,7 +180,7 @@
           <w:color w:val="17365D"/>
           <w:sz w:val="17"/>
         </w:rPr>
-        <w:t>m9.4</w:t>
+        <w:t>m9.5</w:t>
       </w:r>
     </w:p>
     <w:p>
@@ -1477,6 +1477,131 @@
                 <w:sz w:val="17"/>
               </w:rPr>
               <w:t>驗證狀態</w:t>
+            </w:r>
+          </w:p>
+        </w:tc>
+      </w:tr>
+      <w:tr>
+        <w:tc>
+          <w:tcPr>
+            <w:tcW w:type="dxa" w:w="2470"/>
+            <w:vAlign w:val="center"/>
+            <w:tcMar>
+              <w:top w:w="45" w:type="dxa"/>
+              <w:start w:w="120" w:type="dxa"/>
+              <w:bottom w:w="45" w:type="dxa"/>
+              <w:end w:w="120" w:type="dxa"/>
+            </w:tcMar>
+          </w:tcPr>
+          <w:p>
+            <w:pPr>
+              <w:spacing w:after="0"/>
+            </w:pPr>
+            <w:r>
+              <w:rPr>
+                <w:rFonts w:ascii="Calibri" w:hAnsi="Calibri" w:eastAsia="Microsoft JhengHei"/>
+                <w:b w:val="0"/>
+                <w:i w:val="0"/>
+                <w:sz w:val="17"/>
+              </w:rPr>
+              <w:t>0.9.5</w:t>
+            </w:r>
+          </w:p>
+        </w:tc>
+        <w:tc>
+          <w:tcPr>
+            <w:tcW w:type="dxa" w:w="2470"/>
+            <w:vAlign w:val="center"/>
+            <w:tcMar>
+              <w:top w:w="45" w:type="dxa"/>
+              <w:start w:w="120" w:type="dxa"/>
+              <w:bottom w:w="45" w:type="dxa"/>
+              <w:end w:w="120" w:type="dxa"/>
+            </w:tcMar>
+          </w:tcPr>
+          <w:p>
+            <w:pPr>
+              <w:spacing w:after="0"/>
+            </w:pPr>
+            <w:r>
+              <w:rPr>
+                <w:rFonts w:ascii="Calibri" w:hAnsi="Calibri" w:eastAsia="Microsoft JhengHei"/>
+                <w:b w:val="0"/>
+                <w:i w:val="0"/>
+                <w:sz w:val="17"/>
+              </w:rPr>
+              <w:t>2026-08-05</w:t>
+            </w:r>
+          </w:p>
+        </w:tc>
+        <w:tc>
+          <w:tcPr>
+            <w:tcW w:type="dxa" w:w="2470"/>
+            <w:vAlign w:val="center"/>
+            <w:tcMar>
+              <w:top w:w="45" w:type="dxa"/>
+              <w:start w:w="120" w:type="dxa"/>
+              <w:bottom w:w="45" w:type="dxa"/>
+              <w:end w:w="120" w:type="dxa"/>
+            </w:tcMar>
+          </w:tcPr>
+          <w:p>
+            <w:pPr>
+              <w:spacing w:after="0"/>
+            </w:pPr>
+            <w:r>
+              <w:rPr>
+                <w:rFonts w:ascii="Calibri" w:hAnsi="Calibri" w:eastAsia="Microsoft JhengHei"/>
+                <w:b w:val="0"/>
+                <w:i w:val="0"/>
+                <w:sz w:val="17"/>
+              </w:rPr>
+              <w:t>M9.5 公司 EDB deployment、Scoped Golden Persistence 與正式回復點</w:t>
+            </w:r>
+          </w:p>
+        </w:tc>
+        <w:tc>
+          <w:tcPr>
+            <w:tcW w:type="dxa" w:w="2470"/>
+            <w:vAlign w:val="center"/>
+            <w:tcMar>
+              <w:top w:w="45" w:type="dxa"/>
+              <w:start w:w="120" w:type="dxa"/>
+              <w:bottom w:w="45" w:type="dxa"/>
+              <w:end w:w="120" w:type="dxa"/>
+            </w:tcMar>
+          </w:tcPr>
+          <w:p>
+            <w:pPr>
+              <w:spacing w:after="0"/>
+            </w:pPr>
+            <w:r>
+              <w:rPr>
+                <w:rFonts w:ascii="Calibri" w:hAnsi="Calibri" w:eastAsia="Microsoft JhengHei"/>
+                <w:b w:val="0"/>
+                <w:i w:val="0"/>
+                <w:sz w:val="17"/>
+              </w:rPr>
+              <w:t>Backup/hash、VM 70 tests、</w:t>
+            </w:r>
+            <w:r>
+              <w:rPr>
+                <w:rFonts w:ascii="Consolas" w:hAnsi="Consolas" w:eastAsia="Microsoft JhengHei"/>
+                <w:b w:val="0"/>
+                <w:i w:val="0"/>
+                <w:color w:val="17365D"/>
+                <w:sz w:val="17"/>
+              </w:rPr>
+              <w:t>0003_m9_5</w:t>
+            </w:r>
+            <w:r>
+              <w:rPr>
+                <w:rFonts w:ascii="Calibri" w:hAnsi="Calibri" w:eastAsia="Microsoft JhengHei"/>
+                <w:b w:val="0"/>
+                <w:i w:val="0"/>
+                <w:sz w:val="17"/>
+              </w:rPr>
+              <w:t>、冪等、restart persistence 與 health 通過</w:t>
             </w:r>
           </w:p>
         </w:tc>
@@ -3424,7 +3549,7 @@
                 <w:i w:val="0"/>
                 <w:sz w:val="17"/>
               </w:rPr>
-              <w:t>功能分支本機完成</w:t>
+              <w:t>正式完成</w:t>
             </w:r>
           </w:p>
         </w:tc>
@@ -3450,7 +3575,7 @@
                 <w:i w:val="0"/>
                 <w:sz w:val="17"/>
               </w:rPr>
-              <w:t>Scope／Normalized／Config／Assessment／Coverage／QA 冪等 EDB 投影；公司 EDB 待驗證</w:t>
+              <w:t>Scope／Normalized／Config／Assessment／Coverage／QA 冪等 EDB 投影與公司部署</w:t>
             </w:r>
           </w:p>
         </w:tc>
@@ -3568,7 +3693,7 @@
           <w:color w:val="17365D"/>
           <w:sz w:val="17"/>
         </w:rPr>
-        <w:t>m9.4</w:t>
+        <w:t>m9.5</w:t>
       </w:r>
       <w:r>
         <w:rPr>
@@ -3586,15 +3711,15 @@
           <w:color w:val="17365D"/>
           <w:sz w:val="17"/>
         </w:rPr>
-        <w:t>m9.3</w:t>
-      </w:r>
-      <w:r>
-        <w:rPr>
-          <w:rFonts w:ascii="Calibri" w:hAnsi="Calibri" w:eastAsia="Microsoft JhengHei"/>
-          <w:b w:val="0"/>
-          <w:i w:val="0"/>
-        </w:rPr>
-        <w:t xml:space="preserve"> 保留為 foundation 前的 rollback 點，</w:t>
+        <w:t>m9.4</w:t>
+      </w:r>
+      <w:r>
+        <w:rPr>
+          <w:rFonts w:ascii="Calibri" w:hAnsi="Calibri" w:eastAsia="Microsoft JhengHei"/>
+          <w:b w:val="0"/>
+          <w:i w:val="0"/>
+        </w:rPr>
+        <w:t xml:space="preserve"> 保留為 Persistence 前的 application rollback 點，</w:t>
       </w:r>
       <w:r>
         <w:rPr>
@@ -3604,15 +3729,15 @@
           <w:color w:val="17365D"/>
           <w:sz w:val="17"/>
         </w:rPr>
-        <w:t>m8.1</w:t>
-      </w:r>
-      <w:r>
-        <w:rPr>
-          <w:rFonts w:ascii="Calibri" w:hAnsi="Calibri" w:eastAsia="Microsoft JhengHei"/>
-          <w:b w:val="0"/>
-          <w:i w:val="0"/>
-        </w:rPr>
-        <w:t xml:space="preserve"> 保留為導入 Web／EDB 前的 CLI rollback 點。正式重建應 checkout </w:t>
+        <w:t>m9.3</w:t>
+      </w:r>
+      <w:r>
+        <w:rPr>
+          <w:rFonts w:ascii="Calibri" w:hAnsi="Calibri" w:eastAsia="Microsoft JhengHei"/>
+          <w:b w:val="0"/>
+          <w:i w:val="0"/>
+        </w:rPr>
+        <w:t xml:space="preserve"> 保留為 foundation 前的 rollback 點。正式重建應 checkout </w:t>
       </w:r>
       <w:r>
         <w:rPr>
@@ -3622,7 +3747,7 @@
           <w:color w:val="17365D"/>
           <w:sz w:val="17"/>
         </w:rPr>
-        <w:t>m9.4</w:t>
+        <w:t>m9.5</w:t>
       </w:r>
       <w:r>
         <w:rPr>
@@ -4210,7 +4335,7 @@
           <w:b w:val="0"/>
           <w:i w:val="0"/>
         </w:rPr>
-        <w:t xml:space="preserve"> 加入 nullable tenant scope。完整 Pipeline Persistence、Artifact lifecycle、sync worker 與 AI Gateway 尚未完成。</w:t>
+        <w:t xml:space="preserve"> 加入 nullable tenant scope；M9.5 已完成 Pipeline Persistence。Artifact lifecycle、sync worker 與 AI Gateway 尚未完成。</w:t>
       </w:r>
     </w:p>
     <w:p>
@@ -8416,7 +8541,7 @@
           <w:b w:val="0"/>
           <w:i w:val="0"/>
         </w:rPr>
-        <w:t xml:space="preserve">。M9.4 功能分支部署後預期為 </w:t>
+        <w:t xml:space="preserve">。M9.4 為 </w:t>
       </w:r>
       <w:r>
         <w:rPr>
@@ -8426,7 +8551,7 @@
           <w:color w:val="17365D"/>
           <w:sz w:val="17"/>
         </w:rPr>
-        <w:t>0002_m9_4 (head)</w:t>
+        <w:t>0002_m9_4</w:t>
       </w:r>
       <w:r>
         <w:rPr>
@@ -8571,6 +8696,24 @@
           <w:sz w:val="17"/>
         </w:rPr>
         <w:t>customer_id/system_id</w:t>
+      </w:r>
+      <w:r>
+        <w:rPr>
+          <w:rFonts w:ascii="Calibri" w:hAnsi="Calibri" w:eastAsia="Microsoft JhengHei"/>
+          <w:b w:val="0"/>
+          <w:i w:val="0"/>
+        </w:rPr>
+        <w:t xml:space="preserve">。M9.5 正式 revision 為 </w:t>
+      </w:r>
+      <w:r>
+        <w:rPr>
+          <w:rFonts w:ascii="Consolas" w:hAnsi="Consolas" w:eastAsia="Microsoft JhengHei"/>
+          <w:b w:val="0"/>
+          <w:i w:val="0"/>
+          <w:color w:val="17365D"/>
+          <w:sz w:val="17"/>
+        </w:rPr>
+        <w:t>0003_m9_5 (head)</w:t>
       </w:r>
       <w:r>
         <w:rPr>
@@ -8642,7 +8785,7 @@
           <w:b w:val="0"/>
           <w:i w:val="0"/>
         </w:rPr>
-        <w:t>10.3 M9.4 migration 待驗證手順</w:t>
+        <w:t>10.3 M9.4 migration 手順</w:t>
       </w:r>
     </w:p>
     <w:p>
@@ -8997,7 +9140,7 @@
           <w:b w:val="0"/>
           <w:i w:val="0"/>
         </w:rPr>
-        <w:t>10.4 M9.5 migration（公司環境待驗證）</w:t>
+        <w:t>10.4 M9.5 migration</w:t>
       </w:r>
     </w:p>
     <w:p>
@@ -9198,6 +9341,142 @@
           <w:i w:val="0"/>
         </w:rPr>
         <w:t xml:space="preserve"> 會刪除全部 M9.5 results，必須另行核准。</w:t>
+      </w:r>
+    </w:p>
+    <w:p>
+      <w:r>
+        <w:rPr>
+          <w:rFonts w:ascii="Calibri" w:hAnsi="Calibri" w:eastAsia="Microsoft JhengHei"/>
+          <w:b w:val="0"/>
+          <w:i w:val="0"/>
+        </w:rPr>
+        <w:t xml:space="preserve">公司驗證結果：release </w:t>
+      </w:r>
+      <w:r>
+        <w:rPr>
+          <w:rFonts w:ascii="Consolas" w:hAnsi="Consolas" w:eastAsia="Microsoft JhengHei"/>
+          <w:b w:val="0"/>
+          <w:i w:val="0"/>
+          <w:color w:val="17365D"/>
+          <w:sz w:val="17"/>
+        </w:rPr>
+        <w:t>916adff</w:t>
+      </w:r>
+      <w:r>
+        <w:rPr>
+          <w:rFonts w:ascii="Calibri" w:hAnsi="Calibri" w:eastAsia="Microsoft JhengHei"/>
+          <w:b w:val="0"/>
+          <w:i w:val="0"/>
+        </w:rPr>
+        <w:t xml:space="preserve"> 在 VM 通過 70 tests 與 V4 hashes；備份 </w:t>
+      </w:r>
+      <w:r>
+        <w:rPr>
+          <w:rFonts w:ascii="Consolas" w:hAnsi="Consolas" w:eastAsia="Microsoft JhengHei"/>
+          <w:b w:val="0"/>
+          <w:i w:val="0"/>
+          <w:color w:val="17365D"/>
+          <w:sz w:val="17"/>
+        </w:rPr>
+        <w:t>/data/omnicheck/archive/omnicheck_app_pre_m9_5_20260805.dump</w:t>
+      </w:r>
+      <w:r>
+        <w:rPr>
+          <w:rFonts w:ascii="Calibri" w:hAnsi="Calibri" w:eastAsia="Microsoft JhengHei"/>
+          <w:b w:val="0"/>
+          <w:i w:val="0"/>
+        </w:rPr>
+        <w:t xml:space="preserve"> 的 SHA-256 為 </w:t>
+      </w:r>
+      <w:r>
+        <w:rPr>
+          <w:rFonts w:ascii="Consolas" w:hAnsi="Consolas" w:eastAsia="Microsoft JhengHei"/>
+          <w:b w:val="0"/>
+          <w:i w:val="0"/>
+          <w:color w:val="17365D"/>
+          <w:sz w:val="17"/>
+        </w:rPr>
+        <w:t>b1bab16fa5c006a8832a621dd9fce0fe2ce7a18c4025d0b290a865da030e1575</w:t>
+      </w:r>
+      <w:r>
+        <w:rPr>
+          <w:rFonts w:ascii="Calibri" w:hAnsi="Calibri" w:eastAsia="Microsoft JhengHei"/>
+          <w:b w:val="0"/>
+          <w:i w:val="0"/>
+        </w:rPr>
+        <w:t xml:space="preserve">，且 </w:t>
+      </w:r>
+      <w:r>
+        <w:rPr>
+          <w:rFonts w:ascii="Consolas" w:hAnsi="Consolas" w:eastAsia="Microsoft JhengHei"/>
+          <w:b w:val="0"/>
+          <w:i w:val="0"/>
+          <w:color w:val="17365D"/>
+          <w:sz w:val="17"/>
+        </w:rPr>
+        <w:t>pg_restore --list</w:t>
+      </w:r>
+      <w:r>
+        <w:rPr>
+          <w:rFonts w:ascii="Calibri" w:hAnsi="Calibri" w:eastAsia="Microsoft JhengHei"/>
+          <w:b w:val="0"/>
+          <w:i w:val="0"/>
+        </w:rPr>
+        <w:t xml:space="preserve"> 可讀。Schema 升至 </w:t>
+      </w:r>
+      <w:r>
+        <w:rPr>
+          <w:rFonts w:ascii="Consolas" w:hAnsi="Consolas" w:eastAsia="Microsoft JhengHei"/>
+          <w:b w:val="0"/>
+          <w:i w:val="0"/>
+          <w:color w:val="17365D"/>
+          <w:sz w:val="17"/>
+        </w:rPr>
+        <w:t>0003_m9_5</w:t>
+      </w:r>
+      <w:r>
+        <w:rPr>
+          <w:rFonts w:ascii="Calibri" w:hAnsi="Calibri" w:eastAsia="Microsoft JhengHei"/>
+          <w:b w:val="0"/>
+          <w:i w:val="0"/>
+        </w:rPr>
+        <w:t xml:space="preserve">，Scoped Golden Job </w:t>
+      </w:r>
+      <w:r>
+        <w:rPr>
+          <w:rFonts w:ascii="Consolas" w:hAnsi="Consolas" w:eastAsia="Microsoft JhengHei"/>
+          <w:b w:val="0"/>
+          <w:i w:val="0"/>
+          <w:color w:val="17365D"/>
+          <w:sz w:val="17"/>
+        </w:rPr>
+        <w:t>fa28fea9f9d04f53bbd96f209042fe44</w:t>
+      </w:r>
+      <w:r>
+        <w:rPr>
+          <w:rFonts w:ascii="Calibri" w:hAnsi="Calibri" w:eastAsia="Microsoft JhengHei"/>
+          <w:b w:val="0"/>
+          <w:i w:val="0"/>
+        </w:rPr>
+        <w:t xml:space="preserve"> succeeded 並建立 Snapshot </w:t>
+      </w:r>
+      <w:r>
+        <w:rPr>
+          <w:rFonts w:ascii="Consolas" w:hAnsi="Consolas" w:eastAsia="Microsoft JhengHei"/>
+          <w:b w:val="0"/>
+          <w:i w:val="0"/>
+          <w:color w:val="17365D"/>
+          <w:sz w:val="17"/>
+        </w:rPr>
+        <w:t>1be99fddb5404aa8add49a89146ee339</w:t>
+      </w:r>
+      <w:r>
+        <w:rPr>
+          <w:rFonts w:ascii="Calibri" w:hAnsi="Calibri" w:eastAsia="Microsoft JhengHei"/>
+          <w:b w:val="0"/>
+          <w:i w:val="0"/>
+        </w:rPr>
+        <w:t>；冪等重寫、Web／Worker restart 與 health 均通過。Release 切換時必須同步重新安裝 editable package；health probe 應允許 Uvicorn 最多 30 秒啟動。</w:t>
       </w:r>
     </w:p>
     <w:p>
@@ -9682,7 +9961,7 @@
           <w:b w:val="0"/>
           <w:i w:val="0"/>
         </w:rPr>
-        <w:t>公司 M9.3 正式基準為 60 tests；M9.4 功能分支本機基準為 65 tests。實際數量會隨版本增加，不應硬性只等於固定數字；重點是 0 failed。</w:t>
+        <w:t>公司 M9.3 正式基準為 60 tests、M9.4 為 65 tests、M9.5 為 70 tests。實際數量會隨版本增加，不應硬性只等於固定數字；重點是 0 failed。</w:t>
       </w:r>
     </w:p>
     <w:p>
@@ -10413,6 +10692,102 @@
           <w:i w:val="0"/>
         </w:rPr>
         <w:t>實際客戶資料只讀投影前後 manifest 必須一致。</w:t>
+      </w:r>
+    </w:p>
+    <w:p>
+      <w:pPr>
+        <w:pStyle w:val="Heading3"/>
+      </w:pPr>
+      <w:r>
+        <w:rPr>
+          <w:rFonts w:ascii="Calibri" w:hAnsi="Calibri" w:eastAsia="Microsoft JhengHei"/>
+          <w:b w:val="0"/>
+          <w:i w:val="0"/>
+        </w:rPr>
+        <w:t>13.8 M9.5 Pipeline persistence 驗收</w:t>
+      </w:r>
+    </w:p>
+    <w:p>
+      <w:pPr>
+        <w:pStyle w:val="ListBullet"/>
+      </w:pPr>
+      <w:r>
+        <w:rPr>
+          <w:rFonts w:ascii="Calibri" w:hAnsi="Calibri" w:eastAsia="Microsoft JhengHei"/>
+          <w:b w:val="0"/>
+          <w:i w:val="0"/>
+        </w:rPr>
+        <w:t xml:space="preserve">Scoped Job 完成後必須有且只有一個 </w:t>
+      </w:r>
+      <w:r>
+        <w:rPr>
+          <w:rFonts w:ascii="Consolas" w:hAnsi="Consolas" w:eastAsia="Microsoft JhengHei"/>
+          <w:b w:val="0"/>
+          <w:i w:val="0"/>
+          <w:color w:val="17365D"/>
+          <w:sz w:val="17"/>
+        </w:rPr>
+        <w:t>pipeline_snapshots</w:t>
+      </w:r>
+      <w:r>
+        <w:rPr>
+          <w:rFonts w:ascii="Calibri" w:hAnsi="Calibri" w:eastAsia="Microsoft JhengHei"/>
+          <w:b w:val="0"/>
+          <w:i w:val="0"/>
+        </w:rPr>
+        <w:t xml:space="preserve"> row。</w:t>
+      </w:r>
+    </w:p>
+    <w:p>
+      <w:pPr>
+        <w:pStyle w:val="ListBullet"/>
+      </w:pPr>
+      <w:r>
+        <w:rPr>
+          <w:rFonts w:ascii="Calibri" w:hAnsi="Calibri" w:eastAsia="Microsoft JhengHei"/>
+          <w:b w:val="0"/>
+          <w:i w:val="0"/>
+        </w:rPr>
+        <w:t>Scope、Normalized、Unparsed、Config、Assessment、Coverage、QA child rows 必須可依 tenant 查詢。</w:t>
+      </w:r>
+    </w:p>
+    <w:p>
+      <w:pPr>
+        <w:pStyle w:val="ListBullet"/>
+      </w:pPr>
+      <w:r>
+        <w:rPr>
+          <w:rFonts w:ascii="Calibri" w:hAnsi="Calibri" w:eastAsia="Microsoft JhengHei"/>
+          <w:b w:val="0"/>
+          <w:i w:val="0"/>
+        </w:rPr>
+        <w:t>相同 Job、schema 與 Canonical SHA-256 重跑必須回傳既有 Snapshot。</w:t>
+      </w:r>
+    </w:p>
+    <w:p>
+      <w:pPr>
+        <w:pStyle w:val="ListBullet"/>
+      </w:pPr>
+      <w:r>
+        <w:rPr>
+          <w:rFonts w:ascii="Calibri" w:hAnsi="Calibri" w:eastAsia="Microsoft JhengHei"/>
+          <w:b w:val="0"/>
+          <w:i w:val="0"/>
+        </w:rPr>
+        <w:t>Persistence 失敗時 Job 不得標為 succeeded；Legacy unscoped Job 仍可執行。</w:t>
+      </w:r>
+    </w:p>
+    <w:p>
+      <w:pPr>
+        <w:pStyle w:val="ListBullet"/>
+      </w:pPr>
+      <w:r>
+        <w:rPr>
+          <w:rFonts w:ascii="Calibri" w:hAnsi="Calibri" w:eastAsia="Microsoft JhengHei"/>
+          <w:b w:val="0"/>
+          <w:i w:val="0"/>
+        </w:rPr>
+        <w:t>Web／Worker restart 後 Snapshot、Job status 與 output 必須仍存在。</w:t>
       </w:r>
     </w:p>
     <w:p>
@@ -12171,6 +12546,24 @@
           <w:color w:val="17365D"/>
           <w:sz w:val="17"/>
         </w:rPr>
+        <w:t>0003_m9_5 → 0002_m9_4</w:t>
+      </w:r>
+      <w:r>
+        <w:rPr>
+          <w:rFonts w:ascii="Calibri" w:hAnsi="Calibri" w:eastAsia="Microsoft JhengHei"/>
+          <w:b w:val="0"/>
+          <w:i w:val="0"/>
+        </w:rPr>
+        <w:t xml:space="preserve"> 會刪除全部 Pipeline snapshots 與 child rows；</w:t>
+      </w:r>
+      <w:r>
+        <w:rPr>
+          <w:rFonts w:ascii="Consolas" w:hAnsi="Consolas" w:eastAsia="Microsoft JhengHei"/>
+          <w:b w:val="0"/>
+          <w:i w:val="0"/>
+          <w:color w:val="17365D"/>
+          <w:sz w:val="17"/>
+        </w:rPr>
         <w:t>0002_m9_4 → 0001_m9_3</w:t>
       </w:r>
       <w:r>
@@ -13240,7 +13633,7 @@
           <w:b w:val="0"/>
           <w:i w:val="0"/>
         </w:rPr>
-        <w:t xml:space="preserve">M9.5 功能分支已通過 70 tests、offline migration 與台灣行動支付唯讀冪等投影；公司 </w:t>
+        <w:t xml:space="preserve">M9.5 已部署公司 </w:t>
       </w:r>
       <w:r>
         <w:rPr>
@@ -13250,15 +13643,15 @@
           <w:color w:val="17365D"/>
           <w:sz w:val="17"/>
         </w:rPr>
-        <w:t>.81</w:t>
-      </w:r>
-      <w:r>
-        <w:rPr>
-          <w:rFonts w:ascii="Calibri" w:hAnsi="Calibri" w:eastAsia="Microsoft JhengHei"/>
-          <w:b w:val="0"/>
-          <w:i w:val="0"/>
-        </w:rPr>
-        <w:t xml:space="preserve"> 尚未執行 </w:t>
+        <w:t>.77/.81</w:t>
+      </w:r>
+      <w:r>
+        <w:rPr>
+          <w:rFonts w:ascii="Calibri" w:hAnsi="Calibri" w:eastAsia="Microsoft JhengHei"/>
+          <w:b w:val="0"/>
+          <w:i w:val="0"/>
+        </w:rPr>
+        <w:t xml:space="preserve">：release </w:t>
       </w:r>
       <w:r>
         <w:rPr>
@@ -13268,6 +13661,24 @@
           <w:color w:val="17365D"/>
           <w:sz w:val="17"/>
         </w:rPr>
+        <w:t>916adff</w:t>
+      </w:r>
+      <w:r>
+        <w:rPr>
+          <w:rFonts w:ascii="Calibri" w:hAnsi="Calibri" w:eastAsia="Microsoft JhengHei"/>
+          <w:b w:val="0"/>
+          <w:i w:val="0"/>
+        </w:rPr>
+        <w:t xml:space="preserve">、Alembic </w:t>
+      </w:r>
+      <w:r>
+        <w:rPr>
+          <w:rFonts w:ascii="Consolas" w:hAnsi="Consolas" w:eastAsia="Microsoft JhengHei"/>
+          <w:b w:val="0"/>
+          <w:i w:val="0"/>
+          <w:color w:val="17365D"/>
+          <w:sz w:val="17"/>
+        </w:rPr>
         <w:t>0003_m9_5</w:t>
       </w:r>
       <w:r>
@@ -13276,7 +13687,7 @@
           <w:b w:val="0"/>
           <w:i w:val="0"/>
         </w:rPr>
-        <w:t>。</w:t>
+        <w:t>、70 tests、Scoped Golden Persistence、冪等與服務重啟均通過。</w:t>
       </w:r>
     </w:p>
     <w:p>

</xml_diff>

<commit_message>
feat: add M9.6 artifact lifecycle
</commit_message>
<xml_diff>
--- a/docs/OMNICHECK_AI_BUILD_AND_OPERATIONS_GUIDE.docx
+++ b/docs/OMNICHECK_AI_BUILD_AND_OPERATIONS_GUIDE.docx
@@ -103,7 +103,7 @@
           <w:b w:val="0"/>
           <w:i w:val="0"/>
         </w:rPr>
-        <w:t>文件版本：0.9.5</w:t>
+        <w:t>文件版本：0.9.6-draft.1</w:t>
       </w:r>
     </w:p>
     <w:p>
@@ -1477,6 +1477,112 @@
                 <w:sz w:val="17"/>
               </w:rPr>
               <w:t>驗證狀態</w:t>
+            </w:r>
+          </w:p>
+        </w:tc>
+      </w:tr>
+      <w:tr>
+        <w:tc>
+          <w:tcPr>
+            <w:tcW w:type="dxa" w:w="2470"/>
+            <w:vAlign w:val="center"/>
+            <w:tcMar>
+              <w:top w:w="45" w:type="dxa"/>
+              <w:start w:w="120" w:type="dxa"/>
+              <w:bottom w:w="45" w:type="dxa"/>
+              <w:end w:w="120" w:type="dxa"/>
+            </w:tcMar>
+          </w:tcPr>
+          <w:p>
+            <w:pPr>
+              <w:spacing w:after="0"/>
+            </w:pPr>
+            <w:r>
+              <w:rPr>
+                <w:rFonts w:ascii="Calibri" w:hAnsi="Calibri" w:eastAsia="Microsoft JhengHei"/>
+                <w:b w:val="0"/>
+                <w:i w:val="0"/>
+                <w:sz w:val="17"/>
+              </w:rPr>
+              <w:t>0.9.6-draft.1</w:t>
+            </w:r>
+          </w:p>
+        </w:tc>
+        <w:tc>
+          <w:tcPr>
+            <w:tcW w:type="dxa" w:w="2470"/>
+            <w:vAlign w:val="center"/>
+            <w:tcMar>
+              <w:top w:w="45" w:type="dxa"/>
+              <w:start w:w="120" w:type="dxa"/>
+              <w:bottom w:w="45" w:type="dxa"/>
+              <w:end w:w="120" w:type="dxa"/>
+            </w:tcMar>
+          </w:tcPr>
+          <w:p>
+            <w:pPr>
+              <w:spacing w:after="0"/>
+            </w:pPr>
+            <w:r>
+              <w:rPr>
+                <w:rFonts w:ascii="Calibri" w:hAnsi="Calibri" w:eastAsia="Microsoft JhengHei"/>
+                <w:b w:val="0"/>
+                <w:i w:val="0"/>
+                <w:sz w:val="17"/>
+              </w:rPr>
+              <w:t>2026-08-05</w:t>
+            </w:r>
+          </w:p>
+        </w:tc>
+        <w:tc>
+          <w:tcPr>
+            <w:tcW w:type="dxa" w:w="2470"/>
+            <w:vAlign w:val="center"/>
+            <w:tcMar>
+              <w:top w:w="45" w:type="dxa"/>
+              <w:start w:w="120" w:type="dxa"/>
+              <w:bottom w:w="45" w:type="dxa"/>
+              <w:end w:w="120" w:type="dxa"/>
+            </w:tcMar>
+          </w:tcPr>
+          <w:p>
+            <w:pPr>
+              <w:spacing w:after="0"/>
+            </w:pPr>
+            <w:r>
+              <w:rPr>
+                <w:rFonts w:ascii="Calibri" w:hAnsi="Calibri" w:eastAsia="Microsoft JhengHei"/>
+                <w:b w:val="0"/>
+                <w:i w:val="0"/>
+                <w:sz w:val="17"/>
+              </w:rPr>
+              <w:t>Artifact version、derivation、event、Retention 與 copy-verify archive</w:t>
+            </w:r>
+          </w:p>
+        </w:tc>
+        <w:tc>
+          <w:tcPr>
+            <w:tcW w:type="dxa" w:w="2470"/>
+            <w:vAlign w:val="center"/>
+            <w:tcMar>
+              <w:top w:w="45" w:type="dxa"/>
+              <w:start w:w="120" w:type="dxa"/>
+              <w:bottom w:w="45" w:type="dxa"/>
+              <w:end w:w="120" w:type="dxa"/>
+            </w:tcMar>
+          </w:tcPr>
+          <w:p>
+            <w:pPr>
+              <w:spacing w:after="0"/>
+            </w:pPr>
+            <w:r>
+              <w:rPr>
+                <w:rFonts w:ascii="Calibri" w:hAnsi="Calibri" w:eastAsia="Microsoft JhengHei"/>
+                <w:b w:val="0"/>
+                <w:i w:val="0"/>
+                <w:sz w:val="17"/>
+              </w:rPr>
+              <w:t>本機 74 tests、offline migration 與實際資料唯讀驗證通過；公司 EDB 待驗證</w:t>
             </w:r>
           </w:p>
         </w:tc>
@@ -3603,7 +3709,87 @@
                 <w:i w:val="0"/>
                 <w:sz w:val="17"/>
               </w:rPr>
-              <w:t>M9.6～M15</w:t>
+              <w:t>M9.6</w:t>
+            </w:r>
+          </w:p>
+        </w:tc>
+        <w:tc>
+          <w:tcPr>
+            <w:tcW w:type="dxa" w:w="3293"/>
+            <w:vAlign w:val="center"/>
+            <w:tcMar>
+              <w:top w:w="45" w:type="dxa"/>
+              <w:start w:w="120" w:type="dxa"/>
+              <w:bottom w:w="45" w:type="dxa"/>
+              <w:end w:w="120" w:type="dxa"/>
+            </w:tcMar>
+          </w:tcPr>
+          <w:p>
+            <w:pPr>
+              <w:spacing w:after="0"/>
+            </w:pPr>
+            <w:r>
+              <w:rPr>
+                <w:rFonts w:ascii="Calibri" w:hAnsi="Calibri" w:eastAsia="Microsoft JhengHei"/>
+                <w:b w:val="0"/>
+                <w:i w:val="0"/>
+                <w:sz w:val="17"/>
+              </w:rPr>
+              <w:t>功能分支本機完成</w:t>
+            </w:r>
+          </w:p>
+        </w:tc>
+        <w:tc>
+          <w:tcPr>
+            <w:tcW w:type="dxa" w:w="3293"/>
+            <w:vAlign w:val="center"/>
+            <w:tcMar>
+              <w:top w:w="45" w:type="dxa"/>
+              <w:start w:w="120" w:type="dxa"/>
+              <w:bottom w:w="45" w:type="dxa"/>
+              <w:end w:w="120" w:type="dxa"/>
+            </w:tcMar>
+          </w:tcPr>
+          <w:p>
+            <w:pPr>
+              <w:spacing w:after="0"/>
+            </w:pPr>
+            <w:r>
+              <w:rPr>
+                <w:rFonts w:ascii="Calibri" w:hAnsi="Calibri" w:eastAsia="Microsoft JhengHei"/>
+                <w:b w:val="0"/>
+                <w:i w:val="0"/>
+                <w:sz w:val="17"/>
+              </w:rPr>
+              <w:t>Artifact version、derivation、events、Retention、copy-verify archive；公司 EDB 待驗證</w:t>
+            </w:r>
+          </w:p>
+        </w:tc>
+      </w:tr>
+      <w:tr>
+        <w:tc>
+          <w:tcPr>
+            <w:tcW w:type="dxa" w:w="3293"/>
+            <w:vAlign w:val="center"/>
+            <w:tcMar>
+              <w:top w:w="45" w:type="dxa"/>
+              <w:start w:w="120" w:type="dxa"/>
+              <w:bottom w:w="45" w:type="dxa"/>
+              <w:end w:w="120" w:type="dxa"/>
+            </w:tcMar>
+          </w:tcPr>
+          <w:p>
+            <w:pPr>
+              <w:spacing w:after="0"/>
+            </w:pPr>
+            <w:r>
+              <w:rPr>
+                <w:rFonts w:ascii="Calibri" w:hAnsi="Calibri" w:eastAsia="Microsoft JhengHei"/>
+                <w:b w:val="0"/>
+                <w:i w:val="0"/>
+                <w:sz w:val="17"/>
+              </w:rPr>
+              <w:t>M10～M15</w:t>
             </w:r>
           </w:p>
         </w:tc>
@@ -3655,7 +3841,7 @@
                 <w:i w:val="0"/>
                 <w:sz w:val="17"/>
               </w:rPr>
-              <w:t>Artifact lifecycle、拓撲確認、權限、歷史、CVE、選配 AI 與生產強化</w:t>
+              <w:t>拓撲確認、權限、歷史、CVE、選配 AI 與生產強化</w:t>
             </w:r>
           </w:p>
         </w:tc>
@@ -8168,6 +8354,14 @@
               <w:t>OMNICHECK_WORKER_STALE_SECONDS=3600</w:t>
               <w:br/>
               <w:t>OMNICHECK_PERSIST_RESULTS=true</w:t>
+              <w:br/>
+              <w:t>OMNICHECK_REGISTER_ARTIFACTS=true</w:t>
+              <w:br/>
+              <w:t>OMNICHECK_ARTIFACT_RETENTION_DAYS=365</w:t>
+              <w:br/>
+              <w:t>OMNICHECK_STORAGE_ROOT=/data/omnicheck</w:t>
+              <w:br/>
+              <w:t>OMNICHECK_ARCHIVE_ROOT=/data/omnicheck/archive</w:t>
             </w:r>
           </w:p>
         </w:tc>
@@ -9477,6 +9671,209 @@
           <w:i w:val="0"/>
         </w:rPr>
         <w:t>；冪等重寫、Web／Worker restart 與 health 均通過。Release 切換時必須同步重新安裝 editable package；health probe 應允許 Uvicorn 最多 30 秒啟動。</w:t>
+      </w:r>
+    </w:p>
+    <w:p>
+      <w:pPr>
+        <w:pStyle w:val="Heading3"/>
+      </w:pPr>
+      <w:r>
+        <w:rPr>
+          <w:rFonts w:ascii="Calibri" w:hAnsi="Calibri" w:eastAsia="Microsoft JhengHei"/>
+          <w:b w:val="0"/>
+          <w:i w:val="0"/>
+        </w:rPr>
+        <w:t>10.5 M9.6 migration（公司環境待驗證）</w:t>
+      </w:r>
+    </w:p>
+    <w:p>
+      <w:r>
+        <w:rPr>
+          <w:rFonts w:ascii="Consolas" w:hAnsi="Consolas" w:eastAsia="Microsoft JhengHei"/>
+          <w:b w:val="0"/>
+          <w:i w:val="0"/>
+          <w:color w:val="17365D"/>
+          <w:sz w:val="17"/>
+        </w:rPr>
+        <w:t>0004_m9_6</w:t>
+      </w:r>
+      <w:r>
+        <w:rPr>
+          <w:rFonts w:ascii="Calibri" w:hAnsi="Calibri" w:eastAsia="Microsoft JhengHei"/>
+          <w:b w:val="0"/>
+          <w:i w:val="0"/>
+        </w:rPr>
+        <w:t xml:space="preserve"> 擴充 </w:t>
+      </w:r>
+      <w:r>
+        <w:rPr>
+          <w:rFonts w:ascii="Consolas" w:hAnsi="Consolas" w:eastAsia="Microsoft JhengHei"/>
+          <w:b w:val="0"/>
+          <w:i w:val="0"/>
+          <w:color w:val="17365D"/>
+          <w:sz w:val="17"/>
+        </w:rPr>
+        <w:t>artifacts</w:t>
+      </w:r>
+      <w:r>
+        <w:rPr>
+          <w:rFonts w:ascii="Calibri" w:hAnsi="Calibri" w:eastAsia="Microsoft JhengHei"/>
+          <w:b w:val="0"/>
+          <w:i w:val="0"/>
+        </w:rPr>
+        <w:t xml:space="preserve"> 並新增 </w:t>
+      </w:r>
+      <w:r>
+        <w:rPr>
+          <w:rFonts w:ascii="Consolas" w:hAnsi="Consolas" w:eastAsia="Microsoft JhengHei"/>
+          <w:b w:val="0"/>
+          <w:i w:val="0"/>
+          <w:color w:val="17365D"/>
+          <w:sz w:val="17"/>
+        </w:rPr>
+        <w:t>artifact_relations</w:t>
+      </w:r>
+      <w:r>
+        <w:rPr>
+          <w:rFonts w:ascii="Calibri" w:hAnsi="Calibri" w:eastAsia="Microsoft JhengHei"/>
+          <w:b w:val="0"/>
+          <w:i w:val="0"/>
+        </w:rPr>
+        <w:t>、</w:t>
+      </w:r>
+      <w:r>
+        <w:rPr>
+          <w:rFonts w:ascii="Consolas" w:hAnsi="Consolas" w:eastAsia="Microsoft JhengHei"/>
+          <w:b w:val="0"/>
+          <w:i w:val="0"/>
+          <w:color w:val="17365D"/>
+          <w:sz w:val="17"/>
+        </w:rPr>
+        <w:t>artifact_events</w:t>
+      </w:r>
+      <w:r>
+        <w:rPr>
+          <w:rFonts w:ascii="Calibri" w:hAnsi="Calibri" w:eastAsia="Microsoft JhengHei"/>
+          <w:b w:val="0"/>
+          <w:i w:val="0"/>
+        </w:rPr>
+        <w:t xml:space="preserve">。部署前先備份 </w:t>
+      </w:r>
+      <w:r>
+        <w:rPr>
+          <w:rFonts w:ascii="Consolas" w:hAnsi="Consolas" w:eastAsia="Microsoft JhengHei"/>
+          <w:b w:val="0"/>
+          <w:i w:val="0"/>
+          <w:color w:val="17365D"/>
+          <w:sz w:val="17"/>
+        </w:rPr>
+        <w:t>0003_m9_5</w:t>
+      </w:r>
+      <w:r>
+        <w:rPr>
+          <w:rFonts w:ascii="Calibri" w:hAnsi="Calibri" w:eastAsia="Microsoft JhengHei"/>
+          <w:b w:val="0"/>
+          <w:i w:val="0"/>
+        </w:rPr>
+        <w:t>；升級後以 scoped Job 驗證 11 或 13 個輸出 Artifact、版本、relations、events 與冪等。Downgrade 會刪除 M9.6 metadata 與 version 2 以上 registry rows，必須另行核准；實體檔案不由 migration 刪除。</w:t>
+      </w:r>
+    </w:p>
+    <w:p>
+      <w:r>
+        <w:rPr>
+          <w:rFonts w:ascii="Calibri" w:hAnsi="Calibri" w:eastAsia="Microsoft JhengHei"/>
+          <w:b w:val="0"/>
+          <w:i w:val="0"/>
+        </w:rPr>
+        <w:t>先用 dry-run 查看已到期項目，人工確認後才 apply：</w:t>
+      </w:r>
+    </w:p>
+    <w:tbl>
+      <w:tblPr>
+        <w:tblStyle w:val="TableGrid"/>
+        <w:tblW w:type="auto" w:w="0"/>
+        <w:jc w:val="center"/>
+        <w:tblLayout w:type="fixed"/>
+        <w:tblLook w:firstColumn="1" w:firstRow="1" w:lastColumn="0" w:lastRow="0" w:noHBand="0" w:noVBand="1" w:val="04A0"/>
+      </w:tblPr>
+      <w:tblGrid>
+        <w:gridCol w:w="9878"/>
+      </w:tblGrid>
+      <w:tr>
+        <w:tc>
+          <w:tcPr>
+            <w:tcW w:type="dxa" w:w="9878"/>
+            <w:shd w:fill="F2F6FA"/>
+            <w:tcMar>
+              <w:top w:w="90" w:type="dxa"/>
+              <w:start w:w="130" w:type="dxa"/>
+              <w:bottom w:w="90" w:type="dxa"/>
+              <w:end w:w="130" w:type="dxa"/>
+            </w:tcMar>
+          </w:tcPr>
+          <w:p>
+            <w:pPr>
+              <w:pStyle w:val="CodeBlock"/>
+              <w:keepLines w:val="0"/>
+            </w:pPr>
+            <w:r>
+              <w:rPr>
+                <w:rFonts w:ascii="Consolas" w:hAnsi="Consolas" w:eastAsia="Microsoft JhengHei"/>
+                <w:sz w:val="16"/>
+              </w:rPr>
+              <w:t>sudo -u omnicheck env \</w:t>
+              <w:br/>
+              <w:t xml:space="preserve">  OMNICHECK_DATABASE_URL="$(sed -n 's/^OMNICHECK_DATABASE_URL=//p' /etc/omnicheck-ai/omnicheck.env)" \</w:t>
+              <w:br/>
+              <w:t xml:space="preserve">  OMNICHECK_STORAGE_ROOT=/data/omnicheck \</w:t>
+              <w:br/>
+              <w:t xml:space="preserve">  OMNICHECK_ARCHIVE_ROOT=/data/omnicheck/archive \</w:t>
+              <w:br/>
+              <w:t xml:space="preserve">  /data/omnicheck/venv/bin/omni-healthcheck-artifacts</w:t>
+              <w:br/>
+              <w:br/>
+              <w:t># 經核准後才執行；只 copy + verify，不刪來源</w:t>
+              <w:br/>
+              <w:t>sudo -u omnicheck env \</w:t>
+              <w:br/>
+              <w:t xml:space="preserve">  OMNICHECK_DATABASE_URL="$(sed -n 's/^OMNICHECK_DATABASE_URL=//p' /etc/omnicheck-ai/omnicheck.env)" \</w:t>
+              <w:br/>
+              <w:t xml:space="preserve">  OMNICHECK_STORAGE_ROOT=/data/omnicheck \</w:t>
+              <w:br/>
+              <w:t xml:space="preserve">  OMNICHECK_ARCHIVE_ROOT=/data/omnicheck/archive \</w:t>
+              <w:br/>
+              <w:t xml:space="preserve">  /data/omnicheck/venv/bin/omni-healthcheck-artifacts --apply</w:t>
+            </w:r>
+          </w:p>
+        </w:tc>
+      </w:tr>
+    </w:tbl>
+    <w:p>
+      <w:r>
+        <w:rPr>
+          <w:rFonts w:ascii="Calibri" w:hAnsi="Calibri" w:eastAsia="Microsoft JhengHei"/>
+          <w:b w:val="0"/>
+          <w:i w:val="0"/>
+        </w:rPr>
+        <w:t>M9.6 不提供自動實體刪除。</w:t>
+      </w:r>
+      <w:r>
+        <w:rPr>
+          <w:rFonts w:ascii="Consolas" w:hAnsi="Consolas" w:eastAsia="Microsoft JhengHei"/>
+          <w:b w:val="0"/>
+          <w:i w:val="0"/>
+          <w:color w:val="17365D"/>
+          <w:sz w:val="17"/>
+        </w:rPr>
+        <w:t>pending_delete</w:t>
+      </w:r>
+      <w:r>
+        <w:rPr>
+          <w:rFonts w:ascii="Calibri" w:hAnsi="Calibri" w:eastAsia="Microsoft JhengHei"/>
+          <w:b w:val="0"/>
+          <w:i w:val="0"/>
+        </w:rPr>
+        <w:t xml:space="preserve"> 只代表已提出刪除申請，仍可取消；未經獨立備份、legal hold 檢查與明確核准，不得手動刪檔。</w:t>
       </w:r>
     </w:p>
     <w:p>
@@ -13700,7 +14097,43 @@
           <w:b w:val="0"/>
           <w:i w:val="0"/>
         </w:rPr>
-        <w:t>台灣行動支付實際資料在 SCRAM 重啟後通過 13 inputs／13 outputs、QA 8/8、V4 QA、29 頁 PDF 與來源 SHA-256 不變。</w:t>
+        <w:t xml:space="preserve">M9.6 功能分支已通過 74 tests、offline migration、V4 hashes 與台灣行動支付 Artifact 唯讀驗證；公司 </w:t>
+      </w:r>
+      <w:r>
+        <w:rPr>
+          <w:rFonts w:ascii="Consolas" w:hAnsi="Consolas" w:eastAsia="Microsoft JhengHei"/>
+          <w:b w:val="0"/>
+          <w:i w:val="0"/>
+          <w:color w:val="17365D"/>
+          <w:sz w:val="17"/>
+        </w:rPr>
+        <w:t>.81</w:t>
+      </w:r>
+      <w:r>
+        <w:rPr>
+          <w:rFonts w:ascii="Calibri" w:hAnsi="Calibri" w:eastAsia="Microsoft JhengHei"/>
+          <w:b w:val="0"/>
+          <w:i w:val="0"/>
+        </w:rPr>
+        <w:t xml:space="preserve"> 尚未執行 </w:t>
+      </w:r>
+      <w:r>
+        <w:rPr>
+          <w:rFonts w:ascii="Consolas" w:hAnsi="Consolas" w:eastAsia="Microsoft JhengHei"/>
+          <w:b w:val="0"/>
+          <w:i w:val="0"/>
+          <w:color w:val="17365D"/>
+          <w:sz w:val="17"/>
+        </w:rPr>
+        <w:t>0004_m9_6</w:t>
+      </w:r>
+      <w:r>
+        <w:rPr>
+          <w:rFonts w:ascii="Calibri" w:hAnsi="Calibri" w:eastAsia="Microsoft JhengHei"/>
+          <w:b w:val="0"/>
+          <w:i w:val="0"/>
+        </w:rPr>
+        <w:t>。</w:t>
       </w:r>
     </w:p>
     <w:p>
@@ -13709,39 +14142,11 @@
       </w:pPr>
       <w:r>
         <w:rPr>
-          <w:rFonts w:ascii="Consolas" w:hAnsi="Consolas" w:eastAsia="Microsoft JhengHei"/>
-          <w:b w:val="0"/>
-          <w:i w:val="0"/>
-          <w:color w:val="17365D"/>
-          <w:sz w:val="17"/>
-        </w:rPr>
-        <w:t>.81</w:t>
-      </w:r>
-      <w:r>
-        <w:rPr>
-          <w:rFonts w:ascii="Calibri" w:hAnsi="Calibri" w:eastAsia="Microsoft JhengHei"/>
-          <w:b w:val="0"/>
-          <w:i w:val="0"/>
-        </w:rPr>
-        <w:t xml:space="preserve"> 的 OMNIcheck 精確規則已要求 SCRAM；cluster-wide </w:t>
-      </w:r>
-      <w:r>
-        <w:rPr>
-          <w:rFonts w:ascii="Consolas" w:hAnsi="Consolas" w:eastAsia="Microsoft JhengHei"/>
-          <w:b w:val="0"/>
-          <w:i w:val="0"/>
-          <w:color w:val="17365D"/>
-          <w:sz w:val="17"/>
-        </w:rPr>
-        <w:t>host all all 0.0.0.0/0 trust</w:t>
-      </w:r>
-      <w:r>
-        <w:rPr>
-          <w:rFonts w:ascii="Calibri" w:hAnsi="Calibri" w:eastAsia="Microsoft JhengHei"/>
-          <w:b w:val="0"/>
-          <w:i w:val="0"/>
-        </w:rPr>
-        <w:t xml:space="preserve"> 仍是其他連線的安全風險，需另案收斂。</w:t>
+          <w:rFonts w:ascii="Calibri" w:hAnsi="Calibri" w:eastAsia="Microsoft JhengHei"/>
+          <w:b w:val="0"/>
+          <w:i w:val="0"/>
+        </w:rPr>
+        <w:t>台灣行動支付實際資料在 SCRAM 重啟後通過 13 inputs／13 outputs、QA 8/8、V4 QA、29 頁 PDF 與來源 SHA-256 不變。</w:t>
       </w:r>
     </w:p>
     <w:p>
@@ -13750,11 +14155,39 @@
       </w:pPr>
       <w:r>
         <w:rPr>
-          <w:rFonts w:ascii="Calibri" w:hAnsi="Calibri" w:eastAsia="Microsoft JhengHei"/>
-          <w:b w:val="0"/>
-          <w:i w:val="0"/>
-        </w:rPr>
-        <w:t>兩次修正前 API 500 留下兩筆空的 draft Golden 測試案件；尚未執行破壞性清除。</w:t>
+          <w:rFonts w:ascii="Consolas" w:hAnsi="Consolas" w:eastAsia="Microsoft JhengHei"/>
+          <w:b w:val="0"/>
+          <w:i w:val="0"/>
+          <w:color w:val="17365D"/>
+          <w:sz w:val="17"/>
+        </w:rPr>
+        <w:t>.81</w:t>
+      </w:r>
+      <w:r>
+        <w:rPr>
+          <w:rFonts w:ascii="Calibri" w:hAnsi="Calibri" w:eastAsia="Microsoft JhengHei"/>
+          <w:b w:val="0"/>
+          <w:i w:val="0"/>
+        </w:rPr>
+        <w:t xml:space="preserve"> 的 OMNIcheck 精確規則已要求 SCRAM；cluster-wide </w:t>
+      </w:r>
+      <w:r>
+        <w:rPr>
+          <w:rFonts w:ascii="Consolas" w:hAnsi="Consolas" w:eastAsia="Microsoft JhengHei"/>
+          <w:b w:val="0"/>
+          <w:i w:val="0"/>
+          <w:color w:val="17365D"/>
+          <w:sz w:val="17"/>
+        </w:rPr>
+        <w:t>host all all 0.0.0.0/0 trust</w:t>
+      </w:r>
+      <w:r>
+        <w:rPr>
+          <w:rFonts w:ascii="Calibri" w:hAnsi="Calibri" w:eastAsia="Microsoft JhengHei"/>
+          <w:b w:val="0"/>
+          <w:i w:val="0"/>
+        </w:rPr>
+        <w:t xml:space="preserve"> 仍是其他連線的安全風險，需另案收斂。</w:t>
       </w:r>
     </w:p>
     <w:p>
@@ -13767,7 +14200,7 @@
           <w:b w:val="0"/>
           <w:i w:val="0"/>
         </w:rPr>
-        <w:t>正式 TLS/VIP、EFM failover、reverse proxy、登入／RBAC 尚未完成。</w:t>
+        <w:t>兩次修正前 API 500 留下兩筆空的 draft Golden 測試案件；尚未執行破壞性清除。</w:t>
       </w:r>
     </w:p>
     <w:p>
@@ -13780,7 +14213,7 @@
           <w:b w:val="0"/>
           <w:i w:val="0"/>
         </w:rPr>
-        <w:t>完全未知資料包尚不能自動決定節點角色，仍需使用者確認。</w:t>
+        <w:t>正式 TLS/VIP、EFM failover、reverse proxy、登入／RBAC 尚未完成。</w:t>
       </w:r>
     </w:p>
     <w:p>
@@ -13793,7 +14226,7 @@
           <w:b w:val="0"/>
           <w:i w:val="0"/>
         </w:rPr>
-        <w:t>Barman 真實 wrapper fixture 待提供。</w:t>
+        <w:t>完全未知資料包尚不能自動決定節點角色，仍需使用者確認。</w:t>
       </w:r>
     </w:p>
     <w:p>
@@ -13806,7 +14239,7 @@
           <w:b w:val="0"/>
           <w:i w:val="0"/>
         </w:rPr>
-        <w:t>Python dependency 目前為 version ranges，正式 reproducible build 尚需 lock／wheelhouse。</w:t>
+        <w:t>Barman 真實 wrapper fixture 待提供。</w:t>
       </w:r>
     </w:p>
     <w:p>
@@ -13819,7 +14252,7 @@
           <w:b w:val="0"/>
           <w:i w:val="0"/>
         </w:rPr>
-        <w:t>歷史比較、CVE cache、可選 AI gateway 尚未實作。</w:t>
+        <w:t>Python dependency 目前為 version ranges，正式 reproducible build 尚需 lock／wheelhouse。</w:t>
       </w:r>
     </w:p>
     <w:p>
@@ -13832,6 +14265,19 @@
           <w:b w:val="0"/>
           <w:i w:val="0"/>
         </w:rPr>
+        <w:t>歷史比較、CVE cache、可選 AI gateway 尚未實作。</w:t>
+      </w:r>
+    </w:p>
+    <w:p>
+      <w:pPr>
+        <w:pStyle w:val="ListBullet"/>
+      </w:pPr>
+      <w:r>
+        <w:rPr>
+          <w:rFonts w:ascii="Calibri" w:hAnsi="Calibri" w:eastAsia="Microsoft JhengHei"/>
+          <w:b w:val="0"/>
+          <w:i w:val="0"/>
+        </w:rPr>
         <w:t>EDB 中心化與 CVE 自動化方向已核准；Application Data foundation tables 與 M9.5 Persistence Adapter 已實作，Artifact lifecycle 與 CVE tables 尚未實作。</w:t>
       </w:r>
     </w:p>
@@ -14128,6 +14574,47 @@
           <w:sz w:val="17"/>
         </w:rPr>
         <w:t>docs/M9_5_VALIDATION.md</w:t>
+      </w:r>
+    </w:p>
+    <w:p>
+      <w:pPr>
+        <w:pStyle w:val="ListBullet"/>
+      </w:pPr>
+      <w:r>
+        <w:rPr>
+          <w:rFonts w:ascii="Calibri" w:hAnsi="Calibri" w:eastAsia="Microsoft JhengHei"/>
+          <w:b w:val="0"/>
+          <w:i w:val="0"/>
+        </w:rPr>
+        <w:t>M9.6：</w:t>
+      </w:r>
+      <w:r>
+        <w:rPr>
+          <w:rFonts w:ascii="Consolas" w:hAnsi="Consolas" w:eastAsia="Microsoft JhengHei"/>
+          <w:b w:val="0"/>
+          <w:i w:val="0"/>
+          <w:color w:val="17365D"/>
+          <w:sz w:val="17"/>
+        </w:rPr>
+        <w:t>docs/M9_6_ARTIFACT_LIFECYCLE.md</w:t>
+      </w:r>
+      <w:r>
+        <w:rPr>
+          <w:rFonts w:ascii="Calibri" w:hAnsi="Calibri" w:eastAsia="Microsoft JhengHei"/>
+          <w:b w:val="0"/>
+          <w:i w:val="0"/>
+        </w:rPr>
+        <w:t>、</w:t>
+      </w:r>
+      <w:r>
+        <w:rPr>
+          <w:rFonts w:ascii="Consolas" w:hAnsi="Consolas" w:eastAsia="Microsoft JhengHei"/>
+          <w:b w:val="0"/>
+          <w:i w:val="0"/>
+          <w:color w:val="17365D"/>
+          <w:sz w:val="17"/>
+        </w:rPr>
+        <w:t>docs/M9_6_VALIDATION.md</w:t>
       </w:r>
     </w:p>
     <w:p>

</xml_diff>

<commit_message>
docs: formalize M9.6 company deployment
</commit_message>
<xml_diff>
--- a/docs/OMNICHECK_AI_BUILD_AND_OPERATIONS_GUIDE.docx
+++ b/docs/OMNICHECK_AI_BUILD_AND_OPERATIONS_GUIDE.docx
@@ -103,7 +103,7 @@
           <w:b w:val="0"/>
           <w:i w:val="0"/>
         </w:rPr>
-        <w:t>文件版本：0.9.6-draft.1</w:t>
+        <w:t>文件版本：0.9.6</w:t>
       </w:r>
     </w:p>
     <w:p>
@@ -116,7 +116,7 @@
           <w:b w:val="0"/>
           <w:i w:val="0"/>
         </w:rPr>
-        <w:t>最後更新：2026-08-05</w:t>
+        <w:t>最後更新：2026-08-10</w:t>
       </w:r>
     </w:p>
     <w:p>
@@ -157,7 +157,7 @@
           <w:color w:val="17365D"/>
           <w:sz w:val="17"/>
         </w:rPr>
-        <w:t>m9.5</w:t>
+        <w:t>m9.6</w:t>
       </w:r>
     </w:p>
     <w:p>
@@ -180,7 +180,7 @@
           <w:color w:val="17365D"/>
           <w:sz w:val="17"/>
         </w:rPr>
-        <w:t>m9.5</w:t>
+        <w:t>m9.6</w:t>
       </w:r>
     </w:p>
     <w:p>
@@ -1477,6 +1477,131 @@
                 <w:sz w:val="17"/>
               </w:rPr>
               <w:t>驗證狀態</w:t>
+            </w:r>
+          </w:p>
+        </w:tc>
+      </w:tr>
+      <w:tr>
+        <w:tc>
+          <w:tcPr>
+            <w:tcW w:type="dxa" w:w="2470"/>
+            <w:vAlign w:val="center"/>
+            <w:tcMar>
+              <w:top w:w="45" w:type="dxa"/>
+              <w:start w:w="120" w:type="dxa"/>
+              <w:bottom w:w="45" w:type="dxa"/>
+              <w:end w:w="120" w:type="dxa"/>
+            </w:tcMar>
+          </w:tcPr>
+          <w:p>
+            <w:pPr>
+              <w:spacing w:after="0"/>
+            </w:pPr>
+            <w:r>
+              <w:rPr>
+                <w:rFonts w:ascii="Calibri" w:hAnsi="Calibri" w:eastAsia="Microsoft JhengHei"/>
+                <w:b w:val="0"/>
+                <w:i w:val="0"/>
+                <w:sz w:val="17"/>
+              </w:rPr>
+              <w:t>0.9.6</w:t>
+            </w:r>
+          </w:p>
+        </w:tc>
+        <w:tc>
+          <w:tcPr>
+            <w:tcW w:type="dxa" w:w="2470"/>
+            <w:vAlign w:val="center"/>
+            <w:tcMar>
+              <w:top w:w="45" w:type="dxa"/>
+              <w:start w:w="120" w:type="dxa"/>
+              <w:bottom w:w="45" w:type="dxa"/>
+              <w:end w:w="120" w:type="dxa"/>
+            </w:tcMar>
+          </w:tcPr>
+          <w:p>
+            <w:pPr>
+              <w:spacing w:after="0"/>
+            </w:pPr>
+            <w:r>
+              <w:rPr>
+                <w:rFonts w:ascii="Calibri" w:hAnsi="Calibri" w:eastAsia="Microsoft JhengHei"/>
+                <w:b w:val="0"/>
+                <w:i w:val="0"/>
+                <w:sz w:val="17"/>
+              </w:rPr>
+              <w:t>2026-08-10</w:t>
+            </w:r>
+          </w:p>
+        </w:tc>
+        <w:tc>
+          <w:tcPr>
+            <w:tcW w:type="dxa" w:w="2470"/>
+            <w:vAlign w:val="center"/>
+            <w:tcMar>
+              <w:top w:w="45" w:type="dxa"/>
+              <w:start w:w="120" w:type="dxa"/>
+              <w:bottom w:w="45" w:type="dxa"/>
+              <w:end w:w="120" w:type="dxa"/>
+            </w:tcMar>
+          </w:tcPr>
+          <w:p>
+            <w:pPr>
+              <w:spacing w:after="0"/>
+            </w:pPr>
+            <w:r>
+              <w:rPr>
+                <w:rFonts w:ascii="Calibri" w:hAnsi="Calibri" w:eastAsia="Microsoft JhengHei"/>
+                <w:b w:val="0"/>
+                <w:i w:val="0"/>
+                <w:sz w:val="17"/>
+              </w:rPr>
+              <w:t>M9.6 公司 EDB deployment、Scoped Artifact E2E 與正式回復點</w:t>
+            </w:r>
+          </w:p>
+        </w:tc>
+        <w:tc>
+          <w:tcPr>
+            <w:tcW w:type="dxa" w:w="2470"/>
+            <w:vAlign w:val="center"/>
+            <w:tcMar>
+              <w:top w:w="45" w:type="dxa"/>
+              <w:start w:w="120" w:type="dxa"/>
+              <w:bottom w:w="45" w:type="dxa"/>
+              <w:end w:w="120" w:type="dxa"/>
+            </w:tcMar>
+          </w:tcPr>
+          <w:p>
+            <w:pPr>
+              <w:spacing w:after="0"/>
+            </w:pPr>
+            <w:r>
+              <w:rPr>
+                <w:rFonts w:ascii="Calibri" w:hAnsi="Calibri" w:eastAsia="Microsoft JhengHei"/>
+                <w:b w:val="0"/>
+                <w:i w:val="0"/>
+                <w:sz w:val="17"/>
+              </w:rPr>
+              <w:t>Backup/hash、VM 74 tests、</w:t>
+            </w:r>
+            <w:r>
+              <w:rPr>
+                <w:rFonts w:ascii="Consolas" w:hAnsi="Consolas" w:eastAsia="Microsoft JhengHei"/>
+                <w:b w:val="0"/>
+                <w:i w:val="0"/>
+                <w:color w:val="17365D"/>
+                <w:sz w:val="17"/>
+              </w:rPr>
+              <w:t>0004_m9_6</w:t>
+            </w:r>
+            <w:r>
+              <w:rPr>
+                <w:rFonts w:ascii="Calibri" w:hAnsi="Calibri" w:eastAsia="Microsoft JhengHei"/>
+                <w:b w:val="0"/>
+                <w:i w:val="0"/>
+                <w:sz w:val="17"/>
+              </w:rPr>
+              <w:t>、冪等、archive dry-run 與 restart 通過</w:t>
             </w:r>
           </w:p>
         </w:tc>
@@ -3735,7 +3860,7 @@
                 <w:i w:val="0"/>
                 <w:sz w:val="17"/>
               </w:rPr>
-              <w:t>功能分支本機完成</w:t>
+              <w:t>正式完成</w:t>
             </w:r>
           </w:p>
         </w:tc>
@@ -3761,7 +3886,7 @@
                 <w:i w:val="0"/>
                 <w:sz w:val="17"/>
               </w:rPr>
-              <w:t>Artifact version、derivation、events、Retention、copy-verify archive；公司 EDB 待驗證</w:t>
+              <w:t>Artifact version、derivation、events、Retention、copy-verify archive 與公司部署</w:t>
             </w:r>
           </w:p>
         </w:tc>
@@ -3879,7 +4004,7 @@
           <w:color w:val="17365D"/>
           <w:sz w:val="17"/>
         </w:rPr>
-        <w:t>m9.5</w:t>
+        <w:t>m9.6</w:t>
       </w:r>
       <w:r>
         <w:rPr>
@@ -3897,15 +4022,15 @@
           <w:color w:val="17365D"/>
           <w:sz w:val="17"/>
         </w:rPr>
-        <w:t>m9.4</w:t>
-      </w:r>
-      <w:r>
-        <w:rPr>
-          <w:rFonts w:ascii="Calibri" w:hAnsi="Calibri" w:eastAsia="Microsoft JhengHei"/>
-          <w:b w:val="0"/>
-          <w:i w:val="0"/>
-        </w:rPr>
-        <w:t xml:space="preserve"> 保留為 Persistence 前的 application rollback 點，</w:t>
+        <w:t>m9.5</w:t>
+      </w:r>
+      <w:r>
+        <w:rPr>
+          <w:rFonts w:ascii="Calibri" w:hAnsi="Calibri" w:eastAsia="Microsoft JhengHei"/>
+          <w:b w:val="0"/>
+          <w:i w:val="0"/>
+        </w:rPr>
+        <w:t xml:space="preserve"> 保留為 Artifact lifecycle 前的 application rollback 點，</w:t>
       </w:r>
       <w:r>
         <w:rPr>
@@ -3915,15 +4040,15 @@
           <w:color w:val="17365D"/>
           <w:sz w:val="17"/>
         </w:rPr>
-        <w:t>m9.3</w:t>
-      </w:r>
-      <w:r>
-        <w:rPr>
-          <w:rFonts w:ascii="Calibri" w:hAnsi="Calibri" w:eastAsia="Microsoft JhengHei"/>
-          <w:b w:val="0"/>
-          <w:i w:val="0"/>
-        </w:rPr>
-        <w:t xml:space="preserve"> 保留為 foundation 前的 rollback 點。正式重建應 checkout </w:t>
+        <w:t>m9.4</w:t>
+      </w:r>
+      <w:r>
+        <w:rPr>
+          <w:rFonts w:ascii="Calibri" w:hAnsi="Calibri" w:eastAsia="Microsoft JhengHei"/>
+          <w:b w:val="0"/>
+          <w:i w:val="0"/>
+        </w:rPr>
+        <w:t xml:space="preserve"> 保留為 Persistence 前的 rollback 點。正式重建應 checkout </w:t>
       </w:r>
       <w:r>
         <w:rPr>
@@ -3933,7 +4058,7 @@
           <w:color w:val="17365D"/>
           <w:sz w:val="17"/>
         </w:rPr>
-        <w:t>m9.5</w:t>
+        <w:t>m9.6</w:t>
       </w:r>
       <w:r>
         <w:rPr>
@@ -4521,7 +4646,7 @@
           <w:b w:val="0"/>
           <w:i w:val="0"/>
         </w:rPr>
-        <w:t xml:space="preserve"> 加入 nullable tenant scope；M9.5 已完成 Pipeline Persistence。Artifact lifecycle、sync worker 與 AI Gateway 尚未完成。</w:t>
+        <w:t xml:space="preserve"> 加入 nullable tenant scope；M9.5 已完成 Pipeline Persistence，M9.6 已完成 Artifact lifecycle。通用排程器與 AI Gateway 尚未完成。</w:t>
       </w:r>
     </w:p>
     <w:p>
@@ -8663,7 +8788,7 @@
           <w:b w:val="0"/>
           <w:i w:val="0"/>
         </w:rPr>
-        <w:t xml:space="preserve"> 預期 revision 為 </w:t>
+        <w:t xml:space="preserve"> revision 為 </w:t>
       </w:r>
       <w:r>
         <w:rPr>
@@ -8681,7 +8806,7 @@
           <w:b w:val="0"/>
           <w:i w:val="0"/>
         </w:rPr>
-        <w:t xml:space="preserve">，schema 有 </w:t>
+        <w:t xml:space="preserve">。M9.4 為 </w:t>
       </w:r>
       <w:r>
         <w:rPr>
@@ -8691,15 +8816,15 @@
           <w:color w:val="17365D"/>
           <w:sz w:val="17"/>
         </w:rPr>
-        <w:t>jobs</w:t>
-      </w:r>
-      <w:r>
-        <w:rPr>
-          <w:rFonts w:ascii="Calibri" w:hAnsi="Calibri" w:eastAsia="Microsoft JhengHei"/>
-          <w:b w:val="0"/>
-          <w:i w:val="0"/>
-        </w:rPr>
-        <w:t>、</w:t>
+        <w:t>0002_m9_4</w:t>
+      </w:r>
+      <w:r>
+        <w:rPr>
+          <w:rFonts w:ascii="Calibri" w:hAnsi="Calibri" w:eastAsia="Microsoft JhengHei"/>
+          <w:b w:val="0"/>
+          <w:i w:val="0"/>
+        </w:rPr>
+        <w:t xml:space="preserve">，並新增 application foundation；M9.5 為 </w:t>
       </w:r>
       <w:r>
         <w:rPr>
@@ -8709,15 +8834,15 @@
           <w:color w:val="17365D"/>
           <w:sz w:val="17"/>
         </w:rPr>
-        <w:t>job_events</w:t>
-      </w:r>
-      <w:r>
-        <w:rPr>
-          <w:rFonts w:ascii="Calibri" w:hAnsi="Calibri" w:eastAsia="Microsoft JhengHei"/>
-          <w:b w:val="0"/>
-          <w:i w:val="0"/>
-        </w:rPr>
-        <w:t>、</w:t>
+        <w:t>0003_m9_5</w:t>
+      </w:r>
+      <w:r>
+        <w:rPr>
+          <w:rFonts w:ascii="Calibri" w:hAnsi="Calibri" w:eastAsia="Microsoft JhengHei"/>
+          <w:b w:val="0"/>
+          <w:i w:val="0"/>
+        </w:rPr>
+        <w:t xml:space="preserve">。M9.6 正式 revision 為 </w:t>
       </w:r>
       <w:r>
         <w:rPr>
@@ -8727,187 +8852,7 @@
           <w:color w:val="17365D"/>
           <w:sz w:val="17"/>
         </w:rPr>
-        <w:t>alembic_version</w:t>
-      </w:r>
-      <w:r>
-        <w:rPr>
-          <w:rFonts w:ascii="Calibri" w:hAnsi="Calibri" w:eastAsia="Microsoft JhengHei"/>
-          <w:b w:val="0"/>
-          <w:i w:val="0"/>
-        </w:rPr>
-        <w:t xml:space="preserve">。M9.4 為 </w:t>
-      </w:r>
-      <w:r>
-        <w:rPr>
-          <w:rFonts w:ascii="Consolas" w:hAnsi="Consolas" w:eastAsia="Microsoft JhengHei"/>
-          <w:b w:val="0"/>
-          <w:i w:val="0"/>
-          <w:color w:val="17365D"/>
-          <w:sz w:val="17"/>
-        </w:rPr>
-        <w:t>0002_m9_4</w:t>
-      </w:r>
-      <w:r>
-        <w:rPr>
-          <w:rFonts w:ascii="Calibri" w:hAnsi="Calibri" w:eastAsia="Microsoft JhengHei"/>
-          <w:b w:val="0"/>
-          <w:i w:val="0"/>
-        </w:rPr>
-        <w:t xml:space="preserve">，並新增 </w:t>
-      </w:r>
-      <w:r>
-        <w:rPr>
-          <w:rFonts w:ascii="Consolas" w:hAnsi="Consolas" w:eastAsia="Microsoft JhengHei"/>
-          <w:b w:val="0"/>
-          <w:i w:val="0"/>
-          <w:color w:val="17365D"/>
-          <w:sz w:val="17"/>
-        </w:rPr>
-        <w:t>customers</w:t>
-      </w:r>
-      <w:r>
-        <w:rPr>
-          <w:rFonts w:ascii="Calibri" w:hAnsi="Calibri" w:eastAsia="Microsoft JhengHei"/>
-          <w:b w:val="0"/>
-          <w:i w:val="0"/>
-        </w:rPr>
-        <w:t>、</w:t>
-      </w:r>
-      <w:r>
-        <w:rPr>
-          <w:rFonts w:ascii="Consolas" w:hAnsi="Consolas" w:eastAsia="Microsoft JhengHei"/>
-          <w:b w:val="0"/>
-          <w:i w:val="0"/>
-          <w:color w:val="17365D"/>
-          <w:sz w:val="17"/>
-        </w:rPr>
-        <w:t>systems</w:t>
-      </w:r>
-      <w:r>
-        <w:rPr>
-          <w:rFonts w:ascii="Calibri" w:hAnsi="Calibri" w:eastAsia="Microsoft JhengHei"/>
-          <w:b w:val="0"/>
-          <w:i w:val="0"/>
-        </w:rPr>
-        <w:t>、</w:t>
-      </w:r>
-      <w:r>
-        <w:rPr>
-          <w:rFonts w:ascii="Consolas" w:hAnsi="Consolas" w:eastAsia="Microsoft JhengHei"/>
-          <w:b w:val="0"/>
-          <w:i w:val="0"/>
-          <w:color w:val="17365D"/>
-          <w:sz w:val="17"/>
-        </w:rPr>
-        <w:t>nodes</w:t>
-      </w:r>
-      <w:r>
-        <w:rPr>
-          <w:rFonts w:ascii="Calibri" w:hAnsi="Calibri" w:eastAsia="Microsoft JhengHei"/>
-          <w:b w:val="0"/>
-          <w:i w:val="0"/>
-        </w:rPr>
-        <w:t>、</w:t>
-      </w:r>
-      <w:r>
-        <w:rPr>
-          <w:rFonts w:ascii="Consolas" w:hAnsi="Consolas" w:eastAsia="Microsoft JhengHei"/>
-          <w:b w:val="0"/>
-          <w:i w:val="0"/>
-          <w:color w:val="17365D"/>
-          <w:sz w:val="17"/>
-        </w:rPr>
-        <w:t>topology_relations</w:t>
-      </w:r>
-      <w:r>
-        <w:rPr>
-          <w:rFonts w:ascii="Calibri" w:hAnsi="Calibri" w:eastAsia="Microsoft JhengHei"/>
-          <w:b w:val="0"/>
-          <w:i w:val="0"/>
-        </w:rPr>
-        <w:t>、</w:t>
-      </w:r>
-      <w:r>
-        <w:rPr>
-          <w:rFonts w:ascii="Consolas" w:hAnsi="Consolas" w:eastAsia="Microsoft JhengHei"/>
-          <w:b w:val="0"/>
-          <w:i w:val="0"/>
-          <w:color w:val="17365D"/>
-          <w:sz w:val="17"/>
-        </w:rPr>
-        <w:t>evidence_files</w:t>
-      </w:r>
-      <w:r>
-        <w:rPr>
-          <w:rFonts w:ascii="Calibri" w:hAnsi="Calibri" w:eastAsia="Microsoft JhengHei"/>
-          <w:b w:val="0"/>
-          <w:i w:val="0"/>
-        </w:rPr>
-        <w:t>、</w:t>
-      </w:r>
-      <w:r>
-        <w:rPr>
-          <w:rFonts w:ascii="Consolas" w:hAnsi="Consolas" w:eastAsia="Microsoft JhengHei"/>
-          <w:b w:val="0"/>
-          <w:i w:val="0"/>
-          <w:color w:val="17365D"/>
-          <w:sz w:val="17"/>
-        </w:rPr>
-        <w:t>artifacts</w:t>
-      </w:r>
-      <w:r>
-        <w:rPr>
-          <w:rFonts w:ascii="Calibri" w:hAnsi="Calibri" w:eastAsia="Microsoft JhengHei"/>
-          <w:b w:val="0"/>
-          <w:i w:val="0"/>
-        </w:rPr>
-        <w:t>；</w:t>
-      </w:r>
-      <w:r>
-        <w:rPr>
-          <w:rFonts w:ascii="Consolas" w:hAnsi="Consolas" w:eastAsia="Microsoft JhengHei"/>
-          <w:b w:val="0"/>
-          <w:i w:val="0"/>
-          <w:color w:val="17365D"/>
-          <w:sz w:val="17"/>
-        </w:rPr>
-        <w:t>jobs</w:t>
-      </w:r>
-      <w:r>
-        <w:rPr>
-          <w:rFonts w:ascii="Calibri" w:hAnsi="Calibri" w:eastAsia="Microsoft JhengHei"/>
-          <w:b w:val="0"/>
-          <w:i w:val="0"/>
-        </w:rPr>
-        <w:t xml:space="preserve"> 新增 nullable </w:t>
-      </w:r>
-      <w:r>
-        <w:rPr>
-          <w:rFonts w:ascii="Consolas" w:hAnsi="Consolas" w:eastAsia="Microsoft JhengHei"/>
-          <w:b w:val="0"/>
-          <w:i w:val="0"/>
-          <w:color w:val="17365D"/>
-          <w:sz w:val="17"/>
-        </w:rPr>
-        <w:t>customer_id/system_id</w:t>
-      </w:r>
-      <w:r>
-        <w:rPr>
-          <w:rFonts w:ascii="Calibri" w:hAnsi="Calibri" w:eastAsia="Microsoft JhengHei"/>
-          <w:b w:val="0"/>
-          <w:i w:val="0"/>
-        </w:rPr>
-        <w:t xml:space="preserve">。M9.5 正式 revision 為 </w:t>
-      </w:r>
-      <w:r>
-        <w:rPr>
-          <w:rFonts w:ascii="Consolas" w:hAnsi="Consolas" w:eastAsia="Microsoft JhengHei"/>
-          <w:b w:val="0"/>
-          <w:i w:val="0"/>
-          <w:color w:val="17365D"/>
-          <w:sz w:val="17"/>
-        </w:rPr>
-        <w:t>0003_m9_5 (head)</w:t>
+        <w:t>0004_m9_6 (head)</w:t>
       </w:r>
       <w:r>
         <w:rPr>
@@ -9683,7 +9628,7 @@
           <w:b w:val="0"/>
           <w:i w:val="0"/>
         </w:rPr>
-        <w:t>10.5 M9.6 migration（公司環境待驗證）</w:t>
+        <w:t>10.5 M9.6 migration</w:t>
       </w:r>
     </w:p>
     <w:p>
@@ -9877,6 +9822,124 @@
       </w:r>
     </w:p>
     <w:p>
+      <w:r>
+        <w:rPr>
+          <w:rFonts w:ascii="Calibri" w:hAnsi="Calibri" w:eastAsia="Microsoft JhengHei"/>
+          <w:b w:val="0"/>
+          <w:i w:val="0"/>
+        </w:rPr>
+        <w:t xml:space="preserve">公司驗證結果：release </w:t>
+      </w:r>
+      <w:r>
+        <w:rPr>
+          <w:rFonts w:ascii="Consolas" w:hAnsi="Consolas" w:eastAsia="Microsoft JhengHei"/>
+          <w:b w:val="0"/>
+          <w:i w:val="0"/>
+          <w:color w:val="17365D"/>
+          <w:sz w:val="17"/>
+        </w:rPr>
+        <w:t>2fc2ce7</w:t>
+      </w:r>
+      <w:r>
+        <w:rPr>
+          <w:rFonts w:ascii="Calibri" w:hAnsi="Calibri" w:eastAsia="Microsoft JhengHei"/>
+          <w:b w:val="0"/>
+          <w:i w:val="0"/>
+        </w:rPr>
+        <w:t xml:space="preserve"> 在 VM 通過 74 tests 與 V4 hashes；備份 </w:t>
+      </w:r>
+      <w:r>
+        <w:rPr>
+          <w:rFonts w:ascii="Consolas" w:hAnsi="Consolas" w:eastAsia="Microsoft JhengHei"/>
+          <w:b w:val="0"/>
+          <w:i w:val="0"/>
+          <w:color w:val="17365D"/>
+          <w:sz w:val="17"/>
+        </w:rPr>
+        <w:t>/data/omnicheck/archive/omnicheck_app_pre_m9_6_20260810.dump</w:t>
+      </w:r>
+      <w:r>
+        <w:rPr>
+          <w:rFonts w:ascii="Calibri" w:hAnsi="Calibri" w:eastAsia="Microsoft JhengHei"/>
+          <w:b w:val="0"/>
+          <w:i w:val="0"/>
+        </w:rPr>
+        <w:t xml:space="preserve"> 的 SHA-256 為 </w:t>
+      </w:r>
+      <w:r>
+        <w:rPr>
+          <w:rFonts w:ascii="Consolas" w:hAnsi="Consolas" w:eastAsia="Microsoft JhengHei"/>
+          <w:b w:val="0"/>
+          <w:i w:val="0"/>
+          <w:color w:val="17365D"/>
+          <w:sz w:val="17"/>
+        </w:rPr>
+        <w:t>de79b27dc6d05a04f9415d4ef91b04132bde9ea7bc29b57bd38ebf84be4877e2</w:t>
+      </w:r>
+      <w:r>
+        <w:rPr>
+          <w:rFonts w:ascii="Calibri" w:hAnsi="Calibri" w:eastAsia="Microsoft JhengHei"/>
+          <w:b w:val="0"/>
+          <w:i w:val="0"/>
+        </w:rPr>
+        <w:t xml:space="preserve">，且 </w:t>
+      </w:r>
+      <w:r>
+        <w:rPr>
+          <w:rFonts w:ascii="Consolas" w:hAnsi="Consolas" w:eastAsia="Microsoft JhengHei"/>
+          <w:b w:val="0"/>
+          <w:i w:val="0"/>
+          <w:color w:val="17365D"/>
+          <w:sz w:val="17"/>
+        </w:rPr>
+        <w:t>pg_restore --list</w:t>
+      </w:r>
+      <w:r>
+        <w:rPr>
+          <w:rFonts w:ascii="Calibri" w:hAnsi="Calibri" w:eastAsia="Microsoft JhengHei"/>
+          <w:b w:val="0"/>
+          <w:i w:val="0"/>
+        </w:rPr>
+        <w:t xml:space="preserve"> 可讀。Schema 升至 </w:t>
+      </w:r>
+      <w:r>
+        <w:rPr>
+          <w:rFonts w:ascii="Consolas" w:hAnsi="Consolas" w:eastAsia="Microsoft JhengHei"/>
+          <w:b w:val="0"/>
+          <w:i w:val="0"/>
+          <w:color w:val="17365D"/>
+          <w:sz w:val="17"/>
+        </w:rPr>
+        <w:t>0004_m9_6</w:t>
+      </w:r>
+      <w:r>
+        <w:rPr>
+          <w:rFonts w:ascii="Calibri" w:hAnsi="Calibri" w:eastAsia="Microsoft JhengHei"/>
+          <w:b w:val="0"/>
+          <w:i w:val="0"/>
+        </w:rPr>
+        <w:t xml:space="preserve">，Scoped Golden Job </w:t>
+      </w:r>
+      <w:r>
+        <w:rPr>
+          <w:rFonts w:ascii="Consolas" w:hAnsi="Consolas" w:eastAsia="Microsoft JhengHei"/>
+          <w:b w:val="0"/>
+          <w:i w:val="0"/>
+          <w:color w:val="17365D"/>
+          <w:sz w:val="17"/>
+        </w:rPr>
+        <w:t>3c600f747da84d4e92f3c86f6fd0f6d3</w:t>
+      </w:r>
+      <w:r>
+        <w:rPr>
+          <w:rFonts w:ascii="Calibri" w:hAnsi="Calibri" w:eastAsia="Microsoft JhengHei"/>
+          <w:b w:val="0"/>
+          <w:i w:val="0"/>
+        </w:rPr>
+        <w:t xml:space="preserve"> 建立 11 artifacts、2 relations、11 events；冪等、Archive dry-run、archive manifest、Web／Worker restart 與 health 均通過。</w:t>
+      </w:r>
+    </w:p>
+    <w:p>
       <w:pPr>
         <w:pStyle w:val="Heading2"/>
       </w:pPr>
@@ -10358,7 +10421,7 @@
           <w:b w:val="0"/>
           <w:i w:val="0"/>
         </w:rPr>
-        <w:t>公司 M9.3 正式基準為 60 tests、M9.4 為 65 tests、M9.5 為 70 tests。實際數量會隨版本增加，不應硬性只等於固定數字；重點是 0 failed。</w:t>
+        <w:t>公司 M9.3 正式基準為 60 tests、M9.4 為 65 tests、M9.5 為 70 tests、M9.6 為 74 tests。實際數量會隨版本增加，不應硬性只等於固定數字；重點是 0 failed。</w:t>
       </w:r>
     </w:p>
     <w:p>
@@ -11185,6 +11248,115 @@
           <w:i w:val="0"/>
         </w:rPr>
         <w:t>Web／Worker restart 後 Snapshot、Job status 與 output 必須仍存在。</w:t>
+      </w:r>
+    </w:p>
+    <w:p>
+      <w:pPr>
+        <w:pStyle w:val="Heading3"/>
+      </w:pPr>
+      <w:r>
+        <w:rPr>
+          <w:rFonts w:ascii="Calibri" w:hAnsi="Calibri" w:eastAsia="Microsoft JhengHei"/>
+          <w:b w:val="0"/>
+          <w:i w:val="0"/>
+        </w:rPr>
+        <w:t>13.9 M9.6 Artifact lifecycle 驗收</w:t>
+      </w:r>
+    </w:p>
+    <w:p>
+      <w:pPr>
+        <w:pStyle w:val="ListBullet"/>
+      </w:pPr>
+      <w:r>
+        <w:rPr>
+          <w:rFonts w:ascii="Calibri" w:hAnsi="Calibri" w:eastAsia="Microsoft JhengHei"/>
+          <w:b w:val="0"/>
+          <w:i w:val="0"/>
+        </w:rPr>
+        <w:t>Scoped Job 每個 output 必須登錄一筆 Artifact，並保存 version、SHA-256、size、media type 與 retention。</w:t>
+      </w:r>
+    </w:p>
+    <w:p>
+      <w:pPr>
+        <w:pStyle w:val="ListBullet"/>
+      </w:pPr>
+      <w:r>
+        <w:rPr>
+          <w:rFonts w:ascii="Calibri" w:hAnsi="Calibri" w:eastAsia="Microsoft JhengHei"/>
+          <w:b w:val="0"/>
+          <w:i w:val="0"/>
+        </w:rPr>
+        <w:t xml:space="preserve">相同檔案重跑不得重複；內容變更必須升版並建立 </w:t>
+      </w:r>
+      <w:r>
+        <w:rPr>
+          <w:rFonts w:ascii="Consolas" w:hAnsi="Consolas" w:eastAsia="Microsoft JhengHei"/>
+          <w:b w:val="0"/>
+          <w:i w:val="0"/>
+          <w:color w:val="17365D"/>
+          <w:sz w:val="17"/>
+        </w:rPr>
+        <w:t>supersedes</w:t>
+      </w:r>
+      <w:r>
+        <w:rPr>
+          <w:rFonts w:ascii="Calibri" w:hAnsi="Calibri" w:eastAsia="Microsoft JhengHei"/>
+          <w:b w:val="0"/>
+          <w:i w:val="0"/>
+        </w:rPr>
+        <w:t xml:space="preserve"> relation。</w:t>
+      </w:r>
+    </w:p>
+    <w:p>
+      <w:pPr>
+        <w:pStyle w:val="ListBullet"/>
+      </w:pPr>
+      <w:r>
+        <w:rPr>
+          <w:rFonts w:ascii="Calibri" w:hAnsi="Calibri" w:eastAsia="Microsoft JhengHei"/>
+          <w:b w:val="0"/>
+          <w:i w:val="0"/>
+        </w:rPr>
+        <w:t>Canonical、Report Model、V4、DOCX、PDF 的衍生關係與事件必須可查。</w:t>
+      </w:r>
+    </w:p>
+    <w:p>
+      <w:pPr>
+        <w:pStyle w:val="ListBullet"/>
+      </w:pPr>
+      <w:r>
+        <w:rPr>
+          <w:rFonts w:ascii="Calibri" w:hAnsi="Calibri" w:eastAsia="Microsoft JhengHei"/>
+          <w:b w:val="0"/>
+          <w:i w:val="0"/>
+        </w:rPr>
+        <w:t>Archive 預設 dry-run；未到期時 count 必須為 0，archive manifest 不得改變。</w:t>
+      </w:r>
+    </w:p>
+    <w:p>
+      <w:pPr>
+        <w:pStyle w:val="ListBullet"/>
+      </w:pPr>
+      <w:r>
+        <w:rPr>
+          <w:rFonts w:ascii="Calibri" w:hAnsi="Calibri" w:eastAsia="Microsoft JhengHei"/>
+          <w:b w:val="0"/>
+          <w:i w:val="0"/>
+        </w:rPr>
+        <w:t>Apply 必須 copy、驗 hash、保留來源；M9.6 不自動實體刪除。</w:t>
+      </w:r>
+    </w:p>
+    <w:p>
+      <w:pPr>
+        <w:pStyle w:val="ListBullet"/>
+      </w:pPr>
+      <w:r>
+        <w:rPr>
+          <w:rFonts w:ascii="Calibri" w:hAnsi="Calibri" w:eastAsia="Microsoft JhengHei"/>
+          <w:b w:val="0"/>
+          <w:i w:val="0"/>
+        </w:rPr>
+        <w:t>Web／Worker restart 後 Artifact、relations、events 與 Job status 必須仍存在。</w:t>
       </w:r>
     </w:p>
     <w:p>
@@ -14097,7 +14269,7 @@
           <w:b w:val="0"/>
           <w:i w:val="0"/>
         </w:rPr>
-        <w:t xml:space="preserve">M9.6 功能分支已通過 74 tests、offline migration、V4 hashes 與台灣行動支付 Artifact 唯讀驗證；公司 </w:t>
+        <w:t xml:space="preserve">M9.6 已部署公司 </w:t>
       </w:r>
       <w:r>
         <w:rPr>
@@ -14107,15 +14279,15 @@
           <w:color w:val="17365D"/>
           <w:sz w:val="17"/>
         </w:rPr>
-        <w:t>.81</w:t>
-      </w:r>
-      <w:r>
-        <w:rPr>
-          <w:rFonts w:ascii="Calibri" w:hAnsi="Calibri" w:eastAsia="Microsoft JhengHei"/>
-          <w:b w:val="0"/>
-          <w:i w:val="0"/>
-        </w:rPr>
-        <w:t xml:space="preserve"> 尚未執行 </w:t>
+        <w:t>.77/.81</w:t>
+      </w:r>
+      <w:r>
+        <w:rPr>
+          <w:rFonts w:ascii="Calibri" w:hAnsi="Calibri" w:eastAsia="Microsoft JhengHei"/>
+          <w:b w:val="0"/>
+          <w:i w:val="0"/>
+        </w:rPr>
+        <w:t xml:space="preserve">：release </w:t>
       </w:r>
       <w:r>
         <w:rPr>
@@ -14125,6 +14297,24 @@
           <w:color w:val="17365D"/>
           <w:sz w:val="17"/>
         </w:rPr>
+        <w:t>2fc2ce7</w:t>
+      </w:r>
+      <w:r>
+        <w:rPr>
+          <w:rFonts w:ascii="Calibri" w:hAnsi="Calibri" w:eastAsia="Microsoft JhengHei"/>
+          <w:b w:val="0"/>
+          <w:i w:val="0"/>
+        </w:rPr>
+        <w:t xml:space="preserve">、Alembic </w:t>
+      </w:r>
+      <w:r>
+        <w:rPr>
+          <w:rFonts w:ascii="Consolas" w:hAnsi="Consolas" w:eastAsia="Microsoft JhengHei"/>
+          <w:b w:val="0"/>
+          <w:i w:val="0"/>
+          <w:color w:val="17365D"/>
+          <w:sz w:val="17"/>
+        </w:rPr>
         <w:t>0004_m9_6</w:t>
       </w:r>
       <w:r>
@@ -14133,7 +14323,7 @@
           <w:b w:val="0"/>
           <w:i w:val="0"/>
         </w:rPr>
-        <w:t>。</w:t>
+        <w:t>、74 tests、Scoped Artifact E2E、Archive dry-run、冪等與服務重啟均通過。</w:t>
       </w:r>
     </w:p>
     <w:p>
@@ -14278,7 +14468,7 @@
           <w:b w:val="0"/>
           <w:i w:val="0"/>
         </w:rPr>
-        <w:t>EDB 中心化與 CVE 自動化方向已核准；Application Data foundation tables 與 M9.5 Persistence Adapter 已實作，Artifact lifecycle 與 CVE tables 尚未實作。</w:t>
+        <w:t>EDB 中心化與 CVE 自動化方向已核准；Application Data foundation、M9.5 Persistence Adapter 與 M9.6 Artifact lifecycle 已實作，CVE tables 尚未實作。</w:t>
       </w:r>
     </w:p>
     <w:p>

</xml_diff>

<commit_message>
feat: add M10 topology discovery and confirmation
</commit_message>
<xml_diff>
--- a/docs/OMNICHECK_AI_BUILD_AND_OPERATIONS_GUIDE.docx
+++ b/docs/OMNICHECK_AI_BUILD_AND_OPERATIONS_GUIDE.docx
@@ -103,7 +103,7 @@
           <w:b w:val="0"/>
           <w:i w:val="0"/>
         </w:rPr>
-        <w:t>文件版本：0.9.6</w:t>
+        <w:t>文件版本：0.10.0-draft.1</w:t>
       </w:r>
     </w:p>
     <w:p>
@@ -130,6 +130,24 @@
           <w:i w:val="0"/>
         </w:rPr>
         <w:t>適用程式基準：</w:t>
+      </w:r>
+      <w:r>
+        <w:rPr>
+          <w:rFonts w:ascii="Consolas" w:hAnsi="Consolas" w:eastAsia="Microsoft JhengHei"/>
+          <w:b w:val="0"/>
+          <w:i w:val="0"/>
+          <w:color w:val="17365D"/>
+          <w:sz w:val="17"/>
+        </w:rPr>
+        <w:t>feature/m10-topology-discovery</w:t>
+      </w:r>
+      <w:r>
+        <w:rPr>
+          <w:rFonts w:ascii="Calibri" w:hAnsi="Calibri" w:eastAsia="Microsoft JhengHei"/>
+          <w:b w:val="0"/>
+          <w:i w:val="0"/>
+        </w:rPr>
+        <w:t xml:space="preserve">；正式基準仍為 </w:t>
       </w:r>
       <w:r>
         <w:rPr>
@@ -1477,6 +1495,112 @@
                 <w:sz w:val="17"/>
               </w:rPr>
               <w:t>驗證狀態</w:t>
+            </w:r>
+          </w:p>
+        </w:tc>
+      </w:tr>
+      <w:tr>
+        <w:tc>
+          <w:tcPr>
+            <w:tcW w:type="dxa" w:w="2470"/>
+            <w:vAlign w:val="center"/>
+            <w:tcMar>
+              <w:top w:w="45" w:type="dxa"/>
+              <w:start w:w="120" w:type="dxa"/>
+              <w:bottom w:w="45" w:type="dxa"/>
+              <w:end w:w="120" w:type="dxa"/>
+            </w:tcMar>
+          </w:tcPr>
+          <w:p>
+            <w:pPr>
+              <w:spacing w:after="0"/>
+            </w:pPr>
+            <w:r>
+              <w:rPr>
+                <w:rFonts w:ascii="Calibri" w:hAnsi="Calibri" w:eastAsia="Microsoft JhengHei"/>
+                <w:b w:val="0"/>
+                <w:i w:val="0"/>
+                <w:sz w:val="17"/>
+              </w:rPr>
+              <w:t>0.10.0-draft.1</w:t>
+            </w:r>
+          </w:p>
+        </w:tc>
+        <w:tc>
+          <w:tcPr>
+            <w:tcW w:type="dxa" w:w="2470"/>
+            <w:vAlign w:val="center"/>
+            <w:tcMar>
+              <w:top w:w="45" w:type="dxa"/>
+              <w:start w:w="120" w:type="dxa"/>
+              <w:bottom w:w="45" w:type="dxa"/>
+              <w:end w:w="120" w:type="dxa"/>
+            </w:tcMar>
+          </w:tcPr>
+          <w:p>
+            <w:pPr>
+              <w:spacing w:after="0"/>
+            </w:pPr>
+            <w:r>
+              <w:rPr>
+                <w:rFonts w:ascii="Calibri" w:hAnsi="Calibri" w:eastAsia="Microsoft JhengHei"/>
+                <w:b w:val="0"/>
+                <w:i w:val="0"/>
+                <w:sz w:val="17"/>
+              </w:rPr>
+              <w:t>2026-08-10</w:t>
+            </w:r>
+          </w:p>
+        </w:tc>
+        <w:tc>
+          <w:tcPr>
+            <w:tcW w:type="dxa" w:w="2470"/>
+            <w:vAlign w:val="center"/>
+            <w:tcMar>
+              <w:top w:w="45" w:type="dxa"/>
+              <w:start w:w="120" w:type="dxa"/>
+              <w:bottom w:w="45" w:type="dxa"/>
+              <w:end w:w="120" w:type="dxa"/>
+            </w:tcMar>
+          </w:tcPr>
+          <w:p>
+            <w:pPr>
+              <w:spacing w:after="0"/>
+            </w:pPr>
+            <w:r>
+              <w:rPr>
+                <w:rFonts w:ascii="Calibri" w:hAnsi="Calibri" w:eastAsia="Microsoft JhengHei"/>
+                <w:b w:val="0"/>
+                <w:i w:val="0"/>
+                <w:sz w:val="17"/>
+              </w:rPr>
+              <w:t>M10 deterministic topology discovery、人工確認、稽核來源與 Web gate</w:t>
+            </w:r>
+          </w:p>
+        </w:tc>
+        <w:tc>
+          <w:tcPr>
+            <w:tcW w:type="dxa" w:w="2470"/>
+            <w:vAlign w:val="center"/>
+            <w:tcMar>
+              <w:top w:w="45" w:type="dxa"/>
+              <w:start w:w="120" w:type="dxa"/>
+              <w:bottom w:w="45" w:type="dxa"/>
+              <w:end w:w="120" w:type="dxa"/>
+            </w:tcMar>
+          </w:tcPr>
+          <w:p>
+            <w:pPr>
+              <w:spacing w:after="0"/>
+            </w:pPr>
+            <w:r>
+              <w:rPr>
+                <w:rFonts w:ascii="Calibri" w:hAnsi="Calibri" w:eastAsia="Microsoft JhengHei"/>
+                <w:b w:val="0"/>
+                <w:i w:val="0"/>
+                <w:sz w:val="17"/>
+              </w:rPr>
+              <w:t>本機 78 tests；台灣行動支付 13 檔、5 節點、QA/V4 QA、DOCX/PDF、來源 hash 通過；公司環境待驗證</w:t>
             </w:r>
           </w:p>
         </w:tc>
@@ -3914,7 +4038,87 @@
                 <w:i w:val="0"/>
                 <w:sz w:val="17"/>
               </w:rPr>
-              <w:t>M10～M15</w:t>
+              <w:t>M10</w:t>
+            </w:r>
+          </w:p>
+        </w:tc>
+        <w:tc>
+          <w:tcPr>
+            <w:tcW w:type="dxa" w:w="3293"/>
+            <w:vAlign w:val="center"/>
+            <w:tcMar>
+              <w:top w:w="45" w:type="dxa"/>
+              <w:start w:w="120" w:type="dxa"/>
+              <w:bottom w:w="45" w:type="dxa"/>
+              <w:end w:w="120" w:type="dxa"/>
+            </w:tcMar>
+          </w:tcPr>
+          <w:p>
+            <w:pPr>
+              <w:spacing w:after="0"/>
+            </w:pPr>
+            <w:r>
+              <w:rPr>
+                <w:rFonts w:ascii="Calibri" w:hAnsi="Calibri" w:eastAsia="Microsoft JhengHei"/>
+                <w:b w:val="0"/>
+                <w:i w:val="0"/>
+                <w:sz w:val="17"/>
+              </w:rPr>
+              <w:t>功能分支驗證完成</w:t>
+            </w:r>
+          </w:p>
+        </w:tc>
+        <w:tc>
+          <w:tcPr>
+            <w:tcW w:type="dxa" w:w="3293"/>
+            <w:vAlign w:val="center"/>
+            <w:tcMar>
+              <w:top w:w="45" w:type="dxa"/>
+              <w:start w:w="120" w:type="dxa"/>
+              <w:bottom w:w="45" w:type="dxa"/>
+              <w:end w:w="120" w:type="dxa"/>
+            </w:tcMar>
+          </w:tcPr>
+          <w:p>
+            <w:pPr>
+              <w:spacing w:after="0"/>
+            </w:pPr>
+            <w:r>
+              <w:rPr>
+                <w:rFonts w:ascii="Calibri" w:hAnsi="Calibri" w:eastAsia="Microsoft JhengHei"/>
+                <w:b w:val="0"/>
+                <w:i w:val="0"/>
+                <w:sz w:val="17"/>
+              </w:rPr>
+              <w:t>未知資料包的確定性節點／角色／服務候選、人工確認與 fail-closed gate</w:t>
+            </w:r>
+          </w:p>
+        </w:tc>
+      </w:tr>
+      <w:tr>
+        <w:tc>
+          <w:tcPr>
+            <w:tcW w:type="dxa" w:w="3293"/>
+            <w:vAlign w:val="center"/>
+            <w:tcMar>
+              <w:top w:w="45" w:type="dxa"/>
+              <w:start w:w="120" w:type="dxa"/>
+              <w:bottom w:w="45" w:type="dxa"/>
+              <w:end w:w="120" w:type="dxa"/>
+            </w:tcMar>
+          </w:tcPr>
+          <w:p>
+            <w:pPr>
+              <w:spacing w:after="0"/>
+            </w:pPr>
+            <w:r>
+              <w:rPr>
+                <w:rFonts w:ascii="Calibri" w:hAnsi="Calibri" w:eastAsia="Microsoft JhengHei"/>
+                <w:b w:val="0"/>
+                <w:i w:val="0"/>
+                <w:sz w:val="17"/>
+              </w:rPr>
+              <w:t>M11～M15</w:t>
             </w:r>
           </w:p>
         </w:tc>
@@ -3966,7 +4170,7 @@
                 <w:i w:val="0"/>
                 <w:sz w:val="17"/>
               </w:rPr>
-              <w:t>拓撲確認、權限、歷史、CVE、選配 AI 與生產強化</w:t>
+              <w:t>權限、歷史、CVE、選配 AI 與生產強化</w:t>
             </w:r>
           </w:p>
         </w:tc>
@@ -10342,7 +10546,89 @@
           <w:b w:val="0"/>
           <w:i w:val="0"/>
         </w:rPr>
-        <w:t>，建立案件、設定節點、上傳資料夾、執行、等待 Worker，再下載輸出。Primary／Standby／DR／Witness 仍由使用者確認；目前不是完全未知資料包的自動角色決策器。</w:t>
+        <w:t>，選取資料夾後由 M10 確定性 Discovery 提出 hostname、Primary／Standby／DR／Witness、服務、信心與理由。使用者必須核對並勾選確認，系統才建立案件、上傳不可覆寫資料、交由 Worker 執行並提供下載。Discovery 不取代 DBA 決策；Primary 候選不唯一、未知或衝突時必須人工修正。</w:t>
+      </w:r>
+    </w:p>
+    <w:p>
+      <w:r>
+        <w:rPr>
+          <w:rFonts w:ascii="Calibri" w:hAnsi="Calibri" w:eastAsia="Microsoft JhengHei"/>
+          <w:b w:val="0"/>
+          <w:i w:val="0"/>
+        </w:rPr>
+        <w:t xml:space="preserve">Discovery API 只取文字檔前 512 KiB 作樣本；圖片不解析內容。確認紀錄保存在 </w:t>
+      </w:r>
+      <w:r>
+        <w:rPr>
+          <w:rFonts w:ascii="Consolas" w:hAnsi="Consolas" w:eastAsia="Microsoft JhengHei"/>
+          <w:b w:val="0"/>
+          <w:i w:val="0"/>
+          <w:color w:val="17365D"/>
+          <w:sz w:val="17"/>
+        </w:rPr>
+        <w:t>job.yaml.topology_confirmation</w:t>
+      </w:r>
+      <w:r>
+        <w:rPr>
+          <w:rFonts w:ascii="Calibri" w:hAnsi="Calibri" w:eastAsia="Microsoft JhengHei"/>
+          <w:b w:val="0"/>
+          <w:i w:val="0"/>
+        </w:rPr>
+        <w:t>，</w:t>
+      </w:r>
+      <w:r>
+        <w:rPr>
+          <w:rFonts w:ascii="Consolas" w:hAnsi="Consolas" w:eastAsia="Microsoft JhengHei"/>
+          <w:b w:val="0"/>
+          <w:i w:val="0"/>
+          <w:color w:val="17365D"/>
+          <w:sz w:val="17"/>
+        </w:rPr>
+        <w:t>topology.json</w:t>
+      </w:r>
+      <w:r>
+        <w:rPr>
+          <w:rFonts w:ascii="Calibri" w:hAnsi="Calibri" w:eastAsia="Microsoft JhengHei"/>
+          <w:b w:val="0"/>
+          <w:i w:val="0"/>
+        </w:rPr>
+        <w:t xml:space="preserve"> 會標記 </w:t>
+      </w:r>
+      <w:r>
+        <w:rPr>
+          <w:rFonts w:ascii="Consolas" w:hAnsi="Consolas" w:eastAsia="Microsoft JhengHei"/>
+          <w:b w:val="0"/>
+          <w:i w:val="0"/>
+          <w:color w:val="17365D"/>
+          <w:sz w:val="17"/>
+        </w:rPr>
+        <w:t>operator_confirmed_discovery</w:t>
+      </w:r>
+      <w:r>
+        <w:rPr>
+          <w:rFonts w:ascii="Calibri" w:hAnsi="Calibri" w:eastAsia="Microsoft JhengHei"/>
+          <w:b w:val="0"/>
+          <w:i w:val="0"/>
+        </w:rPr>
+        <w:t xml:space="preserve">。此功能不新增 migration、package 或環境變數；回復至 </w:t>
+      </w:r>
+      <w:r>
+        <w:rPr>
+          <w:rFonts w:ascii="Consolas" w:hAnsi="Consolas" w:eastAsia="Microsoft JhengHei"/>
+          <w:b w:val="0"/>
+          <w:i w:val="0"/>
+          <w:color w:val="17365D"/>
+          <w:sz w:val="17"/>
+        </w:rPr>
+        <w:t>m9.6</w:t>
+      </w:r>
+      <w:r>
+        <w:rPr>
+          <w:rFonts w:ascii="Calibri" w:hAnsi="Calibri" w:eastAsia="Microsoft JhengHei"/>
+          <w:b w:val="0"/>
+          <w:i w:val="0"/>
+        </w:rPr>
+        <w:t xml:space="preserve"> 不需 database downgrade。</w:t>
       </w:r>
     </w:p>
     <w:p>
@@ -14336,7 +14622,7 @@
           <w:b w:val="0"/>
           <w:i w:val="0"/>
         </w:rPr>
-        <w:t>台灣行動支付實際資料在 SCRAM 重啟後通過 13 inputs／13 outputs、QA 8/8、V4 QA、29 頁 PDF 與來源 SHA-256 不變。</w:t>
+        <w:t>M10 功能分支本機通過 78 tests；台灣行動支付 13 檔自動提出 5 節點與唯一 Primary，人工確認 gate、13 outputs、QA 8/8、V4 QA、DOCX/PDF 與來源 hash 通過。公司環境尚未部署。</w:t>
       </w:r>
     </w:p>
     <w:p>
@@ -14345,39 +14631,11 @@
       </w:pPr>
       <w:r>
         <w:rPr>
-          <w:rFonts w:ascii="Consolas" w:hAnsi="Consolas" w:eastAsia="Microsoft JhengHei"/>
-          <w:b w:val="0"/>
-          <w:i w:val="0"/>
-          <w:color w:val="17365D"/>
-          <w:sz w:val="17"/>
-        </w:rPr>
-        <w:t>.81</w:t>
-      </w:r>
-      <w:r>
-        <w:rPr>
-          <w:rFonts w:ascii="Calibri" w:hAnsi="Calibri" w:eastAsia="Microsoft JhengHei"/>
-          <w:b w:val="0"/>
-          <w:i w:val="0"/>
-        </w:rPr>
-        <w:t xml:space="preserve"> 的 OMNIcheck 精確規則已要求 SCRAM；cluster-wide </w:t>
-      </w:r>
-      <w:r>
-        <w:rPr>
-          <w:rFonts w:ascii="Consolas" w:hAnsi="Consolas" w:eastAsia="Microsoft JhengHei"/>
-          <w:b w:val="0"/>
-          <w:i w:val="0"/>
-          <w:color w:val="17365D"/>
-          <w:sz w:val="17"/>
-        </w:rPr>
-        <w:t>host all all 0.0.0.0/0 trust</w:t>
-      </w:r>
-      <w:r>
-        <w:rPr>
-          <w:rFonts w:ascii="Calibri" w:hAnsi="Calibri" w:eastAsia="Microsoft JhengHei"/>
-          <w:b w:val="0"/>
-          <w:i w:val="0"/>
-        </w:rPr>
-        <w:t xml:space="preserve"> 仍是其他連線的安全風險，需另案收斂。</w:t>
+          <w:rFonts w:ascii="Calibri" w:hAnsi="Calibri" w:eastAsia="Microsoft JhengHei"/>
+          <w:b w:val="0"/>
+          <w:i w:val="0"/>
+        </w:rPr>
+        <w:t>台灣行動支付實際資料在 SCRAM 重啟後通過 13 inputs／13 outputs、QA 8/8、V4 QA、29 頁 PDF 與來源 SHA-256 不變。</w:t>
       </w:r>
     </w:p>
     <w:p>
@@ -14386,11 +14644,39 @@
       </w:pPr>
       <w:r>
         <w:rPr>
-          <w:rFonts w:ascii="Calibri" w:hAnsi="Calibri" w:eastAsia="Microsoft JhengHei"/>
-          <w:b w:val="0"/>
-          <w:i w:val="0"/>
-        </w:rPr>
-        <w:t>兩次修正前 API 500 留下兩筆空的 draft Golden 測試案件；尚未執行破壞性清除。</w:t>
+          <w:rFonts w:ascii="Consolas" w:hAnsi="Consolas" w:eastAsia="Microsoft JhengHei"/>
+          <w:b w:val="0"/>
+          <w:i w:val="0"/>
+          <w:color w:val="17365D"/>
+          <w:sz w:val="17"/>
+        </w:rPr>
+        <w:t>.81</w:t>
+      </w:r>
+      <w:r>
+        <w:rPr>
+          <w:rFonts w:ascii="Calibri" w:hAnsi="Calibri" w:eastAsia="Microsoft JhengHei"/>
+          <w:b w:val="0"/>
+          <w:i w:val="0"/>
+        </w:rPr>
+        <w:t xml:space="preserve"> 的 OMNIcheck 精確規則已要求 SCRAM；cluster-wide </w:t>
+      </w:r>
+      <w:r>
+        <w:rPr>
+          <w:rFonts w:ascii="Consolas" w:hAnsi="Consolas" w:eastAsia="Microsoft JhengHei"/>
+          <w:b w:val="0"/>
+          <w:i w:val="0"/>
+          <w:color w:val="17365D"/>
+          <w:sz w:val="17"/>
+        </w:rPr>
+        <w:t>host all all 0.0.0.0/0 trust</w:t>
+      </w:r>
+      <w:r>
+        <w:rPr>
+          <w:rFonts w:ascii="Calibri" w:hAnsi="Calibri" w:eastAsia="Microsoft JhengHei"/>
+          <w:b w:val="0"/>
+          <w:i w:val="0"/>
+        </w:rPr>
+        <w:t xml:space="preserve"> 仍是其他連線的安全風險，需另案收斂。</w:t>
       </w:r>
     </w:p>
     <w:p>
@@ -14403,7 +14689,7 @@
           <w:b w:val="0"/>
           <w:i w:val="0"/>
         </w:rPr>
-        <w:t>正式 TLS/VIP、EFM failover、reverse proxy、登入／RBAC 尚未完成。</w:t>
+        <w:t>兩次修正前 API 500 留下兩筆空的 draft Golden 測試案件；尚未執行破壞性清除。</w:t>
       </w:r>
     </w:p>
     <w:p>
@@ -14416,7 +14702,7 @@
           <w:b w:val="0"/>
           <w:i w:val="0"/>
         </w:rPr>
-        <w:t>完全未知資料包尚不能自動決定節點角色，仍需使用者確認。</w:t>
+        <w:t>正式 TLS/VIP、EFM failover、reverse proxy、登入／RBAC 尚未完成。</w:t>
       </w:r>
     </w:p>
     <w:p>
@@ -14429,7 +14715,7 @@
           <w:b w:val="0"/>
           <w:i w:val="0"/>
         </w:rPr>
-        <w:t>Barman 真實 wrapper fixture 待提供。</w:t>
+        <w:t>M10 可對標準搜集包提出角色候選；非標準檔名、缺少 EFM／OS 訊號或衝突時仍需使用者指定，且所有案件都必須人工確認。</w:t>
       </w:r>
     </w:p>
     <w:p>
@@ -14442,7 +14728,7 @@
           <w:b w:val="0"/>
           <w:i w:val="0"/>
         </w:rPr>
-        <w:t>Python dependency 目前為 version ranges，正式 reproducible build 尚需 lock／wheelhouse。</w:t>
+        <w:t>Barman 真實 wrapper fixture 待提供。</w:t>
       </w:r>
     </w:p>
     <w:p>
@@ -14455,7 +14741,7 @@
           <w:b w:val="0"/>
           <w:i w:val="0"/>
         </w:rPr>
-        <w:t>歷史比較、CVE cache、可選 AI gateway 尚未實作。</w:t>
+        <w:t>Python dependency 目前為 version ranges，正式 reproducible build 尚需 lock／wheelhouse。</w:t>
       </w:r>
     </w:p>
     <w:p>
@@ -14468,6 +14754,19 @@
           <w:b w:val="0"/>
           <w:i w:val="0"/>
         </w:rPr>
+        <w:t>歷史比較、CVE cache、可選 AI gateway 尚未實作。</w:t>
+      </w:r>
+    </w:p>
+    <w:p>
+      <w:pPr>
+        <w:pStyle w:val="ListBullet"/>
+      </w:pPr>
+      <w:r>
+        <w:rPr>
+          <w:rFonts w:ascii="Calibri" w:hAnsi="Calibri" w:eastAsia="Microsoft JhengHei"/>
+          <w:b w:val="0"/>
+          <w:i w:val="0"/>
+        </w:rPr>
         <w:t>EDB 中心化與 CVE 自動化方向已核准；Application Data foundation、M9.5 Persistence Adapter 與 M9.6 Artifact lifecycle 已實作，CVE tables 尚未實作。</w:t>
       </w:r>
     </w:p>
@@ -14805,6 +15104,47 @@
           <w:sz w:val="17"/>
         </w:rPr>
         <w:t>docs/M9_6_VALIDATION.md</w:t>
+      </w:r>
+    </w:p>
+    <w:p>
+      <w:pPr>
+        <w:pStyle w:val="ListBullet"/>
+      </w:pPr>
+      <w:r>
+        <w:rPr>
+          <w:rFonts w:ascii="Calibri" w:hAnsi="Calibri" w:eastAsia="Microsoft JhengHei"/>
+          <w:b w:val="0"/>
+          <w:i w:val="0"/>
+        </w:rPr>
+        <w:t>M10：</w:t>
+      </w:r>
+      <w:r>
+        <w:rPr>
+          <w:rFonts w:ascii="Consolas" w:hAnsi="Consolas" w:eastAsia="Microsoft JhengHei"/>
+          <w:b w:val="0"/>
+          <w:i w:val="0"/>
+          <w:color w:val="17365D"/>
+          <w:sz w:val="17"/>
+        </w:rPr>
+        <w:t>docs/M10_TOPOLOGY_DISCOVERY.md</w:t>
+      </w:r>
+      <w:r>
+        <w:rPr>
+          <w:rFonts w:ascii="Calibri" w:hAnsi="Calibri" w:eastAsia="Microsoft JhengHei"/>
+          <w:b w:val="0"/>
+          <w:i w:val="0"/>
+        </w:rPr>
+        <w:t>、</w:t>
+      </w:r>
+      <w:r>
+        <w:rPr>
+          <w:rFonts w:ascii="Consolas" w:hAnsi="Consolas" w:eastAsia="Microsoft JhengHei"/>
+          <w:b w:val="0"/>
+          <w:i w:val="0"/>
+          <w:color w:val="17365D"/>
+          <w:sz w:val="17"/>
+        </w:rPr>
+        <w:t>docs/M10_VALIDATION.md</w:t>
       </w:r>
     </w:p>
     <w:p>

</xml_diff>

<commit_message>
fix: show database inventory for cluster nodes
</commit_message>
<xml_diff>
--- a/docs/OMNICHECK_AI_BUILD_AND_OPERATIONS_GUIDE.docx
+++ b/docs/OMNICHECK_AI_BUILD_AND_OPERATIONS_GUIDE.docx
@@ -1574,7 +1574,7 @@
                 <w:i w:val="0"/>
                 <w:sz w:val="17"/>
               </w:rPr>
-              <w:t>M10 deterministic topology discovery、人工確認、稽核來源與 Web gate</w:t>
+              <w:t>M10 deterministic topology discovery、人工確認、稽核來源、Web gate 與 2.1 節點 Database 清冊修正</w:t>
             </w:r>
           </w:p>
         </w:tc>
@@ -1600,7 +1600,7 @@
                 <w:i w:val="0"/>
                 <w:sz w:val="17"/>
               </w:rPr>
-              <w:t>本機 78 tests；台灣行動支付 13 檔、5 節點、QA/V4 QA、DOCX/PDF、來源 hash 通過；公司環境待驗證</w:t>
+              <w:t>本機 78 tests；台灣行動支付 13 檔、5 節點、QA/V4 QA、DOCX/PDF、2.1 PDF 目視與來源 hash 通過；公司環境待驗證</w:t>
             </w:r>
           </w:p>
         </w:tc>
@@ -10632,6 +10632,34 @@
       </w:r>
     </w:p>
     <w:p>
+      <w:r>
+        <w:rPr>
+          <w:rFonts w:ascii="Calibri" w:hAnsi="Calibri" w:eastAsia="Microsoft JhengHei"/>
+          <w:b w:val="0"/>
+          <w:i w:val="0"/>
+        </w:rPr>
+        <w:t xml:space="preserve">報告 2.1 的 Database 欄是節點軟體清冊，不是邏輯資料 Scope：Primary／Standby／DR 都顯示案件的 PostgreSQL／EPAS 產品；承載 PEM Server 的 Witness 顯示 </w:t>
+      </w:r>
+      <w:r>
+        <w:rPr>
+          <w:rFonts w:ascii="Consolas" w:hAnsi="Consolas" w:eastAsia="Microsoft JhengHei"/>
+          <w:b w:val="0"/>
+          <w:i w:val="0"/>
+          <w:color w:val="17365D"/>
+          <w:sz w:val="17"/>
+        </w:rPr>
+        <w:t>PostgreSQL</w:t>
+      </w:r>
+      <w:r>
+        <w:rPr>
+          <w:rFonts w:ascii="Calibri" w:hAnsi="Calibri" w:eastAsia="Microsoft JhengHei"/>
+          <w:b w:val="0"/>
+          <w:i w:val="0"/>
+        </w:rPr>
+        <w:t xml:space="preserve"> backend；只有 EFM 且沒有資料庫服務證據的 Witness 留白。Database／Schema／Table 等後續判斷仍只採 Primary。</w:t>
+      </w:r>
+    </w:p>
+    <w:p>
       <w:pPr>
         <w:pStyle w:val="Heading2"/>
       </w:pPr>

</xml_diff>

<commit_message>
docs: formalize M10 company deployment
</commit_message>
<xml_diff>
--- a/docs/OMNICHECK_AI_BUILD_AND_OPERATIONS_GUIDE.docx
+++ b/docs/OMNICHECK_AI_BUILD_AND_OPERATIONS_GUIDE.docx
@@ -103,7 +103,7 @@
           <w:b w:val="0"/>
           <w:i w:val="0"/>
         </w:rPr>
-        <w:t>文件版本：0.10.0-draft.1</w:t>
+        <w:t>文件版本：0.10.0</w:t>
       </w:r>
     </w:p>
     <w:p>
@@ -139,15 +139,15 @@
           <w:color w:val="17365D"/>
           <w:sz w:val="17"/>
         </w:rPr>
-        <w:t>feature/m10-topology-discovery</w:t>
-      </w:r>
-      <w:r>
-        <w:rPr>
-          <w:rFonts w:ascii="Calibri" w:hAnsi="Calibri" w:eastAsia="Microsoft JhengHei"/>
-          <w:b w:val="0"/>
-          <w:i w:val="0"/>
-        </w:rPr>
-        <w:t xml:space="preserve">；正式基準仍為 </w:t>
+        <w:t>main</w:t>
+      </w:r>
+      <w:r>
+        <w:rPr>
+          <w:rFonts w:ascii="Calibri" w:hAnsi="Calibri" w:eastAsia="Microsoft JhengHei"/>
+          <w:b w:val="0"/>
+          <w:i w:val="0"/>
+        </w:rPr>
+        <w:t xml:space="preserve"> / </w:t>
       </w:r>
       <w:r>
         <w:rPr>
@@ -157,25 +157,7 @@
           <w:color w:val="17365D"/>
           <w:sz w:val="17"/>
         </w:rPr>
-        <w:t>main</w:t>
-      </w:r>
-      <w:r>
-        <w:rPr>
-          <w:rFonts w:ascii="Calibri" w:hAnsi="Calibri" w:eastAsia="Microsoft JhengHei"/>
-          <w:b w:val="0"/>
-          <w:i w:val="0"/>
-        </w:rPr>
-        <w:t xml:space="preserve"> / </w:t>
-      </w:r>
-      <w:r>
-        <w:rPr>
-          <w:rFonts w:ascii="Consolas" w:hAnsi="Consolas" w:eastAsia="Microsoft JhengHei"/>
-          <w:b w:val="0"/>
-          <w:i w:val="0"/>
-          <w:color w:val="17365D"/>
-          <w:sz w:val="17"/>
-        </w:rPr>
-        <w:t>m9.6</w:t>
+        <w:t>m10</w:t>
       </w:r>
     </w:p>
     <w:p>
@@ -189,6 +171,24 @@
           <w:i w:val="0"/>
         </w:rPr>
         <w:t>正式可回復基準：</w:t>
+      </w:r>
+      <w:r>
+        <w:rPr>
+          <w:rFonts w:ascii="Consolas" w:hAnsi="Consolas" w:eastAsia="Microsoft JhengHei"/>
+          <w:b w:val="0"/>
+          <w:i w:val="0"/>
+          <w:color w:val="17365D"/>
+          <w:sz w:val="17"/>
+        </w:rPr>
+        <w:t>m10</w:t>
+      </w:r>
+      <w:r>
+        <w:rPr>
+          <w:rFonts w:ascii="Calibri" w:hAnsi="Calibri" w:eastAsia="Microsoft JhengHei"/>
+          <w:b w:val="0"/>
+          <w:i w:val="0"/>
+        </w:rPr>
+        <w:t xml:space="preserve">；前一個 application rollback 點為 </w:t>
       </w:r>
       <w:r>
         <w:rPr>
@@ -1522,7 +1522,7 @@
                 <w:i w:val="0"/>
                 <w:sz w:val="17"/>
               </w:rPr>
-              <w:t>0.10.0-draft.1</w:t>
+              <w:t>0.10.0</w:t>
             </w:r>
           </w:p>
         </w:tc>
@@ -1574,7 +1574,7 @@
                 <w:i w:val="0"/>
                 <w:sz w:val="17"/>
               </w:rPr>
-              <w:t>M10 deterministic topology discovery、人工確認、稽核來源、Web gate 與 2.1 節點 Database 清冊修正</w:t>
+              <w:t>M10 deterministic topology discovery、人工確認、稽核來源、Web gate、2.1 節點 Database 清冊與公司正式部署</w:t>
             </w:r>
           </w:p>
         </w:tc>
@@ -1600,7 +1600,7 @@
                 <w:i w:val="0"/>
                 <w:sz w:val="17"/>
               </w:rPr>
-              <w:t>本機 78 tests；台灣行動支付 13 檔、5 節點、QA/V4 QA、DOCX/PDF、2.1 PDF 目視與來源 hash 通過；公司環境待驗證</w:t>
+              <w:t>本機／公司 VM 78 tests；台灣行動支付 13 檔、5 節點、QA/V4 QA、DOCX/PDF、來源 hash、Queue/Worker、EDB 持久性與重啟通過</w:t>
             </w:r>
           </w:p>
         </w:tc>
@@ -4064,7 +4064,7 @@
                 <w:i w:val="0"/>
                 <w:sz w:val="17"/>
               </w:rPr>
-              <w:t>功能分支驗證完成</w:t>
+              <w:t>正式完成</w:t>
             </w:r>
           </w:p>
         </w:tc>
@@ -4090,7 +4090,7 @@
                 <w:i w:val="0"/>
                 <w:sz w:val="17"/>
               </w:rPr>
-              <w:t>未知資料包的確定性節點／角色／服務候選、人工確認與 fail-closed gate</w:t>
+              <w:t>未知資料包的確定性節點／角色／服務候選、人工確認、fail-closed gate 與公司部署</w:t>
             </w:r>
           </w:p>
         </w:tc>
@@ -4208,7 +4208,7 @@
           <w:color w:val="17365D"/>
           <w:sz w:val="17"/>
         </w:rPr>
-        <w:t>m9.6</w:t>
+        <w:t>m10</w:t>
       </w:r>
       <w:r>
         <w:rPr>
@@ -4226,15 +4226,15 @@
           <w:color w:val="17365D"/>
           <w:sz w:val="17"/>
         </w:rPr>
-        <w:t>m9.5</w:t>
-      </w:r>
-      <w:r>
-        <w:rPr>
-          <w:rFonts w:ascii="Calibri" w:hAnsi="Calibri" w:eastAsia="Microsoft JhengHei"/>
-          <w:b w:val="0"/>
-          <w:i w:val="0"/>
-        </w:rPr>
-        <w:t xml:space="preserve"> 保留為 Artifact lifecycle 前的 application rollback 點，</w:t>
+        <w:t>m9.6</w:t>
+      </w:r>
+      <w:r>
+        <w:rPr>
+          <w:rFonts w:ascii="Calibri" w:hAnsi="Calibri" w:eastAsia="Microsoft JhengHei"/>
+          <w:b w:val="0"/>
+          <w:i w:val="0"/>
+        </w:rPr>
+        <w:t xml:space="preserve"> 保留為 M10 前的 application rollback 點，</w:t>
       </w:r>
       <w:r>
         <w:rPr>
@@ -4244,15 +4244,15 @@
           <w:color w:val="17365D"/>
           <w:sz w:val="17"/>
         </w:rPr>
-        <w:t>m9.4</w:t>
-      </w:r>
-      <w:r>
-        <w:rPr>
-          <w:rFonts w:ascii="Calibri" w:hAnsi="Calibri" w:eastAsia="Microsoft JhengHei"/>
-          <w:b w:val="0"/>
-          <w:i w:val="0"/>
-        </w:rPr>
-        <w:t xml:space="preserve"> 保留為 Persistence 前的 rollback 點。正式重建應 checkout </w:t>
+        <w:t>m9.5</w:t>
+      </w:r>
+      <w:r>
+        <w:rPr>
+          <w:rFonts w:ascii="Calibri" w:hAnsi="Calibri" w:eastAsia="Microsoft JhengHei"/>
+          <w:b w:val="0"/>
+          <w:i w:val="0"/>
+        </w:rPr>
+        <w:t xml:space="preserve"> 與 </w:t>
       </w:r>
       <w:r>
         <w:rPr>
@@ -4262,7 +4262,25 @@
           <w:color w:val="17365D"/>
           <w:sz w:val="17"/>
         </w:rPr>
-        <w:t>m9.6</w:t>
+        <w:t>m9.4</w:t>
+      </w:r>
+      <w:r>
+        <w:rPr>
+          <w:rFonts w:ascii="Calibri" w:hAnsi="Calibri" w:eastAsia="Microsoft JhengHei"/>
+          <w:b w:val="0"/>
+          <w:i w:val="0"/>
+        </w:rPr>
+        <w:t xml:space="preserve"> 保留較早期 rollback 點。正式重建應 checkout </w:t>
+      </w:r>
+      <w:r>
+        <w:rPr>
+          <w:rFonts w:ascii="Consolas" w:hAnsi="Consolas" w:eastAsia="Microsoft JhengHei"/>
+          <w:b w:val="0"/>
+          <w:i w:val="0"/>
+          <w:color w:val="17365D"/>
+          <w:sz w:val="17"/>
+        </w:rPr>
+        <w:t>m10</w:t>
       </w:r>
       <w:r>
         <w:rPr>
@@ -10735,7 +10753,7 @@
           <w:b w:val="0"/>
           <w:i w:val="0"/>
         </w:rPr>
-        <w:t>公司 M9.3 正式基準為 60 tests、M9.4 為 65 tests、M9.5 為 70 tests、M9.6 為 74 tests。實際數量會隨版本增加，不應硬性只等於固定數字；重點是 0 failed。</w:t>
+        <w:t>公司 M9.3 正式基準為 60 tests、M9.4 為 65 tests、M9.5 為 70 tests、M9.6 為 74 tests、M10 為 78 tests。實際數量會隨版本增加，不應硬性只等於固定數字；重點是 0 failed。</w:t>
       </w:r>
     </w:p>
     <w:p>
@@ -11671,6 +11689,197 @@
           <w:i w:val="0"/>
         </w:rPr>
         <w:t>Web／Worker restart 後 Artifact、relations、events 與 Job status 必須仍存在。</w:t>
+      </w:r>
+    </w:p>
+    <w:p>
+      <w:pPr>
+        <w:pStyle w:val="Heading3"/>
+      </w:pPr>
+      <w:r>
+        <w:rPr>
+          <w:rFonts w:ascii="Calibri" w:hAnsi="Calibri" w:eastAsia="Microsoft JhengHei"/>
+          <w:b w:val="0"/>
+          <w:i w:val="0"/>
+        </w:rPr>
+        <w:t>13.10 M10 拓撲探索驗收</w:t>
+      </w:r>
+    </w:p>
+    <w:p>
+      <w:pPr>
+        <w:pStyle w:val="ListBullet"/>
+      </w:pPr>
+      <w:r>
+        <w:rPr>
+          <w:rFonts w:ascii="Calibri" w:hAnsi="Calibri" w:eastAsia="Microsoft JhengHei"/>
+          <w:b w:val="0"/>
+          <w:i w:val="0"/>
+        </w:rPr>
+        <w:t>未知資料包必須先顯示節點、角色、服務、信心與判斷理由；未人工確認不得建立案件。</w:t>
+      </w:r>
+    </w:p>
+    <w:p>
+      <w:pPr>
+        <w:pStyle w:val="ListBullet"/>
+      </w:pPr>
+      <w:r>
+        <w:rPr>
+          <w:rFonts w:ascii="Calibri" w:hAnsi="Calibri" w:eastAsia="Microsoft JhengHei"/>
+          <w:b w:val="0"/>
+          <w:i w:val="0"/>
+        </w:rPr>
+        <w:t>Primary 候選不唯一、角色衝突或無法解析時必須要求修正，不得由 AI 猜測。</w:t>
+      </w:r>
+    </w:p>
+    <w:p>
+      <w:pPr>
+        <w:pStyle w:val="ListBullet"/>
+      </w:pPr>
+      <w:r>
+        <w:rPr>
+          <w:rFonts w:ascii="Consolas" w:hAnsi="Consolas" w:eastAsia="Microsoft JhengHei"/>
+          <w:b w:val="0"/>
+          <w:i w:val="0"/>
+          <w:color w:val="17365D"/>
+          <w:sz w:val="17"/>
+        </w:rPr>
+        <w:t>topology.json</w:t>
+      </w:r>
+      <w:r>
+        <w:rPr>
+          <w:rFonts w:ascii="Calibri" w:hAnsi="Calibri" w:eastAsia="Microsoft JhengHei"/>
+          <w:b w:val="0"/>
+          <w:i w:val="0"/>
+        </w:rPr>
+        <w:t xml:space="preserve"> 必須記錄 </w:t>
+      </w:r>
+      <w:r>
+        <w:rPr>
+          <w:rFonts w:ascii="Consolas" w:hAnsi="Consolas" w:eastAsia="Microsoft JhengHei"/>
+          <w:b w:val="0"/>
+          <w:i w:val="0"/>
+          <w:color w:val="17365D"/>
+          <w:sz w:val="17"/>
+        </w:rPr>
+        <w:t>operator_confirmed_discovery</w:t>
+      </w:r>
+      <w:r>
+        <w:rPr>
+          <w:rFonts w:ascii="Calibri" w:hAnsi="Calibri" w:eastAsia="Microsoft JhengHei"/>
+          <w:b w:val="0"/>
+          <w:i w:val="0"/>
+        </w:rPr>
+        <w:t>，並維持邏輯資料 Primary-only 與設定檔跨節點比較規則。</w:t>
+      </w:r>
+    </w:p>
+    <w:p>
+      <w:pPr>
+        <w:pStyle w:val="ListBullet"/>
+      </w:pPr>
+      <w:r>
+        <w:rPr>
+          <w:rFonts w:ascii="Calibri" w:hAnsi="Calibri" w:eastAsia="Microsoft JhengHei"/>
+          <w:b w:val="0"/>
+          <w:i w:val="0"/>
+        </w:rPr>
+        <w:t>2.1 Database 清冊須顯示 Primary／Standby／DR 的案件產品及 PEM Server 的 PostgreSQL backend，不得用 Primary-only Scope 隱藏節點安裝資訊。</w:t>
+      </w:r>
+    </w:p>
+    <w:p>
+      <w:pPr>
+        <w:pStyle w:val="ListBullet"/>
+      </w:pPr>
+      <w:r>
+        <w:rPr>
+          <w:rFonts w:ascii="Calibri" w:hAnsi="Calibri" w:eastAsia="Microsoft JhengHei"/>
+          <w:b w:val="0"/>
+          <w:i w:val="0"/>
+        </w:rPr>
+        <w:t xml:space="preserve">公司基準為 release </w:t>
+      </w:r>
+      <w:r>
+        <w:rPr>
+          <w:rFonts w:ascii="Consolas" w:hAnsi="Consolas" w:eastAsia="Microsoft JhengHei"/>
+          <w:b w:val="0"/>
+          <w:i w:val="0"/>
+          <w:color w:val="17365D"/>
+          <w:sz w:val="17"/>
+        </w:rPr>
+        <w:t>6e8ee6e</w:t>
+      </w:r>
+      <w:r>
+        <w:rPr>
+          <w:rFonts w:ascii="Calibri" w:hAnsi="Calibri" w:eastAsia="Microsoft JhengHei"/>
+          <w:b w:val="0"/>
+          <w:i w:val="0"/>
+        </w:rPr>
+        <w:t xml:space="preserve">、78 tests；Job </w:t>
+      </w:r>
+      <w:r>
+        <w:rPr>
+          <w:rFonts w:ascii="Consolas" w:hAnsi="Consolas" w:eastAsia="Microsoft JhengHei"/>
+          <w:b w:val="0"/>
+          <w:i w:val="0"/>
+          <w:color w:val="17365D"/>
+          <w:sz w:val="17"/>
+        </w:rPr>
+        <w:t>12c90aa3da354f1c83dbc42e6d57e118</w:t>
+      </w:r>
+      <w:r>
+        <w:rPr>
+          <w:rFonts w:ascii="Calibri" w:hAnsi="Calibri" w:eastAsia="Microsoft JhengHei"/>
+          <w:b w:val="0"/>
+          <w:i w:val="0"/>
+        </w:rPr>
+        <w:t xml:space="preserve"> 的 13 inputs／13 outputs、QA、V4 QA、來源 manifest 與重啟持久性均通過。</w:t>
+      </w:r>
+    </w:p>
+    <w:p>
+      <w:pPr>
+        <w:pStyle w:val="ListBullet"/>
+      </w:pPr>
+      <w:r>
+        <w:rPr>
+          <w:rFonts w:ascii="Calibri" w:hAnsi="Calibri" w:eastAsia="Microsoft JhengHei"/>
+          <w:b w:val="0"/>
+          <w:i w:val="0"/>
+        </w:rPr>
+        <w:t xml:space="preserve">M10 不新增 migration；EDB revision 維持 </w:t>
+      </w:r>
+      <w:r>
+        <w:rPr>
+          <w:rFonts w:ascii="Consolas" w:hAnsi="Consolas" w:eastAsia="Microsoft JhengHei"/>
+          <w:b w:val="0"/>
+          <w:i w:val="0"/>
+          <w:color w:val="17365D"/>
+          <w:sz w:val="17"/>
+        </w:rPr>
+        <w:t>0004_m9_6</w:t>
+      </w:r>
+      <w:r>
+        <w:rPr>
+          <w:rFonts w:ascii="Calibri" w:hAnsi="Calibri" w:eastAsia="Microsoft JhengHei"/>
+          <w:b w:val="0"/>
+          <w:i w:val="0"/>
+        </w:rPr>
+        <w:t xml:space="preserve">，application rollback 使用 </w:t>
+      </w:r>
+      <w:r>
+        <w:rPr>
+          <w:rFonts w:ascii="Consolas" w:hAnsi="Consolas" w:eastAsia="Microsoft JhengHei"/>
+          <w:b w:val="0"/>
+          <w:i w:val="0"/>
+          <w:color w:val="17365D"/>
+          <w:sz w:val="17"/>
+        </w:rPr>
+        <w:t>m9.6</w:t>
+      </w:r>
+      <w:r>
+        <w:rPr>
+          <w:rFonts w:ascii="Calibri" w:hAnsi="Calibri" w:eastAsia="Microsoft JhengHei"/>
+          <w:b w:val="0"/>
+          <w:i w:val="0"/>
+        </w:rPr>
+        <w:t>。</w:t>
       </w:r>
     </w:p>
     <w:p>
@@ -14650,7 +14859,79 @@
           <w:b w:val="0"/>
           <w:i w:val="0"/>
         </w:rPr>
-        <w:t>M10 功能分支本機通過 78 tests；台灣行動支付 13 檔自動提出 5 節點與唯一 Primary，人工確認 gate、13 outputs、QA 8/8、V4 QA、DOCX/PDF 與來源 hash 通過。公司環境尚未部署。</w:t>
+        <w:t xml:space="preserve">M10 已部署公司 </w:t>
+      </w:r>
+      <w:r>
+        <w:rPr>
+          <w:rFonts w:ascii="Consolas" w:hAnsi="Consolas" w:eastAsia="Microsoft JhengHei"/>
+          <w:b w:val="0"/>
+          <w:i w:val="0"/>
+          <w:color w:val="17365D"/>
+          <w:sz w:val="17"/>
+        </w:rPr>
+        <w:t>.77/.81</w:t>
+      </w:r>
+      <w:r>
+        <w:rPr>
+          <w:rFonts w:ascii="Calibri" w:hAnsi="Calibri" w:eastAsia="Microsoft JhengHei"/>
+          <w:b w:val="0"/>
+          <w:i w:val="0"/>
+        </w:rPr>
+        <w:t xml:space="preserve">：release </w:t>
+      </w:r>
+      <w:r>
+        <w:rPr>
+          <w:rFonts w:ascii="Consolas" w:hAnsi="Consolas" w:eastAsia="Microsoft JhengHei"/>
+          <w:b w:val="0"/>
+          <w:i w:val="0"/>
+          <w:color w:val="17365D"/>
+          <w:sz w:val="17"/>
+        </w:rPr>
+        <w:t>6e8ee6e</w:t>
+      </w:r>
+      <w:r>
+        <w:rPr>
+          <w:rFonts w:ascii="Calibri" w:hAnsi="Calibri" w:eastAsia="Microsoft JhengHei"/>
+          <w:b w:val="0"/>
+          <w:i w:val="0"/>
+        </w:rPr>
+        <w:t xml:space="preserve">、EDB revision 維持 </w:t>
+      </w:r>
+      <w:r>
+        <w:rPr>
+          <w:rFonts w:ascii="Consolas" w:hAnsi="Consolas" w:eastAsia="Microsoft JhengHei"/>
+          <w:b w:val="0"/>
+          <w:i w:val="0"/>
+          <w:color w:val="17365D"/>
+          <w:sz w:val="17"/>
+        </w:rPr>
+        <w:t>0004_m9_6</w:t>
+      </w:r>
+      <w:r>
+        <w:rPr>
+          <w:rFonts w:ascii="Calibri" w:hAnsi="Calibri" w:eastAsia="Microsoft JhengHei"/>
+          <w:b w:val="0"/>
+          <w:i w:val="0"/>
+        </w:rPr>
+        <w:t xml:space="preserve">，本機／VM 78 tests；台灣行動支付 13 檔自動提出 5 節點與唯一 Primary，人工確認 gate、Queue／Worker Job </w:t>
+      </w:r>
+      <w:r>
+        <w:rPr>
+          <w:rFonts w:ascii="Consolas" w:hAnsi="Consolas" w:eastAsia="Microsoft JhengHei"/>
+          <w:b w:val="0"/>
+          <w:i w:val="0"/>
+          <w:color w:val="17365D"/>
+          <w:sz w:val="17"/>
+        </w:rPr>
+        <w:t>12c90aa3da354f1c83dbc42e6d57e118</w:t>
+      </w:r>
+      <w:r>
+        <w:rPr>
+          <w:rFonts w:ascii="Calibri" w:hAnsi="Calibri" w:eastAsia="Microsoft JhengHei"/>
+          <w:b w:val="0"/>
+          <w:i w:val="0"/>
+        </w:rPr>
+        <w:t>、13 outputs、QA、V4 QA、DOCX/PDF、來源 hash 與重啟持久性均通過。</w:t>
       </w:r>
     </w:p>
     <w:p>

</xml_diff>

<commit_message>
feat: add M11 authentication RBAC and audit
</commit_message>
<xml_diff>
--- a/docs/OMNICHECK_AI_BUILD_AND_OPERATIONS_GUIDE.docx
+++ b/docs/OMNICHECK_AI_BUILD_AND_OPERATIONS_GUIDE.docx
@@ -103,7 +103,7 @@
           <w:b w:val="0"/>
           <w:i w:val="0"/>
         </w:rPr>
-        <w:t>文件版本：0.10.0</w:t>
+        <w:t>文件版本：0.11.0-draft.1</w:t>
       </w:r>
     </w:p>
     <w:p>
@@ -130,6 +130,24 @@
           <w:i w:val="0"/>
         </w:rPr>
         <w:t>適用程式基準：</w:t>
+      </w:r>
+      <w:r>
+        <w:rPr>
+          <w:rFonts w:ascii="Consolas" w:hAnsi="Consolas" w:eastAsia="Microsoft JhengHei"/>
+          <w:b w:val="0"/>
+          <w:i w:val="0"/>
+          <w:color w:val="17365D"/>
+          <w:sz w:val="17"/>
+        </w:rPr>
+        <w:t>feature/m11-auth-rbac-audit</w:t>
+      </w:r>
+      <w:r>
+        <w:rPr>
+          <w:rFonts w:ascii="Calibri" w:hAnsi="Calibri" w:eastAsia="Microsoft JhengHei"/>
+          <w:b w:val="0"/>
+          <w:i w:val="0"/>
+        </w:rPr>
+        <w:t xml:space="preserve">；正式基準仍為 </w:t>
       </w:r>
       <w:r>
         <w:rPr>
@@ -1495,6 +1513,131 @@
                 <w:sz w:val="17"/>
               </w:rPr>
               <w:t>驗證狀態</w:t>
+            </w:r>
+          </w:p>
+        </w:tc>
+      </w:tr>
+      <w:tr>
+        <w:tc>
+          <w:tcPr>
+            <w:tcW w:type="dxa" w:w="2470"/>
+            <w:vAlign w:val="center"/>
+            <w:tcMar>
+              <w:top w:w="45" w:type="dxa"/>
+              <w:start w:w="120" w:type="dxa"/>
+              <w:bottom w:w="45" w:type="dxa"/>
+              <w:end w:w="120" w:type="dxa"/>
+            </w:tcMar>
+          </w:tcPr>
+          <w:p>
+            <w:pPr>
+              <w:spacing w:after="0"/>
+            </w:pPr>
+            <w:r>
+              <w:rPr>
+                <w:rFonts w:ascii="Calibri" w:hAnsi="Calibri" w:eastAsia="Microsoft JhengHei"/>
+                <w:b w:val="0"/>
+                <w:i w:val="0"/>
+                <w:sz w:val="17"/>
+              </w:rPr>
+              <w:t>0.11.0-draft.1</w:t>
+            </w:r>
+          </w:p>
+        </w:tc>
+        <w:tc>
+          <w:tcPr>
+            <w:tcW w:type="dxa" w:w="2470"/>
+            <w:vAlign w:val="center"/>
+            <w:tcMar>
+              <w:top w:w="45" w:type="dxa"/>
+              <w:start w:w="120" w:type="dxa"/>
+              <w:bottom w:w="45" w:type="dxa"/>
+              <w:end w:w="120" w:type="dxa"/>
+            </w:tcMar>
+          </w:tcPr>
+          <w:p>
+            <w:pPr>
+              <w:spacing w:after="0"/>
+            </w:pPr>
+            <w:r>
+              <w:rPr>
+                <w:rFonts w:ascii="Calibri" w:hAnsi="Calibri" w:eastAsia="Microsoft JhengHei"/>
+                <w:b w:val="0"/>
+                <w:i w:val="0"/>
+                <w:sz w:val="17"/>
+              </w:rPr>
+              <w:t>2026-08-10</w:t>
+            </w:r>
+          </w:p>
+        </w:tc>
+        <w:tc>
+          <w:tcPr>
+            <w:tcW w:type="dxa" w:w="2470"/>
+            <w:vAlign w:val="center"/>
+            <w:tcMar>
+              <w:top w:w="45" w:type="dxa"/>
+              <w:start w:w="120" w:type="dxa"/>
+              <w:bottom w:w="45" w:type="dxa"/>
+              <w:end w:w="120" w:type="dxa"/>
+            </w:tcMar>
+          </w:tcPr>
+          <w:p>
+            <w:pPr>
+              <w:spacing w:after="0"/>
+            </w:pPr>
+            <w:r>
+              <w:rPr>
+                <w:rFonts w:ascii="Calibri" w:hAnsi="Calibri" w:eastAsia="Microsoft JhengHei"/>
+                <w:b w:val="0"/>
+                <w:i w:val="0"/>
+                <w:sz w:val="17"/>
+              </w:rPr>
+              <w:t>M11 本機帳號、Session、RBAC、Customer enforcement、Audit、</w:t>
+            </w:r>
+            <w:r>
+              <w:rPr>
+                <w:rFonts w:ascii="Consolas" w:hAnsi="Consolas" w:eastAsia="Microsoft JhengHei"/>
+                <w:b w:val="0"/>
+                <w:i w:val="0"/>
+                <w:color w:val="17365D"/>
+                <w:sz w:val="17"/>
+              </w:rPr>
+              <w:t>0005_m11</w:t>
+            </w:r>
+            <w:r>
+              <w:rPr>
+                <w:rFonts w:ascii="Calibri" w:hAnsi="Calibri" w:eastAsia="Microsoft JhengHei"/>
+                <w:b w:val="0"/>
+                <w:i w:val="0"/>
+                <w:sz w:val="17"/>
+              </w:rPr>
+              <w:t xml:space="preserve"> 與帳號 CLI</w:t>
+            </w:r>
+          </w:p>
+        </w:tc>
+        <w:tc>
+          <w:tcPr>
+            <w:tcW w:type="dxa" w:w="2470"/>
+            <w:vAlign w:val="center"/>
+            <w:tcMar>
+              <w:top w:w="45" w:type="dxa"/>
+              <w:start w:w="120" w:type="dxa"/>
+              <w:bottom w:w="45" w:type="dxa"/>
+              <w:end w:w="120" w:type="dxa"/>
+            </w:tcMar>
+          </w:tcPr>
+          <w:p>
+            <w:pPr>
+              <w:spacing w:after="0"/>
+            </w:pPr>
+            <w:r>
+              <w:rPr>
+                <w:rFonts w:ascii="Calibri" w:hAnsi="Calibri" w:eastAsia="Microsoft JhengHei"/>
+                <w:b w:val="0"/>
+                <w:i w:val="0"/>
+                <w:sz w:val="17"/>
+              </w:rPr>
+              <w:t>本機 Auth/Web、完整回歸與 PostgreSQL offline migration 通過；公司 EDB 與瀏覽器各角色驗收待執行</w:t>
             </w:r>
           </w:p>
         </w:tc>
@@ -4118,7 +4261,87 @@
                 <w:i w:val="0"/>
                 <w:sz w:val="17"/>
               </w:rPr>
-              <w:t>M11～M15</w:t>
+              <w:t>M11</w:t>
+            </w:r>
+          </w:p>
+        </w:tc>
+        <w:tc>
+          <w:tcPr>
+            <w:tcW w:type="dxa" w:w="3293"/>
+            <w:vAlign w:val="center"/>
+            <w:tcMar>
+              <w:top w:w="45" w:type="dxa"/>
+              <w:start w:w="120" w:type="dxa"/>
+              <w:bottom w:w="45" w:type="dxa"/>
+              <w:end w:w="120" w:type="dxa"/>
+            </w:tcMar>
+          </w:tcPr>
+          <w:p>
+            <w:pPr>
+              <w:spacing w:after="0"/>
+            </w:pPr>
+            <w:r>
+              <w:rPr>
+                <w:rFonts w:ascii="Calibri" w:hAnsi="Calibri" w:eastAsia="Microsoft JhengHei"/>
+                <w:b w:val="0"/>
+                <w:i w:val="0"/>
+                <w:sz w:val="17"/>
+              </w:rPr>
+              <w:t>功能分支實作中</w:t>
+            </w:r>
+          </w:p>
+        </w:tc>
+        <w:tc>
+          <w:tcPr>
+            <w:tcW w:type="dxa" w:w="3293"/>
+            <w:vAlign w:val="center"/>
+            <w:tcMar>
+              <w:top w:w="45" w:type="dxa"/>
+              <w:start w:w="120" w:type="dxa"/>
+              <w:bottom w:w="45" w:type="dxa"/>
+              <w:end w:w="120" w:type="dxa"/>
+            </w:tcMar>
+          </w:tcPr>
+          <w:p>
+            <w:pPr>
+              <w:spacing w:after="0"/>
+            </w:pPr>
+            <w:r>
+              <w:rPr>
+                <w:rFonts w:ascii="Calibri" w:hAnsi="Calibri" w:eastAsia="Microsoft JhengHei"/>
+                <w:b w:val="0"/>
+                <w:i w:val="0"/>
+                <w:sz w:val="17"/>
+              </w:rPr>
+              <w:t>Login、RBAC、Customer enforcement、Session 與 Audit；公司環境待驗證</w:t>
+            </w:r>
+          </w:p>
+        </w:tc>
+      </w:tr>
+      <w:tr>
+        <w:tc>
+          <w:tcPr>
+            <w:tcW w:type="dxa" w:w="3293"/>
+            <w:vAlign w:val="center"/>
+            <w:tcMar>
+              <w:top w:w="45" w:type="dxa"/>
+              <w:start w:w="120" w:type="dxa"/>
+              <w:bottom w:w="45" w:type="dxa"/>
+              <w:end w:w="120" w:type="dxa"/>
+            </w:tcMar>
+          </w:tcPr>
+          <w:p>
+            <w:pPr>
+              <w:spacing w:after="0"/>
+            </w:pPr>
+            <w:r>
+              <w:rPr>
+                <w:rFonts w:ascii="Calibri" w:hAnsi="Calibri" w:eastAsia="Microsoft JhengHei"/>
+                <w:b w:val="0"/>
+                <w:i w:val="0"/>
+                <w:sz w:val="17"/>
+              </w:rPr>
+              <w:t>M12～M15</w:t>
             </w:r>
           </w:p>
         </w:tc>
@@ -4170,7 +4393,7 @@
                 <w:i w:val="0"/>
                 <w:sz w:val="17"/>
               </w:rPr>
-              <w:t>權限、歷史、CVE、選配 AI 與生產強化</w:t>
+              <w:t>歷史、CVE、選配 AI 與生產強化</w:t>
             </w:r>
           </w:p>
         </w:tc>
@@ -8709,6 +8932,10 @@
               <w:t>OMNICHECK_STORAGE_ROOT=/data/omnicheck</w:t>
               <w:br/>
               <w:t>OMNICHECK_ARCHIVE_ROOT=/data/omnicheck/archive</w:t>
+              <w:br/>
+              <w:t>OMNICHECK_AUTH_REQUIRED=false</w:t>
+              <w:br/>
+              <w:t>OMNICHECK_COOKIE_SECURE=false</w:t>
             </w:r>
           </w:p>
         </w:tc>
@@ -8799,6 +9026,10 @@
                 <w:sz w:val="16"/>
               </w:rPr>
               <w:t>OMNICHECK_DATABASE_URL=postgresql+psycopg://omnicheck_app@&lt;VIP_DNS&gt;:5444/omnicheck_app?sslmode=verify-full&amp;sslrootcert=/etc/omnicheck-ai/ca.crt&amp;passfile=/etc/omnicheck-ai/pgpass</w:t>
+              <w:br/>
+              <w:t>OMNICHECK_AUTH_REQUIRED=true</w:t>
+              <w:br/>
+              <w:t>OMNICHECK_COOKIE_SECURE=true</w:t>
             </w:r>
           </w:p>
         </w:tc>
@@ -9074,15 +9305,33 @@
           <w:color w:val="17365D"/>
           <w:sz w:val="17"/>
         </w:rPr>
-        <w:t>0004_m9_6 (head)</w:t>
-      </w:r>
-      <w:r>
-        <w:rPr>
-          <w:rFonts w:ascii="Calibri" w:hAnsi="Calibri" w:eastAsia="Microsoft JhengHei"/>
-          <w:b w:val="0"/>
-          <w:i w:val="0"/>
-        </w:rPr>
-        <w:t>。</w:t>
+        <w:t>0004_m9_6</w:t>
+      </w:r>
+      <w:r>
+        <w:rPr>
+          <w:rFonts w:ascii="Calibri" w:hAnsi="Calibri" w:eastAsia="Microsoft JhengHei"/>
+          <w:b w:val="0"/>
+          <w:i w:val="0"/>
+        </w:rPr>
+        <w:t xml:space="preserve">。M11 功能分支 revision 為 </w:t>
+      </w:r>
+      <w:r>
+        <w:rPr>
+          <w:rFonts w:ascii="Consolas" w:hAnsi="Consolas" w:eastAsia="Microsoft JhengHei"/>
+          <w:b w:val="0"/>
+          <w:i w:val="0"/>
+          <w:color w:val="17365D"/>
+          <w:sz w:val="17"/>
+        </w:rPr>
+        <w:t>0005_m11 (head)</w:t>
+      </w:r>
+      <w:r>
+        <w:rPr>
+          <w:rFonts w:ascii="Calibri" w:hAnsi="Calibri" w:eastAsia="Microsoft JhengHei"/>
+          <w:b w:val="0"/>
+          <w:i w:val="0"/>
+        </w:rPr>
+        <w:t>，公司環境尚未套用。</w:t>
       </w:r>
     </w:p>
     <w:tbl>
@@ -10159,6 +10408,416 @@
           <w:i w:val="0"/>
         </w:rPr>
         <w:t xml:space="preserve"> 建立 11 artifacts、2 relations、11 events；冪等、Archive dry-run、archive manifest、Web／Worker restart 與 health 均通過。</w:t>
+      </w:r>
+    </w:p>
+    <w:p>
+      <w:pPr>
+        <w:pStyle w:val="Heading3"/>
+      </w:pPr>
+      <w:r>
+        <w:rPr>
+          <w:rFonts w:ascii="Calibri" w:hAnsi="Calibri" w:eastAsia="Microsoft JhengHei"/>
+          <w:b w:val="0"/>
+          <w:i w:val="0"/>
+        </w:rPr>
+        <w:t>10.6 M11 identity／RBAC／Audit migration（公司環境待驗證）</w:t>
+      </w:r>
+    </w:p>
+    <w:p>
+      <w:r>
+        <w:rPr>
+          <w:rFonts w:ascii="Consolas" w:hAnsi="Consolas" w:eastAsia="Microsoft JhengHei"/>
+          <w:b w:val="0"/>
+          <w:i w:val="0"/>
+          <w:color w:val="17365D"/>
+          <w:sz w:val="17"/>
+        </w:rPr>
+        <w:t>0005_m11</w:t>
+      </w:r>
+      <w:r>
+        <w:rPr>
+          <w:rFonts w:ascii="Calibri" w:hAnsi="Calibri" w:eastAsia="Microsoft JhengHei"/>
+          <w:b w:val="0"/>
+          <w:i w:val="0"/>
+        </w:rPr>
+        <w:t xml:space="preserve"> 新增 </w:t>
+      </w:r>
+      <w:r>
+        <w:rPr>
+          <w:rFonts w:ascii="Consolas" w:hAnsi="Consolas" w:eastAsia="Microsoft JhengHei"/>
+          <w:b w:val="0"/>
+          <w:i w:val="0"/>
+          <w:color w:val="17365D"/>
+          <w:sz w:val="17"/>
+        </w:rPr>
+        <w:t>users</w:t>
+      </w:r>
+      <w:r>
+        <w:rPr>
+          <w:rFonts w:ascii="Calibri" w:hAnsi="Calibri" w:eastAsia="Microsoft JhengHei"/>
+          <w:b w:val="0"/>
+          <w:i w:val="0"/>
+        </w:rPr>
+        <w:t>、</w:t>
+      </w:r>
+      <w:r>
+        <w:rPr>
+          <w:rFonts w:ascii="Consolas" w:hAnsi="Consolas" w:eastAsia="Microsoft JhengHei"/>
+          <w:b w:val="0"/>
+          <w:i w:val="0"/>
+          <w:color w:val="17365D"/>
+          <w:sz w:val="17"/>
+        </w:rPr>
+        <w:t>customer_memberships</w:t>
+      </w:r>
+      <w:r>
+        <w:rPr>
+          <w:rFonts w:ascii="Calibri" w:hAnsi="Calibri" w:eastAsia="Microsoft JhengHei"/>
+          <w:b w:val="0"/>
+          <w:i w:val="0"/>
+        </w:rPr>
+        <w:t>、</w:t>
+      </w:r>
+      <w:r>
+        <w:rPr>
+          <w:rFonts w:ascii="Consolas" w:hAnsi="Consolas" w:eastAsia="Microsoft JhengHei"/>
+          <w:b w:val="0"/>
+          <w:i w:val="0"/>
+          <w:color w:val="17365D"/>
+          <w:sz w:val="17"/>
+        </w:rPr>
+        <w:t>user_sessions</w:t>
+      </w:r>
+      <w:r>
+        <w:rPr>
+          <w:rFonts w:ascii="Calibri" w:hAnsi="Calibri" w:eastAsia="Microsoft JhengHei"/>
+          <w:b w:val="0"/>
+          <w:i w:val="0"/>
+        </w:rPr>
+        <w:t>、</w:t>
+      </w:r>
+      <w:r>
+        <w:rPr>
+          <w:rFonts w:ascii="Consolas" w:hAnsi="Consolas" w:eastAsia="Microsoft JhengHei"/>
+          <w:b w:val="0"/>
+          <w:i w:val="0"/>
+          <w:color w:val="17365D"/>
+          <w:sz w:val="17"/>
+        </w:rPr>
+        <w:t>audit_events</w:t>
+      </w:r>
+      <w:r>
+        <w:rPr>
+          <w:rFonts w:ascii="Calibri" w:hAnsi="Calibri" w:eastAsia="Microsoft JhengHei"/>
+          <w:b w:val="0"/>
+          <w:i w:val="0"/>
+        </w:rPr>
+        <w:t xml:space="preserve">。部署前必須先備份 </w:t>
+      </w:r>
+      <w:r>
+        <w:rPr>
+          <w:rFonts w:ascii="Consolas" w:hAnsi="Consolas" w:eastAsia="Microsoft JhengHei"/>
+          <w:b w:val="0"/>
+          <w:i w:val="0"/>
+          <w:color w:val="17365D"/>
+          <w:sz w:val="17"/>
+        </w:rPr>
+        <w:t>0004_m9_6</w:t>
+      </w:r>
+      <w:r>
+        <w:rPr>
+          <w:rFonts w:ascii="Calibri" w:hAnsi="Calibri" w:eastAsia="Microsoft JhengHei"/>
+          <w:b w:val="0"/>
+          <w:i w:val="0"/>
+        </w:rPr>
+        <w:t>；migration 後先建立第一個平台管理員，再啟用 Auth，避免鎖死 Web：</w:t>
+      </w:r>
+    </w:p>
+    <w:tbl>
+      <w:tblPr>
+        <w:tblStyle w:val="TableGrid"/>
+        <w:tblW w:type="auto" w:w="0"/>
+        <w:jc w:val="center"/>
+        <w:tblLayout w:type="fixed"/>
+        <w:tblLook w:firstColumn="1" w:firstRow="1" w:lastColumn="0" w:lastRow="0" w:noHBand="0" w:noVBand="1" w:val="04A0"/>
+      </w:tblPr>
+      <w:tblGrid>
+        <w:gridCol w:w="9878"/>
+      </w:tblGrid>
+      <w:tr>
+        <w:tc>
+          <w:tcPr>
+            <w:tcW w:type="dxa" w:w="9878"/>
+            <w:shd w:fill="F2F6FA"/>
+            <w:tcMar>
+              <w:top w:w="90" w:type="dxa"/>
+              <w:start w:w="130" w:type="dxa"/>
+              <w:bottom w:w="90" w:type="dxa"/>
+              <w:end w:w="130" w:type="dxa"/>
+            </w:tcMar>
+          </w:tcPr>
+          <w:p>
+            <w:pPr>
+              <w:pStyle w:val="CodeBlock"/>
+              <w:keepLines w:val="0"/>
+            </w:pPr>
+            <w:r>
+              <w:rPr>
+                <w:rFonts w:ascii="Consolas" w:hAnsi="Consolas" w:eastAsia="Microsoft JhengHei"/>
+                <w:sz w:val="16"/>
+              </w:rPr>
+              <w:t>sudo -u omnicheck env \</w:t>
+              <w:br/>
+              <w:t xml:space="preserve">  OMNICHECK_DATABASE_URL="$(sed -n 's/^OMNICHECK_DATABASE_URL=//p' /etc/omnicheck-ai/omnicheck.env)" \</w:t>
+              <w:br/>
+              <w:t xml:space="preserve">  /data/omnicheck/venv/bin/omni-healthcheck-auth create-user \</w:t>
+              <w:br/>
+              <w:t xml:space="preserve">  --username &lt;ADMIN_USERNAME&gt; --display-name '&lt;ADMIN_DISPLAY_NAME&gt;' --platform-admin</w:t>
+            </w:r>
+          </w:p>
+        </w:tc>
+      </w:tr>
+    </w:tbl>
+    <w:p>
+      <w:r>
+        <w:rPr>
+          <w:rFonts w:ascii="Calibri" w:hAnsi="Calibri" w:eastAsia="Microsoft JhengHei"/>
+          <w:b w:val="0"/>
+          <w:i w:val="0"/>
+        </w:rPr>
+        <w:t xml:space="preserve">密碼會由 </w:t>
+      </w:r>
+      <w:r>
+        <w:rPr>
+          <w:rFonts w:ascii="Consolas" w:hAnsi="Consolas" w:eastAsia="Microsoft JhengHei"/>
+          <w:b w:val="0"/>
+          <w:i w:val="0"/>
+          <w:color w:val="17365D"/>
+          <w:sz w:val="17"/>
+        </w:rPr>
+        <w:t>getpass</w:t>
+      </w:r>
+      <w:r>
+        <w:rPr>
+          <w:rFonts w:ascii="Calibri" w:hAnsi="Calibri" w:eastAsia="Microsoft JhengHei"/>
+          <w:b w:val="0"/>
+          <w:i w:val="0"/>
+        </w:rPr>
+        <w:t xml:space="preserve"> 在終端互動輸入，不得放在 command line、聊天、Git 或 shell history。一般使用者建立後，用 EDB 查詢取得 Customer ID，再授權：</w:t>
+      </w:r>
+    </w:p>
+    <w:tbl>
+      <w:tblPr>
+        <w:tblStyle w:val="TableGrid"/>
+        <w:tblW w:type="auto" w:w="0"/>
+        <w:jc w:val="center"/>
+        <w:tblLayout w:type="fixed"/>
+        <w:tblLook w:firstColumn="1" w:firstRow="1" w:lastColumn="0" w:lastRow="0" w:noHBand="0" w:noVBand="1" w:val="04A0"/>
+      </w:tblPr>
+      <w:tblGrid>
+        <w:gridCol w:w="9878"/>
+      </w:tblGrid>
+      <w:tr>
+        <w:tc>
+          <w:tcPr>
+            <w:tcW w:type="dxa" w:w="9878"/>
+            <w:shd w:fill="F2F6FA"/>
+            <w:tcMar>
+              <w:top w:w="90" w:type="dxa"/>
+              <w:start w:w="130" w:type="dxa"/>
+              <w:bottom w:w="90" w:type="dxa"/>
+              <w:end w:w="130" w:type="dxa"/>
+            </w:tcMar>
+          </w:tcPr>
+          <w:p>
+            <w:pPr>
+              <w:pStyle w:val="CodeBlock"/>
+              <w:keepLines w:val="0"/>
+            </w:pPr>
+            <w:r>
+              <w:rPr>
+                <w:rFonts w:ascii="Consolas" w:hAnsi="Consolas" w:eastAsia="Microsoft JhengHei"/>
+                <w:sz w:val="16"/>
+              </w:rPr>
+              <w:t>sudo -u omnicheck env \</w:t>
+              <w:br/>
+              <w:t xml:space="preserve">  OMNICHECK_DATABASE_URL="$(sed -n 's/^OMNICHECK_DATABASE_URL=//p' /etc/omnicheck-ai/omnicheck.env)" \</w:t>
+              <w:br/>
+              <w:t xml:space="preserve">  /data/omnicheck/venv/bin/omni-healthcheck-auth grant-customer \</w:t>
+              <w:br/>
+              <w:t xml:space="preserve">  --user-id &lt;USER_ID&gt; --customer-id &lt;CUSTOMER_ID&gt; --role engineer</w:t>
+            </w:r>
+          </w:p>
+        </w:tc>
+      </w:tr>
+    </w:tbl>
+    <w:p>
+      <w:r>
+        <w:rPr>
+          <w:rFonts w:ascii="Calibri" w:hAnsi="Calibri" w:eastAsia="Microsoft JhengHei"/>
+          <w:b w:val="0"/>
+          <w:i w:val="0"/>
+        </w:rPr>
+        <w:t xml:space="preserve">確認管理員可登入後，在 </w:t>
+      </w:r>
+      <w:r>
+        <w:rPr>
+          <w:rFonts w:ascii="Consolas" w:hAnsi="Consolas" w:eastAsia="Microsoft JhengHei"/>
+          <w:b w:val="0"/>
+          <w:i w:val="0"/>
+          <w:color w:val="17365D"/>
+          <w:sz w:val="17"/>
+        </w:rPr>
+        <w:t>/etc/omnicheck-ai/omnicheck.env</w:t>
+      </w:r>
+      <w:r>
+        <w:rPr>
+          <w:rFonts w:ascii="Calibri" w:hAnsi="Calibri" w:eastAsia="Microsoft JhengHei"/>
+          <w:b w:val="0"/>
+          <w:i w:val="0"/>
+        </w:rPr>
+        <w:t xml:space="preserve"> 加入 </w:t>
+      </w:r>
+      <w:r>
+        <w:rPr>
+          <w:rFonts w:ascii="Consolas" w:hAnsi="Consolas" w:eastAsia="Microsoft JhengHei"/>
+          <w:b w:val="0"/>
+          <w:i w:val="0"/>
+          <w:color w:val="17365D"/>
+          <w:sz w:val="17"/>
+        </w:rPr>
+        <w:t>OMNICHECK_AUTH_REQUIRED=true</w:t>
+      </w:r>
+      <w:r>
+        <w:rPr>
+          <w:rFonts w:ascii="Calibri" w:hAnsi="Calibri" w:eastAsia="Microsoft JhengHei"/>
+          <w:b w:val="0"/>
+          <w:i w:val="0"/>
+        </w:rPr>
+        <w:t>。目前公司環境仍為 HTTP，</w:t>
+      </w:r>
+      <w:r>
+        <w:rPr>
+          <w:rFonts w:ascii="Consolas" w:hAnsi="Consolas" w:eastAsia="Microsoft JhengHei"/>
+          <w:b w:val="0"/>
+          <w:i w:val="0"/>
+          <w:color w:val="17365D"/>
+          <w:sz w:val="17"/>
+        </w:rPr>
+        <w:t>OMNICHECK_COOKIE_SECURE=false</w:t>
+      </w:r>
+      <w:r>
+        <w:rPr>
+          <w:rFonts w:ascii="Calibri" w:hAnsi="Calibri" w:eastAsia="Microsoft JhengHei"/>
+          <w:b w:val="0"/>
+          <w:i w:val="0"/>
+        </w:rPr>
+        <w:t xml:space="preserve">；完成 M15 TLS 後必須改為 </w:t>
+      </w:r>
+      <w:r>
+        <w:rPr>
+          <w:rFonts w:ascii="Consolas" w:hAnsi="Consolas" w:eastAsia="Microsoft JhengHei"/>
+          <w:b w:val="0"/>
+          <w:i w:val="0"/>
+          <w:color w:val="17365D"/>
+          <w:sz w:val="17"/>
+        </w:rPr>
+        <w:t>true</w:t>
+      </w:r>
+      <w:r>
+        <w:rPr>
+          <w:rFonts w:ascii="Calibri" w:hAnsi="Calibri" w:eastAsia="Microsoft JhengHei"/>
+          <w:b w:val="0"/>
+          <w:i w:val="0"/>
+        </w:rPr>
+        <w:t>。修改後重啟 Web，Worker 不需瀏覽器 Session：</w:t>
+      </w:r>
+    </w:p>
+    <w:tbl>
+      <w:tblPr>
+        <w:tblStyle w:val="TableGrid"/>
+        <w:tblW w:type="auto" w:w="0"/>
+        <w:jc w:val="center"/>
+        <w:tblLayout w:type="fixed"/>
+        <w:tblLook w:firstColumn="1" w:firstRow="1" w:lastColumn="0" w:lastRow="0" w:noHBand="0" w:noVBand="1" w:val="04A0"/>
+      </w:tblPr>
+      <w:tblGrid>
+        <w:gridCol w:w="9878"/>
+      </w:tblGrid>
+      <w:tr>
+        <w:tc>
+          <w:tcPr>
+            <w:tcW w:type="dxa" w:w="9878"/>
+            <w:shd w:fill="F2F6FA"/>
+            <w:tcMar>
+              <w:top w:w="90" w:type="dxa"/>
+              <w:start w:w="130" w:type="dxa"/>
+              <w:bottom w:w="90" w:type="dxa"/>
+              <w:end w:w="130" w:type="dxa"/>
+            </w:tcMar>
+          </w:tcPr>
+          <w:p>
+            <w:pPr>
+              <w:pStyle w:val="CodeBlock"/>
+              <w:keepLines w:val="0"/>
+            </w:pPr>
+            <w:r>
+              <w:rPr>
+                <w:rFonts w:ascii="Consolas" w:hAnsi="Consolas" w:eastAsia="Microsoft JhengHei"/>
+                <w:sz w:val="16"/>
+              </w:rPr>
+              <w:t>systemctl restart omnicheck-web</w:t>
+              <w:br/>
+              <w:t>curl --fail http://127.0.0.1:8000/api/health</w:t>
+            </w:r>
+          </w:p>
+        </w:tc>
+      </w:tr>
+    </w:tbl>
+    <w:p>
+      <w:r>
+        <w:rPr>
+          <w:rFonts w:ascii="Calibri" w:hAnsi="Calibri" w:eastAsia="Microsoft JhengHei"/>
+          <w:b w:val="0"/>
+          <w:i w:val="0"/>
+        </w:rPr>
+        <w:t xml:space="preserve">Application rollback 可切回 </w:t>
+      </w:r>
+      <w:r>
+        <w:rPr>
+          <w:rFonts w:ascii="Consolas" w:hAnsi="Consolas" w:eastAsia="Microsoft JhengHei"/>
+          <w:b w:val="0"/>
+          <w:i w:val="0"/>
+          <w:color w:val="17365D"/>
+          <w:sz w:val="17"/>
+        </w:rPr>
+        <w:t>m10</w:t>
+      </w:r>
+      <w:r>
+        <w:rPr>
+          <w:rFonts w:ascii="Calibri" w:hAnsi="Calibri" w:eastAsia="Microsoft JhengHei"/>
+          <w:b w:val="0"/>
+          <w:i w:val="0"/>
+        </w:rPr>
+        <w:t xml:space="preserve"> 並保留四張 additive table。</w:t>
+      </w:r>
+      <w:r>
+        <w:rPr>
+          <w:rFonts w:ascii="Consolas" w:hAnsi="Consolas" w:eastAsia="Microsoft JhengHei"/>
+          <w:b w:val="0"/>
+          <w:i w:val="0"/>
+          <w:color w:val="17365D"/>
+          <w:sz w:val="17"/>
+        </w:rPr>
+        <w:t>alembic downgrade 0004_m9_6</w:t>
+      </w:r>
+      <w:r>
+        <w:rPr>
+          <w:rFonts w:ascii="Calibri" w:hAnsi="Calibri" w:eastAsia="Microsoft JhengHei"/>
+          <w:b w:val="0"/>
+          <w:i w:val="0"/>
+        </w:rPr>
+        <w:t xml:space="preserve"> 會永久刪除帳號、Membership、Session 與 Audit，未完成備份、restore/downgrade drill 及核准不得執行。</w:t>
       </w:r>
     </w:p>
     <w:p>
@@ -15011,7 +15670,7 @@
           <w:b w:val="0"/>
           <w:i w:val="0"/>
         </w:rPr>
-        <w:t>正式 TLS/VIP、EFM failover、reverse proxy、登入／RBAC 尚未完成。</w:t>
+        <w:t>M11 登入／RBAC 核心已在功能分支完成本機驗證，但公司 migration、帳號 bootstrap、角色驗收尚未完成；正式 TLS/VIP、EFM failover 與 reverse proxy 仍未完成。</w:t>
       </w:r>
     </w:p>
     <w:p>

</xml_diff>

<commit_message>
docs: record M11 company migration checkpoint
</commit_message>
<xml_diff>
--- a/docs/OMNICHECK_AI_BUILD_AND_OPERATIONS_GUIDE.docx
+++ b/docs/OMNICHECK_AI_BUILD_AND_OPERATIONS_GUIDE.docx
@@ -1637,7 +1637,26 @@
                 <w:i w:val="0"/>
                 <w:sz w:val="17"/>
               </w:rPr>
-              <w:t>本機 Auth/Web、完整回歸與 PostgreSQL offline migration 通過；公司 EDB 與瀏覽器各角色驗收待執行</w:t>
+              <w:t>本機／VM 87 tests、V4、backup/hash、</w:t>
+            </w:r>
+            <w:r>
+              <w:rPr>
+                <w:rFonts w:ascii="Consolas" w:hAnsi="Consolas" w:eastAsia="Microsoft JhengHei"/>
+                <w:b w:val="0"/>
+                <w:i w:val="0"/>
+                <w:color w:val="17365D"/>
+                <w:sz w:val="17"/>
+              </w:rPr>
+              <w:t>0005_m11</w:t>
+            </w:r>
+            <w:r>
+              <w:rPr>
+                <w:rFonts w:ascii="Calibri" w:hAnsi="Calibri" w:eastAsia="Microsoft JhengHei"/>
+                <w:b w:val="0"/>
+                <w:i w:val="0"/>
+                <w:sz w:val="17"/>
+              </w:rPr>
+              <w:t>、tables 與 services 通過；帳號及逐角色驗收待執行</w:t>
             </w:r>
           </w:p>
         </w:tc>
@@ -10821,6 +10840,124 @@
       </w:r>
     </w:p>
     <w:p>
+      <w:r>
+        <w:rPr>
+          <w:rFonts w:ascii="Calibri" w:hAnsi="Calibri" w:eastAsia="Microsoft JhengHei"/>
+          <w:b w:val="0"/>
+          <w:i w:val="0"/>
+        </w:rPr>
+        <w:t xml:space="preserve">公司階段結果：release </w:t>
+      </w:r>
+      <w:r>
+        <w:rPr>
+          <w:rFonts w:ascii="Consolas" w:hAnsi="Consolas" w:eastAsia="Microsoft JhengHei"/>
+          <w:b w:val="0"/>
+          <w:i w:val="0"/>
+          <w:color w:val="17365D"/>
+          <w:sz w:val="17"/>
+        </w:rPr>
+        <w:t>d93da78</w:t>
+      </w:r>
+      <w:r>
+        <w:rPr>
+          <w:rFonts w:ascii="Calibri" w:hAnsi="Calibri" w:eastAsia="Microsoft JhengHei"/>
+          <w:b w:val="0"/>
+          <w:i w:val="0"/>
+        </w:rPr>
+        <w:t xml:space="preserve"> 在 </w:t>
+      </w:r>
+      <w:r>
+        <w:rPr>
+          <w:rFonts w:ascii="Consolas" w:hAnsi="Consolas" w:eastAsia="Microsoft JhengHei"/>
+          <w:b w:val="0"/>
+          <w:i w:val="0"/>
+          <w:color w:val="17365D"/>
+          <w:sz w:val="17"/>
+        </w:rPr>
+        <w:t>.77</w:t>
+      </w:r>
+      <w:r>
+        <w:rPr>
+          <w:rFonts w:ascii="Calibri" w:hAnsi="Calibri" w:eastAsia="Microsoft JhengHei"/>
+          <w:b w:val="0"/>
+          <w:i w:val="0"/>
+        </w:rPr>
+        <w:t xml:space="preserve"> 通過 87 tests 與 5 項 V4 manifest；升級前 backup </w:t>
+      </w:r>
+      <w:r>
+        <w:rPr>
+          <w:rFonts w:ascii="Consolas" w:hAnsi="Consolas" w:eastAsia="Microsoft JhengHei"/>
+          <w:b w:val="0"/>
+          <w:i w:val="0"/>
+          <w:color w:val="17365D"/>
+          <w:sz w:val="17"/>
+        </w:rPr>
+        <w:t>/data/omnicheck/archive/omnicheck_app_pre_m11_20260810.dump</w:t>
+      </w:r>
+      <w:r>
+        <w:rPr>
+          <w:rFonts w:ascii="Calibri" w:hAnsi="Calibri" w:eastAsia="Microsoft JhengHei"/>
+          <w:b w:val="0"/>
+          <w:i w:val="0"/>
+        </w:rPr>
+        <w:t xml:space="preserve"> 為 67 KiB，SHA-256 </w:t>
+      </w:r>
+      <w:r>
+        <w:rPr>
+          <w:rFonts w:ascii="Consolas" w:hAnsi="Consolas" w:eastAsia="Microsoft JhengHei"/>
+          <w:b w:val="0"/>
+          <w:i w:val="0"/>
+          <w:color w:val="17365D"/>
+          <w:sz w:val="17"/>
+        </w:rPr>
+        <w:t>0a27b7ea507d97d2605e0a1180aaef5d9dd5c84b106dafcfd89f30d5d0901bd4</w:t>
+      </w:r>
+      <w:r>
+        <w:rPr>
+          <w:rFonts w:ascii="Calibri" w:hAnsi="Calibri" w:eastAsia="Microsoft JhengHei"/>
+          <w:b w:val="0"/>
+          <w:i w:val="0"/>
+        </w:rPr>
+        <w:t xml:space="preserve">，且 </w:t>
+      </w:r>
+      <w:r>
+        <w:rPr>
+          <w:rFonts w:ascii="Consolas" w:hAnsi="Consolas" w:eastAsia="Microsoft JhengHei"/>
+          <w:b w:val="0"/>
+          <w:i w:val="0"/>
+          <w:color w:val="17365D"/>
+          <w:sz w:val="17"/>
+        </w:rPr>
+        <w:t>pg_restore --list</w:t>
+      </w:r>
+      <w:r>
+        <w:rPr>
+          <w:rFonts w:ascii="Calibri" w:hAnsi="Calibri" w:eastAsia="Microsoft JhengHei"/>
+          <w:b w:val="0"/>
+          <w:i w:val="0"/>
+        </w:rPr>
+        <w:t xml:space="preserve"> 可讀。EDB 已升至 </w:t>
+      </w:r>
+      <w:r>
+        <w:rPr>
+          <w:rFonts w:ascii="Consolas" w:hAnsi="Consolas" w:eastAsia="Microsoft JhengHei"/>
+          <w:b w:val="0"/>
+          <w:i w:val="0"/>
+          <w:color w:val="17365D"/>
+          <w:sz w:val="17"/>
+        </w:rPr>
+        <w:t>0005_m11</w:t>
+      </w:r>
+      <w:r>
+        <w:rPr>
+          <w:rFonts w:ascii="Calibri" w:hAnsi="Calibri" w:eastAsia="Microsoft JhengHei"/>
+          <w:b w:val="0"/>
+          <w:i w:val="0"/>
+        </w:rPr>
+        <w:t>，四張 M11 table、Web／Worker、health 與 journal 通過。Auth 尚未啟用，等待第一個 platform admin 由使用者在安全終端建立。</w:t>
+      </w:r>
+    </w:p>
+    <w:p>
       <w:pPr>
         <w:pStyle w:val="Heading2"/>
       </w:pPr>

</xml_diff>

<commit_message>
docs: record M11 application rollback
</commit_message>
<xml_diff>
--- a/docs/OMNICHECK_AI_BUILD_AND_OPERATIONS_GUIDE.docx
+++ b/docs/OMNICHECK_AI_BUILD_AND_OPERATIONS_GUIDE.docx
@@ -1611,7 +1611,7 @@
                 <w:i w:val="0"/>
                 <w:sz w:val="17"/>
               </w:rPr>
-              <w:t xml:space="preserve"> 與帳號 CLI</w:t>
+              <w:t xml:space="preserve"> 與 application rollback</w:t>
             </w:r>
           </w:p>
         </w:tc>
@@ -1637,26 +1637,7 @@
                 <w:i w:val="0"/>
                 <w:sz w:val="17"/>
               </w:rPr>
-              <w:t>本機／VM 87 tests、V4、backup/hash、</w:t>
-            </w:r>
-            <w:r>
-              <w:rPr>
-                <w:rFonts w:ascii="Consolas" w:hAnsi="Consolas" w:eastAsia="Microsoft JhengHei"/>
-                <w:b w:val="0"/>
-                <w:i w:val="0"/>
-                <w:color w:val="17365D"/>
-                <w:sz w:val="17"/>
-              </w:rPr>
-              <w:t>0005_m11</w:t>
-            </w:r>
-            <w:r>
-              <w:rPr>
-                <w:rFonts w:ascii="Calibri" w:hAnsi="Calibri" w:eastAsia="Microsoft JhengHei"/>
-                <w:b w:val="0"/>
-                <w:i w:val="0"/>
-                <w:sz w:val="17"/>
-              </w:rPr>
-              <w:t>、tables 與 services 通過；帳號及逐角色驗收待執行</w:t>
+              <w:t>本機／VM 87 tests 與 migration 通過；依使用者決定公司 application 已回 M10，M11 暫不啟用</w:t>
             </w:r>
           </w:p>
         </w:tc>
@@ -10958,6 +10939,52 @@
       </w:r>
     </w:p>
     <w:p>
+      <w:r>
+        <w:rPr>
+          <w:rFonts w:ascii="Calibri" w:hAnsi="Calibri" w:eastAsia="Microsoft JhengHei"/>
+          <w:b w:val="0"/>
+          <w:i w:val="0"/>
+        </w:rPr>
+        <w:t xml:space="preserve">後續使用者登入 smoke test 成功，但產品決定暫不採用登入及 Customer／System 欄位。公司已還原登入前 environment、重新安裝並切回 M10 release </w:t>
+      </w:r>
+      <w:r>
+        <w:rPr>
+          <w:rFonts w:ascii="Consolas" w:hAnsi="Consolas" w:eastAsia="Microsoft JhengHei"/>
+          <w:b w:val="0"/>
+          <w:i w:val="0"/>
+          <w:color w:val="17365D"/>
+          <w:sz w:val="17"/>
+        </w:rPr>
+        <w:t>6e8ee6e</w:t>
+      </w:r>
+      <w:r>
+        <w:rPr>
+          <w:rFonts w:ascii="Calibri" w:hAnsi="Calibri" w:eastAsia="Microsoft JhengHei"/>
+          <w:b w:val="0"/>
+          <w:i w:val="0"/>
+        </w:rPr>
+        <w:t xml:space="preserve">；Web／Worker active、health 正常、Jobs API 無登入回 200、M11 登入頁不存在。EDB 保留 </w:t>
+      </w:r>
+      <w:r>
+        <w:rPr>
+          <w:rFonts w:ascii="Consolas" w:hAnsi="Consolas" w:eastAsia="Microsoft JhengHei"/>
+          <w:b w:val="0"/>
+          <w:i w:val="0"/>
+          <w:color w:val="17365D"/>
+          <w:sz w:val="17"/>
+        </w:rPr>
+        <w:t>0005_m11</w:t>
+      </w:r>
+      <w:r>
+        <w:rPr>
+          <w:rFonts w:ascii="Calibri" w:hAnsi="Calibri" w:eastAsia="Microsoft JhengHei"/>
+          <w:b w:val="0"/>
+          <w:i w:val="0"/>
+        </w:rPr>
+        <w:t xml:space="preserve"> additive tables，不執行破壞性 downgrade；未來恢復 M11 時可重新部署功能分支、確認帳號後再啟用 Auth。</w:t>
+      </w:r>
+    </w:p>
+    <w:p>
       <w:pPr>
         <w:pStyle w:val="Heading2"/>
       </w:pPr>

</xml_diff>

<commit_message>
docs: record M10.1 legacy evidence validation
</commit_message>
<xml_diff>
--- a/docs/OMNICHECK_AI_BUILD_AND_OPERATIONS_GUIDE.docx
+++ b/docs/OMNICHECK_AI_BUILD_AND_OPERATIONS_GUIDE.docx
@@ -103,7 +103,7 @@
           <w:b w:val="0"/>
           <w:i w:val="0"/>
         </w:rPr>
-        <w:t>文件版本：0.10.0</w:t>
+        <w:t>文件版本：0.10.1-draft.1</w:t>
       </w:r>
     </w:p>
     <w:p>
@@ -130,6 +130,24 @@
           <w:i w:val="0"/>
         </w:rPr>
         <w:t>適用程式基準：</w:t>
+      </w:r>
+      <w:r>
+        <w:rPr>
+          <w:rFonts w:ascii="Consolas" w:hAnsi="Consolas" w:eastAsia="Microsoft JhengHei"/>
+          <w:b w:val="0"/>
+          <w:i w:val="0"/>
+          <w:color w:val="17365D"/>
+          <w:sz w:val="17"/>
+        </w:rPr>
+        <w:t>feature/m10-1-legacy-db-evidence</w:t>
+      </w:r>
+      <w:r>
+        <w:rPr>
+          <w:rFonts w:ascii="Calibri" w:hAnsi="Calibri" w:eastAsia="Microsoft JhengHei"/>
+          <w:b w:val="0"/>
+          <w:i w:val="0"/>
+        </w:rPr>
+        <w:t xml:space="preserve">；正式基準仍為 </w:t>
       </w:r>
       <w:r>
         <w:rPr>
@@ -1495,6 +1513,112 @@
                 <w:sz w:val="17"/>
               </w:rPr>
               <w:t>驗證狀態</w:t>
+            </w:r>
+          </w:p>
+        </w:tc>
+      </w:tr>
+      <w:tr>
+        <w:tc>
+          <w:tcPr>
+            <w:tcW w:type="dxa" w:w="2470"/>
+            <w:vAlign w:val="center"/>
+            <w:tcMar>
+              <w:top w:w="45" w:type="dxa"/>
+              <w:start w:w="120" w:type="dxa"/>
+              <w:bottom w:w="45" w:type="dxa"/>
+              <w:end w:w="120" w:type="dxa"/>
+            </w:tcMar>
+          </w:tcPr>
+          <w:p>
+            <w:pPr>
+              <w:spacing w:after="0"/>
+            </w:pPr>
+            <w:r>
+              <w:rPr>
+                <w:rFonts w:ascii="Calibri" w:hAnsi="Calibri" w:eastAsia="Microsoft JhengHei"/>
+                <w:b w:val="0"/>
+                <w:i w:val="0"/>
+                <w:sz w:val="17"/>
+              </w:rPr>
+              <w:t>0.10.1-draft.1</w:t>
+            </w:r>
+          </w:p>
+        </w:tc>
+        <w:tc>
+          <w:tcPr>
+            <w:tcW w:type="dxa" w:w="2470"/>
+            <w:vAlign w:val="center"/>
+            <w:tcMar>
+              <w:top w:w="45" w:type="dxa"/>
+              <w:start w:w="120" w:type="dxa"/>
+              <w:bottom w:w="45" w:type="dxa"/>
+              <w:end w:w="120" w:type="dxa"/>
+            </w:tcMar>
+          </w:tcPr>
+          <w:p>
+            <w:pPr>
+              <w:spacing w:after="0"/>
+            </w:pPr>
+            <w:r>
+              <w:rPr>
+                <w:rFonts w:ascii="Calibri" w:hAnsi="Calibri" w:eastAsia="Microsoft JhengHei"/>
+                <w:b w:val="0"/>
+                <w:i w:val="0"/>
+                <w:sz w:val="17"/>
+              </w:rPr>
+              <w:t>2026-08-10</w:t>
+            </w:r>
+          </w:p>
+        </w:tc>
+        <w:tc>
+          <w:tcPr>
+            <w:tcW w:type="dxa" w:w="2470"/>
+            <w:vAlign w:val="center"/>
+            <w:tcMar>
+              <w:top w:w="45" w:type="dxa"/>
+              <w:start w:w="120" w:type="dxa"/>
+              <w:bottom w:w="45" w:type="dxa"/>
+              <w:end w:w="120" w:type="dxa"/>
+            </w:tcMar>
+          </w:tcPr>
+          <w:p>
+            <w:pPr>
+              <w:spacing w:after="0"/>
+            </w:pPr>
+            <w:r>
+              <w:rPr>
+                <w:rFonts w:ascii="Calibri" w:hAnsi="Calibri" w:eastAsia="Microsoft JhengHei"/>
+                <w:b w:val="0"/>
+                <w:i w:val="0"/>
+                <w:sz w:val="17"/>
+              </w:rPr>
+              <w:t>舊式 Database Output 內容分類、來源節點候選、人工 evidence mapping 與 Scope 稽核</w:t>
+            </w:r>
+          </w:p>
+        </w:tc>
+        <w:tc>
+          <w:tcPr>
+            <w:tcW w:type="dxa" w:w="2470"/>
+            <w:vAlign w:val="center"/>
+            <w:tcMar>
+              <w:top w:w="45" w:type="dxa"/>
+              <w:start w:w="120" w:type="dxa"/>
+              <w:bottom w:w="45" w:type="dxa"/>
+              <w:end w:w="120" w:type="dxa"/>
+            </w:tcMar>
+          </w:tcPr>
+          <w:p>
+            <w:pPr>
+              <w:spacing w:after="0"/>
+            </w:pPr>
+            <w:r>
+              <w:rPr>
+                <w:rFonts w:ascii="Calibri" w:hAnsi="Calibri" w:eastAsia="Microsoft JhengHei"/>
+                <w:b w:val="0"/>
+                <w:i w:val="0"/>
+                <w:sz w:val="17"/>
+              </w:rPr>
+              <w:t>本機／公司 VM 82 tests；實際 ENGDB 3 檔、17 項 Primary checks、QA/V4 QA、19 頁 PDF 與來源 hash 通過；待 Web 驗收</w:t>
             </w:r>
           </w:p>
         </w:tc>
@@ -4118,6 +4242,86 @@
                 <w:i w:val="0"/>
                 <w:sz w:val="17"/>
               </w:rPr>
+              <w:t>M10.1</w:t>
+            </w:r>
+          </w:p>
+        </w:tc>
+        <w:tc>
+          <w:tcPr>
+            <w:tcW w:type="dxa" w:w="3293"/>
+            <w:vAlign w:val="center"/>
+            <w:tcMar>
+              <w:top w:w="45" w:type="dxa"/>
+              <w:start w:w="120" w:type="dxa"/>
+              <w:bottom w:w="45" w:type="dxa"/>
+              <w:end w:w="120" w:type="dxa"/>
+            </w:tcMar>
+          </w:tcPr>
+          <w:p>
+            <w:pPr>
+              <w:spacing w:after="0"/>
+            </w:pPr>
+            <w:r>
+              <w:rPr>
+                <w:rFonts w:ascii="Calibri" w:hAnsi="Calibri" w:eastAsia="Microsoft JhengHei"/>
+                <w:b w:val="0"/>
+                <w:i w:val="0"/>
+                <w:sz w:val="17"/>
+              </w:rPr>
+              <w:t>功能分支完成、待驗收</w:t>
+            </w:r>
+          </w:p>
+        </w:tc>
+        <w:tc>
+          <w:tcPr>
+            <w:tcW w:type="dxa" w:w="3293"/>
+            <w:vAlign w:val="center"/>
+            <w:tcMar>
+              <w:top w:w="45" w:type="dxa"/>
+              <w:start w:w="120" w:type="dxa"/>
+              <w:bottom w:w="45" w:type="dxa"/>
+              <w:end w:w="120" w:type="dxa"/>
+            </w:tcMar>
+          </w:tcPr>
+          <w:p>
+            <w:pPr>
+              <w:spacing w:after="0"/>
+            </w:pPr>
+            <w:r>
+              <w:rPr>
+                <w:rFonts w:ascii="Calibri" w:hAnsi="Calibri" w:eastAsia="Microsoft JhengHei"/>
+                <w:b w:val="0"/>
+                <w:i w:val="0"/>
+                <w:sz w:val="17"/>
+              </w:rPr>
+              <w:t>舊式 Database Output 內容辨識、來源節點候選、人工 mapping 與 Primary-only 保護</w:t>
+            </w:r>
+          </w:p>
+        </w:tc>
+      </w:tr>
+      <w:tr>
+        <w:tc>
+          <w:tcPr>
+            <w:tcW w:type="dxa" w:w="3293"/>
+            <w:vAlign w:val="center"/>
+            <w:tcMar>
+              <w:top w:w="45" w:type="dxa"/>
+              <w:start w:w="120" w:type="dxa"/>
+              <w:bottom w:w="45" w:type="dxa"/>
+              <w:end w:w="120" w:type="dxa"/>
+            </w:tcMar>
+          </w:tcPr>
+          <w:p>
+            <w:pPr>
+              <w:spacing w:after="0"/>
+            </w:pPr>
+            <w:r>
+              <w:rPr>
+                <w:rFonts w:ascii="Calibri" w:hAnsi="Calibri" w:eastAsia="Microsoft JhengHei"/>
+                <w:b w:val="0"/>
+                <w:i w:val="0"/>
+                <w:sz w:val="17"/>
+              </w:rPr>
               <w:t>M11～M15</w:t>
             </w:r>
           </w:p>
@@ -10656,6 +10860,70 @@
           <w:b w:val="0"/>
           <w:i w:val="0"/>
         </w:rPr>
+        <w:t xml:space="preserve">M10.1 對沒有 hostname 的 </w:t>
+      </w:r>
+      <w:r>
+        <w:rPr>
+          <w:rFonts w:ascii="Consolas" w:hAnsi="Consolas" w:eastAsia="Microsoft JhengHei"/>
+          <w:b w:val="0"/>
+          <w:i w:val="0"/>
+          <w:color w:val="17365D"/>
+          <w:sz w:val="17"/>
+        </w:rPr>
+        <w:t>ENGDB_check.txt</w:t>
+      </w:r>
+      <w:r>
+        <w:rPr>
+          <w:rFonts w:ascii="Calibri" w:hAnsi="Calibri" w:eastAsia="Microsoft JhengHei"/>
+          <w:b w:val="0"/>
+          <w:i w:val="0"/>
+        </w:rPr>
+        <w:t xml:space="preserve"> 類型文字檔進行 Database Output 內容分類。若不能唯一對應節點，畫面會在「Database Output 來源確認」列出候選並要求使用者選擇；結果保存於 </w:t>
+      </w:r>
+      <w:r>
+        <w:rPr>
+          <w:rFonts w:ascii="Consolas" w:hAnsi="Consolas" w:eastAsia="Microsoft JhengHei"/>
+          <w:b w:val="0"/>
+          <w:i w:val="0"/>
+          <w:color w:val="17365D"/>
+          <w:sz w:val="17"/>
+        </w:rPr>
+        <w:t>job.yaml.evidence_mappings</w:t>
+      </w:r>
+      <w:r>
+        <w:rPr>
+          <w:rFonts w:ascii="Calibri" w:hAnsi="Calibri" w:eastAsia="Microsoft JhengHei"/>
+          <w:b w:val="0"/>
+          <w:i w:val="0"/>
+        </w:rPr>
+        <w:t xml:space="preserve">，Scope ledger 記錄 </w:t>
+      </w:r>
+      <w:r>
+        <w:rPr>
+          <w:rFonts w:ascii="Consolas" w:hAnsi="Consolas" w:eastAsia="Microsoft JhengHei"/>
+          <w:b w:val="0"/>
+          <w:i w:val="0"/>
+          <w:color w:val="17365D"/>
+          <w:sz w:val="17"/>
+        </w:rPr>
+        <w:t>operator_confirmed_evidence_mapping</w:t>
+      </w:r>
+      <w:r>
+        <w:rPr>
+          <w:rFonts w:ascii="Calibri" w:hAnsi="Calibri" w:eastAsia="Microsoft JhengHei"/>
+          <w:b w:val="0"/>
+          <w:i w:val="0"/>
+        </w:rPr>
+        <w:t>。候選不等於自動採用，未確認時保持 pending；映射到 Standby／DR／Witness 也不會繞過 Database logical Primary-only policy。</w:t>
+      </w:r>
+    </w:p>
+    <w:p>
+      <w:r>
+        <w:rPr>
+          <w:rFonts w:ascii="Calibri" w:hAnsi="Calibri" w:eastAsia="Microsoft JhengHei"/>
+          <w:b w:val="0"/>
+          <w:i w:val="0"/>
+        </w:rPr>
         <w:t xml:space="preserve">報告 2.1 的 Database 欄是節點軟體清冊，不是邏輯資料 Scope：Primary／Standby／DR 都顯示案件的 PostgreSQL／EPAS 產品；承載 PEM Server 的 Witness 顯示 </w:t>
       </w:r>
       <w:r>
@@ -10753,7 +11021,7 @@
           <w:b w:val="0"/>
           <w:i w:val="0"/>
         </w:rPr>
-        <w:t>公司 M9.3 正式基準為 60 tests、M9.4 為 65 tests、M9.5 為 70 tests、M9.6 為 74 tests、M10 為 78 tests。實際數量會隨版本增加，不應硬性只等於固定數字；重點是 0 failed。</w:t>
+        <w:t>公司 M9.3 正式基準為 60 tests、M9.4 為 65 tests、M9.5 為 70 tests、M9.6 為 74 tests、M10 為 78 tests；M10.1 候選為 82 tests。實際數量會隨版本增加，不應硬性只等於固定數字；重點是 0 failed。</w:t>
       </w:r>
     </w:p>
     <w:p>
@@ -11872,6 +12140,125 @@
           <w:sz w:val="17"/>
         </w:rPr>
         <w:t>m9.6</w:t>
+      </w:r>
+      <w:r>
+        <w:rPr>
+          <w:rFonts w:ascii="Calibri" w:hAnsi="Calibri" w:eastAsia="Microsoft JhengHei"/>
+          <w:b w:val="0"/>
+          <w:i w:val="0"/>
+        </w:rPr>
+        <w:t>。</w:t>
+      </w:r>
+    </w:p>
+    <w:p>
+      <w:pPr>
+        <w:pStyle w:val="Heading3"/>
+      </w:pPr>
+      <w:r>
+        <w:rPr>
+          <w:rFonts w:ascii="Calibri" w:hAnsi="Calibri" w:eastAsia="Microsoft JhengHei"/>
+          <w:b w:val="0"/>
+          <w:i w:val="0"/>
+        </w:rPr>
+        <w:t>13.11 M10.1 舊格式 Database Output 驗收</w:t>
+      </w:r>
+    </w:p>
+    <w:p>
+      <w:pPr>
+        <w:pStyle w:val="ListBullet"/>
+      </w:pPr>
+      <w:r>
+        <w:rPr>
+          <w:rFonts w:ascii="Calibri" w:hAnsi="Calibri" w:eastAsia="Microsoft JhengHei"/>
+          <w:b w:val="0"/>
+          <w:i w:val="0"/>
+        </w:rPr>
+        <w:t>沒有 hostname 的舊式 Database Output 必須依內容列為候選，不得誤分類成一般 misc 後靜默略過。</w:t>
+      </w:r>
+    </w:p>
+    <w:p>
+      <w:pPr>
+        <w:pStyle w:val="ListBullet"/>
+      </w:pPr>
+      <w:r>
+        <w:rPr>
+          <w:rFonts w:ascii="Calibri" w:hAnsi="Calibri" w:eastAsia="Microsoft JhengHei"/>
+          <w:b w:val="0"/>
+          <w:i w:val="0"/>
+        </w:rPr>
+        <w:t>使用者未選擇來源節點前不得把候選當成正式 Primary evidence。</w:t>
+      </w:r>
+    </w:p>
+    <w:p>
+      <w:pPr>
+        <w:pStyle w:val="ListBullet"/>
+      </w:pPr>
+      <w:r>
+        <w:rPr>
+          <w:rFonts w:ascii="Consolas" w:hAnsi="Consolas" w:eastAsia="Microsoft JhengHei"/>
+          <w:b w:val="0"/>
+          <w:i w:val="0"/>
+          <w:color w:val="17365D"/>
+          <w:sz w:val="17"/>
+        </w:rPr>
+        <w:t>evidence_mappings</w:t>
+      </w:r>
+      <w:r>
+        <w:rPr>
+          <w:rFonts w:ascii="Calibri" w:hAnsi="Calibri" w:eastAsia="Microsoft JhengHei"/>
+          <w:b w:val="0"/>
+          <w:i w:val="0"/>
+        </w:rPr>
+        <w:t xml:space="preserve"> 必須使用安全相對路徑、已配置節點與 database domain；重複路徑或未知節點必須拒絕。</w:t>
+      </w:r>
+    </w:p>
+    <w:p>
+      <w:pPr>
+        <w:pStyle w:val="ListBullet"/>
+      </w:pPr>
+      <w:r>
+        <w:rPr>
+          <w:rFonts w:ascii="Calibri" w:hAnsi="Calibri" w:eastAsia="Microsoft JhengHei"/>
+          <w:b w:val="0"/>
+          <w:i w:val="0"/>
+        </w:rPr>
+        <w:t>映射至非 Primary 節點時仍要遵守 Database logical Primary-only。</w:t>
+      </w:r>
+    </w:p>
+    <w:p>
+      <w:pPr>
+        <w:pStyle w:val="ListBullet"/>
+      </w:pPr>
+      <w:r>
+        <w:rPr>
+          <w:rFonts w:ascii="Calibri" w:hAnsi="Calibri" w:eastAsia="Microsoft JhengHei"/>
+          <w:b w:val="0"/>
+          <w:i w:val="0"/>
+        </w:rPr>
+        <w:t>實際 ENGDB 基準為 3 allowed、0 pending、17 項 Primary checks、QA 8/8、V4 QA、19 頁 PDF；來源 hash 不變。</w:t>
+      </w:r>
+    </w:p>
+    <w:p>
+      <w:pPr>
+        <w:pStyle w:val="ListBullet"/>
+      </w:pPr>
+      <w:r>
+        <w:rPr>
+          <w:rFonts w:ascii="Calibri" w:hAnsi="Calibri" w:eastAsia="Microsoft JhengHei"/>
+          <w:b w:val="0"/>
+          <w:i w:val="0"/>
+        </w:rPr>
+        <w:t xml:space="preserve">M10.1 不新增 migration、套件或環境變數；application rollback 使用 </w:t>
+      </w:r>
+      <w:r>
+        <w:rPr>
+          <w:rFonts w:ascii="Consolas" w:hAnsi="Consolas" w:eastAsia="Microsoft JhengHei"/>
+          <w:b w:val="0"/>
+          <w:i w:val="0"/>
+          <w:color w:val="17365D"/>
+          <w:sz w:val="17"/>
+        </w:rPr>
+        <w:t>m10</w:t>
       </w:r>
       <w:r>
         <w:rPr>

</xml_diff>

<commit_message>
docs: formalize M10.1 and frontend roadmap
</commit_message>
<xml_diff>
--- a/docs/OMNICHECK_AI_BUILD_AND_OPERATIONS_GUIDE.docx
+++ b/docs/OMNICHECK_AI_BUILD_AND_OPERATIONS_GUIDE.docx
@@ -103,7 +103,7 @@
           <w:b w:val="0"/>
           <w:i w:val="0"/>
         </w:rPr>
-        <w:t>文件版本：0.10.1-draft.1</w:t>
+        <w:t>文件版本：0.10.1</w:t>
       </w:r>
     </w:p>
     <w:p>
@@ -139,15 +139,15 @@
           <w:color w:val="17365D"/>
           <w:sz w:val="17"/>
         </w:rPr>
-        <w:t>feature/m10-1-legacy-db-evidence</w:t>
-      </w:r>
-      <w:r>
-        <w:rPr>
-          <w:rFonts w:ascii="Calibri" w:hAnsi="Calibri" w:eastAsia="Microsoft JhengHei"/>
-          <w:b w:val="0"/>
-          <w:i w:val="0"/>
-        </w:rPr>
-        <w:t xml:space="preserve">；正式基準仍為 </w:t>
+        <w:t>main</w:t>
+      </w:r>
+      <w:r>
+        <w:rPr>
+          <w:rFonts w:ascii="Calibri" w:hAnsi="Calibri" w:eastAsia="Microsoft JhengHei"/>
+          <w:b w:val="0"/>
+          <w:i w:val="0"/>
+        </w:rPr>
+        <w:t xml:space="preserve"> / </w:t>
       </w:r>
       <w:r>
         <w:rPr>
@@ -157,25 +157,7 @@
           <w:color w:val="17365D"/>
           <w:sz w:val="17"/>
         </w:rPr>
-        <w:t>main</w:t>
-      </w:r>
-      <w:r>
-        <w:rPr>
-          <w:rFonts w:ascii="Calibri" w:hAnsi="Calibri" w:eastAsia="Microsoft JhengHei"/>
-          <w:b w:val="0"/>
-          <w:i w:val="0"/>
-        </w:rPr>
-        <w:t xml:space="preserve"> / </w:t>
-      </w:r>
-      <w:r>
-        <w:rPr>
-          <w:rFonts w:ascii="Consolas" w:hAnsi="Consolas" w:eastAsia="Microsoft JhengHei"/>
-          <w:b w:val="0"/>
-          <w:i w:val="0"/>
-          <w:color w:val="17365D"/>
-          <w:sz w:val="17"/>
-        </w:rPr>
-        <w:t>m10</w:t>
+        <w:t>m10.1</w:t>
       </w:r>
     </w:p>
     <w:p>
@@ -198,7 +180,7 @@
           <w:color w:val="17365D"/>
           <w:sz w:val="17"/>
         </w:rPr>
-        <w:t>m10</w:t>
+        <w:t>m10.1</w:t>
       </w:r>
       <w:r>
         <w:rPr>
@@ -216,7 +198,7 @@
           <w:color w:val="17365D"/>
           <w:sz w:val="17"/>
         </w:rPr>
-        <w:t>m9.6</w:t>
+        <w:t>m10</w:t>
       </w:r>
     </w:p>
     <w:p>
@@ -1540,7 +1522,7 @@
                 <w:i w:val="0"/>
                 <w:sz w:val="17"/>
               </w:rPr>
-              <w:t>0.10.1-draft.1</w:t>
+              <w:t>0.10.1</w:t>
             </w:r>
           </w:p>
         </w:tc>
@@ -1592,7 +1574,7 @@
                 <w:i w:val="0"/>
                 <w:sz w:val="17"/>
               </w:rPr>
-              <w:t>舊式 Database Output 內容分類、來源節點候選、人工 evidence mapping 與 Scope 稽核</w:t>
+              <w:t>舊式 Database Output 內容分類、來源節點候選、人工 evidence mapping、Scope 稽核與使用者驗收</w:t>
             </w:r>
           </w:p>
         </w:tc>
@@ -1618,7 +1600,7 @@
                 <w:i w:val="0"/>
                 <w:sz w:val="17"/>
               </w:rPr>
-              <w:t>本機／公司 VM 82 tests；實際 ENGDB 3 檔、17 項 Primary checks、QA/V4 QA、19 頁 PDF 與來源 hash 通過；待 Web 驗收</w:t>
+              <w:t>本機／公司 VM 82 tests；實際 ENGDB 3 檔、17 項 Primary checks、QA/V4 QA、19 頁 PDF、來源 hash 與公司 Web 驗收通過</w:t>
             </w:r>
           </w:p>
         </w:tc>
@@ -4268,7 +4250,7 @@
                 <w:i w:val="0"/>
                 <w:sz w:val="17"/>
               </w:rPr>
-              <w:t>功能分支完成、待驗收</w:t>
+              <w:t>正式完成</w:t>
             </w:r>
           </w:p>
         </w:tc>
@@ -4295,6 +4277,86 @@
                 <w:sz w:val="17"/>
               </w:rPr>
               <w:t>舊式 Database Output 內容辨識、來源節點候選、人工 mapping 與 Primary-only 保護</w:t>
+            </w:r>
+          </w:p>
+        </w:tc>
+      </w:tr>
+      <w:tr>
+        <w:tc>
+          <w:tcPr>
+            <w:tcW w:type="dxa" w:w="3293"/>
+            <w:vAlign w:val="center"/>
+            <w:tcMar>
+              <w:top w:w="45" w:type="dxa"/>
+              <w:start w:w="120" w:type="dxa"/>
+              <w:bottom w:w="45" w:type="dxa"/>
+              <w:end w:w="120" w:type="dxa"/>
+            </w:tcMar>
+          </w:tcPr>
+          <w:p>
+            <w:pPr>
+              <w:spacing w:after="0"/>
+            </w:pPr>
+            <w:r>
+              <w:rPr>
+                <w:rFonts w:ascii="Calibri" w:hAnsi="Calibri" w:eastAsia="Microsoft JhengHei"/>
+                <w:b w:val="0"/>
+                <w:i w:val="0"/>
+                <w:sz w:val="17"/>
+              </w:rPr>
+              <w:t>M10.2～M10.3</w:t>
+            </w:r>
+          </w:p>
+        </w:tc>
+        <w:tc>
+          <w:tcPr>
+            <w:tcW w:type="dxa" w:w="3293"/>
+            <w:vAlign w:val="center"/>
+            <w:tcMar>
+              <w:top w:w="45" w:type="dxa"/>
+              <w:start w:w="120" w:type="dxa"/>
+              <w:bottom w:w="45" w:type="dxa"/>
+              <w:end w:w="120" w:type="dxa"/>
+            </w:tcMar>
+          </w:tcPr>
+          <w:p>
+            <w:pPr>
+              <w:spacing w:after="0"/>
+            </w:pPr>
+            <w:r>
+              <w:rPr>
+                <w:rFonts w:ascii="Calibri" w:hAnsi="Calibri" w:eastAsia="Microsoft JhengHei"/>
+                <w:b w:val="0"/>
+                <w:i w:val="0"/>
+                <w:sz w:val="17"/>
+              </w:rPr>
+              <w:t>已核准、待實作</w:t>
+            </w:r>
+          </w:p>
+        </w:tc>
+        <w:tc>
+          <w:tcPr>
+            <w:tcW w:type="dxa" w:w="3293"/>
+            <w:vAlign w:val="center"/>
+            <w:tcMar>
+              <w:top w:w="45" w:type="dxa"/>
+              <w:start w:w="120" w:type="dxa"/>
+              <w:bottom w:w="45" w:type="dxa"/>
+              <w:end w:w="120" w:type="dxa"/>
+            </w:tcMar>
+          </w:tcPr>
+          <w:p>
+            <w:pPr>
+              <w:spacing w:after="0"/>
+            </w:pPr>
+            <w:r>
+              <w:rPr>
+                <w:rFonts w:ascii="Calibri" w:hAnsi="Calibri" w:eastAsia="Microsoft JhengHei"/>
+                <w:b w:val="0"/>
+                <w:i w:val="0"/>
+                <w:sz w:val="17"/>
+              </w:rPr>
+              <w:t>既有前端 REST／OpenAPI 整合、Section API、AI 草稿與人工審核</w:t>
             </w:r>
           </w:p>
         </w:tc>
@@ -4374,7 +4436,7 @@
                 <w:i w:val="0"/>
                 <w:sz w:val="17"/>
               </w:rPr>
-              <w:t>權限、歷史、CVE、選配 AI 與生產強化</w:t>
+              <w:t>選配權限、歷史、CVE、Ollama AI Gateway 與生產強化</w:t>
             </w:r>
           </w:p>
         </w:tc>
@@ -4412,7 +4474,7 @@
           <w:color w:val="17365D"/>
           <w:sz w:val="17"/>
         </w:rPr>
-        <w:t>m10</w:t>
+        <w:t>m10.1</w:t>
       </w:r>
       <w:r>
         <w:rPr>
@@ -4430,15 +4492,15 @@
           <w:color w:val="17365D"/>
           <w:sz w:val="17"/>
         </w:rPr>
-        <w:t>m9.6</w:t>
-      </w:r>
-      <w:r>
-        <w:rPr>
-          <w:rFonts w:ascii="Calibri" w:hAnsi="Calibri" w:eastAsia="Microsoft JhengHei"/>
-          <w:b w:val="0"/>
-          <w:i w:val="0"/>
-        </w:rPr>
-        <w:t xml:space="preserve"> 保留為 M10 前的 application rollback 點，</w:t>
+        <w:t>m10</w:t>
+      </w:r>
+      <w:r>
+        <w:rPr>
+          <w:rFonts w:ascii="Calibri" w:hAnsi="Calibri" w:eastAsia="Microsoft JhengHei"/>
+          <w:b w:val="0"/>
+          <w:i w:val="0"/>
+        </w:rPr>
+        <w:t xml:space="preserve"> 保留為 M10.1 前的 application rollback 點。正式重建應 checkout </w:t>
       </w:r>
       <w:r>
         <w:rPr>
@@ -4448,43 +4510,7 @@
           <w:color w:val="17365D"/>
           <w:sz w:val="17"/>
         </w:rPr>
-        <w:t>m9.5</w:t>
-      </w:r>
-      <w:r>
-        <w:rPr>
-          <w:rFonts w:ascii="Calibri" w:hAnsi="Calibri" w:eastAsia="Microsoft JhengHei"/>
-          <w:b w:val="0"/>
-          <w:i w:val="0"/>
-        </w:rPr>
-        <w:t xml:space="preserve"> 與 </w:t>
-      </w:r>
-      <w:r>
-        <w:rPr>
-          <w:rFonts w:ascii="Consolas" w:hAnsi="Consolas" w:eastAsia="Microsoft JhengHei"/>
-          <w:b w:val="0"/>
-          <w:i w:val="0"/>
-          <w:color w:val="17365D"/>
-          <w:sz w:val="17"/>
-        </w:rPr>
-        <w:t>m9.4</w:t>
-      </w:r>
-      <w:r>
-        <w:rPr>
-          <w:rFonts w:ascii="Calibri" w:hAnsi="Calibri" w:eastAsia="Microsoft JhengHei"/>
-          <w:b w:val="0"/>
-          <w:i w:val="0"/>
-        </w:rPr>
-        <w:t xml:space="preserve"> 保留較早期 rollback 點。正式重建應 checkout </w:t>
-      </w:r>
-      <w:r>
-        <w:rPr>
-          <w:rFonts w:ascii="Consolas" w:hAnsi="Consolas" w:eastAsia="Microsoft JhengHei"/>
-          <w:b w:val="0"/>
-          <w:i w:val="0"/>
-          <w:color w:val="17365D"/>
-          <w:sz w:val="17"/>
-        </w:rPr>
-        <w:t>m10</w:t>
+        <w:t>m10.1</w:t>
       </w:r>
       <w:r>
         <w:rPr>
@@ -15331,7 +15357,43 @@
           <w:b w:val="0"/>
           <w:i w:val="0"/>
         </w:rPr>
-        <w:t>台灣行動支付實際資料在 SCRAM 重啟後通過 13 inputs／13 outputs、QA 8/8、V4 QA、29 頁 PDF 與來源 SHA-256 不變。</w:t>
+        <w:t xml:space="preserve">M10.1 已通過公司 Web 使用者驗收：候選 release </w:t>
+      </w:r>
+      <w:r>
+        <w:rPr>
+          <w:rFonts w:ascii="Consolas" w:hAnsi="Consolas" w:eastAsia="Microsoft JhengHei"/>
+          <w:b w:val="0"/>
+          <w:i w:val="0"/>
+          <w:color w:val="17365D"/>
+          <w:sz w:val="17"/>
+        </w:rPr>
+        <w:t>be0ca80</w:t>
+      </w:r>
+      <w:r>
+        <w:rPr>
+          <w:rFonts w:ascii="Calibri" w:hAnsi="Calibri" w:eastAsia="Microsoft JhengHei"/>
+          <w:b w:val="0"/>
+          <w:i w:val="0"/>
+        </w:rPr>
+        <w:t xml:space="preserve">、本機／VM 82 tests；實際 ENGDB 來源確認後得到 17 項 Primary checks、QA/V4 QA、19 頁 PDF 與來源 hash 不變。正式 application 可回到 </w:t>
+      </w:r>
+      <w:r>
+        <w:rPr>
+          <w:rFonts w:ascii="Consolas" w:hAnsi="Consolas" w:eastAsia="Microsoft JhengHei"/>
+          <w:b w:val="0"/>
+          <w:i w:val="0"/>
+          <w:color w:val="17365D"/>
+          <w:sz w:val="17"/>
+        </w:rPr>
+        <w:t>m10</w:t>
+      </w:r>
+      <w:r>
+        <w:rPr>
+          <w:rFonts w:ascii="Calibri" w:hAnsi="Calibri" w:eastAsia="Microsoft JhengHei"/>
+          <w:b w:val="0"/>
+          <w:i w:val="0"/>
+        </w:rPr>
+        <w:t>，不需 database downgrade。</w:t>
       </w:r>
     </w:p>
     <w:p>
@@ -15340,39 +15402,11 @@
       </w:pPr>
       <w:r>
         <w:rPr>
-          <w:rFonts w:ascii="Consolas" w:hAnsi="Consolas" w:eastAsia="Microsoft JhengHei"/>
-          <w:b w:val="0"/>
-          <w:i w:val="0"/>
-          <w:color w:val="17365D"/>
-          <w:sz w:val="17"/>
-        </w:rPr>
-        <w:t>.81</w:t>
-      </w:r>
-      <w:r>
-        <w:rPr>
-          <w:rFonts w:ascii="Calibri" w:hAnsi="Calibri" w:eastAsia="Microsoft JhengHei"/>
-          <w:b w:val="0"/>
-          <w:i w:val="0"/>
-        </w:rPr>
-        <w:t xml:space="preserve"> 的 OMNIcheck 精確規則已要求 SCRAM；cluster-wide </w:t>
-      </w:r>
-      <w:r>
-        <w:rPr>
-          <w:rFonts w:ascii="Consolas" w:hAnsi="Consolas" w:eastAsia="Microsoft JhengHei"/>
-          <w:b w:val="0"/>
-          <w:i w:val="0"/>
-          <w:color w:val="17365D"/>
-          <w:sz w:val="17"/>
-        </w:rPr>
-        <w:t>host all all 0.0.0.0/0 trust</w:t>
-      </w:r>
-      <w:r>
-        <w:rPr>
-          <w:rFonts w:ascii="Calibri" w:hAnsi="Calibri" w:eastAsia="Microsoft JhengHei"/>
-          <w:b w:val="0"/>
-          <w:i w:val="0"/>
-        </w:rPr>
-        <w:t xml:space="preserve"> 仍是其他連線的安全風險，需另案收斂。</w:t>
+          <w:rFonts w:ascii="Calibri" w:hAnsi="Calibri" w:eastAsia="Microsoft JhengHei"/>
+          <w:b w:val="0"/>
+          <w:i w:val="0"/>
+        </w:rPr>
+        <w:t>台灣行動支付實際資料在 SCRAM 重啟後通過 13 inputs／13 outputs、QA 8/8、V4 QA、29 頁 PDF 與來源 SHA-256 不變。</w:t>
       </w:r>
     </w:p>
     <w:p>
@@ -15381,11 +15415,39 @@
       </w:pPr>
       <w:r>
         <w:rPr>
-          <w:rFonts w:ascii="Calibri" w:hAnsi="Calibri" w:eastAsia="Microsoft JhengHei"/>
-          <w:b w:val="0"/>
-          <w:i w:val="0"/>
-        </w:rPr>
-        <w:t>兩次修正前 API 500 留下兩筆空的 draft Golden 測試案件；尚未執行破壞性清除。</w:t>
+          <w:rFonts w:ascii="Consolas" w:hAnsi="Consolas" w:eastAsia="Microsoft JhengHei"/>
+          <w:b w:val="0"/>
+          <w:i w:val="0"/>
+          <w:color w:val="17365D"/>
+          <w:sz w:val="17"/>
+        </w:rPr>
+        <w:t>.81</w:t>
+      </w:r>
+      <w:r>
+        <w:rPr>
+          <w:rFonts w:ascii="Calibri" w:hAnsi="Calibri" w:eastAsia="Microsoft JhengHei"/>
+          <w:b w:val="0"/>
+          <w:i w:val="0"/>
+        </w:rPr>
+        <w:t xml:space="preserve"> 的 OMNIcheck 精確規則已要求 SCRAM；cluster-wide </w:t>
+      </w:r>
+      <w:r>
+        <w:rPr>
+          <w:rFonts w:ascii="Consolas" w:hAnsi="Consolas" w:eastAsia="Microsoft JhengHei"/>
+          <w:b w:val="0"/>
+          <w:i w:val="0"/>
+          <w:color w:val="17365D"/>
+          <w:sz w:val="17"/>
+        </w:rPr>
+        <w:t>host all all 0.0.0.0/0 trust</w:t>
+      </w:r>
+      <w:r>
+        <w:rPr>
+          <w:rFonts w:ascii="Calibri" w:hAnsi="Calibri" w:eastAsia="Microsoft JhengHei"/>
+          <w:b w:val="0"/>
+          <w:i w:val="0"/>
+        </w:rPr>
+        <w:t xml:space="preserve"> 仍是其他連線的安全風險，需另案收斂。</w:t>
       </w:r>
     </w:p>
     <w:p>
@@ -15398,7 +15460,7 @@
           <w:b w:val="0"/>
           <w:i w:val="0"/>
         </w:rPr>
-        <w:t>正式 TLS/VIP、EFM failover、reverse proxy、登入／RBAC 尚未完成。</w:t>
+        <w:t>兩次修正前 API 500 留下兩筆空的 draft Golden 測試案件；尚未執行破壞性清除。</w:t>
       </w:r>
     </w:p>
     <w:p>
@@ -15411,7 +15473,7 @@
           <w:b w:val="0"/>
           <w:i w:val="0"/>
         </w:rPr>
-        <w:t>M10 可對標準搜集包提出角色候選；非標準檔名、缺少 EFM／OS 訊號或衝突時仍需使用者指定，且所有案件都必須人工確認。</w:t>
+        <w:t>正式 TLS/VIP、EFM failover、reverse proxy、登入／RBAC 尚未完成。</w:t>
       </w:r>
     </w:p>
     <w:p>
@@ -15424,7 +15486,7 @@
           <w:b w:val="0"/>
           <w:i w:val="0"/>
         </w:rPr>
-        <w:t>Barman 真實 wrapper fixture 待提供。</w:t>
+        <w:t>M10 可對標準搜集包提出角色候選；非標準檔名、缺少 EFM／OS 訊號或衝突時仍需使用者指定，且所有案件都必須人工確認。</w:t>
       </w:r>
     </w:p>
     <w:p>
@@ -15437,7 +15499,7 @@
           <w:b w:val="0"/>
           <w:i w:val="0"/>
         </w:rPr>
-        <w:t>Python dependency 目前為 version ranges，正式 reproducible build 尚需 lock／wheelhouse。</w:t>
+        <w:t>Barman 真實 wrapper fixture 待提供。</w:t>
       </w:r>
     </w:p>
     <w:p>
@@ -15450,7 +15512,38 @@
           <w:b w:val="0"/>
           <w:i w:val="0"/>
         </w:rPr>
-        <w:t>歷史比較、CVE cache、可選 AI gateway 尚未實作。</w:t>
+        <w:t>Python dependency 目前為 version ranges，正式 reproducible build 尚需 lock／wheelhouse。</w:t>
+      </w:r>
+    </w:p>
+    <w:p>
+      <w:pPr>
+        <w:pStyle w:val="ListBullet"/>
+      </w:pPr>
+      <w:r>
+        <w:rPr>
+          <w:rFonts w:ascii="Calibri" w:hAnsi="Calibri" w:eastAsia="Microsoft JhengHei"/>
+          <w:b w:val="0"/>
+          <w:i w:val="0"/>
+        </w:rPr>
+        <w:t xml:space="preserve">前端整合、Section 審核、歷史比較、CVE cache 與 Ollama AI Gateway 尚未實作；順序與責任邊界見 </w:t>
+      </w:r>
+      <w:r>
+        <w:rPr>
+          <w:rFonts w:ascii="Consolas" w:hAnsi="Consolas" w:eastAsia="Microsoft JhengHei"/>
+          <w:b w:val="0"/>
+          <w:i w:val="0"/>
+          <w:color w:val="17365D"/>
+          <w:sz w:val="17"/>
+        </w:rPr>
+        <w:t>docs/MILESTONE_ROADMAP.md</w:t>
+      </w:r>
+      <w:r>
+        <w:rPr>
+          <w:rFonts w:ascii="Calibri" w:hAnsi="Calibri" w:eastAsia="Microsoft JhengHei"/>
+          <w:b w:val="0"/>
+          <w:i w:val="0"/>
+        </w:rPr>
+        <w:t>。</w:t>
       </w:r>
     </w:p>
     <w:p>

</xml_diff>

<commit_message>
feat: add AI-optional section workflow foundation
</commit_message>
<xml_diff>
--- a/docs/OMNICHECK_AI_BUILD_AND_OPERATIONS_GUIDE.docx
+++ b/docs/OMNICHECK_AI_BUILD_AND_OPERATIONS_GUIDE.docx
@@ -103,7 +103,7 @@
           <w:b w:val="0"/>
           <w:i w:val="0"/>
         </w:rPr>
-        <w:t>文件版本：0.10.1</w:t>
+        <w:t>文件版本：0.10.3-draft.1</w:t>
       </w:r>
     </w:p>
     <w:p>
@@ -130,6 +130,24 @@
           <w:i w:val="0"/>
         </w:rPr>
         <w:t>適用程式基準：</w:t>
+      </w:r>
+      <w:r>
+        <w:rPr>
+          <w:rFonts w:ascii="Consolas" w:hAnsi="Consolas" w:eastAsia="Microsoft JhengHei"/>
+          <w:b w:val="0"/>
+          <w:i w:val="0"/>
+          <w:color w:val="17365D"/>
+          <w:sz w:val="17"/>
+        </w:rPr>
+        <w:t>feature/m10-3-section-foundation</w:t>
+      </w:r>
+      <w:r>
+        <w:rPr>
+          <w:rFonts w:ascii="Calibri" w:hAnsi="Calibri" w:eastAsia="Microsoft JhengHei"/>
+          <w:b w:val="0"/>
+          <w:i w:val="0"/>
+        </w:rPr>
+        <w:t xml:space="preserve">；正式基準仍為 </w:t>
       </w:r>
       <w:r>
         <w:rPr>
@@ -1495,6 +1513,112 @@
                 <w:sz w:val="17"/>
               </w:rPr>
               <w:t>驗證狀態</w:t>
+            </w:r>
+          </w:p>
+        </w:tc>
+      </w:tr>
+      <w:tr>
+        <w:tc>
+          <w:tcPr>
+            <w:tcW w:type="dxa" w:w="2470"/>
+            <w:vAlign w:val="center"/>
+            <w:tcMar>
+              <w:top w:w="45" w:type="dxa"/>
+              <w:start w:w="120" w:type="dxa"/>
+              <w:bottom w:w="45" w:type="dxa"/>
+              <w:end w:w="120" w:type="dxa"/>
+            </w:tcMar>
+          </w:tcPr>
+          <w:p>
+            <w:pPr>
+              <w:spacing w:after="0"/>
+            </w:pPr>
+            <w:r>
+              <w:rPr>
+                <w:rFonts w:ascii="Calibri" w:hAnsi="Calibri" w:eastAsia="Microsoft JhengHei"/>
+                <w:b w:val="0"/>
+                <w:i w:val="0"/>
+                <w:sz w:val="17"/>
+              </w:rPr>
+              <w:t>0.10.3-draft.1</w:t>
+            </w:r>
+          </w:p>
+        </w:tc>
+        <w:tc>
+          <w:tcPr>
+            <w:tcW w:type="dxa" w:w="2470"/>
+            <w:vAlign w:val="center"/>
+            <w:tcMar>
+              <w:top w:w="45" w:type="dxa"/>
+              <w:start w:w="120" w:type="dxa"/>
+              <w:bottom w:w="45" w:type="dxa"/>
+              <w:end w:w="120" w:type="dxa"/>
+            </w:tcMar>
+          </w:tcPr>
+          <w:p>
+            <w:pPr>
+              <w:spacing w:after="0"/>
+            </w:pPr>
+            <w:r>
+              <w:rPr>
+                <w:rFonts w:ascii="Calibri" w:hAnsi="Calibri" w:eastAsia="Microsoft JhengHei"/>
+                <w:b w:val="0"/>
+                <w:i w:val="0"/>
+                <w:sz w:val="17"/>
+              </w:rPr>
+              <w:t>2026-08-11</w:t>
+            </w:r>
+          </w:p>
+        </w:tc>
+        <w:tc>
+          <w:tcPr>
+            <w:tcW w:type="dxa" w:w="2470"/>
+            <w:vAlign w:val="center"/>
+            <w:tcMar>
+              <w:top w:w="45" w:type="dxa"/>
+              <w:start w:w="120" w:type="dxa"/>
+              <w:bottom w:w="45" w:type="dxa"/>
+              <w:end w:w="120" w:type="dxa"/>
+            </w:tcMar>
+          </w:tcPr>
+          <w:p>
+            <w:pPr>
+              <w:spacing w:after="0"/>
+            </w:pPr>
+            <w:r>
+              <w:rPr>
+                <w:rFonts w:ascii="Calibri" w:hAnsi="Calibri" w:eastAsia="Microsoft JhengHei"/>
+                <w:b w:val="0"/>
+                <w:i w:val="0"/>
+                <w:sz w:val="17"/>
+              </w:rPr>
+              <w:t>AI-optional Section Workflow JSON、draft／review／approval 分離、Artifact 關係與無 migration rollback</w:t>
+            </w:r>
+          </w:p>
+        </w:tc>
+        <w:tc>
+          <w:tcPr>
+            <w:tcW w:type="dxa" w:w="2470"/>
+            <w:vAlign w:val="center"/>
+            <w:tcMar>
+              <w:top w:w="45" w:type="dxa"/>
+              <w:start w:w="120" w:type="dxa"/>
+              <w:bottom w:w="45" w:type="dxa"/>
+              <w:end w:w="120" w:type="dxa"/>
+            </w:tcMar>
+          </w:tcPr>
+          <w:p>
+            <w:pPr>
+              <w:spacing w:after="0"/>
+            </w:pPr>
+            <w:r>
+              <w:rPr>
+                <w:rFonts w:ascii="Calibri" w:hAnsi="Calibri" w:eastAsia="Microsoft JhengHei"/>
+                <w:b w:val="0"/>
+                <w:i w:val="0"/>
+                <w:sz w:val="17"/>
+              </w:rPr>
+              <w:t>85 tests、V4 manifest、台灣行動支付 14 檔／19 sections、QA/V4 QA、DOCX/PDF 與來源 hash 通過；待公司候選驗收</w:t>
             </w:r>
           </w:p>
         </w:tc>
@@ -4304,7 +4428,7 @@
                 <w:i w:val="0"/>
                 <w:sz w:val="17"/>
               </w:rPr>
-              <w:t>M10.2～M10.3</w:t>
+              <w:t>M10.2</w:t>
             </w:r>
           </w:p>
         </w:tc>
@@ -4330,7 +4454,7 @@
                 <w:i w:val="0"/>
                 <w:sz w:val="17"/>
               </w:rPr>
-              <w:t>已核准、待實作</w:t>
+              <w:t>等待前端需求</w:t>
             </w:r>
           </w:p>
         </w:tc>
@@ -4356,7 +4480,167 @@
                 <w:i w:val="0"/>
                 <w:sz w:val="17"/>
               </w:rPr>
-              <w:t>既有前端 REST／OpenAPI 整合、Section API、AI 草稿與人工審核</w:t>
+              <w:t>既有前端 REST／OpenAPI 整合</w:t>
+            </w:r>
+          </w:p>
+        </w:tc>
+      </w:tr>
+      <w:tr>
+        <w:tc>
+          <w:tcPr>
+            <w:tcW w:type="dxa" w:w="3293"/>
+            <w:vAlign w:val="center"/>
+            <w:tcMar>
+              <w:top w:w="45" w:type="dxa"/>
+              <w:start w:w="120" w:type="dxa"/>
+              <w:bottom w:w="45" w:type="dxa"/>
+              <w:end w:w="120" w:type="dxa"/>
+            </w:tcMar>
+          </w:tcPr>
+          <w:p>
+            <w:pPr>
+              <w:spacing w:after="0"/>
+            </w:pPr>
+            <w:r>
+              <w:rPr>
+                <w:rFonts w:ascii="Calibri" w:hAnsi="Calibri" w:eastAsia="Microsoft JhengHei"/>
+                <w:b w:val="0"/>
+                <w:i w:val="0"/>
+                <w:sz w:val="17"/>
+              </w:rPr>
+              <w:t>M10.3.1</w:t>
+            </w:r>
+          </w:p>
+        </w:tc>
+        <w:tc>
+          <w:tcPr>
+            <w:tcW w:type="dxa" w:w="3293"/>
+            <w:vAlign w:val="center"/>
+            <w:tcMar>
+              <w:top w:w="45" w:type="dxa"/>
+              <w:start w:w="120" w:type="dxa"/>
+              <w:bottom w:w="45" w:type="dxa"/>
+              <w:end w:w="120" w:type="dxa"/>
+            </w:tcMar>
+          </w:tcPr>
+          <w:p>
+            <w:pPr>
+              <w:spacing w:after="0"/>
+            </w:pPr>
+            <w:r>
+              <w:rPr>
+                <w:rFonts w:ascii="Calibri" w:hAnsi="Calibri" w:eastAsia="Microsoft JhengHei"/>
+                <w:b w:val="0"/>
+                <w:i w:val="0"/>
+                <w:sz w:val="17"/>
+              </w:rPr>
+              <w:t>功能分支完成、待公司驗收</w:t>
+            </w:r>
+          </w:p>
+        </w:tc>
+        <w:tc>
+          <w:tcPr>
+            <w:tcW w:type="dxa" w:w="3293"/>
+            <w:vAlign w:val="center"/>
+            <w:tcMar>
+              <w:top w:w="45" w:type="dxa"/>
+              <w:start w:w="120" w:type="dxa"/>
+              <w:bottom w:w="45" w:type="dxa"/>
+              <w:end w:w="120" w:type="dxa"/>
+            </w:tcMar>
+          </w:tcPr>
+          <w:p>
+            <w:pPr>
+              <w:spacing w:after="0"/>
+            </w:pPr>
+            <w:r>
+              <w:rPr>
+                <w:rFonts w:ascii="Calibri" w:hAnsi="Calibri" w:eastAsia="Microsoft JhengHei"/>
+                <w:b w:val="0"/>
+                <w:i w:val="0"/>
+                <w:sz w:val="17"/>
+              </w:rPr>
+              <w:t>Section Workflow JSON、AI 草稿／人工審查／核准與 fail-closed selected source</w:t>
+            </w:r>
+          </w:p>
+        </w:tc>
+      </w:tr>
+      <w:tr>
+        <w:tc>
+          <w:tcPr>
+            <w:tcW w:type="dxa" w:w="3293"/>
+            <w:vAlign w:val="center"/>
+            <w:tcMar>
+              <w:top w:w="45" w:type="dxa"/>
+              <w:start w:w="120" w:type="dxa"/>
+              <w:bottom w:w="45" w:type="dxa"/>
+              <w:end w:w="120" w:type="dxa"/>
+            </w:tcMar>
+          </w:tcPr>
+          <w:p>
+            <w:pPr>
+              <w:spacing w:after="0"/>
+            </w:pPr>
+            <w:r>
+              <w:rPr>
+                <w:rFonts w:ascii="Calibri" w:hAnsi="Calibri" w:eastAsia="Microsoft JhengHei"/>
+                <w:b w:val="0"/>
+                <w:i w:val="0"/>
+                <w:sz w:val="17"/>
+              </w:rPr>
+              <w:t>M10.3.2</w:t>
+            </w:r>
+          </w:p>
+        </w:tc>
+        <w:tc>
+          <w:tcPr>
+            <w:tcW w:type="dxa" w:w="3293"/>
+            <w:vAlign w:val="center"/>
+            <w:tcMar>
+              <w:top w:w="45" w:type="dxa"/>
+              <w:start w:w="120" w:type="dxa"/>
+              <w:bottom w:w="45" w:type="dxa"/>
+              <w:end w:w="120" w:type="dxa"/>
+            </w:tcMar>
+          </w:tcPr>
+          <w:p>
+            <w:pPr>
+              <w:spacing w:after="0"/>
+            </w:pPr>
+            <w:r>
+              <w:rPr>
+                <w:rFonts w:ascii="Calibri" w:hAnsi="Calibri" w:eastAsia="Microsoft JhengHei"/>
+                <w:b w:val="0"/>
+                <w:i w:val="0"/>
+                <w:sz w:val="17"/>
+              </w:rPr>
+              <w:t>待 schema reconciliation</w:t>
+            </w:r>
+          </w:p>
+        </w:tc>
+        <w:tc>
+          <w:tcPr>
+            <w:tcW w:type="dxa" w:w="3293"/>
+            <w:vAlign w:val="center"/>
+            <w:tcMar>
+              <w:top w:w="45" w:type="dxa"/>
+              <w:start w:w="120" w:type="dxa"/>
+              <w:bottom w:w="45" w:type="dxa"/>
+              <w:end w:w="120" w:type="dxa"/>
+            </w:tcMar>
+          </w:tcPr>
+          <w:p>
+            <w:pPr>
+              <w:spacing w:after="0"/>
+            </w:pPr>
+            <w:r>
+              <w:rPr>
+                <w:rFonts w:ascii="Calibri" w:hAnsi="Calibri" w:eastAsia="Microsoft JhengHei"/>
+                <w:b w:val="0"/>
+                <w:i w:val="0"/>
+                <w:sz w:val="17"/>
+              </w:rPr>
+              <w:t>EDB Section persistence、版本、稽核與 API</w:t>
             </w:r>
           </w:p>
         </w:tc>
@@ -11047,7 +11331,7 @@
           <w:b w:val="0"/>
           <w:i w:val="0"/>
         </w:rPr>
-        <w:t>公司 M9.3 正式基準為 60 tests、M9.4 為 65 tests、M9.5 為 70 tests、M9.6 為 74 tests、M10 為 78 tests；M10.1 候選為 82 tests。實際數量會隨版本增加，不應硬性只等於固定數字；重點是 0 failed。</w:t>
+        <w:t>公司 M9.3 正式基準為 60 tests、M9.4 為 65 tests、M9.5 為 70 tests、M9.6 為 74 tests、M10 為 78 tests、M10.1 為 82 tests；M10.3.1 候選為 85 tests。實際數量會隨版本增加，不應硬性只等於固定數字；重點是 0 failed。</w:t>
       </w:r>
     </w:p>
     <w:p>
@@ -12285,6 +12569,202 @@
           <w:sz w:val="17"/>
         </w:rPr>
         <w:t>m10</w:t>
+      </w:r>
+      <w:r>
+        <w:rPr>
+          <w:rFonts w:ascii="Calibri" w:hAnsi="Calibri" w:eastAsia="Microsoft JhengHei"/>
+          <w:b w:val="0"/>
+          <w:i w:val="0"/>
+        </w:rPr>
+        <w:t>。</w:t>
+      </w:r>
+    </w:p>
+    <w:p>
+      <w:pPr>
+        <w:pStyle w:val="Heading3"/>
+      </w:pPr>
+      <w:r>
+        <w:rPr>
+          <w:rFonts w:ascii="Calibri" w:hAnsi="Calibri" w:eastAsia="Microsoft JhengHei"/>
+          <w:b w:val="0"/>
+          <w:i w:val="0"/>
+        </w:rPr>
+        <w:t>13.12 M10.3.1 Section Workflow 驗收</w:t>
+      </w:r>
+    </w:p>
+    <w:p>
+      <w:pPr>
+        <w:pStyle w:val="ListBullet"/>
+      </w:pPr>
+      <w:r>
+        <w:rPr>
+          <w:rFonts w:ascii="Consolas" w:hAnsi="Consolas" w:eastAsia="Microsoft JhengHei"/>
+          <w:b w:val="0"/>
+          <w:i w:val="0"/>
+          <w:color w:val="17365D"/>
+          <w:sz w:val="17"/>
+        </w:rPr>
+        <w:t>section-workflow.json</w:t>
+      </w:r>
+      <w:r>
+        <w:rPr>
+          <w:rFonts w:ascii="Calibri" w:hAnsi="Calibri" w:eastAsia="Microsoft JhengHei"/>
+          <w:b w:val="0"/>
+          <w:i w:val="0"/>
+        </w:rPr>
+        <w:t xml:space="preserve"> 必須使用 </w:t>
+      </w:r>
+      <w:r>
+        <w:rPr>
+          <w:rFonts w:ascii="Consolas" w:hAnsi="Consolas" w:eastAsia="Microsoft JhengHei"/>
+          <w:b w:val="0"/>
+          <w:i w:val="0"/>
+          <w:color w:val="17365D"/>
+          <w:sz w:val="17"/>
+        </w:rPr>
+        <w:t>omnicheck.section-workflow</w:t>
+      </w:r>
+      <w:r>
+        <w:rPr>
+          <w:rFonts w:ascii="Calibri" w:hAnsi="Calibri" w:eastAsia="Microsoft JhengHei"/>
+          <w:b w:val="0"/>
+          <w:i w:val="0"/>
+        </w:rPr>
+        <w:t xml:space="preserve">／schema </w:t>
+      </w:r>
+      <w:r>
+        <w:rPr>
+          <w:rFonts w:ascii="Consolas" w:hAnsi="Consolas" w:eastAsia="Microsoft JhengHei"/>
+          <w:b w:val="0"/>
+          <w:i w:val="0"/>
+          <w:color w:val="17365D"/>
+          <w:sz w:val="17"/>
+        </w:rPr>
+        <w:t>1.0</w:t>
+      </w:r>
+      <w:r>
+        <w:rPr>
+          <w:rFonts w:ascii="Calibri" w:hAnsi="Calibri" w:eastAsia="Microsoft JhengHei"/>
+          <w:b w:val="0"/>
+          <w:i w:val="0"/>
+        </w:rPr>
+        <w:t>。</w:t>
+      </w:r>
+    </w:p>
+    <w:p>
+      <w:pPr>
+        <w:pStyle w:val="ListBullet"/>
+      </w:pPr>
+      <w:r>
+        <w:rPr>
+          <w:rFonts w:ascii="Calibri" w:hAnsi="Calibri" w:eastAsia="Microsoft JhengHei"/>
+          <w:b w:val="0"/>
+          <w:i w:val="0"/>
+        </w:rPr>
+        <w:t xml:space="preserve">初始 item 必須全部為 </w:t>
+      </w:r>
+      <w:r>
+        <w:rPr>
+          <w:rFonts w:ascii="Consolas" w:hAnsi="Consolas" w:eastAsia="Microsoft JhengHei"/>
+          <w:b w:val="0"/>
+          <w:i w:val="0"/>
+          <w:color w:val="17365D"/>
+          <w:sz w:val="17"/>
+        </w:rPr>
+        <w:t>generated</w:t>
+      </w:r>
+      <w:r>
+        <w:rPr>
+          <w:rFonts w:ascii="Calibri" w:hAnsi="Calibri" w:eastAsia="Microsoft JhengHei"/>
+          <w:b w:val="0"/>
+          <w:i w:val="0"/>
+        </w:rPr>
+        <w:t>，selected source 為 deterministic template。</w:t>
+      </w:r>
+    </w:p>
+    <w:p>
+      <w:pPr>
+        <w:pStyle w:val="ListBullet"/>
+      </w:pPr>
+      <w:r>
+        <w:rPr>
+          <w:rFonts w:ascii="Calibri" w:hAnsi="Calibri" w:eastAsia="Microsoft JhengHei"/>
+          <w:b w:val="0"/>
+          <w:i w:val="0"/>
+        </w:rPr>
+        <w:t>加入 AI draft 不得改變 status、evidence、rule trace 或 selected source。</w:t>
+      </w:r>
+    </w:p>
+    <w:p>
+      <w:pPr>
+        <w:pStyle w:val="ListBullet"/>
+      </w:pPr>
+      <w:r>
+        <w:rPr>
+          <w:rFonts w:ascii="Calibri" w:hAnsi="Calibri" w:eastAsia="Microsoft JhengHei"/>
+          <w:b w:val="0"/>
+          <w:i w:val="0"/>
+        </w:rPr>
+        <w:t>未經 engineer review 不得 approve；未 approve 不得選用 AI／人工文字。</w:t>
+      </w:r>
+    </w:p>
+    <w:p>
+      <w:pPr>
+        <w:pStyle w:val="ListBullet"/>
+      </w:pPr>
+      <w:r>
+        <w:rPr>
+          <w:rFonts w:ascii="Consolas" w:hAnsi="Consolas" w:eastAsia="Microsoft JhengHei"/>
+          <w:b w:val="0"/>
+          <w:i w:val="0"/>
+          <w:color w:val="17365D"/>
+          <w:sz w:val="17"/>
+        </w:rPr>
+        <w:t>renderer_uses_ai=false</w:t>
+      </w:r>
+      <w:r>
+        <w:rPr>
+          <w:rFonts w:ascii="Calibri" w:hAnsi="Calibri" w:eastAsia="Microsoft JhengHei"/>
+          <w:b w:val="0"/>
+          <w:i w:val="0"/>
+        </w:rPr>
+        <w:t>，既有 V4 report 與版面不得改變。</w:t>
+      </w:r>
+    </w:p>
+    <w:p>
+      <w:pPr>
+        <w:pStyle w:val="ListBullet"/>
+      </w:pPr>
+      <w:r>
+        <w:rPr>
+          <w:rFonts w:ascii="Calibri" w:hAnsi="Calibri" w:eastAsia="Microsoft JhengHei"/>
+          <w:b w:val="0"/>
+          <w:i w:val="0"/>
+        </w:rPr>
+        <w:t>實際資料來源 manifest、QA、V4 QA、DOCX／PDF 必須通過。</w:t>
+      </w:r>
+    </w:p>
+    <w:p>
+      <w:pPr>
+        <w:pStyle w:val="ListBullet"/>
+      </w:pPr>
+      <w:r>
+        <w:rPr>
+          <w:rFonts w:ascii="Calibri" w:hAnsi="Calibri" w:eastAsia="Microsoft JhengHei"/>
+          <w:b w:val="0"/>
+          <w:i w:val="0"/>
+        </w:rPr>
+        <w:t xml:space="preserve">本階段無 migration；application rollback 使用 </w:t>
+      </w:r>
+      <w:r>
+        <w:rPr>
+          <w:rFonts w:ascii="Consolas" w:hAnsi="Consolas" w:eastAsia="Microsoft JhengHei"/>
+          <w:b w:val="0"/>
+          <w:i w:val="0"/>
+          <w:color w:val="17365D"/>
+          <w:sz w:val="17"/>
+        </w:rPr>
+        <w:t>m10.1</w:t>
       </w:r>
       <w:r>
         <w:rPr>
@@ -12707,6 +13187,61 @@
                 <w:sz w:val="17"/>
               </w:rPr>
               <w:t>規則狀態、證據、觀察、結論、建議</w:t>
+            </w:r>
+          </w:p>
+        </w:tc>
+      </w:tr>
+      <w:tr>
+        <w:tc>
+          <w:tcPr>
+            <w:tcW w:type="dxa" w:w="4939"/>
+            <w:vAlign w:val="center"/>
+            <w:tcMar>
+              <w:top w:w="45" w:type="dxa"/>
+              <w:start w:w="120" w:type="dxa"/>
+              <w:bottom w:w="45" w:type="dxa"/>
+              <w:end w:w="120" w:type="dxa"/>
+            </w:tcMar>
+          </w:tcPr>
+          <w:p>
+            <w:pPr>
+              <w:spacing w:after="0"/>
+            </w:pPr>
+            <w:r>
+              <w:rPr>
+                <w:rFonts w:ascii="Consolas" w:hAnsi="Consolas" w:eastAsia="Microsoft JhengHei"/>
+                <w:b w:val="0"/>
+                <w:i w:val="0"/>
+                <w:color w:val="17365D"/>
+                <w:sz w:val="17"/>
+              </w:rPr>
+              <w:t>section-workflow.json</w:t>
+            </w:r>
+          </w:p>
+        </w:tc>
+        <w:tc>
+          <w:tcPr>
+            <w:tcW w:type="dxa" w:w="4939"/>
+            <w:vAlign w:val="center"/>
+            <w:tcMar>
+              <w:top w:w="45" w:type="dxa"/>
+              <w:start w:w="120" w:type="dxa"/>
+              <w:bottom w:w="45" w:type="dxa"/>
+              <w:end w:w="120" w:type="dxa"/>
+            </w:tcMar>
+          </w:tcPr>
+          <w:p>
+            <w:pPr>
+              <w:spacing w:after="0"/>
+            </w:pPr>
+            <w:r>
+              <w:rPr>
+                <w:rFonts w:ascii="Calibri" w:hAnsi="Calibri" w:eastAsia="Microsoft JhengHei"/>
+                <w:b w:val="0"/>
+                <w:i w:val="0"/>
+                <w:sz w:val="17"/>
+              </w:rPr>
+              <w:t>固定模板、AI 草稿、工程師審查／核准、版本及 selected source</w:t>
             </w:r>
           </w:p>
         </w:tc>

</xml_diff>

<commit_message>
docs: record M10.3.1 company candidate validation
</commit_message>
<xml_diff>
--- a/docs/OMNICHECK_AI_BUILD_AND_OPERATIONS_GUIDE.docx
+++ b/docs/OMNICHECK_AI_BUILD_AND_OPERATIONS_GUIDE.docx
@@ -1618,7 +1618,7 @@
                 <w:i w:val="0"/>
                 <w:sz w:val="17"/>
               </w:rPr>
-              <w:t>85 tests、V4 manifest、台灣行動支付 14 檔／19 sections、QA/V4 QA、DOCX/PDF 與來源 hash 通過；待公司候選驗收</w:t>
+              <w:t>本機／公司 VM 85 tests；台灣行動支付 14 檔／19 sections、公司 ENGDB 3 檔／9 sections、QA/V4 QA、DOCX/PDF 與來源 hash 通過；待使用者驗收</w:t>
             </w:r>
           </w:p>
         </w:tc>
@@ -4534,7 +4534,7 @@
                 <w:i w:val="0"/>
                 <w:sz w:val="17"/>
               </w:rPr>
-              <w:t>功能分支完成、待公司驗收</w:t>
+              <w:t>公司候選完成、待使用者驗收</w:t>
             </w:r>
           </w:p>
         </w:tc>
@@ -15929,6 +15929,37 @@
           <w:i w:val="0"/>
         </w:rPr>
         <w:t>，不需 database downgrade。</w:t>
+      </w:r>
+    </w:p>
+    <w:p>
+      <w:pPr>
+        <w:pStyle w:val="ListBullet"/>
+      </w:pPr>
+      <w:r>
+        <w:rPr>
+          <w:rFonts w:ascii="Calibri" w:hAnsi="Calibri" w:eastAsia="Microsoft JhengHei"/>
+          <w:b w:val="0"/>
+          <w:i w:val="0"/>
+        </w:rPr>
+        <w:t xml:space="preserve">M10.3.1 公司候選 release </w:t>
+      </w:r>
+      <w:r>
+        <w:rPr>
+          <w:rFonts w:ascii="Consolas" w:hAnsi="Consolas" w:eastAsia="Microsoft JhengHei"/>
+          <w:b w:val="0"/>
+          <w:i w:val="0"/>
+          <w:color w:val="17365D"/>
+          <w:sz w:val="17"/>
+        </w:rPr>
+        <w:t>e56f043</w:t>
+      </w:r>
+      <w:r>
+        <w:rPr>
+          <w:rFonts w:ascii="Calibri" w:hAnsi="Calibri" w:eastAsia="Microsoft JhengHei"/>
+          <w:b w:val="0"/>
+          <w:i w:val="0"/>
+        </w:rPr>
+        <w:t>：Web／Worker／EDB health 正常，公司 VM 85 tests；ENGDB 三檔產生 9 個 deterministic Section items、QA/V4 QA、DOCX/PDF 與來源 hash 通過。切換前曾偵測另一個開發套件使用同一 shared venv，後續多人部署必須採 deploy lock／release owner。</w:t>
       </w:r>
     </w:p>
     <w:p>

</xml_diff>

<commit_message>
feat: integrate coworker UI with M10.3 backend
</commit_message>
<xml_diff>
--- a/docs/OMNICHECK_AI_BUILD_AND_OPERATIONS_GUIDE.docx
+++ b/docs/OMNICHECK_AI_BUILD_AND_OPERATIONS_GUIDE.docx
@@ -4454,7 +4454,7 @@
                 <w:i w:val="0"/>
                 <w:sz w:val="17"/>
               </w:rPr>
-              <w:t>等待前端需求</w:t>
+              <w:t>UI Adapter 候選版</w:t>
             </w:r>
           </w:p>
         </w:tc>
@@ -4480,7 +4480,26 @@
                 <w:i w:val="0"/>
                 <w:sz w:val="17"/>
               </w:rPr>
-              <w:t>既有前端 REST／OpenAPI 整合</w:t>
+              <w:t xml:space="preserve">同仁新版 UI 接既有 API 與 M10.3.1 後端；保留 </w:t>
+            </w:r>
+            <w:r>
+              <w:rPr>
+                <w:rFonts w:ascii="Consolas" w:hAnsi="Consolas" w:eastAsia="Microsoft JhengHei"/>
+                <w:b w:val="0"/>
+                <w:i w:val="0"/>
+                <w:color w:val="17365D"/>
+                <w:sz w:val="17"/>
+              </w:rPr>
+              <w:t>/classic</w:t>
+            </w:r>
+            <w:r>
+              <w:rPr>
+                <w:rFonts w:ascii="Calibri" w:hAnsi="Calibri" w:eastAsia="Microsoft JhengHei"/>
+                <w:b w:val="0"/>
+                <w:i w:val="0"/>
+                <w:sz w:val="17"/>
+              </w:rPr>
+              <w:t xml:space="preserve"> fallback</w:t>
             </w:r>
           </w:p>
         </w:tc>
@@ -11335,6 +11354,124 @@
       </w:r>
     </w:p>
     <w:p>
+      <w:r>
+        <w:rPr>
+          <w:rFonts w:ascii="Calibri" w:hAnsi="Calibri" w:eastAsia="Microsoft JhengHei"/>
+          <w:b w:val="0"/>
+          <w:i w:val="0"/>
+        </w:rPr>
+        <w:t>M10.2 UI Adapter 候選仍為 85 tests，因只新增 UI Adapter、路由與 fail-closed 畫面行為，未增加 migration 或更換 Pipeline。</w:t>
+      </w:r>
+      <w:r>
+        <w:rPr>
+          <w:rFonts w:ascii="Consolas" w:hAnsi="Consolas" w:eastAsia="Microsoft JhengHei"/>
+          <w:b w:val="0"/>
+          <w:i w:val="0"/>
+          <w:color w:val="17365D"/>
+          <w:sz w:val="17"/>
+        </w:rPr>
+        <w:t>/</w:t>
+      </w:r>
+      <w:r>
+        <w:rPr>
+          <w:rFonts w:ascii="Calibri" w:hAnsi="Calibri" w:eastAsia="Microsoft JhengHei"/>
+          <w:b w:val="0"/>
+          <w:i w:val="0"/>
+        </w:rPr>
+        <w:t xml:space="preserve"> 與 </w:t>
+      </w:r>
+      <w:r>
+        <w:rPr>
+          <w:rFonts w:ascii="Consolas" w:hAnsi="Consolas" w:eastAsia="Microsoft JhengHei"/>
+          <w:b w:val="0"/>
+          <w:i w:val="0"/>
+          <w:color w:val="17365D"/>
+          <w:sz w:val="17"/>
+        </w:rPr>
+        <w:t>/integrated</w:t>
+      </w:r>
+      <w:r>
+        <w:rPr>
+          <w:rFonts w:ascii="Calibri" w:hAnsi="Calibri" w:eastAsia="Microsoft JhengHei"/>
+          <w:b w:val="0"/>
+          <w:i w:val="0"/>
+        </w:rPr>
+        <w:t xml:space="preserve"> 為新版介面，</w:t>
+      </w:r>
+      <w:r>
+        <w:rPr>
+          <w:rFonts w:ascii="Consolas" w:hAnsi="Consolas" w:eastAsia="Microsoft JhengHei"/>
+          <w:b w:val="0"/>
+          <w:i w:val="0"/>
+          <w:color w:val="17365D"/>
+          <w:sz w:val="17"/>
+        </w:rPr>
+        <w:t>/classic</w:t>
+      </w:r>
+      <w:r>
+        <w:rPr>
+          <w:rFonts w:ascii="Calibri" w:hAnsi="Calibri" w:eastAsia="Microsoft JhengHei"/>
+          <w:b w:val="0"/>
+          <w:i w:val="0"/>
+        </w:rPr>
+        <w:t xml:space="preserve"> 為原介面 fallback。第一階段不得部署同仁版本的 Login/RBAC、Knowledge/CVE、GPDB、</w:t>
+      </w:r>
+      <w:r>
+        <w:rPr>
+          <w:rFonts w:ascii="Consolas" w:hAnsi="Consolas" w:eastAsia="Microsoft JhengHei"/>
+          <w:b w:val="0"/>
+          <w:i w:val="0"/>
+          <w:color w:val="17365D"/>
+          <w:sz w:val="17"/>
+        </w:rPr>
+        <w:t>0005</w:t>
+      </w:r>
+      <w:r>
+        <w:rPr>
+          <w:rFonts w:ascii="Calibri" w:hAnsi="Calibri" w:eastAsia="Microsoft JhengHei"/>
+          <w:b w:val="0"/>
+          <w:i w:val="0"/>
+        </w:rPr>
+        <w:t>～</w:t>
+      </w:r>
+      <w:r>
+        <w:rPr>
+          <w:rFonts w:ascii="Consolas" w:hAnsi="Consolas" w:eastAsia="Microsoft JhengHei"/>
+          <w:b w:val="0"/>
+          <w:i w:val="0"/>
+          <w:color w:val="17365D"/>
+          <w:sz w:val="17"/>
+        </w:rPr>
+        <w:t>0007</w:t>
+      </w:r>
+      <w:r>
+        <w:rPr>
+          <w:rFonts w:ascii="Calibri" w:hAnsi="Calibri" w:eastAsia="Microsoft JhengHei"/>
+          <w:b w:val="0"/>
+          <w:i w:val="0"/>
+        </w:rPr>
+        <w:t xml:space="preserve"> migration 或整份 </w:t>
+      </w:r>
+      <w:r>
+        <w:rPr>
+          <w:rFonts w:ascii="Consolas" w:hAnsi="Consolas" w:eastAsia="Microsoft JhengHei"/>
+          <w:b w:val="0"/>
+          <w:i w:val="0"/>
+          <w:color w:val="17365D"/>
+          <w:sz w:val="17"/>
+        </w:rPr>
+        <w:t>web.py</w:t>
+      </w:r>
+      <w:r>
+        <w:rPr>
+          <w:rFonts w:ascii="Calibri" w:hAnsi="Calibri" w:eastAsia="Microsoft JhengHei"/>
+          <w:b w:val="0"/>
+          <w:i w:val="0"/>
+        </w:rPr>
+        <w:t>。</w:t>
+      </w:r>
+    </w:p>
+    <w:p>
       <w:pPr>
         <w:pStyle w:val="Heading3"/>
       </w:pPr>
@@ -15972,7 +16109,61 @@
           <w:b w:val="0"/>
           <w:i w:val="0"/>
         </w:rPr>
-        <w:t>台灣行動支付實際資料在 SCRAM 重啟後通過 13 inputs／13 outputs、QA 8/8、V4 QA、29 頁 PDF 與來源 SHA-256 不變。</w:t>
+        <w:t xml:space="preserve">M10.2 同仁 UI Adapter 候選：同仁 Bundle 與公司 VM 保存版 185 個檔案逐檔 SHA-256 相同；整合分支 85 tests 與 Browser layout 通過。尚未切換公司 </w:t>
+      </w:r>
+      <w:r>
+        <w:rPr>
+          <w:rFonts w:ascii="Consolas" w:hAnsi="Consolas" w:eastAsia="Microsoft JhengHei"/>
+          <w:b w:val="0"/>
+          <w:i w:val="0"/>
+          <w:color w:val="17365D"/>
+          <w:sz w:val="17"/>
+        </w:rPr>
+        <w:t>current</w:t>
+      </w:r>
+      <w:r>
+        <w:rPr>
+          <w:rFonts w:ascii="Calibri" w:hAnsi="Calibri" w:eastAsia="Microsoft JhengHei"/>
+          <w:b w:val="0"/>
+          <w:i w:val="0"/>
+        </w:rPr>
+        <w:t xml:space="preserve">，公司 E2E 與使用者驗收待執行；rollback 為 </w:t>
+      </w:r>
+      <w:r>
+        <w:rPr>
+          <w:rFonts w:ascii="Consolas" w:hAnsi="Consolas" w:eastAsia="Microsoft JhengHei"/>
+          <w:b w:val="0"/>
+          <w:i w:val="0"/>
+          <w:color w:val="17365D"/>
+          <w:sz w:val="17"/>
+        </w:rPr>
+        <w:t>/classic</w:t>
+      </w:r>
+      <w:r>
+        <w:rPr>
+          <w:rFonts w:ascii="Calibri" w:hAnsi="Calibri" w:eastAsia="Microsoft JhengHei"/>
+          <w:b w:val="0"/>
+          <w:i w:val="0"/>
+        </w:rPr>
+        <w:t xml:space="preserve"> 或 application release </w:t>
+      </w:r>
+      <w:r>
+        <w:rPr>
+          <w:rFonts w:ascii="Consolas" w:hAnsi="Consolas" w:eastAsia="Microsoft JhengHei"/>
+          <w:b w:val="0"/>
+          <w:i w:val="0"/>
+          <w:color w:val="17365D"/>
+          <w:sz w:val="17"/>
+        </w:rPr>
+        <w:t>e56f043</w:t>
+      </w:r>
+      <w:r>
+        <w:rPr>
+          <w:rFonts w:ascii="Calibri" w:hAnsi="Calibri" w:eastAsia="Microsoft JhengHei"/>
+          <w:b w:val="0"/>
+          <w:i w:val="0"/>
+        </w:rPr>
+        <w:t>，無 database downgrade。</w:t>
       </w:r>
     </w:p>
     <w:p>
@@ -15981,39 +16172,11 @@
       </w:pPr>
       <w:r>
         <w:rPr>
-          <w:rFonts w:ascii="Consolas" w:hAnsi="Consolas" w:eastAsia="Microsoft JhengHei"/>
-          <w:b w:val="0"/>
-          <w:i w:val="0"/>
-          <w:color w:val="17365D"/>
-          <w:sz w:val="17"/>
-        </w:rPr>
-        <w:t>.81</w:t>
-      </w:r>
-      <w:r>
-        <w:rPr>
-          <w:rFonts w:ascii="Calibri" w:hAnsi="Calibri" w:eastAsia="Microsoft JhengHei"/>
-          <w:b w:val="0"/>
-          <w:i w:val="0"/>
-        </w:rPr>
-        <w:t xml:space="preserve"> 的 OMNIcheck 精確規則已要求 SCRAM；cluster-wide </w:t>
-      </w:r>
-      <w:r>
-        <w:rPr>
-          <w:rFonts w:ascii="Consolas" w:hAnsi="Consolas" w:eastAsia="Microsoft JhengHei"/>
-          <w:b w:val="0"/>
-          <w:i w:val="0"/>
-          <w:color w:val="17365D"/>
-          <w:sz w:val="17"/>
-        </w:rPr>
-        <w:t>host all all 0.0.0.0/0 trust</w:t>
-      </w:r>
-      <w:r>
-        <w:rPr>
-          <w:rFonts w:ascii="Calibri" w:hAnsi="Calibri" w:eastAsia="Microsoft JhengHei"/>
-          <w:b w:val="0"/>
-          <w:i w:val="0"/>
-        </w:rPr>
-        <w:t xml:space="preserve"> 仍是其他連線的安全風險，需另案收斂。</w:t>
+          <w:rFonts w:ascii="Calibri" w:hAnsi="Calibri" w:eastAsia="Microsoft JhengHei"/>
+          <w:b w:val="0"/>
+          <w:i w:val="0"/>
+        </w:rPr>
+        <w:t>台灣行動支付實際資料在 SCRAM 重啟後通過 13 inputs／13 outputs、QA 8/8、V4 QA、29 頁 PDF 與來源 SHA-256 不變。</w:t>
       </w:r>
     </w:p>
     <w:p>
@@ -16022,11 +16185,39 @@
       </w:pPr>
       <w:r>
         <w:rPr>
-          <w:rFonts w:ascii="Calibri" w:hAnsi="Calibri" w:eastAsia="Microsoft JhengHei"/>
-          <w:b w:val="0"/>
-          <w:i w:val="0"/>
-        </w:rPr>
-        <w:t>兩次修正前 API 500 留下兩筆空的 draft Golden 測試案件；尚未執行破壞性清除。</w:t>
+          <w:rFonts w:ascii="Consolas" w:hAnsi="Consolas" w:eastAsia="Microsoft JhengHei"/>
+          <w:b w:val="0"/>
+          <w:i w:val="0"/>
+          <w:color w:val="17365D"/>
+          <w:sz w:val="17"/>
+        </w:rPr>
+        <w:t>.81</w:t>
+      </w:r>
+      <w:r>
+        <w:rPr>
+          <w:rFonts w:ascii="Calibri" w:hAnsi="Calibri" w:eastAsia="Microsoft JhengHei"/>
+          <w:b w:val="0"/>
+          <w:i w:val="0"/>
+        </w:rPr>
+        <w:t xml:space="preserve"> 的 OMNIcheck 精確規則已要求 SCRAM；cluster-wide </w:t>
+      </w:r>
+      <w:r>
+        <w:rPr>
+          <w:rFonts w:ascii="Consolas" w:hAnsi="Consolas" w:eastAsia="Microsoft JhengHei"/>
+          <w:b w:val="0"/>
+          <w:i w:val="0"/>
+          <w:color w:val="17365D"/>
+          <w:sz w:val="17"/>
+        </w:rPr>
+        <w:t>host all all 0.0.0.0/0 trust</w:t>
+      </w:r>
+      <w:r>
+        <w:rPr>
+          <w:rFonts w:ascii="Calibri" w:hAnsi="Calibri" w:eastAsia="Microsoft JhengHei"/>
+          <w:b w:val="0"/>
+          <w:i w:val="0"/>
+        </w:rPr>
+        <w:t xml:space="preserve"> 仍是其他連線的安全風險，需另案收斂。</w:t>
       </w:r>
     </w:p>
     <w:p>
@@ -16039,7 +16230,7 @@
           <w:b w:val="0"/>
           <w:i w:val="0"/>
         </w:rPr>
-        <w:t>正式 TLS/VIP、EFM failover、reverse proxy、登入／RBAC 尚未完成。</w:t>
+        <w:t>兩次修正前 API 500 留下兩筆空的 draft Golden 測試案件；尚未執行破壞性清除。</w:t>
       </w:r>
     </w:p>
     <w:p>
@@ -16052,7 +16243,7 @@
           <w:b w:val="0"/>
           <w:i w:val="0"/>
         </w:rPr>
-        <w:t>M10 可對標準搜集包提出角色候選；非標準檔名、缺少 EFM／OS 訊號或衝突時仍需使用者指定，且所有案件都必須人工確認。</w:t>
+        <w:t>正式 TLS/VIP、EFM failover、reverse proxy、登入／RBAC 尚未完成。</w:t>
       </w:r>
     </w:p>
     <w:p>
@@ -16065,7 +16256,7 @@
           <w:b w:val="0"/>
           <w:i w:val="0"/>
         </w:rPr>
-        <w:t>Barman 真實 wrapper fixture 待提供。</w:t>
+        <w:t>M10 可對標準搜集包提出角色候選；非標準檔名、缺少 EFM／OS 訊號或衝突時仍需使用者指定，且所有案件都必須人工確認。</w:t>
       </w:r>
     </w:p>
     <w:p>
@@ -16078,7 +16269,7 @@
           <w:b w:val="0"/>
           <w:i w:val="0"/>
         </w:rPr>
-        <w:t>Python dependency 目前為 version ranges，正式 reproducible build 尚需 lock／wheelhouse。</w:t>
+        <w:t>Barman 真實 wrapper fixture 待提供。</w:t>
       </w:r>
     </w:p>
     <w:p>
@@ -16091,7 +16282,20 @@
           <w:b w:val="0"/>
           <w:i w:val="0"/>
         </w:rPr>
-        <w:t xml:space="preserve">前端整合、Section 審核、歷史比較、CVE cache 與 Ollama AI Gateway 尚未實作；順序與責任邊界見 </w:t>
+        <w:t>Python dependency 目前為 version ranges，正式 reproducible build 尚需 lock／wheelhouse。</w:t>
+      </w:r>
+    </w:p>
+    <w:p>
+      <w:pPr>
+        <w:pStyle w:val="ListBullet"/>
+      </w:pPr>
+      <w:r>
+        <w:rPr>
+          <w:rFonts w:ascii="Calibri" w:hAnsi="Calibri" w:eastAsia="Microsoft JhengHei"/>
+          <w:b w:val="0"/>
+          <w:i w:val="0"/>
+        </w:rPr>
+        <w:t xml:space="preserve">同仁 UI Adapter 已進入候選驗證；Section persistence/API、歷史比較、CVE cache 與 Ollama AI Gateway 尚未完成，順序與責任邊界見 </w:t>
       </w:r>
       <w:r>
         <w:rPr>

</xml_diff>

<commit_message>
docs: record coworker UI candidate validation
</commit_message>
<xml_diff>
--- a/docs/OMNICHECK_AI_BUILD_AND_OPERATIONS_GUIDE.docx
+++ b/docs/OMNICHECK_AI_BUILD_AND_OPERATIONS_GUIDE.docx
@@ -11468,7 +11468,25 @@
           <w:b w:val="0"/>
           <w:i w:val="0"/>
         </w:rPr>
-        <w:t>。</w:t>
+        <w:t xml:space="preserve">。公司 VM 隔離 release </w:t>
+      </w:r>
+      <w:r>
+        <w:rPr>
+          <w:rFonts w:ascii="Consolas" w:hAnsi="Consolas" w:eastAsia="Microsoft JhengHei"/>
+          <w:b w:val="0"/>
+          <w:i w:val="0"/>
+          <w:color w:val="17365D"/>
+          <w:sz w:val="17"/>
+        </w:rPr>
+        <w:t>59eff13</w:t>
+      </w:r>
+      <w:r>
+        <w:rPr>
+          <w:rFonts w:ascii="Calibri" w:hAnsi="Calibri" w:eastAsia="Microsoft JhengHei"/>
+          <w:b w:val="0"/>
+          <w:i w:val="0"/>
+        </w:rPr>
+        <w:t xml:space="preserve"> 已通過 85 tests、EDB/external-worker health 與台灣行動支付 13 inputs／14 outputs、QA/V4 QA、Section Workflow、DOCX/PDF；來源 SHA-256 前後一致。</w:t>
       </w:r>
     </w:p>
     <w:p>
@@ -16109,7 +16127,7 @@
           <w:b w:val="0"/>
           <w:i w:val="0"/>
         </w:rPr>
-        <w:t xml:space="preserve">M10.2 同仁 UI Adapter 候選：同仁 Bundle 與公司 VM 保存版 185 個檔案逐檔 SHA-256 相同；整合分支 85 tests 與 Browser layout 通過。尚未切換公司 </w:t>
+        <w:t xml:space="preserve">M10.2 同仁 UI Adapter 候選：同仁 Bundle 與公司 VM 保存版 185 個檔案逐檔 SHA-256 相同；整合分支與 VM 隔離 release </w:t>
       </w:r>
       <w:r>
         <w:rPr>
@@ -16119,6 +16137,24 @@
           <w:color w:val="17365D"/>
           <w:sz w:val="17"/>
         </w:rPr>
+        <w:t>59eff13</w:t>
+      </w:r>
+      <w:r>
+        <w:rPr>
+          <w:rFonts w:ascii="Calibri" w:hAnsi="Calibri" w:eastAsia="Microsoft JhengHei"/>
+          <w:b w:val="0"/>
+          <w:i w:val="0"/>
+        </w:rPr>
+        <w:t xml:space="preserve"> 各 85 tests，Browser layout、EDB/external-worker health 與台灣行動支付 13 inputs／14 outputs、QA/V4 QA、Section Workflow、DOCX/PDF 均通過，來源 hash 前後相同。尚未切換公司 </w:t>
+      </w:r>
+      <w:r>
+        <w:rPr>
+          <w:rFonts w:ascii="Consolas" w:hAnsi="Consolas" w:eastAsia="Microsoft JhengHei"/>
+          <w:b w:val="0"/>
+          <w:i w:val="0"/>
+          <w:color w:val="17365D"/>
+          <w:sz w:val="17"/>
+        </w:rPr>
         <w:t>current</w:t>
       </w:r>
       <w:r>
@@ -16127,7 +16163,7 @@
           <w:b w:val="0"/>
           <w:i w:val="0"/>
         </w:rPr>
-        <w:t xml:space="preserve">，公司 E2E 與使用者驗收待執行；rollback 為 </w:t>
+        <w:t xml:space="preserve">；shared editable venv 不得直接重裝，正式切換前需 per-release venv／systemd release owner。rollback 為 </w:t>
       </w:r>
       <w:r>
         <w:rPr>

</xml_diff>

<commit_message>
ops: isolate web and worker runtime per release
</commit_message>
<xml_diff>
--- a/docs/OMNICHECK_AI_BUILD_AND_OPERATIONS_GUIDE.docx
+++ b/docs/OMNICHECK_AI_BUILD_AND_OPERATIONS_GUIDE.docx
@@ -11486,7 +11486,61 @@
           <w:b w:val="0"/>
           <w:i w:val="0"/>
         </w:rPr>
-        <w:t xml:space="preserve"> 已通過 85 tests、EDB/external-worker health 與台灣行動支付 13 inputs／14 outputs、QA/V4 QA、Section Workflow、DOCX/PDF；來源 SHA-256 前後一致。</w:t>
+        <w:t xml:space="preserve"> 已建立獨立 </w:t>
+      </w:r>
+      <w:r>
+        <w:rPr>
+          <w:rFonts w:ascii="Consolas" w:hAnsi="Consolas" w:eastAsia="Microsoft JhengHei"/>
+          <w:b w:val="0"/>
+          <w:i w:val="0"/>
+          <w:color w:val="17365D"/>
+          <w:sz w:val="17"/>
+        </w:rPr>
+        <w:t>.venv</w:t>
+      </w:r>
+      <w:r>
+        <w:rPr>
+          <w:rFonts w:ascii="Calibri" w:hAnsi="Calibri" w:eastAsia="Microsoft JhengHei"/>
+          <w:b w:val="0"/>
+          <w:i w:val="0"/>
+        </w:rPr>
+        <w:t xml:space="preserve"> 並通過 85 tests、EDB/external-worker health 與台灣行動支付 13 inputs／14 outputs、QA/V4 QA、Section Workflow、DOCX/PDF；來源 SHA-256 前後一致。Web／Worker systemd 必須改用 </w:t>
+      </w:r>
+      <w:r>
+        <w:rPr>
+          <w:rFonts w:ascii="Consolas" w:hAnsi="Consolas" w:eastAsia="Microsoft JhengHei"/>
+          <w:b w:val="0"/>
+          <w:i w:val="0"/>
+          <w:color w:val="17365D"/>
+          <w:sz w:val="17"/>
+        </w:rPr>
+        <w:t>current/.venv</w:t>
+      </w:r>
+      <w:r>
+        <w:rPr>
+          <w:rFonts w:ascii="Calibri" w:hAnsi="Calibri" w:eastAsia="Microsoft JhengHei"/>
+          <w:b w:val="0"/>
+          <w:i w:val="0"/>
+        </w:rPr>
+        <w:t xml:space="preserve">，切換時持有 </w:t>
+      </w:r>
+      <w:r>
+        <w:rPr>
+          <w:rFonts w:ascii="Consolas" w:hAnsi="Consolas" w:eastAsia="Microsoft JhengHei"/>
+          <w:b w:val="0"/>
+          <w:i w:val="0"/>
+          <w:color w:val="17365D"/>
+          <w:sz w:val="17"/>
+        </w:rPr>
+        <w:t>/data/omnicheck/app/deploy.lock</w:t>
+      </w:r>
+      <w:r>
+        <w:rPr>
+          <w:rFonts w:ascii="Calibri" w:hAnsi="Calibri" w:eastAsia="Microsoft JhengHei"/>
+          <w:b w:val="0"/>
+          <w:i w:val="0"/>
+        </w:rPr>
+        <w:t xml:space="preserve"> 並保存 owner／commit／previous／rollback metadata。</w:t>
       </w:r>
     </w:p>
     <w:p>

</xml_diff>

<commit_message>
docs: record M10.2 company candidate deployment
</commit_message>
<xml_diff>
--- a/docs/OMNICHECK_AI_BUILD_AND_OPERATIONS_GUIDE.docx
+++ b/docs/OMNICHECK_AI_BUILD_AND_OPERATIONS_GUIDE.docx
@@ -1513,6 +1513,131 @@
                 <w:sz w:val="17"/>
               </w:rPr>
               <w:t>驗證狀態</w:t>
+            </w:r>
+          </w:p>
+        </w:tc>
+      </w:tr>
+      <w:tr>
+        <w:tc>
+          <w:tcPr>
+            <w:tcW w:type="dxa" w:w="2470"/>
+            <w:vAlign w:val="center"/>
+            <w:tcMar>
+              <w:top w:w="45" w:type="dxa"/>
+              <w:start w:w="120" w:type="dxa"/>
+              <w:bottom w:w="45" w:type="dxa"/>
+              <w:end w:w="120" w:type="dxa"/>
+            </w:tcMar>
+          </w:tcPr>
+          <w:p>
+            <w:pPr>
+              <w:spacing w:after="0"/>
+            </w:pPr>
+            <w:r>
+              <w:rPr>
+                <w:rFonts w:ascii="Calibri" w:hAnsi="Calibri" w:eastAsia="Microsoft JhengHei"/>
+                <w:b w:val="0"/>
+                <w:i w:val="0"/>
+                <w:sz w:val="17"/>
+              </w:rPr>
+              <w:t>0.10.3-draft.2</w:t>
+            </w:r>
+          </w:p>
+        </w:tc>
+        <w:tc>
+          <w:tcPr>
+            <w:tcW w:type="dxa" w:w="2470"/>
+            <w:vAlign w:val="center"/>
+            <w:tcMar>
+              <w:top w:w="45" w:type="dxa"/>
+              <w:start w:w="120" w:type="dxa"/>
+              <w:bottom w:w="45" w:type="dxa"/>
+              <w:end w:w="120" w:type="dxa"/>
+            </w:tcMar>
+          </w:tcPr>
+          <w:p>
+            <w:pPr>
+              <w:spacing w:after="0"/>
+            </w:pPr>
+            <w:r>
+              <w:rPr>
+                <w:rFonts w:ascii="Calibri" w:hAnsi="Calibri" w:eastAsia="Microsoft JhengHei"/>
+                <w:b w:val="0"/>
+                <w:i w:val="0"/>
+                <w:sz w:val="17"/>
+              </w:rPr>
+              <w:t>2026-08-11</w:t>
+            </w:r>
+          </w:p>
+        </w:tc>
+        <w:tc>
+          <w:tcPr>
+            <w:tcW w:type="dxa" w:w="2470"/>
+            <w:vAlign w:val="center"/>
+            <w:tcMar>
+              <w:top w:w="45" w:type="dxa"/>
+              <w:start w:w="120" w:type="dxa"/>
+              <w:bottom w:w="45" w:type="dxa"/>
+              <w:end w:w="120" w:type="dxa"/>
+            </w:tcMar>
+          </w:tcPr>
+          <w:p>
+            <w:pPr>
+              <w:spacing w:after="0"/>
+            </w:pPr>
+            <w:r>
+              <w:rPr>
+                <w:rFonts w:ascii="Calibri" w:hAnsi="Calibri" w:eastAsia="Microsoft JhengHei"/>
+                <w:b w:val="0"/>
+                <w:i w:val="0"/>
+                <w:sz w:val="17"/>
+              </w:rPr>
+              <w:t>同仁 UI Adapter 公司候選部署、per-release venv、systemd release isolation、deploy lock／owner</w:t>
+            </w:r>
+          </w:p>
+        </w:tc>
+        <w:tc>
+          <w:tcPr>
+            <w:tcW w:type="dxa" w:w="2470"/>
+            <w:vAlign w:val="center"/>
+            <w:tcMar>
+              <w:top w:w="45" w:type="dxa"/>
+              <w:start w:w="120" w:type="dxa"/>
+              <w:bottom w:w="45" w:type="dxa"/>
+              <w:end w:w="120" w:type="dxa"/>
+            </w:tcMar>
+          </w:tcPr>
+          <w:p>
+            <w:pPr>
+              <w:spacing w:after="0"/>
+            </w:pPr>
+            <w:r>
+              <w:rPr>
+                <w:rFonts w:ascii="Calibri" w:hAnsi="Calibri" w:eastAsia="Microsoft JhengHei"/>
+                <w:b w:val="0"/>
+                <w:i w:val="0"/>
+                <w:sz w:val="17"/>
+              </w:rPr>
+              <w:t xml:space="preserve">公司 release </w:t>
+            </w:r>
+            <w:r>
+              <w:rPr>
+                <w:rFonts w:ascii="Consolas" w:hAnsi="Consolas" w:eastAsia="Microsoft JhengHei"/>
+                <w:b w:val="0"/>
+                <w:i w:val="0"/>
+                <w:color w:val="17365D"/>
+                <w:sz w:val="17"/>
+              </w:rPr>
+              <w:t>a0582a0</w:t>
+            </w:r>
+            <w:r>
+              <w:rPr>
+                <w:rFonts w:ascii="Calibri" w:hAnsi="Calibri" w:eastAsia="Microsoft JhengHei"/>
+                <w:b w:val="0"/>
+                <w:i w:val="0"/>
+                <w:sz w:val="17"/>
+              </w:rPr>
+              <w:t xml:space="preserve"> 87 tests；Golden Web → EDB Queue → Worker → V4、QA、重啟持久性通過；待使用者驗收</w:t>
             </w:r>
           </w:p>
         </w:tc>
@@ -4454,7 +4579,7 @@
                 <w:i w:val="0"/>
                 <w:sz w:val="17"/>
               </w:rPr>
-              <w:t>UI Adapter 候選版</w:t>
+              <w:t>公司候選已部署、待使用者驗收</w:t>
             </w:r>
           </w:p>
         </w:tc>
@@ -4499,7 +4624,7 @@
                 <w:i w:val="0"/>
                 <w:sz w:val="17"/>
               </w:rPr>
-              <w:t xml:space="preserve"> fallback</w:t>
+              <w:t xml:space="preserve"> fallback；per-release venv／deploy lock</w:t>
             </w:r>
           </w:p>
         </w:tc>
@@ -11360,7 +11485,7 @@
           <w:b w:val="0"/>
           <w:i w:val="0"/>
         </w:rPr>
-        <w:t>M10.2 UI Adapter 候選仍為 85 tests，因只新增 UI Adapter、路由與 fail-closed 畫面行為，未增加 migration 或更換 Pipeline。</w:t>
+        <w:t>M10.2 UI Adapter 公司候選為 87 tests，新增 UI Adapter、路由、fail-closed 畫面行為與 deployment contract tests，未增加 migration 或更換 Pipeline。</w:t>
       </w:r>
       <w:r>
         <w:rPr>
@@ -11468,7 +11593,7 @@
           <w:b w:val="0"/>
           <w:i w:val="0"/>
         </w:rPr>
-        <w:t xml:space="preserve">。公司 VM 隔離 release </w:t>
+        <w:t xml:space="preserve">。公司 release </w:t>
       </w:r>
       <w:r>
         <w:rPr>
@@ -11478,15 +11603,15 @@
           <w:color w:val="17365D"/>
           <w:sz w:val="17"/>
         </w:rPr>
-        <w:t>59eff13</w:t>
-      </w:r>
-      <w:r>
-        <w:rPr>
-          <w:rFonts w:ascii="Calibri" w:hAnsi="Calibri" w:eastAsia="Microsoft JhengHei"/>
-          <w:b w:val="0"/>
-          <w:i w:val="0"/>
-        </w:rPr>
-        <w:t xml:space="preserve"> 已建立獨立 </w:t>
+        <w:t>a0582a0</w:t>
+      </w:r>
+      <w:r>
+        <w:rPr>
+          <w:rFonts w:ascii="Calibri" w:hAnsi="Calibri" w:eastAsia="Microsoft JhengHei"/>
+          <w:b w:val="0"/>
+          <w:i w:val="0"/>
+        </w:rPr>
+        <w:t xml:space="preserve"> 使用獨立 </w:t>
       </w:r>
       <w:r>
         <w:rPr>
@@ -11504,7 +11629,7 @@
           <w:b w:val="0"/>
           <w:i w:val="0"/>
         </w:rPr>
-        <w:t xml:space="preserve"> 並通過 85 tests、EDB/external-worker health 與台灣行動支付 13 inputs／14 outputs、QA/V4 QA、Section Workflow、DOCX/PDF；來源 SHA-256 前後一致。Web／Worker systemd 必須改用 </w:t>
+        <w:t xml:space="preserve">，Web／Worker systemd 已改用 </w:t>
       </w:r>
       <w:r>
         <w:rPr>
@@ -11522,7 +11647,7 @@
           <w:b w:val="0"/>
           <w:i w:val="0"/>
         </w:rPr>
-        <w:t xml:space="preserve">，切換時持有 </w:t>
+        <w:t xml:space="preserve">；切換時持有 </w:t>
       </w:r>
       <w:r>
         <w:rPr>
@@ -11540,7 +11665,43 @@
           <w:b w:val="0"/>
           <w:i w:val="0"/>
         </w:rPr>
-        <w:t xml:space="preserve"> 並保存 owner／commit／previous／rollback metadata。</w:t>
+        <w:t xml:space="preserve"> 並保存 owner／commit／previous／rollback metadata。Golden Job </w:t>
+      </w:r>
+      <w:r>
+        <w:rPr>
+          <w:rFonts w:ascii="Consolas" w:hAnsi="Consolas" w:eastAsia="Microsoft JhengHei"/>
+          <w:b w:val="0"/>
+          <w:i w:val="0"/>
+          <w:color w:val="17365D"/>
+          <w:sz w:val="17"/>
+        </w:rPr>
+        <w:t>2a8d40b0727c41119236fd6642cd2ec2</w:t>
+      </w:r>
+      <w:r>
+        <w:rPr>
+          <w:rFonts w:ascii="Calibri" w:hAnsi="Calibri" w:eastAsia="Microsoft JhengHei"/>
+          <w:b w:val="0"/>
+          <w:i w:val="0"/>
+        </w:rPr>
+        <w:t xml:space="preserve"> 已完成 Web → EDB Queue → Worker → 12 個 Canonical/V4 產物，QA/V4 QA 均允許交付，服務重啟後案件仍可由 EDB 讀回。公司 EDB revision </w:t>
+      </w:r>
+      <w:r>
+        <w:rPr>
+          <w:rFonts w:ascii="Consolas" w:hAnsi="Consolas" w:eastAsia="Microsoft JhengHei"/>
+          <w:b w:val="0"/>
+          <w:i w:val="0"/>
+          <w:color w:val="17365D"/>
+          <w:sz w:val="17"/>
+        </w:rPr>
+        <w:t>0007_m13_catalog</w:t>
+      </w:r>
+      <w:r>
+        <w:rPr>
+          <w:rFonts w:ascii="Calibri" w:hAnsi="Calibri" w:eastAsia="Microsoft JhengHei"/>
+          <w:b w:val="0"/>
+          <w:i w:val="0"/>
+        </w:rPr>
+        <w:t xml:space="preserve"> 並非本分支 migration head，本次未執行 migration 或 downgrade；待 schema reconciliation 後才進行 Section persistence/API。</w:t>
       </w:r>
     </w:p>
     <w:p>
@@ -16181,7 +16342,7 @@
           <w:b w:val="0"/>
           <w:i w:val="0"/>
         </w:rPr>
-        <w:t xml:space="preserve">M10.2 同仁 UI Adapter 候選：同仁 Bundle 與公司 VM 保存版 185 個檔案逐檔 SHA-256 相同；整合分支與 VM 隔離 release </w:t>
+        <w:t xml:space="preserve">M10.2 同仁 UI Adapter 公司候選已部署：同仁 Bundle 與公司 VM 保存版 185 個檔案逐檔 SHA-256 相同；release </w:t>
       </w:r>
       <w:r>
         <w:rPr>
@@ -16191,15 +16352,15 @@
           <w:color w:val="17365D"/>
           <w:sz w:val="17"/>
         </w:rPr>
-        <w:t>59eff13</w:t>
-      </w:r>
-      <w:r>
-        <w:rPr>
-          <w:rFonts w:ascii="Calibri" w:hAnsi="Calibri" w:eastAsia="Microsoft JhengHei"/>
-          <w:b w:val="0"/>
-          <w:i w:val="0"/>
-        </w:rPr>
-        <w:t xml:space="preserve"> 各 85 tests，Browser layout、EDB/external-worker health 與台灣行動支付 13 inputs／14 outputs、QA/V4 QA、Section Workflow、DOCX/PDF 均通過，來源 hash 前後相同。尚未切換公司 </w:t>
+        <w:t>a0582a0</w:t>
+      </w:r>
+      <w:r>
+        <w:rPr>
+          <w:rFonts w:ascii="Calibri" w:hAnsi="Calibri" w:eastAsia="Microsoft JhengHei"/>
+          <w:b w:val="0"/>
+          <w:i w:val="0"/>
+        </w:rPr>
+        <w:t xml:space="preserve"> 以 per-release venv 執行並通過 87 tests，systemd、deploy lock／owner、Browser layout、台灣行動支付 immutable 資料與 Golden E2E 均通過。Golden Job </w:t>
       </w:r>
       <w:r>
         <w:rPr>
@@ -16209,15 +16370,15 @@
           <w:color w:val="17365D"/>
           <w:sz w:val="17"/>
         </w:rPr>
-        <w:t>current</w:t>
-      </w:r>
-      <w:r>
-        <w:rPr>
-          <w:rFonts w:ascii="Calibri" w:hAnsi="Calibri" w:eastAsia="Microsoft JhengHei"/>
-          <w:b w:val="0"/>
-          <w:i w:val="0"/>
-        </w:rPr>
-        <w:t xml:space="preserve">；shared editable venv 不得直接重裝，正式切換前需 per-release venv／systemd release owner。rollback 為 </w:t>
+        <w:t>2a8d40b0727c41119236fd6642cd2ec2</w:t>
+      </w:r>
+      <w:r>
+        <w:rPr>
+          <w:rFonts w:ascii="Calibri" w:hAnsi="Calibri" w:eastAsia="Microsoft JhengHei"/>
+          <w:b w:val="0"/>
+          <w:i w:val="0"/>
+        </w:rPr>
+        <w:t xml:space="preserve"> 產生 12 個 Canonical/V4 產物，QA/V4 QA 允許交付，服務重啟後 EDB persistence 正常。rollback 為 </w:t>
       </w:r>
       <w:r>
         <w:rPr>
@@ -16253,7 +16414,25 @@
           <w:b w:val="0"/>
           <w:i w:val="0"/>
         </w:rPr>
-        <w:t>，無 database downgrade。</w:t>
+        <w:t xml:space="preserve">，無 database downgrade；EDB </w:t>
+      </w:r>
+      <w:r>
+        <w:rPr>
+          <w:rFonts w:ascii="Consolas" w:hAnsi="Consolas" w:eastAsia="Microsoft JhengHei"/>
+          <w:b w:val="0"/>
+          <w:i w:val="0"/>
+          <w:color w:val="17365D"/>
+          <w:sz w:val="17"/>
+        </w:rPr>
+        <w:t>0007_m13_catalog</w:t>
+      </w:r>
+      <w:r>
+        <w:rPr>
+          <w:rFonts w:ascii="Calibri" w:hAnsi="Calibri" w:eastAsia="Microsoft JhengHei"/>
+          <w:b w:val="0"/>
+          <w:i w:val="0"/>
+        </w:rPr>
+        <w:t xml:space="preserve"> schema reconciliation 仍待處理。</w:t>
       </w:r>
     </w:p>
     <w:p>

</xml_diff>

<commit_message>
fix: require explicit database evidence source
</commit_message>
<xml_diff>
--- a/docs/OMNICHECK_AI_BUILD_AND_OPERATIONS_GUIDE.docx
+++ b/docs/OMNICHECK_AI_BUILD_AND_OPERATIONS_GUIDE.docx
@@ -11485,7 +11485,7 @@
           <w:b w:val="0"/>
           <w:i w:val="0"/>
         </w:rPr>
-        <w:t>M10.2 UI Adapter 公司候選為 87 tests，新增 UI Adapter、路由、fail-closed 畫面行為與 deployment contract tests，未增加 migration 或更換 Pipeline。</w:t>
+        <w:t>M10.2 UI Adapter 公司候選為 88 tests，新增 UI Adapter、路由、fail-closed 畫面行為與 deployment contract tests，未增加 migration 或更換 Pipeline。</w:t>
       </w:r>
       <w:r>
         <w:rPr>
@@ -11593,7 +11593,7 @@
           <w:b w:val="0"/>
           <w:i w:val="0"/>
         </w:rPr>
-        <w:t xml:space="preserve">。公司 release </w:t>
+        <w:t xml:space="preserve">。Database Output 沒有 Primary suggestion 時，UI 必須顯示「請選擇來源節點」，不得預選排序第一台 DR；人工修正為唯一 Primary 並完成全部來源映射後，確認 checkbox 才可啟用。公司 release </w:t>
       </w:r>
       <w:r>
         <w:rPr>

</xml_diff>

<commit_message>
docs: record explicit evidence source deployment
</commit_message>
<xml_diff>
--- a/docs/OMNICHECK_AI_BUILD_AND_OPERATIONS_GUIDE.docx
+++ b/docs/OMNICHECK_AI_BUILD_AND_OPERATIONS_GUIDE.docx
@@ -1513,6 +1513,122 @@
                 <w:sz w:val="17"/>
               </w:rPr>
               <w:t>驗證狀態</w:t>
+            </w:r>
+          </w:p>
+        </w:tc>
+      </w:tr>
+      <w:tr>
+        <w:tc>
+          <w:tcPr>
+            <w:tcW w:type="dxa" w:w="2470"/>
+            <w:vAlign w:val="center"/>
+            <w:tcMar>
+              <w:top w:w="45" w:type="dxa"/>
+              <w:start w:w="120" w:type="dxa"/>
+              <w:bottom w:w="45" w:type="dxa"/>
+              <w:end w:w="120" w:type="dxa"/>
+            </w:tcMar>
+          </w:tcPr>
+          <w:p>
+            <w:pPr>
+              <w:spacing w:after="0"/>
+            </w:pPr>
+            <w:r>
+              <w:rPr>
+                <w:rFonts w:ascii="Calibri" w:hAnsi="Calibri" w:eastAsia="Microsoft JhengHei"/>
+                <w:b w:val="0"/>
+                <w:i w:val="0"/>
+                <w:sz w:val="17"/>
+              </w:rPr>
+              <w:t>0.10.3-draft.3</w:t>
+            </w:r>
+          </w:p>
+        </w:tc>
+        <w:tc>
+          <w:tcPr>
+            <w:tcW w:type="dxa" w:w="2470"/>
+            <w:vAlign w:val="center"/>
+            <w:tcMar>
+              <w:top w:w="45" w:type="dxa"/>
+              <w:start w:w="120" w:type="dxa"/>
+              <w:bottom w:w="45" w:type="dxa"/>
+              <w:end w:w="120" w:type="dxa"/>
+            </w:tcMar>
+          </w:tcPr>
+          <w:p>
+            <w:pPr>
+              <w:spacing w:after="0"/>
+            </w:pPr>
+            <w:r>
+              <w:rPr>
+                <w:rFonts w:ascii="Calibri" w:hAnsi="Calibri" w:eastAsia="Microsoft JhengHei"/>
+                <w:b w:val="0"/>
+                <w:i w:val="0"/>
+                <w:sz w:val="17"/>
+              </w:rPr>
+              <w:t>2026-08-11</w:t>
+            </w:r>
+          </w:p>
+        </w:tc>
+        <w:tc>
+          <w:tcPr>
+            <w:tcW w:type="dxa" w:w="2470"/>
+            <w:vAlign w:val="center"/>
+            <w:tcMar>
+              <w:top w:w="45" w:type="dxa"/>
+              <w:start w:w="120" w:type="dxa"/>
+              <w:bottom w:w="45" w:type="dxa"/>
+              <w:end w:w="120" w:type="dxa"/>
+            </w:tcMar>
+          </w:tcPr>
+          <w:p>
+            <w:pPr>
+              <w:spacing w:after="0"/>
+            </w:pPr>
+            <w:r>
+              <w:rPr>
+                <w:rFonts w:ascii="Calibri" w:hAnsi="Calibri" w:eastAsia="Microsoft JhengHei"/>
+                <w:b w:val="0"/>
+                <w:i w:val="0"/>
+                <w:sz w:val="17"/>
+              </w:rPr>
+              <w:t>修正無 Primary 時 Database Output 誤顯示 DR、人工修正後重新開放確認</w:t>
+            </w:r>
+          </w:p>
+        </w:tc>
+        <w:tc>
+          <w:tcPr>
+            <w:tcW w:type="dxa" w:w="2470"/>
+            <w:vAlign w:val="center"/>
+            <w:tcMar>
+              <w:top w:w="45" w:type="dxa"/>
+              <w:start w:w="120" w:type="dxa"/>
+              <w:bottom w:w="45" w:type="dxa"/>
+              <w:end w:w="120" w:type="dxa"/>
+            </w:tcMar>
+          </w:tcPr>
+          <w:p>
+            <w:pPr>
+              <w:spacing w:after="0"/>
+            </w:pPr>
+            <w:r>
+              <w:rPr>
+                <w:rFonts w:ascii="Calibri" w:hAnsi="Calibri" w:eastAsia="Microsoft JhengHei"/>
+                <w:b w:val="0"/>
+                <w:i w:val="0"/>
+                <w:sz w:val="17"/>
+              </w:rPr>
+              <w:t xml:space="preserve">本機 88 tests、公司 VM targeted 11 tests、health／UI marker／per-release process 通過；rollback </w:t>
+            </w:r>
+            <w:r>
+              <w:rPr>
+                <w:rFonts w:ascii="Consolas" w:hAnsi="Consolas" w:eastAsia="Microsoft JhengHei"/>
+                <w:b w:val="0"/>
+                <w:i w:val="0"/>
+                <w:color w:val="17365D"/>
+                <w:sz w:val="17"/>
+              </w:rPr>
+              <w:t>a0582a0</w:t>
             </w:r>
           </w:p>
         </w:tc>
@@ -16342,7 +16458,7 @@
           <w:b w:val="0"/>
           <w:i w:val="0"/>
         </w:rPr>
-        <w:t xml:space="preserve">M10.2 同仁 UI Adapter 公司候選已部署：同仁 Bundle 與公司 VM 保存版 185 個檔案逐檔 SHA-256 相同；release </w:t>
+        <w:t xml:space="preserve">M10.2 同仁 UI Adapter 公司候選已部署：目前 release </w:t>
       </w:r>
       <w:r>
         <w:rPr>
@@ -16352,15 +16468,15 @@
           <w:color w:val="17365D"/>
           <w:sz w:val="17"/>
         </w:rPr>
-        <w:t>a0582a0</w:t>
-      </w:r>
-      <w:r>
-        <w:rPr>
-          <w:rFonts w:ascii="Calibri" w:hAnsi="Calibri" w:eastAsia="Microsoft JhengHei"/>
-          <w:b w:val="0"/>
-          <w:i w:val="0"/>
-        </w:rPr>
-        <w:t xml:space="preserve"> 以 per-release venv 執行並通過 87 tests，systemd、deploy lock／owner、Browser layout、台灣行動支付 immutable 資料與 Golden E2E 均通過。Golden Job </w:t>
+        <w:t>0a6dccd</w:t>
+      </w:r>
+      <w:r>
+        <w:rPr>
+          <w:rFonts w:ascii="Calibri" w:hAnsi="Calibri" w:eastAsia="Microsoft JhengHei"/>
+          <w:b w:val="0"/>
+          <w:i w:val="0"/>
+        </w:rPr>
+        <w:t xml:space="preserve">；無 Primary 時 Database Output 顯示空白來源並強制人工選擇，節點修正為唯一 Primary 且全部映射完成後才可確認。本機 88 tests、公司 VM 相關 11 tests、health、UI marker 與 per-release process 通過；完整 Golden E2E 基準沿用前版 Job </w:t>
       </w:r>
       <w:r>
         <w:rPr>
@@ -16378,7 +16494,7 @@
           <w:b w:val="0"/>
           <w:i w:val="0"/>
         </w:rPr>
-        <w:t xml:space="preserve"> 產生 12 個 Canonical/V4 產物，QA/V4 QA 允許交付，服務重啟後 EDB persistence 正常。rollback 為 </w:t>
+        <w:t xml:space="preserve">。rollback 為 </w:t>
       </w:r>
       <w:r>
         <w:rPr>
@@ -16406,7 +16522,7 @@
           <w:color w:val="17365D"/>
           <w:sz w:val="17"/>
         </w:rPr>
-        <w:t>e56f043</w:t>
+        <w:t>a0582a0</w:t>
       </w:r>
       <w:r>
         <w:rPr>

</xml_diff>

<commit_message>
fix: support Novatek topology and evidence formats
</commit_message>
<xml_diff>
--- a/docs/OMNICHECK_AI_BUILD_AND_OPERATIONS_GUIDE.docx
+++ b/docs/OMNICHECK_AI_BUILD_AND_OPERATIONS_GUIDE.docx
@@ -1513,6 +1513,112 @@
                 <w:sz w:val="17"/>
               </w:rPr>
               <w:t>驗證狀態</w:t>
+            </w:r>
+          </w:p>
+        </w:tc>
+      </w:tr>
+      <w:tr>
+        <w:tc>
+          <w:tcPr>
+            <w:tcW w:type="dxa" w:w="2470"/>
+            <w:vAlign w:val="center"/>
+            <w:tcMar>
+              <w:top w:w="45" w:type="dxa"/>
+              <w:start w:w="120" w:type="dxa"/>
+              <w:bottom w:w="45" w:type="dxa"/>
+              <w:end w:w="120" w:type="dxa"/>
+            </w:tcMar>
+          </w:tcPr>
+          <w:p>
+            <w:pPr>
+              <w:spacing w:after="0"/>
+            </w:pPr>
+            <w:r>
+              <w:rPr>
+                <w:rFonts w:ascii="Calibri" w:hAnsi="Calibri" w:eastAsia="Microsoft JhengHei"/>
+                <w:b w:val="0"/>
+                <w:i w:val="0"/>
+                <w:sz w:val="17"/>
+              </w:rPr>
+              <w:t>0.10.3-draft.4</w:t>
+            </w:r>
+          </w:p>
+        </w:tc>
+        <w:tc>
+          <w:tcPr>
+            <w:tcW w:type="dxa" w:w="2470"/>
+            <w:vAlign w:val="center"/>
+            <w:tcMar>
+              <w:top w:w="45" w:type="dxa"/>
+              <w:start w:w="120" w:type="dxa"/>
+              <w:bottom w:w="45" w:type="dxa"/>
+              <w:end w:w="120" w:type="dxa"/>
+            </w:tcMar>
+          </w:tcPr>
+          <w:p>
+            <w:pPr>
+              <w:spacing w:after="0"/>
+            </w:pPr>
+            <w:r>
+              <w:rPr>
+                <w:rFonts w:ascii="Calibri" w:hAnsi="Calibri" w:eastAsia="Microsoft JhengHei"/>
+                <w:b w:val="0"/>
+                <w:i w:val="0"/>
+                <w:sz w:val="17"/>
+              </w:rPr>
+              <w:t>2026-08-11</w:t>
+            </w:r>
+          </w:p>
+        </w:tc>
+        <w:tc>
+          <w:tcPr>
+            <w:tcW w:type="dxa" w:w="2470"/>
+            <w:vAlign w:val="center"/>
+            <w:tcMar>
+              <w:top w:w="45" w:type="dxa"/>
+              <w:start w:w="120" w:type="dxa"/>
+              <w:bottom w:w="45" w:type="dxa"/>
+              <w:end w:w="120" w:type="dxa"/>
+            </w:tcMar>
+          </w:tcPr>
+          <w:p>
+            <w:pPr>
+              <w:spacing w:after="0"/>
+            </w:pPr>
+            <w:r>
+              <w:rPr>
+                <w:rFonts w:ascii="Calibri" w:hAnsi="Calibri" w:eastAsia="Microsoft JhengHei"/>
+                <w:b w:val="0"/>
+                <w:i w:val="0"/>
+                <w:sz w:val="17"/>
+              </w:rPr>
+              <w:t>聯詠 walsender／walreceiver topology、OS／DB 標題相容、zero-row 與 coverage ID</w:t>
+            </w:r>
+          </w:p>
+        </w:tc>
+        <w:tc>
+          <w:tcPr>
+            <w:tcW w:type="dxa" w:w="2470"/>
+            <w:vAlign w:val="center"/>
+            <w:tcMar>
+              <w:top w:w="45" w:type="dxa"/>
+              <w:start w:w="120" w:type="dxa"/>
+              <w:bottom w:w="45" w:type="dxa"/>
+              <w:end w:w="120" w:type="dxa"/>
+            </w:tcMar>
+          </w:tcPr>
+          <w:p>
+            <w:pPr>
+              <w:spacing w:after="0"/>
+            </w:pPr>
+            <w:r>
+              <w:rPr>
+                <w:rFonts w:ascii="Calibri" w:hAnsi="Calibri" w:eastAsia="Microsoft JhengHei"/>
+                <w:b w:val="0"/>
+                <w:i w:val="0"/>
+                <w:sz w:val="17"/>
+              </w:rPr>
+              <w:t>本機 93 tests；聯詠 3 檔 coverage 92.5%、QA/V4 QA、29 頁 PDF 與來源 hash 通過；待公司部署</w:t>
             </w:r>
           </w:p>
         </w:tc>
@@ -16561,6 +16667,91 @@
           <w:b w:val="0"/>
           <w:i w:val="0"/>
         </w:rPr>
+        <w:t xml:space="preserve">聯詠三檔唯讀回歸：walsender／walreceiver 自動提出 </w:t>
+      </w:r>
+      <w:r>
+        <w:rPr>
+          <w:rFonts w:ascii="Consolas" w:hAnsi="Consolas" w:eastAsia="Microsoft JhengHei"/>
+          <w:b w:val="0"/>
+          <w:i w:val="0"/>
+          <w:color w:val="17365D"/>
+          <w:sz w:val="17"/>
+        </w:rPr>
+        <w:t>OADB15N → Primary</w:t>
+      </w:r>
+      <w:r>
+        <w:rPr>
+          <w:rFonts w:ascii="Calibri" w:hAnsi="Calibri" w:eastAsia="Microsoft JhengHei"/>
+          <w:b w:val="0"/>
+          <w:i w:val="0"/>
+        </w:rPr>
+        <w:t>、</w:t>
+      </w:r>
+      <w:r>
+        <w:rPr>
+          <w:rFonts w:ascii="Consolas" w:hAnsi="Consolas" w:eastAsia="Microsoft JhengHei"/>
+          <w:b w:val="0"/>
+          <w:i w:val="0"/>
+          <w:color w:val="17365D"/>
+          <w:sz w:val="17"/>
+        </w:rPr>
+        <w:t>OADB15-DR → DR</w:t>
+      </w:r>
+      <w:r>
+        <w:rPr>
+          <w:rFonts w:ascii="Calibri" w:hAnsi="Calibri" w:eastAsia="Microsoft JhengHei"/>
+          <w:b w:val="0"/>
+          <w:i w:val="0"/>
+        </w:rPr>
+        <w:t xml:space="preserve">，Database Output 建議來源 </w:t>
+      </w:r>
+      <w:r>
+        <w:rPr>
+          <w:rFonts w:ascii="Consolas" w:hAnsi="Consolas" w:eastAsia="Microsoft JhengHei"/>
+          <w:b w:val="0"/>
+          <w:i w:val="0"/>
+          <w:color w:val="17365D"/>
+          <w:sz w:val="17"/>
+        </w:rPr>
+        <w:t>OADB15N</w:t>
+      </w:r>
+      <w:r>
+        <w:rPr>
+          <w:rFonts w:ascii="Calibri" w:hAnsi="Calibri" w:eastAsia="Microsoft JhengHei"/>
+          <w:b w:val="0"/>
+          <w:i w:val="0"/>
+        </w:rPr>
+        <w:t xml:space="preserve">；聯詠標題、zero-row 與 coverage ID 修正後 normalized checks 29 → 49、coverage 50% → 92.5%。剩餘 missing 為來源未提供的兩台 Kernel version 與 Primary </w:t>
+      </w:r>
+      <w:r>
+        <w:rPr>
+          <w:rFonts w:ascii="Consolas" w:hAnsi="Consolas" w:eastAsia="Microsoft JhengHei"/>
+          <w:b w:val="0"/>
+          <w:i w:val="0"/>
+          <w:color w:val="17365D"/>
+          <w:sz w:val="17"/>
+        </w:rPr>
+        <w:t>pg_hba.conf</w:t>
+      </w:r>
+      <w:r>
+        <w:rPr>
+          <w:rFonts w:ascii="Calibri" w:hAnsi="Calibri" w:eastAsia="Microsoft JhengHei"/>
+          <w:b w:val="0"/>
+          <w:i w:val="0"/>
+        </w:rPr>
+        <w:t>；QA/V4 QA、29 頁 PDF 逐頁 QA 與來源 SHA-256 不變均通過。</w:t>
+      </w:r>
+    </w:p>
+    <w:p>
+      <w:pPr>
+        <w:pStyle w:val="ListBullet"/>
+      </w:pPr>
+      <w:r>
+        <w:rPr>
+          <w:rFonts w:ascii="Calibri" w:hAnsi="Calibri" w:eastAsia="Microsoft JhengHei"/>
+          <w:b w:val="0"/>
+          <w:i w:val="0"/>
+        </w:rPr>
         <w:t>台灣行動支付實際資料在 SCRAM 重啟後通過 13 inputs／13 outputs、QA 8/8、V4 QA、29 頁 PDF 與來源 SHA-256 不變。</w:t>
       </w:r>
     </w:p>

</xml_diff>

<commit_message>
docs: record Novatek company validation
</commit_message>
<xml_diff>
--- a/docs/OMNICHECK_AI_BUILD_AND_OPERATIONS_GUIDE.docx
+++ b/docs/OMNICHECK_AI_BUILD_AND_OPERATIONS_GUIDE.docx
@@ -1618,7 +1618,26 @@
                 <w:i w:val="0"/>
                 <w:sz w:val="17"/>
               </w:rPr>
-              <w:t>本機 93 tests；聯詠 3 檔 coverage 92.5%、QA/V4 QA、29 頁 PDF 與來源 hash 通過；待公司部署</w:t>
+              <w:t xml:space="preserve">release </w:t>
+            </w:r>
+            <w:r>
+              <w:rPr>
+                <w:rFonts w:ascii="Consolas" w:hAnsi="Consolas" w:eastAsia="Microsoft JhengHei"/>
+                <w:b w:val="0"/>
+                <w:i w:val="0"/>
+                <w:color w:val="17365D"/>
+                <w:sz w:val="17"/>
+              </w:rPr>
+              <w:t>327748d</w:t>
+            </w:r>
+            <w:r>
+              <w:rPr>
+                <w:rFonts w:ascii="Calibri" w:hAnsi="Calibri" w:eastAsia="Microsoft JhengHei"/>
+                <w:b w:val="0"/>
+                <w:i w:val="0"/>
+                <w:sz w:val="17"/>
+              </w:rPr>
+              <w:t>；本機 93 tests、公司相關 28 tests、Discovery API、health、PDF 與來源 hash 通過</w:t>
             </w:r>
           </w:p>
         </w:tc>
@@ -16667,7 +16686,7 @@
           <w:b w:val="0"/>
           <w:i w:val="0"/>
         </w:rPr>
-        <w:t xml:space="preserve">聯詠三檔唯讀回歸：walsender／walreceiver 自動提出 </w:t>
+        <w:t xml:space="preserve">聯詠三檔唯讀回歸與公司部署：release </w:t>
       </w:r>
       <w:r>
         <w:rPr>
@@ -16677,15 +16696,15 @@
           <w:color w:val="17365D"/>
           <w:sz w:val="17"/>
         </w:rPr>
-        <w:t>OADB15N → Primary</w:t>
-      </w:r>
-      <w:r>
-        <w:rPr>
-          <w:rFonts w:ascii="Calibri" w:hAnsi="Calibri" w:eastAsia="Microsoft JhengHei"/>
-          <w:b w:val="0"/>
-          <w:i w:val="0"/>
-        </w:rPr>
-        <w:t>、</w:t>
+        <w:t>327748d</w:t>
+      </w:r>
+      <w:r>
+        <w:rPr>
+          <w:rFonts w:ascii="Calibri" w:hAnsi="Calibri" w:eastAsia="Microsoft JhengHei"/>
+          <w:b w:val="0"/>
+          <w:i w:val="0"/>
+        </w:rPr>
+        <w:t xml:space="preserve">；walsender／walreceiver 自動提出 </w:t>
       </w:r>
       <w:r>
         <w:rPr>
@@ -16695,15 +16714,15 @@
           <w:color w:val="17365D"/>
           <w:sz w:val="17"/>
         </w:rPr>
-        <w:t>OADB15-DR → DR</w:t>
-      </w:r>
-      <w:r>
-        <w:rPr>
-          <w:rFonts w:ascii="Calibri" w:hAnsi="Calibri" w:eastAsia="Microsoft JhengHei"/>
-          <w:b w:val="0"/>
-          <w:i w:val="0"/>
-        </w:rPr>
-        <w:t xml:space="preserve">，Database Output 建議來源 </w:t>
+        <w:t>OADB15N → Primary</w:t>
+      </w:r>
+      <w:r>
+        <w:rPr>
+          <w:rFonts w:ascii="Calibri" w:hAnsi="Calibri" w:eastAsia="Microsoft JhengHei"/>
+          <w:b w:val="0"/>
+          <w:i w:val="0"/>
+        </w:rPr>
+        <w:t>、</w:t>
       </w:r>
       <w:r>
         <w:rPr>
@@ -16713,15 +16732,15 @@
           <w:color w:val="17365D"/>
           <w:sz w:val="17"/>
         </w:rPr>
-        <w:t>OADB15N</w:t>
-      </w:r>
-      <w:r>
-        <w:rPr>
-          <w:rFonts w:ascii="Calibri" w:hAnsi="Calibri" w:eastAsia="Microsoft JhengHei"/>
-          <w:b w:val="0"/>
-          <w:i w:val="0"/>
-        </w:rPr>
-        <w:t xml:space="preserve">；聯詠標題、zero-row 與 coverage ID 修正後 normalized checks 29 → 49、coverage 50% → 92.5%。剩餘 missing 為來源未提供的兩台 Kernel version 與 Primary </w:t>
+        <w:t>OADB15-DR → DR</w:t>
+      </w:r>
+      <w:r>
+        <w:rPr>
+          <w:rFonts w:ascii="Calibri" w:hAnsi="Calibri" w:eastAsia="Microsoft JhengHei"/>
+          <w:b w:val="0"/>
+          <w:i w:val="0"/>
+        </w:rPr>
+        <w:t xml:space="preserve">，Database Output 建議來源 </w:t>
       </w:r>
       <w:r>
         <w:rPr>
@@ -16731,6 +16750,24 @@
           <w:color w:val="17365D"/>
           <w:sz w:val="17"/>
         </w:rPr>
+        <w:t>OADB15N</w:t>
+      </w:r>
+      <w:r>
+        <w:rPr>
+          <w:rFonts w:ascii="Calibri" w:hAnsi="Calibri" w:eastAsia="Microsoft JhengHei"/>
+          <w:b w:val="0"/>
+          <w:i w:val="0"/>
+        </w:rPr>
+        <w:t xml:space="preserve">。normalized checks 29 → 49、coverage 50% → 92.5%；剩餘 missing 為來源未提供的兩台 Kernel version 與 Primary </w:t>
+      </w:r>
+      <w:r>
+        <w:rPr>
+          <w:rFonts w:ascii="Consolas" w:hAnsi="Consolas" w:eastAsia="Microsoft JhengHei"/>
+          <w:b w:val="0"/>
+          <w:i w:val="0"/>
+          <w:color w:val="17365D"/>
+          <w:sz w:val="17"/>
+        </w:rPr>
         <w:t>pg_hba.conf</w:t>
       </w:r>
       <w:r>
@@ -16739,7 +16776,25 @@
           <w:b w:val="0"/>
           <w:i w:val="0"/>
         </w:rPr>
-        <w:t>；QA/V4 QA、29 頁 PDF 逐頁 QA 與來源 SHA-256 不變均通過。</w:t>
+        <w:t xml:space="preserve">。本機 93 tests、公司相關 28 tests、Discovery API、health、Web／Worker process、QA/V4 QA、29 頁 PDF 與來源 SHA-256 不變均通過。rollback </w:t>
+      </w:r>
+      <w:r>
+        <w:rPr>
+          <w:rFonts w:ascii="Consolas" w:hAnsi="Consolas" w:eastAsia="Microsoft JhengHei"/>
+          <w:b w:val="0"/>
+          <w:i w:val="0"/>
+          <w:color w:val="17365D"/>
+          <w:sz w:val="17"/>
+        </w:rPr>
+        <w:t>0a6dccd</w:t>
+      </w:r>
+      <w:r>
+        <w:rPr>
+          <w:rFonts w:ascii="Calibri" w:hAnsi="Calibri" w:eastAsia="Microsoft JhengHei"/>
+          <w:b w:val="0"/>
+          <w:i w:val="0"/>
+        </w:rPr>
+        <w:t>。</w:t>
       </w:r>
     </w:p>
     <w:p>

</xml_diff>

<commit_message>
feat: persist and approve section narratives
</commit_message>
<xml_diff>
--- a/docs/OMNICHECK_AI_BUILD_AND_OPERATIONS_GUIDE.docx
+++ b/docs/OMNICHECK_AI_BUILD_AND_OPERATIONS_GUIDE.docx
@@ -1985,6 +1985,131 @@
                 <w:sz w:val="17"/>
               </w:rPr>
               <w:t>本機／公司 VM 85 tests；台灣行動支付 14 檔／19 sections、公司 ENGDB 3 檔／9 sections、QA/V4 QA、DOCX/PDF 與來源 hash 通過；待使用者驗收</w:t>
+            </w:r>
+          </w:p>
+        </w:tc>
+      </w:tr>
+      <w:tr>
+        <w:tc>
+          <w:tcPr>
+            <w:tcW w:type="dxa" w:w="2470"/>
+            <w:vAlign w:val="center"/>
+            <w:tcMar>
+              <w:top w:w="45" w:type="dxa"/>
+              <w:start w:w="120" w:type="dxa"/>
+              <w:bottom w:w="45" w:type="dxa"/>
+              <w:end w:w="120" w:type="dxa"/>
+            </w:tcMar>
+          </w:tcPr>
+          <w:p>
+            <w:pPr>
+              <w:spacing w:after="0"/>
+            </w:pPr>
+            <w:r>
+              <w:rPr>
+                <w:rFonts w:ascii="Calibri" w:hAnsi="Calibri" w:eastAsia="Microsoft JhengHei"/>
+                <w:b w:val="0"/>
+                <w:i w:val="0"/>
+                <w:sz w:val="17"/>
+              </w:rPr>
+              <w:t>0.10.3-draft.2</w:t>
+            </w:r>
+          </w:p>
+        </w:tc>
+        <w:tc>
+          <w:tcPr>
+            <w:tcW w:type="dxa" w:w="2470"/>
+            <w:vAlign w:val="center"/>
+            <w:tcMar>
+              <w:top w:w="45" w:type="dxa"/>
+              <w:start w:w="120" w:type="dxa"/>
+              <w:bottom w:w="45" w:type="dxa"/>
+              <w:end w:w="120" w:type="dxa"/>
+            </w:tcMar>
+          </w:tcPr>
+          <w:p>
+            <w:pPr>
+              <w:spacing w:after="0"/>
+            </w:pPr>
+            <w:r>
+              <w:rPr>
+                <w:rFonts w:ascii="Calibri" w:hAnsi="Calibri" w:eastAsia="Microsoft JhengHei"/>
+                <w:b w:val="0"/>
+                <w:i w:val="0"/>
+                <w:sz w:val="17"/>
+              </w:rPr>
+              <w:t>2026-08-11</w:t>
+            </w:r>
+          </w:p>
+        </w:tc>
+        <w:tc>
+          <w:tcPr>
+            <w:tcW w:type="dxa" w:w="2470"/>
+            <w:vAlign w:val="center"/>
+            <w:tcMar>
+              <w:top w:w="45" w:type="dxa"/>
+              <w:start w:w="120" w:type="dxa"/>
+              <w:bottom w:w="45" w:type="dxa"/>
+              <w:end w:w="120" w:type="dxa"/>
+            </w:tcMar>
+          </w:tcPr>
+          <w:p>
+            <w:pPr>
+              <w:spacing w:after="0"/>
+            </w:pPr>
+            <w:r>
+              <w:rPr>
+                <w:rFonts w:ascii="Calibri" w:hAnsi="Calibri" w:eastAsia="Microsoft JhengHei"/>
+                <w:b w:val="0"/>
+                <w:i w:val="0"/>
+                <w:sz w:val="17"/>
+              </w:rPr>
+              <w:t>0007 schema reconciliation、EDB Section current/revision persistence、review/approval API、approved-only Renderer</w:t>
+            </w:r>
+          </w:p>
+        </w:tc>
+        <w:tc>
+          <w:tcPr>
+            <w:tcW w:type="dxa" w:w="2470"/>
+            <w:vAlign w:val="center"/>
+            <w:tcMar>
+              <w:top w:w="45" w:type="dxa"/>
+              <w:start w:w="120" w:type="dxa"/>
+              <w:bottom w:w="45" w:type="dxa"/>
+              <w:end w:w="120" w:type="dxa"/>
+            </w:tcMar>
+          </w:tcPr>
+          <w:p>
+            <w:pPr>
+              <w:spacing w:after="0"/>
+            </w:pPr>
+            <w:r>
+              <w:rPr>
+                <w:rFonts w:ascii="Calibri" w:hAnsi="Calibri" w:eastAsia="Microsoft JhengHei"/>
+                <w:b w:val="0"/>
+                <w:i w:val="0"/>
+                <w:sz w:val="17"/>
+              </w:rPr>
+              <w:t xml:space="preserve">本機 97 tests；Alembic 單一 head </w:t>
+            </w:r>
+            <w:r>
+              <w:rPr>
+                <w:rFonts w:ascii="Consolas" w:hAnsi="Consolas" w:eastAsia="Microsoft JhengHei"/>
+                <w:b w:val="0"/>
+                <w:i w:val="0"/>
+                <w:color w:val="17365D"/>
+                <w:sz w:val="17"/>
+              </w:rPr>
+              <w:t>0008_m10_3_sections</w:t>
+            </w:r>
+            <w:r>
+              <w:rPr>
+                <w:rFonts w:ascii="Calibri" w:hAnsi="Calibri" w:eastAsia="Microsoft JhengHei"/>
+                <w:b w:val="0"/>
+                <w:i w:val="0"/>
+                <w:sz w:val="17"/>
+              </w:rPr>
+              <w:t>；Golden approved overlay、QA/V4 QA 通過；待公司 migration/E2E</w:t>
             </w:r>
           </w:p>
         </w:tc>
@@ -4820,7 +4945,7 @@
                 <w:i w:val="0"/>
                 <w:sz w:val="17"/>
               </w:rPr>
-              <w:t>公司候選已部署、待使用者驗收</w:t>
+              <w:t>完成、已合併主線</w:t>
             </w:r>
           </w:p>
         </w:tc>
@@ -4846,7 +4971,7 @@
                 <w:i w:val="0"/>
                 <w:sz w:val="17"/>
               </w:rPr>
-              <w:t xml:space="preserve">同仁新版 UI 接既有 API 與 M10.3.1 後端；保留 </w:t>
+              <w:t xml:space="preserve">同仁新版 UI 接既有 API 與後端；保留 </w:t>
             </w:r>
             <w:r>
               <w:rPr>
@@ -4919,7 +5044,7 @@
                 <w:i w:val="0"/>
                 <w:sz w:val="17"/>
               </w:rPr>
-              <w:t>公司候選完成、待使用者驗收</w:t>
+              <w:t>完成</w:t>
             </w:r>
           </w:p>
         </w:tc>
@@ -4999,7 +5124,7 @@
                 <w:i w:val="0"/>
                 <w:sz w:val="17"/>
               </w:rPr>
-              <w:t>待 schema reconciliation</w:t>
+              <w:t>程式完成、待公司 E2E</w:t>
             </w:r>
           </w:p>
         </w:tc>
@@ -5025,7 +5150,7 @@
                 <w:i w:val="0"/>
                 <w:sz w:val="17"/>
               </w:rPr>
-              <w:t>EDB Section persistence、版本、稽核與 API</w:t>
+              <w:t>相容 migration chain、EDB current/revision persistence、Section API、approved-only Renderer</w:t>
             </w:r>
           </w:p>
         </w:tc>
@@ -13384,6 +13509,455 @@
           <w:i w:val="0"/>
         </w:rPr>
         <w:t>。</w:t>
+      </w:r>
+    </w:p>
+    <w:p>
+      <w:pPr>
+        <w:pStyle w:val="Heading3"/>
+      </w:pPr>
+      <w:r>
+        <w:rPr>
+          <w:rFonts w:ascii="Calibri" w:hAnsi="Calibri" w:eastAsia="Microsoft JhengHei"/>
+          <w:b w:val="0"/>
+          <w:i w:val="0"/>
+        </w:rPr>
+        <w:t>13.13 M10.3.2 EDB Section persistence 部署與驗收</w:t>
+      </w:r>
+    </w:p>
+    <w:p>
+      <w:r>
+        <w:rPr>
+          <w:rFonts w:ascii="Calibri" w:hAnsi="Calibri" w:eastAsia="Microsoft JhengHei"/>
+          <w:b w:val="0"/>
+          <w:i w:val="0"/>
+        </w:rPr>
+        <w:t>部署前先確認 migration head 與公司 current：</w:t>
+      </w:r>
+    </w:p>
+    <w:tbl>
+      <w:tblPr>
+        <w:tblStyle w:val="TableGrid"/>
+        <w:tblW w:type="auto" w:w="0"/>
+        <w:jc w:val="center"/>
+        <w:tblLayout w:type="fixed"/>
+        <w:tblLook w:firstColumn="1" w:firstRow="1" w:lastColumn="0" w:lastRow="0" w:noHBand="0" w:noVBand="1" w:val="04A0"/>
+      </w:tblPr>
+      <w:tblGrid>
+        <w:gridCol w:w="9878"/>
+      </w:tblGrid>
+      <w:tr>
+        <w:tc>
+          <w:tcPr>
+            <w:tcW w:type="dxa" w:w="9878"/>
+            <w:shd w:fill="F2F6FA"/>
+            <w:tcMar>
+              <w:top w:w="90" w:type="dxa"/>
+              <w:start w:w="130" w:type="dxa"/>
+              <w:bottom w:w="90" w:type="dxa"/>
+              <w:end w:w="130" w:type="dxa"/>
+            </w:tcMar>
+          </w:tcPr>
+          <w:p>
+            <w:pPr>
+              <w:pStyle w:val="CodeBlock"/>
+              <w:keepLines w:val="0"/>
+            </w:pPr>
+            <w:r>
+              <w:rPr>
+                <w:rFonts w:ascii="Consolas" w:hAnsi="Consolas" w:eastAsia="Microsoft JhengHei"/>
+                <w:sz w:val="16"/>
+              </w:rPr>
+              <w:t>.venv/bin/alembic heads</w:t>
+              <w:br/>
+              <w:t>PGPASSFILE=/etc/omnicheck-ai/pgpass /usr/edb/as17/bin/psql \</w:t>
+              <w:br/>
+              <w:t xml:space="preserve">  -h 192.168.118.81 -p 5444 -U omnicheck_app -d omnicheck_app \</w:t>
+              <w:br/>
+              <w:t xml:space="preserve">  -X -Atc "select version_num from omnicheck.alembic_version"</w:t>
+            </w:r>
+          </w:p>
+        </w:tc>
+      </w:tr>
+    </w:tbl>
+    <w:p>
+      <w:r>
+        <w:rPr>
+          <w:rFonts w:ascii="Calibri" w:hAnsi="Calibri" w:eastAsia="Microsoft JhengHei"/>
+          <w:b w:val="0"/>
+          <w:i w:val="0"/>
+        </w:rPr>
+        <w:t xml:space="preserve">預期分別為 </w:t>
+      </w:r>
+      <w:r>
+        <w:rPr>
+          <w:rFonts w:ascii="Consolas" w:hAnsi="Consolas" w:eastAsia="Microsoft JhengHei"/>
+          <w:b w:val="0"/>
+          <w:i w:val="0"/>
+          <w:color w:val="17365D"/>
+          <w:sz w:val="17"/>
+        </w:rPr>
+        <w:t>0008_m10_3_sections</w:t>
+      </w:r>
+      <w:r>
+        <w:rPr>
+          <w:rFonts w:ascii="Calibri" w:hAnsi="Calibri" w:eastAsia="Microsoft JhengHei"/>
+          <w:b w:val="0"/>
+          <w:i w:val="0"/>
+        </w:rPr>
+        <w:t xml:space="preserve"> 與部署前的 </w:t>
+      </w:r>
+      <w:r>
+        <w:rPr>
+          <w:rFonts w:ascii="Consolas" w:hAnsi="Consolas" w:eastAsia="Microsoft JhengHei"/>
+          <w:b w:val="0"/>
+          <w:i w:val="0"/>
+          <w:color w:val="17365D"/>
+          <w:sz w:val="17"/>
+        </w:rPr>
+        <w:t>0007_m13_catalog</w:t>
+      </w:r>
+      <w:r>
+        <w:rPr>
+          <w:rFonts w:ascii="Calibri" w:hAnsi="Calibri" w:eastAsia="Microsoft JhengHei"/>
+          <w:b w:val="0"/>
+          <w:i w:val="0"/>
+        </w:rPr>
+        <w:t xml:space="preserve">。先建立 schema-only 備份與 Alembic／新表清冊；備份檔保存於 </w:t>
+      </w:r>
+      <w:r>
+        <w:rPr>
+          <w:rFonts w:ascii="Consolas" w:hAnsi="Consolas" w:eastAsia="Microsoft JhengHei"/>
+          <w:b w:val="0"/>
+          <w:i w:val="0"/>
+          <w:color w:val="17365D"/>
+          <w:sz w:val="17"/>
+        </w:rPr>
+        <w:t>/data/omnicheck/archive/</w:t>
+      </w:r>
+      <w:r>
+        <w:rPr>
+          <w:rFonts w:ascii="Calibri" w:hAnsi="Calibri" w:eastAsia="Microsoft JhengHei"/>
+          <w:b w:val="0"/>
+          <w:i w:val="0"/>
+        </w:rPr>
+        <w:t>，記錄 SHA-256。確認 0005～0007 migration 與同仁 source SHA-256 完全一致後，才允許：</w:t>
+      </w:r>
+    </w:p>
+    <w:tbl>
+      <w:tblPr>
+        <w:tblStyle w:val="TableGrid"/>
+        <w:tblW w:type="auto" w:w="0"/>
+        <w:jc w:val="center"/>
+        <w:tblLayout w:type="fixed"/>
+        <w:tblLook w:firstColumn="1" w:firstRow="1" w:lastColumn="0" w:lastRow="0" w:noHBand="0" w:noVBand="1" w:val="04A0"/>
+      </w:tblPr>
+      <w:tblGrid>
+        <w:gridCol w:w="9878"/>
+      </w:tblGrid>
+      <w:tr>
+        <w:tc>
+          <w:tcPr>
+            <w:tcW w:type="dxa" w:w="9878"/>
+            <w:shd w:fill="F2F6FA"/>
+            <w:tcMar>
+              <w:top w:w="90" w:type="dxa"/>
+              <w:start w:w="130" w:type="dxa"/>
+              <w:bottom w:w="90" w:type="dxa"/>
+              <w:end w:w="130" w:type="dxa"/>
+            </w:tcMar>
+          </w:tcPr>
+          <w:p>
+            <w:pPr>
+              <w:pStyle w:val="CodeBlock"/>
+              <w:keepLines w:val="0"/>
+            </w:pPr>
+            <w:r>
+              <w:rPr>
+                <w:rFonts w:ascii="Consolas" w:hAnsi="Consolas" w:eastAsia="Microsoft JhengHei"/>
+                <w:sz w:val="16"/>
+              </w:rPr>
+              <w:t>cd /data/omnicheck/app/current</w:t>
+              <w:br/>
+              <w:t>set -a</w:t>
+              <w:br/>
+              <w:t>. /etc/omnicheck-ai/omnicheck.env</w:t>
+              <w:br/>
+              <w:t>set +a</w:t>
+              <w:br/>
+              <w:t>.venv/bin/alembic upgrade 0008_m10_3_sections</w:t>
+            </w:r>
+          </w:p>
+        </w:tc>
+      </w:tr>
+    </w:tbl>
+    <w:p>
+      <w:r>
+        <w:rPr>
+          <w:rFonts w:ascii="Calibri" w:hAnsi="Calibri" w:eastAsia="Microsoft JhengHei"/>
+          <w:b w:val="0"/>
+          <w:i w:val="0"/>
+        </w:rPr>
+        <w:t xml:space="preserve">migration 只應新增 </w:t>
+      </w:r>
+      <w:r>
+        <w:rPr>
+          <w:rFonts w:ascii="Consolas" w:hAnsi="Consolas" w:eastAsia="Microsoft JhengHei"/>
+          <w:b w:val="0"/>
+          <w:i w:val="0"/>
+          <w:color w:val="17365D"/>
+          <w:sz w:val="17"/>
+        </w:rPr>
+        <w:t>section_workflows</w:t>
+      </w:r>
+      <w:r>
+        <w:rPr>
+          <w:rFonts w:ascii="Calibri" w:hAnsi="Calibri" w:eastAsia="Microsoft JhengHei"/>
+          <w:b w:val="0"/>
+          <w:i w:val="0"/>
+        </w:rPr>
+        <w:t>、</w:t>
+      </w:r>
+      <w:r>
+        <w:rPr>
+          <w:rFonts w:ascii="Consolas" w:hAnsi="Consolas" w:eastAsia="Microsoft JhengHei"/>
+          <w:b w:val="0"/>
+          <w:i w:val="0"/>
+          <w:color w:val="17365D"/>
+          <w:sz w:val="17"/>
+        </w:rPr>
+        <w:t>section_workflow_items</w:t>
+      </w:r>
+      <w:r>
+        <w:rPr>
+          <w:rFonts w:ascii="Calibri" w:hAnsi="Calibri" w:eastAsia="Microsoft JhengHei"/>
+          <w:b w:val="0"/>
+          <w:i w:val="0"/>
+        </w:rPr>
+        <w:t>、</w:t>
+      </w:r>
+      <w:r>
+        <w:rPr>
+          <w:rFonts w:ascii="Consolas" w:hAnsi="Consolas" w:eastAsia="Microsoft JhengHei"/>
+          <w:b w:val="0"/>
+          <w:i w:val="0"/>
+          <w:color w:val="17365D"/>
+          <w:sz w:val="17"/>
+        </w:rPr>
+        <w:t>section_workflow_revisions</w:t>
+      </w:r>
+      <w:r>
+        <w:rPr>
+          <w:rFonts w:ascii="Calibri" w:hAnsi="Calibri" w:eastAsia="Microsoft JhengHei"/>
+          <w:b w:val="0"/>
+          <w:i w:val="0"/>
+        </w:rPr>
+        <w:t xml:space="preserve">。不得執行 </w:t>
+      </w:r>
+      <w:r>
+        <w:rPr>
+          <w:rFonts w:ascii="Consolas" w:hAnsi="Consolas" w:eastAsia="Microsoft JhengHei"/>
+          <w:b w:val="0"/>
+          <w:i w:val="0"/>
+          <w:color w:val="17365D"/>
+          <w:sz w:val="17"/>
+        </w:rPr>
+        <w:t>stamp</w:t>
+      </w:r>
+      <w:r>
+        <w:rPr>
+          <w:rFonts w:ascii="Calibri" w:hAnsi="Calibri" w:eastAsia="Microsoft JhengHei"/>
+          <w:b w:val="0"/>
+          <w:i w:val="0"/>
+        </w:rPr>
+        <w:t>、</w:t>
+      </w:r>
+      <w:r>
+        <w:rPr>
+          <w:rFonts w:ascii="Consolas" w:hAnsi="Consolas" w:eastAsia="Microsoft JhengHei"/>
+          <w:b w:val="0"/>
+          <w:i w:val="0"/>
+          <w:color w:val="17365D"/>
+          <w:sz w:val="17"/>
+        </w:rPr>
+        <w:t>downgrade</w:t>
+      </w:r>
+      <w:r>
+        <w:rPr>
+          <w:rFonts w:ascii="Calibri" w:hAnsi="Calibri" w:eastAsia="Microsoft JhengHei"/>
+          <w:b w:val="0"/>
+          <w:i w:val="0"/>
+        </w:rPr>
+        <w:t xml:space="preserve"> 或刪除 0005～0007 tables。</w:t>
+      </w:r>
+    </w:p>
+    <w:p>
+      <w:r>
+        <w:rPr>
+          <w:rFonts w:ascii="Calibri" w:hAnsi="Calibri" w:eastAsia="Microsoft JhengHei"/>
+          <w:b w:val="0"/>
+          <w:i w:val="0"/>
+        </w:rPr>
+        <w:t>API 驗收順序：</w:t>
+      </w:r>
+    </w:p>
+    <w:p>
+      <w:pPr>
+        <w:pStyle w:val="ListNumber"/>
+      </w:pPr>
+      <w:r>
+        <w:rPr>
+          <w:rFonts w:ascii="Calibri" w:hAnsi="Calibri" w:eastAsia="Microsoft JhengHei"/>
+          <w:b w:val="0"/>
+          <w:i w:val="0"/>
+        </w:rPr>
+        <w:t>建立並完成一個測試 Job，確認 Worker 自動保存 generated baseline。</w:t>
+      </w:r>
+    </w:p>
+    <w:p>
+      <w:pPr>
+        <w:pStyle w:val="ListNumber"/>
+      </w:pPr>
+      <w:r>
+        <w:rPr>
+          <w:rFonts w:ascii="Consolas" w:hAnsi="Consolas" w:eastAsia="Microsoft JhengHei"/>
+          <w:b w:val="0"/>
+          <w:i w:val="0"/>
+          <w:color w:val="17365D"/>
+          <w:sz w:val="17"/>
+        </w:rPr>
+        <w:t>GET /api/jobs/{job_id}/sections</w:t>
+      </w:r>
+      <w:r>
+        <w:rPr>
+          <w:rFonts w:ascii="Calibri" w:hAnsi="Calibri" w:eastAsia="Microsoft JhengHei"/>
+          <w:b w:val="0"/>
+          <w:i w:val="0"/>
+        </w:rPr>
+        <w:t xml:space="preserve"> 取得 </w:t>
+      </w:r>
+      <w:r>
+        <w:rPr>
+          <w:rFonts w:ascii="Consolas" w:hAnsi="Consolas" w:eastAsia="Microsoft JhengHei"/>
+          <w:b w:val="0"/>
+          <w:i w:val="0"/>
+          <w:color w:val="17365D"/>
+          <w:sz w:val="17"/>
+        </w:rPr>
+        <w:t>item_id</w:t>
+      </w:r>
+      <w:r>
+        <w:rPr>
+          <w:rFonts w:ascii="Calibri" w:hAnsi="Calibri" w:eastAsia="Microsoft JhengHei"/>
+          <w:b w:val="0"/>
+          <w:i w:val="0"/>
+        </w:rPr>
+        <w:t xml:space="preserve"> 與 revision 1。</w:t>
+      </w:r>
+    </w:p>
+    <w:p>
+      <w:pPr>
+        <w:pStyle w:val="ListNumber"/>
+      </w:pPr>
+      <w:r>
+        <w:rPr>
+          <w:rFonts w:ascii="Calibri" w:hAnsi="Calibri" w:eastAsia="Microsoft JhengHei"/>
+          <w:b w:val="0"/>
+          <w:i w:val="0"/>
+        </w:rPr>
+        <w:t>不建立 AI draft，直接呼叫 review；確認 revision 2、selected source 仍為 deterministic。</w:t>
+      </w:r>
+    </w:p>
+    <w:p>
+      <w:pPr>
+        <w:pStyle w:val="ListNumber"/>
+      </w:pPr>
+      <w:r>
+        <w:rPr>
+          <w:rFonts w:ascii="Calibri" w:hAnsi="Calibri" w:eastAsia="Microsoft JhengHei"/>
+          <w:b w:val="0"/>
+          <w:i w:val="0"/>
+        </w:rPr>
+        <w:t>用舊 revision 核准，預期 HTTP 409。</w:t>
+      </w:r>
+    </w:p>
+    <w:p>
+      <w:pPr>
+        <w:pStyle w:val="ListNumber"/>
+      </w:pPr>
+      <w:r>
+        <w:rPr>
+          <w:rFonts w:ascii="Calibri" w:hAnsi="Calibri" w:eastAsia="Microsoft JhengHei"/>
+          <w:b w:val="0"/>
+          <w:i w:val="0"/>
+        </w:rPr>
+        <w:t>用 revision 2 核准，預期 revision 3、selected source 為 approved。</w:t>
+      </w:r>
+    </w:p>
+    <w:p>
+      <w:pPr>
+        <w:pStyle w:val="ListNumber"/>
+      </w:pPr>
+      <w:r>
+        <w:rPr>
+          <w:rFonts w:ascii="Calibri" w:hAnsi="Calibri" w:eastAsia="Microsoft JhengHei"/>
+          <w:b w:val="0"/>
+          <w:i w:val="0"/>
+        </w:rPr>
+        <w:t xml:space="preserve">呼叫 </w:t>
+      </w:r>
+      <w:r>
+        <w:rPr>
+          <w:rFonts w:ascii="Consolas" w:hAnsi="Consolas" w:eastAsia="Microsoft JhengHei"/>
+          <w:b w:val="0"/>
+          <w:i w:val="0"/>
+          <w:color w:val="17365D"/>
+          <w:sz w:val="17"/>
+        </w:rPr>
+        <w:t>/sections/render</w:t>
+      </w:r>
+      <w:r>
+        <w:rPr>
+          <w:rFonts w:ascii="Calibri" w:hAnsi="Calibri" w:eastAsia="Microsoft JhengHei"/>
+          <w:b w:val="0"/>
+          <w:i w:val="0"/>
+        </w:rPr>
+        <w:t>，確認核准文字出現在 report-model/V4/DOCX/PDF。</w:t>
+      </w:r>
+    </w:p>
+    <w:p>
+      <w:pPr>
+        <w:pStyle w:val="ListNumber"/>
+      </w:pPr>
+      <w:r>
+        <w:rPr>
+          <w:rFonts w:ascii="Calibri" w:hAnsi="Calibri" w:eastAsia="Microsoft JhengHei"/>
+          <w:b w:val="0"/>
+          <w:i w:val="0"/>
+        </w:rPr>
+        <w:t>另選未核准 section，確認報告仍使用 deterministic 內容。</w:t>
+      </w:r>
+    </w:p>
+    <w:p>
+      <w:pPr>
+        <w:pStyle w:val="ListNumber"/>
+      </w:pPr>
+      <w:r>
+        <w:rPr>
+          <w:rFonts w:ascii="Calibri" w:hAnsi="Calibri" w:eastAsia="Microsoft JhengHei"/>
+          <w:b w:val="0"/>
+          <w:i w:val="0"/>
+        </w:rPr>
+        <w:t>查 revisions，確認 generated/reviewed/approved、actor、timestamp、content SHA-256 均存在。</w:t>
+      </w:r>
+    </w:p>
+    <w:p>
+      <w:r>
+        <w:rPr>
+          <w:rFonts w:ascii="Calibri" w:hAnsi="Calibri" w:eastAsia="Microsoft JhengHei"/>
+          <w:b w:val="0"/>
+          <w:i w:val="0"/>
+        </w:rPr>
+        <w:t>Rollback 原則：Application 可切回上一 release；0008 tables留在 EDB 不影響舊程式。正式環境採 forward-fix，不執行 Alembic downgrade。誤核准內容以新 revision 修正並重新核准，不刪除歷史。</w:t>
       </w:r>
     </w:p>
     <w:p>

</xml_diff>

<commit_message>
docs: record M10.3.2 company validation
</commit_message>
<xml_diff>
--- a/docs/OMNICHECK_AI_BUILD_AND_OPERATIONS_GUIDE.docx
+++ b/docs/OMNICHECK_AI_BUILD_AND_OPERATIONS_GUIDE.docx
@@ -2090,7 +2090,7 @@
                 <w:i w:val="0"/>
                 <w:sz w:val="17"/>
               </w:rPr>
-              <w:t xml:space="preserve">本機 97 tests；Alembic 單一 head </w:t>
+              <w:t xml:space="preserve">本機／公司 97 tests；公司 0008 migration、Job </w:t>
             </w:r>
             <w:r>
               <w:rPr>
@@ -2100,7 +2100,7 @@
                 <w:color w:val="17365D"/>
                 <w:sz w:val="17"/>
               </w:rPr>
-              <w:t>0008_m10_3_sections</w:t>
+              <w:t>774499b66693455eb16d14f04a5fd687</w:t>
             </w:r>
             <w:r>
               <w:rPr>
@@ -2109,7 +2109,7 @@
                 <w:i w:val="0"/>
                 <w:sz w:val="17"/>
               </w:rPr>
-              <w:t>；Golden approved overlay、QA/V4 QA 通過；待公司 migration/E2E</w:t>
+              <w:t xml:space="preserve"> approved-only E2E 通過</w:t>
             </w:r>
           </w:p>
         </w:tc>
@@ -5124,7 +5124,7 @@
                 <w:i w:val="0"/>
                 <w:sz w:val="17"/>
               </w:rPr>
-              <w:t>程式完成、待公司 E2E</w:t>
+              <w:t>完成、公司 E2E 通過</w:t>
             </w:r>
           </w:p>
         </w:tc>

</xml_diff>

<commit_message>
feat: add audited Ollama section gateway
</commit_message>
<xml_diff>
--- a/docs/OMNICHECK_AI_BUILD_AND_OPERATIONS_GUIDE.docx
+++ b/docs/OMNICHECK_AI_BUILD_AND_OPERATIONS_GUIDE.docx
@@ -2110,6 +2110,112 @@
                 <w:sz w:val="17"/>
               </w:rPr>
               <w:t xml:space="preserve"> approved-only E2E 通過</w:t>
+            </w:r>
+          </w:p>
+        </w:tc>
+      </w:tr>
+      <w:tr>
+        <w:tc>
+          <w:tcPr>
+            <w:tcW w:type="dxa" w:w="2470"/>
+            <w:vAlign w:val="center"/>
+            <w:tcMar>
+              <w:top w:w="45" w:type="dxa"/>
+              <w:start w:w="120" w:type="dxa"/>
+              <w:bottom w:w="45" w:type="dxa"/>
+              <w:end w:w="120" w:type="dxa"/>
+            </w:tcMar>
+          </w:tcPr>
+          <w:p>
+            <w:pPr>
+              <w:spacing w:after="0"/>
+            </w:pPr>
+            <w:r>
+              <w:rPr>
+                <w:rFonts w:ascii="Calibri" w:hAnsi="Calibri" w:eastAsia="Microsoft JhengHei"/>
+                <w:b w:val="0"/>
+                <w:i w:val="0"/>
+                <w:sz w:val="17"/>
+              </w:rPr>
+              <w:t>0.14.1-rc.1</w:t>
+            </w:r>
+          </w:p>
+        </w:tc>
+        <w:tc>
+          <w:tcPr>
+            <w:tcW w:type="dxa" w:w="2470"/>
+            <w:vAlign w:val="center"/>
+            <w:tcMar>
+              <w:top w:w="45" w:type="dxa"/>
+              <w:start w:w="120" w:type="dxa"/>
+              <w:bottom w:w="45" w:type="dxa"/>
+              <w:end w:w="120" w:type="dxa"/>
+            </w:tcMar>
+          </w:tcPr>
+          <w:p>
+            <w:pPr>
+              <w:spacing w:after="0"/>
+            </w:pPr>
+            <w:r>
+              <w:rPr>
+                <w:rFonts w:ascii="Calibri" w:hAnsi="Calibri" w:eastAsia="Microsoft JhengHei"/>
+                <w:b w:val="0"/>
+                <w:i w:val="0"/>
+                <w:sz w:val="17"/>
+              </w:rPr>
+              <w:t>2026-08-11</w:t>
+            </w:r>
+          </w:p>
+        </w:tc>
+        <w:tc>
+          <w:tcPr>
+            <w:tcW w:type="dxa" w:w="2470"/>
+            <w:vAlign w:val="center"/>
+            <w:tcMar>
+              <w:top w:w="45" w:type="dxa"/>
+              <w:start w:w="120" w:type="dxa"/>
+              <w:bottom w:w="45" w:type="dxa"/>
+              <w:end w:w="120" w:type="dxa"/>
+            </w:tcMar>
+          </w:tcPr>
+          <w:p>
+            <w:pPr>
+              <w:spacing w:after="0"/>
+            </w:pPr>
+            <w:r>
+              <w:rPr>
+                <w:rFonts w:ascii="Calibri" w:hAnsi="Calibri" w:eastAsia="Microsoft JhengHei"/>
+                <w:b w:val="0"/>
+                <w:i w:val="0"/>
+                <w:sz w:val="17"/>
+              </w:rPr>
+              <w:t>Ollama Section draft Gateway、資料最小化／遮蔽、JSON schema、timeout/retry、EDB AI audit 與 deterministic fallback</w:t>
+            </w:r>
+          </w:p>
+        </w:tc>
+        <w:tc>
+          <w:tcPr>
+            <w:tcW w:type="dxa" w:w="2470"/>
+            <w:vAlign w:val="center"/>
+            <w:tcMar>
+              <w:top w:w="45" w:type="dxa"/>
+              <w:start w:w="120" w:type="dxa"/>
+              <w:bottom w:w="45" w:type="dxa"/>
+              <w:end w:w="120" w:type="dxa"/>
+            </w:tcMar>
+          </w:tcPr>
+          <w:p>
+            <w:pPr>
+              <w:spacing w:after="0"/>
+            </w:pPr>
+            <w:r>
+              <w:rPr>
+                <w:rFonts w:ascii="Calibri" w:hAnsi="Calibri" w:eastAsia="Microsoft JhengHei"/>
+                <w:b w:val="0"/>
+                <w:i w:val="0"/>
+                <w:sz w:val="17"/>
+              </w:rPr>
+              <w:t>本機 100 tests、Alembic head 0009；App VM 至 gpt-oss:20b 最小連線通過；待公司 migration/E2E</w:t>
             </w:r>
           </w:p>
         </w:tc>
@@ -5178,6 +5284,86 @@
                 <w:i w:val="0"/>
                 <w:sz w:val="17"/>
               </w:rPr>
+              <w:t>M14.1</w:t>
+            </w:r>
+          </w:p>
+        </w:tc>
+        <w:tc>
+          <w:tcPr>
+            <w:tcW w:type="dxa" w:w="3293"/>
+            <w:vAlign w:val="center"/>
+            <w:tcMar>
+              <w:top w:w="45" w:type="dxa"/>
+              <w:start w:w="120" w:type="dxa"/>
+              <w:bottom w:w="45" w:type="dxa"/>
+              <w:end w:w="120" w:type="dxa"/>
+            </w:tcMar>
+          </w:tcPr>
+          <w:p>
+            <w:pPr>
+              <w:spacing w:after="0"/>
+            </w:pPr>
+            <w:r>
+              <w:rPr>
+                <w:rFonts w:ascii="Calibri" w:hAnsi="Calibri" w:eastAsia="Microsoft JhengHei"/>
+                <w:b w:val="0"/>
+                <w:i w:val="0"/>
+                <w:sz w:val="17"/>
+              </w:rPr>
+              <w:t>程式完成、待公司 E2E</w:t>
+            </w:r>
+          </w:p>
+        </w:tc>
+        <w:tc>
+          <w:tcPr>
+            <w:tcW w:type="dxa" w:w="3293"/>
+            <w:vAlign w:val="center"/>
+            <w:tcMar>
+              <w:top w:w="45" w:type="dxa"/>
+              <w:start w:w="120" w:type="dxa"/>
+              <w:bottom w:w="45" w:type="dxa"/>
+              <w:end w:w="120" w:type="dxa"/>
+            </w:tcMar>
+          </w:tcPr>
+          <w:p>
+            <w:pPr>
+              <w:spacing w:after="0"/>
+            </w:pPr>
+            <w:r>
+              <w:rPr>
+                <w:rFonts w:ascii="Calibri" w:hAnsi="Calibri" w:eastAsia="Microsoft JhengHei"/>
+                <w:b w:val="0"/>
+                <w:i w:val="0"/>
+                <w:sz w:val="17"/>
+              </w:rPr>
+              <w:t>Ollama Section draft、遮蔽、audit、fallback；預設 disabled</w:t>
+            </w:r>
+          </w:p>
+        </w:tc>
+      </w:tr>
+      <w:tr>
+        <w:tc>
+          <w:tcPr>
+            <w:tcW w:type="dxa" w:w="3293"/>
+            <w:vAlign w:val="center"/>
+            <w:tcMar>
+              <w:top w:w="45" w:type="dxa"/>
+              <w:start w:w="120" w:type="dxa"/>
+              <w:bottom w:w="45" w:type="dxa"/>
+              <w:end w:w="120" w:type="dxa"/>
+            </w:tcMar>
+          </w:tcPr>
+          <w:p>
+            <w:pPr>
+              <w:spacing w:after="0"/>
+            </w:pPr>
+            <w:r>
+              <w:rPr>
+                <w:rFonts w:ascii="Calibri" w:hAnsi="Calibri" w:eastAsia="Microsoft JhengHei"/>
+                <w:b w:val="0"/>
+                <w:i w:val="0"/>
+                <w:sz w:val="17"/>
+              </w:rPr>
               <w:t>M11～M15</w:t>
             </w:r>
           </w:p>
@@ -13958,6 +14144,439 @@
           <w:i w:val="0"/>
         </w:rPr>
         <w:t>Rollback 原則：Application 可切回上一 release；0008 tables留在 EDB 不影響舊程式。正式環境採 forward-fix，不執行 Alembic downgrade。誤核准內容以新 revision 修正並重新核准，不刪除歷史。</w:t>
+      </w:r>
+    </w:p>
+    <w:p>
+      <w:pPr>
+        <w:pStyle w:val="Heading3"/>
+      </w:pPr>
+      <w:r>
+        <w:rPr>
+          <w:rFonts w:ascii="Calibri" w:hAnsi="Calibri" w:eastAsia="Microsoft JhengHei"/>
+          <w:b w:val="0"/>
+          <w:i w:val="0"/>
+        </w:rPr>
+        <w:t>13.14 M14.1 Ollama Gateway 部署與驗收</w:t>
+      </w:r>
+    </w:p>
+    <w:p>
+      <w:r>
+        <w:rPr>
+          <w:rFonts w:ascii="Calibri" w:hAnsi="Calibri" w:eastAsia="Microsoft JhengHei"/>
+          <w:b w:val="0"/>
+          <w:i w:val="0"/>
+        </w:rPr>
+        <w:t xml:space="preserve">網路需求：App VM 必須能連到 </w:t>
+      </w:r>
+      <w:r>
+        <w:rPr>
+          <w:rFonts w:ascii="Consolas" w:hAnsi="Consolas" w:eastAsia="Microsoft JhengHei"/>
+          <w:b w:val="0"/>
+          <w:i w:val="0"/>
+          <w:color w:val="17365D"/>
+          <w:sz w:val="17"/>
+        </w:rPr>
+        <w:t>192.168.68.39:11434</w:t>
+      </w:r>
+      <w:r>
+        <w:rPr>
+          <w:rFonts w:ascii="Calibri" w:hAnsi="Calibri" w:eastAsia="Microsoft JhengHei"/>
+          <w:b w:val="0"/>
+          <w:i w:val="0"/>
+        </w:rPr>
+        <w:t xml:space="preserve">。先使用不含客戶資料的最小請求確認 </w:t>
+      </w:r>
+      <w:r>
+        <w:rPr>
+          <w:rFonts w:ascii="Consolas" w:hAnsi="Consolas" w:eastAsia="Microsoft JhengHei"/>
+          <w:b w:val="0"/>
+          <w:i w:val="0"/>
+          <w:color w:val="17365D"/>
+          <w:sz w:val="17"/>
+        </w:rPr>
+        <w:t>/v1/chat/completions</w:t>
+      </w:r>
+      <w:r>
+        <w:rPr>
+          <w:rFonts w:ascii="Calibri" w:hAnsi="Calibri" w:eastAsia="Microsoft JhengHei"/>
+          <w:b w:val="0"/>
+          <w:i w:val="0"/>
+        </w:rPr>
+        <w:t xml:space="preserve"> 與 </w:t>
+      </w:r>
+      <w:r>
+        <w:rPr>
+          <w:rFonts w:ascii="Consolas" w:hAnsi="Consolas" w:eastAsia="Microsoft JhengHei"/>
+          <w:b w:val="0"/>
+          <w:i w:val="0"/>
+          <w:color w:val="17365D"/>
+          <w:sz w:val="17"/>
+        </w:rPr>
+        <w:t>gpt-oss:20b</w:t>
+      </w:r>
+      <w:r>
+        <w:rPr>
+          <w:rFonts w:ascii="Calibri" w:hAnsi="Calibri" w:eastAsia="Microsoft JhengHei"/>
+          <w:b w:val="0"/>
+          <w:i w:val="0"/>
+        </w:rPr>
+        <w:t>，不可用正式 evidence 當 connectivity test。</w:t>
+      </w:r>
+    </w:p>
+    <w:p>
+      <w:r>
+        <w:rPr>
+          <w:rFonts w:ascii="Calibri" w:hAnsi="Calibri" w:eastAsia="Microsoft JhengHei"/>
+          <w:b w:val="0"/>
+          <w:i w:val="0"/>
+        </w:rPr>
+        <w:t>環境檔加入：</w:t>
+      </w:r>
+    </w:p>
+    <w:tbl>
+      <w:tblPr>
+        <w:tblStyle w:val="TableGrid"/>
+        <w:tblW w:type="auto" w:w="0"/>
+        <w:jc w:val="center"/>
+        <w:tblLayout w:type="fixed"/>
+        <w:tblLook w:firstColumn="1" w:firstRow="1" w:lastColumn="0" w:lastRow="0" w:noHBand="0" w:noVBand="1" w:val="04A0"/>
+      </w:tblPr>
+      <w:tblGrid>
+        <w:gridCol w:w="9878"/>
+      </w:tblGrid>
+      <w:tr>
+        <w:tc>
+          <w:tcPr>
+            <w:tcW w:type="dxa" w:w="9878"/>
+            <w:shd w:fill="F2F6FA"/>
+            <w:tcMar>
+              <w:top w:w="90" w:type="dxa"/>
+              <w:start w:w="130" w:type="dxa"/>
+              <w:bottom w:w="90" w:type="dxa"/>
+              <w:end w:w="130" w:type="dxa"/>
+            </w:tcMar>
+          </w:tcPr>
+          <w:p>
+            <w:pPr>
+              <w:pStyle w:val="CodeBlock"/>
+              <w:keepLines w:val="0"/>
+            </w:pPr>
+            <w:r>
+              <w:rPr>
+                <w:rFonts w:ascii="Consolas" w:hAnsi="Consolas" w:eastAsia="Microsoft JhengHei"/>
+                <w:sz w:val="16"/>
+              </w:rPr>
+              <w:t>OMNICHECK_AI_ENABLED=false</w:t>
+              <w:br/>
+              <w:t>OMNICHECK_AI_ENDPOINT=http://192.168.68.39:11434/v1/chat/completions</w:t>
+              <w:br/>
+              <w:t>OMNICHECK_AI_MODEL=gpt-oss:20b</w:t>
+              <w:br/>
+              <w:t>OMNICHECK_AI_TIMEOUT_SECONDS=120</w:t>
+              <w:br/>
+              <w:t>OMNICHECK_AI_MAX_ATTEMPTS=2</w:t>
+            </w:r>
+          </w:p>
+        </w:tc>
+      </w:tr>
+    </w:tbl>
+    <w:p>
+      <w:r>
+        <w:rPr>
+          <w:rFonts w:ascii="Calibri" w:hAnsi="Calibri" w:eastAsia="Microsoft JhengHei"/>
+          <w:b w:val="0"/>
+          <w:i w:val="0"/>
+        </w:rPr>
+        <w:t>先保持 disabled，建立 0008 schema-only backup 並記錄 SHA-256，再執行 additive migration：</w:t>
+      </w:r>
+    </w:p>
+    <w:tbl>
+      <w:tblPr>
+        <w:tblStyle w:val="TableGrid"/>
+        <w:tblW w:type="auto" w:w="0"/>
+        <w:jc w:val="center"/>
+        <w:tblLayout w:type="fixed"/>
+        <w:tblLook w:firstColumn="1" w:firstRow="1" w:lastColumn="0" w:lastRow="0" w:noHBand="0" w:noVBand="1" w:val="04A0"/>
+      </w:tblPr>
+      <w:tblGrid>
+        <w:gridCol w:w="9878"/>
+      </w:tblGrid>
+      <w:tr>
+        <w:tc>
+          <w:tcPr>
+            <w:tcW w:type="dxa" w:w="9878"/>
+            <w:shd w:fill="F2F6FA"/>
+            <w:tcMar>
+              <w:top w:w="90" w:type="dxa"/>
+              <w:start w:w="130" w:type="dxa"/>
+              <w:bottom w:w="90" w:type="dxa"/>
+              <w:end w:w="130" w:type="dxa"/>
+            </w:tcMar>
+          </w:tcPr>
+          <w:p>
+            <w:pPr>
+              <w:pStyle w:val="CodeBlock"/>
+              <w:keepLines w:val="0"/>
+            </w:pPr>
+            <w:r>
+              <w:rPr>
+                <w:rFonts w:ascii="Consolas" w:hAnsi="Consolas" w:eastAsia="Microsoft JhengHei"/>
+                <w:sz w:val="16"/>
+              </w:rPr>
+              <w:t>cd /data/omnicheck/app/current</w:t>
+              <w:br/>
+              <w:t>set -a</w:t>
+              <w:br/>
+              <w:t>. /etc/omnicheck-ai/omnicheck.env</w:t>
+              <w:br/>
+              <w:t>set +a</w:t>
+              <w:br/>
+              <w:t>.venv/bin/alembic upgrade 0009_m14_ai_gateway</w:t>
+            </w:r>
+          </w:p>
+        </w:tc>
+      </w:tr>
+    </w:tbl>
+    <w:p>
+      <w:r>
+        <w:rPr>
+          <w:rFonts w:ascii="Calibri" w:hAnsi="Calibri" w:eastAsia="Microsoft JhengHei"/>
+          <w:b w:val="0"/>
+          <w:i w:val="0"/>
+        </w:rPr>
+        <w:t xml:space="preserve">確認只新增 </w:t>
+      </w:r>
+      <w:r>
+        <w:rPr>
+          <w:rFonts w:ascii="Consolas" w:hAnsi="Consolas" w:eastAsia="Microsoft JhengHei"/>
+          <w:b w:val="0"/>
+          <w:i w:val="0"/>
+          <w:color w:val="17365D"/>
+          <w:sz w:val="17"/>
+        </w:rPr>
+        <w:t>omnicheck.ai_gateway_requests</w:t>
+      </w:r>
+      <w:r>
+        <w:rPr>
+          <w:rFonts w:ascii="Calibri" w:hAnsi="Calibri" w:eastAsia="Microsoft JhengHei"/>
+          <w:b w:val="0"/>
+          <w:i w:val="0"/>
+        </w:rPr>
+        <w:t xml:space="preserve">。切換 Application 後先確認 </w:t>
+      </w:r>
+      <w:r>
+        <w:rPr>
+          <w:rFonts w:ascii="Consolas" w:hAnsi="Consolas" w:eastAsia="Microsoft JhengHei"/>
+          <w:b w:val="0"/>
+          <w:i w:val="0"/>
+          <w:color w:val="17365D"/>
+          <w:sz w:val="17"/>
+        </w:rPr>
+        <w:t>/api/health</w:t>
+      </w:r>
+      <w:r>
+        <w:rPr>
+          <w:rFonts w:ascii="Calibri" w:hAnsi="Calibri" w:eastAsia="Microsoft JhengHei"/>
+          <w:b w:val="0"/>
+          <w:i w:val="0"/>
+        </w:rPr>
+        <w:t xml:space="preserve"> 顯示 </w:t>
+      </w:r>
+      <w:r>
+        <w:rPr>
+          <w:rFonts w:ascii="Consolas" w:hAnsi="Consolas" w:eastAsia="Microsoft JhengHei"/>
+          <w:b w:val="0"/>
+          <w:i w:val="0"/>
+          <w:color w:val="17365D"/>
+          <w:sz w:val="17"/>
+        </w:rPr>
+        <w:t>ai_gateway=disabled</w:t>
+      </w:r>
+      <w:r>
+        <w:rPr>
+          <w:rFonts w:ascii="Calibri" w:hAnsi="Calibri" w:eastAsia="Microsoft JhengHei"/>
+          <w:b w:val="0"/>
+          <w:i w:val="0"/>
+        </w:rPr>
+        <w:t xml:space="preserve">，deterministic Job、review、approval、render 正常，再把 </w:t>
+      </w:r>
+      <w:r>
+        <w:rPr>
+          <w:rFonts w:ascii="Consolas" w:hAnsi="Consolas" w:eastAsia="Microsoft JhengHei"/>
+          <w:b w:val="0"/>
+          <w:i w:val="0"/>
+          <w:color w:val="17365D"/>
+          <w:sz w:val="17"/>
+        </w:rPr>
+        <w:t>OMNICHECK_AI_ENABLED=true</w:t>
+      </w:r>
+      <w:r>
+        <w:rPr>
+          <w:rFonts w:ascii="Calibri" w:hAnsi="Calibri" w:eastAsia="Microsoft JhengHei"/>
+          <w:b w:val="0"/>
+          <w:i w:val="0"/>
+        </w:rPr>
+        <w:t xml:space="preserve"> 並只重啟 Web。</w:t>
+      </w:r>
+    </w:p>
+    <w:p>
+      <w:r>
+        <w:rPr>
+          <w:rFonts w:ascii="Calibri" w:hAnsi="Calibri" w:eastAsia="Microsoft JhengHei"/>
+          <w:b w:val="0"/>
+          <w:i w:val="0"/>
+        </w:rPr>
+        <w:t>AI E2E 驗收：</w:t>
+      </w:r>
+    </w:p>
+    <w:p>
+      <w:pPr>
+        <w:pStyle w:val="ListNumber"/>
+      </w:pPr>
+      <w:r>
+        <w:rPr>
+          <w:rFonts w:ascii="Calibri" w:hAnsi="Calibri" w:eastAsia="Microsoft JhengHei"/>
+          <w:b w:val="0"/>
+          <w:i w:val="0"/>
+        </w:rPr>
+        <w:t xml:space="preserve">對 generated Section 呼叫 </w:t>
+      </w:r>
+      <w:r>
+        <w:rPr>
+          <w:rFonts w:ascii="Consolas" w:hAnsi="Consolas" w:eastAsia="Microsoft JhengHei"/>
+          <w:b w:val="0"/>
+          <w:i w:val="0"/>
+          <w:color w:val="17365D"/>
+          <w:sz w:val="17"/>
+        </w:rPr>
+        <w:t>generate-ai-draft</w:t>
+      </w:r>
+      <w:r>
+        <w:rPr>
+          <w:rFonts w:ascii="Calibri" w:hAnsi="Calibri" w:eastAsia="Microsoft JhengHei"/>
+          <w:b w:val="0"/>
+          <w:i w:val="0"/>
+        </w:rPr>
+        <w:t>。</w:t>
+      </w:r>
+    </w:p>
+    <w:p>
+      <w:pPr>
+        <w:pStyle w:val="ListNumber"/>
+      </w:pPr>
+      <w:r>
+        <w:rPr>
+          <w:rFonts w:ascii="Calibri" w:hAnsi="Calibri" w:eastAsia="Microsoft JhengHei"/>
+          <w:b w:val="0"/>
+          <w:i w:val="0"/>
+        </w:rPr>
+        <w:t>確認 revision 加一、workflow status 為 ai_drafted、selected source 仍為 deterministic。</w:t>
+      </w:r>
+    </w:p>
+    <w:p>
+      <w:pPr>
+        <w:pStyle w:val="ListNumber"/>
+      </w:pPr>
+      <w:r>
+        <w:rPr>
+          <w:rFonts w:ascii="Calibri" w:hAnsi="Calibri" w:eastAsia="Microsoft JhengHei"/>
+          <w:b w:val="0"/>
+          <w:i w:val="0"/>
+        </w:rPr>
+        <w:t>檢查 EDB audit 的 provider、model、prompt version、actor、attempts、duration、SHA-256 與 usage。</w:t>
+      </w:r>
+    </w:p>
+    <w:p>
+      <w:pPr>
+        <w:pStyle w:val="ListNumber"/>
+      </w:pPr>
+      <w:r>
+        <w:rPr>
+          <w:rFonts w:ascii="Calibri" w:hAnsi="Calibri" w:eastAsia="Microsoft JhengHei"/>
+          <w:b w:val="0"/>
+          <w:i w:val="0"/>
+        </w:rPr>
+        <w:t>確認 sanitized prompt 無 customer、hostname、IP、email、password 或 raw evidence。</w:t>
+      </w:r>
+    </w:p>
+    <w:p>
+      <w:pPr>
+        <w:pStyle w:val="ListNumber"/>
+      </w:pPr>
+      <w:r>
+        <w:rPr>
+          <w:rFonts w:ascii="Calibri" w:hAnsi="Calibri" w:eastAsia="Microsoft JhengHei"/>
+          <w:b w:val="0"/>
+          <w:i w:val="0"/>
+        </w:rPr>
+        <w:t>確認 reasoning 未保存。</w:t>
+      </w:r>
+    </w:p>
+    <w:p>
+      <w:pPr>
+        <w:pStyle w:val="ListNumber"/>
+      </w:pPr>
+      <w:r>
+        <w:rPr>
+          <w:rFonts w:ascii="Calibri" w:hAnsi="Calibri" w:eastAsia="Microsoft JhengHei"/>
+          <w:b w:val="0"/>
+          <w:i w:val="0"/>
+        </w:rPr>
+        <w:t>在 review／approval 前重新 render，正式報告不得出現 AI draft。</w:t>
+      </w:r>
+    </w:p>
+    <w:p>
+      <w:pPr>
+        <w:pStyle w:val="ListNumber"/>
+      </w:pPr>
+      <w:r>
+        <w:rPr>
+          <w:rFonts w:ascii="Calibri" w:hAnsi="Calibri" w:eastAsia="Microsoft JhengHei"/>
+          <w:b w:val="0"/>
+          <w:i w:val="0"/>
+        </w:rPr>
+        <w:t>完成人工 review／approval 後重新 render，正式報告只出現 approved 內容。</w:t>
+      </w:r>
+    </w:p>
+    <w:p>
+      <w:pPr>
+        <w:pStyle w:val="ListNumber"/>
+      </w:pPr>
+      <w:r>
+        <w:rPr>
+          <w:rFonts w:ascii="Calibri" w:hAnsi="Calibri" w:eastAsia="Microsoft JhengHei"/>
+          <w:b w:val="0"/>
+          <w:i w:val="0"/>
+        </w:rPr>
+        <w:t>暫時使用無效 endpoint 或測試 transport 驗證 fallback；Section revision 與 deterministic 產報不得改變。</w:t>
+      </w:r>
+    </w:p>
+    <w:p>
+      <w:r>
+        <w:rPr>
+          <w:rFonts w:ascii="Calibri" w:hAnsi="Calibri" w:eastAsia="Microsoft JhengHei"/>
+          <w:b w:val="0"/>
+          <w:i w:val="0"/>
+        </w:rPr>
+        <w:t xml:space="preserve">緊急停用只需設定 </w:t>
+      </w:r>
+      <w:r>
+        <w:rPr>
+          <w:rFonts w:ascii="Consolas" w:hAnsi="Consolas" w:eastAsia="Microsoft JhengHei"/>
+          <w:b w:val="0"/>
+          <w:i w:val="0"/>
+          <w:color w:val="17365D"/>
+          <w:sz w:val="17"/>
+        </w:rPr>
+        <w:t>OMNICHECK_AI_ENABLED=false</w:t>
+      </w:r>
+      <w:r>
+        <w:rPr>
+          <w:rFonts w:ascii="Calibri" w:hAnsi="Calibri" w:eastAsia="Microsoft JhengHei"/>
+          <w:b w:val="0"/>
+          <w:i w:val="0"/>
+        </w:rPr>
+        <w:t xml:space="preserve"> 並重啟 Web。Application 可切回 M10.3.2；0009 audit table 保留。正式 EDB 不 downgrade。</w:t>
       </w:r>
     </w:p>
     <w:p>

</xml_diff>

<commit_message>
docs: record M14.1 company Ollama validation
</commit_message>
<xml_diff>
--- a/docs/OMNICHECK_AI_BUILD_AND_OPERATIONS_GUIDE.docx
+++ b/docs/OMNICHECK_AI_BUILD_AND_OPERATIONS_GUIDE.docx
@@ -2137,7 +2137,7 @@
                 <w:i w:val="0"/>
                 <w:sz w:val="17"/>
               </w:rPr>
-              <w:t>0.14.1-rc.1</w:t>
+              <w:t>0.14.1</w:t>
             </w:r>
           </w:p>
         </w:tc>
@@ -2215,7 +2215,7 @@
                 <w:i w:val="0"/>
                 <w:sz w:val="17"/>
               </w:rPr>
-              <w:t>本機 100 tests、Alembic head 0009；App VM 至 gpt-oss:20b 最小連線通過；待公司 migration/E2E</w:t>
+              <w:t>本機／公司 101 tests、EDB 0009、真實 gpt-oss:20b draft→review→approval→render E2E 通過</w:t>
             </w:r>
           </w:p>
         </w:tc>
@@ -5310,7 +5310,7 @@
                 <w:i w:val="0"/>
                 <w:sz w:val="17"/>
               </w:rPr>
-              <w:t>程式完成、待公司 E2E</w:t>
+              <w:t>完成、公司真實模型 E2E 通過</w:t>
             </w:r>
           </w:p>
         </w:tc>
@@ -5336,7 +5336,7 @@
                 <w:i w:val="0"/>
                 <w:sz w:val="17"/>
               </w:rPr>
-              <w:t>Ollama Section draft、遮蔽、audit、fallback；預設 disabled</w:t>
+              <w:t>Ollama Section draft、遮蔽、audit、fallback；feature flag 可立即停用</w:t>
             </w:r>
           </w:p>
         </w:tc>

</xml_diff>

<commit_message>
feat: add controlled AI section batches
</commit_message>
<xml_diff>
--- a/docs/OMNICHECK_AI_BUILD_AND_OPERATIONS_GUIDE.docx
+++ b/docs/OMNICHECK_AI_BUILD_AND_OPERATIONS_GUIDE.docx
@@ -5364,6 +5364,86 @@
                 <w:i w:val="0"/>
                 <w:sz w:val="17"/>
               </w:rPr>
+              <w:t>M14.2</w:t>
+            </w:r>
+          </w:p>
+        </w:tc>
+        <w:tc>
+          <w:tcPr>
+            <w:tcW w:type="dxa" w:w="3293"/>
+            <w:vAlign w:val="center"/>
+            <w:tcMar>
+              <w:top w:w="45" w:type="dxa"/>
+              <w:start w:w="120" w:type="dxa"/>
+              <w:bottom w:w="45" w:type="dxa"/>
+              <w:end w:w="120" w:type="dxa"/>
+            </w:tcMar>
+          </w:tcPr>
+          <w:p>
+            <w:pPr>
+              <w:spacing w:after="0"/>
+            </w:pPr>
+            <w:r>
+              <w:rPr>
+                <w:rFonts w:ascii="Calibri" w:hAnsi="Calibri" w:eastAsia="Microsoft JhengHei"/>
+                <w:b w:val="0"/>
+                <w:i w:val="0"/>
+                <w:sz w:val="17"/>
+              </w:rPr>
+              <w:t>本機候選完成、公司待驗證</w:t>
+            </w:r>
+          </w:p>
+        </w:tc>
+        <w:tc>
+          <w:tcPr>
+            <w:tcW w:type="dxa" w:w="3293"/>
+            <w:vAlign w:val="center"/>
+            <w:tcMar>
+              <w:top w:w="45" w:type="dxa"/>
+              <w:start w:w="120" w:type="dxa"/>
+              <w:bottom w:w="45" w:type="dxa"/>
+              <w:end w:w="120" w:type="dxa"/>
+            </w:tcMar>
+          </w:tcPr>
+          <w:p>
+            <w:pPr>
+              <w:spacing w:after="0"/>
+            </w:pPr>
+            <w:r>
+              <w:rPr>
+                <w:rFonts w:ascii="Calibri" w:hAnsi="Calibri" w:eastAsia="Microsoft JhengHei"/>
+                <w:b w:val="0"/>
+                <w:i w:val="0"/>
+                <w:sz w:val="17"/>
+              </w:rPr>
+              <w:t>Section 審核工作台、EDB durable batch、逐筆限流、進度與人工核准</w:t>
+            </w:r>
+          </w:p>
+        </w:tc>
+      </w:tr>
+      <w:tr>
+        <w:tc>
+          <w:tcPr>
+            <w:tcW w:type="dxa" w:w="3293"/>
+            <w:vAlign w:val="center"/>
+            <w:tcMar>
+              <w:top w:w="45" w:type="dxa"/>
+              <w:start w:w="120" w:type="dxa"/>
+              <w:bottom w:w="45" w:type="dxa"/>
+              <w:end w:w="120" w:type="dxa"/>
+            </w:tcMar>
+          </w:tcPr>
+          <w:p>
+            <w:pPr>
+              <w:spacing w:after="0"/>
+            </w:pPr>
+            <w:r>
+              <w:rPr>
+                <w:rFonts w:ascii="Calibri" w:hAnsi="Calibri" w:eastAsia="Microsoft JhengHei"/>
+                <w:b w:val="0"/>
+                <w:i w:val="0"/>
+                <w:sz w:val="17"/>
+              </w:rPr>
               <w:t>M11～M15</w:t>
             </w:r>
           </w:p>
@@ -14275,6 +14355,10 @@
               <w:t>OMNICHECK_AI_TIMEOUT_SECONDS=120</w:t>
               <w:br/>
               <w:t>OMNICHECK_AI_MAX_ATTEMPTS=2</w:t>
+              <w:br/>
+              <w:t>OMNICHECK_AI_BATCH_MAX_ITEMS=5</w:t>
+              <w:br/>
+              <w:t>OMNICHECK_AI_MIN_INTERVAL_SECONDS=1</w:t>
             </w:r>
           </w:p>
         </w:tc>
@@ -14577,6 +14661,392 @@
           <w:i w:val="0"/>
         </w:rPr>
         <w:t xml:space="preserve"> 並重啟 Web。Application 可切回 M10.3.2；0009 audit table 保留。正式 EDB 不 downgrade。</w:t>
+      </w:r>
+    </w:p>
+    <w:p>
+      <w:pPr>
+        <w:pStyle w:val="Heading3"/>
+      </w:pPr>
+      <w:r>
+        <w:rPr>
+          <w:rFonts w:ascii="Calibri" w:hAnsi="Calibri" w:eastAsia="Microsoft JhengHei"/>
+          <w:b w:val="0"/>
+          <w:i w:val="0"/>
+        </w:rPr>
+        <w:t>13.15 M14.2 Section 審核工作台與受控批次部署</w:t>
+      </w:r>
+    </w:p>
+    <w:p>
+      <w:r>
+        <w:rPr>
+          <w:rFonts w:ascii="Calibri" w:hAnsi="Calibri" w:eastAsia="Microsoft JhengHei"/>
+          <w:b w:val="0"/>
+          <w:i w:val="0"/>
+        </w:rPr>
+        <w:t xml:space="preserve">0010 migration 只新增 </w:t>
+      </w:r>
+      <w:r>
+        <w:rPr>
+          <w:rFonts w:ascii="Consolas" w:hAnsi="Consolas" w:eastAsia="Microsoft JhengHei"/>
+          <w:b w:val="0"/>
+          <w:i w:val="0"/>
+          <w:color w:val="17365D"/>
+          <w:sz w:val="17"/>
+        </w:rPr>
+        <w:t>omnicheck.ai_draft_batches</w:t>
+      </w:r>
+      <w:r>
+        <w:rPr>
+          <w:rFonts w:ascii="Calibri" w:hAnsi="Calibri" w:eastAsia="Microsoft JhengHei"/>
+          <w:b w:val="0"/>
+          <w:i w:val="0"/>
+        </w:rPr>
+        <w:t xml:space="preserve"> 與 </w:t>
+      </w:r>
+      <w:r>
+        <w:rPr>
+          <w:rFonts w:ascii="Consolas" w:hAnsi="Consolas" w:eastAsia="Microsoft JhengHei"/>
+          <w:b w:val="0"/>
+          <w:i w:val="0"/>
+          <w:color w:val="17365D"/>
+          <w:sz w:val="17"/>
+        </w:rPr>
+        <w:t>omnicheck.ai_draft_batch_items</w:t>
+      </w:r>
+      <w:r>
+        <w:rPr>
+          <w:rFonts w:ascii="Calibri" w:hAnsi="Calibri" w:eastAsia="Microsoft JhengHei"/>
+          <w:b w:val="0"/>
+          <w:i w:val="0"/>
+        </w:rPr>
+        <w:t>。先備份 0009 schema 並記錄 SHA-256，再執行：</w:t>
+      </w:r>
+    </w:p>
+    <w:tbl>
+      <w:tblPr>
+        <w:tblStyle w:val="TableGrid"/>
+        <w:tblW w:type="auto" w:w="0"/>
+        <w:jc w:val="center"/>
+        <w:tblLayout w:type="fixed"/>
+        <w:tblLook w:firstColumn="1" w:firstRow="1" w:lastColumn="0" w:lastRow="0" w:noHBand="0" w:noVBand="1" w:val="04A0"/>
+      </w:tblPr>
+      <w:tblGrid>
+        <w:gridCol w:w="9878"/>
+      </w:tblGrid>
+      <w:tr>
+        <w:tc>
+          <w:tcPr>
+            <w:tcW w:type="dxa" w:w="9878"/>
+            <w:shd w:fill="F2F6FA"/>
+            <w:tcMar>
+              <w:top w:w="90" w:type="dxa"/>
+              <w:start w:w="130" w:type="dxa"/>
+              <w:bottom w:w="90" w:type="dxa"/>
+              <w:end w:w="130" w:type="dxa"/>
+            </w:tcMar>
+          </w:tcPr>
+          <w:p>
+            <w:pPr>
+              <w:pStyle w:val="CodeBlock"/>
+              <w:keepLines w:val="0"/>
+            </w:pPr>
+            <w:r>
+              <w:rPr>
+                <w:rFonts w:ascii="Consolas" w:hAnsi="Consolas" w:eastAsia="Microsoft JhengHei"/>
+                <w:sz w:val="16"/>
+              </w:rPr>
+              <w:t>cd /data/omnicheck/app/current</w:t>
+              <w:br/>
+              <w:t>set -a</w:t>
+              <w:br/>
+              <w:t>. /etc/omnicheck-ai/omnicheck.env</w:t>
+              <w:br/>
+              <w:t>set +a</w:t>
+              <w:br/>
+              <w:t>.venv/bin/alembic upgrade 0010_m14_2_batches</w:t>
+            </w:r>
+          </w:p>
+        </w:tc>
+      </w:tr>
+    </w:tbl>
+    <w:p>
+      <w:r>
+        <w:rPr>
+          <w:rFonts w:ascii="Calibri" w:hAnsi="Calibri" w:eastAsia="Microsoft JhengHei"/>
+          <w:b w:val="0"/>
+          <w:i w:val="0"/>
+        </w:rPr>
+        <w:t>環境檔加入：</w:t>
+      </w:r>
+    </w:p>
+    <w:tbl>
+      <w:tblPr>
+        <w:tblStyle w:val="TableGrid"/>
+        <w:tblW w:type="auto" w:w="0"/>
+        <w:jc w:val="center"/>
+        <w:tblLayout w:type="fixed"/>
+        <w:tblLook w:firstColumn="1" w:firstRow="1" w:lastColumn="0" w:lastRow="0" w:noHBand="0" w:noVBand="1" w:val="04A0"/>
+      </w:tblPr>
+      <w:tblGrid>
+        <w:gridCol w:w="9878"/>
+      </w:tblGrid>
+      <w:tr>
+        <w:tc>
+          <w:tcPr>
+            <w:tcW w:type="dxa" w:w="9878"/>
+            <w:shd w:fill="F2F6FA"/>
+            <w:tcMar>
+              <w:top w:w="90" w:type="dxa"/>
+              <w:start w:w="130" w:type="dxa"/>
+              <w:bottom w:w="90" w:type="dxa"/>
+              <w:end w:w="130" w:type="dxa"/>
+            </w:tcMar>
+          </w:tcPr>
+          <w:p>
+            <w:pPr>
+              <w:pStyle w:val="CodeBlock"/>
+              <w:keepLines w:val="0"/>
+            </w:pPr>
+            <w:r>
+              <w:rPr>
+                <w:rFonts w:ascii="Consolas" w:hAnsi="Consolas" w:eastAsia="Microsoft JhengHei"/>
+                <w:sz w:val="16"/>
+              </w:rPr>
+              <w:t>OMNICHECK_AI_BATCH_MAX_ITEMS=5</w:t>
+              <w:br/>
+              <w:t>OMNICHECK_AI_MIN_INTERVAL_SECONDS=1</w:t>
+            </w:r>
+          </w:p>
+        </w:tc>
+      </w:tr>
+    </w:tbl>
+    <w:p>
+      <w:r>
+        <w:rPr>
+          <w:rFonts w:ascii="Consolas" w:hAnsi="Consolas" w:eastAsia="Microsoft JhengHei"/>
+          <w:b w:val="0"/>
+          <w:i w:val="0"/>
+          <w:color w:val="17365D"/>
+          <w:sz w:val="17"/>
+        </w:rPr>
+        <w:t>OMNICHECK_AI_BATCH_MAX_ITEMS</w:t>
+      </w:r>
+      <w:r>
+        <w:rPr>
+          <w:rFonts w:ascii="Calibri" w:hAnsi="Calibri" w:eastAsia="Microsoft JhengHei"/>
+          <w:b w:val="0"/>
+          <w:i w:val="0"/>
+        </w:rPr>
+        <w:t xml:space="preserve"> 合法範圍為 1～20，建議公司單一 Ollama 先維持 5。</w:t>
+      </w:r>
+      <w:r>
+        <w:rPr>
+          <w:rFonts w:ascii="Consolas" w:hAnsi="Consolas" w:eastAsia="Microsoft JhengHei"/>
+          <w:b w:val="0"/>
+          <w:i w:val="0"/>
+          <w:color w:val="17365D"/>
+          <w:sz w:val="17"/>
+        </w:rPr>
+        <w:t>OMNICHECK_AI_MIN_INTERVAL_SECONDS</w:t>
+      </w:r>
+      <w:r>
+        <w:rPr>
+          <w:rFonts w:ascii="Calibri" w:hAnsi="Calibri" w:eastAsia="Microsoft JhengHei"/>
+          <w:b w:val="0"/>
+          <w:i w:val="0"/>
+        </w:rPr>
+        <w:t xml:space="preserve"> 是同一批各請求之間的最小秒數，Worker 會限制最高 sleep 30 秒。Web 和 Worker 必須讀到相同 AI endpoint／model；只重啟 Web 不會讓 Worker 套用新批次參數。</w:t>
+      </w:r>
+    </w:p>
+    <w:p>
+      <w:r>
+        <w:rPr>
+          <w:rFonts w:ascii="Calibri" w:hAnsi="Calibri" w:eastAsia="Microsoft JhengHei"/>
+          <w:b w:val="0"/>
+          <w:i w:val="0"/>
+        </w:rPr>
+        <w:t>部署後重啟 Web 與 Worker，依序驗收：</w:t>
+      </w:r>
+    </w:p>
+    <w:p>
+      <w:pPr>
+        <w:pStyle w:val="ListNumber"/>
+      </w:pPr>
+      <w:r>
+        <w:rPr>
+          <w:rFonts w:ascii="Calibri" w:hAnsi="Calibri" w:eastAsia="Microsoft JhengHei"/>
+          <w:b w:val="0"/>
+          <w:i w:val="0"/>
+        </w:rPr>
+        <w:t>完成一個測試 Job，在 Section 審核工作台載入 Job ID。</w:t>
+      </w:r>
+    </w:p>
+    <w:p>
+      <w:pPr>
+        <w:pStyle w:val="ListNumber"/>
+      </w:pPr>
+      <w:r>
+        <w:rPr>
+          <w:rFonts w:ascii="Calibri" w:hAnsi="Calibri" w:eastAsia="Microsoft JhengHei"/>
+          <w:b w:val="0"/>
+          <w:i w:val="0"/>
+        </w:rPr>
+        <w:t>勾選 2～3 個 generated Section 建立 AI batch，確認 API 回傳 202／queued。</w:t>
+      </w:r>
+    </w:p>
+    <w:p>
+      <w:pPr>
+        <w:pStyle w:val="ListNumber"/>
+      </w:pPr>
+      <w:r>
+        <w:rPr>
+          <w:rFonts w:ascii="Calibri" w:hAnsi="Calibri" w:eastAsia="Microsoft JhengHei"/>
+          <w:b w:val="0"/>
+          <w:i w:val="0"/>
+        </w:rPr>
+        <w:t>確認 Worker 逐筆執行，畫面顯示 completed／partial／failed 與成功、fallback、conflict 數量。</w:t>
+      </w:r>
+    </w:p>
+    <w:p>
+      <w:pPr>
+        <w:pStyle w:val="ListNumber"/>
+      </w:pPr>
+      <w:r>
+        <w:rPr>
+          <w:rFonts w:ascii="Calibri" w:hAnsi="Calibri" w:eastAsia="Microsoft JhengHei"/>
+          <w:b w:val="0"/>
+          <w:i w:val="0"/>
+        </w:rPr>
+        <w:t>確認成功項目只進入 ai_drafted 且 selected source 仍為 deterministic。</w:t>
+      </w:r>
+    </w:p>
+    <w:p>
+      <w:pPr>
+        <w:pStyle w:val="ListNumber"/>
+      </w:pPr>
+      <w:r>
+        <w:rPr>
+          <w:rFonts w:ascii="Calibri" w:hAnsi="Calibri" w:eastAsia="Microsoft JhengHei"/>
+          <w:b w:val="0"/>
+          <w:i w:val="0"/>
+        </w:rPr>
+        <w:t>修改一項文字並儲存 review，再核准；未 reviewed 的項目不得直接核准。</w:t>
+      </w:r>
+    </w:p>
+    <w:p>
+      <w:pPr>
+        <w:pStyle w:val="ListNumber"/>
+      </w:pPr>
+      <w:r>
+        <w:rPr>
+          <w:rFonts w:ascii="Calibri" w:hAnsi="Calibri" w:eastAsia="Microsoft JhengHei"/>
+          <w:b w:val="0"/>
+          <w:i w:val="0"/>
+        </w:rPr>
+        <w:t>重新產報，確認只有 approved 內容取代 deterministic。</w:t>
+      </w:r>
+    </w:p>
+    <w:p>
+      <w:pPr>
+        <w:pStyle w:val="ListNumber"/>
+      </w:pPr>
+      <w:r>
+        <w:rPr>
+          <w:rFonts w:ascii="Calibri" w:hAnsi="Calibri" w:eastAsia="Microsoft JhengHei"/>
+          <w:b w:val="0"/>
+          <w:i w:val="0"/>
+        </w:rPr>
+        <w:t>批次執行前先變更一個 revision，確認該項記錄 conflict，其他項目繼續。</w:t>
+      </w:r>
+    </w:p>
+    <w:p>
+      <w:pPr>
+        <w:pStyle w:val="ListNumber"/>
+      </w:pPr>
+      <w:r>
+        <w:rPr>
+          <w:rFonts w:ascii="Calibri" w:hAnsi="Calibri" w:eastAsia="Microsoft JhengHei"/>
+          <w:b w:val="0"/>
+          <w:i w:val="0"/>
+        </w:rPr>
+        <w:t>暫時停用 AI，確認不能建立新 batch，既有 deterministic 報告仍可產生。</w:t>
+      </w:r>
+    </w:p>
+    <w:p>
+      <w:pPr>
+        <w:pStyle w:val="ListNumber"/>
+      </w:pPr>
+      <w:r>
+        <w:rPr>
+          <w:rFonts w:ascii="Calibri" w:hAnsi="Calibri" w:eastAsia="Microsoft JhengHei"/>
+          <w:b w:val="0"/>
+          <w:i w:val="0"/>
+        </w:rPr>
+        <w:t xml:space="preserve">Worker 執行中重啟時，超過 </w:t>
+      </w:r>
+      <w:r>
+        <w:rPr>
+          <w:rFonts w:ascii="Consolas" w:hAnsi="Consolas" w:eastAsia="Microsoft JhengHei"/>
+          <w:b w:val="0"/>
+          <w:i w:val="0"/>
+          <w:color w:val="17365D"/>
+          <w:sz w:val="17"/>
+        </w:rPr>
+        <w:t>OMNICHECK_WORKER_STALE_SECONDS</w:t>
+      </w:r>
+      <w:r>
+        <w:rPr>
+          <w:rFonts w:ascii="Calibri" w:hAnsi="Calibri" w:eastAsia="Microsoft JhengHei"/>
+          <w:b w:val="0"/>
+          <w:i w:val="0"/>
+        </w:rPr>
+        <w:t xml:space="preserve"> 的 running batch 應回復 queued；重試時 revision gate 防止重複覆寫。</w:t>
+      </w:r>
+    </w:p>
+    <w:p>
+      <w:r>
+        <w:rPr>
+          <w:rFonts w:ascii="Calibri" w:hAnsi="Calibri" w:eastAsia="Microsoft JhengHei"/>
+          <w:b w:val="0"/>
+          <w:i w:val="0"/>
+        </w:rPr>
+        <w:t xml:space="preserve">Rollback：先設定 </w:t>
+      </w:r>
+      <w:r>
+        <w:rPr>
+          <w:rFonts w:ascii="Consolas" w:hAnsi="Consolas" w:eastAsia="Microsoft JhengHei"/>
+          <w:b w:val="0"/>
+          <w:i w:val="0"/>
+          <w:color w:val="17365D"/>
+          <w:sz w:val="17"/>
+        </w:rPr>
+        <w:t>OMNICHECK_AI_ENABLED=false</w:t>
+      </w:r>
+      <w:r>
+        <w:rPr>
+          <w:rFonts w:ascii="Calibri" w:hAnsi="Calibri" w:eastAsia="Microsoft JhengHei"/>
+          <w:b w:val="0"/>
+          <w:i w:val="0"/>
+        </w:rPr>
+        <w:t xml:space="preserve">，再將 Application symlink 切回 </w:t>
+      </w:r>
+      <w:r>
+        <w:rPr>
+          <w:rFonts w:ascii="Consolas" w:hAnsi="Consolas" w:eastAsia="Microsoft JhengHei"/>
+          <w:b w:val="0"/>
+          <w:i w:val="0"/>
+          <w:color w:val="17365D"/>
+          <w:sz w:val="17"/>
+        </w:rPr>
+        <w:t>m14.1</w:t>
+      </w:r>
+      <w:r>
+        <w:rPr>
+          <w:rFonts w:ascii="Calibri" w:hAnsi="Calibri" w:eastAsia="Microsoft JhengHei"/>
+          <w:b w:val="0"/>
+          <w:i w:val="0"/>
+        </w:rPr>
+        <w:t xml:space="preserve"> 並重啟 Web／Worker；0010 tables 保留，採 forward-fix，不在正式 EDB downgrade。</w:t>
       </w:r>
     </w:p>
     <w:p>

</xml_diff>

<commit_message>
fix: isolate PEM backend database evidence
</commit_message>
<xml_diff>
--- a/docs/OMNICHECK_AI_BUILD_AND_OPERATIONS_GUIDE.docx
+++ b/docs/OMNICHECK_AI_BUILD_AND_OPERATIONS_GUIDE.docx
@@ -1513,6 +1513,112 @@
                 <w:sz w:val="17"/>
               </w:rPr>
               <w:t>驗證狀態</w:t>
+            </w:r>
+          </w:p>
+        </w:tc>
+      </w:tr>
+      <w:tr>
+        <w:tc>
+          <w:tcPr>
+            <w:tcW w:type="dxa" w:w="2470"/>
+            <w:vAlign w:val="center"/>
+            <w:tcMar>
+              <w:top w:w="45" w:type="dxa"/>
+              <w:start w:w="120" w:type="dxa"/>
+              <w:bottom w:w="45" w:type="dxa"/>
+              <w:end w:w="120" w:type="dxa"/>
+            </w:tcMar>
+          </w:tcPr>
+          <w:p>
+            <w:pPr>
+              <w:spacing w:after="0"/>
+            </w:pPr>
+            <w:r>
+              <w:rPr>
+                <w:rFonts w:ascii="Calibri" w:hAnsi="Calibri" w:eastAsia="Microsoft JhengHei"/>
+                <w:b w:val="0"/>
+                <w:i w:val="0"/>
+                <w:sz w:val="17"/>
+              </w:rPr>
+              <w:t>0.14.2.1-candidate</w:t>
+            </w:r>
+          </w:p>
+        </w:tc>
+        <w:tc>
+          <w:tcPr>
+            <w:tcW w:type="dxa" w:w="2470"/>
+            <w:vAlign w:val="center"/>
+            <w:tcMar>
+              <w:top w:w="45" w:type="dxa"/>
+              <w:start w:w="120" w:type="dxa"/>
+              <w:bottom w:w="45" w:type="dxa"/>
+              <w:end w:w="120" w:type="dxa"/>
+            </w:tcMar>
+          </w:tcPr>
+          <w:p>
+            <w:pPr>
+              <w:spacing w:after="0"/>
+            </w:pPr>
+            <w:r>
+              <w:rPr>
+                <w:rFonts w:ascii="Calibri" w:hAnsi="Calibri" w:eastAsia="Microsoft JhengHei"/>
+                <w:b w:val="0"/>
+                <w:i w:val="0"/>
+                <w:sz w:val="17"/>
+              </w:rPr>
+              <w:t>2026-08-12</w:t>
+            </w:r>
+          </w:p>
+        </w:tc>
+        <w:tc>
+          <w:tcPr>
+            <w:tcW w:type="dxa" w:w="2470"/>
+            <w:vAlign w:val="center"/>
+            <w:tcMar>
+              <w:top w:w="45" w:type="dxa"/>
+              <w:start w:w="120" w:type="dxa"/>
+              <w:bottom w:w="45" w:type="dxa"/>
+              <w:end w:w="120" w:type="dxa"/>
+            </w:tcMar>
+          </w:tcPr>
+          <w:p>
+            <w:pPr>
+              <w:spacing w:after="0"/>
+            </w:pPr>
+            <w:r>
+              <w:rPr>
+                <w:rFonts w:ascii="Calibri" w:hAnsi="Calibri" w:eastAsia="Microsoft JhengHei"/>
+                <w:b w:val="0"/>
+                <w:i w:val="0"/>
+                <w:sz w:val="17"/>
+              </w:rPr>
+              <w:t>PEM backend Database Output 自動映射唯一 PEM Witness、後端 Scope 防繞過、Section key 寫入前唯一性 QA</w:t>
+            </w:r>
+          </w:p>
+        </w:tc>
+        <w:tc>
+          <w:tcPr>
+            <w:tcW w:type="dxa" w:w="2470"/>
+            <w:vAlign w:val="center"/>
+            <w:tcMar>
+              <w:top w:w="45" w:type="dxa"/>
+              <w:start w:w="120" w:type="dxa"/>
+              <w:bottom w:w="45" w:type="dxa"/>
+              <w:end w:w="120" w:type="dxa"/>
+            </w:tcMar>
+          </w:tcPr>
+          <w:p>
+            <w:pPr>
+              <w:spacing w:after="0"/>
+            </w:pPr>
+            <w:r>
+              <w:rPr>
+                <w:rFonts w:ascii="Calibri" w:hAnsi="Calibri" w:eastAsia="Microsoft JhengHei"/>
+                <w:b w:val="0"/>
+                <w:i w:val="0"/>
+                <w:sz w:val="17"/>
+              </w:rPr>
+              <w:t>本機 106 tests 通過；公司原失敗案件待回歸驗證</w:t>
             </w:r>
           </w:p>
         </w:tc>
@@ -12006,6 +12112,80 @@
     <w:p>
       <w:r>
         <w:rPr>
+          <w:rFonts w:ascii="Consolas" w:hAnsi="Consolas" w:eastAsia="Microsoft JhengHei"/>
+          <w:b w:val="0"/>
+          <w:i w:val="0"/>
+          <w:color w:val="17365D"/>
+          <w:sz w:val="17"/>
+        </w:rPr>
+        <w:t>&lt;日期&gt;_PEM_check/</w:t>
+      </w:r>
+      <w:r>
+        <w:rPr>
+          <w:rFonts w:ascii="Calibri" w:hAnsi="Calibri" w:eastAsia="Microsoft JhengHei"/>
+          <w:b w:val="0"/>
+          <w:i w:val="0"/>
+        </w:rPr>
+        <w:t xml:space="preserve"> 內的 Database Output 是 PEM Server 的後端 PostgreSQL，不是客戶業務 Primary。當案件只有一個承載 PEM 的 Witness 時，Discovery 必須將來源建議為該節點；Scope controller 也會以 </w:t>
+      </w:r>
+      <w:r>
+        <w:rPr>
+          <w:rFonts w:ascii="Consolas" w:hAnsi="Consolas" w:eastAsia="Microsoft JhengHei"/>
+          <w:b w:val="0"/>
+          <w:i w:val="0"/>
+          <w:color w:val="17365D"/>
+          <w:sz w:val="17"/>
+        </w:rPr>
+        <w:t>service_path</w:t>
+      </w:r>
+      <w:r>
+        <w:rPr>
+          <w:rFonts w:ascii="Calibri" w:hAnsi="Calibri" w:eastAsia="Microsoft JhengHei"/>
+          <w:b w:val="0"/>
+          <w:i w:val="0"/>
+        </w:rPr>
+        <w:t xml:space="preserve"> 與 </w:t>
+      </w:r>
+      <w:r>
+        <w:rPr>
+          <w:rFonts w:ascii="Consolas" w:hAnsi="Consolas" w:eastAsia="Microsoft JhengHei"/>
+          <w:b w:val="0"/>
+          <w:i w:val="0"/>
+          <w:color w:val="17365D"/>
+          <w:sz w:val="17"/>
+        </w:rPr>
+        <w:t>policy.pem_backend_database_scope</w:t>
+      </w:r>
+      <w:r>
+        <w:rPr>
+          <w:rFonts w:ascii="Calibri" w:hAnsi="Calibri" w:eastAsia="Microsoft JhengHei"/>
+          <w:b w:val="0"/>
+          <w:i w:val="0"/>
+        </w:rPr>
+        <w:t xml:space="preserve"> 再次保護，即使舊案件曾誤存 Primary mapping，仍須排除於業務資料庫評估。若產生重複的 </w:t>
+      </w:r>
+      <w:r>
+        <w:rPr>
+          <w:rFonts w:ascii="Consolas" w:hAnsi="Consolas" w:eastAsia="Microsoft JhengHei"/>
+          <w:b w:val="0"/>
+          <w:i w:val="0"/>
+          <w:color w:val="17365D"/>
+          <w:sz w:val="17"/>
+        </w:rPr>
+        <w:t>section_id:node:check_id</w:t>
+      </w:r>
+      <w:r>
+        <w:rPr>
+          <w:rFonts w:ascii="Calibri" w:hAnsi="Calibri" w:eastAsia="Microsoft JhengHei"/>
+          <w:b w:val="0"/>
+          <w:i w:val="0"/>
+        </w:rPr>
+        <w:t>，Section Workflow 必須在 EDB persistence 前停止並列出重複 key，不可合併不同來源的資料庫結果。</w:t>
+      </w:r>
+    </w:p>
+    <w:p>
+      <w:r>
+        <w:rPr>
           <w:rFonts w:ascii="Calibri" w:hAnsi="Calibri" w:eastAsia="Microsoft JhengHei"/>
           <w:b w:val="0"/>
           <w:i w:val="0"/>
@@ -12108,6 +12288,34 @@
           <w:i w:val="0"/>
         </w:rPr>
         <w:t>公司 M9.3 正式基準為 60 tests、M9.4 為 65 tests、M9.5 為 70 tests、M9.6 為 74 tests、M10 為 78 tests、M10.1 為 82 tests；M10.3.1 候選為 85 tests。實際數量會隨版本增加，不應硬性只等於固定數字；重點是 0 failed。</w:t>
+      </w:r>
+    </w:p>
+    <w:p>
+      <w:r>
+        <w:rPr>
+          <w:rFonts w:ascii="Calibri" w:hAnsi="Calibri" w:eastAsia="Microsoft JhengHei"/>
+          <w:b w:val="0"/>
+          <w:i w:val="0"/>
+        </w:rPr>
+        <w:t xml:space="preserve">PEM backend Scope 回歸至少必須驗證：Discovery 將 </w:t>
+      </w:r>
+      <w:r>
+        <w:rPr>
+          <w:rFonts w:ascii="Consolas" w:hAnsi="Consolas" w:eastAsia="Microsoft JhengHei"/>
+          <w:b w:val="0"/>
+          <w:i w:val="0"/>
+          <w:color w:val="17365D"/>
+          <w:sz w:val="17"/>
+        </w:rPr>
+        <w:t>PEM_check</w:t>
+      </w:r>
+      <w:r>
+        <w:rPr>
+          <w:rFonts w:ascii="Calibri" w:hAnsi="Calibri" w:eastAsia="Microsoft JhengHei"/>
+          <w:b w:val="0"/>
+          <w:i w:val="0"/>
+        </w:rPr>
+        <w:t xml:space="preserve"> Database Output 指向唯一 PEM Witness；既有錯誤 Primary mapping 被後端政策覆寫為 Witness／excluded；一般未標節點 Database Output 的人工 Primary mapping 保持可用；重複 Section key 在 persistence 前提供明確錯誤。本機候選基準為 106 tests、0 failed。</w:t>
       </w:r>
     </w:p>
     <w:p>

</xml_diff>

<commit_message>
docs: record PEM backend scope validation
</commit_message>
<xml_diff>
--- a/docs/OMNICHECK_AI_BUILD_AND_OPERATIONS_GUIDE.docx
+++ b/docs/OMNICHECK_AI_BUILD_AND_OPERATIONS_GUIDE.docx
@@ -1540,7 +1540,7 @@
                 <w:i w:val="0"/>
                 <w:sz w:val="17"/>
               </w:rPr>
-              <w:t>0.14.2.1-candidate</w:t>
+              <w:t>0.14.2.1</w:t>
             </w:r>
           </w:p>
         </w:tc>
@@ -1618,7 +1618,26 @@
                 <w:i w:val="0"/>
                 <w:sz w:val="17"/>
               </w:rPr>
-              <w:t>本機 106 tests 通過；公司原失敗案件待回歸驗證</w:t>
+              <w:t xml:space="preserve">release </w:t>
+            </w:r>
+            <w:r>
+              <w:rPr>
+                <w:rFonts w:ascii="Consolas" w:hAnsi="Consolas" w:eastAsia="Microsoft JhengHei"/>
+                <w:b w:val="0"/>
+                <w:i w:val="0"/>
+                <w:color w:val="17365D"/>
+                <w:sz w:val="17"/>
+              </w:rPr>
+              <w:t>8bef579</w:t>
+            </w:r>
+            <w:r>
+              <w:rPr>
+                <w:rFonts w:ascii="Calibri" w:hAnsi="Calibri" w:eastAsia="Microsoft JhengHei"/>
+                <w:b w:val="0"/>
+                <w:i w:val="0"/>
+                <w:sz w:val="17"/>
+              </w:rPr>
+              <w:t>；本機／公司 106 tests，原失敗 Job、20 Sections、QA/V4 QA、DOCX/PDF、來源 hash 通過</w:t>
             </w:r>
           </w:p>
         </w:tc>
@@ -12325,6 +12344,106 @@
           <w:b w:val="0"/>
           <w:i w:val="0"/>
         </w:rPr>
+        <w:t xml:space="preserve">公司實測：release </w:t>
+      </w:r>
+      <w:r>
+        <w:rPr>
+          <w:rFonts w:ascii="Consolas" w:hAnsi="Consolas" w:eastAsia="Microsoft JhengHei"/>
+          <w:b w:val="0"/>
+          <w:i w:val="0"/>
+          <w:color w:val="17365D"/>
+          <w:sz w:val="17"/>
+        </w:rPr>
+        <w:t>8bef579</w:t>
+      </w:r>
+      <w:r>
+        <w:rPr>
+          <w:rFonts w:ascii="Calibri" w:hAnsi="Calibri" w:eastAsia="Microsoft JhengHei"/>
+          <w:b w:val="0"/>
+          <w:i w:val="0"/>
+        </w:rPr>
+        <w:t xml:space="preserve"> 的 106 tests 與 V4 manifest 5/5 通過。原失敗 Job </w:t>
+      </w:r>
+      <w:r>
+        <w:rPr>
+          <w:rFonts w:ascii="Consolas" w:hAnsi="Consolas" w:eastAsia="Microsoft JhengHei"/>
+          <w:b w:val="0"/>
+          <w:i w:val="0"/>
+          <w:color w:val="17365D"/>
+          <w:sz w:val="17"/>
+        </w:rPr>
+        <w:t>871079e5936f4035bf975a241fb401a1</w:t>
+      </w:r>
+      <w:r>
+        <w:rPr>
+          <w:rFonts w:ascii="Calibri" w:hAnsi="Calibri" w:eastAsia="Microsoft JhengHei"/>
+          <w:b w:val="0"/>
+          <w:i w:val="0"/>
+        </w:rPr>
+        <w:t xml:space="preserve"> 在不修改舊 Primary mapping 與 13 個 input 的情況下重跑成功；PEM backend evidence 為 </w:t>
+      </w:r>
+      <w:r>
+        <w:rPr>
+          <w:rFonts w:ascii="Consolas" w:hAnsi="Consolas" w:eastAsia="Microsoft JhengHei"/>
+          <w:b w:val="0"/>
+          <w:i w:val="0"/>
+          <w:color w:val="17365D"/>
+          <w:sz w:val="17"/>
+        </w:rPr>
+        <w:t>pemp1 / Witness / excluded</w:t>
+      </w:r>
+      <w:r>
+        <w:rPr>
+          <w:rFonts w:ascii="Calibri" w:hAnsi="Calibri" w:eastAsia="Microsoft JhengHei"/>
+          <w:b w:val="0"/>
+          <w:i w:val="0"/>
+        </w:rPr>
+        <w:t xml:space="preserve">，20/20 Section keys 唯一並保存至 EDB，QA／V4 QA 可交付，DOCX/PDF 正常。輸入 aggregate SHA-256 前後同為 </w:t>
+      </w:r>
+      <w:r>
+        <w:rPr>
+          <w:rFonts w:ascii="Consolas" w:hAnsi="Consolas" w:eastAsia="Microsoft JhengHei"/>
+          <w:b w:val="0"/>
+          <w:i w:val="0"/>
+          <w:color w:val="17365D"/>
+          <w:sz w:val="17"/>
+        </w:rPr>
+        <w:t>551d2498af7f456ad0b8f6550aad7b2356fd9e085787fb17ddd47c0eecea77aa</w:t>
+      </w:r>
+      <w:r>
+        <w:rPr>
+          <w:rFonts w:ascii="Calibri" w:hAnsi="Calibri" w:eastAsia="Microsoft JhengHei"/>
+          <w:b w:val="0"/>
+          <w:i w:val="0"/>
+        </w:rPr>
+        <w:t xml:space="preserve">。本次無 migration；rollback release 為 </w:t>
+      </w:r>
+      <w:r>
+        <w:rPr>
+          <w:rFonts w:ascii="Consolas" w:hAnsi="Consolas" w:eastAsia="Microsoft JhengHei"/>
+          <w:b w:val="0"/>
+          <w:i w:val="0"/>
+          <w:color w:val="17365D"/>
+          <w:sz w:val="17"/>
+        </w:rPr>
+        <w:t>8031088</w:t>
+      </w:r>
+      <w:r>
+        <w:rPr>
+          <w:rFonts w:ascii="Calibri" w:hAnsi="Calibri" w:eastAsia="Microsoft JhengHei"/>
+          <w:b w:val="0"/>
+          <w:i w:val="0"/>
+        </w:rPr>
+        <w:t>。</w:t>
+      </w:r>
+    </w:p>
+    <w:p>
+      <w:r>
+        <w:rPr>
+          <w:rFonts w:ascii="Calibri" w:hAnsi="Calibri" w:eastAsia="Microsoft JhengHei"/>
+          <w:b w:val="0"/>
+          <w:i w:val="0"/>
+        </w:rPr>
         <w:t>M10.2 UI Adapter 公司候選為 88 tests，新增 UI Adapter、路由、fail-closed 畫面行為與 deployment contract tests，未增加 migration 或更換 Pipeline。</w:t>
       </w:r>
       <w:r>
@@ -12590,9 +12709,9 @@
                 <w:rFonts w:ascii="Consolas" w:hAnsi="Consolas" w:eastAsia="Microsoft JhengHei"/>
                 <w:sz w:val="16"/>
               </w:rPr>
-              <w:t>cd /data/omnicheck/app/current</w:t>
+              <w:t>cd /data/omnicheck/app/current/vendor/omni-v4-renderer</w:t>
               <w:br/>
-              <w:t>sha256sum -c vendor/omni-v4-renderer/MANIFEST.sha256</w:t>
+              <w:t>sha256sum -c MANIFEST.sha256</w:t>
             </w:r>
           </w:p>
         </w:tc>

</xml_diff>

<commit_message>
feat: refine section assessment policies
</commit_message>
<xml_diff>
--- a/docs/OMNICHECK_AI_BUILD_AND_OPERATIONS_GUIDE.docx
+++ b/docs/OMNICHECK_AI_BUILD_AND_OPERATIONS_GUIDE.docx
@@ -1513,6 +1513,112 @@
                 <w:sz w:val="17"/>
               </w:rPr>
               <w:t>驗證狀態</w:t>
+            </w:r>
+          </w:p>
+        </w:tc>
+      </w:tr>
+      <w:tr>
+        <w:tc>
+          <w:tcPr>
+            <w:tcW w:type="dxa" w:w="2470"/>
+            <w:vAlign w:val="center"/>
+            <w:tcMar>
+              <w:top w:w="45" w:type="dxa"/>
+              <w:start w:w="120" w:type="dxa"/>
+              <w:bottom w:w="45" w:type="dxa"/>
+              <w:end w:w="120" w:type="dxa"/>
+            </w:tcMar>
+          </w:tcPr>
+          <w:p>
+            <w:pPr>
+              <w:spacing w:after="0"/>
+            </w:pPr>
+            <w:r>
+              <w:rPr>
+                <w:rFonts w:ascii="Calibri" w:hAnsi="Calibri" w:eastAsia="Microsoft JhengHei"/>
+                <w:b w:val="0"/>
+                <w:i w:val="0"/>
+                <w:sz w:val="17"/>
+              </w:rPr>
+              <w:t>0.14.2.2-candidate</w:t>
+            </w:r>
+          </w:p>
+        </w:tc>
+        <w:tc>
+          <w:tcPr>
+            <w:tcW w:type="dxa" w:w="2470"/>
+            <w:vAlign w:val="center"/>
+            <w:tcMar>
+              <w:top w:w="45" w:type="dxa"/>
+              <w:start w:w="120" w:type="dxa"/>
+              <w:bottom w:w="45" w:type="dxa"/>
+              <w:end w:w="120" w:type="dxa"/>
+            </w:tcMar>
+          </w:tcPr>
+          <w:p>
+            <w:pPr>
+              <w:spacing w:after="0"/>
+            </w:pPr>
+            <w:r>
+              <w:rPr>
+                <w:rFonts w:ascii="Calibri" w:hAnsi="Calibri" w:eastAsia="Microsoft JhengHei"/>
+                <w:b w:val="0"/>
+                <w:i w:val="0"/>
+                <w:sz w:val="17"/>
+              </w:rPr>
+              <w:t>2026-08-12</w:t>
+            </w:r>
+          </w:p>
+        </w:tc>
+        <w:tc>
+          <w:tcPr>
+            <w:tcW w:type="dxa" w:w="2470"/>
+            <w:vAlign w:val="center"/>
+            <w:tcMar>
+              <w:top w:w="45" w:type="dxa"/>
+              <w:start w:w="120" w:type="dxa"/>
+              <w:bottom w:w="45" w:type="dxa"/>
+              <w:end w:w="120" w:type="dxa"/>
+            </w:tcMar>
+          </w:tcPr>
+          <w:p>
+            <w:pPr>
+              <w:spacing w:after="0"/>
+            </w:pPr>
+            <w:r>
+              <w:rPr>
+                <w:rFonts w:ascii="Calibri" w:hAnsi="Calibri" w:eastAsia="Microsoft JhengHei"/>
+                <w:b w:val="0"/>
+                <w:i w:val="0"/>
+                <w:sz w:val="17"/>
+              </w:rPr>
+              <w:t>Ruleset 2026.2：filesystem 50/70、bloat 前十名敘述契約、罕用索引 10 筆、系統角色排除</w:t>
+            </w:r>
+          </w:p>
+        </w:tc>
+        <w:tc>
+          <w:tcPr>
+            <w:tcW w:type="dxa" w:w="2470"/>
+            <w:vAlign w:val="center"/>
+            <w:tcMar>
+              <w:top w:w="45" w:type="dxa"/>
+              <w:start w:w="120" w:type="dxa"/>
+              <w:bottom w:w="45" w:type="dxa"/>
+              <w:end w:w="120" w:type="dxa"/>
+            </w:tcMar>
+          </w:tcPr>
+          <w:p>
+            <w:pPr>
+              <w:spacing w:after="0"/>
+            </w:pPr>
+            <w:r>
+              <w:rPr>
+                <w:rFonts w:ascii="Calibri" w:hAnsi="Calibri" w:eastAsia="Microsoft JhengHei"/>
+                <w:b w:val="0"/>
+                <w:i w:val="0"/>
+                <w:sz w:val="17"/>
+              </w:rPr>
+              <w:t>本機測試通過；實際客戶資料與公司部署待驗證</w:t>
             </w:r>
           </w:p>
         </w:tc>
@@ -12444,6 +12550,142 @@
           <w:b w:val="0"/>
           <w:i w:val="0"/>
         </w:rPr>
+        <w:t xml:space="preserve">Ruleset </w:t>
+      </w:r>
+      <w:r>
+        <w:rPr>
+          <w:rFonts w:ascii="Consolas" w:hAnsi="Consolas" w:eastAsia="Microsoft JhengHei"/>
+          <w:b w:val="0"/>
+          <w:i w:val="0"/>
+          <w:color w:val="17365D"/>
+          <w:sz w:val="17"/>
+        </w:rPr>
+        <w:t>2026.2</w:t>
+      </w:r>
+      <w:r>
+        <w:rPr>
+          <w:rFonts w:ascii="Calibri" w:hAnsi="Calibri" w:eastAsia="Microsoft JhengHei"/>
+          <w:b w:val="0"/>
+          <w:i w:val="0"/>
+        </w:rPr>
+        <w:t xml:space="preserve"> 驗收重點：filesystem 49% 為一般 normal、50%～69% 為含「隨時觀察量體成長速度」的 normal、70% 以上為 attention；table/index bloat Output 原樣保留前十名，deterministic 與 AI 觀察／建議逐一列出其中指數 &gt;2 的所有物件，Table 對應 </w:t>
+      </w:r>
+      <w:r>
+        <w:rPr>
+          <w:rFonts w:ascii="Consolas" w:hAnsi="Consolas" w:eastAsia="Microsoft JhengHei"/>
+          <w:b w:val="0"/>
+          <w:i w:val="0"/>
+          <w:color w:val="17365D"/>
+          <w:sz w:val="17"/>
+        </w:rPr>
+        <w:t>VACUUM FULL</w:t>
+      </w:r>
+      <w:r>
+        <w:rPr>
+          <w:rFonts w:ascii="Calibri" w:hAnsi="Calibri" w:eastAsia="Microsoft JhengHei"/>
+          <w:b w:val="0"/>
+          <w:i w:val="0"/>
+        </w:rPr>
+        <w:t xml:space="preserve">、Index 對應 </w:t>
+      </w:r>
+      <w:r>
+        <w:rPr>
+          <w:rFonts w:ascii="Consolas" w:hAnsi="Consolas" w:eastAsia="Microsoft JhengHei"/>
+          <w:b w:val="0"/>
+          <w:i w:val="0"/>
+          <w:color w:val="17365D"/>
+          <w:sz w:val="17"/>
+        </w:rPr>
+        <w:t>REINDEX</w:t>
+      </w:r>
+      <w:r>
+        <w:rPr>
+          <w:rFonts w:ascii="Calibri" w:hAnsi="Calibri" w:eastAsia="Microsoft JhengHei"/>
+          <w:b w:val="0"/>
+          <w:i w:val="0"/>
+        </w:rPr>
+        <w:t xml:space="preserve">；AI 若遺漏任一物件或處置，Gateway 必須拒絕草稿並保留 deterministic fallback。rarely used indexes 依 </w:t>
+      </w:r>
+      <w:r>
+        <w:rPr>
+          <w:rFonts w:ascii="Consolas" w:hAnsi="Consolas" w:eastAsia="Microsoft JhengHei"/>
+          <w:b w:val="0"/>
+          <w:i w:val="0"/>
+          <w:color w:val="17365D"/>
+          <w:sz w:val="17"/>
+        </w:rPr>
+        <w:t>idx_scan=0</w:t>
+      </w:r>
+      <w:r>
+        <w:rPr>
+          <w:rFonts w:ascii="Calibri" w:hAnsi="Calibri" w:eastAsia="Microsoft JhengHei"/>
+          <w:b w:val="0"/>
+          <w:i w:val="0"/>
+        </w:rPr>
+        <w:t xml:space="preserve"> 優先後最多 10 筆；role/schema privilege 不顯示 </w:t>
+      </w:r>
+      <w:r>
+        <w:rPr>
+          <w:rFonts w:ascii="Consolas" w:hAnsi="Consolas" w:eastAsia="Microsoft JhengHei"/>
+          <w:b w:val="0"/>
+          <w:i w:val="0"/>
+          <w:color w:val="17365D"/>
+          <w:sz w:val="17"/>
+        </w:rPr>
+        <w:t>pg_*</w:t>
+      </w:r>
+      <w:r>
+        <w:rPr>
+          <w:rFonts w:ascii="Calibri" w:hAnsi="Calibri" w:eastAsia="Microsoft JhengHei"/>
+          <w:b w:val="0"/>
+          <w:i w:val="0"/>
+        </w:rPr>
+        <w:t>、</w:t>
+      </w:r>
+      <w:r>
+        <w:rPr>
+          <w:rFonts w:ascii="Consolas" w:hAnsi="Consolas" w:eastAsia="Microsoft JhengHei"/>
+          <w:b w:val="0"/>
+          <w:i w:val="0"/>
+          <w:color w:val="17365D"/>
+          <w:sz w:val="17"/>
+        </w:rPr>
+        <w:t>postgres</w:t>
+      </w:r>
+      <w:r>
+        <w:rPr>
+          <w:rFonts w:ascii="Calibri" w:hAnsi="Calibri" w:eastAsia="Microsoft JhengHei"/>
+          <w:b w:val="0"/>
+          <w:i w:val="0"/>
+        </w:rPr>
+        <w:t>、</w:t>
+      </w:r>
+      <w:r>
+        <w:rPr>
+          <w:rFonts w:ascii="Consolas" w:hAnsi="Consolas" w:eastAsia="Microsoft JhengHei"/>
+          <w:b w:val="0"/>
+          <w:i w:val="0"/>
+          <w:color w:val="17365D"/>
+          <w:sz w:val="17"/>
+        </w:rPr>
+        <w:t>enterprisedb</w:t>
+      </w:r>
+      <w:r>
+        <w:rPr>
+          <w:rFonts w:ascii="Calibri" w:hAnsi="Calibri" w:eastAsia="Microsoft JhengHei"/>
+          <w:b w:val="0"/>
+          <w:i w:val="0"/>
+        </w:rPr>
+        <w:t>。</w:t>
+      </w:r>
+    </w:p>
+    <w:p>
+      <w:r>
+        <w:rPr>
+          <w:rFonts w:ascii="Calibri" w:hAnsi="Calibri" w:eastAsia="Microsoft JhengHei"/>
+          <w:b w:val="0"/>
+          <w:i w:val="0"/>
+        </w:rPr>
         <w:t>M10.2 UI Adapter 公司候選為 88 tests，新增 UI Adapter、路由、fail-closed 畫面行為與 deployment contract tests，未增加 migration 或更換 Pipeline。</w:t>
       </w:r>
       <w:r>

</xml_diff>

<commit_message>
feat: automate report-wide AI section drafts
</commit_message>
<xml_diff>
--- a/docs/OMNICHECK_AI_BUILD_AND_OPERATIONS_GUIDE.docx
+++ b/docs/OMNICHECK_AI_BUILD_AND_OPERATIONS_GUIDE.docx
@@ -103,7 +103,7 @@
           <w:b w:val="0"/>
           <w:i w:val="0"/>
         </w:rPr>
-        <w:t>文件版本：0.10.3-draft.1</w:t>
+        <w:t>文件版本：0.14.3-candidate</w:t>
       </w:r>
     </w:p>
     <w:p>
@@ -116,7 +116,7 @@
           <w:b w:val="0"/>
           <w:i w:val="0"/>
         </w:rPr>
-        <w:t>最後更新：2026-08-10</w:t>
+        <w:t>最後更新：2026-08-12</w:t>
       </w:r>
     </w:p>
     <w:p>
@@ -129,53 +129,7 @@
           <w:b w:val="0"/>
           <w:i w:val="0"/>
         </w:rPr>
-        <w:t>適用程式基準：</w:t>
-      </w:r>
-      <w:r>
-        <w:rPr>
-          <w:rFonts w:ascii="Consolas" w:hAnsi="Consolas" w:eastAsia="Microsoft JhengHei"/>
-          <w:b w:val="0"/>
-          <w:i w:val="0"/>
-          <w:color w:val="17365D"/>
-          <w:sz w:val="17"/>
-        </w:rPr>
-        <w:t>feature/m10-3-section-foundation</w:t>
-      </w:r>
-      <w:r>
-        <w:rPr>
-          <w:rFonts w:ascii="Calibri" w:hAnsi="Calibri" w:eastAsia="Microsoft JhengHei"/>
-          <w:b w:val="0"/>
-          <w:i w:val="0"/>
-        </w:rPr>
-        <w:t xml:space="preserve">；正式基準仍為 </w:t>
-      </w:r>
-      <w:r>
-        <w:rPr>
-          <w:rFonts w:ascii="Consolas" w:hAnsi="Consolas" w:eastAsia="Microsoft JhengHei"/>
-          <w:b w:val="0"/>
-          <w:i w:val="0"/>
-          <w:color w:val="17365D"/>
-          <w:sz w:val="17"/>
-        </w:rPr>
-        <w:t>main</w:t>
-      </w:r>
-      <w:r>
-        <w:rPr>
-          <w:rFonts w:ascii="Calibri" w:hAnsi="Calibri" w:eastAsia="Microsoft JhengHei"/>
-          <w:b w:val="0"/>
-          <w:i w:val="0"/>
-        </w:rPr>
-        <w:t xml:space="preserve"> / </w:t>
-      </w:r>
-      <w:r>
-        <w:rPr>
-          <w:rFonts w:ascii="Consolas" w:hAnsi="Consolas" w:eastAsia="Microsoft JhengHei"/>
-          <w:b w:val="0"/>
-          <w:i w:val="0"/>
-          <w:color w:val="17365D"/>
-          <w:sz w:val="17"/>
-        </w:rPr>
-        <w:t>m10.1</w:t>
+        <w:t>適用程式基準：M14.3 本機候選；正式公司基準仍以已部署 release 為準</w:t>
       </w:r>
     </w:p>
     <w:p>
@@ -1513,6 +1467,112 @@
                 <w:sz w:val="17"/>
               </w:rPr>
               <w:t>驗證狀態</w:t>
+            </w:r>
+          </w:p>
+        </w:tc>
+      </w:tr>
+      <w:tr>
+        <w:tc>
+          <w:tcPr>
+            <w:tcW w:type="dxa" w:w="2470"/>
+            <w:vAlign w:val="center"/>
+            <w:tcMar>
+              <w:top w:w="45" w:type="dxa"/>
+              <w:start w:w="120" w:type="dxa"/>
+              <w:bottom w:w="45" w:type="dxa"/>
+              <w:end w:w="120" w:type="dxa"/>
+            </w:tcMar>
+          </w:tcPr>
+          <w:p>
+            <w:pPr>
+              <w:spacing w:after="0"/>
+            </w:pPr>
+            <w:r>
+              <w:rPr>
+                <w:rFonts w:ascii="Calibri" w:hAnsi="Calibri" w:eastAsia="Microsoft JhengHei"/>
+                <w:b w:val="0"/>
+                <w:i w:val="0"/>
+                <w:sz w:val="17"/>
+              </w:rPr>
+              <w:t>0.14.3-candidate</w:t>
+            </w:r>
+          </w:p>
+        </w:tc>
+        <w:tc>
+          <w:tcPr>
+            <w:tcW w:type="dxa" w:w="2470"/>
+            <w:vAlign w:val="center"/>
+            <w:tcMar>
+              <w:top w:w="45" w:type="dxa"/>
+              <w:start w:w="120" w:type="dxa"/>
+              <w:bottom w:w="45" w:type="dxa"/>
+              <w:end w:w="120" w:type="dxa"/>
+            </w:tcMar>
+          </w:tcPr>
+          <w:p>
+            <w:pPr>
+              <w:spacing w:after="0"/>
+            </w:pPr>
+            <w:r>
+              <w:rPr>
+                <w:rFonts w:ascii="Calibri" w:hAnsi="Calibri" w:eastAsia="Microsoft JhengHei"/>
+                <w:b w:val="0"/>
+                <w:i w:val="0"/>
+                <w:sz w:val="17"/>
+              </w:rPr>
+              <w:t>2026-08-12</w:t>
+            </w:r>
+          </w:p>
+        </w:tc>
+        <w:tc>
+          <w:tcPr>
+            <w:tcW w:type="dxa" w:w="2470"/>
+            <w:vAlign w:val="center"/>
+            <w:tcMar>
+              <w:top w:w="45" w:type="dxa"/>
+              <w:start w:w="120" w:type="dxa"/>
+              <w:bottom w:w="45" w:type="dxa"/>
+              <w:end w:w="120" w:type="dxa"/>
+            </w:tcMar>
+          </w:tcPr>
+          <w:p>
+            <w:pPr>
+              <w:spacing w:after="0"/>
+            </w:pPr>
+            <w:r>
+              <w:rPr>
+                <w:rFonts w:ascii="Calibri" w:hAnsi="Calibri" w:eastAsia="Microsoft JhengHei"/>
+                <w:b w:val="0"/>
+                <w:i w:val="0"/>
+                <w:sz w:val="17"/>
+              </w:rPr>
+              <w:t>全 V4 可見 Section 自動 AI 批次、PEM 圖片 Vision 分流、整批核准與一鍵重新產報</w:t>
+            </w:r>
+          </w:p>
+        </w:tc>
+        <w:tc>
+          <w:tcPr>
+            <w:tcW w:type="dxa" w:w="2470"/>
+            <w:vAlign w:val="center"/>
+            <w:tcMar>
+              <w:top w:w="45" w:type="dxa"/>
+              <w:start w:w="120" w:type="dxa"/>
+              <w:bottom w:w="45" w:type="dxa"/>
+              <w:end w:w="120" w:type="dxa"/>
+            </w:tcMar>
+          </w:tcPr>
+          <w:p>
+            <w:pPr>
+              <w:spacing w:after="0"/>
+            </w:pPr>
+            <w:r>
+              <w:rPr>
+                <w:rFonts w:ascii="Calibri" w:hAnsi="Calibri" w:eastAsia="Microsoft JhengHei"/>
+                <w:b w:val="0"/>
+                <w:i w:val="0"/>
+                <w:sz w:val="17"/>
+              </w:rPr>
+              <w:t>本機 115 tests；台灣行動支付唯讀資料 29/29 Workflow、5 張圖片通過；公司部署與 Vision 實機待驗證</w:t>
             </w:r>
           </w:p>
         </w:tc>
@@ -14928,6 +14988,12 @@
               <w:t>OMNICHECK_AI_BATCH_MAX_ITEMS=5</w:t>
               <w:br/>
               <w:t>OMNICHECK_AI_MIN_INTERVAL_SECONDS=1</w:t>
+              <w:br/>
+              <w:t>OMNICHECK_AI_AUTO_DRAFT_ALL=true</w:t>
+              <w:br/>
+              <w:t># 選配；必須是 Ollama 已安裝且支援 OpenAI image_url 的 Vision 模型</w:t>
+              <w:br/>
+              <w:t>OMNICHECK_AI_VISION_MODEL=</w:t>
             </w:r>
           </w:p>
         </w:tc>
@@ -15616,6 +15682,309 @@
           <w:i w:val="0"/>
         </w:rPr>
         <w:t xml:space="preserve"> 並重啟 Web／Worker；0010 tables 保留，採 forward-fix，不在正式 EDB downgrade。</w:t>
+      </w:r>
+    </w:p>
+    <w:p>
+      <w:pPr>
+        <w:pStyle w:val="Heading3"/>
+      </w:pPr>
+      <w:r>
+        <w:rPr>
+          <w:rFonts w:ascii="Calibri" w:hAnsi="Calibri" w:eastAsia="Microsoft JhengHei"/>
+          <w:b w:val="0"/>
+          <w:i w:val="0"/>
+        </w:rPr>
+        <w:t>13.16 M14.3 全報告自動 AI 草稿與 PEM Vision 部署</w:t>
+      </w:r>
+    </w:p>
+    <w:p>
+      <w:r>
+        <w:rPr>
+          <w:rFonts w:ascii="Calibri" w:hAnsi="Calibri" w:eastAsia="Microsoft JhengHei"/>
+          <w:b w:val="0"/>
+          <w:i w:val="0"/>
+        </w:rPr>
+        <w:t>M14.3 不新增 migration，沿用 0010 durable batch。Web 與 Worker 的環境檔加入：</w:t>
+      </w:r>
+    </w:p>
+    <w:tbl>
+      <w:tblPr>
+        <w:tblStyle w:val="TableGrid"/>
+        <w:tblW w:type="auto" w:w="0"/>
+        <w:jc w:val="center"/>
+        <w:tblLayout w:type="fixed"/>
+        <w:tblLook w:firstColumn="1" w:firstRow="1" w:lastColumn="0" w:lastRow="0" w:noHBand="0" w:noVBand="1" w:val="04A0"/>
+      </w:tblPr>
+      <w:tblGrid>
+        <w:gridCol w:w="9878"/>
+      </w:tblGrid>
+      <w:tr>
+        <w:tc>
+          <w:tcPr>
+            <w:tcW w:type="dxa" w:w="9878"/>
+            <w:shd w:fill="F2F6FA"/>
+            <w:tcMar>
+              <w:top w:w="90" w:type="dxa"/>
+              <w:start w:w="130" w:type="dxa"/>
+              <w:bottom w:w="90" w:type="dxa"/>
+              <w:end w:w="130" w:type="dxa"/>
+            </w:tcMar>
+          </w:tcPr>
+          <w:p>
+            <w:pPr>
+              <w:pStyle w:val="CodeBlock"/>
+              <w:keepLines w:val="0"/>
+            </w:pPr>
+            <w:r>
+              <w:rPr>
+                <w:rFonts w:ascii="Consolas" w:hAnsi="Consolas" w:eastAsia="Microsoft JhengHei"/>
+                <w:sz w:val="16"/>
+              </w:rPr>
+              <w:t>OMNICHECK_AI_AUTO_DRAFT_ALL=true</w:t>
+              <w:br/>
+              <w:t>OMNICHECK_AI_VISION_MODEL=&lt;已在 Ollama 安裝且支援圖片輸入的模型名稱&gt;</w:t>
+            </w:r>
+          </w:p>
+        </w:tc>
+      </w:tr>
+    </w:tbl>
+    <w:p>
+      <w:r>
+        <w:rPr>
+          <w:rFonts w:ascii="Consolas" w:hAnsi="Consolas" w:eastAsia="Microsoft JhengHei"/>
+          <w:b w:val="0"/>
+          <w:i w:val="0"/>
+          <w:color w:val="17365D"/>
+          <w:sz w:val="17"/>
+        </w:rPr>
+        <w:t>OMNICHECK_AI_AUTO_DRAFT_ALL</w:t>
+      </w:r>
+      <w:r>
+        <w:rPr>
+          <w:rFonts w:ascii="Calibri" w:hAnsi="Calibri" w:eastAsia="Microsoft JhengHei"/>
+          <w:b w:val="0"/>
+          <w:i w:val="0"/>
+        </w:rPr>
+        <w:t xml:space="preserve"> 預設在 AI enabled 時啟用；若需保留 M14.2 人工勾選模式，明確設為 </w:t>
+      </w:r>
+      <w:r>
+        <w:rPr>
+          <w:rFonts w:ascii="Consolas" w:hAnsi="Consolas" w:eastAsia="Microsoft JhengHei"/>
+          <w:b w:val="0"/>
+          <w:i w:val="0"/>
+          <w:color w:val="17365D"/>
+          <w:sz w:val="17"/>
+        </w:rPr>
+        <w:t>false</w:t>
+      </w:r>
+      <w:r>
+        <w:rPr>
+          <w:rFonts w:ascii="Calibri" w:hAnsi="Calibri" w:eastAsia="Microsoft JhengHei"/>
+          <w:b w:val="0"/>
+          <w:i w:val="0"/>
+        </w:rPr>
+        <w:t>。</w:t>
+      </w:r>
+      <w:r>
+        <w:rPr>
+          <w:rFonts w:ascii="Consolas" w:hAnsi="Consolas" w:eastAsia="Microsoft JhengHei"/>
+          <w:b w:val="0"/>
+          <w:i w:val="0"/>
+          <w:color w:val="17365D"/>
+          <w:sz w:val="17"/>
+        </w:rPr>
+        <w:t>OMNICHECK_AI_VISION_MODEL</w:t>
+      </w:r>
+      <w:r>
+        <w:rPr>
+          <w:rFonts w:ascii="Calibri" w:hAnsi="Calibri" w:eastAsia="Microsoft JhengHei"/>
+          <w:b w:val="0"/>
+          <w:i w:val="0"/>
+        </w:rPr>
+        <w:t xml:space="preserve"> 是選配設定：未設定時 PEM 圖片不會送入文字模型，而是保留 deterministic 觀察／建議並記錄 fallback；文字 Section 不受影響。Web 與 Worker 都應讀取相同環境檔，變更後至少重啟 Worker。</w:t>
+      </w:r>
+    </w:p>
+    <w:p>
+      <w:r>
+        <w:rPr>
+          <w:rFonts w:ascii="Calibri" w:hAnsi="Calibri" w:eastAsia="Microsoft JhengHei"/>
+          <w:b w:val="0"/>
+          <w:i w:val="0"/>
+        </w:rPr>
+        <w:t>部署後使用一包含 PEM 圖片的測試資料驗收：</w:t>
+      </w:r>
+    </w:p>
+    <w:p>
+      <w:pPr>
+        <w:pStyle w:val="ListNumber"/>
+      </w:pPr>
+      <w:r>
+        <w:rPr>
+          <w:rFonts w:ascii="Calibri" w:hAnsi="Calibri" w:eastAsia="Microsoft JhengHei"/>
+          <w:b w:val="0"/>
+          <w:i w:val="0"/>
+        </w:rPr>
+        <w:t>只按一次執行，確認 Pipeline 成功且自動建立多個 AI batches。</w:t>
+      </w:r>
+    </w:p>
+    <w:p>
+      <w:pPr>
+        <w:pStyle w:val="ListNumber"/>
+      </w:pPr>
+      <w:r>
+        <w:rPr>
+          <w:rFonts w:ascii="Calibri" w:hAnsi="Calibri" w:eastAsia="Microsoft JhengHei"/>
+          <w:b w:val="0"/>
+          <w:i w:val="0"/>
+        </w:rPr>
+        <w:t xml:space="preserve">比對 </w:t>
+      </w:r>
+      <w:r>
+        <w:rPr>
+          <w:rFonts w:ascii="Consolas" w:hAnsi="Consolas" w:eastAsia="Microsoft JhengHei"/>
+          <w:b w:val="0"/>
+          <w:i w:val="0"/>
+          <w:color w:val="17365D"/>
+          <w:sz w:val="17"/>
+        </w:rPr>
+        <w:t>section-workflow.json</w:t>
+      </w:r>
+      <w:r>
+        <w:rPr>
+          <w:rFonts w:ascii="Calibri" w:hAnsi="Calibri" w:eastAsia="Microsoft JhengHei"/>
+          <w:b w:val="0"/>
+          <w:i w:val="0"/>
+        </w:rPr>
+        <w:t xml:space="preserve"> 項目數與 V4 所有可見 items 數量完全一致。</w:t>
+      </w:r>
+    </w:p>
+    <w:p>
+      <w:pPr>
+        <w:pStyle w:val="ListNumber"/>
+      </w:pPr>
+      <w:r>
+        <w:rPr>
+          <w:rFonts w:ascii="Calibri" w:hAnsi="Calibri" w:eastAsia="Microsoft JhengHei"/>
+          <w:b w:val="0"/>
+          <w:i w:val="0"/>
+        </w:rPr>
+        <w:t xml:space="preserve">確認文字項目逐筆成為 </w:t>
+      </w:r>
+      <w:r>
+        <w:rPr>
+          <w:rFonts w:ascii="Consolas" w:hAnsi="Consolas" w:eastAsia="Microsoft JhengHei"/>
+          <w:b w:val="0"/>
+          <w:i w:val="0"/>
+          <w:color w:val="17365D"/>
+          <w:sz w:val="17"/>
+        </w:rPr>
+        <w:t>ai_drafted</w:t>
+      </w:r>
+      <w:r>
+        <w:rPr>
+          <w:rFonts w:ascii="Calibri" w:hAnsi="Calibri" w:eastAsia="Microsoft JhengHei"/>
+          <w:b w:val="0"/>
+          <w:i w:val="0"/>
+        </w:rPr>
+        <w:t>；圖片項目使用 Vision model，或在未設定時成為 fallback。</w:t>
+      </w:r>
+    </w:p>
+    <w:p>
+      <w:pPr>
+        <w:pStyle w:val="ListNumber"/>
+      </w:pPr>
+      <w:r>
+        <w:rPr>
+          <w:rFonts w:ascii="Calibri" w:hAnsi="Calibri" w:eastAsia="Microsoft JhengHei"/>
+          <w:b w:val="0"/>
+          <w:i w:val="0"/>
+        </w:rPr>
+        <w:t>查 AI audit，確認文字與圖片採用正確 model，且 sanitized prompt 未保存圖片 Base64、hostname、IP 或秘密。</w:t>
+      </w:r>
+    </w:p>
+    <w:p>
+      <w:pPr>
+        <w:pStyle w:val="ListNumber"/>
+      </w:pPr>
+      <w:r>
+        <w:rPr>
+          <w:rFonts w:ascii="Calibri" w:hAnsi="Calibri" w:eastAsia="Microsoft JhengHei"/>
+          <w:b w:val="0"/>
+          <w:i w:val="0"/>
+        </w:rPr>
+        <w:t>在核准前產報，確認仍是 deterministic 內容。</w:t>
+      </w:r>
+    </w:p>
+    <w:p>
+      <w:pPr>
+        <w:pStyle w:val="ListNumber"/>
+      </w:pPr>
+      <w:r>
+        <w:rPr>
+          <w:rFonts w:ascii="Calibri" w:hAnsi="Calibri" w:eastAsia="Microsoft JhengHei"/>
+          <w:b w:val="0"/>
+          <w:i w:val="0"/>
+        </w:rPr>
+        <w:t>在工作台按「整批核准 AI 草稿並產報」，確認 AI 草稿經 reviewed／approved revision 後才進入 DOCX／PDF。</w:t>
+      </w:r>
+    </w:p>
+    <w:p>
+      <w:pPr>
+        <w:pStyle w:val="ListNumber"/>
+      </w:pPr>
+      <w:r>
+        <w:rPr>
+          <w:rFonts w:ascii="Calibri" w:hAnsi="Calibri" w:eastAsia="Microsoft JhengHei"/>
+          <w:b w:val="0"/>
+          <w:i w:val="0"/>
+        </w:rPr>
+        <w:t>抽查 filesystem、table/index bloat、rare index、roles/schema privileges，確認 AI 未改變規則狀態、Output 與必要處置。</w:t>
+      </w:r>
+    </w:p>
+    <w:p>
+      <w:r>
+        <w:rPr>
+          <w:rFonts w:ascii="Calibri" w:hAnsi="Calibri" w:eastAsia="Microsoft JhengHei"/>
+          <w:b w:val="0"/>
+          <w:i w:val="0"/>
+        </w:rPr>
+        <w:t xml:space="preserve">Rollback：不需 EDB downgrade。先將 </w:t>
+      </w:r>
+      <w:r>
+        <w:rPr>
+          <w:rFonts w:ascii="Consolas" w:hAnsi="Consolas" w:eastAsia="Microsoft JhengHei"/>
+          <w:b w:val="0"/>
+          <w:i w:val="0"/>
+          <w:color w:val="17365D"/>
+          <w:sz w:val="17"/>
+        </w:rPr>
+        <w:t>OMNICHECK_AI_AUTO_DRAFT_ALL=false</w:t>
+      </w:r>
+      <w:r>
+        <w:rPr>
+          <w:rFonts w:ascii="Calibri" w:hAnsi="Calibri" w:eastAsia="Microsoft JhengHei"/>
+          <w:b w:val="0"/>
+          <w:i w:val="0"/>
+        </w:rPr>
+        <w:t xml:space="preserve"> 並重啟 Worker，即回到人工批次；若需完全停用 AI，設定 </w:t>
+      </w:r>
+      <w:r>
+        <w:rPr>
+          <w:rFonts w:ascii="Consolas" w:hAnsi="Consolas" w:eastAsia="Microsoft JhengHei"/>
+          <w:b w:val="0"/>
+          <w:i w:val="0"/>
+          <w:color w:val="17365D"/>
+          <w:sz w:val="17"/>
+        </w:rPr>
+        <w:t>OMNICHECK_AI_ENABLED=false</w:t>
+      </w:r>
+      <w:r>
+        <w:rPr>
+          <w:rFonts w:ascii="Calibri" w:hAnsi="Calibri" w:eastAsia="Microsoft JhengHei"/>
+          <w:b w:val="0"/>
+          <w:i w:val="0"/>
+        </w:rPr>
+        <w:t xml:space="preserve"> 並重啟 Web／Worker。已保存的 AI audit 與 revision 保留，不刪除歷史。</w:t>
       </w:r>
     </w:p>
     <w:p>

</xml_diff>

<commit_message>
docs: record M14.3 company candidate deployment
</commit_message>
<xml_diff>
--- a/docs/OMNICHECK_AI_BUILD_AND_OPERATIONS_GUIDE.docx
+++ b/docs/OMNICHECK_AI_BUILD_AND_OPERATIONS_GUIDE.docx
@@ -1572,7 +1572,26 @@
                 <w:i w:val="0"/>
                 <w:sz w:val="17"/>
               </w:rPr>
-              <w:t>本機 115 tests；台灣行動支付唯讀資料 29/29 Workflow、5 張圖片通過；公司部署與 Vision 實機待驗證</w:t>
+              <w:t xml:space="preserve">release </w:t>
+            </w:r>
+            <w:r>
+              <w:rPr>
+                <w:rFonts w:ascii="Consolas" w:hAnsi="Consolas" w:eastAsia="Microsoft JhengHei"/>
+                <w:b w:val="0"/>
+                <w:i w:val="0"/>
+                <w:color w:val="17365D"/>
+                <w:sz w:val="17"/>
+              </w:rPr>
+              <w:t>a18c7cd</w:t>
+            </w:r>
+            <w:r>
+              <w:rPr>
+                <w:rFonts w:ascii="Calibri" w:hAnsi="Calibri" w:eastAsia="Microsoft JhengHei"/>
+                <w:b w:val="0"/>
+                <w:i w:val="0"/>
+                <w:sz w:val="17"/>
+              </w:rPr>
+              <w:t>；本機／公司 115 tests、台灣行動支付 29/29 Workflow、5 張圖片、Ruleset 2026.2、QA/V4 QA、DOCX/PDF 通過；待使用者與 Vision 驗收</w:t>
             </w:r>
           </w:p>
         </w:tc>
@@ -15988,6 +16007,106 @@
       </w:r>
     </w:p>
     <w:p>
+      <w:r>
+        <w:rPr>
+          <w:rFonts w:ascii="Calibri" w:hAnsi="Calibri" w:eastAsia="Microsoft JhengHei"/>
+          <w:b w:val="0"/>
+          <w:i w:val="0"/>
+        </w:rPr>
+        <w:t>公司候選部署紀錄（2026-08-12）：</w:t>
+      </w:r>
+      <w:r>
+        <w:rPr>
+          <w:rFonts w:ascii="Consolas" w:hAnsi="Consolas" w:eastAsia="Microsoft JhengHei"/>
+          <w:b w:val="0"/>
+          <w:i w:val="0"/>
+          <w:color w:val="17365D"/>
+          <w:sz w:val="17"/>
+        </w:rPr>
+        <w:t>current</w:t>
+      </w:r>
+      <w:r>
+        <w:rPr>
+          <w:rFonts w:ascii="Calibri" w:hAnsi="Calibri" w:eastAsia="Microsoft JhengHei"/>
+          <w:b w:val="0"/>
+          <w:i w:val="0"/>
+        </w:rPr>
+        <w:t xml:space="preserve"> 已原子切至 </w:t>
+      </w:r>
+      <w:r>
+        <w:rPr>
+          <w:rFonts w:ascii="Consolas" w:hAnsi="Consolas" w:eastAsia="Microsoft JhengHei"/>
+          <w:b w:val="0"/>
+          <w:i w:val="0"/>
+          <w:color w:val="17365D"/>
+          <w:sz w:val="17"/>
+        </w:rPr>
+        <w:t>/data/omnicheck/app/releases/a18c7cd</w:t>
+      </w:r>
+      <w:r>
+        <w:rPr>
+          <w:rFonts w:ascii="Calibri" w:hAnsi="Calibri" w:eastAsia="Microsoft JhengHei"/>
+          <w:b w:val="0"/>
+          <w:i w:val="0"/>
+        </w:rPr>
+        <w:t xml:space="preserve">，Web／Worker cwd 均確認為該 release，EDB migration 為 </w:t>
+      </w:r>
+      <w:r>
+        <w:rPr>
+          <w:rFonts w:ascii="Consolas" w:hAnsi="Consolas" w:eastAsia="Microsoft JhengHei"/>
+          <w:b w:val="0"/>
+          <w:i w:val="0"/>
+          <w:color w:val="17365D"/>
+          <w:sz w:val="17"/>
+        </w:rPr>
+        <w:t>0010_m14_2_batches (head)</w:t>
+      </w:r>
+      <w:r>
+        <w:rPr>
+          <w:rFonts w:ascii="Calibri" w:hAnsi="Calibri" w:eastAsia="Microsoft JhengHei"/>
+          <w:b w:val="0"/>
+          <w:i w:val="0"/>
+        </w:rPr>
+        <w:t xml:space="preserve">，health 顯示 database／external worker／AI enabled。Rollback release 為 </w:t>
+      </w:r>
+      <w:r>
+        <w:rPr>
+          <w:rFonts w:ascii="Consolas" w:hAnsi="Consolas" w:eastAsia="Microsoft JhengHei"/>
+          <w:b w:val="0"/>
+          <w:i w:val="0"/>
+          <w:color w:val="17365D"/>
+          <w:sz w:val="17"/>
+        </w:rPr>
+        <w:t>8bef579</w:t>
+      </w:r>
+      <w:r>
+        <w:rPr>
+          <w:rFonts w:ascii="Calibri" w:hAnsi="Calibri" w:eastAsia="Microsoft JhengHei"/>
+          <w:b w:val="0"/>
+          <w:i w:val="0"/>
+        </w:rPr>
+        <w:t xml:space="preserve">，環境檔備份為 </w:t>
+      </w:r>
+      <w:r>
+        <w:rPr>
+          <w:rFonts w:ascii="Consolas" w:hAnsi="Consolas" w:eastAsia="Microsoft JhengHei"/>
+          <w:b w:val="0"/>
+          <w:i w:val="0"/>
+          <w:color w:val="17365D"/>
+          <w:sz w:val="17"/>
+        </w:rPr>
+        <w:t>/etc/omnicheck-ai/omnicheck.env.pre-a18c7cd</w:t>
+      </w:r>
+      <w:r>
+        <w:rPr>
+          <w:rFonts w:ascii="Calibri" w:hAnsi="Calibri" w:eastAsia="Microsoft JhengHei"/>
+          <w:b w:val="0"/>
+          <w:i w:val="0"/>
+        </w:rPr>
+        <w:t>。舊 Job 的 Section Workflow 是稽核歷史，不會在重新 render 時改寫 ruleset；驗收新規則必須建立新案件。</w:t>
+      </w:r>
+    </w:p>
+    <w:p>
       <w:pPr>
         <w:pStyle w:val="Heading2"/>
       </w:pPr>

</xml_diff>

<commit_message>
feat: enable Gemma vision and simplify results UI
</commit_message>
<xml_diff>
--- a/docs/OMNICHECK_AI_BUILD_AND_OPERATIONS_GUIDE.docx
+++ b/docs/OMNICHECK_AI_BUILD_AND_OPERATIONS_GUIDE.docx
@@ -1494,7 +1494,7 @@
                 <w:i w:val="0"/>
                 <w:sz w:val="17"/>
               </w:rPr>
-              <w:t>0.14.4-candidate</w:t>
+              <w:t>0.14.4</w:t>
             </w:r>
           </w:p>
         </w:tc>
@@ -1546,7 +1546,7 @@
                 <w:i w:val="0"/>
                 <w:sz w:val="17"/>
               </w:rPr>
-              <w:t>全文字 Section Evidence-to-Ollama、additive Workflow rollback 相容、每 release 原生 venv 與載入路徑驗證</w:t>
+              <w:t>全 Section Evidence-to-Ollama、Gemma 文字／PEM Vision、收合式案件與產物 UI、additive Workflow rollback 相容、每 release 原生 venv</w:t>
             </w:r>
           </w:p>
         </w:tc>
@@ -1572,7 +1572,26 @@
                 <w:i w:val="0"/>
                 <w:sz w:val="17"/>
               </w:rPr>
-              <w:t>本機 123 tests；台灣行動支付 20/20 文字 Evidence Snapshot、QA/V4 QA、公司 gpt-oss:20b 實際 Evidence 分析通過；正式切換待完成</w:t>
+              <w:t>124 tests；台灣行動支付 20/20 文字 Evidence Snapshot、QA/V4 QA；</w:t>
+            </w:r>
+            <w:r>
+              <w:rPr>
+                <w:rFonts w:ascii="Arial Unicode MS" w:hAnsi="Arial Unicode MS" w:eastAsia="Arial Unicode MS"/>
+                <w:b w:val="0"/>
+                <w:i w:val="0"/>
+                <w:color w:val="17365D"/>
+                <w:sz w:val="17"/>
+              </w:rPr>
+              <w:t>gemma4:26b</w:t>
+            </w:r>
+            <w:r>
+              <w:rPr>
+                <w:rFonts w:ascii="Arial Unicode MS" w:hAnsi="Arial Unicode MS" w:eastAsia="Arial Unicode MS"/>
+                <w:b w:val="0"/>
+                <w:i w:val="0"/>
+                <w:sz w:val="17"/>
+              </w:rPr>
+              <w:t xml:space="preserve"> 通過 filesystem 文字與 CPU／Memory／Disk／Process 圖片測試</w:t>
             </w:r>
           </w:p>
         </w:tc>
@@ -15232,7 +15251,7 @@
               <w:br/>
               <w:t>OMNICHECK_AI_ENDPOINT=http://192.168.68.39:11434/v1/chat/completions</w:t>
               <w:br/>
-              <w:t>OMNICHECK_AI_MODEL=gpt-oss:20b</w:t>
+              <w:t>OMNICHECK_AI_MODEL=gemma4:26b</w:t>
               <w:br/>
               <w:t>OMNICHECK_AI_TIMEOUT_SECONDS=120</w:t>
               <w:br/>
@@ -15246,7 +15265,7 @@
               <w:br/>
               <w:t># 選配；必須是 Ollama 已安裝且支援 OpenAI image_url 的 Vision 模型</w:t>
               <w:br/>
-              <w:t>OMNICHECK_AI_VISION_MODEL=</w:t>
+              <w:t>OMNICHECK_AI_VISION_MODEL=gemma4:26b</w:t>
             </w:r>
           </w:p>
         </w:tc>
@@ -15995,7 +16014,7 @@
               </w:rPr>
               <w:t>OMNICHECK_AI_AUTO_DRAFT_ALL=true</w:t>
               <w:br/>
-              <w:t>OMNICHECK_AI_VISION_MODEL=&lt;已在 Ollama 安裝且支援圖片輸入的模型名稱&gt;</w:t>
+              <w:t>OMNICHECK_AI_VISION_MODEL=gemma4:26b</w:t>
             </w:r>
           </w:p>
         </w:tc>
@@ -16055,6 +16074,124 @@
           <w:i w:val="0"/>
         </w:rPr>
         <w:t xml:space="preserve"> 是選配設定：未設定時 PEM 圖片不會送入文字模型，而是保留 deterministic 觀察／建議並記錄 fallback；文字 Section 不受影響。Web 與 Worker 都應讀取相同環境檔，變更後至少重啟 Worker。</w:t>
+      </w:r>
+    </w:p>
+    <w:p>
+      <w:r>
+        <w:rPr>
+          <w:rFonts w:ascii="Arial Unicode MS" w:hAnsi="Arial Unicode MS" w:eastAsia="Arial Unicode MS"/>
+          <w:b w:val="0"/>
+          <w:i w:val="0"/>
+        </w:rPr>
+        <w:t>公司模型比較（2026-08-12）：</w:t>
+      </w:r>
+      <w:r>
+        <w:rPr>
+          <w:rFonts w:ascii="Arial Unicode MS" w:hAnsi="Arial Unicode MS" w:eastAsia="Arial Unicode MS"/>
+          <w:b w:val="0"/>
+          <w:i w:val="0"/>
+          <w:color w:val="17365D"/>
+          <w:sz w:val="17"/>
+        </w:rPr>
+        <w:t>gpt-oss:20b</w:t>
+      </w:r>
+      <w:r>
+        <w:rPr>
+          <w:rFonts w:ascii="Arial Unicode MS" w:hAnsi="Arial Unicode MS" w:eastAsia="Arial Unicode MS"/>
+          <w:b w:val="0"/>
+          <w:i w:val="0"/>
+        </w:rPr>
+        <w:t xml:space="preserve"> 與 </w:t>
+      </w:r>
+      <w:r>
+        <w:rPr>
+          <w:rFonts w:ascii="Arial Unicode MS" w:hAnsi="Arial Unicode MS" w:eastAsia="Arial Unicode MS"/>
+          <w:b w:val="0"/>
+          <w:i w:val="0"/>
+          <w:color w:val="17365D"/>
+          <w:sz w:val="17"/>
+        </w:rPr>
+        <w:t>nemotron-3-ultra:cloud</w:t>
+      </w:r>
+      <w:r>
+        <w:rPr>
+          <w:rFonts w:ascii="Arial Unicode MS" w:hAnsi="Arial Unicode MS" w:eastAsia="Arial Unicode MS"/>
+          <w:b w:val="0"/>
+          <w:i w:val="0"/>
+        </w:rPr>
+        <w:t xml:space="preserve"> 的 OpenAI-compatible endpoint 均未接受測試用 </w:t>
+      </w:r>
+      <w:r>
+        <w:rPr>
+          <w:rFonts w:ascii="Arial Unicode MS" w:hAnsi="Arial Unicode MS" w:eastAsia="Arial Unicode MS"/>
+          <w:b w:val="0"/>
+          <w:i w:val="0"/>
+          <w:color w:val="17365D"/>
+          <w:sz w:val="17"/>
+        </w:rPr>
+        <w:t>image_url</w:t>
+      </w:r>
+      <w:r>
+        <w:rPr>
+          <w:rFonts w:ascii="Arial Unicode MS" w:hAnsi="Arial Unicode MS" w:eastAsia="Arial Unicode MS"/>
+          <w:b w:val="0"/>
+          <w:i w:val="0"/>
+        </w:rPr>
+        <w:t xml:space="preserve">（HTTP 400）；Nemotron 文字回覆另曾將 pemp1 </w:t>
+      </w:r>
+      <w:r>
+        <w:rPr>
+          <w:rFonts w:ascii="Arial Unicode MS" w:hAnsi="Arial Unicode MS" w:eastAsia="Arial Unicode MS"/>
+          <w:b w:val="0"/>
+          <w:i w:val="0"/>
+          <w:color w:val="17365D"/>
+          <w:sz w:val="17"/>
+        </w:rPr>
+        <w:t>/</w:t>
+      </w:r>
+      <w:r>
+        <w:rPr>
+          <w:rFonts w:ascii="Arial Unicode MS" w:hAnsi="Arial Unicode MS" w:eastAsia="Arial Unicode MS"/>
+          <w:b w:val="0"/>
+          <w:i w:val="0"/>
+        </w:rPr>
+        <w:t xml:space="preserve"> 誤寫為 </w:t>
+      </w:r>
+      <w:r>
+        <w:rPr>
+          <w:rFonts w:ascii="Arial Unicode MS" w:hAnsi="Arial Unicode MS" w:eastAsia="Arial Unicode MS"/>
+          <w:b w:val="0"/>
+          <w:i w:val="0"/>
+          <w:color w:val="17365D"/>
+          <w:sz w:val="17"/>
+        </w:rPr>
+        <w:t>/pgdata</w:t>
+      </w:r>
+      <w:r>
+        <w:rPr>
+          <w:rFonts w:ascii="Arial Unicode MS" w:hAnsi="Arial Unicode MS" w:eastAsia="Arial Unicode MS"/>
+          <w:b w:val="0"/>
+          <w:i w:val="0"/>
+        </w:rPr>
+        <w:t>。</w:t>
+      </w:r>
+      <w:r>
+        <w:rPr>
+          <w:rFonts w:ascii="Arial Unicode MS" w:hAnsi="Arial Unicode MS" w:eastAsia="Arial Unicode MS"/>
+          <w:b w:val="0"/>
+          <w:i w:val="0"/>
+          <w:color w:val="17365D"/>
+          <w:sz w:val="17"/>
+        </w:rPr>
+        <w:t>gemma4:26b</w:t>
+      </w:r>
+      <w:r>
+        <w:rPr>
+          <w:rFonts w:ascii="Arial Unicode MS" w:hAnsi="Arial Unicode MS" w:eastAsia="Arial Unicode MS"/>
+          <w:b w:val="0"/>
+          <w:i w:val="0"/>
+        </w:rPr>
+        <w:t xml:space="preserve"> 正確遵守 filesystem 50%／70% 規則，並連續成功分析 CPU、Memory、Disk、Process 四張 PEM 圖。故目前文字與 Vision 都採 Gemma。圖片判讀仍是草稿，精確數值、期間與異常必須由工程師覆核後才能核准進入正式報告。</w:t>
       </w:r>
     </w:p>
     <w:p>

</xml_diff>

<commit_message>
docs: record Gemma vision deployment
</commit_message>
<xml_diff>
--- a/docs/OMNICHECK_AI_BUILD_AND_OPERATIONS_GUIDE.docx
+++ b/docs/OMNICHECK_AI_BUILD_AND_OPERATIONS_GUIDE.docx
@@ -16201,6 +16201,142 @@
           <w:b w:val="0"/>
           <w:i w:val="0"/>
         </w:rPr>
+        <w:t xml:space="preserve">公司正式部署紀錄（2026-08-12）：release </w:t>
+      </w:r>
+      <w:r>
+        <w:rPr>
+          <w:rFonts w:ascii="Arial Unicode MS" w:hAnsi="Arial Unicode MS" w:eastAsia="Arial Unicode MS"/>
+          <w:b w:val="0"/>
+          <w:i w:val="0"/>
+          <w:color w:val="17365D"/>
+          <w:sz w:val="17"/>
+        </w:rPr>
+        <w:t>4c755b7</w:t>
+      </w:r>
+      <w:r>
+        <w:rPr>
+          <w:rFonts w:ascii="Arial Unicode MS" w:hAnsi="Arial Unicode MS" w:eastAsia="Arial Unicode MS"/>
+          <w:b w:val="0"/>
+          <w:i w:val="0"/>
+        </w:rPr>
+        <w:t xml:space="preserve"> 使用 per-release 原生 venv，124 tests 通過；Web／Worker active，health 為 database／external worker／AI enabled。</w:t>
+      </w:r>
+      <w:r>
+        <w:rPr>
+          <w:rFonts w:ascii="Arial Unicode MS" w:hAnsi="Arial Unicode MS" w:eastAsia="Arial Unicode MS"/>
+          <w:b w:val="0"/>
+          <w:i w:val="0"/>
+          <w:color w:val="17365D"/>
+          <w:sz w:val="17"/>
+        </w:rPr>
+        <w:t>OMNICHECK_AI_MODEL</w:t>
+      </w:r>
+      <w:r>
+        <w:rPr>
+          <w:rFonts w:ascii="Arial Unicode MS" w:hAnsi="Arial Unicode MS" w:eastAsia="Arial Unicode MS"/>
+          <w:b w:val="0"/>
+          <w:i w:val="0"/>
+        </w:rPr>
+        <w:t xml:space="preserve"> 與 </w:t>
+      </w:r>
+      <w:r>
+        <w:rPr>
+          <w:rFonts w:ascii="Arial Unicode MS" w:hAnsi="Arial Unicode MS" w:eastAsia="Arial Unicode MS"/>
+          <w:b w:val="0"/>
+          <w:i w:val="0"/>
+          <w:color w:val="17365D"/>
+          <w:sz w:val="17"/>
+        </w:rPr>
+        <w:t>OMNICHECK_AI_VISION_MODEL</w:t>
+      </w:r>
+      <w:r>
+        <w:rPr>
+          <w:rFonts w:ascii="Arial Unicode MS" w:hAnsi="Arial Unicode MS" w:eastAsia="Arial Unicode MS"/>
+          <w:b w:val="0"/>
+          <w:i w:val="0"/>
+        </w:rPr>
+        <w:t xml:space="preserve"> 均為 </w:t>
+      </w:r>
+      <w:r>
+        <w:rPr>
+          <w:rFonts w:ascii="Arial Unicode MS" w:hAnsi="Arial Unicode MS" w:eastAsia="Arial Unicode MS"/>
+          <w:b w:val="0"/>
+          <w:i w:val="0"/>
+          <w:color w:val="17365D"/>
+          <w:sz w:val="17"/>
+        </w:rPr>
+        <w:t>gemma4:26b</w:t>
+      </w:r>
+      <w:r>
+        <w:rPr>
+          <w:rFonts w:ascii="Arial Unicode MS" w:hAnsi="Arial Unicode MS" w:eastAsia="Arial Unicode MS"/>
+          <w:b w:val="0"/>
+          <w:i w:val="0"/>
+        </w:rPr>
+        <w:t xml:space="preserve">。實際 CPU PEM Gateway request </w:t>
+      </w:r>
+      <w:r>
+        <w:rPr>
+          <w:rFonts w:ascii="Arial Unicode MS" w:hAnsi="Arial Unicode MS" w:eastAsia="Arial Unicode MS"/>
+          <w:b w:val="0"/>
+          <w:i w:val="0"/>
+          <w:color w:val="17365D"/>
+          <w:sz w:val="17"/>
+        </w:rPr>
+        <w:t>3ea01317c5194e4f843ffeed1da41bfd</w:t>
+      </w:r>
+      <w:r>
+        <w:rPr>
+          <w:rFonts w:ascii="Arial Unicode MS" w:hAnsi="Arial Unicode MS" w:eastAsia="Arial Unicode MS"/>
+          <w:b w:val="0"/>
+          <w:i w:val="0"/>
+        </w:rPr>
+        <w:t xml:space="preserve"> 成功保存 AI draft；核准前 Renderer 仍選 deterministic。環境檔備份為 </w:t>
+      </w:r>
+      <w:r>
+        <w:rPr>
+          <w:rFonts w:ascii="Arial Unicode MS" w:hAnsi="Arial Unicode MS" w:eastAsia="Arial Unicode MS"/>
+          <w:b w:val="0"/>
+          <w:i w:val="0"/>
+          <w:color w:val="17365D"/>
+          <w:sz w:val="17"/>
+        </w:rPr>
+        <w:t>/etc/omnicheck-ai/omnicheck.env.pre-4c755b7</w:t>
+      </w:r>
+      <w:r>
+        <w:rPr>
+          <w:rFonts w:ascii="Arial Unicode MS" w:hAnsi="Arial Unicode MS" w:eastAsia="Arial Unicode MS"/>
+          <w:b w:val="0"/>
+          <w:i w:val="0"/>
+        </w:rPr>
+        <w:t xml:space="preserve">，application rollback release 為 </w:t>
+      </w:r>
+      <w:r>
+        <w:rPr>
+          <w:rFonts w:ascii="Arial Unicode MS" w:hAnsi="Arial Unicode MS" w:eastAsia="Arial Unicode MS"/>
+          <w:b w:val="0"/>
+          <w:i w:val="0"/>
+          <w:color w:val="17365D"/>
+          <w:sz w:val="17"/>
+        </w:rPr>
+        <w:t>33d02b1</w:t>
+      </w:r>
+      <w:r>
+        <w:rPr>
+          <w:rFonts w:ascii="Arial Unicode MS" w:hAnsi="Arial Unicode MS" w:eastAsia="Arial Unicode MS"/>
+          <w:b w:val="0"/>
+          <w:i w:val="0"/>
+        </w:rPr>
+        <w:t>，本次沒有 migration。</w:t>
+      </w:r>
+    </w:p>
+    <w:p>
+      <w:r>
+        <w:rPr>
+          <w:rFonts w:ascii="Arial Unicode MS" w:hAnsi="Arial Unicode MS" w:eastAsia="Arial Unicode MS"/>
+          <w:b w:val="0"/>
+          <w:i w:val="0"/>
+        </w:rPr>
         <w:t>部署後使用一包含 PEM 圖片的測試資料驗收：</w:t>
       </w:r>
     </w:p>

</xml_diff>

<commit_message>
feat: include AI drafts in completed reports
</commit_message>
<xml_diff>
--- a/docs/OMNICHECK_AI_BUILD_AND_OPERATIONS_GUIDE.docx
+++ b/docs/OMNICHECK_AI_BUILD_AND_OPERATIONS_GUIDE.docx
@@ -1467,6 +1467,112 @@
                 <w:sz w:val="17"/>
               </w:rPr>
               <w:t>驗證狀態</w:t>
+            </w:r>
+          </w:p>
+        </w:tc>
+      </w:tr>
+      <w:tr>
+        <w:tc>
+          <w:tcPr>
+            <w:tcW w:type="dxa" w:w="2470"/>
+            <w:vAlign w:val="center"/>
+            <w:tcMar>
+              <w:top w:w="45" w:type="dxa"/>
+              <w:start w:w="120" w:type="dxa"/>
+              <w:bottom w:w="45" w:type="dxa"/>
+              <w:end w:w="120" w:type="dxa"/>
+            </w:tcMar>
+          </w:tcPr>
+          <w:p>
+            <w:pPr>
+              <w:spacing w:after="0"/>
+            </w:pPr>
+            <w:r>
+              <w:rPr>
+                <w:rFonts w:ascii="Arial Unicode MS" w:hAnsi="Arial Unicode MS" w:eastAsia="Arial Unicode MS"/>
+                <w:b w:val="0"/>
+                <w:i w:val="0"/>
+                <w:sz w:val="17"/>
+              </w:rPr>
+              <w:t>0.14.5-candidate</w:t>
+            </w:r>
+          </w:p>
+        </w:tc>
+        <w:tc>
+          <w:tcPr>
+            <w:tcW w:type="dxa" w:w="2470"/>
+            <w:vAlign w:val="center"/>
+            <w:tcMar>
+              <w:top w:w="45" w:type="dxa"/>
+              <w:start w:w="120" w:type="dxa"/>
+              <w:bottom w:w="45" w:type="dxa"/>
+              <w:end w:w="120" w:type="dxa"/>
+            </w:tcMar>
+          </w:tcPr>
+          <w:p>
+            <w:pPr>
+              <w:spacing w:after="0"/>
+            </w:pPr>
+            <w:r>
+              <w:rPr>
+                <w:rFonts w:ascii="Arial Unicode MS" w:hAnsi="Arial Unicode MS" w:eastAsia="Arial Unicode MS"/>
+                <w:b w:val="0"/>
+                <w:i w:val="0"/>
+                <w:sz w:val="17"/>
+              </w:rPr>
+              <w:t>2026-08-12</w:t>
+            </w:r>
+          </w:p>
+        </w:tc>
+        <w:tc>
+          <w:tcPr>
+            <w:tcW w:type="dxa" w:w="2470"/>
+            <w:vAlign w:val="center"/>
+            <w:tcMar>
+              <w:top w:w="45" w:type="dxa"/>
+              <w:start w:w="120" w:type="dxa"/>
+              <w:bottom w:w="45" w:type="dxa"/>
+              <w:end w:w="120" w:type="dxa"/>
+            </w:tcMar>
+          </w:tcPr>
+          <w:p>
+            <w:pPr>
+              <w:spacing w:after="0"/>
+            </w:pPr>
+            <w:r>
+              <w:rPr>
+                <w:rFonts w:ascii="Arial Unicode MS" w:hAnsi="Arial Unicode MS" w:eastAsia="Arial Unicode MS"/>
+                <w:b w:val="0"/>
+                <w:i w:val="0"/>
+                <w:sz w:val="17"/>
+              </w:rPr>
+              <w:t>AI batch 納入 Job 完成條件；初版報告採 approved／AI draft／deterministic；完成後才顯示 PDF／DOCX</w:t>
+            </w:r>
+          </w:p>
+        </w:tc>
+        <w:tc>
+          <w:tcPr>
+            <w:tcW w:type="dxa" w:w="2470"/>
+            <w:vAlign w:val="center"/>
+            <w:tcMar>
+              <w:top w:w="45" w:type="dxa"/>
+              <w:start w:w="120" w:type="dxa"/>
+              <w:bottom w:w="45" w:type="dxa"/>
+              <w:end w:w="120" w:type="dxa"/>
+            </w:tcMar>
+          </w:tcPr>
+          <w:p>
+            <w:pPr>
+              <w:spacing w:after="0"/>
+            </w:pPr>
+            <w:r>
+              <w:rPr>
+                <w:rFonts w:ascii="Arial Unicode MS" w:hAnsi="Arial Unicode MS" w:eastAsia="Arial Unicode MS"/>
+                <w:b w:val="0"/>
+                <w:i w:val="0"/>
+                <w:sz w:val="17"/>
+              </w:rPr>
+              <w:t>本機 125 tests；公司實際案件與 PDF／DOCX 待部署驗證</w:t>
             </w:r>
           </w:p>
         </w:tc>
@@ -16615,6 +16721,335 @@
     </w:p>
     <w:p>
       <w:pPr>
+        <w:pStyle w:val="Heading3"/>
+      </w:pPr>
+      <w:r>
+        <w:rPr>
+          <w:rFonts w:ascii="Arial Unicode MS" w:hAnsi="Arial Unicode MS" w:eastAsia="Arial Unicode MS"/>
+          <w:b w:val="0"/>
+          <w:i w:val="0"/>
+        </w:rPr>
+        <w:t>13.17 M14.5 AI 完整交付流程</w:t>
+      </w:r>
+    </w:p>
+    <w:p>
+      <w:r>
+        <w:rPr>
+          <w:rFonts w:ascii="Arial Unicode MS" w:hAnsi="Arial Unicode MS" w:eastAsia="Arial Unicode MS"/>
+          <w:b w:val="0"/>
+          <w:i w:val="0"/>
+        </w:rPr>
+        <w:t xml:space="preserve">M14.5 不新增 migration。行為由 Application release 改變：Worker 取得 Job lease 後，先執行既有 Pipeline 與持久化 deterministic baseline，再於同一 lease 內完成該 Job 的所有 durable AI batches，最後以 </w:t>
+      </w:r>
+      <w:r>
+        <w:rPr>
+          <w:rFonts w:ascii="Arial Unicode MS" w:hAnsi="Arial Unicode MS" w:eastAsia="Arial Unicode MS"/>
+          <w:b w:val="0"/>
+          <w:i w:val="0"/>
+          <w:color w:val="17365D"/>
+          <w:sz w:val="17"/>
+        </w:rPr>
+        <w:t>approved → ai_draft → deterministic</w:t>
+      </w:r>
+      <w:r>
+        <w:rPr>
+          <w:rFonts w:ascii="Arial Unicode MS" w:hAnsi="Arial Unicode MS" w:eastAsia="Arial Unicode MS"/>
+          <w:b w:val="0"/>
+          <w:i w:val="0"/>
+        </w:rPr>
+        <w:t xml:space="preserve"> 優先順序重新產生 DOCX／PDF。只有最終 render 與 QA 成功後，Job 才標示 </w:t>
+      </w:r>
+      <w:r>
+        <w:rPr>
+          <w:rFonts w:ascii="Arial Unicode MS" w:hAnsi="Arial Unicode MS" w:eastAsia="Arial Unicode MS"/>
+          <w:b w:val="0"/>
+          <w:i w:val="0"/>
+          <w:color w:val="17365D"/>
+          <w:sz w:val="17"/>
+        </w:rPr>
+        <w:t>succeeded</w:t>
+      </w:r>
+      <w:r>
+        <w:rPr>
+          <w:rFonts w:ascii="Arial Unicode MS" w:hAnsi="Arial Unicode MS" w:eastAsia="Arial Unicode MS"/>
+          <w:b w:val="0"/>
+          <w:i w:val="0"/>
+        </w:rPr>
+        <w:t>，Web 才顯示下載連結。</w:t>
+      </w:r>
+    </w:p>
+    <w:p>
+      <w:r>
+        <w:rPr>
+          <w:rFonts w:ascii="Arial Unicode MS" w:hAnsi="Arial Unicode MS" w:eastAsia="Arial Unicode MS"/>
+          <w:b w:val="0"/>
+          <w:i w:val="0"/>
+        </w:rPr>
+        <w:t xml:space="preserve">個別 AI request 失敗時，batch item 記錄 </w:t>
+      </w:r>
+      <w:r>
+        <w:rPr>
+          <w:rFonts w:ascii="Arial Unicode MS" w:hAnsi="Arial Unicode MS" w:eastAsia="Arial Unicode MS"/>
+          <w:b w:val="0"/>
+          <w:i w:val="0"/>
+          <w:color w:val="17365D"/>
+          <w:sz w:val="17"/>
+        </w:rPr>
+        <w:t>fallback</w:t>
+      </w:r>
+      <w:r>
+        <w:rPr>
+          <w:rFonts w:ascii="Arial Unicode MS" w:hAnsi="Arial Unicode MS" w:eastAsia="Arial Unicode MS"/>
+          <w:b w:val="0"/>
+          <w:i w:val="0"/>
+        </w:rPr>
+        <w:t>，該 Section 使用 deterministic，不阻斷其他項目或整份報告。AI disabled 時維持 deterministic-only。AI draft 進入初版報告不代表工程師 approval；工程師修改文字仍須 reviewed／approved 後，才會優先取代 AI draft。</w:t>
+      </w:r>
+    </w:p>
+    <w:p>
+      <w:r>
+        <w:rPr>
+          <w:rFonts w:ascii="Arial Unicode MS" w:hAnsi="Arial Unicode MS" w:eastAsia="Arial Unicode MS"/>
+          <w:b w:val="0"/>
+          <w:i w:val="0"/>
+        </w:rPr>
+        <w:t>部署驗收：</w:t>
+      </w:r>
+    </w:p>
+    <w:p>
+      <w:pPr>
+        <w:pStyle w:val="ListNumber"/>
+      </w:pPr>
+      <w:r>
+        <w:rPr>
+          <w:rFonts w:ascii="Arial Unicode MS" w:hAnsi="Arial Unicode MS" w:eastAsia="Arial Unicode MS"/>
+          <w:b w:val="0"/>
+          <w:i w:val="0"/>
+        </w:rPr>
+        <w:t xml:space="preserve">建立含文字與 PEM 圖片的新案件，確認 Job 在 AI batches 尚未終止時保持 </w:t>
+      </w:r>
+      <w:r>
+        <w:rPr>
+          <w:rFonts w:ascii="Arial Unicode MS" w:hAnsi="Arial Unicode MS" w:eastAsia="Arial Unicode MS"/>
+          <w:b w:val="0"/>
+          <w:i w:val="0"/>
+          <w:color w:val="17365D"/>
+          <w:sz w:val="17"/>
+        </w:rPr>
+        <w:t>running</w:t>
+      </w:r>
+      <w:r>
+        <w:rPr>
+          <w:rFonts w:ascii="Arial Unicode MS" w:hAnsi="Arial Unicode MS" w:eastAsia="Arial Unicode MS"/>
+          <w:b w:val="0"/>
+          <w:i w:val="0"/>
+        </w:rPr>
+        <w:t>，outputs API 不可下載。</w:t>
+      </w:r>
+    </w:p>
+    <w:p>
+      <w:pPr>
+        <w:pStyle w:val="ListNumber"/>
+      </w:pPr>
+      <w:r>
+        <w:rPr>
+          <w:rFonts w:ascii="Arial Unicode MS" w:hAnsi="Arial Unicode MS" w:eastAsia="Arial Unicode MS"/>
+          <w:b w:val="0"/>
+          <w:i w:val="0"/>
+        </w:rPr>
+        <w:t xml:space="preserve">確認文字與圖片 AI audit 使用 </w:t>
+      </w:r>
+      <w:r>
+        <w:rPr>
+          <w:rFonts w:ascii="Arial Unicode MS" w:hAnsi="Arial Unicode MS" w:eastAsia="Arial Unicode MS"/>
+          <w:b w:val="0"/>
+          <w:i w:val="0"/>
+          <w:color w:val="17365D"/>
+          <w:sz w:val="17"/>
+        </w:rPr>
+        <w:t>gemma4:26b</w:t>
+      </w:r>
+      <w:r>
+        <w:rPr>
+          <w:rFonts w:ascii="Arial Unicode MS" w:hAnsi="Arial Unicode MS" w:eastAsia="Arial Unicode MS"/>
+          <w:b w:val="0"/>
+          <w:i w:val="0"/>
+        </w:rPr>
+        <w:t xml:space="preserve">；成功項目為 </w:t>
+      </w:r>
+      <w:r>
+        <w:rPr>
+          <w:rFonts w:ascii="Arial Unicode MS" w:hAnsi="Arial Unicode MS" w:eastAsia="Arial Unicode MS"/>
+          <w:b w:val="0"/>
+          <w:i w:val="0"/>
+          <w:color w:val="17365D"/>
+          <w:sz w:val="17"/>
+        </w:rPr>
+        <w:t>ai_drafted</w:t>
+      </w:r>
+      <w:r>
+        <w:rPr>
+          <w:rFonts w:ascii="Arial Unicode MS" w:hAnsi="Arial Unicode MS" w:eastAsia="Arial Unicode MS"/>
+          <w:b w:val="0"/>
+          <w:i w:val="0"/>
+        </w:rPr>
+        <w:t>，失敗項目有 fallback error。</w:t>
+      </w:r>
+    </w:p>
+    <w:p>
+      <w:pPr>
+        <w:pStyle w:val="ListNumber"/>
+      </w:pPr>
+      <w:r>
+        <w:rPr>
+          <w:rFonts w:ascii="Arial Unicode MS" w:hAnsi="Arial Unicode MS" w:eastAsia="Arial Unicode MS"/>
+          <w:b w:val="0"/>
+          <w:i w:val="0"/>
+        </w:rPr>
+        <w:t>Job 顯示 succeeded 後下載 DOCX／PDF，抽查文字與 PEM Section 已使用 AI observation／recommendation；fallback 項目仍是 deterministic。</w:t>
+      </w:r>
+    </w:p>
+    <w:p>
+      <w:pPr>
+        <w:pStyle w:val="ListNumber"/>
+      </w:pPr>
+      <w:r>
+        <w:rPr>
+          <w:rFonts w:ascii="Arial Unicode MS" w:hAnsi="Arial Unicode MS" w:eastAsia="Arial Unicode MS"/>
+          <w:b w:val="0"/>
+          <w:i w:val="0"/>
+        </w:rPr>
+        <w:t xml:space="preserve">確認 </w:t>
+      </w:r>
+      <w:r>
+        <w:rPr>
+          <w:rFonts w:ascii="Arial Unicode MS" w:hAnsi="Arial Unicode MS" w:eastAsia="Arial Unicode MS"/>
+          <w:b w:val="0"/>
+          <w:i w:val="0"/>
+          <w:color w:val="17365D"/>
+          <w:sz w:val="17"/>
+        </w:rPr>
+        <w:t>section-workflow.json</w:t>
+      </w:r>
+      <w:r>
+        <w:rPr>
+          <w:rFonts w:ascii="Arial Unicode MS" w:hAnsi="Arial Unicode MS" w:eastAsia="Arial Unicode MS"/>
+          <w:b w:val="0"/>
+          <w:i w:val="0"/>
+        </w:rPr>
+        <w:t xml:space="preserve"> 的 </w:t>
+      </w:r>
+      <w:r>
+        <w:rPr>
+          <w:rFonts w:ascii="Arial Unicode MS" w:hAnsi="Arial Unicode MS" w:eastAsia="Arial Unicode MS"/>
+          <w:b w:val="0"/>
+          <w:i w:val="0"/>
+          <w:color w:val="17365D"/>
+          <w:sz w:val="17"/>
+        </w:rPr>
+        <w:t>renderer_uses_ai=true</w:t>
+      </w:r>
+      <w:r>
+        <w:rPr>
+          <w:rFonts w:ascii="Arial Unicode MS" w:hAnsi="Arial Unicode MS" w:eastAsia="Arial Unicode MS"/>
+          <w:b w:val="0"/>
+          <w:i w:val="0"/>
+        </w:rPr>
+        <w:t xml:space="preserve">，但 item </w:t>
+      </w:r>
+      <w:r>
+        <w:rPr>
+          <w:rFonts w:ascii="Arial Unicode MS" w:hAnsi="Arial Unicode MS" w:eastAsia="Arial Unicode MS"/>
+          <w:b w:val="0"/>
+          <w:i w:val="0"/>
+          <w:color w:val="17365D"/>
+          <w:sz w:val="17"/>
+        </w:rPr>
+        <w:t>selected_source</w:t>
+      </w:r>
+      <w:r>
+        <w:rPr>
+          <w:rFonts w:ascii="Arial Unicode MS" w:hAnsi="Arial Unicode MS" w:eastAsia="Arial Unicode MS"/>
+          <w:b w:val="0"/>
+          <w:i w:val="0"/>
+        </w:rPr>
+        <w:t xml:space="preserve"> 仍保留 </w:t>
+      </w:r>
+      <w:r>
+        <w:rPr>
+          <w:rFonts w:ascii="Arial Unicode MS" w:hAnsi="Arial Unicode MS" w:eastAsia="Arial Unicode MS"/>
+          <w:b w:val="0"/>
+          <w:i w:val="0"/>
+          <w:color w:val="17365D"/>
+          <w:sz w:val="17"/>
+        </w:rPr>
+        <w:t>deterministic_template</w:t>
+      </w:r>
+      <w:r>
+        <w:rPr>
+          <w:rFonts w:ascii="Arial Unicode MS" w:hAnsi="Arial Unicode MS" w:eastAsia="Arial Unicode MS"/>
+          <w:b w:val="0"/>
+          <w:i w:val="0"/>
+        </w:rPr>
+        <w:t xml:space="preserve"> 或 </w:t>
+      </w:r>
+      <w:r>
+        <w:rPr>
+          <w:rFonts w:ascii="Arial Unicode MS" w:hAnsi="Arial Unicode MS" w:eastAsia="Arial Unicode MS"/>
+          <w:b w:val="0"/>
+          <w:i w:val="0"/>
+          <w:color w:val="17365D"/>
+          <w:sz w:val="17"/>
+        </w:rPr>
+        <w:t>approved</w:t>
+      </w:r>
+      <w:r>
+        <w:rPr>
+          <w:rFonts w:ascii="Arial Unicode MS" w:hAnsi="Arial Unicode MS" w:eastAsia="Arial Unicode MS"/>
+          <w:b w:val="0"/>
+          <w:i w:val="0"/>
+        </w:rPr>
+        <w:t>，避免把未核准草稿偽裝為 approved。</w:t>
+      </w:r>
+    </w:p>
+    <w:p>
+      <w:pPr>
+        <w:pStyle w:val="ListNumber"/>
+      </w:pPr>
+      <w:r>
+        <w:rPr>
+          <w:rFonts w:ascii="Arial Unicode MS" w:hAnsi="Arial Unicode MS" w:eastAsia="Arial Unicode MS"/>
+          <w:b w:val="0"/>
+          <w:i w:val="0"/>
+        </w:rPr>
+        <w:t>工程師修改並核准一個 Section 後重新產報，確認 approved 文字優先於原 AI draft。</w:t>
+      </w:r>
+    </w:p>
+    <w:p>
+      <w:pPr>
+        <w:pStyle w:val="ListNumber"/>
+      </w:pPr>
+      <w:r>
+        <w:rPr>
+          <w:rFonts w:ascii="Arial Unicode MS" w:hAnsi="Arial Unicode MS" w:eastAsia="Arial Unicode MS"/>
+          <w:b w:val="0"/>
+          <w:i w:val="0"/>
+        </w:rPr>
+        <w:t>重新啟動 Worker 模擬 retry，確認 terminal batches 不重跑，既有 AI／工程師 revisions 不被覆寫。</w:t>
+      </w:r>
+    </w:p>
+    <w:p>
+      <w:r>
+        <w:rPr>
+          <w:rFonts w:ascii="Arial Unicode MS" w:hAnsi="Arial Unicode MS" w:eastAsia="Arial Unicode MS"/>
+          <w:b w:val="0"/>
+          <w:i w:val="0"/>
+        </w:rPr>
+        <w:t>Rollback：切回 M14.4 Application release 即恢復舊流程，不需 EDB downgrade。注意 M14.4 會先將 Job 標示 succeeded，再於背景產生 AI 草稿，且初版報告不使用未核准草稿；操作公告必須清楚說明語意差異。</w:t>
+      </w:r>
+    </w:p>
+    <w:p>
+      <w:pPr>
         <w:pStyle w:val="Heading2"/>
       </w:pPr>
       <w:r>

</xml_diff>

<commit_message>
feat: add M13 CVE cache matcher and report gate
</commit_message>
<xml_diff>
--- a/docs/OMNICHECK_AI_BUILD_AND_OPERATIONS_GUIDE.docx
+++ b/docs/OMNICHECK_AI_BUILD_AND_OPERATIONS_GUIDE.docx
@@ -103,7 +103,7 @@
           <w:b w:val="0"/>
           <w:i w:val="0"/>
         </w:rPr>
-        <w:t>文件版本：0.14.4-candidate</w:t>
+        <w:t>文件版本：0.14.5</w:t>
       </w:r>
     </w:p>
     <w:p>
@@ -129,7 +129,17 @@
           <w:b w:val="0"/>
           <w:i w:val="0"/>
         </w:rPr>
-        <w:t>適用程式基準：M14.3 本機候選；正式公司基準仍以已部署 release 為準</w:t>
+        <w:t xml:space="preserve">適用程式基準：M14.5 公司正式 release </w:t>
+      </w:r>
+      <w:r>
+        <w:rPr>
+          <w:rFonts w:ascii="Arial Unicode MS" w:hAnsi="Arial Unicode MS" w:eastAsia="Arial Unicode MS"/>
+          <w:b w:val="0"/>
+          <w:i w:val="0"/>
+          <w:color w:val="17365D"/>
+          <w:sz w:val="17"/>
+        </w:rPr>
+        <w:t>e6e31f2</w:t>
       </w:r>
     </w:p>
     <w:p>
@@ -170,7 +180,7 @@
           <w:color w:val="17365D"/>
           <w:sz w:val="17"/>
         </w:rPr>
-        <w:t>m10</w:t>
+        <w:t>4c755b7</w:t>
       </w:r>
     </w:p>
     <w:p>
@@ -1494,7 +1504,142 @@
                 <w:i w:val="0"/>
                 <w:sz w:val="17"/>
               </w:rPr>
-              <w:t>0.14.5-candidate</w:t>
+              <w:t>0.14.6</w:t>
+            </w:r>
+          </w:p>
+        </w:tc>
+        <w:tc>
+          <w:tcPr>
+            <w:tcW w:type="dxa" w:w="2470"/>
+            <w:vAlign w:val="center"/>
+            <w:tcMar>
+              <w:top w:w="45" w:type="dxa"/>
+              <w:start w:w="120" w:type="dxa"/>
+              <w:bottom w:w="45" w:type="dxa"/>
+              <w:end w:w="120" w:type="dxa"/>
+            </w:tcMar>
+          </w:tcPr>
+          <w:p>
+            <w:pPr>
+              <w:spacing w:after="0"/>
+            </w:pPr>
+            <w:r>
+              <w:rPr>
+                <w:rFonts w:ascii="Arial Unicode MS" w:hAnsi="Arial Unicode MS" w:eastAsia="Arial Unicode MS"/>
+                <w:b w:val="0"/>
+                <w:i w:val="0"/>
+                <w:sz w:val="17"/>
+              </w:rPr>
+              <w:t>2026-08-12</w:t>
+            </w:r>
+          </w:p>
+        </w:tc>
+        <w:tc>
+          <w:tcPr>
+            <w:tcW w:type="dxa" w:w="2470"/>
+            <w:vAlign w:val="center"/>
+            <w:tcMar>
+              <w:top w:w="45" w:type="dxa"/>
+              <w:start w:w="120" w:type="dxa"/>
+              <w:bottom w:w="45" w:type="dxa"/>
+              <w:end w:w="120" w:type="dxa"/>
+            </w:tcMar>
+          </w:tcPr>
+          <w:p>
+            <w:pPr>
+              <w:spacing w:after="0"/>
+            </w:pPr>
+            <w:r>
+              <w:rPr>
+                <w:rFonts w:ascii="Arial Unicode MS" w:hAnsi="Arial Unicode MS" w:eastAsia="Arial Unicode MS"/>
+                <w:b w:val="0"/>
+                <w:i w:val="0"/>
+                <w:sz w:val="17"/>
+              </w:rPr>
+              <w:t>文字／Vision 模型分流、Vision 縮圖、正常圖略過、35 秒 timeout 與最多 2 張並行</w:t>
+            </w:r>
+          </w:p>
+        </w:tc>
+        <w:tc>
+          <w:tcPr>
+            <w:tcW w:type="dxa" w:w="2470"/>
+            <w:vAlign w:val="center"/>
+            <w:tcMar>
+              <w:top w:w="45" w:type="dxa"/>
+              <w:start w:w="120" w:type="dxa"/>
+              <w:bottom w:w="45" w:type="dxa"/>
+              <w:end w:w="120" w:type="dxa"/>
+            </w:tcMar>
+          </w:tcPr>
+          <w:p>
+            <w:pPr>
+              <w:spacing w:after="0"/>
+            </w:pPr>
+            <w:r>
+              <w:rPr>
+                <w:rFonts w:ascii="Arial Unicode MS" w:hAnsi="Arial Unicode MS" w:eastAsia="Arial Unicode MS"/>
+                <w:b w:val="0"/>
+                <w:i w:val="0"/>
+                <w:sz w:val="17"/>
+              </w:rPr>
+              <w:t xml:space="preserve">release </w:t>
+            </w:r>
+            <w:r>
+              <w:rPr>
+                <w:rFonts w:ascii="Arial Unicode MS" w:hAnsi="Arial Unicode MS" w:eastAsia="Arial Unicode MS"/>
+                <w:b w:val="0"/>
+                <w:i w:val="0"/>
+                <w:color w:val="17365D"/>
+                <w:sz w:val="17"/>
+              </w:rPr>
+              <w:t>01ba901</w:t>
+            </w:r>
+            <w:r>
+              <w:rPr>
+                <w:rFonts w:ascii="Arial Unicode MS" w:hAnsi="Arial Unicode MS" w:eastAsia="Arial Unicode MS"/>
+                <w:b w:val="0"/>
+                <w:i w:val="0"/>
+                <w:sz w:val="17"/>
+              </w:rPr>
+              <w:t xml:space="preserve">；本機／公司 127 tests；實機 Job 約 6 分鐘、15 AI draft／10 fallback、QA/V4 QA、DOCX/PDF 通過；rollback </w:t>
+            </w:r>
+            <w:r>
+              <w:rPr>
+                <w:rFonts w:ascii="Arial Unicode MS" w:hAnsi="Arial Unicode MS" w:eastAsia="Arial Unicode MS"/>
+                <w:b w:val="0"/>
+                <w:i w:val="0"/>
+                <w:color w:val="17365D"/>
+                <w:sz w:val="17"/>
+              </w:rPr>
+              <w:t>e6e31f2</w:t>
+            </w:r>
+          </w:p>
+        </w:tc>
+      </w:tr>
+      <w:tr>
+        <w:tc>
+          <w:tcPr>
+            <w:tcW w:type="dxa" w:w="2470"/>
+            <w:vAlign w:val="center"/>
+            <w:tcMar>
+              <w:top w:w="45" w:type="dxa"/>
+              <w:start w:w="120" w:type="dxa"/>
+              <w:bottom w:w="45" w:type="dxa"/>
+              <w:end w:w="120" w:type="dxa"/>
+            </w:tcMar>
+          </w:tcPr>
+          <w:p>
+            <w:pPr>
+              <w:spacing w:after="0"/>
+            </w:pPr>
+            <w:r>
+              <w:rPr>
+                <w:rFonts w:ascii="Arial Unicode MS" w:hAnsi="Arial Unicode MS" w:eastAsia="Arial Unicode MS"/>
+                <w:b w:val="0"/>
+                <w:i w:val="0"/>
+                <w:sz w:val="17"/>
+              </w:rPr>
+              <w:t>0.14.5</w:t>
             </w:r>
           </w:p>
         </w:tc>
@@ -1572,7 +1717,55 @@
                 <w:i w:val="0"/>
                 <w:sz w:val="17"/>
               </w:rPr>
-              <w:t>本機 125 tests；公司實際案件與 PDF／DOCX 待部署驗證</w:t>
+              <w:t xml:space="preserve">release </w:t>
+            </w:r>
+            <w:r>
+              <w:rPr>
+                <w:rFonts w:ascii="Arial Unicode MS" w:hAnsi="Arial Unicode MS" w:eastAsia="Arial Unicode MS"/>
+                <w:b w:val="0"/>
+                <w:i w:val="0"/>
+                <w:color w:val="17365D"/>
+                <w:sz w:val="17"/>
+              </w:rPr>
+              <w:t>e6e31f2</w:t>
+            </w:r>
+            <w:r>
+              <w:rPr>
+                <w:rFonts w:ascii="Arial Unicode MS" w:hAnsi="Arial Unicode MS" w:eastAsia="Arial Unicode MS"/>
+                <w:b w:val="0"/>
+                <w:i w:val="0"/>
+                <w:sz w:val="17"/>
+              </w:rPr>
+              <w:t xml:space="preserve">；本機／公司 125 tests；實機 Job </w:t>
+            </w:r>
+            <w:r>
+              <w:rPr>
+                <w:rFonts w:ascii="Arial Unicode MS" w:hAnsi="Arial Unicode MS" w:eastAsia="Arial Unicode MS"/>
+                <w:b w:val="0"/>
+                <w:i w:val="0"/>
+                <w:color w:val="17365D"/>
+                <w:sz w:val="17"/>
+              </w:rPr>
+              <w:t>2c0d700694d4472c8c218e79d40e52a4</w:t>
+            </w:r>
+            <w:r>
+              <w:rPr>
+                <w:rFonts w:ascii="Arial Unicode MS" w:hAnsi="Arial Unicode MS" w:eastAsia="Arial Unicode MS"/>
+                <w:b w:val="0"/>
+                <w:i w:val="0"/>
+                <w:sz w:val="17"/>
+              </w:rPr>
+              <w:t xml:space="preserve"> 21 AI draft、4 fallback、QA/V4 QA、DOCX/PDF 通過；rollback </w:t>
+            </w:r>
+            <w:r>
+              <w:rPr>
+                <w:rFonts w:ascii="Arial Unicode MS" w:hAnsi="Arial Unicode MS" w:eastAsia="Arial Unicode MS"/>
+                <w:b w:val="0"/>
+                <w:i w:val="0"/>
+                <w:color w:val="17365D"/>
+                <w:sz w:val="17"/>
+              </w:rPr>
+              <w:t>4c755b7</w:t>
             </w:r>
           </w:p>
         </w:tc>
@@ -5985,6 +6178,86 @@
                 <w:i w:val="0"/>
                 <w:sz w:val="17"/>
               </w:rPr>
+              <w:t>M13.1～M13.3</w:t>
+            </w:r>
+          </w:p>
+        </w:tc>
+        <w:tc>
+          <w:tcPr>
+            <w:tcW w:type="dxa" w:w="3293"/>
+            <w:vAlign w:val="center"/>
+            <w:tcMar>
+              <w:top w:w="45" w:type="dxa"/>
+              <w:start w:w="120" w:type="dxa"/>
+              <w:bottom w:w="45" w:type="dxa"/>
+              <w:end w:w="120" w:type="dxa"/>
+            </w:tcMar>
+          </w:tcPr>
+          <w:p>
+            <w:pPr>
+              <w:spacing w:after="0"/>
+            </w:pPr>
+            <w:r>
+              <w:rPr>
+                <w:rFonts w:ascii="Arial Unicode MS" w:hAnsi="Arial Unicode MS" w:eastAsia="Arial Unicode MS"/>
+                <w:b w:val="0"/>
+                <w:i w:val="0"/>
+                <w:sz w:val="17"/>
+              </w:rPr>
+              <w:t>開發中、本機驗證</w:t>
+            </w:r>
+          </w:p>
+        </w:tc>
+        <w:tc>
+          <w:tcPr>
+            <w:tcW w:type="dxa" w:w="3293"/>
+            <w:vAlign w:val="center"/>
+            <w:tcMar>
+              <w:top w:w="45" w:type="dxa"/>
+              <w:start w:w="120" w:type="dxa"/>
+              <w:bottom w:w="45" w:type="dxa"/>
+              <w:end w:w="120" w:type="dxa"/>
+            </w:tcMar>
+          </w:tcPr>
+          <w:p>
+            <w:pPr>
+              <w:spacing w:after="0"/>
+            </w:pPr>
+            <w:r>
+              <w:rPr>
+                <w:rFonts w:ascii="Arial Unicode MS" w:hAnsi="Arial Unicode MS" w:eastAsia="Arial Unicode MS"/>
+                <w:b w:val="0"/>
+                <w:i w:val="0"/>
+                <w:sz w:val="17"/>
+              </w:rPr>
+              <w:t>固定來源 Cache import、Primary version parser、確定性 matcher、stale gate、V4 CVE contract；待公司 sync／E2E</w:t>
+            </w:r>
+          </w:p>
+        </w:tc>
+      </w:tr>
+      <w:tr>
+        <w:tc>
+          <w:tcPr>
+            <w:tcW w:type="dxa" w:w="3293"/>
+            <w:vAlign w:val="center"/>
+            <w:tcMar>
+              <w:top w:w="45" w:type="dxa"/>
+              <w:start w:w="120" w:type="dxa"/>
+              <w:bottom w:w="45" w:type="dxa"/>
+              <w:end w:w="120" w:type="dxa"/>
+            </w:tcMar>
+          </w:tcPr>
+          <w:p>
+            <w:pPr>
+              <w:spacing w:after="0"/>
+            </w:pPr>
+            <w:r>
+              <w:rPr>
+                <w:rFonts w:ascii="Arial Unicode MS" w:hAnsi="Arial Unicode MS" w:eastAsia="Arial Unicode MS"/>
+                <w:b w:val="0"/>
+                <w:i w:val="0"/>
+                <w:sz w:val="17"/>
+              </w:rPr>
               <w:t>M11～M15</w:t>
             </w:r>
           </w:p>
@@ -20608,7 +20881,7 @@
           <w:b w:val="0"/>
           <w:i w:val="0"/>
         </w:rPr>
-        <w:t xml:space="preserve">同仁 UI Adapter 已進入候選驗證；Section persistence/API、歷史比較、CVE cache 與 Ollama AI Gateway 尚未完成，順序與責任邊界見 </w:t>
+        <w:t xml:space="preserve">M13 開發中：既有 </w:t>
       </w:r>
       <w:r>
         <w:rPr>
@@ -20618,7 +20891,151 @@
           <w:color w:val="17365D"/>
           <w:sz w:val="17"/>
         </w:rPr>
-        <w:t>docs/MILESTONE_ROADMAP.md</w:t>
+        <w:t>0006_m13</w:t>
+      </w:r>
+      <w:r>
+        <w:rPr>
+          <w:rFonts w:ascii="Arial Unicode MS" w:hAnsi="Arial Unicode MS" w:eastAsia="Arial Unicode MS"/>
+          <w:b w:val="0"/>
+          <w:i w:val="0"/>
+        </w:rPr>
+        <w:t>／</w:t>
+      </w:r>
+      <w:r>
+        <w:rPr>
+          <w:rFonts w:ascii="Arial Unicode MS" w:hAnsi="Arial Unicode MS" w:eastAsia="Arial Unicode MS"/>
+          <w:b w:val="0"/>
+          <w:i w:val="0"/>
+          <w:color w:val="17365D"/>
+          <w:sz w:val="17"/>
+        </w:rPr>
+        <w:t>0007_m13_catalog</w:t>
+      </w:r>
+      <w:r>
+        <w:rPr>
+          <w:rFonts w:ascii="Arial Unicode MS" w:hAnsi="Arial Unicode MS" w:eastAsia="Arial Unicode MS"/>
+          <w:b w:val="0"/>
+          <w:i w:val="0"/>
+        </w:rPr>
+        <w:t xml:space="preserve"> schema 已接入固定來源 Cache import、PostgreSQL 官方 Release catalog／Security CVE downloader、EDB direct EPAS Advisory downloader、NVD CVSS/CWE 補強、Primary-only Version Parser、確定性 matcher、stale gate、</w:t>
+      </w:r>
+      <w:r>
+        <w:rPr>
+          <w:rFonts w:ascii="Arial Unicode MS" w:hAnsi="Arial Unicode MS" w:eastAsia="Arial Unicode MS"/>
+          <w:b w:val="0"/>
+          <w:i w:val="0"/>
+          <w:color w:val="17365D"/>
+          <w:sz w:val="17"/>
+        </w:rPr>
+        <w:t>cve-result.json</w:t>
+      </w:r>
+      <w:r>
+        <w:rPr>
+          <w:rFonts w:ascii="Arial Unicode MS" w:hAnsi="Arial Unicode MS" w:eastAsia="Arial Unicode MS"/>
+          <w:b w:val="0"/>
+          <w:i w:val="0"/>
+        </w:rPr>
+        <w:t xml:space="preserve"> artifact 與 V4 metadata gate。先升級到 </w:t>
+      </w:r>
+      <w:r>
+        <w:rPr>
+          <w:rFonts w:ascii="Arial Unicode MS" w:hAnsi="Arial Unicode MS" w:eastAsia="Arial Unicode MS"/>
+          <w:b w:val="0"/>
+          <w:i w:val="0"/>
+          <w:color w:val="17365D"/>
+          <w:sz w:val="17"/>
+        </w:rPr>
+        <w:t>0011_m13_cve_major</w:t>
+      </w:r>
+      <w:r>
+        <w:rPr>
+          <w:rFonts w:ascii="Arial Unicode MS" w:hAnsi="Arial Unicode MS" w:eastAsia="Arial Unicode MS"/>
+          <w:b w:val="0"/>
+          <w:i w:val="0"/>
+        </w:rPr>
+        <w:t xml:space="preserve">，再以 </w:t>
+      </w:r>
+      <w:r>
+        <w:rPr>
+          <w:rFonts w:ascii="Arial Unicode MS" w:hAnsi="Arial Unicode MS" w:eastAsia="Arial Unicode MS"/>
+          <w:b w:val="0"/>
+          <w:i w:val="0"/>
+          <w:color w:val="17365D"/>
+          <w:sz w:val="17"/>
+        </w:rPr>
+        <w:t>omni-healthcheck-cve-import --sync-postgresql-releases</w:t>
+      </w:r>
+      <w:r>
+        <w:rPr>
+          <w:rFonts w:ascii="Arial Unicode MS" w:hAnsi="Arial Unicode MS" w:eastAsia="Arial Unicode MS"/>
+          <w:b w:val="0"/>
+          <w:i w:val="0"/>
+        </w:rPr>
+        <w:t>、</w:t>
+      </w:r>
+      <w:r>
+        <w:rPr>
+          <w:rFonts w:ascii="Arial Unicode MS" w:hAnsi="Arial Unicode MS" w:eastAsia="Arial Unicode MS"/>
+          <w:b w:val="0"/>
+          <w:i w:val="0"/>
+          <w:color w:val="17365D"/>
+          <w:sz w:val="17"/>
+        </w:rPr>
+        <w:t>--sync-postgresql-cves</w:t>
+      </w:r>
+      <w:r>
+        <w:rPr>
+          <w:rFonts w:ascii="Arial Unicode MS" w:hAnsi="Arial Unicode MS" w:eastAsia="Arial Unicode MS"/>
+          <w:b w:val="0"/>
+          <w:i w:val="0"/>
+        </w:rPr>
+        <w:t>、</w:t>
+      </w:r>
+      <w:r>
+        <w:rPr>
+          <w:rFonts w:ascii="Arial Unicode MS" w:hAnsi="Arial Unicode MS" w:eastAsia="Arial Unicode MS"/>
+          <w:b w:val="0"/>
+          <w:i w:val="0"/>
+          <w:color w:val="17365D"/>
+          <w:sz w:val="17"/>
+        </w:rPr>
+        <w:t>--sync-edb-advisories</w:t>
+      </w:r>
+      <w:r>
+        <w:rPr>
+          <w:rFonts w:ascii="Arial Unicode MS" w:hAnsi="Arial Unicode MS" w:eastAsia="Arial Unicode MS"/>
+          <w:b w:val="0"/>
+          <w:i w:val="0"/>
+        </w:rPr>
+        <w:t xml:space="preserve"> 和指定 </w:t>
+      </w:r>
+      <w:r>
+        <w:rPr>
+          <w:rFonts w:ascii="Arial Unicode MS" w:hAnsi="Arial Unicode MS" w:eastAsia="Arial Unicode MS"/>
+          <w:b w:val="0"/>
+          <w:i w:val="0"/>
+          <w:color w:val="17365D"/>
+          <w:sz w:val="17"/>
+        </w:rPr>
+        <w:t>--sync-nvd --cve-id</w:t>
+      </w:r>
+      <w:r>
+        <w:rPr>
+          <w:rFonts w:ascii="Arial Unicode MS" w:hAnsi="Arial Unicode MS" w:eastAsia="Arial Unicode MS"/>
+          <w:b w:val="0"/>
+          <w:i w:val="0"/>
+        </w:rPr>
+        <w:t xml:space="preserve"> 維護快取；所有下載都必須保存 snapshot，且報告 Worker 不可連外。正式排程、公司 EDB sync 與實際客戶資料 PDF 驗收尚未完成。操作與 rollback 見 </w:t>
+      </w:r>
+      <w:r>
+        <w:rPr>
+          <w:rFonts w:ascii="Arial Unicode MS" w:hAnsi="Arial Unicode MS" w:eastAsia="Arial Unicode MS"/>
+          <w:b w:val="0"/>
+          <w:i w:val="0"/>
+          <w:color w:val="17365D"/>
+          <w:sz w:val="17"/>
+        </w:rPr>
+        <w:t>docs/M13_CVE_IMPLEMENTATION.md</w:t>
       </w:r>
       <w:r>
         <w:rPr>
@@ -20627,19 +21044,6 @@
           <w:i w:val="0"/>
         </w:rPr>
         <w:t>。</w:t>
-      </w:r>
-    </w:p>
-    <w:p>
-      <w:pPr>
-        <w:pStyle w:val="ListBullet"/>
-      </w:pPr>
-      <w:r>
-        <w:rPr>
-          <w:rFonts w:ascii="Arial Unicode MS" w:hAnsi="Arial Unicode MS" w:eastAsia="Arial Unicode MS"/>
-          <w:b w:val="0"/>
-          <w:i w:val="0"/>
-        </w:rPr>
-        <w:t>EDB 中心化與 CVE 自動化方向已核准；Application Data foundation、M9.5 Persistence Adapter 與 M9.6 Artifact lifecycle 已實作，CVE tables 尚未實作。</w:t>
       </w:r>
     </w:p>
     <w:p>

</xml_diff>

<commit_message>
docs: record M13 company cache deployment
</commit_message>
<xml_diff>
--- a/docs/OMNICHECK_AI_BUILD_AND_OPERATIONS_GUIDE.docx
+++ b/docs/OMNICHECK_AI_BUILD_AND_OPERATIONS_GUIDE.docx
@@ -20881,7 +20881,7 @@
           <w:b w:val="0"/>
           <w:i w:val="0"/>
         </w:rPr>
-        <w:t xml:space="preserve">M13 開發中：既有 </w:t>
+        <w:t xml:space="preserve">M13 公司 Cache 已部署：release </w:t>
       </w:r>
       <w:r>
         <w:rPr>
@@ -20891,15 +20891,15 @@
           <w:color w:val="17365D"/>
           <w:sz w:val="17"/>
         </w:rPr>
-        <w:t>0006_m13</w:t>
-      </w:r>
-      <w:r>
-        <w:rPr>
-          <w:rFonts w:ascii="Arial Unicode MS" w:hAnsi="Arial Unicode MS" w:eastAsia="Arial Unicode MS"/>
-          <w:b w:val="0"/>
-          <w:i w:val="0"/>
-        </w:rPr>
-        <w:t>／</w:t>
+        <w:t>abd8e69</w:t>
+      </w:r>
+      <w:r>
+        <w:rPr>
+          <w:rFonts w:ascii="Arial Unicode MS" w:hAnsi="Arial Unicode MS" w:eastAsia="Arial Unicode MS"/>
+          <w:b w:val="0"/>
+          <w:i w:val="0"/>
+        </w:rPr>
+        <w:t xml:space="preserve">、EDB revision </w:t>
       </w:r>
       <w:r>
         <w:rPr>
@@ -20909,15 +20909,15 @@
           <w:color w:val="17365D"/>
           <w:sz w:val="17"/>
         </w:rPr>
-        <w:t>0007_m13_catalog</w:t>
-      </w:r>
-      <w:r>
-        <w:rPr>
-          <w:rFonts w:ascii="Arial Unicode MS" w:hAnsi="Arial Unicode MS" w:eastAsia="Arial Unicode MS"/>
-          <w:b w:val="0"/>
-          <w:i w:val="0"/>
-        </w:rPr>
-        <w:t xml:space="preserve"> schema 已接入固定來源 Cache import、PostgreSQL 官方 Release catalog／Security CVE downloader、EDB direct EPAS Advisory downloader、NVD CVSS/CWE 補強、Primary-only Version Parser、確定性 matcher、stale gate、</w:t>
+        <w:t>0011_m13_cve_major</w:t>
+      </w:r>
+      <w:r>
+        <w:rPr>
+          <w:rFonts w:ascii="Arial Unicode MS" w:hAnsi="Arial Unicode MS" w:eastAsia="Arial Unicode MS"/>
+          <w:b w:val="0"/>
+          <w:i w:val="0"/>
+        </w:rPr>
+        <w:t>，首次同步保存 PostgreSQL Release 5 筆、PostgreSQL Security 109 個 CVE range 與 EDB direct EPAS Advisory 11 個 CVE range 的不可變 snapshot。M13 具備固定來源 Cache import、PostgreSQL 官方 Release catalog／Security CVE downloader、EDB direct EPAS Advisory downloader、NVD CVSS/CWE 補強、Primary-only Version Parser、確定性 matcher、stale gate、</w:t>
       </w:r>
       <w:r>
         <w:rPr>
@@ -20935,7 +20935,7 @@
           <w:b w:val="0"/>
           <w:i w:val="0"/>
         </w:rPr>
-        <w:t xml:space="preserve"> artifact 與 V4 metadata gate。先升級到 </w:t>
+        <w:t xml:space="preserve"> artifact 與 V4 metadata gate。以 </w:t>
       </w:r>
       <w:r>
         <w:rPr>
@@ -20945,15 +20945,15 @@
           <w:color w:val="17365D"/>
           <w:sz w:val="17"/>
         </w:rPr>
-        <w:t>0011_m13_cve_major</w:t>
-      </w:r>
-      <w:r>
-        <w:rPr>
-          <w:rFonts w:ascii="Arial Unicode MS" w:hAnsi="Arial Unicode MS" w:eastAsia="Arial Unicode MS"/>
-          <w:b w:val="0"/>
-          <w:i w:val="0"/>
-        </w:rPr>
-        <w:t xml:space="preserve">，再以 </w:t>
+        <w:t>omni-healthcheck-cve-import --sync-postgresql-releases</w:t>
+      </w:r>
+      <w:r>
+        <w:rPr>
+          <w:rFonts w:ascii="Arial Unicode MS" w:hAnsi="Arial Unicode MS" w:eastAsia="Arial Unicode MS"/>
+          <w:b w:val="0"/>
+          <w:i w:val="0"/>
+        </w:rPr>
+        <w:t>、</w:t>
       </w:r>
       <w:r>
         <w:rPr>
@@ -20963,7 +20963,7 @@
           <w:color w:val="17365D"/>
           <w:sz w:val="17"/>
         </w:rPr>
-        <w:t>omni-healthcheck-cve-import --sync-postgresql-releases</w:t>
+        <w:t>--sync-postgresql-cves</w:t>
       </w:r>
       <w:r>
         <w:rPr>
@@ -20981,15 +20981,15 @@
           <w:color w:val="17365D"/>
           <w:sz w:val="17"/>
         </w:rPr>
-        <w:t>--sync-postgresql-cves</w:t>
-      </w:r>
-      <w:r>
-        <w:rPr>
-          <w:rFonts w:ascii="Arial Unicode MS" w:hAnsi="Arial Unicode MS" w:eastAsia="Arial Unicode MS"/>
-          <w:b w:val="0"/>
-          <w:i w:val="0"/>
-        </w:rPr>
-        <w:t>、</w:t>
+        <w:t>--sync-edb-advisories</w:t>
+      </w:r>
+      <w:r>
+        <w:rPr>
+          <w:rFonts w:ascii="Arial Unicode MS" w:hAnsi="Arial Unicode MS" w:eastAsia="Arial Unicode MS"/>
+          <w:b w:val="0"/>
+          <w:i w:val="0"/>
+        </w:rPr>
+        <w:t xml:space="preserve"> 和指定 </w:t>
       </w:r>
       <w:r>
         <w:rPr>
@@ -20999,15 +20999,15 @@
           <w:color w:val="17365D"/>
           <w:sz w:val="17"/>
         </w:rPr>
-        <w:t>--sync-edb-advisories</w:t>
-      </w:r>
-      <w:r>
-        <w:rPr>
-          <w:rFonts w:ascii="Arial Unicode MS" w:hAnsi="Arial Unicode MS" w:eastAsia="Arial Unicode MS"/>
-          <w:b w:val="0"/>
-          <w:i w:val="0"/>
-        </w:rPr>
-        <w:t xml:space="preserve"> 和指定 </w:t>
+        <w:t>--sync-nvd --cve-id</w:t>
+      </w:r>
+      <w:r>
+        <w:rPr>
+          <w:rFonts w:ascii="Arial Unicode MS" w:hAnsi="Arial Unicode MS" w:eastAsia="Arial Unicode MS"/>
+          <w:b w:val="0"/>
+          <w:i w:val="0"/>
+        </w:rPr>
+        <w:t xml:space="preserve"> 維護快取；所有下載都必須保存 snapshot，且報告 Worker 不可連外。公司批次 NVD 排程與實際客戶資料 CVE V4/PDF 驗收尚未完成。application rollback 為 </w:t>
       </w:r>
       <w:r>
         <w:rPr>
@@ -21017,15 +21017,15 @@
           <w:color w:val="17365D"/>
           <w:sz w:val="17"/>
         </w:rPr>
-        <w:t>--sync-nvd --cve-id</w:t>
-      </w:r>
-      <w:r>
-        <w:rPr>
-          <w:rFonts w:ascii="Arial Unicode MS" w:hAnsi="Arial Unicode MS" w:eastAsia="Arial Unicode MS"/>
-          <w:b w:val="0"/>
-          <w:i w:val="0"/>
-        </w:rPr>
-        <w:t xml:space="preserve"> 維護快取；所有下載都必須保存 snapshot，且報告 Worker 不可連外。正式排程、公司 EDB sync 與實際客戶資料 PDF 驗收尚未完成。操作與 rollback 見 </w:t>
+        <w:t>01ba901</w:t>
+      </w:r>
+      <w:r>
+        <w:rPr>
+          <w:rFonts w:ascii="Arial Unicode MS" w:hAnsi="Arial Unicode MS" w:eastAsia="Arial Unicode MS"/>
+          <w:b w:val="0"/>
+          <w:i w:val="0"/>
+        </w:rPr>
+        <w:t xml:space="preserve">；migration 採 additive/forward fix，不建議 production downgrade。操作見 </w:t>
       </w:r>
       <w:r>
         <w:rPr>

</xml_diff>

<commit_message>
docs: record M13 E2E report validation
</commit_message>
<xml_diff>
--- a/docs/OMNICHECK_AI_BUILD_AND_OPERATIONS_GUIDE.docx
+++ b/docs/OMNICHECK_AI_BUILD_AND_OPERATIONS_GUIDE.docx
@@ -9067,7 +9067,7 @@
                 <w:rFonts w:ascii="Consolas" w:hAnsi="Consolas" w:eastAsia="Microsoft JhengHei"/>
                 <w:sz w:val="16"/>
               </w:rPr>
-              <w:t>dnf install -y git python3.12 python3.12-pip fontconfig libreoffice google-noto-sans-cjk-ttc-fonts</w:t>
+              <w:t>dnf install -y git python3.12 python3.12-pip fontconfig libreoffice google-noto-sans-cjk-ttc-fonts poppler-utils</w:t>
               <w:br/>
               <w:t>python3.12 --version</w:t>
               <w:br/>
@@ -9086,7 +9086,7 @@
           <w:b w:val="0"/>
           <w:i w:val="0"/>
         </w:rPr>
-        <w:t>公司實測版本為 Python 3.12.13、LibreOffice 7.1.8.1、Noto Sans CJK TC。若 repository 沒有上述套件，停止並由 OS 管理員提供核准 repository／RPM；不可臨時從不明網站下載，也不可用系統 Python 3.9 代替。</w:t>
+        <w:t>公司實測版本為 Python 3.12.13、LibreOffice 7.1.8.1、Noto Sans CJK TC 與 poppler-utils 21.01.0。若 repository 沒有上述套件，停止並由 OS 管理員提供核准 repository／RPM；不可臨時從不明網站下載，也不可用系統 Python 3.9 代替。</w:t>
       </w:r>
     </w:p>
     <w:p>
@@ -20881,7 +20881,7 @@
           <w:b w:val="0"/>
           <w:i w:val="0"/>
         </w:rPr>
-        <w:t xml:space="preserve">M13 公司 Cache 已部署：release </w:t>
+        <w:t xml:space="preserve">M13 公司 E2E 已完成：Cache schema 為 </w:t>
       </w:r>
       <w:r>
         <w:rPr>
@@ -20891,15 +20891,15 @@
           <w:color w:val="17365D"/>
           <w:sz w:val="17"/>
         </w:rPr>
-        <w:t>abd8e69</w:t>
-      </w:r>
-      <w:r>
-        <w:rPr>
-          <w:rFonts w:ascii="Arial Unicode MS" w:hAnsi="Arial Unicode MS" w:eastAsia="Arial Unicode MS"/>
-          <w:b w:val="0"/>
-          <w:i w:val="0"/>
-        </w:rPr>
-        <w:t xml:space="preserve">、EDB revision </w:t>
+        <w:t>0011_m13_cve_major</w:t>
+      </w:r>
+      <w:r>
+        <w:rPr>
+          <w:rFonts w:ascii="Arial Unicode MS" w:hAnsi="Arial Unicode MS" w:eastAsia="Arial Unicode MS"/>
+          <w:b w:val="0"/>
+          <w:i w:val="0"/>
+        </w:rPr>
+        <w:t xml:space="preserve">，首次同步保存 PostgreSQL Release 5 筆、PostgreSQL Security 109 個 CVE range 與 EDB direct EPAS Advisory 11 個 CVE range 的不可變 snapshot。tenant-scoped Golden Job </w:t>
       </w:r>
       <w:r>
         <w:rPr>
@@ -20909,15 +20909,15 @@
           <w:color w:val="17365D"/>
           <w:sz w:val="17"/>
         </w:rPr>
-        <w:t>0011_m13_cve_major</w:t>
-      </w:r>
-      <w:r>
-        <w:rPr>
-          <w:rFonts w:ascii="Arial Unicode MS" w:hAnsi="Arial Unicode MS" w:eastAsia="Arial Unicode MS"/>
-          <w:b w:val="0"/>
-          <w:i w:val="0"/>
-        </w:rPr>
-        <w:t>，首次同步保存 PostgreSQL Release 5 筆、PostgreSQL Security 109 個 CVE range 與 EDB direct EPAS Advisory 11 個 CVE range 的不可變 snapshot。M13 具備固定來源 Cache import、PostgreSQL 官方 Release catalog／Security CVE downloader、EDB direct EPAS Advisory downloader、NVD CVSS/CWE 補強、Primary-only Version Parser、確定性 matcher、stale gate、</w:t>
+        <w:t>3cd0eb11ded54825a6d6089f4e06f004</w:t>
+      </w:r>
+      <w:r>
+        <w:rPr>
+          <w:rFonts w:ascii="Arial Unicode MS" w:hAnsi="Arial Unicode MS" w:eastAsia="Arial Unicode MS"/>
+          <w:b w:val="0"/>
+          <w:i w:val="0"/>
+        </w:rPr>
+        <w:t xml:space="preserve"> 以不可變輸入產生 46 個 EPAS CVE，</w:t>
       </w:r>
       <w:r>
         <w:rPr>
@@ -20935,7 +20935,7 @@
           <w:b w:val="0"/>
           <w:i w:val="0"/>
         </w:rPr>
-        <w:t xml:space="preserve"> artifact 與 V4 metadata gate。以 </w:t>
+        <w:t xml:space="preserve"> ready、V4 QA passed，並在獨立暫存輸出驗證 23 頁 DOCX/PDF。M13 具備固定來源 Cache import、PostgreSQL 官方 Release catalog／Security CVE downloader、EDB direct EPAS Advisory downloader、NVD CVSS/CWE 補強、Primary-only Version Parser、確定性 matcher、stale gate、</w:t>
       </w:r>
       <w:r>
         <w:rPr>
@@ -20945,15 +20945,15 @@
           <w:color w:val="17365D"/>
           <w:sz w:val="17"/>
         </w:rPr>
-        <w:t>omni-healthcheck-cve-import --sync-postgresql-releases</w:t>
-      </w:r>
-      <w:r>
-        <w:rPr>
-          <w:rFonts w:ascii="Arial Unicode MS" w:hAnsi="Arial Unicode MS" w:eastAsia="Arial Unicode MS"/>
-          <w:b w:val="0"/>
-          <w:i w:val="0"/>
-        </w:rPr>
-        <w:t>、</w:t>
+        <w:t>cve-result.json</w:t>
+      </w:r>
+      <w:r>
+        <w:rPr>
+          <w:rFonts w:ascii="Arial Unicode MS" w:hAnsi="Arial Unicode MS" w:eastAsia="Arial Unicode MS"/>
+          <w:b w:val="0"/>
+          <w:i w:val="0"/>
+        </w:rPr>
+        <w:t xml:space="preserve"> artifact 與 V4 metadata gate。以 </w:t>
       </w:r>
       <w:r>
         <w:rPr>
@@ -20963,7 +20963,7 @@
           <w:color w:val="17365D"/>
           <w:sz w:val="17"/>
         </w:rPr>
-        <w:t>--sync-postgresql-cves</w:t>
+        <w:t>omni-healthcheck-cve-import --sync-postgresql-releases</w:t>
       </w:r>
       <w:r>
         <w:rPr>
@@ -20981,15 +20981,15 @@
           <w:color w:val="17365D"/>
           <w:sz w:val="17"/>
         </w:rPr>
-        <w:t>--sync-edb-advisories</w:t>
-      </w:r>
-      <w:r>
-        <w:rPr>
-          <w:rFonts w:ascii="Arial Unicode MS" w:hAnsi="Arial Unicode MS" w:eastAsia="Arial Unicode MS"/>
-          <w:b w:val="0"/>
-          <w:i w:val="0"/>
-        </w:rPr>
-        <w:t xml:space="preserve"> 和指定 </w:t>
+        <w:t>--sync-postgresql-cves</w:t>
+      </w:r>
+      <w:r>
+        <w:rPr>
+          <w:rFonts w:ascii="Arial Unicode MS" w:hAnsi="Arial Unicode MS" w:eastAsia="Arial Unicode MS"/>
+          <w:b w:val="0"/>
+          <w:i w:val="0"/>
+        </w:rPr>
+        <w:t>、</w:t>
       </w:r>
       <w:r>
         <w:rPr>
@@ -20999,15 +20999,15 @@
           <w:color w:val="17365D"/>
           <w:sz w:val="17"/>
         </w:rPr>
-        <w:t>--sync-nvd --cve-id</w:t>
-      </w:r>
-      <w:r>
-        <w:rPr>
-          <w:rFonts w:ascii="Arial Unicode MS" w:hAnsi="Arial Unicode MS" w:eastAsia="Arial Unicode MS"/>
-          <w:b w:val="0"/>
-          <w:i w:val="0"/>
-        </w:rPr>
-        <w:t xml:space="preserve"> 維護快取；所有下載都必須保存 snapshot，且報告 Worker 不可連外。公司批次 NVD 排程與實際客戶資料 CVE V4/PDF 驗收尚未完成。application rollback 為 </w:t>
+        <w:t>--sync-edb-advisories</w:t>
+      </w:r>
+      <w:r>
+        <w:rPr>
+          <w:rFonts w:ascii="Arial Unicode MS" w:hAnsi="Arial Unicode MS" w:eastAsia="Arial Unicode MS"/>
+          <w:b w:val="0"/>
+          <w:i w:val="0"/>
+        </w:rPr>
+        <w:t xml:space="preserve"> 和指定 </w:t>
       </w:r>
       <w:r>
         <w:rPr>
@@ -21017,7 +21017,97 @@
           <w:color w:val="17365D"/>
           <w:sz w:val="17"/>
         </w:rPr>
-        <w:t>01ba901</w:t>
+        <w:t>--sync-nvd --cve-id</w:t>
+      </w:r>
+      <w:r>
+        <w:rPr>
+          <w:rFonts w:ascii="Arial Unicode MS" w:hAnsi="Arial Unicode MS" w:eastAsia="Arial Unicode MS"/>
+          <w:b w:val="0"/>
+          <w:i w:val="0"/>
+        </w:rPr>
+        <w:t xml:space="preserve"> 維護快取；所有下載都必須保存 snapshot，且報告 Worker 不可連外。公司端 PDF QA 依賴 </w:t>
+      </w:r>
+      <w:r>
+        <w:rPr>
+          <w:rFonts w:ascii="Arial Unicode MS" w:hAnsi="Arial Unicode MS" w:eastAsia="Arial Unicode MS"/>
+          <w:b w:val="0"/>
+          <w:i w:val="0"/>
+          <w:color w:val="17365D"/>
+          <w:sz w:val="17"/>
+        </w:rPr>
+        <w:t>poppler-utils</w:t>
+      </w:r>
+      <w:r>
+        <w:rPr>
+          <w:rFonts w:ascii="Arial Unicode MS" w:hAnsi="Arial Unicode MS" w:eastAsia="Arial Unicode MS"/>
+          <w:b w:val="0"/>
+          <w:i w:val="0"/>
+        </w:rPr>
+        <w:t>（</w:t>
+      </w:r>
+      <w:r>
+        <w:rPr>
+          <w:rFonts w:ascii="Arial Unicode MS" w:hAnsi="Arial Unicode MS" w:eastAsia="Arial Unicode MS"/>
+          <w:b w:val="0"/>
+          <w:i w:val="0"/>
+          <w:color w:val="17365D"/>
+          <w:sz w:val="17"/>
+        </w:rPr>
+        <w:t>pdftoppm</w:t>
+      </w:r>
+      <w:r>
+        <w:rPr>
+          <w:rFonts w:ascii="Arial Unicode MS" w:hAnsi="Arial Unicode MS" w:eastAsia="Arial Unicode MS"/>
+          <w:b w:val="0"/>
+          <w:i w:val="0"/>
+        </w:rPr>
+        <w:t>／</w:t>
+      </w:r>
+      <w:r>
+        <w:rPr>
+          <w:rFonts w:ascii="Arial Unicode MS" w:hAnsi="Arial Unicode MS" w:eastAsia="Arial Unicode MS"/>
+          <w:b w:val="0"/>
+          <w:i w:val="0"/>
+          <w:color w:val="17365D"/>
+          <w:sz w:val="17"/>
+        </w:rPr>
+        <w:t>pdfinfo</w:t>
+      </w:r>
+      <w:r>
+        <w:rPr>
+          <w:rFonts w:ascii="Arial Unicode MS" w:hAnsi="Arial Unicode MS" w:eastAsia="Arial Unicode MS"/>
+          <w:b w:val="0"/>
+          <w:i w:val="0"/>
+        </w:rPr>
+        <w:t xml:space="preserve">），已安裝；Noto Sans CJK TC 可用。isolated release V4 renderer 路徑 hotfix </w:t>
+      </w:r>
+      <w:r>
+        <w:rPr>
+          <w:rFonts w:ascii="Arial Unicode MS" w:hAnsi="Arial Unicode MS" w:eastAsia="Arial Unicode MS"/>
+          <w:b w:val="0"/>
+          <w:i w:val="0"/>
+          <w:color w:val="17365D"/>
+          <w:sz w:val="17"/>
+        </w:rPr>
+        <w:t>aec3332</w:t>
+      </w:r>
+      <w:r>
+        <w:rPr>
+          <w:rFonts w:ascii="Arial Unicode MS" w:hAnsi="Arial Unicode MS" w:eastAsia="Arial Unicode MS"/>
+          <w:b w:val="0"/>
+          <w:i w:val="0"/>
+        </w:rPr>
+        <w:t xml:space="preserve"> 已部署，application rollback 為 </w:t>
+      </w:r>
+      <w:r>
+        <w:rPr>
+          <w:rFonts w:ascii="Arial Unicode MS" w:hAnsi="Arial Unicode MS" w:eastAsia="Arial Unicode MS"/>
+          <w:b w:val="0"/>
+          <w:i w:val="0"/>
+          <w:color w:val="17365D"/>
+          <w:sz w:val="17"/>
+        </w:rPr>
+        <w:t>abd8e69</w:t>
       </w:r>
       <w:r>
         <w:rPr>

</xml_diff>

<commit_message>
docs: record unscoped CVE delivery validation
</commit_message>
<xml_diff>
--- a/docs/OMNICHECK_AI_BUILD_AND_OPERATIONS_GUIDE.docx
+++ b/docs/OMNICHECK_AI_BUILD_AND_OPERATIONS_GUIDE.docx
@@ -21138,6 +21138,145 @@
     </w:p>
     <w:p>
       <w:pPr>
+        <w:pStyle w:val="ListBullet"/>
+      </w:pPr>
+      <w:r>
+        <w:rPr>
+          <w:rFonts w:ascii="Arial Unicode MS" w:hAnsi="Arial Unicode MS" w:eastAsia="Arial Unicode MS"/>
+          <w:b w:val="0"/>
+          <w:i w:val="0"/>
+        </w:rPr>
+        <w:t xml:space="preserve">CVE 無登入模式 hotfix（2026-08-13）：目前內網 UI 不啟用 Login/RBAC，使用者建立的 Job 可沒有 Customer／System 綁定；這不應影響 CVE。release </w:t>
+      </w:r>
+      <w:r>
+        <w:rPr>
+          <w:rFonts w:ascii="Arial Unicode MS" w:hAnsi="Arial Unicode MS" w:eastAsia="Arial Unicode MS"/>
+          <w:b w:val="0"/>
+          <w:i w:val="0"/>
+          <w:color w:val="17365D"/>
+          <w:sz w:val="17"/>
+        </w:rPr>
+        <w:t>dffcb98</w:t>
+      </w:r>
+      <w:r>
+        <w:rPr>
+          <w:rFonts w:ascii="Arial Unicode MS" w:hAnsi="Arial Unicode MS" w:eastAsia="Arial Unicode MS"/>
+          <w:b w:val="0"/>
+          <w:i w:val="0"/>
+        </w:rPr>
+        <w:t xml:space="preserve"> 已改為只要求 immutable </w:t>
+      </w:r>
+      <w:r>
+        <w:rPr>
+          <w:rFonts w:ascii="Arial Unicode MS" w:hAnsi="Arial Unicode MS" w:eastAsia="Arial Unicode MS"/>
+          <w:b w:val="0"/>
+          <w:i w:val="0"/>
+          <w:color w:val="17365D"/>
+          <w:sz w:val="17"/>
+        </w:rPr>
+        <w:t>normalized.json</w:t>
+      </w:r>
+      <w:r>
+        <w:rPr>
+          <w:rFonts w:ascii="Arial Unicode MS" w:hAnsi="Arial Unicode MS" w:eastAsia="Arial Unicode MS"/>
+          <w:b w:val="0"/>
+          <w:i w:val="0"/>
+        </w:rPr>
+        <w:t xml:space="preserve"> 中的 Primary database version evidence 與公司官方 CVE Cache，才執行 matcher；它不會讀取其他 Job 或租戶資料，也不會在缺少版本證據時猜測。公司 unscoped Golden 驗證 Job </w:t>
+      </w:r>
+      <w:r>
+        <w:rPr>
+          <w:rFonts w:ascii="Arial Unicode MS" w:hAnsi="Arial Unicode MS" w:eastAsia="Arial Unicode MS"/>
+          <w:b w:val="0"/>
+          <w:i w:val="0"/>
+          <w:color w:val="17365D"/>
+          <w:sz w:val="17"/>
+        </w:rPr>
+        <w:t>09c72b615eab45c3a0e39e59dc632efe</w:t>
+      </w:r>
+      <w:r>
+        <w:rPr>
+          <w:rFonts w:ascii="Arial Unicode MS" w:hAnsi="Arial Unicode MS" w:eastAsia="Arial Unicode MS"/>
+          <w:b w:val="0"/>
+          <w:i w:val="0"/>
+        </w:rPr>
+        <w:t xml:space="preserve"> 已成功產生 1 個 version update／46 個 CVE，</w:t>
+      </w:r>
+      <w:r>
+        <w:rPr>
+          <w:rFonts w:ascii="Arial Unicode MS" w:hAnsi="Arial Unicode MS" w:eastAsia="Arial Unicode MS"/>
+          <w:b w:val="0"/>
+          <w:i w:val="0"/>
+          <w:color w:val="17365D"/>
+          <w:sz w:val="17"/>
+        </w:rPr>
+        <w:t>cve-result.json=ready</w:t>
+      </w:r>
+      <w:r>
+        <w:rPr>
+          <w:rFonts w:ascii="Arial Unicode MS" w:hAnsi="Arial Unicode MS" w:eastAsia="Arial Unicode MS"/>
+          <w:b w:val="0"/>
+          <w:i w:val="0"/>
+        </w:rPr>
+        <w:t xml:space="preserve">、delivery allowed，V4 JSON 有 </w:t>
+      </w:r>
+      <w:r>
+        <w:rPr>
+          <w:rFonts w:ascii="Arial Unicode MS" w:hAnsi="Arial Unicode MS" w:eastAsia="Arial Unicode MS"/>
+          <w:b w:val="0"/>
+          <w:i w:val="0"/>
+          <w:color w:val="17365D"/>
+          <w:sz w:val="17"/>
+        </w:rPr>
+        <w:t>version_updates</w:t>
+      </w:r>
+      <w:r>
+        <w:rPr>
+          <w:rFonts w:ascii="Arial Unicode MS" w:hAnsi="Arial Unicode MS" w:eastAsia="Arial Unicode MS"/>
+          <w:b w:val="0"/>
+          <w:i w:val="0"/>
+        </w:rPr>
+        <w:t>。current=</w:t>
+      </w:r>
+      <w:r>
+        <w:rPr>
+          <w:rFonts w:ascii="Arial Unicode MS" w:hAnsi="Arial Unicode MS" w:eastAsia="Arial Unicode MS"/>
+          <w:b w:val="0"/>
+          <w:i w:val="0"/>
+          <w:color w:val="17365D"/>
+          <w:sz w:val="17"/>
+        </w:rPr>
+        <w:t>dffcb98</w:t>
+      </w:r>
+      <w:r>
+        <w:rPr>
+          <w:rFonts w:ascii="Arial Unicode MS" w:hAnsi="Arial Unicode MS" w:eastAsia="Arial Unicode MS"/>
+          <w:b w:val="0"/>
+          <w:i w:val="0"/>
+        </w:rPr>
+        <w:t>，application rollback=</w:t>
+      </w:r>
+      <w:r>
+        <w:rPr>
+          <w:rFonts w:ascii="Arial Unicode MS" w:hAnsi="Arial Unicode MS" w:eastAsia="Arial Unicode MS"/>
+          <w:b w:val="0"/>
+          <w:i w:val="0"/>
+          <w:color w:val="17365D"/>
+          <w:sz w:val="17"/>
+        </w:rPr>
+        <w:t>aec3332</w:t>
+      </w:r>
+      <w:r>
+        <w:rPr>
+          <w:rFonts w:ascii="Arial Unicode MS" w:hAnsi="Arial Unicode MS" w:eastAsia="Arial Unicode MS"/>
+          <w:b w:val="0"/>
+          <w:i w:val="0"/>
+        </w:rPr>
+        <w:t>，無 migration。</w:t>
+      </w:r>
+    </w:p>
+    <w:p>
+      <w:pPr>
         <w:pStyle w:val="Heading2"/>
       </w:pPr>
       <w:r>

</xml_diff>

<commit_message>
docs: record CVE minor path and EOL policy
</commit_message>
<xml_diff>
--- a/docs/OMNICHECK_AI_BUILD_AND_OPERATIONS_GUIDE.docx
+++ b/docs/OMNICHECK_AI_BUILD_AND_OPERATIONS_GUIDE.docx
@@ -21277,6 +21277,91 @@
     </w:p>
     <w:p>
       <w:pPr>
+        <w:pStyle w:val="ListBullet"/>
+      </w:pPr>
+      <w:r>
+        <w:rPr>
+          <w:rFonts w:ascii="Arial Unicode MS" w:hAnsi="Arial Unicode MS" w:eastAsia="Arial Unicode MS"/>
+          <w:b w:val="0"/>
+          <w:i w:val="0"/>
+        </w:rPr>
+        <w:t xml:space="preserve">CVE minor-path／EOL hotfix（2026-08-13）：report version parser 以 normalized canonical product 為準，避免 EPAS 的版本字串含 PostgreSQL 而誤標產品。適用性只可使用 PostgreSQL Security 或 EDB Security Advisory 的同 Major、明確 </w:t>
+      </w:r>
+      <w:r>
+        <w:rPr>
+          <w:rFonts w:ascii="Arial Unicode MS" w:hAnsi="Arial Unicode MS" w:eastAsia="Arial Unicode MS"/>
+          <w:b w:val="0"/>
+          <w:i w:val="0"/>
+          <w:color w:val="17365D"/>
+          <w:sz w:val="17"/>
+        </w:rPr>
+        <w:t>affected_from</w:t>
+      </w:r>
+      <w:r>
+        <w:rPr>
+          <w:rFonts w:ascii="Arial Unicode MS" w:hAnsi="Arial Unicode MS" w:eastAsia="Arial Unicode MS"/>
+          <w:b w:val="0"/>
+          <w:i w:val="0"/>
+        </w:rPr>
+        <w:t>／</w:t>
+      </w:r>
+      <w:r>
+        <w:rPr>
+          <w:rFonts w:ascii="Arial Unicode MS" w:hAnsi="Arial Unicode MS" w:eastAsia="Arial Unicode MS"/>
+          <w:b w:val="0"/>
+          <w:i w:val="0"/>
+          <w:color w:val="17365D"/>
+          <w:sz w:val="17"/>
+        </w:rPr>
+        <w:t>affected_before</w:t>
+      </w:r>
+      <w:r>
+        <w:rPr>
+          <w:rFonts w:ascii="Arial Unicode MS" w:hAnsi="Arial Unicode MS" w:eastAsia="Arial Unicode MS"/>
+          <w:b w:val="0"/>
+          <w:i w:val="0"/>
+        </w:rPr>
+        <w:t xml:space="preserve"> 範圍；NVD 僅可補 CVSS／CWE，絕不可當作產品適用性來源。報告將客戶版本與同 Major 最新 minor 比較：落後時只列該更新路徑可修正 CVE，已是最新時不顯示 CVE 明細。CVE 表格欄位為版本、CVE、嚴重程度、CVSS、元件、修正內容。PostgreSQL 相容 Major 已 EOL 或 365 天內 EOL 時於摘要加註提醒；EPAS 必須同時人工確認 EDB 支援期限。company current=</w:t>
+      </w:r>
+      <w:r>
+        <w:rPr>
+          <w:rFonts w:ascii="Arial Unicode MS" w:hAnsi="Arial Unicode MS" w:eastAsia="Arial Unicode MS"/>
+          <w:b w:val="0"/>
+          <w:i w:val="0"/>
+          <w:color w:val="17365D"/>
+          <w:sz w:val="17"/>
+        </w:rPr>
+        <w:t>14fe797</w:t>
+      </w:r>
+      <w:r>
+        <w:rPr>
+          <w:rFonts w:ascii="Arial Unicode MS" w:hAnsi="Arial Unicode MS" w:eastAsia="Arial Unicode MS"/>
+          <w:b w:val="0"/>
+          <w:i w:val="0"/>
+        </w:rPr>
+        <w:t>，application rollback=</w:t>
+      </w:r>
+      <w:r>
+        <w:rPr>
+          <w:rFonts w:ascii="Arial Unicode MS" w:hAnsi="Arial Unicode MS" w:eastAsia="Arial Unicode MS"/>
+          <w:b w:val="0"/>
+          <w:i w:val="0"/>
+          <w:color w:val="17365D"/>
+          <w:sz w:val="17"/>
+        </w:rPr>
+        <w:t>dffcb98</w:t>
+      </w:r>
+      <w:r>
+        <w:rPr>
+          <w:rFonts w:ascii="Arial Unicode MS" w:hAnsi="Arial Unicode MS" w:eastAsia="Arial Unicode MS"/>
+          <w:b w:val="0"/>
+          <w:i w:val="0"/>
+        </w:rPr>
+        <w:t>，無 migration。</w:t>
+      </w:r>
+    </w:p>
+    <w:p>
+      <w:pPr>
         <w:pStyle w:val="Heading2"/>
       </w:pPr>
       <w:r>

</xml_diff>

<commit_message>
docs: record M12 history comparison start
</commit_message>
<xml_diff>
--- a/docs/OMNICHECK_AI_BUILD_AND_OPERATIONS_GUIDE.docx
+++ b/docs/OMNICHECK_AI_BUILD_AND_OPERATIONS_GUIDE.docx
@@ -21362,6 +21362,55 @@
     </w:p>
     <w:p>
       <w:pPr>
+        <w:pStyle w:val="ListBullet"/>
+      </w:pPr>
+      <w:r>
+        <w:rPr>
+          <w:rFonts w:ascii="Arial Unicode MS" w:hAnsi="Arial Unicode MS" w:eastAsia="Arial Unicode MS"/>
+          <w:b w:val="0"/>
+          <w:i w:val="0"/>
+        </w:rPr>
+        <w:t>M12 歷史比較（開始，2026-08-13）：</w:t>
+      </w:r>
+      <w:r>
+        <w:rPr>
+          <w:rFonts w:ascii="Arial Unicode MS" w:hAnsi="Arial Unicode MS" w:eastAsia="Arial Unicode MS"/>
+          <w:b w:val="0"/>
+          <w:i w:val="0"/>
+          <w:color w:val="17365D"/>
+          <w:sz w:val="17"/>
+        </w:rPr>
+        <w:t>omni_healthcheck.history.compare_snapshots()</w:t>
+      </w:r>
+      <w:r>
+        <w:rPr>
+          <w:rFonts w:ascii="Arial Unicode MS" w:hAnsi="Arial Unicode MS" w:eastAsia="Arial Unicode MS"/>
+          <w:b w:val="0"/>
+          <w:i w:val="0"/>
+        </w:rPr>
+        <w:t xml:space="preserve"> 只讀兩期 immutable Canonical JSON 與 deterministic assessment，輸出 check 新增／移除、evidence changed、status improved／worsened。它不呼叫 AI、不改寫當期 assessment，也不影響 Primary-only scope。後續會由 Job metadata 的客戶名稱＋系統名稱尋找上一期已完成 Job，輸出 </w:t>
+      </w:r>
+      <w:r>
+        <w:rPr>
+          <w:rFonts w:ascii="Arial Unicode MS" w:hAnsi="Arial Unicode MS" w:eastAsia="Arial Unicode MS"/>
+          <w:b w:val="0"/>
+          <w:i w:val="0"/>
+          <w:color w:val="17365D"/>
+          <w:sz w:val="17"/>
+        </w:rPr>
+        <w:t>history-comparison.json</w:t>
+      </w:r>
+      <w:r>
+        <w:rPr>
+          <w:rFonts w:ascii="Arial Unicode MS" w:hAnsi="Arial Unicode MS" w:eastAsia="Arial Unicode MS"/>
+          <w:b w:val="0"/>
+          <w:i w:val="0"/>
+        </w:rPr>
+        <w:t xml:space="preserve"> 並接入 V4；目前內網 UI 仍不顯示 Customer/System 授權選項。</w:t>
+      </w:r>
+    </w:p>
+    <w:p>
+      <w:pPr>
         <w:pStyle w:val="Heading2"/>
       </w:pPr>
       <w:r>

</xml_diff>

<commit_message>
docs: record M12 company validation
</commit_message>
<xml_diff>
--- a/docs/OMNICHECK_AI_BUILD_AND_OPERATIONS_GUIDE.docx
+++ b/docs/OMNICHECK_AI_BUILD_AND_OPERATIONS_GUIDE.docx
@@ -6178,6 +6178,105 @@
                 <w:i w:val="0"/>
                 <w:sz w:val="17"/>
               </w:rPr>
+              <w:t>M12</w:t>
+            </w:r>
+          </w:p>
+        </w:tc>
+        <w:tc>
+          <w:tcPr>
+            <w:tcW w:type="dxa" w:w="3293"/>
+            <w:vAlign w:val="center"/>
+            <w:tcMar>
+              <w:top w:w="45" w:type="dxa"/>
+              <w:start w:w="120" w:type="dxa"/>
+              <w:bottom w:w="45" w:type="dxa"/>
+              <w:end w:w="120" w:type="dxa"/>
+            </w:tcMar>
+          </w:tcPr>
+          <w:p>
+            <w:pPr>
+              <w:spacing w:after="0"/>
+            </w:pPr>
+            <w:r>
+              <w:rPr>
+                <w:rFonts w:ascii="Arial Unicode MS" w:hAnsi="Arial Unicode MS" w:eastAsia="Arial Unicode MS"/>
+                <w:b w:val="0"/>
+                <w:i w:val="0"/>
+                <w:sz w:val="17"/>
+              </w:rPr>
+              <w:t>公司 E2E 驗收完成</w:t>
+            </w:r>
+          </w:p>
+        </w:tc>
+        <w:tc>
+          <w:tcPr>
+            <w:tcW w:type="dxa" w:w="3293"/>
+            <w:vAlign w:val="center"/>
+            <w:tcMar>
+              <w:top w:w="45" w:type="dxa"/>
+              <w:start w:w="120" w:type="dxa"/>
+              <w:bottom w:w="45" w:type="dxa"/>
+              <w:end w:w="120" w:type="dxa"/>
+            </w:tcMar>
+          </w:tcPr>
+          <w:p>
+            <w:pPr>
+              <w:spacing w:after="0"/>
+            </w:pPr>
+            <w:r>
+              <w:rPr>
+                <w:rFonts w:ascii="Arial Unicode MS" w:hAnsi="Arial Unicode MS" w:eastAsia="Arial Unicode MS"/>
+                <w:b w:val="0"/>
+                <w:i w:val="0"/>
+                <w:sz w:val="17"/>
+              </w:rPr>
+              <w:t>同 customer／system_name／product 的 immutable snapshot 比較、</w:t>
+            </w:r>
+            <w:r>
+              <w:rPr>
+                <w:rFonts w:ascii="Arial Unicode MS" w:hAnsi="Arial Unicode MS" w:eastAsia="Arial Unicode MS"/>
+                <w:b w:val="0"/>
+                <w:i w:val="0"/>
+                <w:color w:val="17365D"/>
+                <w:sz w:val="17"/>
+              </w:rPr>
+              <w:t>history-comparison.json</w:t>
+            </w:r>
+            <w:r>
+              <w:rPr>
+                <w:rFonts w:ascii="Arial Unicode MS" w:hAnsi="Arial Unicode MS" w:eastAsia="Arial Unicode MS"/>
+                <w:b w:val="0"/>
+                <w:i w:val="0"/>
+                <w:sz w:val="17"/>
+              </w:rPr>
+              <w:t>、V4／PDF 歷史比較章節；不需要 AI 或 migration</w:t>
+            </w:r>
+          </w:p>
+        </w:tc>
+      </w:tr>
+      <w:tr>
+        <w:tc>
+          <w:tcPr>
+            <w:tcW w:type="dxa" w:w="3293"/>
+            <w:vAlign w:val="center"/>
+            <w:tcMar>
+              <w:top w:w="45" w:type="dxa"/>
+              <w:start w:w="120" w:type="dxa"/>
+              <w:bottom w:w="45" w:type="dxa"/>
+              <w:end w:w="120" w:type="dxa"/>
+            </w:tcMar>
+          </w:tcPr>
+          <w:p>
+            <w:pPr>
+              <w:spacing w:after="0"/>
+            </w:pPr>
+            <w:r>
+              <w:rPr>
+                <w:rFonts w:ascii="Arial Unicode MS" w:hAnsi="Arial Unicode MS" w:eastAsia="Arial Unicode MS"/>
+                <w:b w:val="0"/>
+                <w:i w:val="0"/>
+                <w:sz w:val="17"/>
+              </w:rPr>
               <w:t>M13.1～M13.3</w:t>
             </w:r>
           </w:p>
@@ -21407,6 +21506,253 @@
           <w:i w:val="0"/>
         </w:rPr>
         <w:t xml:space="preserve"> 並接入 V4；目前內網 UI 仍不顯示 Customer/System 授權選項。</w:t>
+      </w:r>
+    </w:p>
+    <w:p>
+      <w:pPr>
+        <w:pStyle w:val="ListBullet"/>
+      </w:pPr>
+      <w:r>
+        <w:rPr>
+          <w:rFonts w:ascii="Arial Unicode MS" w:hAnsi="Arial Unicode MS" w:eastAsia="Arial Unicode MS"/>
+          <w:b w:val="0"/>
+          <w:i w:val="0"/>
+        </w:rPr>
+        <w:t xml:space="preserve">M12 歷史比較（公司 E2E 完成，2026-08-13）：release </w:t>
+      </w:r>
+      <w:r>
+        <w:rPr>
+          <w:rFonts w:ascii="Arial Unicode MS" w:hAnsi="Arial Unicode MS" w:eastAsia="Arial Unicode MS"/>
+          <w:b w:val="0"/>
+          <w:i w:val="0"/>
+          <w:color w:val="17365D"/>
+          <w:sz w:val="17"/>
+        </w:rPr>
+        <w:t>46bd7e4</w:t>
+      </w:r>
+      <w:r>
+        <w:rPr>
+          <w:rFonts w:ascii="Arial Unicode MS" w:hAnsi="Arial Unicode MS" w:eastAsia="Arial Unicode MS"/>
+          <w:b w:val="0"/>
+          <w:i w:val="0"/>
+        </w:rPr>
+        <w:t xml:space="preserve"> 已部署，application rollback=</w:t>
+      </w:r>
+      <w:r>
+        <w:rPr>
+          <w:rFonts w:ascii="Arial Unicode MS" w:hAnsi="Arial Unicode MS" w:eastAsia="Arial Unicode MS"/>
+          <w:b w:val="0"/>
+          <w:i w:val="0"/>
+          <w:color w:val="17365D"/>
+          <w:sz w:val="17"/>
+        </w:rPr>
+        <w:t>14fe797</w:t>
+      </w:r>
+      <w:r>
+        <w:rPr>
+          <w:rFonts w:ascii="Arial Unicode MS" w:hAnsi="Arial Unicode MS" w:eastAsia="Arial Unicode MS"/>
+          <w:b w:val="0"/>
+          <w:i w:val="0"/>
+        </w:rPr>
+        <w:t xml:space="preserve">，無 schema migration。Worker 只會挑選同 </w:t>
+      </w:r>
+      <w:r>
+        <w:rPr>
+          <w:rFonts w:ascii="Arial Unicode MS" w:hAnsi="Arial Unicode MS" w:eastAsia="Arial Unicode MS"/>
+          <w:b w:val="0"/>
+          <w:i w:val="0"/>
+          <w:color w:val="17365D"/>
+          <w:sz w:val="17"/>
+        </w:rPr>
+        <w:t>customer</w:t>
+      </w:r>
+      <w:r>
+        <w:rPr>
+          <w:rFonts w:ascii="Arial Unicode MS" w:hAnsi="Arial Unicode MS" w:eastAsia="Arial Unicode MS"/>
+          <w:b w:val="0"/>
+          <w:i w:val="0"/>
+        </w:rPr>
+        <w:t>、</w:t>
+      </w:r>
+      <w:r>
+        <w:rPr>
+          <w:rFonts w:ascii="Arial Unicode MS" w:hAnsi="Arial Unicode MS" w:eastAsia="Arial Unicode MS"/>
+          <w:b w:val="0"/>
+          <w:i w:val="0"/>
+          <w:color w:val="17365D"/>
+          <w:sz w:val="17"/>
+        </w:rPr>
+        <w:t>system_name</w:t>
+      </w:r>
+      <w:r>
+        <w:rPr>
+          <w:rFonts w:ascii="Arial Unicode MS" w:hAnsi="Arial Unicode MS" w:eastAsia="Arial Unicode MS"/>
+          <w:b w:val="0"/>
+          <w:i w:val="0"/>
+        </w:rPr>
+        <w:t>、</w:t>
+      </w:r>
+      <w:r>
+        <w:rPr>
+          <w:rFonts w:ascii="Arial Unicode MS" w:hAnsi="Arial Unicode MS" w:eastAsia="Arial Unicode MS"/>
+          <w:b w:val="0"/>
+          <w:i w:val="0"/>
+          <w:color w:val="17365D"/>
+          <w:sz w:val="17"/>
+        </w:rPr>
+        <w:t>product</w:t>
+      </w:r>
+      <w:r>
+        <w:rPr>
+          <w:rFonts w:ascii="Arial Unicode MS" w:hAnsi="Arial Unicode MS" w:eastAsia="Arial Unicode MS"/>
+          <w:b w:val="0"/>
+          <w:i w:val="0"/>
+        </w:rPr>
+        <w:t xml:space="preserve"> 且早於本次 created_at 的最新 succeeded Job，讀取兩期不可變 </w:t>
+      </w:r>
+      <w:r>
+        <w:rPr>
+          <w:rFonts w:ascii="Arial Unicode MS" w:hAnsi="Arial Unicode MS" w:eastAsia="Arial Unicode MS"/>
+          <w:b w:val="0"/>
+          <w:i w:val="0"/>
+          <w:color w:val="17365D"/>
+          <w:sz w:val="17"/>
+        </w:rPr>
+        <w:t>normalized.json</w:t>
+      </w:r>
+      <w:r>
+        <w:rPr>
+          <w:rFonts w:ascii="Arial Unicode MS" w:hAnsi="Arial Unicode MS" w:eastAsia="Arial Unicode MS"/>
+          <w:b w:val="0"/>
+          <w:i w:val="0"/>
+        </w:rPr>
+        <w:t xml:space="preserve"> 與 </w:t>
+      </w:r>
+      <w:r>
+        <w:rPr>
+          <w:rFonts w:ascii="Arial Unicode MS" w:hAnsi="Arial Unicode MS" w:eastAsia="Arial Unicode MS"/>
+          <w:b w:val="0"/>
+          <w:i w:val="0"/>
+          <w:color w:val="17365D"/>
+          <w:sz w:val="17"/>
+        </w:rPr>
+        <w:t>assessment.json</w:t>
+      </w:r>
+      <w:r>
+        <w:rPr>
+          <w:rFonts w:ascii="Arial Unicode MS" w:hAnsi="Arial Unicode MS" w:eastAsia="Arial Unicode MS"/>
+          <w:b w:val="0"/>
+          <w:i w:val="0"/>
+        </w:rPr>
+        <w:t xml:space="preserve">，輸出 </w:t>
+      </w:r>
+      <w:r>
+        <w:rPr>
+          <w:rFonts w:ascii="Arial Unicode MS" w:hAnsi="Arial Unicode MS" w:eastAsia="Arial Unicode MS"/>
+          <w:b w:val="0"/>
+          <w:i w:val="0"/>
+          <w:color w:val="17365D"/>
+          <w:sz w:val="17"/>
+        </w:rPr>
+        <w:t>history-comparison.json</w:t>
+      </w:r>
+      <w:r>
+        <w:rPr>
+          <w:rFonts w:ascii="Arial Unicode MS" w:hAnsi="Arial Unicode MS" w:eastAsia="Arial Unicode MS"/>
+          <w:b w:val="0"/>
+          <w:i w:val="0"/>
+        </w:rPr>
+        <w:t xml:space="preserve">；只有 </w:t>
+      </w:r>
+      <w:r>
+        <w:rPr>
+          <w:rFonts w:ascii="Arial Unicode MS" w:hAnsi="Arial Unicode MS" w:eastAsia="Arial Unicode MS"/>
+          <w:b w:val="0"/>
+          <w:i w:val="0"/>
+          <w:color w:val="17365D"/>
+          <w:sz w:val="17"/>
+        </w:rPr>
+        <w:t>status=ready</w:t>
+      </w:r>
+      <w:r>
+        <w:rPr>
+          <w:rFonts w:ascii="Arial Unicode MS" w:hAnsi="Arial Unicode MS" w:eastAsia="Arial Unicode MS"/>
+          <w:b w:val="0"/>
+          <w:i w:val="0"/>
+        </w:rPr>
+        <w:t xml:space="preserve"> 時 V4 Renderer 才新增「歷史健檢比較」章節。隔離驗證 Job </w:t>
+      </w:r>
+      <w:r>
+        <w:rPr>
+          <w:rFonts w:ascii="Arial Unicode MS" w:hAnsi="Arial Unicode MS" w:eastAsia="Arial Unicode MS"/>
+          <w:b w:val="0"/>
+          <w:i w:val="0"/>
+          <w:color w:val="17365D"/>
+          <w:sz w:val="17"/>
+        </w:rPr>
+        <w:t>d654d97f9a7f41ee8e3b28ef81982479</w:t>
+      </w:r>
+      <w:r>
+        <w:rPr>
+          <w:rFonts w:ascii="Arial Unicode MS" w:hAnsi="Arial Unicode MS" w:eastAsia="Arial Unicode MS"/>
+          <w:b w:val="0"/>
+          <w:i w:val="0"/>
+        </w:rPr>
+        <w:t xml:space="preserve"> 成功使用 prior Job </w:t>
+      </w:r>
+      <w:r>
+        <w:rPr>
+          <w:rFonts w:ascii="Arial Unicode MS" w:hAnsi="Arial Unicode MS" w:eastAsia="Arial Unicode MS"/>
+          <w:b w:val="0"/>
+          <w:i w:val="0"/>
+          <w:color w:val="17365D"/>
+          <w:sz w:val="17"/>
+        </w:rPr>
+        <w:t>6310338ddc054beebdd523a3e7211dac</w:t>
+      </w:r>
+      <w:r>
+        <w:rPr>
+          <w:rFonts w:ascii="Arial Unicode MS" w:hAnsi="Arial Unicode MS" w:eastAsia="Arial Unicode MS"/>
+          <w:b w:val="0"/>
+          <w:i w:val="0"/>
+        </w:rPr>
+        <w:t xml:space="preserve">，V4 QA delivery allowed，PDF 文字層可見第 6 章。沒有 prior baseline 時報告照常產出而不顯示該章節。建立手動驗證 Job 時必須以 </w:t>
+      </w:r>
+      <w:r>
+        <w:rPr>
+          <w:rFonts w:ascii="Arial Unicode MS" w:hAnsi="Arial Unicode MS" w:eastAsia="Arial Unicode MS"/>
+          <w:b w:val="0"/>
+          <w:i w:val="0"/>
+          <w:color w:val="17365D"/>
+          <w:sz w:val="17"/>
+        </w:rPr>
+        <w:t>omnicheck:omnicheck</w:t>
+      </w:r>
+      <w:r>
+        <w:rPr>
+          <w:rFonts w:ascii="Arial Unicode MS" w:hAnsi="Arial Unicode MS" w:eastAsia="Arial Unicode MS"/>
+          <w:b w:val="0"/>
+          <w:i w:val="0"/>
+        </w:rPr>
+        <w:t xml:space="preserve"> 擁有 </w:t>
+      </w:r>
+      <w:r>
+        <w:rPr>
+          <w:rFonts w:ascii="Arial Unicode MS" w:hAnsi="Arial Unicode MS" w:eastAsia="Arial Unicode MS"/>
+          <w:b w:val="0"/>
+          <w:i w:val="0"/>
+          <w:color w:val="17365D"/>
+          <w:sz w:val="17"/>
+        </w:rPr>
+        <w:t>/data/omnicheck/jobs/&lt;job_id&gt;</w:t>
+      </w:r>
+      <w:r>
+        <w:rPr>
+          <w:rFonts w:ascii="Arial Unicode MS" w:hAnsi="Arial Unicode MS" w:eastAsia="Arial Unicode MS"/>
+          <w:b w:val="0"/>
+          <w:i w:val="0"/>
+        </w:rPr>
+        <w:t>；勿以 root 建立後直接讓 Worker 執行。</w:t>
       </w:r>
     </w:p>
     <w:p>

</xml_diff>

<commit_message>
docs: record report delivery enhancements
</commit_message>
<xml_diff>
--- a/docs/OMNICHECK_AI_BUILD_AND_OPERATIONS_GUIDE.docx
+++ b/docs/OMNICHECK_AI_BUILD_AND_OPERATIONS_GUIDE.docx
@@ -21757,6 +21757,163 @@
     </w:p>
     <w:p>
       <w:pPr>
+        <w:pStyle w:val="ListBullet"/>
+      </w:pPr>
+      <w:r>
+        <w:rPr>
+          <w:rFonts w:ascii="Arial Unicode MS" w:hAnsi="Arial Unicode MS" w:eastAsia="Arial Unicode MS"/>
+          <w:b w:val="0"/>
+          <w:i w:val="0"/>
+        </w:rPr>
+        <w:t xml:space="preserve">報告時間、CVE 中文與 V4 視覺規則（2026-08-13）：release </w:t>
+      </w:r>
+      <w:r>
+        <w:rPr>
+          <w:rFonts w:ascii="Arial Unicode MS" w:hAnsi="Arial Unicode MS" w:eastAsia="Arial Unicode MS"/>
+          <w:b w:val="0"/>
+          <w:i w:val="0"/>
+          <w:color w:val="17365D"/>
+          <w:sz w:val="17"/>
+        </w:rPr>
+        <w:t>5f629d8</w:t>
+      </w:r>
+      <w:r>
+        <w:rPr>
+          <w:rFonts w:ascii="Arial Unicode MS" w:hAnsi="Arial Unicode MS" w:eastAsia="Arial Unicode MS"/>
+          <w:b w:val="0"/>
+          <w:i w:val="0"/>
+        </w:rPr>
+        <w:t xml:space="preserve"> 已部署，rollback=</w:t>
+      </w:r>
+      <w:r>
+        <w:rPr>
+          <w:rFonts w:ascii="Arial Unicode MS" w:hAnsi="Arial Unicode MS" w:eastAsia="Arial Unicode MS"/>
+          <w:b w:val="0"/>
+          <w:i w:val="0"/>
+          <w:color w:val="17365D"/>
+          <w:sz w:val="17"/>
+        </w:rPr>
+        <w:t>e3b9c83</w:t>
+      </w:r>
+      <w:r>
+        <w:rPr>
+          <w:rFonts w:ascii="Arial Unicode MS" w:hAnsi="Arial Unicode MS" w:eastAsia="Arial Unicode MS"/>
+          <w:b w:val="0"/>
+          <w:i w:val="0"/>
+        </w:rPr>
+        <w:t xml:space="preserve">，無 migration。每個 Worker Job 完成或失敗都會在 output 建立 </w:t>
+      </w:r>
+      <w:r>
+        <w:rPr>
+          <w:rFonts w:ascii="Arial Unicode MS" w:hAnsi="Arial Unicode MS" w:eastAsia="Arial Unicode MS"/>
+          <w:b w:val="0"/>
+          <w:i w:val="0"/>
+          <w:color w:val="17365D"/>
+          <w:sz w:val="17"/>
+        </w:rPr>
+        <w:t>execution-profile.json</w:t>
+      </w:r>
+      <w:r>
+        <w:rPr>
+          <w:rFonts w:ascii="Arial Unicode MS" w:hAnsi="Arial Unicode MS" w:eastAsia="Arial Unicode MS"/>
+          <w:b w:val="0"/>
+          <w:i w:val="0"/>
+        </w:rPr>
+        <w:t xml:space="preserve">，並透過 </w:t>
+      </w:r>
+      <w:r>
+        <w:rPr>
+          <w:rFonts w:ascii="Arial Unicode MS" w:hAnsi="Arial Unicode MS" w:eastAsia="Arial Unicode MS"/>
+          <w:b w:val="0"/>
+          <w:i w:val="0"/>
+          <w:color w:val="17365D"/>
+          <w:sz w:val="17"/>
+        </w:rPr>
+        <w:t>GET /api/jobs/{job_id}/execution-profile</w:t>
+      </w:r>
+      <w:r>
+        <w:rPr>
+          <w:rFonts w:ascii="Arial Unicode MS" w:hAnsi="Arial Unicode MS" w:eastAsia="Arial Unicode MS"/>
+          <w:b w:val="0"/>
+          <w:i w:val="0"/>
+        </w:rPr>
+        <w:t xml:space="preserve"> 回傳階段與總毫秒；一般 UI 結果畫面會轉換為秒／分秒。不可將此檔當作客戶正式報告內容。V4 Logo 位於受版控 </w:t>
+      </w:r>
+      <w:r>
+        <w:rPr>
+          <w:rFonts w:ascii="Arial Unicode MS" w:hAnsi="Arial Unicode MS" w:eastAsia="Arial Unicode MS"/>
+          <w:b w:val="0"/>
+          <w:i w:val="0"/>
+          <w:color w:val="17365D"/>
+          <w:sz w:val="17"/>
+        </w:rPr>
+        <w:t>vendor/omni-v4-renderer/assets/omniwaresoft-logo.png</w:t>
+      </w:r>
+      <w:r>
+        <w:rPr>
+          <w:rFonts w:ascii="Arial Unicode MS" w:hAnsi="Arial Unicode MS" w:eastAsia="Arial Unicode MS"/>
+          <w:b w:val="0"/>
+          <w:i w:val="0"/>
+        </w:rPr>
+        <w:t xml:space="preserve">，部署 archive 必須包含該檔；Logo 遺失時只省略圖片，其他封面仍可產出。目錄使用頁碼欄位，DOCX 編輯後如頁數變動，必須在 Word 或 LibreOffice 更新欄位並重新轉 PDF。CVE 顯示欄位固定為版本、CVE、CVSS、元件、修正內容；嚴重程度保留於 cache／QA 但不渲染。翻譯僅能對 canonical report 的 CVE summary 產生 </w:t>
+      </w:r>
+      <w:r>
+        <w:rPr>
+          <w:rFonts w:ascii="Arial Unicode MS" w:hAnsi="Arial Unicode MS" w:eastAsia="Arial Unicode MS"/>
+          <w:b w:val="0"/>
+          <w:i w:val="0"/>
+          <w:color w:val="17365D"/>
+          <w:sz w:val="17"/>
+        </w:rPr>
+        <w:t>summary_zh</w:t>
+      </w:r>
+      <w:r>
+        <w:rPr>
+          <w:rFonts w:ascii="Arial Unicode MS" w:hAnsi="Arial Unicode MS" w:eastAsia="Arial Unicode MS"/>
+          <w:b w:val="0"/>
+          <w:i w:val="0"/>
+        </w:rPr>
+        <w:t xml:space="preserve">，且必須關聯既有 </w:t>
+      </w:r>
+      <w:r>
+        <w:rPr>
+          <w:rFonts w:ascii="Arial Unicode MS" w:hAnsi="Arial Unicode MS" w:eastAsia="Arial Unicode MS"/>
+          <w:b w:val="0"/>
+          <w:i w:val="0"/>
+          <w:color w:val="17365D"/>
+          <w:sz w:val="17"/>
+        </w:rPr>
+        <w:t>section_workflow_items.item_id</w:t>
+      </w:r>
+      <w:r>
+        <w:rPr>
+          <w:rFonts w:ascii="Arial Unicode MS" w:hAnsi="Arial Unicode MS" w:eastAsia="Arial Unicode MS"/>
+          <w:b w:val="0"/>
+          <w:i w:val="0"/>
+        </w:rPr>
+        <w:t xml:space="preserve"> 寫入 AI audit；若 AI disabled、逾時或 JSON 驗證失敗，保留原文而不得阻擋 deterministic 報告。舊 EDB official advisory 若僅有同 Major fixed version，matcher 會記錄 inferred </w:t>
+      </w:r>
+      <w:r>
+        <w:rPr>
+          <w:rFonts w:ascii="Arial Unicode MS" w:hAnsi="Arial Unicode MS" w:eastAsia="Arial Unicode MS"/>
+          <w:b w:val="0"/>
+          <w:i w:val="0"/>
+          <w:color w:val="17365D"/>
+          <w:sz w:val="17"/>
+        </w:rPr>
+        <w:t>Major.0</w:t>
+      </w:r>
+      <w:r>
+        <w:rPr>
+          <w:rFonts w:ascii="Arial Unicode MS" w:hAnsi="Arial Unicode MS" w:eastAsia="Arial Unicode MS"/>
+          <w:b w:val="0"/>
+          <w:i w:val="0"/>
+        </w:rPr>
+        <w:t xml:space="preserve"> lower bound；非 EDB official source 不可使用此推論。</w:t>
+      </w:r>
+    </w:p>
+    <w:p>
+      <w:pPr>
         <w:pStyle w:val="Heading2"/>
       </w:pPr>
       <w:r>

</xml_diff>

<commit_message>
fix: refine V4 toc and CVE readability
</commit_message>
<xml_diff>
--- a/docs/OMNICHECK_AI_BUILD_AND_OPERATIONS_GUIDE.docx
+++ b/docs/OMNICHECK_AI_BUILD_AND_OPERATIONS_GUIDE.docx
@@ -21855,7 +21855,7 @@
           <w:b w:val="0"/>
           <w:i w:val="0"/>
         </w:rPr>
-        <w:t xml:space="preserve">，部署 archive 必須包含該檔；Logo 遺失時只省略圖片，其他封面仍可產出。目錄使用頁碼欄位，DOCX 編輯後如頁數變動，必須在 Word 或 LibreOffice 更新欄位並重新轉 PDF。CVE 顯示欄位固定為版本、CVE、CVSS、元件、修正內容；嚴重程度保留於 cache／QA 但不渲染。翻譯僅能對 canonical report 的 CVE summary 產生 </w:t>
+        <w:t xml:space="preserve">，部署 archive 必須包含該檔；Logo 遺失時只省略圖片，其他封面仍可產出。目錄採無框雙欄固定寬度，章節在左、頁碼欄在最右；DOCX 編輯後如頁數變動，必須在 Word 或 LibreOffice 更新 </w:t>
       </w:r>
       <w:r>
         <w:rPr>
@@ -21865,15 +21865,15 @@
           <w:color w:val="17365D"/>
           <w:sz w:val="17"/>
         </w:rPr>
-        <w:t>summary_zh</w:t>
-      </w:r>
-      <w:r>
-        <w:rPr>
-          <w:rFonts w:ascii="Arial Unicode MS" w:hAnsi="Arial Unicode MS" w:eastAsia="Arial Unicode MS"/>
-          <w:b w:val="0"/>
-          <w:i w:val="0"/>
-        </w:rPr>
-        <w:t xml:space="preserve">，且必須關聯既有 </w:t>
+        <w:t>PAGEREF</w:t>
+      </w:r>
+      <w:r>
+        <w:rPr>
+          <w:rFonts w:ascii="Arial Unicode MS" w:hAnsi="Arial Unicode MS" w:eastAsia="Arial Unicode MS"/>
+          <w:b w:val="0"/>
+          <w:i w:val="0"/>
+        </w:rPr>
+        <w:t xml:space="preserve"> 欄位並重新轉 PDF。CVE 顯示欄位固定為版本、CVE、CVSS、修正內容，元件／嚴重程度／CVSS version／vector／source 保留在 cache、canonical V4 JSON 與 QA 而不渲染。翻譯僅能對 canonical report 的 CVE summary 產生 </w:t>
       </w:r>
       <w:r>
         <w:rPr>
@@ -21883,6 +21883,24 @@
           <w:color w:val="17365D"/>
           <w:sz w:val="17"/>
         </w:rPr>
+        <w:t>summary_zh</w:t>
+      </w:r>
+      <w:r>
+        <w:rPr>
+          <w:rFonts w:ascii="Arial Unicode MS" w:hAnsi="Arial Unicode MS" w:eastAsia="Arial Unicode MS"/>
+          <w:b w:val="0"/>
+          <w:i w:val="0"/>
+        </w:rPr>
+        <w:t xml:space="preserve">，且必須關聯既有 </w:t>
+      </w:r>
+      <w:r>
+        <w:rPr>
+          <w:rFonts w:ascii="Arial Unicode MS" w:hAnsi="Arial Unicode MS" w:eastAsia="Arial Unicode MS"/>
+          <w:b w:val="0"/>
+          <w:i w:val="0"/>
+          <w:color w:val="17365D"/>
+          <w:sz w:val="17"/>
+        </w:rPr>
         <w:t>section_workflow_items.item_id</w:t>
       </w:r>
       <w:r>
@@ -21891,7 +21909,7 @@
           <w:b w:val="0"/>
           <w:i w:val="0"/>
         </w:rPr>
-        <w:t xml:space="preserve"> 寫入 AI audit；若 AI disabled、逾時或 JSON 驗證失敗，保留原文而不得阻擋 deterministic 報告。舊 EDB official advisory 若僅有同 Major fixed version，matcher 會記錄 inferred </w:t>
+        <w:t xml:space="preserve"> 寫入 AI audit；prompt 要求一至兩句具體繁中說明，且 validation 會拒絕「更多細節／更多資訊／詳情／請參閱」等空泛語。若 AI disabled、逾時或 JSON／內容驗證失敗，保留原文而不得阻擋 deterministic 報告。舊 EDB official advisory 若僅有同 Major fixed version，matcher 會記錄 inferred </w:t>
       </w:r>
       <w:r>
         <w:rPr>

</xml_diff>

<commit_message>
feat: add optional login and customer RBAC
</commit_message>
<xml_diff>
--- a/docs/OMNICHECK_AI_BUILD_AND_OPERATIONS_GUIDE.docx
+++ b/docs/OMNICHECK_AI_BUILD_AND_OPERATIONS_GUIDE.docx
@@ -844,7 +844,7 @@
                 <w:color w:val="17365D"/>
                 <w:sz w:val="18"/>
               </w:rPr>
-              <w:t>附錄 B：交付驗收簽核表</w:t>
+              <w:t>M11 Login／RBAC 啟用手順（預設不啟用）</w:t>
             </w:r>
           </w:p>
         </w:tc>
@@ -877,8 +877,26 @@
         <w:tc>
           <w:tcPr>
             <w:tcW w:type="dxa" w:w="4939"/>
+            <w:tcMar>
+              <w:top w:w="45" w:type="dxa"/>
+              <w:start w:w="80" w:type="dxa"/>
+              <w:bottom w:w="45" w:type="dxa"/>
+              <w:end w:w="80" w:type="dxa"/>
+            </w:tcMar>
           </w:tcPr>
-          <w:p/>
+          <w:p>
+            <w:pPr>
+              <w:spacing w:after="20"/>
+            </w:pPr>
+            <w:r>
+              <w:rPr>
+                <w:rFonts w:ascii="Arial Unicode MS" w:hAnsi="Arial Unicode MS" w:eastAsia="Arial Unicode MS"/>
+                <w:color w:val="17365D"/>
+                <w:sz w:val="18"/>
+              </w:rPr>
+              <w:t>附錄 B：交付驗收簽核表</w:t>
+            </w:r>
+          </w:p>
         </w:tc>
       </w:tr>
     </w:tbl>
@@ -21945,6 +21963,426 @@
     </w:p>
     <w:p>
       <w:pPr>
+        <w:pStyle w:val="Heading2"/>
+      </w:pPr>
+      <w:r>
+        <w:rPr>
+          <w:rFonts w:ascii="Arial Unicode MS" w:hAnsi="Arial Unicode MS" w:eastAsia="Arial Unicode MS"/>
+          <w:b w:val="0"/>
+          <w:i w:val="0"/>
+        </w:rPr>
+        <w:t>M11 Login／RBAC 啟用手順（預設不啟用）</w:t>
+      </w:r>
+    </w:p>
+    <w:p>
+      <w:r>
+        <w:rPr>
+          <w:rFonts w:ascii="Arial Unicode MS" w:hAnsi="Arial Unicode MS" w:eastAsia="Arial Unicode MS"/>
+          <w:b w:val="0"/>
+          <w:i w:val="0"/>
+        </w:rPr>
+        <w:t xml:space="preserve">M11 不更動既有 Pipeline、Canonical JSON 或 V4 Renderer；只在 Web API 加上 EDB 身分、角色與 Customer scope enforcement。既有 </w:t>
+      </w:r>
+      <w:r>
+        <w:rPr>
+          <w:rFonts w:ascii="Arial Unicode MS" w:hAnsi="Arial Unicode MS" w:eastAsia="Arial Unicode MS"/>
+          <w:b w:val="0"/>
+          <w:i w:val="0"/>
+          <w:color w:val="17365D"/>
+          <w:sz w:val="17"/>
+        </w:rPr>
+        <w:t>0005_m11</w:t>
+      </w:r>
+      <w:r>
+        <w:rPr>
+          <w:rFonts w:ascii="Arial Unicode MS" w:hAnsi="Arial Unicode MS" w:eastAsia="Arial Unicode MS"/>
+          <w:b w:val="0"/>
+          <w:i w:val="0"/>
+        </w:rPr>
+        <w:t xml:space="preserve"> migration 建立 </w:t>
+      </w:r>
+      <w:r>
+        <w:rPr>
+          <w:rFonts w:ascii="Arial Unicode MS" w:hAnsi="Arial Unicode MS" w:eastAsia="Arial Unicode MS"/>
+          <w:b w:val="0"/>
+          <w:i w:val="0"/>
+          <w:color w:val="17365D"/>
+          <w:sz w:val="17"/>
+        </w:rPr>
+        <w:t>users</w:t>
+      </w:r>
+      <w:r>
+        <w:rPr>
+          <w:rFonts w:ascii="Arial Unicode MS" w:hAnsi="Arial Unicode MS" w:eastAsia="Arial Unicode MS"/>
+          <w:b w:val="0"/>
+          <w:i w:val="0"/>
+        </w:rPr>
+        <w:t>、</w:t>
+      </w:r>
+      <w:r>
+        <w:rPr>
+          <w:rFonts w:ascii="Arial Unicode MS" w:hAnsi="Arial Unicode MS" w:eastAsia="Arial Unicode MS"/>
+          <w:b w:val="0"/>
+          <w:i w:val="0"/>
+          <w:color w:val="17365D"/>
+          <w:sz w:val="17"/>
+        </w:rPr>
+        <w:t>customer_memberships</w:t>
+      </w:r>
+      <w:r>
+        <w:rPr>
+          <w:rFonts w:ascii="Arial Unicode MS" w:hAnsi="Arial Unicode MS" w:eastAsia="Arial Unicode MS"/>
+          <w:b w:val="0"/>
+          <w:i w:val="0"/>
+        </w:rPr>
+        <w:t>、</w:t>
+      </w:r>
+      <w:r>
+        <w:rPr>
+          <w:rFonts w:ascii="Arial Unicode MS" w:hAnsi="Arial Unicode MS" w:eastAsia="Arial Unicode MS"/>
+          <w:b w:val="0"/>
+          <w:i w:val="0"/>
+          <w:color w:val="17365D"/>
+          <w:sz w:val="17"/>
+        </w:rPr>
+        <w:t>user_sessions</w:t>
+      </w:r>
+      <w:r>
+        <w:rPr>
+          <w:rFonts w:ascii="Arial Unicode MS" w:hAnsi="Arial Unicode MS" w:eastAsia="Arial Unicode MS"/>
+          <w:b w:val="0"/>
+          <w:i w:val="0"/>
+        </w:rPr>
+        <w:t>、</w:t>
+      </w:r>
+      <w:r>
+        <w:rPr>
+          <w:rFonts w:ascii="Arial Unicode MS" w:hAnsi="Arial Unicode MS" w:eastAsia="Arial Unicode MS"/>
+          <w:b w:val="0"/>
+          <w:i w:val="0"/>
+          <w:color w:val="17365D"/>
+          <w:sz w:val="17"/>
+        </w:rPr>
+        <w:t>audit_events</w:t>
+      </w:r>
+      <w:r>
+        <w:rPr>
+          <w:rFonts w:ascii="Arial Unicode MS" w:hAnsi="Arial Unicode MS" w:eastAsia="Arial Unicode MS"/>
+          <w:b w:val="0"/>
+          <w:i w:val="0"/>
+        </w:rPr>
+        <w:t>，不得為啟用登入執行 downgrade。</w:t>
+      </w:r>
+    </w:p>
+    <w:p>
+      <w:pPr>
+        <w:pStyle w:val="ListNumber"/>
+      </w:pPr>
+      <w:r>
+        <w:rPr>
+          <w:rFonts w:ascii="Arial Unicode MS" w:hAnsi="Arial Unicode MS" w:eastAsia="Arial Unicode MS"/>
+          <w:b w:val="0"/>
+          <w:i w:val="0"/>
+        </w:rPr>
+        <w:t>確認 Customer／System 已建立且名稱正確；啟用模式下新案件必須選擇被授權的 Customer 和 System。</w:t>
+      </w:r>
+    </w:p>
+    <w:p>
+      <w:pPr>
+        <w:pStyle w:val="ListNumber"/>
+      </w:pPr>
+      <w:r>
+        <w:rPr>
+          <w:rFonts w:ascii="Arial Unicode MS" w:hAnsi="Arial Unicode MS" w:eastAsia="Arial Unicode MS"/>
+          <w:b w:val="0"/>
+          <w:i w:val="0"/>
+        </w:rPr>
+        <w:t xml:space="preserve">在 </w:t>
+      </w:r>
+      <w:r>
+        <w:rPr>
+          <w:rFonts w:ascii="Arial Unicode MS" w:hAnsi="Arial Unicode MS" w:eastAsia="Arial Unicode MS"/>
+          <w:b w:val="0"/>
+          <w:i w:val="0"/>
+          <w:color w:val="17365D"/>
+          <w:sz w:val="17"/>
+        </w:rPr>
+        <w:t>/etc/omnicheck-ai/omnicheck.env</w:t>
+      </w:r>
+      <w:r>
+        <w:rPr>
+          <w:rFonts w:ascii="Arial Unicode MS" w:hAnsi="Arial Unicode MS" w:eastAsia="Arial Unicode MS"/>
+          <w:b w:val="0"/>
+          <w:i w:val="0"/>
+        </w:rPr>
+        <w:t xml:space="preserve"> 設定一次性高熵 </w:t>
+      </w:r>
+      <w:r>
+        <w:rPr>
+          <w:rFonts w:ascii="Arial Unicode MS" w:hAnsi="Arial Unicode MS" w:eastAsia="Arial Unicode MS"/>
+          <w:b w:val="0"/>
+          <w:i w:val="0"/>
+          <w:color w:val="17365D"/>
+          <w:sz w:val="17"/>
+        </w:rPr>
+        <w:t>OMNICHECK_AUTH_BOOTSTRAP_TOKEN</w:t>
+      </w:r>
+      <w:r>
+        <w:rPr>
+          <w:rFonts w:ascii="Arial Unicode MS" w:hAnsi="Arial Unicode MS" w:eastAsia="Arial Unicode MS"/>
+          <w:b w:val="0"/>
+          <w:i w:val="0"/>
+        </w:rPr>
+        <w:t xml:space="preserve">，先維持 </w:t>
+      </w:r>
+      <w:r>
+        <w:rPr>
+          <w:rFonts w:ascii="Arial Unicode MS" w:hAnsi="Arial Unicode MS" w:eastAsia="Arial Unicode MS"/>
+          <w:b w:val="0"/>
+          <w:i w:val="0"/>
+          <w:color w:val="17365D"/>
+          <w:sz w:val="17"/>
+        </w:rPr>
+        <w:t>OMNICHECK_AUTH_ENABLED=false</w:t>
+      </w:r>
+      <w:r>
+        <w:rPr>
+          <w:rFonts w:ascii="Arial Unicode MS" w:hAnsi="Arial Unicode MS" w:eastAsia="Arial Unicode MS"/>
+          <w:b w:val="0"/>
+          <w:i w:val="0"/>
+        </w:rPr>
+        <w:t>。不可提交 token。</w:t>
+      </w:r>
+    </w:p>
+    <w:p>
+      <w:pPr>
+        <w:pStyle w:val="ListNumber"/>
+      </w:pPr>
+      <w:r>
+        <w:rPr>
+          <w:rFonts w:ascii="Arial Unicode MS" w:hAnsi="Arial Unicode MS" w:eastAsia="Arial Unicode MS"/>
+          <w:b w:val="0"/>
+          <w:i w:val="0"/>
+        </w:rPr>
+        <w:t xml:space="preserve">使用 </w:t>
+      </w:r>
+      <w:r>
+        <w:rPr>
+          <w:rFonts w:ascii="Arial Unicode MS" w:hAnsi="Arial Unicode MS" w:eastAsia="Arial Unicode MS"/>
+          <w:b w:val="0"/>
+          <w:i w:val="0"/>
+          <w:color w:val="17365D"/>
+          <w:sz w:val="17"/>
+        </w:rPr>
+        <w:t>POST /api/auth/bootstrap</w:t>
+      </w:r>
+      <w:r>
+        <w:rPr>
+          <w:rFonts w:ascii="Arial Unicode MS" w:hAnsi="Arial Unicode MS" w:eastAsia="Arial Unicode MS"/>
+          <w:b w:val="0"/>
+          <w:i w:val="0"/>
+        </w:rPr>
+        <w:t xml:space="preserve"> 建立第一位 platform admin；成功後 endpoint 必須回 409，隨即從環境檔移除 bootstrap token。</w:t>
+      </w:r>
+    </w:p>
+    <w:p>
+      <w:pPr>
+        <w:pStyle w:val="ListNumber"/>
+      </w:pPr>
+      <w:r>
+        <w:rPr>
+          <w:rFonts w:ascii="Arial Unicode MS" w:hAnsi="Arial Unicode MS" w:eastAsia="Arial Unicode MS"/>
+          <w:b w:val="0"/>
+          <w:i w:val="0"/>
+        </w:rPr>
+        <w:t xml:space="preserve">用 admin session 呼叫 </w:t>
+      </w:r>
+      <w:r>
+        <w:rPr>
+          <w:rFonts w:ascii="Arial Unicode MS" w:hAnsi="Arial Unicode MS" w:eastAsia="Arial Unicode MS"/>
+          <w:b w:val="0"/>
+          <w:i w:val="0"/>
+          <w:color w:val="17365D"/>
+          <w:sz w:val="17"/>
+        </w:rPr>
+        <w:t>POST /api/admin/users</w:t>
+      </w:r>
+      <w:r>
+        <w:rPr>
+          <w:rFonts w:ascii="Arial Unicode MS" w:hAnsi="Arial Unicode MS" w:eastAsia="Arial Unicode MS"/>
+          <w:b w:val="0"/>
+          <w:i w:val="0"/>
+        </w:rPr>
+        <w:t xml:space="preserve"> 建帳號、</w:t>
+      </w:r>
+      <w:r>
+        <w:rPr>
+          <w:rFonts w:ascii="Arial Unicode MS" w:hAnsi="Arial Unicode MS" w:eastAsia="Arial Unicode MS"/>
+          <w:b w:val="0"/>
+          <w:i w:val="0"/>
+          <w:color w:val="17365D"/>
+          <w:sz w:val="17"/>
+        </w:rPr>
+        <w:t>POST /api/admin/customer-memberships</w:t>
+      </w:r>
+      <w:r>
+        <w:rPr>
+          <w:rFonts w:ascii="Arial Unicode MS" w:hAnsi="Arial Unicode MS" w:eastAsia="Arial Unicode MS"/>
+          <w:b w:val="0"/>
+          <w:i w:val="0"/>
+        </w:rPr>
+        <w:t xml:space="preserve"> 授予 Customer </w:t>
+      </w:r>
+      <w:r>
+        <w:rPr>
+          <w:rFonts w:ascii="Arial Unicode MS" w:hAnsi="Arial Unicode MS" w:eastAsia="Arial Unicode MS"/>
+          <w:b w:val="0"/>
+          <w:i w:val="0"/>
+          <w:color w:val="17365D"/>
+          <w:sz w:val="17"/>
+        </w:rPr>
+        <w:t>engineer</w:t>
+      </w:r>
+      <w:r>
+        <w:rPr>
+          <w:rFonts w:ascii="Arial Unicode MS" w:hAnsi="Arial Unicode MS" w:eastAsia="Arial Unicode MS"/>
+          <w:b w:val="0"/>
+          <w:i w:val="0"/>
+        </w:rPr>
+        <w:t>、</w:t>
+      </w:r>
+      <w:r>
+        <w:rPr>
+          <w:rFonts w:ascii="Arial Unicode MS" w:hAnsi="Arial Unicode MS" w:eastAsia="Arial Unicode MS"/>
+          <w:b w:val="0"/>
+          <w:i w:val="0"/>
+          <w:color w:val="17365D"/>
+          <w:sz w:val="17"/>
+        </w:rPr>
+        <w:t>reviewer</w:t>
+      </w:r>
+      <w:r>
+        <w:rPr>
+          <w:rFonts w:ascii="Arial Unicode MS" w:hAnsi="Arial Unicode MS" w:eastAsia="Arial Unicode MS"/>
+          <w:b w:val="0"/>
+          <w:i w:val="0"/>
+        </w:rPr>
+        <w:t xml:space="preserve"> 或 </w:t>
+      </w:r>
+      <w:r>
+        <w:rPr>
+          <w:rFonts w:ascii="Arial Unicode MS" w:hAnsi="Arial Unicode MS" w:eastAsia="Arial Unicode MS"/>
+          <w:b w:val="0"/>
+          <w:i w:val="0"/>
+          <w:color w:val="17365D"/>
+          <w:sz w:val="17"/>
+        </w:rPr>
+        <w:t>viewer</w:t>
+      </w:r>
+      <w:r>
+        <w:rPr>
+          <w:rFonts w:ascii="Arial Unicode MS" w:hAnsi="Arial Unicode MS" w:eastAsia="Arial Unicode MS"/>
+          <w:b w:val="0"/>
+          <w:i w:val="0"/>
+        </w:rPr>
+        <w:t>。platform admin 可管理全部 Customer；engineer 可建案／上傳／執行／修改；reviewer 可讀取與核准；viewer 僅讀取。</w:t>
+      </w:r>
+    </w:p>
+    <w:p>
+      <w:pPr>
+        <w:pStyle w:val="ListNumber"/>
+      </w:pPr>
+      <w:r>
+        <w:rPr>
+          <w:rFonts w:ascii="Arial Unicode MS" w:hAnsi="Arial Unicode MS" w:eastAsia="Arial Unicode MS"/>
+          <w:b w:val="0"/>
+          <w:i w:val="0"/>
+        </w:rPr>
+        <w:t xml:space="preserve">staging 設定 </w:t>
+      </w:r>
+      <w:r>
+        <w:rPr>
+          <w:rFonts w:ascii="Arial Unicode MS" w:hAnsi="Arial Unicode MS" w:eastAsia="Arial Unicode MS"/>
+          <w:b w:val="0"/>
+          <w:i w:val="0"/>
+          <w:color w:val="17365D"/>
+          <w:sz w:val="17"/>
+        </w:rPr>
+        <w:t>OMNICHECK_AUTH_ENABLED=true</w:t>
+      </w:r>
+      <w:r>
+        <w:rPr>
+          <w:rFonts w:ascii="Arial Unicode MS" w:hAnsi="Arial Unicode MS" w:eastAsia="Arial Unicode MS"/>
+          <w:b w:val="0"/>
+          <w:i w:val="0"/>
+        </w:rPr>
+        <w:t xml:space="preserve">。HTTP 測試時 </w:t>
+      </w:r>
+      <w:r>
+        <w:rPr>
+          <w:rFonts w:ascii="Arial Unicode MS" w:hAnsi="Arial Unicode MS" w:eastAsia="Arial Unicode MS"/>
+          <w:b w:val="0"/>
+          <w:i w:val="0"/>
+          <w:color w:val="17365D"/>
+          <w:sz w:val="17"/>
+        </w:rPr>
+        <w:t>OMNICHECK_AUTH_COOKIE_SECURE=false</w:t>
+      </w:r>
+      <w:r>
+        <w:rPr>
+          <w:rFonts w:ascii="Arial Unicode MS" w:hAnsi="Arial Unicode MS" w:eastAsia="Arial Unicode MS"/>
+          <w:b w:val="0"/>
+          <w:i w:val="0"/>
+        </w:rPr>
+        <w:t xml:space="preserve">；正式 TLS reverse proxy 完成後必須設為 </w:t>
+      </w:r>
+      <w:r>
+        <w:rPr>
+          <w:rFonts w:ascii="Arial Unicode MS" w:hAnsi="Arial Unicode MS" w:eastAsia="Arial Unicode MS"/>
+          <w:b w:val="0"/>
+          <w:i w:val="0"/>
+          <w:color w:val="17365D"/>
+          <w:sz w:val="17"/>
+        </w:rPr>
+        <w:t>true</w:t>
+      </w:r>
+      <w:r>
+        <w:rPr>
+          <w:rFonts w:ascii="Arial Unicode MS" w:hAnsi="Arial Unicode MS" w:eastAsia="Arial Unicode MS"/>
+          <w:b w:val="0"/>
+          <w:i w:val="0"/>
+        </w:rPr>
+        <w:t>。</w:t>
+      </w:r>
+    </w:p>
+    <w:p>
+      <w:pPr>
+        <w:pStyle w:val="ListNumber"/>
+      </w:pPr>
+      <w:r>
+        <w:rPr>
+          <w:rFonts w:ascii="Arial Unicode MS" w:hAnsi="Arial Unicode MS" w:eastAsia="Arial Unicode MS"/>
+          <w:b w:val="0"/>
+          <w:i w:val="0"/>
+        </w:rPr>
+        <w:t>驗證未登入 API 回 401、跨 Customer Job 不可列出或下載、legacy unscoped Job 僅 admin 可讀、缺 CSRF 的 cookie POST 回 403，且登入／拒絕登入／帳號與授權異動都寫入 audit。</w:t>
+      </w:r>
+    </w:p>
+    <w:p>
+      <w:pPr>
+        <w:pStyle w:val="ListNumber"/>
+      </w:pPr>
+      <w:r>
+        <w:rPr>
+          <w:rFonts w:ascii="Arial Unicode MS" w:hAnsi="Arial Unicode MS" w:eastAsia="Arial Unicode MS"/>
+          <w:b w:val="0"/>
+          <w:i w:val="0"/>
+        </w:rPr>
+        <w:t>公司驗收後才啟用正式環境。若需 application rollback，先將開關關閉；不可用 Git rollback 取代 EDB schema downgrade。</w:t>
+      </w:r>
+    </w:p>
+    <w:p>
+      <w:pPr>
         <w:pStyle w:val="ListBullet"/>
       </w:pPr>
       <w:r>

</xml_diff>

<commit_message>
docs: record M11 deployment state
</commit_message>
<xml_diff>
--- a/docs/OMNICHECK_AI_BUILD_AND_OPERATIONS_GUIDE.docx
+++ b/docs/OMNICHECK_AI_BUILD_AND_OPERATIONS_GUIDE.docx
@@ -22382,6 +22382,88 @@
       </w:r>
     </w:p>
     <w:p>
+      <w:r>
+        <w:rPr>
+          <w:rFonts w:ascii="Arial Unicode MS" w:hAnsi="Arial Unicode MS" w:eastAsia="Arial Unicode MS"/>
+          <w:b w:val="0"/>
+          <w:i w:val="0"/>
+        </w:rPr>
+        <w:t xml:space="preserve">公司部署紀錄（2026-08-14）：release </w:t>
+      </w:r>
+      <w:r>
+        <w:rPr>
+          <w:rFonts w:ascii="Arial Unicode MS" w:hAnsi="Arial Unicode MS" w:eastAsia="Arial Unicode MS"/>
+          <w:b w:val="0"/>
+          <w:i w:val="0"/>
+          <w:color w:val="17365D"/>
+          <w:sz w:val="17"/>
+        </w:rPr>
+        <w:t>b1de455</w:t>
+      </w:r>
+      <w:r>
+        <w:rPr>
+          <w:rFonts w:ascii="Arial Unicode MS" w:hAnsi="Arial Unicode MS" w:eastAsia="Arial Unicode MS"/>
+          <w:b w:val="0"/>
+          <w:i w:val="0"/>
+        </w:rPr>
+        <w:t xml:space="preserve"> 已安裝於公司 App VM，登入功能維持預設 disabled；Alembic </w:t>
+      </w:r>
+      <w:r>
+        <w:rPr>
+          <w:rFonts w:ascii="Arial Unicode MS" w:hAnsi="Arial Unicode MS" w:eastAsia="Arial Unicode MS"/>
+          <w:b w:val="0"/>
+          <w:i w:val="0"/>
+          <w:color w:val="17365D"/>
+          <w:sz w:val="17"/>
+        </w:rPr>
+        <w:t>0011_m13_cve_major (head)</w:t>
+      </w:r>
+      <w:r>
+        <w:rPr>
+          <w:rFonts w:ascii="Arial Unicode MS" w:hAnsi="Arial Unicode MS" w:eastAsia="Arial Unicode MS"/>
+          <w:b w:val="0"/>
+          <w:i w:val="0"/>
+        </w:rPr>
+        <w:t>、Web／Worker、</w:t>
+      </w:r>
+      <w:r>
+        <w:rPr>
+          <w:rFonts w:ascii="Arial Unicode MS" w:hAnsi="Arial Unicode MS" w:eastAsia="Arial Unicode MS"/>
+          <w:b w:val="0"/>
+          <w:i w:val="0"/>
+          <w:color w:val="17365D"/>
+          <w:sz w:val="17"/>
+        </w:rPr>
+        <w:t>/api/health</w:t>
+      </w:r>
+      <w:r>
+        <w:rPr>
+          <w:rFonts w:ascii="Arial Unicode MS" w:hAnsi="Arial Unicode MS" w:eastAsia="Arial Unicode MS"/>
+          <w:b w:val="0"/>
+          <w:i w:val="0"/>
+        </w:rPr>
+        <w:t xml:space="preserve"> 均通過。application rollback=</w:t>
+      </w:r>
+      <w:r>
+        <w:rPr>
+          <w:rFonts w:ascii="Arial Unicode MS" w:hAnsi="Arial Unicode MS" w:eastAsia="Arial Unicode MS"/>
+          <w:b w:val="0"/>
+          <w:i w:val="0"/>
+          <w:color w:val="17365D"/>
+          <w:sz w:val="17"/>
+        </w:rPr>
+        <w:t>33f6e41</w:t>
+      </w:r>
+      <w:r>
+        <w:rPr>
+          <w:rFonts w:ascii="Arial Unicode MS" w:hAnsi="Arial Unicode MS" w:eastAsia="Arial Unicode MS"/>
+          <w:b w:val="0"/>
+          <w:i w:val="0"/>
+        </w:rPr>
+        <w:t>，無 migration。</w:t>
+      </w:r>
+    </w:p>
+    <w:p>
       <w:pPr>
         <w:pStyle w:val="ListBullet"/>
       </w:pPr>

</xml_diff>

<commit_message>
feat: allow explicit test password policy
</commit_message>
<xml_diff>
--- a/docs/OMNICHECK_AI_BUILD_AND_OPERATIONS_GUIDE.docx
+++ b/docs/OMNICHECK_AI_BUILD_AND_OPERATIONS_GUIDE.docx
@@ -22388,6 +22388,34 @@
           <w:b w:val="0"/>
           <w:i w:val="0"/>
         </w:rPr>
+        <w:t xml:space="preserve">密碼政策預設最低 12 碼。僅供測試時可明確設定 </w:t>
+      </w:r>
+      <w:r>
+        <w:rPr>
+          <w:rFonts w:ascii="Arial Unicode MS" w:hAnsi="Arial Unicode MS" w:eastAsia="Arial Unicode MS"/>
+          <w:b w:val="0"/>
+          <w:i w:val="0"/>
+          <w:color w:val="17365D"/>
+          <w:sz w:val="17"/>
+        </w:rPr>
+        <w:t>OMNICHECK_AUTH_MIN_PASSWORD_LENGTH=1</w:t>
+      </w:r>
+      <w:r>
+        <w:rPr>
+          <w:rFonts w:ascii="Arial Unicode MS" w:hAnsi="Arial Unicode MS" w:eastAsia="Arial Unicode MS"/>
+          <w:b w:val="0"/>
+          <w:i w:val="0"/>
+        </w:rPr>
+        <w:t>；正式環境不得設定此值，應移除設定並要求所有帳號換成高強度密碼。</w:t>
+      </w:r>
+    </w:p>
+    <w:p>
+      <w:r>
+        <w:rPr>
+          <w:rFonts w:ascii="Arial Unicode MS" w:hAnsi="Arial Unicode MS" w:eastAsia="Arial Unicode MS"/>
+          <w:b w:val="0"/>
+          <w:i w:val="0"/>
+        </w:rPr>
         <w:t xml:space="preserve">公司部署紀錄（2026-08-14）：release </w:t>
       </w:r>
       <w:r>

</xml_diff>

<commit_message>
docs: record M11 login test handover
</commit_message>
<xml_diff>
--- a/docs/OMNICHECK_AI_BUILD_AND_OPERATIONS_GUIDE.docx
+++ b/docs/OMNICHECK_AI_BUILD_AND_OPERATIONS_GUIDE.docx
@@ -22492,6 +22492,160 @@
       </w:r>
     </w:p>
     <w:p>
+      <w:r>
+        <w:rPr>
+          <w:rFonts w:ascii="Arial Unicode MS" w:hAnsi="Arial Unicode MS" w:eastAsia="Arial Unicode MS"/>
+          <w:b w:val="0"/>
+          <w:i w:val="0"/>
+        </w:rPr>
+        <w:t xml:space="preserve">公司登入測試紀錄（2026-08-14）：release </w:t>
+      </w:r>
+      <w:r>
+        <w:rPr>
+          <w:rFonts w:ascii="Arial Unicode MS" w:hAnsi="Arial Unicode MS" w:eastAsia="Arial Unicode MS"/>
+          <w:b w:val="0"/>
+          <w:i w:val="0"/>
+          <w:color w:val="17365D"/>
+          <w:sz w:val="17"/>
+        </w:rPr>
+        <w:t>3cec743</w:t>
+      </w:r>
+      <w:r>
+        <w:rPr>
+          <w:rFonts w:ascii="Arial Unicode MS" w:hAnsi="Arial Unicode MS" w:eastAsia="Arial Unicode MS"/>
+          <w:b w:val="0"/>
+          <w:i w:val="0"/>
+        </w:rPr>
+        <w:t xml:space="preserve"> 已啟用登入；舊 </w:t>
+      </w:r>
+      <w:r>
+        <w:rPr>
+          <w:rFonts w:ascii="Arial Unicode MS" w:hAnsi="Arial Unicode MS" w:eastAsia="Arial Unicode MS"/>
+          <w:b w:val="0"/>
+          <w:i w:val="0"/>
+          <w:color w:val="17365D"/>
+          <w:sz w:val="17"/>
+        </w:rPr>
+        <w:t>omnicheck-admin</w:t>
+      </w:r>
+      <w:r>
+        <w:rPr>
+          <w:rFonts w:ascii="Arial Unicode MS" w:hAnsi="Arial Unicode MS" w:eastAsia="Arial Unicode MS"/>
+          <w:b w:val="0"/>
+          <w:i w:val="0"/>
+        </w:rPr>
+        <w:t xml:space="preserve"> 已停用但保留，</w:t>
+      </w:r>
+      <w:r>
+        <w:rPr>
+          <w:rFonts w:ascii="Arial Unicode MS" w:hAnsi="Arial Unicode MS" w:eastAsia="Arial Unicode MS"/>
+          <w:b w:val="0"/>
+          <w:i w:val="0"/>
+          <w:color w:val="17365D"/>
+          <w:sz w:val="17"/>
+        </w:rPr>
+        <w:t>victor</w:t>
+      </w:r>
+      <w:r>
+        <w:rPr>
+          <w:rFonts w:ascii="Arial Unicode MS" w:hAnsi="Arial Unicode MS" w:eastAsia="Arial Unicode MS"/>
+          <w:b w:val="0"/>
+          <w:i w:val="0"/>
+        </w:rPr>
+        <w:t xml:space="preserve"> 為唯一 active platform admin。實測登入 API 回 200、</w:t>
+      </w:r>
+      <w:r>
+        <w:rPr>
+          <w:rFonts w:ascii="Arial Unicode MS" w:hAnsi="Arial Unicode MS" w:eastAsia="Arial Unicode MS"/>
+          <w:b w:val="0"/>
+          <w:i w:val="0"/>
+          <w:color w:val="17365D"/>
+          <w:sz w:val="17"/>
+        </w:rPr>
+        <w:t>/api/auth/me</w:t>
+      </w:r>
+      <w:r>
+        <w:rPr>
+          <w:rFonts w:ascii="Arial Unicode MS" w:hAnsi="Arial Unicode MS" w:eastAsia="Arial Unicode MS"/>
+          <w:b w:val="0"/>
+          <w:i w:val="0"/>
+        </w:rPr>
+        <w:t xml:space="preserve"> 確認 platform admin、未登入 </w:t>
+      </w:r>
+      <w:r>
+        <w:rPr>
+          <w:rFonts w:ascii="Arial Unicode MS" w:hAnsi="Arial Unicode MS" w:eastAsia="Arial Unicode MS"/>
+          <w:b w:val="0"/>
+          <w:i w:val="0"/>
+          <w:color w:val="17365D"/>
+          <w:sz w:val="17"/>
+        </w:rPr>
+        <w:t>/api/jobs</w:t>
+      </w:r>
+      <w:r>
+        <w:rPr>
+          <w:rFonts w:ascii="Arial Unicode MS" w:hAnsi="Arial Unicode MS" w:eastAsia="Arial Unicode MS"/>
+          <w:b w:val="0"/>
+          <w:i w:val="0"/>
+        </w:rPr>
+        <w:t xml:space="preserve"> 回 401。此環境暫時為 HTTP 測試模式：</w:t>
+      </w:r>
+      <w:r>
+        <w:rPr>
+          <w:rFonts w:ascii="Arial Unicode MS" w:hAnsi="Arial Unicode MS" w:eastAsia="Arial Unicode MS"/>
+          <w:b w:val="0"/>
+          <w:i w:val="0"/>
+          <w:color w:val="17365D"/>
+          <w:sz w:val="17"/>
+        </w:rPr>
+        <w:t>OMNICHECK_AUTH_MIN_PASSWORD_LENGTH=1</w:t>
+      </w:r>
+      <w:r>
+        <w:rPr>
+          <w:rFonts w:ascii="Arial Unicode MS" w:hAnsi="Arial Unicode MS" w:eastAsia="Arial Unicode MS"/>
+          <w:b w:val="0"/>
+          <w:i w:val="0"/>
+        </w:rPr>
+        <w:t>、</w:t>
+      </w:r>
+      <w:r>
+        <w:rPr>
+          <w:rFonts w:ascii="Arial Unicode MS" w:hAnsi="Arial Unicode MS" w:eastAsia="Arial Unicode MS"/>
+          <w:b w:val="0"/>
+          <w:i w:val="0"/>
+          <w:color w:val="17365D"/>
+          <w:sz w:val="17"/>
+        </w:rPr>
+        <w:t>OMNICHECK_AUTH_COOKIE_SECURE=false</w:t>
+      </w:r>
+      <w:r>
+        <w:rPr>
+          <w:rFonts w:ascii="Arial Unicode MS" w:hAnsi="Arial Unicode MS" w:eastAsia="Arial Unicode MS"/>
+          <w:b w:val="0"/>
+          <w:i w:val="0"/>
+        </w:rPr>
+        <w:t>；正式上線前必須移除弱密碼例外、強制更換測試密碼，並在 HTTPS reverse proxy 啟用 secure cookie。application rollback=</w:t>
+      </w:r>
+      <w:r>
+        <w:rPr>
+          <w:rFonts w:ascii="Arial Unicode MS" w:hAnsi="Arial Unicode MS" w:eastAsia="Arial Unicode MS"/>
+          <w:b w:val="0"/>
+          <w:i w:val="0"/>
+          <w:color w:val="17365D"/>
+          <w:sz w:val="17"/>
+        </w:rPr>
+        <w:t>b1de455</w:t>
+      </w:r>
+      <w:r>
+        <w:rPr>
+          <w:rFonts w:ascii="Arial Unicode MS" w:hAnsi="Arial Unicode MS" w:eastAsia="Arial Unicode MS"/>
+          <w:b w:val="0"/>
+          <w:i w:val="0"/>
+        </w:rPr>
+        <w:t>；無 migration。</w:t>
+      </w:r>
+    </w:p>
+    <w:p>
       <w:pPr>
         <w:pStyle w:val="ListBullet"/>
       </w:pPr>

</xml_diff>

<commit_message>
fix: provision admin job scope on demand
</commit_message>
<xml_diff>
--- a/docs/OMNICHECK_AI_BUILD_AND_OPERATIONS_GUIDE.docx
+++ b/docs/OMNICHECK_AI_BUILD_AND_OPERATIONS_GUIDE.docx
@@ -22388,6 +22388,16 @@
           <w:b w:val="0"/>
           <w:i w:val="0"/>
         </w:rPr>
+        <w:t>平台管理者第一次輸入尚未建立的 Customer/System 時，Web 可自動且冪等建立範圍；Traditional Chinese 名稱以 SHA-256 衍生 tenant/system internal key。此行為僅限 platform admin；一般 engineer、reviewer、viewer 仍只能存取被授權的既有 Customer 範圍。</w:t>
+      </w:r>
+    </w:p>
+    <w:p>
+      <w:r>
+        <w:rPr>
+          <w:rFonts w:ascii="Arial Unicode MS" w:hAnsi="Arial Unicode MS" w:eastAsia="Arial Unicode MS"/>
+          <w:b w:val="0"/>
+          <w:i w:val="0"/>
+        </w:rPr>
         <w:t xml:space="preserve">密碼政策預設最低 12 碼。僅供測試時可明確設定 </w:t>
       </w:r>
       <w:r>

</xml_diff>

<commit_message>
docs: record admin scope provisioning deployment
</commit_message>
<xml_diff>
--- a/docs/OMNICHECK_AI_BUILD_AND_OPERATIONS_GUIDE.docx
+++ b/docs/OMNICHECK_AI_BUILD_AND_OPERATIONS_GUIDE.docx
@@ -22656,6 +22656,52 @@
       </w:r>
     </w:p>
     <w:p>
+      <w:r>
+        <w:rPr>
+          <w:rFonts w:ascii="Arial Unicode MS" w:hAnsi="Arial Unicode MS" w:eastAsia="Arial Unicode MS"/>
+          <w:b w:val="0"/>
+          <w:i w:val="0"/>
+        </w:rPr>
+        <w:t xml:space="preserve">公司 scope UX 修正部署（2026-08-14）：release </w:t>
+      </w:r>
+      <w:r>
+        <w:rPr>
+          <w:rFonts w:ascii="Arial Unicode MS" w:hAnsi="Arial Unicode MS" w:eastAsia="Arial Unicode MS"/>
+          <w:b w:val="0"/>
+          <w:i w:val="0"/>
+          <w:color w:val="17365D"/>
+          <w:sz w:val="17"/>
+        </w:rPr>
+        <w:t>a599a85</w:t>
+      </w:r>
+      <w:r>
+        <w:rPr>
+          <w:rFonts w:ascii="Arial Unicode MS" w:hAnsi="Arial Unicode MS" w:eastAsia="Arial Unicode MS"/>
+          <w:b w:val="0"/>
+          <w:i w:val="0"/>
+        </w:rPr>
+        <w:t>，application rollback=</w:t>
+      </w:r>
+      <w:r>
+        <w:rPr>
+          <w:rFonts w:ascii="Arial Unicode MS" w:hAnsi="Arial Unicode MS" w:eastAsia="Arial Unicode MS"/>
+          <w:b w:val="0"/>
+          <w:i w:val="0"/>
+          <w:color w:val="17365D"/>
+          <w:sz w:val="17"/>
+        </w:rPr>
+        <w:t>3cec743</w:t>
+      </w:r>
+      <w:r>
+        <w:rPr>
+          <w:rFonts w:ascii="Arial Unicode MS" w:hAnsi="Arial Unicode MS" w:eastAsia="Arial Unicode MS"/>
+          <w:b w:val="0"/>
+          <w:i w:val="0"/>
+        </w:rPr>
+        <w:t>；platform admin 首次建立新 Customer/System 的 Job 可自動建立其 EDB scope。Web／Worker／health 與未登入 API 401 均通過；無 migration。</w:t>
+      </w:r>
+    </w:p>
+    <w:p>
       <w:pPr>
         <w:pStyle w:val="ListBullet"/>
       </w:pPr>

</xml_diff>

<commit_message>
docs: fix M11 guide pagination
</commit_message>
<xml_diff>
--- a/docs/OMNICHECK_AI_BUILD_AND_OPERATIONS_GUIDE.docx
+++ b/docs/OMNICHECK_AI_BUILD_AND_OPERATIONS_GUIDE.docx
@@ -844,7 +844,7 @@
                 <w:color w:val="17365D"/>
                 <w:sz w:val="18"/>
               </w:rPr>
-              <w:t>M11 Login／RBAC 啟用手順（預設不啟用）</w:t>
+              <w:t>附錄 B：交付驗收簽核表</w:t>
             </w:r>
           </w:p>
         </w:tc>
@@ -877,26 +877,8 @@
         <w:tc>
           <w:tcPr>
             <w:tcW w:type="dxa" w:w="4939"/>
-            <w:tcMar>
-              <w:top w:w="45" w:type="dxa"/>
-              <w:start w:w="80" w:type="dxa"/>
-              <w:bottom w:w="45" w:type="dxa"/>
-              <w:end w:w="80" w:type="dxa"/>
-            </w:tcMar>
           </w:tcPr>
-          <w:p>
-            <w:pPr>
-              <w:spacing w:after="20"/>
-            </w:pPr>
-            <w:r>
-              <w:rPr>
-                <w:rFonts w:ascii="Arial Unicode MS" w:hAnsi="Arial Unicode MS" w:eastAsia="Arial Unicode MS"/>
-                <w:color w:val="17365D"/>
-                <w:sz w:val="18"/>
-              </w:rPr>
-              <w:t>附錄 B：交付驗收簽核表</w:t>
-            </w:r>
-          </w:p>
+          <w:p/>
         </w:tc>
       </w:tr>
     </w:tbl>
@@ -21963,7 +21945,7 @@
     </w:p>
     <w:p>
       <w:pPr>
-        <w:pStyle w:val="Heading2"/>
+        <w:pStyle w:val="Heading3"/>
       </w:pPr>
       <w:r>
         <w:rPr>

</xml_diff>

<commit_message>
fix: discover extensionless database output
</commit_message>
<xml_diff>
--- a/docs/OMNICHECK_AI_BUILD_AND_OPERATIONS_GUIDE.docx
+++ b/docs/OMNICHECK_AI_BUILD_AND_OPERATIONS_GUIDE.docx
@@ -12905,7 +12905,43 @@
           <w:b w:val="0"/>
           <w:i w:val="0"/>
         </w:rPr>
-        <w:t xml:space="preserve">Discovery API 只取文字檔前 512 KiB 作樣本；圖片不解析內容。確認紀錄保存在 </w:t>
+        <w:t xml:space="preserve">Discovery API 對非圖片檔一律只取前 512 KiB 作樣本；此規則包含沒有副檔名的客戶 Database Output，例如 </w:t>
+      </w:r>
+      <w:r>
+        <w:rPr>
+          <w:rFonts w:ascii="Arial Unicode MS" w:hAnsi="Arial Unicode MS" w:eastAsia="Arial Unicode MS"/>
+          <w:b w:val="0"/>
+          <w:i w:val="0"/>
+          <w:color w:val="17365D"/>
+          <w:sz w:val="17"/>
+        </w:rPr>
+        <w:t>db_einvoice_check</w:t>
+      </w:r>
+      <w:r>
+        <w:rPr>
+          <w:rFonts w:ascii="Arial Unicode MS" w:hAnsi="Arial Unicode MS" w:eastAsia="Arial Unicode MS"/>
+          <w:b w:val="0"/>
+          <w:i w:val="0"/>
+        </w:rPr>
+        <w:t xml:space="preserve">。圖片不解析內容。若樣本有資料庫結構標記且已有唯一 Primary，UI 會預填該 Primary 作為來源候選，但仍必須由工程師確認後才寫入 </w:t>
+      </w:r>
+      <w:r>
+        <w:rPr>
+          <w:rFonts w:ascii="Arial Unicode MS" w:hAnsi="Arial Unicode MS" w:eastAsia="Arial Unicode MS"/>
+          <w:b w:val="0"/>
+          <w:i w:val="0"/>
+          <w:color w:val="17365D"/>
+          <w:sz w:val="17"/>
+        </w:rPr>
+        <w:t>job.yaml.evidence_mappings</w:t>
+      </w:r>
+      <w:r>
+        <w:rPr>
+          <w:rFonts w:ascii="Arial Unicode MS" w:hAnsi="Arial Unicode MS" w:eastAsia="Arial Unicode MS"/>
+          <w:b w:val="0"/>
+          <w:i w:val="0"/>
+        </w:rPr>
+        <w:t xml:space="preserve">；無 Primary、多 Primary、PEM backend 或內容不足時不得自動採用。確認紀錄保存在 </w:t>
       </w:r>
       <w:r>
         <w:rPr>

</xml_diff>

<commit_message>
fix: raise confidence for primary replication evidence
</commit_message>
<xml_diff>
--- a/docs/OMNICHECK_AI_BUILD_AND_OPERATIONS_GUIDE.docx
+++ b/docs/OMNICHECK_AI_BUILD_AND_OPERATIONS_GUIDE.docx
@@ -12923,7 +12923,43 @@
           <w:b w:val="0"/>
           <w:i w:val="0"/>
         </w:rPr>
-        <w:t xml:space="preserve">。圖片不解析內容。若樣本有資料庫結構標記且已有唯一 Primary，UI 會預填該 Primary 作為來源候選，但仍必須由工程師確認後才寫入 </w:t>
+        <w:t xml:space="preserve">。圖片不解析內容。若樣本有資料庫結構標記且已有唯一 Primary，UI 會預填該 Primary 作為來源候選；若同時偵測到 </w:t>
+      </w:r>
+      <w:r>
+        <w:rPr>
+          <w:rFonts w:ascii="Arial Unicode MS" w:hAnsi="Arial Unicode MS" w:eastAsia="Arial Unicode MS"/>
+          <w:b w:val="0"/>
+          <w:i w:val="0"/>
+          <w:color w:val="17365D"/>
+          <w:sz w:val="17"/>
+        </w:rPr>
+        <w:t>pg_stat_replication</w:t>
+      </w:r>
+      <w:r>
+        <w:rPr>
+          <w:rFonts w:ascii="Arial Unicode MS" w:hAnsi="Arial Unicode MS" w:eastAsia="Arial Unicode MS"/>
+          <w:b w:val="0"/>
+          <w:i w:val="0"/>
+        </w:rPr>
+        <w:t xml:space="preserve"> 類型區段中有 </w:t>
+      </w:r>
+      <w:r>
+        <w:rPr>
+          <w:rFonts w:ascii="Arial Unicode MS" w:hAnsi="Arial Unicode MS" w:eastAsia="Arial Unicode MS"/>
+          <w:b w:val="0"/>
+          <w:i w:val="0"/>
+          <w:color w:val="17365D"/>
+          <w:sz w:val="17"/>
+        </w:rPr>
+        <w:t>walreceiver streaming</w:t>
+      </w:r>
+      <w:r>
+        <w:rPr>
+          <w:rFonts w:ascii="Arial Unicode MS" w:hAnsi="Arial Unicode MS" w:eastAsia="Arial Unicode MS"/>
+          <w:b w:val="0"/>
+          <w:i w:val="0"/>
+        </w:rPr>
+        <w:t xml:space="preserve"> 資料列，候選為高信心，因為這是 Primary 對複本回報的 replication evidence。上述所有情況仍必須由工程師確認後才寫入 </w:t>
       </w:r>
       <w:r>
         <w:rPr>

</xml_diff>

<commit_message>
docs: record extensionless output deployment
</commit_message>
<xml_diff>
--- a/docs/OMNICHECK_AI_BUILD_AND_OPERATIONS_GUIDE.docx
+++ b/docs/OMNICHECK_AI_BUILD_AND_OPERATIONS_GUIDE.docx
@@ -22756,6 +22756,178 @@
       </w:r>
     </w:p>
     <w:p>
+      <w:r>
+        <w:rPr>
+          <w:rFonts w:ascii="Arial Unicode MS" w:hAnsi="Arial Unicode MS" w:eastAsia="Arial Unicode MS"/>
+          <w:b w:val="0"/>
+          <w:i w:val="0"/>
+        </w:rPr>
+        <w:t xml:space="preserve">無副檔名 Database Output 修正部署（2026-09-03）：release </w:t>
+      </w:r>
+      <w:r>
+        <w:rPr>
+          <w:rFonts w:ascii="Arial Unicode MS" w:hAnsi="Arial Unicode MS" w:eastAsia="Arial Unicode MS"/>
+          <w:b w:val="0"/>
+          <w:i w:val="0"/>
+          <w:color w:val="17365D"/>
+          <w:sz w:val="17"/>
+        </w:rPr>
+        <w:t>dff0524</w:t>
+      </w:r>
+      <w:r>
+        <w:rPr>
+          <w:rFonts w:ascii="Arial Unicode MS" w:hAnsi="Arial Unicode MS" w:eastAsia="Arial Unicode MS"/>
+          <w:b w:val="0"/>
+          <w:i w:val="0"/>
+        </w:rPr>
+        <w:t>，application rollback=</w:t>
+      </w:r>
+      <w:r>
+        <w:rPr>
+          <w:rFonts w:ascii="Arial Unicode MS" w:hAnsi="Arial Unicode MS" w:eastAsia="Arial Unicode MS"/>
+          <w:b w:val="0"/>
+          <w:i w:val="0"/>
+          <w:color w:val="17365D"/>
+          <w:sz w:val="17"/>
+        </w:rPr>
+        <w:t>2e148cb</w:t>
+      </w:r>
+      <w:r>
+        <w:rPr>
+          <w:rFonts w:ascii="Arial Unicode MS" w:hAnsi="Arial Unicode MS" w:eastAsia="Arial Unicode MS"/>
+          <w:b w:val="0"/>
+          <w:i w:val="0"/>
+        </w:rPr>
+        <w:t xml:space="preserve">，無 migration。Discovery 對非圖片檔讀取前 512 KiB，可辨識 </w:t>
+      </w:r>
+      <w:r>
+        <w:rPr>
+          <w:rFonts w:ascii="Arial Unicode MS" w:hAnsi="Arial Unicode MS" w:eastAsia="Arial Unicode MS"/>
+          <w:b w:val="0"/>
+          <w:i w:val="0"/>
+          <w:color w:val="17365D"/>
+          <w:sz w:val="17"/>
+        </w:rPr>
+        <w:t>db_einvoice_check</w:t>
+      </w:r>
+      <w:r>
+        <w:rPr>
+          <w:rFonts w:ascii="Arial Unicode MS" w:hAnsi="Arial Unicode MS" w:eastAsia="Arial Unicode MS"/>
+          <w:b w:val="0"/>
+          <w:i w:val="0"/>
+        </w:rPr>
+        <w:t xml:space="preserve"> 類型無副檔名 Database Output；</w:t>
+      </w:r>
+      <w:r>
+        <w:rPr>
+          <w:rFonts w:ascii="Arial Unicode MS" w:hAnsi="Arial Unicode MS" w:eastAsia="Arial Unicode MS"/>
+          <w:b w:val="0"/>
+          <w:i w:val="0"/>
+          <w:color w:val="17365D"/>
+          <w:sz w:val="17"/>
+        </w:rPr>
+        <w:t>pg_stat_replication</w:t>
+      </w:r>
+      <w:r>
+        <w:rPr>
+          <w:rFonts w:ascii="Arial Unicode MS" w:hAnsi="Arial Unicode MS" w:eastAsia="Arial Unicode MS"/>
+          <w:b w:val="0"/>
+          <w:i w:val="0"/>
+        </w:rPr>
+        <w:t xml:space="preserve"> 類型區段的 </w:t>
+      </w:r>
+      <w:r>
+        <w:rPr>
+          <w:rFonts w:ascii="Arial Unicode MS" w:hAnsi="Arial Unicode MS" w:eastAsia="Arial Unicode MS"/>
+          <w:b w:val="0"/>
+          <w:i w:val="0"/>
+          <w:color w:val="17365D"/>
+          <w:sz w:val="17"/>
+        </w:rPr>
+        <w:t>walreceiver streaming</w:t>
+      </w:r>
+      <w:r>
+        <w:rPr>
+          <w:rFonts w:ascii="Arial Unicode MS" w:hAnsi="Arial Unicode MS" w:eastAsia="Arial Unicode MS"/>
+          <w:b w:val="0"/>
+          <w:i w:val="0"/>
+        </w:rPr>
+        <w:t xml:space="preserve"> 資料列會對唯一 Primary 提出高信心候選，但仍需工程師確認 mapping。汎宇唯讀 Job </w:t>
+      </w:r>
+      <w:r>
+        <w:rPr>
+          <w:rFonts w:ascii="Arial Unicode MS" w:hAnsi="Arial Unicode MS" w:eastAsia="Arial Unicode MS"/>
+          <w:b w:val="0"/>
+          <w:i w:val="0"/>
+          <w:color w:val="17365D"/>
+          <w:sz w:val="17"/>
+        </w:rPr>
+        <w:t>1078412ae8b14b32a1e85962a7956551</w:t>
+      </w:r>
+      <w:r>
+        <w:rPr>
+          <w:rFonts w:ascii="Arial Unicode MS" w:hAnsi="Arial Unicode MS" w:eastAsia="Arial Unicode MS"/>
+          <w:b w:val="0"/>
+          <w:i w:val="0"/>
+        </w:rPr>
+        <w:t xml:space="preserve"> 驗證得到 </w:t>
+      </w:r>
+      <w:r>
+        <w:rPr>
+          <w:rFonts w:ascii="Arial Unicode MS" w:hAnsi="Arial Unicode MS" w:eastAsia="Arial Unicode MS"/>
+          <w:b w:val="0"/>
+          <w:i w:val="0"/>
+          <w:color w:val="17365D"/>
+          <w:sz w:val="17"/>
+        </w:rPr>
+        <w:t>db_einvoice_check → dsc-invdb85</w:t>
+      </w:r>
+      <w:r>
+        <w:rPr>
+          <w:rFonts w:ascii="Arial Unicode MS" w:hAnsi="Arial Unicode MS" w:eastAsia="Arial Unicode MS"/>
+          <w:b w:val="0"/>
+          <w:i w:val="0"/>
+        </w:rPr>
+        <w:t>、</w:t>
+      </w:r>
+      <w:r>
+        <w:rPr>
+          <w:rFonts w:ascii="Arial Unicode MS" w:hAnsi="Arial Unicode MS" w:eastAsia="Arial Unicode MS"/>
+          <w:b w:val="0"/>
+          <w:i w:val="0"/>
+          <w:color w:val="17365D"/>
+          <w:sz w:val="17"/>
+        </w:rPr>
+        <w:t>confidence=high</w:t>
+      </w:r>
+      <w:r>
+        <w:rPr>
+          <w:rFonts w:ascii="Arial Unicode MS" w:hAnsi="Arial Unicode MS" w:eastAsia="Arial Unicode MS"/>
+          <w:b w:val="0"/>
+          <w:i w:val="0"/>
+        </w:rPr>
+        <w:t>、</w:t>
+      </w:r>
+      <w:r>
+        <w:rPr>
+          <w:rFonts w:ascii="Arial Unicode MS" w:hAnsi="Arial Unicode MS" w:eastAsia="Arial Unicode MS"/>
+          <w:b w:val="0"/>
+          <w:i w:val="0"/>
+          <w:color w:val="17365D"/>
+          <w:sz w:val="17"/>
+        </w:rPr>
+        <w:t>can_confirm=true</w:t>
+      </w:r>
+      <w:r>
+        <w:rPr>
+          <w:rFonts w:ascii="Arial Unicode MS" w:hAnsi="Arial Unicode MS" w:eastAsia="Arial Unicode MS"/>
+          <w:b w:val="0"/>
+          <w:i w:val="0"/>
+        </w:rPr>
+        <w:t>；Web／Worker／health 通過。公司 VM 隔離目標測試 26 項通過；完整測試應先解除公司即時 EDB／Ollama 環境變數，以避免測試繼承外部服務設定。</w:t>
+      </w:r>
+    </w:p>
+    <w:p>
       <w:pPr>
         <w:pStyle w:val="ListBullet"/>
       </w:pPr>

</xml_diff>

<commit_message>
feat: schedule official CVE cache sync
</commit_message>
<xml_diff>
--- a/docs/OMNICHECK_AI_BUILD_AND_OPERATIONS_GUIDE.docx
+++ b/docs/OMNICHECK_AI_BUILD_AND_OPERATIONS_GUIDE.docx
@@ -22928,6 +22928,160 @@
       </w:r>
     </w:p>
     <w:p>
+      <w:r>
+        <w:rPr>
+          <w:rFonts w:ascii="Arial Unicode MS" w:hAnsi="Arial Unicode MS" w:eastAsia="Arial Unicode MS"/>
+          <w:b w:val="0"/>
+          <w:i w:val="0"/>
+        </w:rPr>
+        <w:t xml:space="preserve">CVE Cache 排程（2026-09-03）：安裝 </w:t>
+      </w:r>
+      <w:r>
+        <w:rPr>
+          <w:rFonts w:ascii="Arial Unicode MS" w:hAnsi="Arial Unicode MS" w:eastAsia="Arial Unicode MS"/>
+          <w:b w:val="0"/>
+          <w:i w:val="0"/>
+          <w:color w:val="17365D"/>
+          <w:sz w:val="17"/>
+        </w:rPr>
+        <w:t>omnicheck-cve-sync.service</w:t>
+      </w:r>
+      <w:r>
+        <w:rPr>
+          <w:rFonts w:ascii="Arial Unicode MS" w:hAnsi="Arial Unicode MS" w:eastAsia="Arial Unicode MS"/>
+          <w:b w:val="0"/>
+          <w:i w:val="0"/>
+        </w:rPr>
+        <w:t xml:space="preserve"> 與 </w:t>
+      </w:r>
+      <w:r>
+        <w:rPr>
+          <w:rFonts w:ascii="Arial Unicode MS" w:hAnsi="Arial Unicode MS" w:eastAsia="Arial Unicode MS"/>
+          <w:b w:val="0"/>
+          <w:i w:val="0"/>
+          <w:color w:val="17365D"/>
+          <w:sz w:val="17"/>
+        </w:rPr>
+        <w:t>omnicheck-cve-sync.timer</w:t>
+      </w:r>
+      <w:r>
+        <w:rPr>
+          <w:rFonts w:ascii="Arial Unicode MS" w:hAnsi="Arial Unicode MS" w:eastAsia="Arial Unicode MS"/>
+          <w:b w:val="0"/>
+          <w:i w:val="0"/>
+        </w:rPr>
+        <w:t>；每日 02:15 Asia/Taipei 執行並隨機延遲最多 15 分鐘，</w:t>
+      </w:r>
+      <w:r>
+        <w:rPr>
+          <w:rFonts w:ascii="Arial Unicode MS" w:hAnsi="Arial Unicode MS" w:eastAsia="Arial Unicode MS"/>
+          <w:b w:val="0"/>
+          <w:i w:val="0"/>
+          <w:color w:val="17365D"/>
+          <w:sz w:val="17"/>
+        </w:rPr>
+        <w:t>Persistent=true</w:t>
+      </w:r>
+      <w:r>
+        <w:rPr>
+          <w:rFonts w:ascii="Arial Unicode MS" w:hAnsi="Arial Unicode MS" w:eastAsia="Arial Unicode MS"/>
+          <w:b w:val="0"/>
+          <w:i w:val="0"/>
+        </w:rPr>
+        <w:t xml:space="preserve"> 會在停機後補跑。service 以 </w:t>
+      </w:r>
+      <w:r>
+        <w:rPr>
+          <w:rFonts w:ascii="Arial Unicode MS" w:hAnsi="Arial Unicode MS" w:eastAsia="Arial Unicode MS"/>
+          <w:b w:val="0"/>
+          <w:i w:val="0"/>
+          <w:color w:val="17365D"/>
+          <w:sz w:val="17"/>
+        </w:rPr>
+        <w:t>omnicheck</w:t>
+      </w:r>
+      <w:r>
+        <w:rPr>
+          <w:rFonts w:ascii="Arial Unicode MS" w:hAnsi="Arial Unicode MS" w:eastAsia="Arial Unicode MS"/>
+          <w:b w:val="0"/>
+          <w:i w:val="0"/>
+        </w:rPr>
+        <w:t xml:space="preserve"> 使用者執行 </w:t>
+      </w:r>
+      <w:r>
+        <w:rPr>
+          <w:rFonts w:ascii="Arial Unicode MS" w:hAnsi="Arial Unicode MS" w:eastAsia="Arial Unicode MS"/>
+          <w:b w:val="0"/>
+          <w:i w:val="0"/>
+          <w:color w:val="17365D"/>
+          <w:sz w:val="17"/>
+        </w:rPr>
+        <w:t>deploy/cve-sync.sh</w:t>
+      </w:r>
+      <w:r>
+        <w:rPr>
+          <w:rFonts w:ascii="Arial Unicode MS" w:hAnsi="Arial Unicode MS" w:eastAsia="Arial Unicode MS"/>
+          <w:b w:val="0"/>
+          <w:i w:val="0"/>
+        </w:rPr>
+        <w:t xml:space="preserve">，固定同步 PostgreSQL Release、PostgreSQL Security 與 EDB EPAS Advisory，並將每次原始 JSON snapshot 以 UTC timestamp 寫入 </w:t>
+      </w:r>
+      <w:r>
+        <w:rPr>
+          <w:rFonts w:ascii="Arial Unicode MS" w:hAnsi="Arial Unicode MS" w:eastAsia="Arial Unicode MS"/>
+          <w:b w:val="0"/>
+          <w:i w:val="0"/>
+          <w:color w:val="17365D"/>
+          <w:sz w:val="17"/>
+        </w:rPr>
+        <w:t>/data/omnicheck/archive/cve</w:t>
+      </w:r>
+      <w:r>
+        <w:rPr>
+          <w:rFonts w:ascii="Arial Unicode MS" w:hAnsi="Arial Unicode MS" w:eastAsia="Arial Unicode MS"/>
+          <w:b w:val="0"/>
+          <w:i w:val="0"/>
+        </w:rPr>
+        <w:t xml:space="preserve">。先 </w:t>
+      </w:r>
+      <w:r>
+        <w:rPr>
+          <w:rFonts w:ascii="Arial Unicode MS" w:hAnsi="Arial Unicode MS" w:eastAsia="Arial Unicode MS"/>
+          <w:b w:val="0"/>
+          <w:i w:val="0"/>
+          <w:color w:val="17365D"/>
+          <w:sz w:val="17"/>
+        </w:rPr>
+        <w:t>systemctl start omnicheck-cve-sync.service</w:t>
+      </w:r>
+      <w:r>
+        <w:rPr>
+          <w:rFonts w:ascii="Arial Unicode MS" w:hAnsi="Arial Unicode MS" w:eastAsia="Arial Unicode MS"/>
+          <w:b w:val="0"/>
+          <w:i w:val="0"/>
+        </w:rPr>
+        <w:t xml:space="preserve"> 完成初次同步與快取新鮮度驗證，才可 </w:t>
+      </w:r>
+      <w:r>
+        <w:rPr>
+          <w:rFonts w:ascii="Arial Unicode MS" w:hAnsi="Arial Unicode MS" w:eastAsia="Arial Unicode MS"/>
+          <w:b w:val="0"/>
+          <w:i w:val="0"/>
+          <w:color w:val="17365D"/>
+          <w:sz w:val="17"/>
+        </w:rPr>
+        <w:t>enable --now</w:t>
+      </w:r>
+      <w:r>
+        <w:rPr>
+          <w:rFonts w:ascii="Arial Unicode MS" w:hAnsi="Arial Unicode MS" w:eastAsia="Arial Unicode MS"/>
+          <w:b w:val="0"/>
+          <w:i w:val="0"/>
+        </w:rPr>
+        <w:t xml:space="preserve"> timer。NVD CVSS/CWE 為逐筆補強，不納入此 timer；報告 Worker 不得連外。</w:t>
+      </w:r>
+    </w:p>
+    <w:p>
       <w:pPr>
         <w:pStyle w:val="ListBullet"/>
       </w:pPr>

</xml_diff>

<commit_message>
docs: record production CVE timer validation
</commit_message>
<xml_diff>
--- a/docs/OMNICHECK_AI_BUILD_AND_OPERATIONS_GUIDE.docx
+++ b/docs/OMNICHECK_AI_BUILD_AND_OPERATIONS_GUIDE.docx
@@ -23082,6 +23082,88 @@
       </w:r>
     </w:p>
     <w:p>
+      <w:r>
+        <w:rPr>
+          <w:rFonts w:ascii="Arial Unicode MS" w:hAnsi="Arial Unicode MS" w:eastAsia="Arial Unicode MS"/>
+          <w:b w:val="0"/>
+          <w:i w:val="0"/>
+        </w:rPr>
+        <w:t xml:space="preserve">實機狀態（2026-09-03 17:50 Asia/Taipei）：首次手動同步已成功完成（PostgreSQL Release 5、PostgreSQL Security CVE 190、EDB EPAS Advisory 11），timer 已 </w:t>
+      </w:r>
+      <w:r>
+        <w:rPr>
+          <w:rFonts w:ascii="Arial Unicode MS" w:hAnsi="Arial Unicode MS" w:eastAsia="Arial Unicode MS"/>
+          <w:b w:val="0"/>
+          <w:i w:val="0"/>
+          <w:color w:val="17365D"/>
+          <w:sz w:val="17"/>
+        </w:rPr>
+        <w:t>enabled</w:t>
+      </w:r>
+      <w:r>
+        <w:rPr>
+          <w:rFonts w:ascii="Arial Unicode MS" w:hAnsi="Arial Unicode MS" w:eastAsia="Arial Unicode MS"/>
+          <w:b w:val="0"/>
+          <w:i w:val="0"/>
+        </w:rPr>
+        <w:t xml:space="preserve"> 且 </w:t>
+      </w:r>
+      <w:r>
+        <w:rPr>
+          <w:rFonts w:ascii="Arial Unicode MS" w:hAnsi="Arial Unicode MS" w:eastAsia="Arial Unicode MS"/>
+          <w:b w:val="0"/>
+          <w:i w:val="0"/>
+          <w:color w:val="17365D"/>
+          <w:sz w:val="17"/>
+        </w:rPr>
+        <w:t>active</w:t>
+      </w:r>
+      <w:r>
+        <w:rPr>
+          <w:rFonts w:ascii="Arial Unicode MS" w:hAnsi="Arial Unicode MS" w:eastAsia="Arial Unicode MS"/>
+          <w:b w:val="0"/>
+          <w:i w:val="0"/>
+        </w:rPr>
+        <w:t xml:space="preserve">。oneshot service 成功後顯示 </w:t>
+      </w:r>
+      <w:r>
+        <w:rPr>
+          <w:rFonts w:ascii="Arial Unicode MS" w:hAnsi="Arial Unicode MS" w:eastAsia="Arial Unicode MS"/>
+          <w:b w:val="0"/>
+          <w:i w:val="0"/>
+          <w:color w:val="17365D"/>
+          <w:sz w:val="17"/>
+        </w:rPr>
+        <w:t>inactive (dead)</w:t>
+      </w:r>
+      <w:r>
+        <w:rPr>
+          <w:rFonts w:ascii="Arial Unicode MS" w:hAnsi="Arial Unicode MS" w:eastAsia="Arial Unicode MS"/>
+          <w:b w:val="0"/>
+          <w:i w:val="0"/>
+        </w:rPr>
+        <w:t xml:space="preserve"> 屬預期行為；請以 </w:t>
+      </w:r>
+      <w:r>
+        <w:rPr>
+          <w:rFonts w:ascii="Arial Unicode MS" w:hAnsi="Arial Unicode MS" w:eastAsia="Arial Unicode MS"/>
+          <w:b w:val="0"/>
+          <w:i w:val="0"/>
+          <w:color w:val="17365D"/>
+          <w:sz w:val="17"/>
+        </w:rPr>
+        <w:t>systemctl list-timers omnicheck-cve-sync.timer --all</w:t>
+      </w:r>
+      <w:r>
+        <w:rPr>
+          <w:rFonts w:ascii="Arial Unicode MS" w:hAnsi="Arial Unicode MS" w:eastAsia="Arial Unicode MS"/>
+          <w:b w:val="0"/>
+          <w:i w:val="0"/>
+        </w:rPr>
+        <w:t xml:space="preserve"> 查閱下一次執行時間。</w:t>
+      </w:r>
+    </w:p>
+    <w:p>
       <w:pPr>
         <w:pStyle w:val="ListBullet"/>
       </w:pPr>

</xml_diff>

<commit_message>
feat: map sole database output to primary
</commit_message>
<xml_diff>
--- a/docs/OMNICHECK_AI_BUILD_AND_OPERATIONS_GUIDE.docx
+++ b/docs/OMNICHECK_AI_BUILD_AND_OPERATIONS_GUIDE.docx
@@ -13122,6 +13122,178 @@
           <w:rFonts w:ascii="Arial Unicode MS" w:hAnsi="Arial Unicode MS" w:eastAsia="Arial Unicode MS"/>
           <w:b w:val="0"/>
           <w:i w:val="0"/>
+        </w:rPr>
+        <w:t xml:space="preserve">單一輸出例外：整個案件只有一份 Database logical output，且其節點無法由路徑或內容解析時，Scope Controller 可將其確定性映射到已確認 Primary，並記錄 </w:t>
+      </w:r>
+      <w:r>
+        <w:rPr>
+          <w:rFonts w:ascii="Arial Unicode MS" w:hAnsi="Arial Unicode MS" w:eastAsia="Arial Unicode MS"/>
+          <w:b w:val="0"/>
+          <w:i w:val="0"/>
+          <w:color w:val="17365D"/>
+          <w:sz w:val="17"/>
+        </w:rPr>
+        <w:t>policy.single_database_output_defaults_to_primary</w:t>
+      </w:r>
+      <w:r>
+        <w:rPr>
+          <w:rFonts w:ascii="Arial Unicode MS" w:hAnsi="Arial Unicode MS" w:eastAsia="Arial Unicode MS"/>
+          <w:b w:val="0"/>
+          <w:i w:val="0"/>
+        </w:rPr>
+        <w:t>。若存在兩份以上 Database output，或來源已明確屬於 Standby／DR／Witness，則不得套用例外、仍須人工確認。所有受支援的圖片副檔名（</w:t>
+      </w:r>
+      <w:r>
+        <w:rPr>
+          <w:rFonts w:ascii="Arial Unicode MS" w:hAnsi="Arial Unicode MS" w:eastAsia="Arial Unicode MS"/>
+          <w:b w:val="0"/>
+          <w:i w:val="0"/>
+          <w:color w:val="17365D"/>
+          <w:sz w:val="17"/>
+        </w:rPr>
+        <w:t>.png</w:t>
+      </w:r>
+      <w:r>
+        <w:rPr>
+          <w:rFonts w:ascii="Arial Unicode MS" w:hAnsi="Arial Unicode MS" w:eastAsia="Arial Unicode MS"/>
+          <w:b w:val="0"/>
+          <w:i w:val="0"/>
+        </w:rPr>
+        <w:t>、</w:t>
+      </w:r>
+      <w:r>
+        <w:rPr>
+          <w:rFonts w:ascii="Arial Unicode MS" w:hAnsi="Arial Unicode MS" w:eastAsia="Arial Unicode MS"/>
+          <w:b w:val="0"/>
+          <w:i w:val="0"/>
+          <w:color w:val="17365D"/>
+          <w:sz w:val="17"/>
+        </w:rPr>
+        <w:t>.jpg</w:t>
+      </w:r>
+      <w:r>
+        <w:rPr>
+          <w:rFonts w:ascii="Arial Unicode MS" w:hAnsi="Arial Unicode MS" w:eastAsia="Arial Unicode MS"/>
+          <w:b w:val="0"/>
+          <w:i w:val="0"/>
+        </w:rPr>
+        <w:t>、</w:t>
+      </w:r>
+      <w:r>
+        <w:rPr>
+          <w:rFonts w:ascii="Arial Unicode MS" w:hAnsi="Arial Unicode MS" w:eastAsia="Arial Unicode MS"/>
+          <w:b w:val="0"/>
+          <w:i w:val="0"/>
+          <w:color w:val="17365D"/>
+          <w:sz w:val="17"/>
+        </w:rPr>
+        <w:t>.jpeg</w:t>
+      </w:r>
+      <w:r>
+        <w:rPr>
+          <w:rFonts w:ascii="Arial Unicode MS" w:hAnsi="Arial Unicode MS" w:eastAsia="Arial Unicode MS"/>
+          <w:b w:val="0"/>
+          <w:i w:val="0"/>
+        </w:rPr>
+        <w:t>、</w:t>
+      </w:r>
+      <w:r>
+        <w:rPr>
+          <w:rFonts w:ascii="Arial Unicode MS" w:hAnsi="Arial Unicode MS" w:eastAsia="Arial Unicode MS"/>
+          <w:b w:val="0"/>
+          <w:i w:val="0"/>
+          <w:color w:val="17365D"/>
+          <w:sz w:val="17"/>
+        </w:rPr>
+        <w:t>.webp</w:t>
+      </w:r>
+      <w:r>
+        <w:rPr>
+          <w:rFonts w:ascii="Arial Unicode MS" w:hAnsi="Arial Unicode MS" w:eastAsia="Arial Unicode MS"/>
+          <w:b w:val="0"/>
+          <w:i w:val="0"/>
+        </w:rPr>
+        <w:t>、</w:t>
+      </w:r>
+      <w:r>
+        <w:rPr>
+          <w:rFonts w:ascii="Arial Unicode MS" w:hAnsi="Arial Unicode MS" w:eastAsia="Arial Unicode MS"/>
+          <w:b w:val="0"/>
+          <w:i w:val="0"/>
+          <w:color w:val="17365D"/>
+          <w:sz w:val="17"/>
+        </w:rPr>
+        <w:t>.tif</w:t>
+      </w:r>
+      <w:r>
+        <w:rPr>
+          <w:rFonts w:ascii="Arial Unicode MS" w:hAnsi="Arial Unicode MS" w:eastAsia="Arial Unicode MS"/>
+          <w:b w:val="0"/>
+          <w:i w:val="0"/>
+        </w:rPr>
+        <w:t>、</w:t>
+      </w:r>
+      <w:r>
+        <w:rPr>
+          <w:rFonts w:ascii="Arial Unicode MS" w:hAnsi="Arial Unicode MS" w:eastAsia="Arial Unicode MS"/>
+          <w:b w:val="0"/>
+          <w:i w:val="0"/>
+          <w:color w:val="17365D"/>
+          <w:sz w:val="17"/>
+        </w:rPr>
+        <w:t>.tiff</w:t>
+      </w:r>
+      <w:r>
+        <w:rPr>
+          <w:rFonts w:ascii="Arial Unicode MS" w:hAnsi="Arial Unicode MS" w:eastAsia="Arial Unicode MS"/>
+          <w:b w:val="0"/>
+          <w:i w:val="0"/>
+        </w:rPr>
+        <w:t xml:space="preserve">）均為 monitoring evidence；即使檔名是 </w:t>
+      </w:r>
+      <w:r>
+        <w:rPr>
+          <w:rFonts w:ascii="Arial Unicode MS" w:hAnsi="Arial Unicode MS" w:eastAsia="Arial Unicode MS"/>
+          <w:b w:val="0"/>
+          <w:i w:val="0"/>
+          <w:color w:val="17365D"/>
+          <w:sz w:val="17"/>
+        </w:rPr>
+        <w:t>Database Size.jpeg</w:t>
+      </w:r>
+      <w:r>
+        <w:rPr>
+          <w:rFonts w:ascii="Arial Unicode MS" w:hAnsi="Arial Unicode MS" w:eastAsia="Arial Unicode MS"/>
+          <w:b w:val="0"/>
+          <w:i w:val="0"/>
+        </w:rPr>
+        <w:t xml:space="preserve"> 也採用 </w:t>
+      </w:r>
+      <w:r>
+        <w:rPr>
+          <w:rFonts w:ascii="Arial Unicode MS" w:hAnsi="Arial Unicode MS" w:eastAsia="Arial Unicode MS"/>
+          <w:b w:val="0"/>
+          <w:i w:val="0"/>
+          <w:color w:val="17365D"/>
+          <w:sz w:val="17"/>
+        </w:rPr>
+        <w:t>policy.monitoring_images_default_to_primary</w:t>
+      </w:r>
+      <w:r>
+        <w:rPr>
+          <w:rFonts w:ascii="Arial Unicode MS" w:hAnsi="Arial Unicode MS" w:eastAsia="Arial Unicode MS"/>
+          <w:b w:val="0"/>
+          <w:i w:val="0"/>
+        </w:rPr>
+        <w:t>，不作為資料庫邏輯輸出。這不會繞過 Primary-only 邏輯資料 Scope。</w:t>
+      </w:r>
+    </w:p>
+    <w:p>
+      <w:r>
+        <w:rPr>
+          <w:rFonts w:ascii="Arial Unicode MS" w:hAnsi="Arial Unicode MS" w:eastAsia="Arial Unicode MS"/>
+          <w:b w:val="0"/>
+          <w:i w:val="0"/>
           <w:color w:val="17365D"/>
           <w:sz w:val="17"/>
         </w:rPr>

</xml_diff>

<commit_message>
docs: record primary scope rule deployment
</commit_message>
<xml_diff>
--- a/docs/OMNICHECK_AI_BUILD_AND_OPERATIONS_GUIDE.docx
+++ b/docs/OMNICHECK_AI_BUILD_AND_OPERATIONS_GUIDE.docx
@@ -13294,6 +13294,124 @@
           <w:rFonts w:ascii="Arial Unicode MS" w:hAnsi="Arial Unicode MS" w:eastAsia="Arial Unicode MS"/>
           <w:b w:val="0"/>
           <w:i w:val="0"/>
+        </w:rPr>
+        <w:t xml:space="preserve">公司部署驗收（2026-09-07）：release </w:t>
+      </w:r>
+      <w:r>
+        <w:rPr>
+          <w:rFonts w:ascii="Arial Unicode MS" w:hAnsi="Arial Unicode MS" w:eastAsia="Arial Unicode MS"/>
+          <w:b w:val="0"/>
+          <w:i w:val="0"/>
+          <w:color w:val="17365D"/>
+          <w:sz w:val="17"/>
+        </w:rPr>
+        <w:t>99fb49b</w:t>
+      </w:r>
+      <w:r>
+        <w:rPr>
+          <w:rFonts w:ascii="Arial Unicode MS" w:hAnsi="Arial Unicode MS" w:eastAsia="Arial Unicode MS"/>
+          <w:b w:val="0"/>
+          <w:i w:val="0"/>
+        </w:rPr>
+        <w:t xml:space="preserve"> 已建立獨立 </w:t>
+      </w:r>
+      <w:r>
+        <w:rPr>
+          <w:rFonts w:ascii="Arial Unicode MS" w:hAnsi="Arial Unicode MS" w:eastAsia="Arial Unicode MS"/>
+          <w:b w:val="0"/>
+          <w:i w:val="0"/>
+          <w:color w:val="17365D"/>
+          <w:sz w:val="17"/>
+        </w:rPr>
+        <w:t>.venv</w:t>
+      </w:r>
+      <w:r>
+        <w:rPr>
+          <w:rFonts w:ascii="Arial Unicode MS" w:hAnsi="Arial Unicode MS" w:eastAsia="Arial Unicode MS"/>
+          <w:b w:val="0"/>
+          <w:i w:val="0"/>
+        </w:rPr>
+        <w:t xml:space="preserve">、完成 VM 完整測試後以 deploy lock 原子切至 </w:t>
+      </w:r>
+      <w:r>
+        <w:rPr>
+          <w:rFonts w:ascii="Arial Unicode MS" w:hAnsi="Arial Unicode MS" w:eastAsia="Arial Unicode MS"/>
+          <w:b w:val="0"/>
+          <w:i w:val="0"/>
+          <w:color w:val="17365D"/>
+          <w:sz w:val="17"/>
+        </w:rPr>
+        <w:t>current</w:t>
+      </w:r>
+      <w:r>
+        <w:rPr>
+          <w:rFonts w:ascii="Arial Unicode MS" w:hAnsi="Arial Unicode MS" w:eastAsia="Arial Unicode MS"/>
+          <w:b w:val="0"/>
+          <w:i w:val="0"/>
+        </w:rPr>
+        <w:t xml:space="preserve">，不執行 migration；Web／Worker 與 </w:t>
+      </w:r>
+      <w:r>
+        <w:rPr>
+          <w:rFonts w:ascii="Arial Unicode MS" w:hAnsi="Arial Unicode MS" w:eastAsia="Arial Unicode MS"/>
+          <w:b w:val="0"/>
+          <w:i w:val="0"/>
+          <w:color w:val="17365D"/>
+          <w:sz w:val="17"/>
+        </w:rPr>
+        <w:t>/api/health</w:t>
+      </w:r>
+      <w:r>
+        <w:rPr>
+          <w:rFonts w:ascii="Arial Unicode MS" w:hAnsi="Arial Unicode MS" w:eastAsia="Arial Unicode MS"/>
+          <w:b w:val="0"/>
+          <w:i w:val="0"/>
+        </w:rPr>
+        <w:t xml:space="preserve"> 均正常。舊 failed Job 不會被回寫或自動重跑。需要回復時，在 deploy lock 下將 </w:t>
+      </w:r>
+      <w:r>
+        <w:rPr>
+          <w:rFonts w:ascii="Arial Unicode MS" w:hAnsi="Arial Unicode MS" w:eastAsia="Arial Unicode MS"/>
+          <w:b w:val="0"/>
+          <w:i w:val="0"/>
+          <w:color w:val="17365D"/>
+          <w:sz w:val="17"/>
+        </w:rPr>
+        <w:t>/data/omnicheck/app/current</w:t>
+      </w:r>
+      <w:r>
+        <w:rPr>
+          <w:rFonts w:ascii="Arial Unicode MS" w:hAnsi="Arial Unicode MS" w:eastAsia="Arial Unicode MS"/>
+          <w:b w:val="0"/>
+          <w:i w:val="0"/>
+        </w:rPr>
+        <w:t xml:space="preserve"> symlink 原子切回 </w:t>
+      </w:r>
+      <w:r>
+        <w:rPr>
+          <w:rFonts w:ascii="Arial Unicode MS" w:hAnsi="Arial Unicode MS" w:eastAsia="Arial Unicode MS"/>
+          <w:b w:val="0"/>
+          <w:i w:val="0"/>
+          <w:color w:val="17365D"/>
+          <w:sz w:val="17"/>
+        </w:rPr>
+        <w:t>/data/omnicheck/app/releases/dff0524</w:t>
+      </w:r>
+      <w:r>
+        <w:rPr>
+          <w:rFonts w:ascii="Arial Unicode MS" w:hAnsi="Arial Unicode MS" w:eastAsia="Arial Unicode MS"/>
+          <w:b w:val="0"/>
+          <w:i w:val="0"/>
+        </w:rPr>
+        <w:t>，再重啟 Web／Worker 並驗證 health。</w:t>
+      </w:r>
+    </w:p>
+    <w:p>
+      <w:r>
+        <w:rPr>
+          <w:rFonts w:ascii="Arial Unicode MS" w:hAnsi="Arial Unicode MS" w:eastAsia="Arial Unicode MS"/>
+          <w:b w:val="0"/>
+          <w:i w:val="0"/>
           <w:color w:val="17365D"/>
           <w:sz w:val="17"/>
         </w:rPr>

</xml_diff>